<commit_message>
Added higher order mode maths and astigmatism. Added a figure showing the beam width
</commit_message>
<xml_diff>
--- a/Structuring.docx
+++ b/Structuring.docx
@@ -115,6 +115,16 @@
           <w:sz w:val="32"/>
           <w:szCs w:val="32"/>
         </w:rPr>
+        <w:t xml:space="preserve">Presentation of </w:t>
+      </w:r>
+      <w:r>
+        <w:rPr>
+          <w:rFonts w:asciiTheme="majorHAnsi" w:hAnsiTheme="majorHAnsi"/>
+          <w:b/>
+          <w:bCs/>
+          <w:sz w:val="32"/>
+          <w:szCs w:val="32"/>
+        </w:rPr>
         <w:t>Graphs</w:t>
       </w:r>
     </w:p>
@@ -135,39 +145,7 @@
           <w:sz w:val="24"/>
           <w:szCs w:val="24"/>
         </w:rPr>
-        <w:t>Figures shall be saved as eps when using matplotlib or '</w:t>
-      </w:r>
-      <w:proofErr w:type="spellStart"/>
-      <w:r>
-        <w:rPr>
-          <w:sz w:val="24"/>
-          <w:szCs w:val="24"/>
-        </w:rPr>
-        <w:t>epsc</w:t>
-      </w:r>
-      <w:proofErr w:type="spellEnd"/>
-      <w:r>
-        <w:rPr>
-          <w:sz w:val="24"/>
-          <w:szCs w:val="24"/>
-        </w:rPr>
-        <w:t xml:space="preserve">' when using </w:t>
-      </w:r>
-      <w:proofErr w:type="spellStart"/>
-      <w:r>
-        <w:rPr>
-          <w:sz w:val="24"/>
-          <w:szCs w:val="24"/>
-        </w:rPr>
-        <w:t>matlab</w:t>
-      </w:r>
-      <w:proofErr w:type="spellEnd"/>
-      <w:r>
-        <w:rPr>
-          <w:sz w:val="24"/>
-          <w:szCs w:val="24"/>
-        </w:rPr>
-        <w:t>. This is to prevent a latex warning.</w:t>
+        <w:t>Figures shall be saved as eps when using matplotlib or 'epsc' when using matlab. This is to prevent a latex warning.</w:t>
       </w:r>
     </w:p>
     <w:p>
@@ -187,67 +165,7 @@
           <w:sz w:val="24"/>
           <w:szCs w:val="24"/>
         </w:rPr>
-        <w:t xml:space="preserve">Figure names shall be 'chapter </w:t>
-      </w:r>
-      <w:proofErr w:type="spellStart"/>
-      <w:r>
-        <w:rPr>
-          <w:sz w:val="24"/>
-          <w:szCs w:val="24"/>
-        </w:rPr>
-        <w:t>description'_chapter_'figure</w:t>
-      </w:r>
-      <w:proofErr w:type="spellEnd"/>
-      <w:r>
-        <w:rPr>
-          <w:sz w:val="24"/>
-          <w:szCs w:val="24"/>
-        </w:rPr>
-        <w:t xml:space="preserve"> description'. For</w:t>
-      </w:r>
-      <w:r>
-        <w:rPr>
-          <w:sz w:val="24"/>
-          <w:szCs w:val="24"/>
-        </w:rPr>
-        <w:t xml:space="preserve"> </w:t>
-      </w:r>
-      <w:r>
-        <w:rPr>
-          <w:sz w:val="24"/>
-          <w:szCs w:val="24"/>
-        </w:rPr>
-        <w:t>example, '</w:t>
-      </w:r>
-      <w:proofErr w:type="spellStart"/>
-      <w:r>
-        <w:rPr>
-          <w:sz w:val="24"/>
-          <w:szCs w:val="24"/>
-        </w:rPr>
-        <w:t>sim_chapter_Zoom_in_ETM_tuning</w:t>
-      </w:r>
-      <w:proofErr w:type="spellEnd"/>
-      <w:r>
-        <w:rPr>
-          <w:sz w:val="24"/>
-          <w:szCs w:val="24"/>
-        </w:rPr>
-        <w:t>' refers to the figure being in the</w:t>
-      </w:r>
-      <w:r>
-        <w:rPr>
-          <w:sz w:val="24"/>
-          <w:szCs w:val="24"/>
-        </w:rPr>
-        <w:t xml:space="preserve"> </w:t>
-      </w:r>
-      <w:r>
-        <w:rPr>
-          <w:sz w:val="24"/>
-          <w:szCs w:val="24"/>
-        </w:rPr>
-        <w:t>simulation chapter, and the figure is a zoom in of ETM behaviour.</w:t>
+        <w:t>Figures will have their width in Latex set to 0.95\linewidth.</w:t>
       </w:r>
     </w:p>
     <w:p>
@@ -267,6 +185,54 @@
           <w:sz w:val="24"/>
           <w:szCs w:val="24"/>
         </w:rPr>
+        <w:t>Figure names shall be 'chapter description'_chapter_'figure description'. For</w:t>
+      </w:r>
+      <w:r>
+        <w:rPr>
+          <w:sz w:val="24"/>
+          <w:szCs w:val="24"/>
+        </w:rPr>
+        <w:t xml:space="preserve"> </w:t>
+      </w:r>
+      <w:r>
+        <w:rPr>
+          <w:sz w:val="24"/>
+          <w:szCs w:val="24"/>
+        </w:rPr>
+        <w:t>example, 'sim_chapter_Zoom_in_ETM_tuning' refers to the figure being in the</w:t>
+      </w:r>
+      <w:r>
+        <w:rPr>
+          <w:sz w:val="24"/>
+          <w:szCs w:val="24"/>
+        </w:rPr>
+        <w:t xml:space="preserve"> </w:t>
+      </w:r>
+      <w:r>
+        <w:rPr>
+          <w:sz w:val="24"/>
+          <w:szCs w:val="24"/>
+        </w:rPr>
+        <w:t>simulation chapter, and the figure is a zoom in of ETM behaviour.</w:t>
+      </w:r>
+    </w:p>
+    <w:p>
+      <w:pPr>
+        <w:pStyle w:val="ListParagraph"/>
+        <w:numPr>
+          <w:ilvl w:val="0"/>
+          <w:numId w:val="3"/>
+        </w:numPr>
+        <w:rPr>
+          <w:sz w:val="24"/>
+          <w:szCs w:val="24"/>
+        </w:rPr>
+      </w:pPr>
+      <w:r>
+        <w:rPr>
+          <w:sz w:val="24"/>
+          <w:szCs w:val="24"/>
+        </w:rPr>
         <w:t>For all figures, the following points should be checked:</w:t>
       </w:r>
     </w:p>
@@ -287,37 +253,7 @@
           <w:sz w:val="24"/>
           <w:szCs w:val="24"/>
         </w:rPr>
-        <w:t xml:space="preserve">Are all lines visible/distinguishable? Changing thickness and </w:t>
-      </w:r>
-      <w:proofErr w:type="spellStart"/>
-      <w:r>
-        <w:rPr>
-          <w:sz w:val="24"/>
-          <w:szCs w:val="24"/>
-        </w:rPr>
-        <w:t>linestyle</w:t>
-      </w:r>
-      <w:proofErr w:type="spellEnd"/>
-      <w:r>
-        <w:rPr>
-          <w:sz w:val="24"/>
-          <w:szCs w:val="24"/>
-        </w:rPr>
-        <w:t xml:space="preserve"> can</w:t>
-      </w:r>
-      <w:r>
-        <w:rPr>
-          <w:sz w:val="24"/>
-          <w:szCs w:val="24"/>
-        </w:rPr>
-        <w:t xml:space="preserve"> </w:t>
-      </w:r>
-      <w:r>
-        <w:rPr>
-          <w:sz w:val="24"/>
-          <w:szCs w:val="24"/>
-        </w:rPr>
-        <w:t>help.</w:t>
+        <w:t>Are all lines visible/distinguishable? Changing thickness and linestyle can help.</w:t>
       </w:r>
     </w:p>
     <w:p>
@@ -337,23 +273,7 @@
           <w:sz w:val="24"/>
           <w:szCs w:val="24"/>
         </w:rPr>
-        <w:t xml:space="preserve">Are the axis labelled? The label is a sentence, so normal sentence capitalisation should be used. If </w:t>
-      </w:r>
-      <w:proofErr w:type="spellStart"/>
-      <w:r>
-        <w:rPr>
-          <w:sz w:val="24"/>
-          <w:szCs w:val="24"/>
-        </w:rPr>
-        <w:t>its</w:t>
-      </w:r>
-      <w:proofErr w:type="spellEnd"/>
-      <w:r>
-        <w:rPr>
-          <w:sz w:val="24"/>
-          <w:szCs w:val="24"/>
-        </w:rPr>
-        <w:t xml:space="preserve"> just one word, use a capital letter.</w:t>
+        <w:t>Are the axis labelled? The label is a sentence, so normal sentence capitalisation should be used. If its just one word, use a capital letter.</w:t>
       </w:r>
     </w:p>
     <w:p>
@@ -433,23 +353,7 @@
           <w:sz w:val="24"/>
           <w:szCs w:val="24"/>
         </w:rPr>
-        <w:t xml:space="preserve">Are subscripts properly </w:t>
-      </w:r>
-      <w:proofErr w:type="spellStart"/>
-      <w:r>
-        <w:rPr>
-          <w:sz w:val="24"/>
-          <w:szCs w:val="24"/>
-        </w:rPr>
-        <w:t>typset</w:t>
-      </w:r>
-      <w:proofErr w:type="spellEnd"/>
-      <w:r>
-        <w:rPr>
-          <w:sz w:val="24"/>
-          <w:szCs w:val="24"/>
-        </w:rPr>
-        <w:t>?</w:t>
+        <w:t>Are subscripts properly typset?</w:t>
       </w:r>
     </w:p>
     <w:p>
@@ -469,37 +373,7 @@
           <w:sz w:val="24"/>
           <w:szCs w:val="24"/>
         </w:rPr>
-        <w:t>Have standard unit labels been used? A for amps, degree symbols instead</w:t>
-      </w:r>
-      <w:r>
-        <w:rPr>
-          <w:sz w:val="24"/>
-          <w:szCs w:val="24"/>
-        </w:rPr>
-        <w:t xml:space="preserve"> </w:t>
-      </w:r>
-      <w:r>
-        <w:rPr>
-          <w:sz w:val="24"/>
-          <w:szCs w:val="24"/>
-        </w:rPr>
-        <w:t>of '</w:t>
-      </w:r>
-      <w:proofErr w:type="spellStart"/>
-      <w:r>
-        <w:rPr>
-          <w:sz w:val="24"/>
-          <w:szCs w:val="24"/>
-        </w:rPr>
-        <w:t>deg</w:t>
-      </w:r>
-      <w:proofErr w:type="spellEnd"/>
-      <w:r>
-        <w:rPr>
-          <w:sz w:val="24"/>
-          <w:szCs w:val="24"/>
-        </w:rPr>
-        <w:t>' etc.</w:t>
+        <w:t>Have standard unit labels been used? A for amps, degree symbols instead of 'deg' etc.</w:t>
       </w:r>
     </w:p>
     <w:p>
@@ -539,23 +413,47 @@
           <w:sz w:val="24"/>
           <w:szCs w:val="24"/>
         </w:rPr>
-        <w:t xml:space="preserve">Check for spelling mistakes! e.g. </w:t>
-      </w:r>
-      <w:proofErr w:type="spellStart"/>
-      <w:r>
-        <w:rPr>
-          <w:sz w:val="24"/>
-          <w:szCs w:val="24"/>
-        </w:rPr>
-        <w:t>freuqency</w:t>
-      </w:r>
-      <w:proofErr w:type="spellEnd"/>
-      <w:r>
-        <w:rPr>
-          <w:sz w:val="24"/>
-          <w:szCs w:val="24"/>
-        </w:rPr>
-        <w:t xml:space="preserve"> -&gt; frequency.</w:t>
+        <w:t>Check for spelling mistakes! e.g. freuqency -&gt; frequency.</w:t>
+      </w:r>
+    </w:p>
+    <w:p>
+      <w:pPr>
+        <w:pStyle w:val="ListParagraph"/>
+        <w:numPr>
+          <w:ilvl w:val="1"/>
+          <w:numId w:val="2"/>
+        </w:numPr>
+        <w:rPr>
+          <w:sz w:val="24"/>
+          <w:szCs w:val="24"/>
+        </w:rPr>
+      </w:pPr>
+      <w:r>
+        <w:rPr>
+          <w:sz w:val="24"/>
+          <w:szCs w:val="24"/>
+        </w:rPr>
+        <w:t>Is there any weird looking ‘1e-5’ type notation?</w:t>
+      </w:r>
+    </w:p>
+    <w:p>
+      <w:pPr>
+        <w:pStyle w:val="ListParagraph"/>
+        <w:numPr>
+          <w:ilvl w:val="1"/>
+          <w:numId w:val="2"/>
+        </w:numPr>
+        <w:rPr>
+          <w:sz w:val="24"/>
+          <w:szCs w:val="24"/>
+        </w:rPr>
+      </w:pPr>
+      <w:r>
+        <w:rPr>
+          <w:sz w:val="24"/>
+          <w:szCs w:val="24"/>
+        </w:rPr>
+        <w:t>For log plots, it looks better to start and end on a decade.</w:t>
       </w:r>
     </w:p>
     <w:p>
@@ -618,23 +516,7 @@
           <w:sz w:val="24"/>
           <w:szCs w:val="24"/>
         </w:rPr>
-        <w:t xml:space="preserve">Standard </w:t>
-      </w:r>
-      <w:proofErr w:type="spellStart"/>
-      <w:r>
-        <w:rPr>
-          <w:sz w:val="24"/>
-          <w:szCs w:val="24"/>
-        </w:rPr>
-        <w:t>matlab</w:t>
-      </w:r>
-      <w:proofErr w:type="spellEnd"/>
-      <w:r>
-        <w:rPr>
-          <w:sz w:val="24"/>
-          <w:szCs w:val="24"/>
-        </w:rPr>
-        <w:t xml:space="preserve"> and matplotlib fonts will be used. The following examples give</w:t>
+        <w:t>Standard matlab and matplotlib fonts will be used. The following examples give</w:t>
       </w:r>
       <w:r>
         <w:rPr>
@@ -703,357 +585,236 @@
           <w:szCs w:val="24"/>
         </w:rPr>
       </w:pPr>
-      <w:proofErr w:type="spellStart"/>
-      <w:r>
-        <w:rPr>
-          <w:rFonts w:ascii="SimSun" w:eastAsia="SimSun" w:hAnsi="SimSun"/>
-          <w:sz w:val="24"/>
-          <w:szCs w:val="24"/>
-        </w:rPr>
-        <w:t>figure_size</w:t>
-      </w:r>
-      <w:proofErr w:type="spellEnd"/>
-      <w:r>
-        <w:rPr>
-          <w:rFonts w:ascii="SimSun" w:eastAsia="SimSun" w:hAnsi="SimSun"/>
-          <w:sz w:val="24"/>
-          <w:szCs w:val="24"/>
-        </w:rPr>
-        <w:t xml:space="preserve"> = (6,4)</w:t>
-      </w:r>
-    </w:p>
-    <w:p>
-      <w:pPr>
-        <w:rPr>
-          <w:rFonts w:ascii="SimSun" w:eastAsia="SimSun" w:hAnsi="SimSun"/>
-          <w:sz w:val="24"/>
-          <w:szCs w:val="24"/>
-        </w:rPr>
-      </w:pPr>
-      <w:proofErr w:type="spellStart"/>
-      <w:r>
-        <w:rPr>
-          <w:rFonts w:ascii="SimSun" w:eastAsia="SimSun" w:hAnsi="SimSun"/>
-          <w:sz w:val="24"/>
-          <w:szCs w:val="24"/>
-        </w:rPr>
-        <w:lastRenderedPageBreak/>
-        <w:t>plt.figure</w:t>
-      </w:r>
-      <w:proofErr w:type="spellEnd"/>
-      <w:r>
-        <w:rPr>
-          <w:rFonts w:ascii="SimSun" w:eastAsia="SimSun" w:hAnsi="SimSun"/>
-          <w:sz w:val="24"/>
-          <w:szCs w:val="24"/>
-        </w:rPr>
-        <w:t>(</w:t>
-      </w:r>
-      <w:proofErr w:type="spellStart"/>
-      <w:r>
-        <w:rPr>
-          <w:rFonts w:ascii="SimSun" w:eastAsia="SimSun" w:hAnsi="SimSun"/>
-          <w:sz w:val="24"/>
-          <w:szCs w:val="24"/>
-        </w:rPr>
-        <w:t>figsize</w:t>
-      </w:r>
-      <w:proofErr w:type="spellEnd"/>
-      <w:r>
-        <w:rPr>
-          <w:rFonts w:ascii="SimSun" w:eastAsia="SimSun" w:hAnsi="SimSun"/>
-          <w:sz w:val="24"/>
-          <w:szCs w:val="24"/>
-        </w:rPr>
-        <w:t xml:space="preserve"> = </w:t>
-      </w:r>
-      <w:proofErr w:type="spellStart"/>
-      <w:r>
-        <w:rPr>
-          <w:rFonts w:ascii="SimSun" w:eastAsia="SimSun" w:hAnsi="SimSun"/>
-          <w:sz w:val="24"/>
-          <w:szCs w:val="24"/>
-        </w:rPr>
-        <w:t>figure_size,dpi</w:t>
-      </w:r>
-      <w:proofErr w:type="spellEnd"/>
-      <w:r>
-        <w:rPr>
-          <w:rFonts w:ascii="SimSun" w:eastAsia="SimSun" w:hAnsi="SimSun"/>
-          <w:sz w:val="24"/>
-          <w:szCs w:val="24"/>
-        </w:rPr>
-        <w:t xml:space="preserve"> = 150)</w:t>
-      </w:r>
-    </w:p>
-    <w:p>
-      <w:pPr>
-        <w:rPr>
-          <w:rFonts w:ascii="SimSun" w:eastAsia="SimSun" w:hAnsi="SimSun"/>
-          <w:sz w:val="24"/>
-          <w:szCs w:val="24"/>
-        </w:rPr>
-      </w:pPr>
-      <w:proofErr w:type="spellStart"/>
-      <w:r>
-        <w:rPr>
-          <w:rFonts w:ascii="SimSun" w:eastAsia="SimSun" w:hAnsi="SimSun"/>
-          <w:sz w:val="24"/>
-          <w:szCs w:val="24"/>
-        </w:rPr>
-        <w:t>plt.plot</w:t>
-      </w:r>
-      <w:proofErr w:type="spellEnd"/>
-      <w:r>
-        <w:rPr>
-          <w:rFonts w:ascii="SimSun" w:eastAsia="SimSun" w:hAnsi="SimSun"/>
-          <w:sz w:val="24"/>
-          <w:szCs w:val="24"/>
-        </w:rPr>
-        <w:t>(</w:t>
-      </w:r>
-      <w:proofErr w:type="spellStart"/>
-      <w:r>
-        <w:rPr>
-          <w:rFonts w:ascii="SimSun" w:eastAsia="SimSun" w:hAnsi="SimSun"/>
-          <w:sz w:val="24"/>
-          <w:szCs w:val="24"/>
-        </w:rPr>
-        <w:t>x,y,label</w:t>
-      </w:r>
-      <w:proofErr w:type="spellEnd"/>
-      <w:r>
-        <w:rPr>
-          <w:rFonts w:ascii="SimSun" w:eastAsia="SimSun" w:hAnsi="SimSun"/>
-          <w:sz w:val="24"/>
-          <w:szCs w:val="24"/>
-        </w:rPr>
-        <w:t xml:space="preserve"> = 'Name of line')</w:t>
-      </w:r>
-    </w:p>
-    <w:p>
-      <w:pPr>
-        <w:rPr>
-          <w:rFonts w:ascii="SimSun" w:eastAsia="SimSun" w:hAnsi="SimSun"/>
-          <w:sz w:val="24"/>
-          <w:szCs w:val="24"/>
-        </w:rPr>
-      </w:pPr>
-      <w:proofErr w:type="spellStart"/>
-      <w:r>
-        <w:rPr>
-          <w:rFonts w:ascii="SimSun" w:eastAsia="SimSun" w:hAnsi="SimSun"/>
-          <w:sz w:val="24"/>
-          <w:szCs w:val="24"/>
-        </w:rPr>
-        <w:t>plt.legend</w:t>
-      </w:r>
-      <w:proofErr w:type="spellEnd"/>
-      <w:r>
-        <w:rPr>
-          <w:rFonts w:ascii="SimSun" w:eastAsia="SimSun" w:hAnsi="SimSun"/>
-          <w:sz w:val="24"/>
-          <w:szCs w:val="24"/>
-        </w:rPr>
-        <w:t>(prop={'size': 8},</w:t>
-      </w:r>
-      <w:proofErr w:type="spellStart"/>
-      <w:r>
-        <w:rPr>
-          <w:rFonts w:ascii="SimSun" w:eastAsia="SimSun" w:hAnsi="SimSun"/>
-          <w:sz w:val="24"/>
-          <w:szCs w:val="24"/>
-        </w:rPr>
-        <w:t>loc</w:t>
-      </w:r>
-      <w:proofErr w:type="spellEnd"/>
-      <w:r>
-        <w:rPr>
-          <w:rFonts w:ascii="SimSun" w:eastAsia="SimSun" w:hAnsi="SimSun"/>
-          <w:sz w:val="24"/>
-          <w:szCs w:val="24"/>
-        </w:rPr>
-        <w:t xml:space="preserve"> = 'lower left')</w:t>
-      </w:r>
-    </w:p>
-    <w:p>
-      <w:pPr>
-        <w:rPr>
-          <w:rFonts w:ascii="SimSun" w:eastAsia="SimSun" w:hAnsi="SimSun"/>
-          <w:sz w:val="24"/>
-          <w:szCs w:val="24"/>
-        </w:rPr>
-      </w:pPr>
-      <w:proofErr w:type="spellStart"/>
-      <w:r>
-        <w:rPr>
-          <w:rFonts w:ascii="SimSun" w:eastAsia="SimSun" w:hAnsi="SimSun"/>
-          <w:sz w:val="24"/>
-          <w:szCs w:val="24"/>
-        </w:rPr>
-        <w:t>plt.xlabel</w:t>
-      </w:r>
-      <w:proofErr w:type="spellEnd"/>
-      <w:r>
-        <w:rPr>
-          <w:rFonts w:ascii="SimSun" w:eastAsia="SimSun" w:hAnsi="SimSun"/>
-          <w:sz w:val="24"/>
-          <w:szCs w:val="24"/>
-        </w:rPr>
-        <w:t>('x axis (units)')</w:t>
-      </w:r>
-    </w:p>
-    <w:p>
-      <w:pPr>
-        <w:rPr>
-          <w:rFonts w:ascii="SimSun" w:eastAsia="SimSun" w:hAnsi="SimSun"/>
-          <w:sz w:val="24"/>
-          <w:szCs w:val="24"/>
-        </w:rPr>
-      </w:pPr>
-      <w:proofErr w:type="spellStart"/>
-      <w:r>
-        <w:rPr>
-          <w:rFonts w:ascii="SimSun" w:eastAsia="SimSun" w:hAnsi="SimSun"/>
-          <w:sz w:val="24"/>
-          <w:szCs w:val="24"/>
-        </w:rPr>
-        <w:t>plt.ylabel</w:t>
-      </w:r>
-      <w:proofErr w:type="spellEnd"/>
-      <w:r>
-        <w:rPr>
-          <w:rFonts w:ascii="SimSun" w:eastAsia="SimSun" w:hAnsi="SimSun"/>
-          <w:sz w:val="24"/>
-          <w:szCs w:val="24"/>
-        </w:rPr>
-        <w:t>('y axis (units)')</w:t>
-      </w:r>
-    </w:p>
-    <w:p>
-      <w:pPr>
-        <w:rPr>
-          <w:rFonts w:ascii="SimSun" w:eastAsia="SimSun" w:hAnsi="SimSun"/>
-          <w:sz w:val="24"/>
-          <w:szCs w:val="24"/>
-        </w:rPr>
-      </w:pPr>
-      <w:proofErr w:type="spellStart"/>
-      <w:r>
-        <w:rPr>
-          <w:rFonts w:ascii="SimSun" w:eastAsia="SimSun" w:hAnsi="SimSun"/>
-          <w:sz w:val="24"/>
-          <w:szCs w:val="24"/>
-        </w:rPr>
-        <w:t>plt.tight_layout</w:t>
-      </w:r>
-      <w:proofErr w:type="spellEnd"/>
-      <w:r>
-        <w:rPr>
-          <w:rFonts w:ascii="SimSun" w:eastAsia="SimSun" w:hAnsi="SimSun"/>
-          <w:sz w:val="24"/>
-          <w:szCs w:val="24"/>
-        </w:rPr>
-        <w:t>()</w:t>
-      </w:r>
-    </w:p>
-    <w:p>
-      <w:pPr>
-        <w:rPr>
-          <w:rFonts w:ascii="SimSun" w:eastAsia="SimSun" w:hAnsi="SimSun"/>
-          <w:sz w:val="24"/>
-          <w:szCs w:val="24"/>
-        </w:rPr>
-      </w:pPr>
-      <w:proofErr w:type="spellStart"/>
-      <w:r>
-        <w:rPr>
-          <w:rFonts w:ascii="SimSun" w:eastAsia="SimSun" w:hAnsi="SimSun"/>
-          <w:sz w:val="24"/>
-          <w:szCs w:val="24"/>
-        </w:rPr>
-        <w:t>plt.grid</w:t>
-      </w:r>
-      <w:proofErr w:type="spellEnd"/>
-      <w:r>
-        <w:rPr>
-          <w:rFonts w:ascii="SimSun" w:eastAsia="SimSun" w:hAnsi="SimSun"/>
-          <w:sz w:val="24"/>
-          <w:szCs w:val="24"/>
-        </w:rPr>
-        <w:t>()</w:t>
-      </w:r>
-    </w:p>
-    <w:p>
-      <w:pPr>
-        <w:rPr>
-          <w:rFonts w:ascii="SimSun" w:eastAsia="SimSun" w:hAnsi="SimSun"/>
-          <w:sz w:val="24"/>
-          <w:szCs w:val="24"/>
-        </w:rPr>
-      </w:pPr>
-      <w:proofErr w:type="spellStart"/>
-      <w:r>
-        <w:rPr>
-          <w:rFonts w:ascii="SimSun" w:eastAsia="SimSun" w:hAnsi="SimSun"/>
-          <w:sz w:val="24"/>
-          <w:szCs w:val="24"/>
-        </w:rPr>
-        <w:t>plt.savefig</w:t>
-      </w:r>
-      <w:proofErr w:type="spellEnd"/>
-      <w:r>
-        <w:rPr>
-          <w:rFonts w:ascii="SimSun" w:eastAsia="SimSun" w:hAnsi="SimSun"/>
-          <w:sz w:val="24"/>
-          <w:szCs w:val="24"/>
-        </w:rPr>
-        <w:t>('</w:t>
-      </w:r>
-      <w:proofErr w:type="spellStart"/>
-      <w:r>
-        <w:rPr>
-          <w:rFonts w:ascii="SimSun" w:eastAsia="SimSun" w:hAnsi="SimSun"/>
-          <w:sz w:val="24"/>
-          <w:szCs w:val="24"/>
-        </w:rPr>
-        <w:t>sim_chapter_Zoom_in_ETM_tuning.eps</w:t>
-      </w:r>
-      <w:proofErr w:type="spellEnd"/>
-      <w:r>
-        <w:rPr>
-          <w:rFonts w:ascii="SimSun" w:eastAsia="SimSun" w:hAnsi="SimSun"/>
-          <w:sz w:val="24"/>
-          <w:szCs w:val="24"/>
-        </w:rPr>
-        <w:t>')</w:t>
-      </w:r>
-    </w:p>
-    <w:p>
-      <w:pPr>
-        <w:rPr>
-          <w:rFonts w:ascii="SimSun" w:eastAsia="SimSun" w:hAnsi="SimSun"/>
-          <w:sz w:val="24"/>
-          <w:szCs w:val="24"/>
-        </w:rPr>
-      </w:pPr>
-      <w:proofErr w:type="spellStart"/>
-      <w:r>
-        <w:rPr>
-          <w:rFonts w:ascii="SimSun" w:eastAsia="SimSun" w:hAnsi="SimSun"/>
-          <w:sz w:val="24"/>
-          <w:szCs w:val="24"/>
-        </w:rPr>
-        <w:t>plt.show</w:t>
-      </w:r>
-      <w:proofErr w:type="spellEnd"/>
-      <w:r>
-        <w:rPr>
-          <w:rFonts w:ascii="SimSun" w:eastAsia="SimSun" w:hAnsi="SimSun"/>
-          <w:sz w:val="24"/>
-          <w:szCs w:val="24"/>
-        </w:rPr>
-        <w:t>()</w:t>
+      <w:r>
+        <w:rPr>
+          <w:rFonts w:ascii="SimSun" w:eastAsia="SimSun" w:hAnsi="SimSun"/>
+          <w:sz w:val="24"/>
+          <w:szCs w:val="24"/>
+        </w:rPr>
+        <w:t>figure_size = (6,4)</w:t>
+      </w:r>
+    </w:p>
+    <w:p>
+      <w:pPr>
+        <w:rPr>
+          <w:rFonts w:ascii="SimSun" w:eastAsia="SimSun" w:hAnsi="SimSun"/>
+          <w:sz w:val="24"/>
+          <w:szCs w:val="24"/>
+        </w:rPr>
+      </w:pPr>
+      <w:r>
+        <w:rPr>
+          <w:rFonts w:ascii="SimSun" w:eastAsia="SimSun" w:hAnsi="SimSun"/>
+          <w:sz w:val="24"/>
+          <w:szCs w:val="24"/>
+        </w:rPr>
+        <w:t xml:space="preserve">plt.figure(figsize = figure_size,dpi = </w:t>
+      </w:r>
+      <w:r>
+        <w:rPr>
+          <w:rFonts w:ascii="SimSun" w:eastAsia="SimSun" w:hAnsi="SimSun"/>
+          <w:sz w:val="24"/>
+          <w:szCs w:val="24"/>
+        </w:rPr>
+        <w:t>15</w:t>
+      </w:r>
+      <w:r>
+        <w:rPr>
+          <w:rFonts w:ascii="SimSun" w:eastAsia="SimSun" w:hAnsi="SimSun"/>
+          <w:sz w:val="24"/>
+          <w:szCs w:val="24"/>
+        </w:rPr>
+        <w:t>0)</w:t>
+      </w:r>
+    </w:p>
+    <w:p>
+      <w:pPr>
+        <w:rPr>
+          <w:rFonts w:ascii="SimSun" w:eastAsia="SimSun" w:hAnsi="SimSun"/>
+          <w:sz w:val="24"/>
+          <w:szCs w:val="24"/>
+        </w:rPr>
+      </w:pPr>
+      <w:r>
+        <w:rPr>
+          <w:rFonts w:ascii="SimSun" w:eastAsia="SimSun" w:hAnsi="SimSun"/>
+          <w:sz w:val="24"/>
+          <w:szCs w:val="24"/>
+        </w:rPr>
+        <w:t>plt.plot(x,y,label = 'Name of line')</w:t>
+      </w:r>
+    </w:p>
+    <w:p>
+      <w:pPr>
+        <w:rPr>
+          <w:rFonts w:ascii="SimSun" w:eastAsia="SimSun" w:hAnsi="SimSun"/>
+          <w:sz w:val="24"/>
+          <w:szCs w:val="24"/>
+        </w:rPr>
+      </w:pPr>
+      <w:r>
+        <w:rPr>
+          <w:rFonts w:ascii="SimSun" w:eastAsia="SimSun" w:hAnsi="SimSun"/>
+          <w:sz w:val="24"/>
+          <w:szCs w:val="24"/>
+        </w:rPr>
+        <w:t>plt.legend(prop={'size': 8},loc = 'lower left')</w:t>
+      </w:r>
+    </w:p>
+    <w:p>
+      <w:pPr>
+        <w:rPr>
+          <w:rFonts w:ascii="SimSun" w:eastAsia="SimSun" w:hAnsi="SimSun"/>
+          <w:sz w:val="24"/>
+          <w:szCs w:val="24"/>
+        </w:rPr>
+      </w:pPr>
+      <w:r>
+        <w:rPr>
+          <w:rFonts w:ascii="SimSun" w:eastAsia="SimSun" w:hAnsi="SimSun"/>
+          <w:sz w:val="24"/>
+          <w:szCs w:val="24"/>
+        </w:rPr>
+        <w:t>plt.xlabel('x axis (units)'</w:t>
+      </w:r>
+      <w:r>
+        <w:rPr>
+          <w:rFonts w:ascii="SimSun" w:eastAsia="SimSun" w:hAnsi="SimSun"/>
+          <w:sz w:val="24"/>
+          <w:szCs w:val="24"/>
+        </w:rPr>
+        <w:t>,</w:t>
+      </w:r>
+      <w:r>
+        <w:t xml:space="preserve"> </w:t>
+      </w:r>
+      <w:r>
+        <w:rPr>
+          <w:rFonts w:ascii="SimSun" w:eastAsia="SimSun" w:hAnsi="SimSun"/>
+          <w:sz w:val="24"/>
+          <w:szCs w:val="24"/>
+        </w:rPr>
+        <w:t>fontsize = 10</w:t>
+      </w:r>
+      <w:r>
+        <w:rPr>
+          <w:rFonts w:ascii="SimSun" w:eastAsia="SimSun" w:hAnsi="SimSun"/>
+          <w:sz w:val="24"/>
+          <w:szCs w:val="24"/>
+        </w:rPr>
+        <w:t>)</w:t>
+      </w:r>
+    </w:p>
+    <w:p>
+      <w:pPr>
+        <w:rPr>
+          <w:rFonts w:ascii="SimSun" w:eastAsia="SimSun" w:hAnsi="SimSun"/>
+          <w:sz w:val="24"/>
+          <w:szCs w:val="24"/>
+        </w:rPr>
+      </w:pPr>
+      <w:r>
+        <w:rPr>
+          <w:rFonts w:ascii="SimSun" w:eastAsia="SimSun" w:hAnsi="SimSun"/>
+          <w:sz w:val="24"/>
+          <w:szCs w:val="24"/>
+        </w:rPr>
+        <w:t>plt.ylabel('y axis (units)'</w:t>
+      </w:r>
+      <w:r>
+        <w:rPr>
+          <w:rFonts w:ascii="SimSun" w:eastAsia="SimSun" w:hAnsi="SimSun"/>
+          <w:sz w:val="24"/>
+          <w:szCs w:val="24"/>
+        </w:rPr>
+        <w:t>,</w:t>
+      </w:r>
+      <w:r>
+        <w:t xml:space="preserve"> </w:t>
+      </w:r>
+      <w:r>
+        <w:rPr>
+          <w:rFonts w:ascii="SimSun" w:eastAsia="SimSun" w:hAnsi="SimSun"/>
+          <w:sz w:val="24"/>
+          <w:szCs w:val="24"/>
+        </w:rPr>
+        <w:t>fontsize = 10</w:t>
+      </w:r>
+      <w:r>
+        <w:rPr>
+          <w:rFonts w:ascii="SimSun" w:eastAsia="SimSun" w:hAnsi="SimSun"/>
+          <w:sz w:val="24"/>
+          <w:szCs w:val="24"/>
+        </w:rPr>
+        <w:t>)</w:t>
+      </w:r>
+    </w:p>
+    <w:p>
+      <w:pPr>
+        <w:rPr>
+          <w:rFonts w:ascii="SimSun" w:eastAsia="SimSun" w:hAnsi="SimSun"/>
+          <w:sz w:val="24"/>
+          <w:szCs w:val="24"/>
+        </w:rPr>
+      </w:pPr>
+      <w:r>
+        <w:rPr>
+          <w:rFonts w:ascii="SimSun" w:eastAsia="SimSun" w:hAnsi="SimSun"/>
+          <w:sz w:val="24"/>
+          <w:szCs w:val="24"/>
+        </w:rPr>
+        <w:t>plt.tight_layout()</w:t>
+      </w:r>
+    </w:p>
+    <w:p>
+      <w:pPr>
+        <w:rPr>
+          <w:rFonts w:ascii="SimSun" w:eastAsia="SimSun" w:hAnsi="SimSun"/>
+          <w:sz w:val="24"/>
+          <w:szCs w:val="24"/>
+        </w:rPr>
+      </w:pPr>
+      <w:r>
+        <w:rPr>
+          <w:rFonts w:ascii="SimSun" w:eastAsia="SimSun" w:hAnsi="SimSun"/>
+          <w:sz w:val="24"/>
+          <w:szCs w:val="24"/>
+        </w:rPr>
+        <w:t>plt.grid()</w:t>
+      </w:r>
+    </w:p>
+    <w:p>
+      <w:pPr>
+        <w:rPr>
+          <w:rFonts w:ascii="SimSun" w:eastAsia="SimSun" w:hAnsi="SimSun"/>
+          <w:sz w:val="24"/>
+          <w:szCs w:val="24"/>
+        </w:rPr>
+      </w:pPr>
+      <w:r>
+        <w:rPr>
+          <w:rFonts w:ascii="SimSun" w:eastAsia="SimSun" w:hAnsi="SimSun"/>
+          <w:sz w:val="24"/>
+          <w:szCs w:val="24"/>
+        </w:rPr>
+        <w:t>plt.savefig('sim_chapter_Zoom_in_ETM_tuning.eps')</w:t>
+      </w:r>
+    </w:p>
+    <w:p>
+      <w:pPr>
+        <w:rPr>
+          <w:rFonts w:ascii="SimSun" w:eastAsia="SimSun" w:hAnsi="SimSun"/>
+          <w:sz w:val="24"/>
+          <w:szCs w:val="24"/>
+        </w:rPr>
+      </w:pPr>
+      <w:r>
+        <w:rPr>
+          <w:rFonts w:ascii="SimSun" w:eastAsia="SimSun" w:hAnsi="SimSun"/>
+          <w:sz w:val="24"/>
+          <w:szCs w:val="24"/>
+        </w:rPr>
+        <w:t>plt.show()</w:t>
       </w:r>
     </w:p>
     <w:p>
@@ -1090,41 +851,13 @@
           <w:szCs w:val="24"/>
         </w:rPr>
       </w:pPr>
-      <w:proofErr w:type="spellStart"/>
-      <w:r>
-        <w:rPr>
-          <w:rFonts w:ascii="SimSun" w:eastAsia="SimSun" w:hAnsi="SimSun"/>
-          <w:sz w:val="24"/>
-          <w:szCs w:val="24"/>
-        </w:rPr>
-        <w:t>plt.figure</w:t>
-      </w:r>
-      <w:proofErr w:type="spellEnd"/>
-      <w:r>
-        <w:rPr>
-          <w:rFonts w:ascii="SimSun" w:eastAsia="SimSun" w:hAnsi="SimSun"/>
-          <w:sz w:val="24"/>
-          <w:szCs w:val="24"/>
-        </w:rPr>
-        <w:t>(</w:t>
-      </w:r>
-      <w:proofErr w:type="spellStart"/>
-      <w:r>
-        <w:rPr>
-          <w:rFonts w:ascii="SimSun" w:eastAsia="SimSun" w:hAnsi="SimSun"/>
-          <w:sz w:val="24"/>
-          <w:szCs w:val="24"/>
-        </w:rPr>
-        <w:t>figsize</w:t>
-      </w:r>
-      <w:proofErr w:type="spellEnd"/>
-      <w:r>
-        <w:rPr>
-          <w:rFonts w:ascii="SimSun" w:eastAsia="SimSun" w:hAnsi="SimSun"/>
-          <w:sz w:val="24"/>
-          <w:szCs w:val="24"/>
-        </w:rPr>
-        <w:t>=(6, 6), dpi=150)</w:t>
+      <w:r>
+        <w:rPr>
+          <w:rFonts w:ascii="SimSun" w:eastAsia="SimSun" w:hAnsi="SimSun"/>
+          <w:sz w:val="24"/>
+          <w:szCs w:val="24"/>
+        </w:rPr>
+        <w:t>plt.figure(figsize=(6, 6), dpi=150)</w:t>
       </w:r>
     </w:p>
     <w:p>
@@ -1182,7 +915,6 @@
           <w:szCs w:val="24"/>
         </w:rPr>
       </w:pPr>
-      <w:proofErr w:type="spellStart"/>
       <w:r>
         <w:rPr>
           <w:rFonts w:asciiTheme="majorHAnsi" w:hAnsiTheme="majorHAnsi"/>
@@ -1193,69 +925,20 @@
         </w:rPr>
         <w:t>Matlab</w:t>
       </w:r>
-      <w:proofErr w:type="spellEnd"/>
-    </w:p>
-    <w:p>
-      <w:pPr>
-        <w:rPr>
-          <w:sz w:val="24"/>
-          <w:szCs w:val="24"/>
-        </w:rPr>
-      </w:pPr>
-      <w:r>
-        <w:rPr>
-          <w:sz w:val="24"/>
-          <w:szCs w:val="24"/>
-        </w:rPr>
-        <w:t xml:space="preserve">For </w:t>
-      </w:r>
-      <w:proofErr w:type="spellStart"/>
-      <w:r>
-        <w:rPr>
-          <w:sz w:val="24"/>
-          <w:szCs w:val="24"/>
-        </w:rPr>
-        <w:t>matlab</w:t>
-      </w:r>
-      <w:proofErr w:type="spellEnd"/>
-      <w:r>
-        <w:rPr>
-          <w:sz w:val="24"/>
-          <w:szCs w:val="24"/>
-        </w:rPr>
-        <w:t xml:space="preserve"> figures, use the </w:t>
-      </w:r>
-      <w:proofErr w:type="spellStart"/>
-      <w:r>
-        <w:rPr>
-          <w:sz w:val="24"/>
-          <w:szCs w:val="24"/>
-        </w:rPr>
-        <w:t>linspecer</w:t>
-      </w:r>
-      <w:proofErr w:type="spellEnd"/>
-      <w:r>
-        <w:rPr>
-          <w:sz w:val="24"/>
-          <w:szCs w:val="24"/>
-        </w:rPr>
-        <w:t xml:space="preserve"> (from </w:t>
-      </w:r>
-      <w:proofErr w:type="spellStart"/>
-      <w:r>
-        <w:rPr>
-          <w:sz w:val="24"/>
-          <w:szCs w:val="24"/>
-        </w:rPr>
-        <w:t>mathworks</w:t>
-      </w:r>
-      <w:proofErr w:type="spellEnd"/>
-      <w:r>
-        <w:rPr>
-          <w:sz w:val="24"/>
-          <w:szCs w:val="24"/>
-        </w:rPr>
-        <w:t xml:space="preserve"> file exchange) function to </w:t>
+    </w:p>
+    <w:p>
+      <w:pPr>
+        <w:rPr>
+          <w:sz w:val="24"/>
+          <w:szCs w:val="24"/>
+        </w:rPr>
+      </w:pPr>
+      <w:r>
+        <w:rPr>
+          <w:sz w:val="24"/>
+          <w:szCs w:val="24"/>
+        </w:rPr>
+        <w:t xml:space="preserve">For matlab figures, use the linspecer (from mathworks file exchange) function to </w:t>
       </w:r>
     </w:p>
     <w:p>
@@ -1287,25 +970,7 @@
           <w:sz w:val="24"/>
           <w:szCs w:val="24"/>
         </w:rPr>
-        <w:t xml:space="preserve">c = </w:t>
-      </w:r>
-      <w:proofErr w:type="spellStart"/>
-      <w:r>
-        <w:rPr>
-          <w:rFonts w:ascii="SimSun" w:eastAsia="SimSun" w:hAnsi="SimSun"/>
-          <w:sz w:val="24"/>
-          <w:szCs w:val="24"/>
-        </w:rPr>
-        <w:t>linspecer</w:t>
-      </w:r>
-      <w:proofErr w:type="spellEnd"/>
-      <w:r>
-        <w:rPr>
-          <w:rFonts w:ascii="SimSun" w:eastAsia="SimSun" w:hAnsi="SimSun"/>
-          <w:sz w:val="24"/>
-          <w:szCs w:val="24"/>
-        </w:rPr>
-        <w:t>(2);</w:t>
+        <w:t>c = linspecer(2);</w:t>
       </w:r>
     </w:p>
     <w:p>
@@ -1333,156 +998,56 @@
           <w:szCs w:val="24"/>
         </w:rPr>
       </w:pPr>
-      <w:proofErr w:type="spellStart"/>
-      <w:r>
-        <w:rPr>
-          <w:rFonts w:ascii="SimSun" w:eastAsia="SimSun" w:hAnsi="SimSun"/>
-          <w:sz w:val="24"/>
-          <w:szCs w:val="24"/>
-        </w:rPr>
-        <w:t>aspect_ratio</w:t>
-      </w:r>
-      <w:proofErr w:type="spellEnd"/>
-      <w:r>
-        <w:rPr>
-          <w:rFonts w:ascii="SimSun" w:eastAsia="SimSun" w:hAnsi="SimSun"/>
-          <w:sz w:val="24"/>
-          <w:szCs w:val="24"/>
-        </w:rPr>
-        <w:t xml:space="preserve"> = size.*[6,4];</w:t>
-      </w:r>
-    </w:p>
-    <w:p>
-      <w:pPr>
-        <w:rPr>
-          <w:rFonts w:ascii="SimSun" w:eastAsia="SimSun" w:hAnsi="SimSun"/>
-          <w:sz w:val="24"/>
-          <w:szCs w:val="24"/>
-        </w:rPr>
-      </w:pPr>
-    </w:p>
-    <w:p>
-      <w:pPr>
-        <w:rPr>
-          <w:rFonts w:ascii="SimSun" w:eastAsia="SimSun" w:hAnsi="SimSun"/>
-          <w:sz w:val="24"/>
-          <w:szCs w:val="24"/>
-        </w:rPr>
-      </w:pPr>
-      <w:r>
-        <w:rPr>
-          <w:rFonts w:ascii="SimSun" w:eastAsia="SimSun" w:hAnsi="SimSun"/>
-          <w:sz w:val="24"/>
-          <w:szCs w:val="24"/>
-        </w:rPr>
-        <w:t>figure('</w:t>
-      </w:r>
-      <w:proofErr w:type="spellStart"/>
-      <w:r>
-        <w:rPr>
-          <w:rFonts w:ascii="SimSun" w:eastAsia="SimSun" w:hAnsi="SimSun"/>
-          <w:sz w:val="24"/>
-          <w:szCs w:val="24"/>
-        </w:rPr>
-        <w:t>Name','dark</w:t>
-      </w:r>
-      <w:proofErr w:type="spellEnd"/>
-      <w:r>
-        <w:rPr>
-          <w:rFonts w:ascii="SimSun" w:eastAsia="SimSun" w:hAnsi="SimSun"/>
-          <w:sz w:val="24"/>
-          <w:szCs w:val="24"/>
-        </w:rPr>
-        <w:t xml:space="preserve"> </w:t>
-      </w:r>
-      <w:proofErr w:type="spellStart"/>
-      <w:r>
-        <w:rPr>
-          <w:rFonts w:ascii="SimSun" w:eastAsia="SimSun" w:hAnsi="SimSun"/>
-          <w:sz w:val="24"/>
-          <w:szCs w:val="24"/>
-        </w:rPr>
-        <w:t>noise','units','inches','position</w:t>
-      </w:r>
-      <w:proofErr w:type="spellEnd"/>
-      <w:r>
-        <w:rPr>
-          <w:rFonts w:ascii="SimSun" w:eastAsia="SimSun" w:hAnsi="SimSun"/>
-          <w:sz w:val="24"/>
-          <w:szCs w:val="24"/>
-        </w:rPr>
-        <w:t xml:space="preserve">',[0 0 </w:t>
-      </w:r>
-      <w:proofErr w:type="spellStart"/>
-      <w:r>
-        <w:rPr>
-          <w:rFonts w:ascii="SimSun" w:eastAsia="SimSun" w:hAnsi="SimSun"/>
-          <w:sz w:val="24"/>
-          <w:szCs w:val="24"/>
-        </w:rPr>
-        <w:t>aspect_ratio</w:t>
-      </w:r>
-      <w:proofErr w:type="spellEnd"/>
-      <w:r>
-        <w:rPr>
-          <w:rFonts w:ascii="SimSun" w:eastAsia="SimSun" w:hAnsi="SimSun"/>
-          <w:sz w:val="24"/>
-          <w:szCs w:val="24"/>
-        </w:rPr>
-        <w:t xml:space="preserve">(1) </w:t>
-      </w:r>
-      <w:proofErr w:type="spellStart"/>
-      <w:r>
-        <w:rPr>
-          <w:rFonts w:ascii="SimSun" w:eastAsia="SimSun" w:hAnsi="SimSun"/>
-          <w:sz w:val="24"/>
-          <w:szCs w:val="24"/>
-        </w:rPr>
-        <w:t>aspect_ratio</w:t>
-      </w:r>
-      <w:proofErr w:type="spellEnd"/>
-      <w:r>
-        <w:rPr>
-          <w:rFonts w:ascii="SimSun" w:eastAsia="SimSun" w:hAnsi="SimSun"/>
-          <w:sz w:val="24"/>
-          <w:szCs w:val="24"/>
-        </w:rPr>
-        <w:t>(2)])</w:t>
-      </w:r>
-    </w:p>
-    <w:p>
-      <w:pPr>
-        <w:rPr>
-          <w:rFonts w:ascii="SimSun" w:eastAsia="SimSun" w:hAnsi="SimSun"/>
-          <w:sz w:val="24"/>
-          <w:szCs w:val="24"/>
-        </w:rPr>
-      </w:pPr>
-      <w:r>
-        <w:rPr>
-          <w:rFonts w:ascii="SimSun" w:eastAsia="SimSun" w:hAnsi="SimSun"/>
-          <w:sz w:val="24"/>
-          <w:szCs w:val="24"/>
-        </w:rPr>
-        <w:t>loglog(x1, y1, '</w:t>
-      </w:r>
-      <w:proofErr w:type="spellStart"/>
-      <w:r>
-        <w:rPr>
-          <w:rFonts w:ascii="SimSun" w:eastAsia="SimSun" w:hAnsi="SimSun"/>
-          <w:sz w:val="24"/>
-          <w:szCs w:val="24"/>
-        </w:rPr>
-        <w:t>color</w:t>
-      </w:r>
-      <w:proofErr w:type="spellEnd"/>
-      <w:r>
-        <w:rPr>
-          <w:rFonts w:ascii="SimSun" w:eastAsia="SimSun" w:hAnsi="SimSun"/>
-          <w:sz w:val="24"/>
-          <w:szCs w:val="24"/>
-        </w:rPr>
-        <w:t>',c(1,:))</w:t>
+      <w:r>
+        <w:rPr>
+          <w:rFonts w:ascii="SimSun" w:eastAsia="SimSun" w:hAnsi="SimSun"/>
+          <w:sz w:val="24"/>
+          <w:szCs w:val="24"/>
+        </w:rPr>
+        <w:t>aspect_ratio = size.*[6,4];</w:t>
+      </w:r>
+    </w:p>
+    <w:p>
+      <w:pPr>
+        <w:rPr>
+          <w:rFonts w:ascii="SimSun" w:eastAsia="SimSun" w:hAnsi="SimSun"/>
+          <w:sz w:val="24"/>
+          <w:szCs w:val="24"/>
+        </w:rPr>
+      </w:pPr>
+    </w:p>
+    <w:p>
+      <w:pPr>
+        <w:rPr>
+          <w:rFonts w:ascii="SimSun" w:eastAsia="SimSun" w:hAnsi="SimSun"/>
+          <w:sz w:val="24"/>
+          <w:szCs w:val="24"/>
+        </w:rPr>
+      </w:pPr>
+      <w:r>
+        <w:rPr>
+          <w:rFonts w:ascii="SimSun" w:eastAsia="SimSun" w:hAnsi="SimSun"/>
+          <w:sz w:val="24"/>
+          <w:szCs w:val="24"/>
+        </w:rPr>
+        <w:t>figure('Name','dark noise','units','inches','position',[0 0 aspect_ratio(1) aspect_ratio(2)])</w:t>
+      </w:r>
+    </w:p>
+    <w:p>
+      <w:pPr>
+        <w:rPr>
+          <w:rFonts w:ascii="SimSun" w:eastAsia="SimSun" w:hAnsi="SimSun"/>
+          <w:sz w:val="24"/>
+          <w:szCs w:val="24"/>
+        </w:rPr>
+      </w:pPr>
+      <w:r>
+        <w:rPr>
+          <w:rFonts w:ascii="SimSun" w:eastAsia="SimSun" w:hAnsi="SimSun"/>
+          <w:sz w:val="24"/>
+          <w:szCs w:val="24"/>
+        </w:rPr>
+        <w:t>loglog(x1, y1, 'color',c(1,:))</w:t>
       </w:r>
     </w:p>
     <w:p>
@@ -1516,41 +1081,24 @@
           <w:sz w:val="24"/>
           <w:szCs w:val="24"/>
         </w:rPr>
-        <w:t>loglog(x2, y2, '</w:t>
-      </w:r>
-      <w:proofErr w:type="spellStart"/>
-      <w:r>
-        <w:rPr>
-          <w:rFonts w:ascii="SimSun" w:eastAsia="SimSun" w:hAnsi="SimSun"/>
-          <w:sz w:val="24"/>
-          <w:szCs w:val="24"/>
-        </w:rPr>
-        <w:t>color</w:t>
-      </w:r>
-      <w:proofErr w:type="spellEnd"/>
-      <w:r>
-        <w:rPr>
-          <w:rFonts w:ascii="SimSun" w:eastAsia="SimSun" w:hAnsi="SimSun"/>
-          <w:sz w:val="24"/>
-          <w:szCs w:val="24"/>
-        </w:rPr>
-        <w:t>',c(2,:))</w:t>
-      </w:r>
-    </w:p>
-    <w:p>
-      <w:pPr>
-        <w:rPr>
-          <w:rFonts w:ascii="SimSun" w:eastAsia="SimSun" w:hAnsi="SimSun"/>
-          <w:sz w:val="24"/>
-          <w:szCs w:val="24"/>
-        </w:rPr>
-      </w:pPr>
-      <w:r>
-        <w:rPr>
-          <w:rFonts w:ascii="SimSun" w:eastAsia="SimSun" w:hAnsi="SimSun"/>
-          <w:sz w:val="24"/>
-          <w:szCs w:val="24"/>
-        </w:rPr>
+        <w:t>loglog(x2, y2, 'color',c(2,:))</w:t>
+      </w:r>
+    </w:p>
+    <w:p>
+      <w:pPr>
+        <w:rPr>
+          <w:rFonts w:ascii="SimSun" w:eastAsia="SimSun" w:hAnsi="SimSun"/>
+          <w:sz w:val="24"/>
+          <w:szCs w:val="24"/>
+        </w:rPr>
+      </w:pPr>
+      <w:r>
+        <w:rPr>
+          <w:rFonts w:ascii="SimSun" w:eastAsia="SimSun" w:hAnsi="SimSun"/>
+          <w:sz w:val="24"/>
+          <w:szCs w:val="24"/>
+        </w:rPr>
+        <w:lastRenderedPageBreak/>
         <w:t>hold off</w:t>
       </w:r>
     </w:p>
@@ -1579,69 +1127,30 @@
           <w:szCs w:val="24"/>
         </w:rPr>
       </w:pPr>
-      <w:proofErr w:type="spellStart"/>
-      <w:r>
-        <w:rPr>
-          <w:rFonts w:ascii="SimSun" w:eastAsia="SimSun" w:hAnsi="SimSun"/>
-          <w:sz w:val="24"/>
-          <w:szCs w:val="24"/>
-        </w:rPr>
-        <w:lastRenderedPageBreak/>
-        <w:t>xlabel</w:t>
-      </w:r>
-      <w:proofErr w:type="spellEnd"/>
-      <w:r>
-        <w:rPr>
-          <w:rFonts w:ascii="SimSun" w:eastAsia="SimSun" w:hAnsi="SimSun"/>
-          <w:sz w:val="24"/>
-          <w:szCs w:val="24"/>
-        </w:rPr>
-        <w:t>('Frequency (Hz)')</w:t>
-      </w:r>
-    </w:p>
-    <w:p>
-      <w:pPr>
-        <w:rPr>
-          <w:rFonts w:ascii="SimSun" w:eastAsia="SimSun" w:hAnsi="SimSun"/>
-          <w:sz w:val="24"/>
-          <w:szCs w:val="24"/>
-        </w:rPr>
-      </w:pPr>
-      <w:proofErr w:type="spellStart"/>
-      <w:r>
-        <w:rPr>
-          <w:rFonts w:ascii="SimSun" w:eastAsia="SimSun" w:hAnsi="SimSun"/>
-          <w:sz w:val="24"/>
-          <w:szCs w:val="24"/>
-        </w:rPr>
-        <w:t>ylabel</w:t>
-      </w:r>
-      <w:proofErr w:type="spellEnd"/>
-      <w:r>
-        <w:rPr>
-          <w:rFonts w:ascii="SimSun" w:eastAsia="SimSun" w:hAnsi="SimSun"/>
-          <w:sz w:val="24"/>
-          <w:szCs w:val="24"/>
-        </w:rPr>
-        <w:t>('</w:t>
-      </w:r>
-      <w:proofErr w:type="spellStart"/>
-      <w:r>
-        <w:rPr>
-          <w:rFonts w:ascii="SimSun" w:eastAsia="SimSun" w:hAnsi="SimSun"/>
-          <w:sz w:val="24"/>
-          <w:szCs w:val="24"/>
-        </w:rPr>
-        <w:t>I_r_m_s</w:t>
-      </w:r>
-      <w:proofErr w:type="spellEnd"/>
-      <w:r>
-        <w:rPr>
-          <w:rFonts w:ascii="SimSun" w:eastAsia="SimSun" w:hAnsi="SimSun"/>
-          <w:sz w:val="24"/>
-          <w:szCs w:val="24"/>
-        </w:rPr>
-        <w:t>/\surd(Hz)')</w:t>
+      <w:r>
+        <w:rPr>
+          <w:rFonts w:ascii="SimSun" w:eastAsia="SimSun" w:hAnsi="SimSun"/>
+          <w:sz w:val="24"/>
+          <w:szCs w:val="24"/>
+        </w:rPr>
+        <w:t>xlabel('Frequency (Hz)')</w:t>
+      </w:r>
+    </w:p>
+    <w:p>
+      <w:pPr>
+        <w:rPr>
+          <w:rFonts w:ascii="SimSun" w:eastAsia="SimSun" w:hAnsi="SimSun"/>
+          <w:sz w:val="24"/>
+          <w:szCs w:val="24"/>
+        </w:rPr>
+      </w:pPr>
+      <w:r>
+        <w:rPr>
+          <w:rFonts w:ascii="SimSun" w:eastAsia="SimSun" w:hAnsi="SimSun"/>
+          <w:sz w:val="24"/>
+          <w:szCs w:val="24"/>
+        </w:rPr>
+        <w:t>ylabel('I_r_m_s/\surd(Hz)')</w:t>
       </w:r>
     </w:p>
     <w:p>
@@ -1692,25 +1201,7 @@
           <w:sz w:val="24"/>
           <w:szCs w:val="24"/>
         </w:rPr>
-        <w:t>print('Noise_low_f','-</w:t>
-      </w:r>
-      <w:proofErr w:type="spellStart"/>
-      <w:r>
-        <w:rPr>
-          <w:rFonts w:ascii="SimSun" w:eastAsia="SimSun" w:hAnsi="SimSun"/>
-          <w:sz w:val="24"/>
-          <w:szCs w:val="24"/>
-        </w:rPr>
-        <w:t>depsc</w:t>
-      </w:r>
-      <w:proofErr w:type="spellEnd"/>
-      <w:r>
-        <w:rPr>
-          <w:rFonts w:ascii="SimSun" w:eastAsia="SimSun" w:hAnsi="SimSun"/>
-          <w:sz w:val="24"/>
-          <w:szCs w:val="24"/>
-        </w:rPr>
-        <w:t>')</w:t>
+        <w:t>print('Noise_low_f','-depsc')</w:t>
       </w:r>
     </w:p>
     <w:p>
@@ -1816,23 +1307,7 @@
           <w:sz w:val="24"/>
           <w:szCs w:val="24"/>
         </w:rPr>
-        <w:t xml:space="preserve">have </w:t>
-      </w:r>
-      <w:proofErr w:type="spellStart"/>
-      <w:r>
-        <w:rPr>
-          <w:sz w:val="24"/>
-          <w:szCs w:val="24"/>
-        </w:rPr>
-        <w:t>gnd</w:t>
-      </w:r>
-      <w:proofErr w:type="spellEnd"/>
-      <w:r>
-        <w:rPr>
-          <w:sz w:val="24"/>
-          <w:szCs w:val="24"/>
-        </w:rPr>
-        <w:t xml:space="preserve"> at the bottom of the diagram.</w:t>
+        <w:t>have gnd at the bottom of the diagram.</w:t>
       </w:r>
     </w:p>
     <w:p>
@@ -2389,6 +1864,7 @@
     <w:lsdException w:name="HTML Sample" w:semiHidden="1" w:unhideWhenUsed="1"/>
     <w:lsdException w:name="HTML Typewriter" w:semiHidden="1" w:unhideWhenUsed="1"/>
     <w:lsdException w:name="HTML Variable" w:semiHidden="1" w:unhideWhenUsed="1"/>
+    <w:lsdException w:name="Normal Table" w:semiHidden="1" w:unhideWhenUsed="1"/>
     <w:lsdException w:name="annotation subject" w:semiHidden="1" w:unhideWhenUsed="1"/>
     <w:lsdException w:name="No List" w:semiHidden="1" w:unhideWhenUsed="1"/>
     <w:lsdException w:name="Outline List 1" w:semiHidden="1" w:unhideWhenUsed="1"/>
@@ -2435,8 +1911,10 @@
     <w:lsdException w:name="Table Subtle 2" w:semiHidden="1" w:unhideWhenUsed="1"/>
     <w:lsdException w:name="Table Web 1" w:semiHidden="1" w:unhideWhenUsed="1"/>
     <w:lsdException w:name="Table Web 2" w:semiHidden="1" w:unhideWhenUsed="1"/>
+    <w:lsdException w:name="Table Web 3" w:semiHidden="1" w:unhideWhenUsed="1"/>
     <w:lsdException w:name="Balloon Text" w:semiHidden="1" w:unhideWhenUsed="1"/>
     <w:lsdException w:name="Table Grid" w:uiPriority="39"/>
+    <w:lsdException w:name="Table Theme" w:semiHidden="1" w:unhideWhenUsed="1"/>
     <w:lsdException w:name="Placeholder Text" w:semiHidden="1"/>
     <w:lsdException w:name="No Spacing" w:uiPriority="1" w:qFormat="1"/>
     <w:lsdException w:name="Light Shading" w:uiPriority="60"/>

</xml_diff>

<commit_message>
Finished main content of BHD for ligo chapter
added 1 figure, and wrote a section on the WS analysis.
</commit_message>
<xml_diff>
--- a/Structuring.docx
+++ b/Structuring.docx
@@ -29,13 +29,11 @@
           <w:rFonts w:asciiTheme="majorHAnsi" w:hAnsiTheme="majorHAnsi"/>
           <w:b/>
           <w:bCs/>
-          <w:sz w:val="40"/>
-          <w:szCs w:val="40"/>
-        </w:rPr>
-      </w:pPr>
-    </w:p>
-    <w:p>
-      <w:pPr>
+          <w:sz w:val="32"/>
+          <w:szCs w:val="32"/>
+        </w:rPr>
+      </w:pPr>
+      <w:r>
         <w:rPr>
           <w:rFonts w:asciiTheme="majorHAnsi" w:hAnsiTheme="majorHAnsi"/>
           <w:b/>
@@ -43,7 +41,8 @@
           <w:sz w:val="32"/>
           <w:szCs w:val="32"/>
         </w:rPr>
-      </w:pPr>
+        <w:t>Structur</w:t>
+      </w:r>
       <w:r>
         <w:rPr>
           <w:rFonts w:asciiTheme="majorHAnsi" w:hAnsiTheme="majorHAnsi"/>
@@ -52,7 +51,7 @@
           <w:sz w:val="32"/>
           <w:szCs w:val="32"/>
         </w:rPr>
-        <w:t>Structur</w:t>
+        <w:t>ing</w:t>
       </w:r>
       <w:r>
         <w:rPr>
@@ -62,9 +61,54 @@
           <w:sz w:val="32"/>
           <w:szCs w:val="32"/>
         </w:rPr>
-        <w:t>ing</w:t>
-      </w:r>
-      <w:r>
+        <w:t xml:space="preserve"> of Chapters</w:t>
+      </w:r>
+    </w:p>
+    <w:p>
+      <w:pPr>
+        <w:rPr>
+          <w:rFonts w:cstheme="minorHAnsi"/>
+          <w:sz w:val="24"/>
+          <w:szCs w:val="24"/>
+        </w:rPr>
+      </w:pPr>
+      <w:r>
+        <w:rPr>
+          <w:rFonts w:cstheme="minorHAnsi"/>
+          <w:sz w:val="24"/>
+          <w:szCs w:val="24"/>
+        </w:rPr>
+        <w:t xml:space="preserve">This is the first step to writing a chapter. Come up with likely </w:t>
+      </w:r>
+      <w:proofErr w:type="gramStart"/>
+      <w:r>
+        <w:rPr>
+          <w:rFonts w:cstheme="minorHAnsi"/>
+          <w:sz w:val="24"/>
+          <w:szCs w:val="24"/>
+        </w:rPr>
+        <w:t>sections,</w:t>
+      </w:r>
+      <w:r>
+        <w:rPr>
+          <w:rFonts w:cstheme="minorHAnsi"/>
+          <w:sz w:val="24"/>
+          <w:szCs w:val="24"/>
+        </w:rPr>
+        <w:t xml:space="preserve"> and</w:t>
+      </w:r>
+      <w:proofErr w:type="gramEnd"/>
+      <w:r>
+        <w:rPr>
+          <w:rFonts w:cstheme="minorHAnsi"/>
+          <w:sz w:val="24"/>
+          <w:szCs w:val="24"/>
+        </w:rPr>
+        <w:t xml:space="preserve"> fill them in with ideas for paragraphs. Think about/put in relevant figures at this point.</w:t>
+      </w:r>
+    </w:p>
+    <w:p>
+      <w:pPr>
         <w:rPr>
           <w:rFonts w:asciiTheme="majorHAnsi" w:hAnsiTheme="majorHAnsi"/>
           <w:b/>
@@ -72,11 +116,8 @@
           <w:sz w:val="32"/>
           <w:szCs w:val="32"/>
         </w:rPr>
-        <w:t xml:space="preserve"> of Chapters</w:t>
-      </w:r>
-    </w:p>
-    <w:p>
-      <w:pPr>
+      </w:pPr>
+      <w:r>
         <w:rPr>
           <w:rFonts w:asciiTheme="majorHAnsi" w:hAnsiTheme="majorHAnsi"/>
           <w:b/>
@@ -84,21 +125,9 @@
           <w:sz w:val="32"/>
           <w:szCs w:val="32"/>
         </w:rPr>
-      </w:pPr>
-    </w:p>
-    <w:p>
-      <w:pPr>
-        <w:rPr>
-          <w:sz w:val="24"/>
-          <w:szCs w:val="24"/>
-        </w:rPr>
-      </w:pPr>
-      <w:r>
-        <w:t xml:space="preserve"> </w:t>
-      </w:r>
-    </w:p>
-    <w:p>
-      <w:pPr>
+        <w:t>Process</w:t>
+      </w:r>
+      <w:r>
         <w:rPr>
           <w:rFonts w:asciiTheme="majorHAnsi" w:hAnsiTheme="majorHAnsi"/>
           <w:b/>
@@ -106,7 +135,8 @@
           <w:sz w:val="32"/>
           <w:szCs w:val="32"/>
         </w:rPr>
-      </w:pPr>
+        <w:t xml:space="preserve"> of </w:t>
+      </w:r>
       <w:r>
         <w:rPr>
           <w:rFonts w:asciiTheme="majorHAnsi" w:hAnsiTheme="majorHAnsi"/>
@@ -115,9 +145,519 @@
           <w:sz w:val="32"/>
           <w:szCs w:val="32"/>
         </w:rPr>
-        <w:t xml:space="preserve">Presentation of </w:t>
-      </w:r>
-      <w:r>
+        <w:t>Drafting</w:t>
+      </w:r>
+    </w:p>
+    <w:p>
+      <w:pPr>
+        <w:pStyle w:val="ListParagraph"/>
+        <w:numPr>
+          <w:ilvl w:val="0"/>
+          <w:numId w:val="4"/>
+        </w:numPr>
+        <w:rPr>
+          <w:rFonts w:cstheme="minorHAnsi"/>
+          <w:b/>
+          <w:bCs/>
+          <w:sz w:val="40"/>
+          <w:szCs w:val="40"/>
+        </w:rPr>
+      </w:pPr>
+      <w:r>
+        <w:rPr>
+          <w:rFonts w:cstheme="minorHAnsi"/>
+          <w:sz w:val="24"/>
+          <w:szCs w:val="24"/>
+        </w:rPr>
+        <w:t xml:space="preserve">First </w:t>
+      </w:r>
+      <w:r>
+        <w:rPr>
+          <w:rFonts w:cstheme="minorHAnsi"/>
+          <w:sz w:val="24"/>
+          <w:szCs w:val="24"/>
+        </w:rPr>
+        <w:t xml:space="preserve">draft will be achieved by </w:t>
+      </w:r>
+      <w:r>
+        <w:rPr>
+          <w:rFonts w:cstheme="minorHAnsi"/>
+          <w:sz w:val="24"/>
+          <w:szCs w:val="24"/>
+        </w:rPr>
+        <w:t xml:space="preserve">writing. </w:t>
+      </w:r>
+      <w:proofErr w:type="gramStart"/>
+      <w:r>
+        <w:rPr>
+          <w:rFonts w:cstheme="minorHAnsi"/>
+          <w:sz w:val="24"/>
+          <w:szCs w:val="24"/>
+        </w:rPr>
+        <w:t>The majority of</w:t>
+      </w:r>
+      <w:proofErr w:type="gramEnd"/>
+      <w:r>
+        <w:rPr>
+          <w:rFonts w:cstheme="minorHAnsi"/>
+          <w:sz w:val="24"/>
+          <w:szCs w:val="24"/>
+        </w:rPr>
+        <w:t xml:space="preserve"> the content of the chapter (&lt;90%) will be written by the end of this draft</w:t>
+      </w:r>
+      <w:r>
+        <w:rPr>
+          <w:rFonts w:cstheme="minorHAnsi"/>
+          <w:sz w:val="24"/>
+          <w:szCs w:val="24"/>
+        </w:rPr>
+        <w:t xml:space="preserve">. The writing at this point may be ‘stream of </w:t>
+      </w:r>
+      <w:proofErr w:type="spellStart"/>
+      <w:r>
+        <w:rPr>
+          <w:rFonts w:cstheme="minorHAnsi"/>
+          <w:sz w:val="24"/>
+          <w:szCs w:val="24"/>
+        </w:rPr>
+        <w:t>conciouness</w:t>
+      </w:r>
+      <w:proofErr w:type="spellEnd"/>
+      <w:r>
+        <w:rPr>
+          <w:rFonts w:cstheme="minorHAnsi"/>
+          <w:sz w:val="24"/>
+          <w:szCs w:val="24"/>
+        </w:rPr>
+        <w:t>`-</w:t>
+      </w:r>
+      <w:proofErr w:type="spellStart"/>
+      <w:r>
+        <w:rPr>
+          <w:rFonts w:cstheme="minorHAnsi"/>
+          <w:sz w:val="24"/>
+          <w:szCs w:val="24"/>
+        </w:rPr>
+        <w:t>esk</w:t>
+      </w:r>
+      <w:proofErr w:type="spellEnd"/>
+      <w:r>
+        <w:rPr>
+          <w:rFonts w:cstheme="minorHAnsi"/>
+          <w:sz w:val="24"/>
+          <w:szCs w:val="24"/>
+        </w:rPr>
+        <w:t xml:space="preserve">, but it should have had an attempt at making it clear. </w:t>
+      </w:r>
+      <w:r>
+        <w:rPr>
+          <w:rFonts w:cstheme="minorHAnsi"/>
+          <w:sz w:val="24"/>
+          <w:szCs w:val="24"/>
+        </w:rPr>
+        <w:t xml:space="preserve">All sections will be </w:t>
+      </w:r>
+      <w:r>
+        <w:rPr>
+          <w:rFonts w:cstheme="minorHAnsi"/>
+          <w:sz w:val="24"/>
+          <w:szCs w:val="24"/>
+        </w:rPr>
+        <w:t>probably be included and completed</w:t>
+      </w:r>
+      <w:r>
+        <w:rPr>
+          <w:rFonts w:cstheme="minorHAnsi"/>
+          <w:sz w:val="24"/>
+          <w:szCs w:val="24"/>
+        </w:rPr>
+        <w:t xml:space="preserve"> by this point</w:t>
+      </w:r>
+      <w:r>
+        <w:rPr>
+          <w:rFonts w:cstheme="minorHAnsi"/>
+          <w:sz w:val="24"/>
+          <w:szCs w:val="24"/>
+        </w:rPr>
+        <w:t>.</w:t>
+      </w:r>
+      <w:r>
+        <w:rPr>
+          <w:rFonts w:cstheme="minorHAnsi"/>
+          <w:sz w:val="24"/>
+          <w:szCs w:val="24"/>
+        </w:rPr>
+        <w:t xml:space="preserve"> Most figures will be included by now.</w:t>
+      </w:r>
+      <w:r>
+        <w:rPr>
+          <w:rFonts w:cstheme="minorHAnsi"/>
+          <w:sz w:val="24"/>
+          <w:szCs w:val="24"/>
+        </w:rPr>
+        <w:t xml:space="preserve"> Ignore most citations for now, just put in useful links for myself.</w:t>
+      </w:r>
+    </w:p>
+    <w:p>
+      <w:pPr>
+        <w:pStyle w:val="ListParagraph"/>
+        <w:numPr>
+          <w:ilvl w:val="0"/>
+          <w:numId w:val="4"/>
+        </w:numPr>
+        <w:rPr>
+          <w:rFonts w:cstheme="minorHAnsi"/>
+          <w:b/>
+          <w:bCs/>
+          <w:sz w:val="40"/>
+          <w:szCs w:val="40"/>
+        </w:rPr>
+      </w:pPr>
+      <w:r>
+        <w:rPr>
+          <w:rFonts w:cstheme="minorHAnsi"/>
+          <w:sz w:val="24"/>
+          <w:szCs w:val="24"/>
+        </w:rPr>
+        <w:t>Second</w:t>
+      </w:r>
+      <w:r>
+        <w:rPr>
+          <w:rFonts w:cstheme="minorHAnsi"/>
+          <w:sz w:val="24"/>
+          <w:szCs w:val="24"/>
+        </w:rPr>
+        <w:t xml:space="preserve"> draft will be focussed on </w:t>
+      </w:r>
+      <w:r>
+        <w:rPr>
+          <w:rFonts w:cstheme="minorHAnsi"/>
+          <w:sz w:val="24"/>
+          <w:szCs w:val="24"/>
+        </w:rPr>
+        <w:t>structuring of sections.</w:t>
+      </w:r>
+      <w:r>
+        <w:rPr>
+          <w:rFonts w:cstheme="minorHAnsi"/>
+          <w:sz w:val="24"/>
+          <w:szCs w:val="24"/>
+        </w:rPr>
+        <w:t xml:space="preserve"> </w:t>
+      </w:r>
+      <w:r>
+        <w:rPr>
+          <w:rFonts w:cstheme="minorHAnsi"/>
+          <w:sz w:val="24"/>
+          <w:szCs w:val="24"/>
+        </w:rPr>
+        <w:t>The most important structural elements of a section are the introduction and the conclusion.</w:t>
+      </w:r>
+      <w:r>
+        <w:rPr>
+          <w:rFonts w:cstheme="minorHAnsi"/>
+          <w:sz w:val="24"/>
+          <w:szCs w:val="24"/>
+        </w:rPr>
+        <w:t xml:space="preserve"> </w:t>
+      </w:r>
+      <w:r>
+        <w:rPr>
+          <w:rFonts w:cstheme="minorHAnsi"/>
+          <w:sz w:val="24"/>
+          <w:szCs w:val="24"/>
+        </w:rPr>
+        <w:t>Other tasks at t</w:t>
+      </w:r>
+      <w:r>
+        <w:rPr>
+          <w:rFonts w:cstheme="minorHAnsi"/>
+          <w:sz w:val="24"/>
+          <w:szCs w:val="24"/>
+        </w:rPr>
+        <w:t>his</w:t>
+      </w:r>
+      <w:r>
+        <w:rPr>
+          <w:rFonts w:cstheme="minorHAnsi"/>
+          <w:sz w:val="24"/>
+          <w:szCs w:val="24"/>
+        </w:rPr>
+        <w:t xml:space="preserve"> draft</w:t>
+      </w:r>
+      <w:r>
+        <w:rPr>
+          <w:rFonts w:cstheme="minorHAnsi"/>
+          <w:sz w:val="24"/>
+          <w:szCs w:val="24"/>
+        </w:rPr>
+        <w:t xml:space="preserve"> include </w:t>
+      </w:r>
+      <w:r>
+        <w:rPr>
+          <w:rFonts w:cstheme="minorHAnsi"/>
+          <w:sz w:val="24"/>
+          <w:szCs w:val="24"/>
+        </w:rPr>
+        <w:t xml:space="preserve">organising the paragraphs. If it becomes obvious that there </w:t>
+      </w:r>
+      <w:proofErr w:type="gramStart"/>
+      <w:r>
+        <w:rPr>
+          <w:rFonts w:cstheme="minorHAnsi"/>
+          <w:sz w:val="24"/>
+          <w:szCs w:val="24"/>
+        </w:rPr>
+        <w:t>are</w:t>
+      </w:r>
+      <w:proofErr w:type="gramEnd"/>
+      <w:r>
+        <w:rPr>
+          <w:rFonts w:cstheme="minorHAnsi"/>
+          <w:sz w:val="24"/>
+          <w:szCs w:val="24"/>
+        </w:rPr>
+        <w:t xml:space="preserve"> bit which are missing, then they shall be added at this point. They will be completed to the same quality as the rest of the contents of the second draft.</w:t>
+      </w:r>
+    </w:p>
+    <w:p>
+      <w:pPr>
+        <w:pStyle w:val="ListParagraph"/>
+        <w:numPr>
+          <w:ilvl w:val="0"/>
+          <w:numId w:val="4"/>
+        </w:numPr>
+        <w:rPr>
+          <w:rFonts w:cstheme="minorHAnsi"/>
+          <w:b/>
+          <w:bCs/>
+          <w:sz w:val="40"/>
+          <w:szCs w:val="40"/>
+        </w:rPr>
+      </w:pPr>
+      <w:r>
+        <w:rPr>
+          <w:rFonts w:cstheme="minorHAnsi"/>
+          <w:sz w:val="24"/>
+          <w:szCs w:val="24"/>
+        </w:rPr>
+        <w:t>Third</w:t>
+      </w:r>
+      <w:r>
+        <w:rPr>
+          <w:rFonts w:cstheme="minorHAnsi"/>
+          <w:sz w:val="24"/>
+          <w:szCs w:val="24"/>
+        </w:rPr>
+        <w:t xml:space="preserve"> draft will be figure focussed: All the figures will be made to their final form (hopefully), and captions will be written to their final form. </w:t>
+      </w:r>
+      <w:r>
+        <w:rPr>
+          <w:rFonts w:cstheme="minorHAnsi"/>
+          <w:sz w:val="24"/>
+          <w:szCs w:val="24"/>
+        </w:rPr>
+        <w:t>The second drafting may reveal points where a figure would help explain something.</w:t>
+      </w:r>
+    </w:p>
+    <w:p>
+      <w:pPr>
+        <w:pStyle w:val="ListParagraph"/>
+        <w:numPr>
+          <w:ilvl w:val="0"/>
+          <w:numId w:val="4"/>
+        </w:numPr>
+        <w:rPr>
+          <w:rFonts w:cstheme="minorHAnsi"/>
+          <w:b/>
+          <w:bCs/>
+          <w:sz w:val="40"/>
+          <w:szCs w:val="40"/>
+        </w:rPr>
+      </w:pPr>
+      <w:r>
+        <w:rPr>
+          <w:rFonts w:cstheme="minorHAnsi"/>
+          <w:sz w:val="24"/>
+          <w:szCs w:val="24"/>
+        </w:rPr>
+        <w:t>Fourth</w:t>
+      </w:r>
+      <w:r>
+        <w:rPr>
+          <w:rFonts w:cstheme="minorHAnsi"/>
+          <w:sz w:val="24"/>
+          <w:szCs w:val="24"/>
+        </w:rPr>
+        <w:t xml:space="preserve"> draft</w:t>
+      </w:r>
+      <w:r>
+        <w:rPr>
+          <w:rFonts w:cstheme="minorHAnsi"/>
+          <w:sz w:val="24"/>
+          <w:szCs w:val="24"/>
+        </w:rPr>
+        <w:t xml:space="preserve"> will be focussed on the sentence level. This involves </w:t>
+      </w:r>
+      <w:r>
+        <w:rPr>
+          <w:rFonts w:cstheme="minorHAnsi"/>
+          <w:sz w:val="24"/>
+          <w:szCs w:val="24"/>
+        </w:rPr>
+        <w:t>rewording hard to read sentences</w:t>
+      </w:r>
+      <w:r>
+        <w:rPr>
+          <w:rFonts w:cstheme="minorHAnsi"/>
+          <w:sz w:val="24"/>
+          <w:szCs w:val="24"/>
+        </w:rPr>
+        <w:t>.</w:t>
+      </w:r>
+      <w:r>
+        <w:rPr>
+          <w:rFonts w:cstheme="minorHAnsi"/>
+          <w:sz w:val="24"/>
+          <w:szCs w:val="24"/>
+        </w:rPr>
+        <w:t xml:space="preserve"> This is where all the necessary citations will be put in.</w:t>
+      </w:r>
+    </w:p>
+    <w:p>
+      <w:pPr>
+        <w:pStyle w:val="ListParagraph"/>
+        <w:numPr>
+          <w:ilvl w:val="0"/>
+          <w:numId w:val="4"/>
+        </w:numPr>
+        <w:rPr>
+          <w:rFonts w:cstheme="minorHAnsi"/>
+          <w:b/>
+          <w:bCs/>
+          <w:sz w:val="40"/>
+          <w:szCs w:val="40"/>
+        </w:rPr>
+      </w:pPr>
+      <w:r>
+        <w:rPr>
+          <w:rFonts w:cstheme="minorHAnsi"/>
+          <w:sz w:val="24"/>
+          <w:szCs w:val="24"/>
+        </w:rPr>
+        <w:t>Fifth draft: This</w:t>
+      </w:r>
+      <w:r>
+        <w:rPr>
+          <w:rFonts w:cstheme="minorHAnsi"/>
+          <w:sz w:val="24"/>
+          <w:szCs w:val="24"/>
+        </w:rPr>
+        <w:t xml:space="preserve"> draft will be </w:t>
+      </w:r>
+      <w:r>
+        <w:rPr>
+          <w:rFonts w:cstheme="minorHAnsi"/>
+          <w:sz w:val="24"/>
+          <w:szCs w:val="24"/>
+        </w:rPr>
+        <w:t>word level. This involves checking the spellings of words (</w:t>
+      </w:r>
+      <w:proofErr w:type="spellStart"/>
+      <w:r>
+        <w:rPr>
+          <w:rFonts w:cstheme="minorHAnsi"/>
+          <w:sz w:val="24"/>
+          <w:szCs w:val="24"/>
+        </w:rPr>
+        <w:t>eg.</w:t>
+      </w:r>
+      <w:proofErr w:type="spellEnd"/>
+      <w:r>
+        <w:rPr>
+          <w:rFonts w:cstheme="minorHAnsi"/>
+          <w:sz w:val="24"/>
+          <w:szCs w:val="24"/>
+        </w:rPr>
+        <w:t xml:space="preserve"> Effect or affect). The</w:t>
+      </w:r>
+      <w:r>
+        <w:rPr>
+          <w:rFonts w:cstheme="minorHAnsi"/>
+          <w:sz w:val="24"/>
+          <w:szCs w:val="24"/>
+        </w:rPr>
+        <w:t xml:space="preserve"> final</w:t>
+      </w:r>
+      <w:r>
+        <w:rPr>
+          <w:rFonts w:cstheme="minorHAnsi"/>
+          <w:sz w:val="24"/>
+          <w:szCs w:val="24"/>
+        </w:rPr>
+        <w:t xml:space="preserve"> </w:t>
+      </w:r>
+      <w:r>
+        <w:rPr>
+          <w:rFonts w:cstheme="minorHAnsi"/>
+          <w:sz w:val="24"/>
+          <w:szCs w:val="24"/>
+        </w:rPr>
+        <w:t xml:space="preserve">formatting will be </w:t>
+      </w:r>
+      <w:r>
+        <w:rPr>
+          <w:rFonts w:cstheme="minorHAnsi"/>
+          <w:sz w:val="24"/>
+          <w:szCs w:val="24"/>
+        </w:rPr>
+        <w:t>done at this stage</w:t>
+      </w:r>
+      <w:r>
+        <w:rPr>
+          <w:rFonts w:cstheme="minorHAnsi"/>
+          <w:sz w:val="24"/>
+          <w:szCs w:val="24"/>
+        </w:rPr>
+        <w:t>.</w:t>
+      </w:r>
+    </w:p>
+    <w:p>
+      <w:pPr>
+        <w:ind w:left="360"/>
+        <w:rPr>
+          <w:rFonts w:cstheme="minorHAnsi"/>
+          <w:sz w:val="24"/>
+          <w:szCs w:val="24"/>
+        </w:rPr>
+      </w:pPr>
+      <w:r>
+        <w:rPr>
+          <w:rFonts w:cstheme="minorHAnsi"/>
+          <w:sz w:val="24"/>
+          <w:szCs w:val="24"/>
+        </w:rPr>
+        <w:t>After these 5 stages have been completed</w:t>
+      </w:r>
+      <w:r>
+        <w:rPr>
+          <w:rFonts w:cstheme="minorHAnsi"/>
+          <w:sz w:val="24"/>
+          <w:szCs w:val="24"/>
+        </w:rPr>
+        <w:t>, send the draft to Ken.</w:t>
+      </w:r>
+    </w:p>
+    <w:p>
+      <w:pPr>
+        <w:rPr>
+          <w:sz w:val="24"/>
+          <w:szCs w:val="24"/>
+        </w:rPr>
+      </w:pPr>
+    </w:p>
+    <w:p>
+      <w:pPr>
         <w:rPr>
           <w:rFonts w:asciiTheme="majorHAnsi" w:hAnsiTheme="majorHAnsi"/>
           <w:b/>
@@ -125,6 +665,25 @@
           <w:sz w:val="32"/>
           <w:szCs w:val="32"/>
         </w:rPr>
+      </w:pPr>
+      <w:r>
+        <w:rPr>
+          <w:rFonts w:asciiTheme="majorHAnsi" w:hAnsiTheme="majorHAnsi"/>
+          <w:b/>
+          <w:bCs/>
+          <w:sz w:val="32"/>
+          <w:szCs w:val="32"/>
+        </w:rPr>
+        <w:t xml:space="preserve">Presentation of </w:t>
+      </w:r>
+      <w:r>
+        <w:rPr>
+          <w:rFonts w:asciiTheme="majorHAnsi" w:hAnsiTheme="majorHAnsi"/>
+          <w:b/>
+          <w:bCs/>
+          <w:sz w:val="32"/>
+          <w:szCs w:val="32"/>
+        </w:rPr>
         <w:t>Graphs</w:t>
       </w:r>
     </w:p>
@@ -145,7 +704,39 @@
           <w:sz w:val="24"/>
           <w:szCs w:val="24"/>
         </w:rPr>
-        <w:t>Figures shall be saved as eps when using matplotlib or 'epsc' when using matlab. This is to prevent a latex warning.</w:t>
+        <w:t>Figures shall be saved as eps when using matplotlib or '</w:t>
+      </w:r>
+      <w:proofErr w:type="spellStart"/>
+      <w:r>
+        <w:rPr>
+          <w:sz w:val="24"/>
+          <w:szCs w:val="24"/>
+        </w:rPr>
+        <w:t>epsc</w:t>
+      </w:r>
+      <w:proofErr w:type="spellEnd"/>
+      <w:r>
+        <w:rPr>
+          <w:sz w:val="24"/>
+          <w:szCs w:val="24"/>
+        </w:rPr>
+        <w:t xml:space="preserve">' when using </w:t>
+      </w:r>
+      <w:proofErr w:type="spellStart"/>
+      <w:r>
+        <w:rPr>
+          <w:sz w:val="24"/>
+          <w:szCs w:val="24"/>
+        </w:rPr>
+        <w:t>matlab</w:t>
+      </w:r>
+      <w:proofErr w:type="spellEnd"/>
+      <w:r>
+        <w:rPr>
+          <w:sz w:val="24"/>
+          <w:szCs w:val="24"/>
+        </w:rPr>
+        <w:t>. This is to prevent a latex warning.</w:t>
       </w:r>
     </w:p>
     <w:p>
@@ -185,7 +776,23 @@
           <w:sz w:val="24"/>
           <w:szCs w:val="24"/>
         </w:rPr>
-        <w:t>Figure names shall be 'chapter description'_chapter_'figure description'. For</w:t>
+        <w:t xml:space="preserve">Figure names shall be 'chapter </w:t>
+      </w:r>
+      <w:proofErr w:type="spellStart"/>
+      <w:r>
+        <w:rPr>
+          <w:sz w:val="24"/>
+          <w:szCs w:val="24"/>
+        </w:rPr>
+        <w:t>description'_chapter_'figure</w:t>
+      </w:r>
+      <w:proofErr w:type="spellEnd"/>
+      <w:r>
+        <w:rPr>
+          <w:sz w:val="24"/>
+          <w:szCs w:val="24"/>
+        </w:rPr>
+        <w:t xml:space="preserve"> description'. For</w:t>
       </w:r>
       <w:r>
         <w:rPr>
@@ -199,7 +806,23 @@
           <w:sz w:val="24"/>
           <w:szCs w:val="24"/>
         </w:rPr>
-        <w:t>example, 'sim_chapter_Zoom_in_ETM_tuning' refers to the figure being in the</w:t>
+        <w:t>example, '</w:t>
+      </w:r>
+      <w:proofErr w:type="spellStart"/>
+      <w:r>
+        <w:rPr>
+          <w:sz w:val="24"/>
+          <w:szCs w:val="24"/>
+        </w:rPr>
+        <w:t>sim_chapter_Zoom_in_ETM_tuning</w:t>
+      </w:r>
+      <w:proofErr w:type="spellEnd"/>
+      <w:r>
+        <w:rPr>
+          <w:sz w:val="24"/>
+          <w:szCs w:val="24"/>
+        </w:rPr>
+        <w:t>' refers to the figure being in the</w:t>
       </w:r>
       <w:r>
         <w:rPr>
@@ -253,7 +876,23 @@
           <w:sz w:val="24"/>
           <w:szCs w:val="24"/>
         </w:rPr>
-        <w:t>Are all lines visible/distinguishable? Changing thickness and linestyle can help.</w:t>
+        <w:t xml:space="preserve">Are all lines visible/distinguishable? Changing thickness and </w:t>
+      </w:r>
+      <w:proofErr w:type="spellStart"/>
+      <w:r>
+        <w:rPr>
+          <w:sz w:val="24"/>
+          <w:szCs w:val="24"/>
+        </w:rPr>
+        <w:t>linestyle</w:t>
+      </w:r>
+      <w:proofErr w:type="spellEnd"/>
+      <w:r>
+        <w:rPr>
+          <w:sz w:val="24"/>
+          <w:szCs w:val="24"/>
+        </w:rPr>
+        <w:t xml:space="preserve"> can help.</w:t>
       </w:r>
     </w:p>
     <w:p>
@@ -268,12 +907,37 @@
           <w:szCs w:val="24"/>
         </w:rPr>
       </w:pPr>
-      <w:r>
-        <w:rPr>
-          <w:sz w:val="24"/>
-          <w:szCs w:val="24"/>
-        </w:rPr>
-        <w:t>Are the axis labelled? The label is a sentence, so normal sentence capitalisation should be used. If its just one word, use a capital letter.</w:t>
+      <w:proofErr w:type="gramStart"/>
+      <w:r>
+        <w:rPr>
+          <w:sz w:val="24"/>
+          <w:szCs w:val="24"/>
+        </w:rPr>
+        <w:t>Are</w:t>
+      </w:r>
+      <w:proofErr w:type="gramEnd"/>
+      <w:r>
+        <w:rPr>
+          <w:sz w:val="24"/>
+          <w:szCs w:val="24"/>
+        </w:rPr>
+        <w:t xml:space="preserve"> the axis labelled? The label is a sentence, so normal sentence capitalisation should be used. If </w:t>
+      </w:r>
+      <w:proofErr w:type="spellStart"/>
+      <w:r>
+        <w:rPr>
+          <w:sz w:val="24"/>
+          <w:szCs w:val="24"/>
+        </w:rPr>
+        <w:t>its</w:t>
+      </w:r>
+      <w:proofErr w:type="spellEnd"/>
+      <w:r>
+        <w:rPr>
+          <w:sz w:val="24"/>
+          <w:szCs w:val="24"/>
+        </w:rPr>
+        <w:t xml:space="preserve"> just one word, use a capital letter.</w:t>
       </w:r>
     </w:p>
     <w:p>
@@ -308,12 +972,22 @@
           <w:szCs w:val="24"/>
         </w:rPr>
       </w:pPr>
-      <w:r>
-        <w:rPr>
-          <w:sz w:val="24"/>
-          <w:szCs w:val="24"/>
-        </w:rPr>
-        <w:t>Do the axis have units? The units should be put in brackets like (m). No other shape of brackets should be used.</w:t>
+      <w:proofErr w:type="gramStart"/>
+      <w:r>
+        <w:rPr>
+          <w:sz w:val="24"/>
+          <w:szCs w:val="24"/>
+        </w:rPr>
+        <w:lastRenderedPageBreak/>
+        <w:t>Do</w:t>
+      </w:r>
+      <w:proofErr w:type="gramEnd"/>
+      <w:r>
+        <w:rPr>
+          <w:sz w:val="24"/>
+          <w:szCs w:val="24"/>
+        </w:rPr>
+        <w:t xml:space="preserve"> the axis have units? The units should be put in brackets like (m). No other shape of brackets should be used.</w:t>
       </w:r>
     </w:p>
     <w:p>
@@ -353,7 +1027,23 @@
           <w:sz w:val="24"/>
           <w:szCs w:val="24"/>
         </w:rPr>
-        <w:t>Are subscripts properly typset?</w:t>
+        <w:t xml:space="preserve">Are subscripts properly </w:t>
+      </w:r>
+      <w:proofErr w:type="spellStart"/>
+      <w:r>
+        <w:rPr>
+          <w:sz w:val="24"/>
+          <w:szCs w:val="24"/>
+        </w:rPr>
+        <w:t>typset</w:t>
+      </w:r>
+      <w:proofErr w:type="spellEnd"/>
+      <w:r>
+        <w:rPr>
+          <w:sz w:val="24"/>
+          <w:szCs w:val="24"/>
+        </w:rPr>
+        <w:t>?</w:t>
       </w:r>
     </w:p>
     <w:p>
@@ -373,7 +1063,39 @@
           <w:sz w:val="24"/>
           <w:szCs w:val="24"/>
         </w:rPr>
-        <w:t>Have standard unit labels been used? A for amps, degree symbols instead of 'deg' etc.</w:t>
+        <w:t xml:space="preserve">Have standard unit labels been used? </w:t>
+      </w:r>
+      <w:proofErr w:type="gramStart"/>
+      <w:r>
+        <w:rPr>
+          <w:sz w:val="24"/>
+          <w:szCs w:val="24"/>
+        </w:rPr>
+        <w:t>A for</w:t>
+      </w:r>
+      <w:proofErr w:type="gramEnd"/>
+      <w:r>
+        <w:rPr>
+          <w:sz w:val="24"/>
+          <w:szCs w:val="24"/>
+        </w:rPr>
+        <w:t xml:space="preserve"> amps, degree symbols instead of '</w:t>
+      </w:r>
+      <w:proofErr w:type="spellStart"/>
+      <w:r>
+        <w:rPr>
+          <w:sz w:val="24"/>
+          <w:szCs w:val="24"/>
+        </w:rPr>
+        <w:t>deg</w:t>
+      </w:r>
+      <w:proofErr w:type="spellEnd"/>
+      <w:r>
+        <w:rPr>
+          <w:sz w:val="24"/>
+          <w:szCs w:val="24"/>
+        </w:rPr>
+        <w:t>' etc.</w:t>
       </w:r>
     </w:p>
     <w:p>
@@ -413,7 +1135,23 @@
           <w:sz w:val="24"/>
           <w:szCs w:val="24"/>
         </w:rPr>
-        <w:t>Check for spelling mistakes! e.g. freuqency -&gt; frequency.</w:t>
+        <w:t xml:space="preserve">Check for spelling mistakes! e.g. </w:t>
+      </w:r>
+      <w:proofErr w:type="spellStart"/>
+      <w:r>
+        <w:rPr>
+          <w:sz w:val="24"/>
+          <w:szCs w:val="24"/>
+        </w:rPr>
+        <w:t>freuqency</w:t>
+      </w:r>
+      <w:proofErr w:type="spellEnd"/>
+      <w:r>
+        <w:rPr>
+          <w:sz w:val="24"/>
+          <w:szCs w:val="24"/>
+        </w:rPr>
+        <w:t xml:space="preserve"> -&gt; frequency.</w:t>
       </w:r>
     </w:p>
     <w:p>
@@ -516,7 +1254,23 @@
           <w:sz w:val="24"/>
           <w:szCs w:val="24"/>
         </w:rPr>
-        <w:t>Standard matlab and matplotlib fonts will be used. The following examples give</w:t>
+        <w:t xml:space="preserve">Standard </w:t>
+      </w:r>
+      <w:proofErr w:type="spellStart"/>
+      <w:r>
+        <w:rPr>
+          <w:sz w:val="24"/>
+          <w:szCs w:val="24"/>
+        </w:rPr>
+        <w:t>matlab</w:t>
+      </w:r>
+      <w:proofErr w:type="spellEnd"/>
+      <w:r>
+        <w:rPr>
+          <w:sz w:val="24"/>
+          <w:szCs w:val="24"/>
+        </w:rPr>
+        <w:t xml:space="preserve"> and matplotlib fonts will be used. The following examples give</w:t>
       </w:r>
       <w:r>
         <w:rPr>
@@ -585,30 +1339,88 @@
           <w:szCs w:val="24"/>
         </w:rPr>
       </w:pPr>
-      <w:r>
-        <w:rPr>
-          <w:rFonts w:ascii="SimSun" w:eastAsia="SimSun" w:hAnsi="SimSun"/>
-          <w:sz w:val="24"/>
-          <w:szCs w:val="24"/>
-        </w:rPr>
-        <w:t>figure_size = (6,4)</w:t>
-      </w:r>
-    </w:p>
-    <w:p>
-      <w:pPr>
-        <w:rPr>
-          <w:rFonts w:ascii="SimSun" w:eastAsia="SimSun" w:hAnsi="SimSun"/>
-          <w:sz w:val="24"/>
-          <w:szCs w:val="24"/>
-        </w:rPr>
-      </w:pPr>
-      <w:r>
-        <w:rPr>
-          <w:rFonts w:ascii="SimSun" w:eastAsia="SimSun" w:hAnsi="SimSun"/>
-          <w:sz w:val="24"/>
-          <w:szCs w:val="24"/>
-        </w:rPr>
-        <w:t xml:space="preserve">plt.figure(figsize = figure_size,dpi = </w:t>
+      <w:proofErr w:type="spellStart"/>
+      <w:r>
+        <w:rPr>
+          <w:rFonts w:ascii="SimSun" w:eastAsia="SimSun" w:hAnsi="SimSun"/>
+          <w:sz w:val="24"/>
+          <w:szCs w:val="24"/>
+        </w:rPr>
+        <w:t>figure_size</w:t>
+      </w:r>
+      <w:proofErr w:type="spellEnd"/>
+      <w:r>
+        <w:rPr>
+          <w:rFonts w:ascii="SimSun" w:eastAsia="SimSun" w:hAnsi="SimSun"/>
+          <w:sz w:val="24"/>
+          <w:szCs w:val="24"/>
+        </w:rPr>
+        <w:t xml:space="preserve"> = (6,4)</w:t>
+      </w:r>
+    </w:p>
+    <w:p>
+      <w:pPr>
+        <w:rPr>
+          <w:rFonts w:ascii="SimSun" w:eastAsia="SimSun" w:hAnsi="SimSun"/>
+          <w:sz w:val="24"/>
+          <w:szCs w:val="24"/>
+        </w:rPr>
+      </w:pPr>
+      <w:proofErr w:type="spellStart"/>
+      <w:proofErr w:type="gramStart"/>
+      <w:r>
+        <w:rPr>
+          <w:rFonts w:ascii="SimSun" w:eastAsia="SimSun" w:hAnsi="SimSun"/>
+          <w:sz w:val="24"/>
+          <w:szCs w:val="24"/>
+        </w:rPr>
+        <w:t>plt.figure</w:t>
+      </w:r>
+      <w:proofErr w:type="spellEnd"/>
+      <w:proofErr w:type="gramEnd"/>
+      <w:r>
+        <w:rPr>
+          <w:rFonts w:ascii="SimSun" w:eastAsia="SimSun" w:hAnsi="SimSun"/>
+          <w:sz w:val="24"/>
+          <w:szCs w:val="24"/>
+        </w:rPr>
+        <w:t>(</w:t>
+      </w:r>
+      <w:proofErr w:type="spellStart"/>
+      <w:r>
+        <w:rPr>
+          <w:rFonts w:ascii="SimSun" w:eastAsia="SimSun" w:hAnsi="SimSun"/>
+          <w:sz w:val="24"/>
+          <w:szCs w:val="24"/>
+        </w:rPr>
+        <w:t>figsize</w:t>
+      </w:r>
+      <w:proofErr w:type="spellEnd"/>
+      <w:r>
+        <w:rPr>
+          <w:rFonts w:ascii="SimSun" w:eastAsia="SimSun" w:hAnsi="SimSun"/>
+          <w:sz w:val="24"/>
+          <w:szCs w:val="24"/>
+        </w:rPr>
+        <w:t xml:space="preserve"> = </w:t>
+      </w:r>
+      <w:proofErr w:type="spellStart"/>
+      <w:r>
+        <w:rPr>
+          <w:rFonts w:ascii="SimSun" w:eastAsia="SimSun" w:hAnsi="SimSun"/>
+          <w:sz w:val="24"/>
+          <w:szCs w:val="24"/>
+        </w:rPr>
+        <w:t>figure_size,dpi</w:t>
+      </w:r>
+      <w:proofErr w:type="spellEnd"/>
+      <w:r>
+        <w:rPr>
+          <w:rFonts w:ascii="SimSun" w:eastAsia="SimSun" w:hAnsi="SimSun"/>
+          <w:sz w:val="24"/>
+          <w:szCs w:val="24"/>
+        </w:rPr>
+        <w:t xml:space="preserve"> = </w:t>
       </w:r>
       <w:r>
         <w:rPr>
@@ -635,47 +1447,119 @@
           <w:szCs w:val="24"/>
         </w:rPr>
       </w:pPr>
-      <w:r>
-        <w:rPr>
-          <w:rFonts w:ascii="SimSun" w:eastAsia="SimSun" w:hAnsi="SimSun"/>
-          <w:sz w:val="24"/>
-          <w:szCs w:val="24"/>
-        </w:rPr>
-        <w:t>plt.plot(x,y,label = 'Name of line')</w:t>
-      </w:r>
-    </w:p>
-    <w:p>
-      <w:pPr>
-        <w:rPr>
-          <w:rFonts w:ascii="SimSun" w:eastAsia="SimSun" w:hAnsi="SimSun"/>
-          <w:sz w:val="24"/>
-          <w:szCs w:val="24"/>
-        </w:rPr>
-      </w:pPr>
-      <w:r>
-        <w:rPr>
-          <w:rFonts w:ascii="SimSun" w:eastAsia="SimSun" w:hAnsi="SimSun"/>
-          <w:sz w:val="24"/>
-          <w:szCs w:val="24"/>
-        </w:rPr>
-        <w:t>plt.legend(prop={'size': 8},loc = 'lower left')</w:t>
-      </w:r>
-    </w:p>
-    <w:p>
-      <w:pPr>
-        <w:rPr>
-          <w:rFonts w:ascii="SimSun" w:eastAsia="SimSun" w:hAnsi="SimSun"/>
-          <w:sz w:val="24"/>
-          <w:szCs w:val="24"/>
-        </w:rPr>
-      </w:pPr>
-      <w:r>
-        <w:rPr>
-          <w:rFonts w:ascii="SimSun" w:eastAsia="SimSun" w:hAnsi="SimSun"/>
-          <w:sz w:val="24"/>
-          <w:szCs w:val="24"/>
-        </w:rPr>
-        <w:t>plt.xlabel('x axis (units)'</w:t>
+      <w:proofErr w:type="spellStart"/>
+      <w:proofErr w:type="gramStart"/>
+      <w:r>
+        <w:rPr>
+          <w:rFonts w:ascii="SimSun" w:eastAsia="SimSun" w:hAnsi="SimSun"/>
+          <w:sz w:val="24"/>
+          <w:szCs w:val="24"/>
+        </w:rPr>
+        <w:t>plt.plot</w:t>
+      </w:r>
+      <w:proofErr w:type="spellEnd"/>
+      <w:proofErr w:type="gramEnd"/>
+      <w:r>
+        <w:rPr>
+          <w:rFonts w:ascii="SimSun" w:eastAsia="SimSun" w:hAnsi="SimSun"/>
+          <w:sz w:val="24"/>
+          <w:szCs w:val="24"/>
+        </w:rPr>
+        <w:t>(</w:t>
+      </w:r>
+      <w:proofErr w:type="spellStart"/>
+      <w:r>
+        <w:rPr>
+          <w:rFonts w:ascii="SimSun" w:eastAsia="SimSun" w:hAnsi="SimSun"/>
+          <w:sz w:val="24"/>
+          <w:szCs w:val="24"/>
+        </w:rPr>
+        <w:t>x,y,label</w:t>
+      </w:r>
+      <w:proofErr w:type="spellEnd"/>
+      <w:r>
+        <w:rPr>
+          <w:rFonts w:ascii="SimSun" w:eastAsia="SimSun" w:hAnsi="SimSun"/>
+          <w:sz w:val="24"/>
+          <w:szCs w:val="24"/>
+        </w:rPr>
+        <w:t xml:space="preserve"> = 'Name of line')</w:t>
+      </w:r>
+    </w:p>
+    <w:p>
+      <w:pPr>
+        <w:rPr>
+          <w:rFonts w:ascii="SimSun" w:eastAsia="SimSun" w:hAnsi="SimSun"/>
+          <w:sz w:val="24"/>
+          <w:szCs w:val="24"/>
+        </w:rPr>
+      </w:pPr>
+      <w:proofErr w:type="spellStart"/>
+      <w:proofErr w:type="gramStart"/>
+      <w:r>
+        <w:rPr>
+          <w:rFonts w:ascii="SimSun" w:eastAsia="SimSun" w:hAnsi="SimSun"/>
+          <w:sz w:val="24"/>
+          <w:szCs w:val="24"/>
+        </w:rPr>
+        <w:t>plt.legend</w:t>
+      </w:r>
+      <w:proofErr w:type="spellEnd"/>
+      <w:proofErr w:type="gramEnd"/>
+      <w:r>
+        <w:rPr>
+          <w:rFonts w:ascii="SimSun" w:eastAsia="SimSun" w:hAnsi="SimSun"/>
+          <w:sz w:val="24"/>
+          <w:szCs w:val="24"/>
+        </w:rPr>
+        <w:t>(prop={'size': 8},</w:t>
+      </w:r>
+      <w:proofErr w:type="spellStart"/>
+      <w:r>
+        <w:rPr>
+          <w:rFonts w:ascii="SimSun" w:eastAsia="SimSun" w:hAnsi="SimSun"/>
+          <w:sz w:val="24"/>
+          <w:szCs w:val="24"/>
+        </w:rPr>
+        <w:t>loc</w:t>
+      </w:r>
+      <w:proofErr w:type="spellEnd"/>
+      <w:r>
+        <w:rPr>
+          <w:rFonts w:ascii="SimSun" w:eastAsia="SimSun" w:hAnsi="SimSun"/>
+          <w:sz w:val="24"/>
+          <w:szCs w:val="24"/>
+        </w:rPr>
+        <w:t xml:space="preserve"> = 'lower left')</w:t>
+      </w:r>
+    </w:p>
+    <w:p>
+      <w:pPr>
+        <w:rPr>
+          <w:rFonts w:ascii="SimSun" w:eastAsia="SimSun" w:hAnsi="SimSun"/>
+          <w:sz w:val="24"/>
+          <w:szCs w:val="24"/>
+        </w:rPr>
+      </w:pPr>
+      <w:proofErr w:type="spellStart"/>
+      <w:proofErr w:type="gramStart"/>
+      <w:r>
+        <w:rPr>
+          <w:rFonts w:ascii="SimSun" w:eastAsia="SimSun" w:hAnsi="SimSun"/>
+          <w:sz w:val="24"/>
+          <w:szCs w:val="24"/>
+        </w:rPr>
+        <w:t>plt.xlabel</w:t>
+      </w:r>
+      <w:proofErr w:type="spellEnd"/>
+      <w:proofErr w:type="gramEnd"/>
+      <w:r>
+        <w:rPr>
+          <w:rFonts w:ascii="SimSun" w:eastAsia="SimSun" w:hAnsi="SimSun"/>
+          <w:sz w:val="24"/>
+          <w:szCs w:val="24"/>
+        </w:rPr>
+        <w:t>('x axis (units)'</w:t>
       </w:r>
       <w:r>
         <w:rPr>
@@ -688,13 +1572,23 @@
       <w:r>
         <w:t xml:space="preserve"> </w:t>
       </w:r>
-      <w:r>
-        <w:rPr>
-          <w:rFonts w:ascii="SimSun" w:eastAsia="SimSun" w:hAnsi="SimSun"/>
-          <w:sz w:val="24"/>
-          <w:szCs w:val="24"/>
-        </w:rPr>
-        <w:t>fontsize = 10</w:t>
+      <w:proofErr w:type="spellStart"/>
+      <w:r>
+        <w:rPr>
+          <w:rFonts w:ascii="SimSun" w:eastAsia="SimSun" w:hAnsi="SimSun"/>
+          <w:sz w:val="24"/>
+          <w:szCs w:val="24"/>
+        </w:rPr>
+        <w:t>fontsize</w:t>
+      </w:r>
+      <w:proofErr w:type="spellEnd"/>
+      <w:r>
+        <w:rPr>
+          <w:rFonts w:ascii="SimSun" w:eastAsia="SimSun" w:hAnsi="SimSun"/>
+          <w:sz w:val="24"/>
+          <w:szCs w:val="24"/>
+        </w:rPr>
+        <w:t xml:space="preserve"> = 10</w:t>
       </w:r>
       <w:r>
         <w:rPr>
@@ -713,13 +1607,25 @@
           <w:szCs w:val="24"/>
         </w:rPr>
       </w:pPr>
-      <w:r>
-        <w:rPr>
-          <w:rFonts w:ascii="SimSun" w:eastAsia="SimSun" w:hAnsi="SimSun"/>
-          <w:sz w:val="24"/>
-          <w:szCs w:val="24"/>
-        </w:rPr>
-        <w:t>plt.ylabel('y axis (units)'</w:t>
+      <w:proofErr w:type="spellStart"/>
+      <w:proofErr w:type="gramStart"/>
+      <w:r>
+        <w:rPr>
+          <w:rFonts w:ascii="SimSun" w:eastAsia="SimSun" w:hAnsi="SimSun"/>
+          <w:sz w:val="24"/>
+          <w:szCs w:val="24"/>
+        </w:rPr>
+        <w:t>plt.ylabel</w:t>
+      </w:r>
+      <w:proofErr w:type="spellEnd"/>
+      <w:proofErr w:type="gramEnd"/>
+      <w:r>
+        <w:rPr>
+          <w:rFonts w:ascii="SimSun" w:eastAsia="SimSun" w:hAnsi="SimSun"/>
+          <w:sz w:val="24"/>
+          <w:szCs w:val="24"/>
+        </w:rPr>
+        <w:t>('y axis (units)'</w:t>
       </w:r>
       <w:r>
         <w:rPr>
@@ -732,13 +1638,23 @@
       <w:r>
         <w:t xml:space="preserve"> </w:t>
       </w:r>
-      <w:r>
-        <w:rPr>
-          <w:rFonts w:ascii="SimSun" w:eastAsia="SimSun" w:hAnsi="SimSun"/>
-          <w:sz w:val="24"/>
-          <w:szCs w:val="24"/>
-        </w:rPr>
-        <w:t>fontsize = 10</w:t>
+      <w:proofErr w:type="spellStart"/>
+      <w:r>
+        <w:rPr>
+          <w:rFonts w:ascii="SimSun" w:eastAsia="SimSun" w:hAnsi="SimSun"/>
+          <w:sz w:val="24"/>
+          <w:szCs w:val="24"/>
+        </w:rPr>
+        <w:t>fontsize</w:t>
+      </w:r>
+      <w:proofErr w:type="spellEnd"/>
+      <w:r>
+        <w:rPr>
+          <w:rFonts w:ascii="SimSun" w:eastAsia="SimSun" w:hAnsi="SimSun"/>
+          <w:sz w:val="24"/>
+          <w:szCs w:val="24"/>
+        </w:rPr>
+        <w:t xml:space="preserve"> = 10</w:t>
       </w:r>
       <w:r>
         <w:rPr>
@@ -757,64 +1673,138 @@
           <w:szCs w:val="24"/>
         </w:rPr>
       </w:pPr>
-      <w:r>
-        <w:rPr>
-          <w:rFonts w:ascii="SimSun" w:eastAsia="SimSun" w:hAnsi="SimSun"/>
-          <w:sz w:val="24"/>
-          <w:szCs w:val="24"/>
-        </w:rPr>
-        <w:t>plt.tight_layout()</w:t>
-      </w:r>
-    </w:p>
-    <w:p>
-      <w:pPr>
-        <w:rPr>
-          <w:rFonts w:ascii="SimSun" w:eastAsia="SimSun" w:hAnsi="SimSun"/>
-          <w:sz w:val="24"/>
-          <w:szCs w:val="24"/>
-        </w:rPr>
-      </w:pPr>
-      <w:r>
-        <w:rPr>
-          <w:rFonts w:ascii="SimSun" w:eastAsia="SimSun" w:hAnsi="SimSun"/>
-          <w:sz w:val="24"/>
-          <w:szCs w:val="24"/>
-        </w:rPr>
-        <w:t>plt.grid()</w:t>
-      </w:r>
-    </w:p>
-    <w:p>
-      <w:pPr>
-        <w:rPr>
-          <w:rFonts w:ascii="SimSun" w:eastAsia="SimSun" w:hAnsi="SimSun"/>
-          <w:sz w:val="24"/>
-          <w:szCs w:val="24"/>
-        </w:rPr>
-      </w:pPr>
-      <w:r>
-        <w:rPr>
-          <w:rFonts w:ascii="SimSun" w:eastAsia="SimSun" w:hAnsi="SimSun"/>
-          <w:sz w:val="24"/>
-          <w:szCs w:val="24"/>
-        </w:rPr>
-        <w:t>plt.savefig('sim_chapter_Zoom_in_ETM_tuning.eps')</w:t>
-      </w:r>
-    </w:p>
-    <w:p>
-      <w:pPr>
-        <w:rPr>
-          <w:rFonts w:ascii="SimSun" w:eastAsia="SimSun" w:hAnsi="SimSun"/>
-          <w:sz w:val="24"/>
-          <w:szCs w:val="24"/>
-        </w:rPr>
-      </w:pPr>
-      <w:r>
-        <w:rPr>
-          <w:rFonts w:ascii="SimSun" w:eastAsia="SimSun" w:hAnsi="SimSun"/>
-          <w:sz w:val="24"/>
-          <w:szCs w:val="24"/>
-        </w:rPr>
-        <w:t>plt.show()</w:t>
+      <w:proofErr w:type="spellStart"/>
+      <w:proofErr w:type="gramStart"/>
+      <w:r>
+        <w:rPr>
+          <w:rFonts w:ascii="SimSun" w:eastAsia="SimSun" w:hAnsi="SimSun"/>
+          <w:sz w:val="24"/>
+          <w:szCs w:val="24"/>
+        </w:rPr>
+        <w:t>plt.tight</w:t>
+      </w:r>
+      <w:proofErr w:type="gramEnd"/>
+      <w:r>
+        <w:rPr>
+          <w:rFonts w:ascii="SimSun" w:eastAsia="SimSun" w:hAnsi="SimSun"/>
+          <w:sz w:val="24"/>
+          <w:szCs w:val="24"/>
+        </w:rPr>
+        <w:t>_layout</w:t>
+      </w:r>
+      <w:proofErr w:type="spellEnd"/>
+      <w:r>
+        <w:rPr>
+          <w:rFonts w:ascii="SimSun" w:eastAsia="SimSun" w:hAnsi="SimSun"/>
+          <w:sz w:val="24"/>
+          <w:szCs w:val="24"/>
+        </w:rPr>
+        <w:t>()</w:t>
+      </w:r>
+    </w:p>
+    <w:p>
+      <w:pPr>
+        <w:rPr>
+          <w:rFonts w:ascii="SimSun" w:eastAsia="SimSun" w:hAnsi="SimSun"/>
+          <w:sz w:val="24"/>
+          <w:szCs w:val="24"/>
+        </w:rPr>
+      </w:pPr>
+      <w:proofErr w:type="spellStart"/>
+      <w:proofErr w:type="gramStart"/>
+      <w:r>
+        <w:rPr>
+          <w:rFonts w:ascii="SimSun" w:eastAsia="SimSun" w:hAnsi="SimSun"/>
+          <w:sz w:val="24"/>
+          <w:szCs w:val="24"/>
+        </w:rPr>
+        <w:t>plt.grid</w:t>
+      </w:r>
+      <w:proofErr w:type="spellEnd"/>
+      <w:proofErr w:type="gramEnd"/>
+      <w:r>
+        <w:rPr>
+          <w:rFonts w:ascii="SimSun" w:eastAsia="SimSun" w:hAnsi="SimSun"/>
+          <w:sz w:val="24"/>
+          <w:szCs w:val="24"/>
+        </w:rPr>
+        <w:t>()</w:t>
+      </w:r>
+    </w:p>
+    <w:p>
+      <w:pPr>
+        <w:rPr>
+          <w:rFonts w:ascii="SimSun" w:eastAsia="SimSun" w:hAnsi="SimSun"/>
+          <w:sz w:val="24"/>
+          <w:szCs w:val="24"/>
+        </w:rPr>
+      </w:pPr>
+      <w:proofErr w:type="spellStart"/>
+      <w:proofErr w:type="gramStart"/>
+      <w:r>
+        <w:rPr>
+          <w:rFonts w:ascii="SimSun" w:eastAsia="SimSun" w:hAnsi="SimSun"/>
+          <w:sz w:val="24"/>
+          <w:szCs w:val="24"/>
+        </w:rPr>
+        <w:t>plt.savefig</w:t>
+      </w:r>
+      <w:proofErr w:type="spellEnd"/>
+      <w:proofErr w:type="gramEnd"/>
+      <w:r>
+        <w:rPr>
+          <w:rFonts w:ascii="SimSun" w:eastAsia="SimSun" w:hAnsi="SimSun"/>
+          <w:sz w:val="24"/>
+          <w:szCs w:val="24"/>
+        </w:rPr>
+        <w:t>('</w:t>
+      </w:r>
+      <w:proofErr w:type="spellStart"/>
+      <w:r>
+        <w:rPr>
+          <w:rFonts w:ascii="SimSun" w:eastAsia="SimSun" w:hAnsi="SimSun"/>
+          <w:sz w:val="24"/>
+          <w:szCs w:val="24"/>
+        </w:rPr>
+        <w:t>sim_chapter_Zoom_in_ETM_tuning.eps</w:t>
+      </w:r>
+      <w:proofErr w:type="spellEnd"/>
+      <w:r>
+        <w:rPr>
+          <w:rFonts w:ascii="SimSun" w:eastAsia="SimSun" w:hAnsi="SimSun"/>
+          <w:sz w:val="24"/>
+          <w:szCs w:val="24"/>
+        </w:rPr>
+        <w:t>')</w:t>
+      </w:r>
+    </w:p>
+    <w:p>
+      <w:pPr>
+        <w:rPr>
+          <w:rFonts w:ascii="SimSun" w:eastAsia="SimSun" w:hAnsi="SimSun"/>
+          <w:sz w:val="24"/>
+          <w:szCs w:val="24"/>
+        </w:rPr>
+      </w:pPr>
+      <w:proofErr w:type="spellStart"/>
+      <w:proofErr w:type="gramStart"/>
+      <w:r>
+        <w:rPr>
+          <w:rFonts w:ascii="SimSun" w:eastAsia="SimSun" w:hAnsi="SimSun"/>
+          <w:sz w:val="24"/>
+          <w:szCs w:val="24"/>
+        </w:rPr>
+        <w:t>plt.show</w:t>
+      </w:r>
+      <w:proofErr w:type="spellEnd"/>
+      <w:proofErr w:type="gramEnd"/>
+      <w:r>
+        <w:rPr>
+          <w:rFonts w:ascii="SimSun" w:eastAsia="SimSun" w:hAnsi="SimSun"/>
+          <w:sz w:val="24"/>
+          <w:szCs w:val="24"/>
+        </w:rPr>
+        <w:t>()</w:t>
       </w:r>
     </w:p>
     <w:p>
@@ -851,35 +1841,66 @@
           <w:szCs w:val="24"/>
         </w:rPr>
       </w:pPr>
-      <w:r>
-        <w:rPr>
-          <w:rFonts w:ascii="SimSun" w:eastAsia="SimSun" w:hAnsi="SimSun"/>
-          <w:sz w:val="24"/>
-          <w:szCs w:val="24"/>
-        </w:rPr>
-        <w:t>plt.figure(figsize=(6, 6), dpi=150)</w:t>
-      </w:r>
-    </w:p>
-    <w:p>
-      <w:pPr>
-        <w:rPr>
-          <w:sz w:val="24"/>
-          <w:szCs w:val="24"/>
-        </w:rPr>
-      </w:pPr>
-    </w:p>
-    <w:p>
-      <w:pPr>
-        <w:rPr>
-          <w:sz w:val="24"/>
-          <w:szCs w:val="24"/>
-        </w:rPr>
-      </w:pPr>
-      <w:r>
-        <w:rPr>
-          <w:sz w:val="24"/>
-          <w:szCs w:val="24"/>
-        </w:rPr>
+      <w:proofErr w:type="spellStart"/>
+      <w:proofErr w:type="gramStart"/>
+      <w:r>
+        <w:rPr>
+          <w:rFonts w:ascii="SimSun" w:eastAsia="SimSun" w:hAnsi="SimSun"/>
+          <w:sz w:val="24"/>
+          <w:szCs w:val="24"/>
+        </w:rPr>
+        <w:t>plt.figure</w:t>
+      </w:r>
+      <w:proofErr w:type="spellEnd"/>
+      <w:proofErr w:type="gramEnd"/>
+      <w:r>
+        <w:rPr>
+          <w:rFonts w:ascii="SimSun" w:eastAsia="SimSun" w:hAnsi="SimSun"/>
+          <w:sz w:val="24"/>
+          <w:szCs w:val="24"/>
+        </w:rPr>
+        <w:t>(</w:t>
+      </w:r>
+      <w:proofErr w:type="spellStart"/>
+      <w:r>
+        <w:rPr>
+          <w:rFonts w:ascii="SimSun" w:eastAsia="SimSun" w:hAnsi="SimSun"/>
+          <w:sz w:val="24"/>
+          <w:szCs w:val="24"/>
+        </w:rPr>
+        <w:t>figsize</w:t>
+      </w:r>
+      <w:proofErr w:type="spellEnd"/>
+      <w:r>
+        <w:rPr>
+          <w:rFonts w:ascii="SimSun" w:eastAsia="SimSun" w:hAnsi="SimSun"/>
+          <w:sz w:val="24"/>
+          <w:szCs w:val="24"/>
+        </w:rPr>
+        <w:t>=(6, 6), dpi=150)</w:t>
+      </w:r>
+    </w:p>
+    <w:p>
+      <w:pPr>
+        <w:rPr>
+          <w:sz w:val="24"/>
+          <w:szCs w:val="24"/>
+        </w:rPr>
+      </w:pPr>
+    </w:p>
+    <w:p>
+      <w:pPr>
+        <w:rPr>
+          <w:sz w:val="24"/>
+          <w:szCs w:val="24"/>
+        </w:rPr>
+      </w:pPr>
+      <w:r>
+        <w:rPr>
+          <w:sz w:val="24"/>
+          <w:szCs w:val="24"/>
+        </w:rPr>
+        <w:lastRenderedPageBreak/>
         <w:t xml:space="preserve">when there </w:t>
       </w:r>
       <w:r>
@@ -915,6 +1936,7 @@
           <w:szCs w:val="24"/>
         </w:rPr>
       </w:pPr>
+      <w:proofErr w:type="spellStart"/>
       <w:r>
         <w:rPr>
           <w:rFonts w:asciiTheme="majorHAnsi" w:hAnsiTheme="majorHAnsi"/>
@@ -925,20 +1947,69 @@
         </w:rPr>
         <w:t>Matlab</w:t>
       </w:r>
-    </w:p>
-    <w:p>
-      <w:pPr>
-        <w:rPr>
-          <w:sz w:val="24"/>
-          <w:szCs w:val="24"/>
-        </w:rPr>
-      </w:pPr>
-      <w:r>
-        <w:rPr>
-          <w:sz w:val="24"/>
-          <w:szCs w:val="24"/>
-        </w:rPr>
-        <w:t xml:space="preserve">For matlab figures, use the linspecer (from mathworks file exchange) function to </w:t>
+      <w:proofErr w:type="spellEnd"/>
+    </w:p>
+    <w:p>
+      <w:pPr>
+        <w:rPr>
+          <w:sz w:val="24"/>
+          <w:szCs w:val="24"/>
+        </w:rPr>
+      </w:pPr>
+      <w:r>
+        <w:rPr>
+          <w:sz w:val="24"/>
+          <w:szCs w:val="24"/>
+        </w:rPr>
+        <w:t xml:space="preserve">For </w:t>
+      </w:r>
+      <w:proofErr w:type="spellStart"/>
+      <w:r>
+        <w:rPr>
+          <w:sz w:val="24"/>
+          <w:szCs w:val="24"/>
+        </w:rPr>
+        <w:t>matlab</w:t>
+      </w:r>
+      <w:proofErr w:type="spellEnd"/>
+      <w:r>
+        <w:rPr>
+          <w:sz w:val="24"/>
+          <w:szCs w:val="24"/>
+        </w:rPr>
+        <w:t xml:space="preserve"> figures, use the </w:t>
+      </w:r>
+      <w:proofErr w:type="spellStart"/>
+      <w:r>
+        <w:rPr>
+          <w:sz w:val="24"/>
+          <w:szCs w:val="24"/>
+        </w:rPr>
+        <w:t>linspecer</w:t>
+      </w:r>
+      <w:proofErr w:type="spellEnd"/>
+      <w:r>
+        <w:rPr>
+          <w:sz w:val="24"/>
+          <w:szCs w:val="24"/>
+        </w:rPr>
+        <w:t xml:space="preserve"> (from </w:t>
+      </w:r>
+      <w:proofErr w:type="spellStart"/>
+      <w:r>
+        <w:rPr>
+          <w:sz w:val="24"/>
+          <w:szCs w:val="24"/>
+        </w:rPr>
+        <w:t>mathworks</w:t>
+      </w:r>
+      <w:proofErr w:type="spellEnd"/>
+      <w:r>
+        <w:rPr>
+          <w:sz w:val="24"/>
+          <w:szCs w:val="24"/>
+        </w:rPr>
+        <w:t xml:space="preserve"> file exchange) function to </w:t>
       </w:r>
     </w:p>
     <w:p>
@@ -970,84 +2041,260 @@
           <w:sz w:val="24"/>
           <w:szCs w:val="24"/>
         </w:rPr>
-        <w:t>c = linspecer(2);</w:t>
-      </w:r>
-    </w:p>
-    <w:p>
-      <w:pPr>
-        <w:rPr>
-          <w:rFonts w:ascii="SimSun" w:eastAsia="SimSun" w:hAnsi="SimSun"/>
-          <w:sz w:val="24"/>
-          <w:szCs w:val="24"/>
-        </w:rPr>
-      </w:pPr>
-      <w:r>
-        <w:rPr>
-          <w:rFonts w:ascii="SimSun" w:eastAsia="SimSun" w:hAnsi="SimSun"/>
-          <w:sz w:val="24"/>
-          <w:szCs w:val="24"/>
-        </w:rPr>
-        <w:t>size = 1.1;</w:t>
-      </w:r>
-    </w:p>
-    <w:p>
-      <w:pPr>
-        <w:rPr>
-          <w:rFonts w:ascii="SimSun" w:eastAsia="SimSun" w:hAnsi="SimSun"/>
-          <w:sz w:val="24"/>
-          <w:szCs w:val="24"/>
-        </w:rPr>
-      </w:pPr>
-      <w:r>
-        <w:rPr>
-          <w:rFonts w:ascii="SimSun" w:eastAsia="SimSun" w:hAnsi="SimSun"/>
-          <w:sz w:val="24"/>
-          <w:szCs w:val="24"/>
-        </w:rPr>
-        <w:t>aspect_ratio = size.*[6,4];</w:t>
-      </w:r>
-    </w:p>
-    <w:p>
-      <w:pPr>
-        <w:rPr>
-          <w:rFonts w:ascii="SimSun" w:eastAsia="SimSun" w:hAnsi="SimSun"/>
-          <w:sz w:val="24"/>
-          <w:szCs w:val="24"/>
-        </w:rPr>
-      </w:pPr>
-    </w:p>
-    <w:p>
-      <w:pPr>
-        <w:rPr>
-          <w:rFonts w:ascii="SimSun" w:eastAsia="SimSun" w:hAnsi="SimSun"/>
-          <w:sz w:val="24"/>
-          <w:szCs w:val="24"/>
-        </w:rPr>
-      </w:pPr>
-      <w:r>
-        <w:rPr>
-          <w:rFonts w:ascii="SimSun" w:eastAsia="SimSun" w:hAnsi="SimSun"/>
-          <w:sz w:val="24"/>
-          <w:szCs w:val="24"/>
-        </w:rPr>
-        <w:t>figure('Name','dark noise','units','inches','position',[0 0 aspect_ratio(1) aspect_ratio(2)])</w:t>
-      </w:r>
-    </w:p>
-    <w:p>
-      <w:pPr>
-        <w:rPr>
-          <w:rFonts w:ascii="SimSun" w:eastAsia="SimSun" w:hAnsi="SimSun"/>
-          <w:sz w:val="24"/>
-          <w:szCs w:val="24"/>
-        </w:rPr>
-      </w:pPr>
-      <w:r>
-        <w:rPr>
-          <w:rFonts w:ascii="SimSun" w:eastAsia="SimSun" w:hAnsi="SimSun"/>
-          <w:sz w:val="24"/>
-          <w:szCs w:val="24"/>
-        </w:rPr>
-        <w:t>loglog(x1, y1, 'color',c(1,:))</w:t>
+        <w:t xml:space="preserve">c = </w:t>
+      </w:r>
+      <w:proofErr w:type="spellStart"/>
+      <w:proofErr w:type="gramStart"/>
+      <w:r>
+        <w:rPr>
+          <w:rFonts w:ascii="SimSun" w:eastAsia="SimSun" w:hAnsi="SimSun"/>
+          <w:sz w:val="24"/>
+          <w:szCs w:val="24"/>
+        </w:rPr>
+        <w:t>linspecer</w:t>
+      </w:r>
+      <w:proofErr w:type="spellEnd"/>
+      <w:r>
+        <w:rPr>
+          <w:rFonts w:ascii="SimSun" w:eastAsia="SimSun" w:hAnsi="SimSun"/>
+          <w:sz w:val="24"/>
+          <w:szCs w:val="24"/>
+        </w:rPr>
+        <w:t>(</w:t>
+      </w:r>
+      <w:proofErr w:type="gramEnd"/>
+      <w:r>
+        <w:rPr>
+          <w:rFonts w:ascii="SimSun" w:eastAsia="SimSun" w:hAnsi="SimSun"/>
+          <w:sz w:val="24"/>
+          <w:szCs w:val="24"/>
+        </w:rPr>
+        <w:t>2);</w:t>
+      </w:r>
+    </w:p>
+    <w:p>
+      <w:pPr>
+        <w:rPr>
+          <w:rFonts w:ascii="SimSun" w:eastAsia="SimSun" w:hAnsi="SimSun"/>
+          <w:sz w:val="24"/>
+          <w:szCs w:val="24"/>
+        </w:rPr>
+      </w:pPr>
+      <w:r>
+        <w:rPr>
+          <w:rFonts w:ascii="SimSun" w:eastAsia="SimSun" w:hAnsi="SimSun"/>
+          <w:sz w:val="24"/>
+          <w:szCs w:val="24"/>
+        </w:rPr>
+        <w:t xml:space="preserve">size = </w:t>
+      </w:r>
+      <w:proofErr w:type="gramStart"/>
+      <w:r>
+        <w:rPr>
+          <w:rFonts w:ascii="SimSun" w:eastAsia="SimSun" w:hAnsi="SimSun"/>
+          <w:sz w:val="24"/>
+          <w:szCs w:val="24"/>
+        </w:rPr>
+        <w:t>1.1;</w:t>
+      </w:r>
+      <w:proofErr w:type="gramEnd"/>
+    </w:p>
+    <w:p>
+      <w:pPr>
+        <w:rPr>
+          <w:rFonts w:ascii="SimSun" w:eastAsia="SimSun" w:hAnsi="SimSun"/>
+          <w:sz w:val="24"/>
+          <w:szCs w:val="24"/>
+        </w:rPr>
+      </w:pPr>
+      <w:proofErr w:type="spellStart"/>
+      <w:r>
+        <w:rPr>
+          <w:rFonts w:ascii="SimSun" w:eastAsia="SimSun" w:hAnsi="SimSun"/>
+          <w:sz w:val="24"/>
+          <w:szCs w:val="24"/>
+        </w:rPr>
+        <w:t>aspect_ratio</w:t>
+      </w:r>
+      <w:proofErr w:type="spellEnd"/>
+      <w:r>
+        <w:rPr>
+          <w:rFonts w:ascii="SimSun" w:eastAsia="SimSun" w:hAnsi="SimSun"/>
+          <w:sz w:val="24"/>
+          <w:szCs w:val="24"/>
+        </w:rPr>
+        <w:t xml:space="preserve"> = </w:t>
+      </w:r>
+      <w:proofErr w:type="gramStart"/>
+      <w:r>
+        <w:rPr>
+          <w:rFonts w:ascii="SimSun" w:eastAsia="SimSun" w:hAnsi="SimSun"/>
+          <w:sz w:val="24"/>
+          <w:szCs w:val="24"/>
+        </w:rPr>
+        <w:t>size.*</w:t>
+      </w:r>
+      <w:proofErr w:type="gramEnd"/>
+      <w:r>
+        <w:rPr>
+          <w:rFonts w:ascii="SimSun" w:eastAsia="SimSun" w:hAnsi="SimSun"/>
+          <w:sz w:val="24"/>
+          <w:szCs w:val="24"/>
+        </w:rPr>
+        <w:t>[6,4];</w:t>
+      </w:r>
+    </w:p>
+    <w:p>
+      <w:pPr>
+        <w:rPr>
+          <w:rFonts w:ascii="SimSun" w:eastAsia="SimSun" w:hAnsi="SimSun"/>
+          <w:sz w:val="24"/>
+          <w:szCs w:val="24"/>
+        </w:rPr>
+      </w:pPr>
+    </w:p>
+    <w:p>
+      <w:pPr>
+        <w:rPr>
+          <w:rFonts w:ascii="SimSun" w:eastAsia="SimSun" w:hAnsi="SimSun"/>
+          <w:sz w:val="24"/>
+          <w:szCs w:val="24"/>
+        </w:rPr>
+      </w:pPr>
+      <w:proofErr w:type="gramStart"/>
+      <w:r>
+        <w:rPr>
+          <w:rFonts w:ascii="SimSun" w:eastAsia="SimSun" w:hAnsi="SimSun"/>
+          <w:sz w:val="24"/>
+          <w:szCs w:val="24"/>
+        </w:rPr>
+        <w:t>figure(</w:t>
+      </w:r>
+      <w:proofErr w:type="gramEnd"/>
+      <w:r>
+        <w:rPr>
+          <w:rFonts w:ascii="SimSun" w:eastAsia="SimSun" w:hAnsi="SimSun"/>
+          <w:sz w:val="24"/>
+          <w:szCs w:val="24"/>
+        </w:rPr>
+        <w:t>'</w:t>
+      </w:r>
+      <w:proofErr w:type="spellStart"/>
+      <w:r>
+        <w:rPr>
+          <w:rFonts w:ascii="SimSun" w:eastAsia="SimSun" w:hAnsi="SimSun"/>
+          <w:sz w:val="24"/>
+          <w:szCs w:val="24"/>
+        </w:rPr>
+        <w:t>Name','dark</w:t>
+      </w:r>
+      <w:proofErr w:type="spellEnd"/>
+      <w:r>
+        <w:rPr>
+          <w:rFonts w:ascii="SimSun" w:eastAsia="SimSun" w:hAnsi="SimSun"/>
+          <w:sz w:val="24"/>
+          <w:szCs w:val="24"/>
+        </w:rPr>
+        <w:t xml:space="preserve"> </w:t>
+      </w:r>
+      <w:proofErr w:type="spellStart"/>
+      <w:r>
+        <w:rPr>
+          <w:rFonts w:ascii="SimSun" w:eastAsia="SimSun" w:hAnsi="SimSun"/>
+          <w:sz w:val="24"/>
+          <w:szCs w:val="24"/>
+        </w:rPr>
+        <w:t>noise','units','inches','position</w:t>
+      </w:r>
+      <w:proofErr w:type="spellEnd"/>
+      <w:r>
+        <w:rPr>
+          <w:rFonts w:ascii="SimSun" w:eastAsia="SimSun" w:hAnsi="SimSun"/>
+          <w:sz w:val="24"/>
+          <w:szCs w:val="24"/>
+        </w:rPr>
+        <w:t xml:space="preserve">',[0 0 </w:t>
+      </w:r>
+      <w:proofErr w:type="spellStart"/>
+      <w:r>
+        <w:rPr>
+          <w:rFonts w:ascii="SimSun" w:eastAsia="SimSun" w:hAnsi="SimSun"/>
+          <w:sz w:val="24"/>
+          <w:szCs w:val="24"/>
+        </w:rPr>
+        <w:t>aspect_ratio</w:t>
+      </w:r>
+      <w:proofErr w:type="spellEnd"/>
+      <w:r>
+        <w:rPr>
+          <w:rFonts w:ascii="SimSun" w:eastAsia="SimSun" w:hAnsi="SimSun"/>
+          <w:sz w:val="24"/>
+          <w:szCs w:val="24"/>
+        </w:rPr>
+        <w:t xml:space="preserve">(1) </w:t>
+      </w:r>
+      <w:proofErr w:type="spellStart"/>
+      <w:r>
+        <w:rPr>
+          <w:rFonts w:ascii="SimSun" w:eastAsia="SimSun" w:hAnsi="SimSun"/>
+          <w:sz w:val="24"/>
+          <w:szCs w:val="24"/>
+        </w:rPr>
+        <w:t>aspect_ratio</w:t>
+      </w:r>
+      <w:proofErr w:type="spellEnd"/>
+      <w:r>
+        <w:rPr>
+          <w:rFonts w:ascii="SimSun" w:eastAsia="SimSun" w:hAnsi="SimSun"/>
+          <w:sz w:val="24"/>
+          <w:szCs w:val="24"/>
+        </w:rPr>
+        <w:t>(2)])</w:t>
+      </w:r>
+    </w:p>
+    <w:p>
+      <w:pPr>
+        <w:rPr>
+          <w:rFonts w:ascii="SimSun" w:eastAsia="SimSun" w:hAnsi="SimSun"/>
+          <w:sz w:val="24"/>
+          <w:szCs w:val="24"/>
+        </w:rPr>
+      </w:pPr>
+      <w:proofErr w:type="gramStart"/>
+      <w:r>
+        <w:rPr>
+          <w:rFonts w:ascii="SimSun" w:eastAsia="SimSun" w:hAnsi="SimSun"/>
+          <w:sz w:val="24"/>
+          <w:szCs w:val="24"/>
+        </w:rPr>
+        <w:t>loglog(</w:t>
+      </w:r>
+      <w:proofErr w:type="gramEnd"/>
+      <w:r>
+        <w:rPr>
+          <w:rFonts w:ascii="SimSun" w:eastAsia="SimSun" w:hAnsi="SimSun"/>
+          <w:sz w:val="24"/>
+          <w:szCs w:val="24"/>
+        </w:rPr>
+        <w:t>x1, y1, '</w:t>
+      </w:r>
+      <w:proofErr w:type="spellStart"/>
+      <w:r>
+        <w:rPr>
+          <w:rFonts w:ascii="SimSun" w:eastAsia="SimSun" w:hAnsi="SimSun"/>
+          <w:sz w:val="24"/>
+          <w:szCs w:val="24"/>
+        </w:rPr>
+        <w:t>color</w:t>
+      </w:r>
+      <w:proofErr w:type="spellEnd"/>
+      <w:r>
+        <w:rPr>
+          <w:rFonts w:ascii="SimSun" w:eastAsia="SimSun" w:hAnsi="SimSun"/>
+          <w:sz w:val="24"/>
+          <w:szCs w:val="24"/>
+        </w:rPr>
+        <w:t>',c(1,:))</w:t>
       </w:r>
     </w:p>
     <w:p>
@@ -1075,30 +2322,57 @@
           <w:szCs w:val="24"/>
         </w:rPr>
       </w:pPr>
-      <w:r>
-        <w:rPr>
-          <w:rFonts w:ascii="SimSun" w:eastAsia="SimSun" w:hAnsi="SimSun"/>
-          <w:sz w:val="24"/>
-          <w:szCs w:val="24"/>
-        </w:rPr>
-        <w:t>loglog(x2, y2, 'color',c(2,:))</w:t>
-      </w:r>
-    </w:p>
-    <w:p>
-      <w:pPr>
-        <w:rPr>
-          <w:rFonts w:ascii="SimSun" w:eastAsia="SimSun" w:hAnsi="SimSun"/>
-          <w:sz w:val="24"/>
-          <w:szCs w:val="24"/>
-        </w:rPr>
-      </w:pPr>
-      <w:r>
-        <w:rPr>
-          <w:rFonts w:ascii="SimSun" w:eastAsia="SimSun" w:hAnsi="SimSun"/>
-          <w:sz w:val="24"/>
-          <w:szCs w:val="24"/>
-        </w:rPr>
-        <w:lastRenderedPageBreak/>
+      <w:proofErr w:type="gramStart"/>
+      <w:r>
+        <w:rPr>
+          <w:rFonts w:ascii="SimSun" w:eastAsia="SimSun" w:hAnsi="SimSun"/>
+          <w:sz w:val="24"/>
+          <w:szCs w:val="24"/>
+        </w:rPr>
+        <w:t>loglog(</w:t>
+      </w:r>
+      <w:proofErr w:type="gramEnd"/>
+      <w:r>
+        <w:rPr>
+          <w:rFonts w:ascii="SimSun" w:eastAsia="SimSun" w:hAnsi="SimSun"/>
+          <w:sz w:val="24"/>
+          <w:szCs w:val="24"/>
+        </w:rPr>
+        <w:t>x2, y2, '</w:t>
+      </w:r>
+      <w:proofErr w:type="spellStart"/>
+      <w:r>
+        <w:rPr>
+          <w:rFonts w:ascii="SimSun" w:eastAsia="SimSun" w:hAnsi="SimSun"/>
+          <w:sz w:val="24"/>
+          <w:szCs w:val="24"/>
+        </w:rPr>
+        <w:t>color</w:t>
+      </w:r>
+      <w:proofErr w:type="spellEnd"/>
+      <w:r>
+        <w:rPr>
+          <w:rFonts w:ascii="SimSun" w:eastAsia="SimSun" w:hAnsi="SimSun"/>
+          <w:sz w:val="24"/>
+          <w:szCs w:val="24"/>
+        </w:rPr>
+        <w:t>',c(2,:))</w:t>
+      </w:r>
+    </w:p>
+    <w:p>
+      <w:pPr>
+        <w:rPr>
+          <w:rFonts w:ascii="SimSun" w:eastAsia="SimSun" w:hAnsi="SimSun"/>
+          <w:sz w:val="24"/>
+          <w:szCs w:val="24"/>
+        </w:rPr>
+      </w:pPr>
+      <w:r>
+        <w:rPr>
+          <w:rFonts w:ascii="SimSun" w:eastAsia="SimSun" w:hAnsi="SimSun"/>
+          <w:sz w:val="24"/>
+          <w:szCs w:val="24"/>
+        </w:rPr>
         <w:t>hold off</w:t>
       </w:r>
     </w:p>
@@ -1127,30 +2401,96 @@
           <w:szCs w:val="24"/>
         </w:rPr>
       </w:pPr>
-      <w:r>
-        <w:rPr>
-          <w:rFonts w:ascii="SimSun" w:eastAsia="SimSun" w:hAnsi="SimSun"/>
-          <w:sz w:val="24"/>
-          <w:szCs w:val="24"/>
-        </w:rPr>
-        <w:t>xlabel('Frequency (Hz)')</w:t>
-      </w:r>
-    </w:p>
-    <w:p>
-      <w:pPr>
-        <w:rPr>
-          <w:rFonts w:ascii="SimSun" w:eastAsia="SimSun" w:hAnsi="SimSun"/>
-          <w:sz w:val="24"/>
-          <w:szCs w:val="24"/>
-        </w:rPr>
-      </w:pPr>
-      <w:r>
-        <w:rPr>
-          <w:rFonts w:ascii="SimSun" w:eastAsia="SimSun" w:hAnsi="SimSun"/>
-          <w:sz w:val="24"/>
-          <w:szCs w:val="24"/>
-        </w:rPr>
-        <w:t>ylabel('I_r_m_s/\surd(Hz)')</w:t>
+      <w:proofErr w:type="spellStart"/>
+      <w:proofErr w:type="gramStart"/>
+      <w:r>
+        <w:rPr>
+          <w:rFonts w:ascii="SimSun" w:eastAsia="SimSun" w:hAnsi="SimSun"/>
+          <w:sz w:val="24"/>
+          <w:szCs w:val="24"/>
+        </w:rPr>
+        <w:t>xlabel</w:t>
+      </w:r>
+      <w:proofErr w:type="spellEnd"/>
+      <w:r>
+        <w:rPr>
+          <w:rFonts w:ascii="SimSun" w:eastAsia="SimSun" w:hAnsi="SimSun"/>
+          <w:sz w:val="24"/>
+          <w:szCs w:val="24"/>
+        </w:rPr>
+        <w:t>(</w:t>
+      </w:r>
+      <w:proofErr w:type="gramEnd"/>
+      <w:r>
+        <w:rPr>
+          <w:rFonts w:ascii="SimSun" w:eastAsia="SimSun" w:hAnsi="SimSun"/>
+          <w:sz w:val="24"/>
+          <w:szCs w:val="24"/>
+        </w:rPr>
+        <w:t>'Frequency (Hz)')</w:t>
+      </w:r>
+    </w:p>
+    <w:p>
+      <w:pPr>
+        <w:rPr>
+          <w:rFonts w:ascii="SimSun" w:eastAsia="SimSun" w:hAnsi="SimSun"/>
+          <w:sz w:val="24"/>
+          <w:szCs w:val="24"/>
+        </w:rPr>
+      </w:pPr>
+      <w:proofErr w:type="spellStart"/>
+      <w:r>
+        <w:rPr>
+          <w:rFonts w:ascii="SimSun" w:eastAsia="SimSun" w:hAnsi="SimSun"/>
+          <w:sz w:val="24"/>
+          <w:szCs w:val="24"/>
+        </w:rPr>
+        <w:t>ylabel</w:t>
+      </w:r>
+      <w:proofErr w:type="spellEnd"/>
+      <w:r>
+        <w:rPr>
+          <w:rFonts w:ascii="SimSun" w:eastAsia="SimSun" w:hAnsi="SimSun"/>
+          <w:sz w:val="24"/>
+          <w:szCs w:val="24"/>
+        </w:rPr>
+        <w:t>('</w:t>
+      </w:r>
+      <w:proofErr w:type="spellStart"/>
+      <w:r>
+        <w:rPr>
+          <w:rFonts w:ascii="SimSun" w:eastAsia="SimSun" w:hAnsi="SimSun"/>
+          <w:sz w:val="24"/>
+          <w:szCs w:val="24"/>
+        </w:rPr>
+        <w:t>I_r_m_s</w:t>
+      </w:r>
+      <w:proofErr w:type="spellEnd"/>
+      <w:r>
+        <w:rPr>
+          <w:rFonts w:ascii="SimSun" w:eastAsia="SimSun" w:hAnsi="SimSun"/>
+          <w:sz w:val="24"/>
+          <w:szCs w:val="24"/>
+        </w:rPr>
+        <w:t>/\</w:t>
+      </w:r>
+      <w:proofErr w:type="gramStart"/>
+      <w:r>
+        <w:rPr>
+          <w:rFonts w:ascii="SimSun" w:eastAsia="SimSun" w:hAnsi="SimSun"/>
+          <w:sz w:val="24"/>
+          <w:szCs w:val="24"/>
+        </w:rPr>
+        <w:t>surd(</w:t>
+      </w:r>
+      <w:proofErr w:type="gramEnd"/>
+      <w:r>
+        <w:rPr>
+          <w:rFonts w:ascii="SimSun" w:eastAsia="SimSun" w:hAnsi="SimSun"/>
+          <w:sz w:val="24"/>
+          <w:szCs w:val="24"/>
+        </w:rPr>
+        <w:t>Hz)')</w:t>
       </w:r>
     </w:p>
     <w:p>
@@ -1201,7 +2541,25 @@
           <w:sz w:val="24"/>
           <w:szCs w:val="24"/>
         </w:rPr>
-        <w:t>print('Noise_low_f','-depsc')</w:t>
+        <w:t>print('Noise_low_f','-</w:t>
+      </w:r>
+      <w:proofErr w:type="spellStart"/>
+      <w:r>
+        <w:rPr>
+          <w:rFonts w:ascii="SimSun" w:eastAsia="SimSun" w:hAnsi="SimSun"/>
+          <w:sz w:val="24"/>
+          <w:szCs w:val="24"/>
+        </w:rPr>
+        <w:t>depsc</w:t>
+      </w:r>
+      <w:proofErr w:type="spellEnd"/>
+      <w:r>
+        <w:rPr>
+          <w:rFonts w:ascii="SimSun" w:eastAsia="SimSun" w:hAnsi="SimSun"/>
+          <w:sz w:val="24"/>
+          <w:szCs w:val="24"/>
+        </w:rPr>
+        <w:t>')</w:t>
       </w:r>
     </w:p>
     <w:p>
@@ -1307,7 +2665,23 @@
           <w:sz w:val="24"/>
           <w:szCs w:val="24"/>
         </w:rPr>
-        <w:t>have gnd at the bottom of the diagram.</w:t>
+        <w:t xml:space="preserve">have </w:t>
+      </w:r>
+      <w:proofErr w:type="spellStart"/>
+      <w:r>
+        <w:rPr>
+          <w:sz w:val="24"/>
+          <w:szCs w:val="24"/>
+        </w:rPr>
+        <w:t>gnd</w:t>
+      </w:r>
+      <w:proofErr w:type="spellEnd"/>
+      <w:r>
+        <w:rPr>
+          <w:sz w:val="24"/>
+          <w:szCs w:val="24"/>
+        </w:rPr>
+        <w:t xml:space="preserve"> at the bottom of the diagram.</w:t>
       </w:r>
     </w:p>
     <w:p>
@@ -1504,6 +2878,121 @@
     </w:lvl>
   </w:abstractNum>
   <w:abstractNum w:abstractNumId="1" w15:restartNumberingAfterBreak="0">
+    <w:nsid w:val="38380739"/>
+    <w:multiLevelType w:val="hybridMultilevel"/>
+    <w:tmpl w:val="CBBA359A"/>
+    <w:lvl w:ilvl="0" w:tplc="D14E586A">
+      <w:start w:val="1"/>
+      <w:numFmt w:val="bullet"/>
+      <w:lvlText w:val=""/>
+      <w:lvlJc w:val="left"/>
+      <w:pPr>
+        <w:ind w:left="720" w:hanging="360"/>
+      </w:pPr>
+      <w:rPr>
+        <w:rFonts w:ascii="Symbol" w:hAnsi="Symbol" w:hint="default"/>
+        <w:sz w:val="24"/>
+        <w:szCs w:val="24"/>
+      </w:rPr>
+    </w:lvl>
+    <w:lvl w:ilvl="1" w:tplc="08090003" w:tentative="1">
+      <w:start w:val="1"/>
+      <w:numFmt w:val="bullet"/>
+      <w:lvlText w:val="o"/>
+      <w:lvlJc w:val="left"/>
+      <w:pPr>
+        <w:ind w:left="1440" w:hanging="360"/>
+      </w:pPr>
+      <w:rPr>
+        <w:rFonts w:ascii="Courier New" w:hAnsi="Courier New" w:cs="Courier New" w:hint="default"/>
+      </w:rPr>
+    </w:lvl>
+    <w:lvl w:ilvl="2" w:tplc="08090005" w:tentative="1">
+      <w:start w:val="1"/>
+      <w:numFmt w:val="bullet"/>
+      <w:lvlText w:val=""/>
+      <w:lvlJc w:val="left"/>
+      <w:pPr>
+        <w:ind w:left="2160" w:hanging="360"/>
+      </w:pPr>
+      <w:rPr>
+        <w:rFonts w:ascii="Wingdings" w:hAnsi="Wingdings" w:hint="default"/>
+      </w:rPr>
+    </w:lvl>
+    <w:lvl w:ilvl="3" w:tplc="08090001" w:tentative="1">
+      <w:start w:val="1"/>
+      <w:numFmt w:val="bullet"/>
+      <w:lvlText w:val=""/>
+      <w:lvlJc w:val="left"/>
+      <w:pPr>
+        <w:ind w:left="2880" w:hanging="360"/>
+      </w:pPr>
+      <w:rPr>
+        <w:rFonts w:ascii="Symbol" w:hAnsi="Symbol" w:hint="default"/>
+      </w:rPr>
+    </w:lvl>
+    <w:lvl w:ilvl="4" w:tplc="08090003" w:tentative="1">
+      <w:start w:val="1"/>
+      <w:numFmt w:val="bullet"/>
+      <w:lvlText w:val="o"/>
+      <w:lvlJc w:val="left"/>
+      <w:pPr>
+        <w:ind w:left="3600" w:hanging="360"/>
+      </w:pPr>
+      <w:rPr>
+        <w:rFonts w:ascii="Courier New" w:hAnsi="Courier New" w:cs="Courier New" w:hint="default"/>
+      </w:rPr>
+    </w:lvl>
+    <w:lvl w:ilvl="5" w:tplc="08090005" w:tentative="1">
+      <w:start w:val="1"/>
+      <w:numFmt w:val="bullet"/>
+      <w:lvlText w:val=""/>
+      <w:lvlJc w:val="left"/>
+      <w:pPr>
+        <w:ind w:left="4320" w:hanging="360"/>
+      </w:pPr>
+      <w:rPr>
+        <w:rFonts w:ascii="Wingdings" w:hAnsi="Wingdings" w:hint="default"/>
+      </w:rPr>
+    </w:lvl>
+    <w:lvl w:ilvl="6" w:tplc="08090001" w:tentative="1">
+      <w:start w:val="1"/>
+      <w:numFmt w:val="bullet"/>
+      <w:lvlText w:val=""/>
+      <w:lvlJc w:val="left"/>
+      <w:pPr>
+        <w:ind w:left="5040" w:hanging="360"/>
+      </w:pPr>
+      <w:rPr>
+        <w:rFonts w:ascii="Symbol" w:hAnsi="Symbol" w:hint="default"/>
+      </w:rPr>
+    </w:lvl>
+    <w:lvl w:ilvl="7" w:tplc="08090003" w:tentative="1">
+      <w:start w:val="1"/>
+      <w:numFmt w:val="bullet"/>
+      <w:lvlText w:val="o"/>
+      <w:lvlJc w:val="left"/>
+      <w:pPr>
+        <w:ind w:left="5760" w:hanging="360"/>
+      </w:pPr>
+      <w:rPr>
+        <w:rFonts w:ascii="Courier New" w:hAnsi="Courier New" w:cs="Courier New" w:hint="default"/>
+      </w:rPr>
+    </w:lvl>
+    <w:lvl w:ilvl="8" w:tplc="08090005" w:tentative="1">
+      <w:start w:val="1"/>
+      <w:numFmt w:val="bullet"/>
+      <w:lvlText w:val=""/>
+      <w:lvlJc w:val="left"/>
+      <w:pPr>
+        <w:ind w:left="6480" w:hanging="360"/>
+      </w:pPr>
+      <w:rPr>
+        <w:rFonts w:ascii="Wingdings" w:hAnsi="Wingdings" w:hint="default"/>
+      </w:rPr>
+    </w:lvl>
+  </w:abstractNum>
+  <w:abstractNum w:abstractNumId="2" w15:restartNumberingAfterBreak="0">
     <w:nsid w:val="47AB2572"/>
     <w:multiLevelType w:val="hybridMultilevel"/>
     <w:tmpl w:val="2124AB0C"/>
@@ -1616,7 +3105,7 @@
       </w:rPr>
     </w:lvl>
   </w:abstractNum>
-  <w:abstractNum w:abstractNumId="2" w15:restartNumberingAfterBreak="0">
+  <w:abstractNum w:abstractNumId="3" w15:restartNumberingAfterBreak="0">
     <w:nsid w:val="6E25443C"/>
     <w:multiLevelType w:val="hybridMultilevel"/>
     <w:tmpl w:val="17463BD8"/>
@@ -1733,9 +3222,12 @@
     <w:abstractNumId w:val="0"/>
   </w:num>
   <w:num w:numId="2">
+    <w:abstractNumId w:val="3"/>
+  </w:num>
+  <w:num w:numId="3">
     <w:abstractNumId w:val="2"/>
   </w:num>
-  <w:num w:numId="3">
+  <w:num w:numId="4">
     <w:abstractNumId w:val="1"/>
   </w:num>
 </w:numbering>

</xml_diff>

<commit_message>
Finished draft 1 of BHD_for_ligo chapter
The main text for the BHD ligo chapter has been completed. Some figure captions need work, but the bulk of what needs writing is written.
</commit_message>
<xml_diff>
--- a/Structuring.docx
+++ b/Structuring.docx
@@ -78,33 +78,15 @@
           <w:sz w:val="24"/>
           <w:szCs w:val="24"/>
         </w:rPr>
-        <w:t xml:space="preserve">This is the first step to writing a chapter. Come up with likely </w:t>
-      </w:r>
-      <w:proofErr w:type="gramStart"/>
-      <w:r>
-        <w:rPr>
-          <w:rFonts w:cstheme="minorHAnsi"/>
-          <w:sz w:val="24"/>
-          <w:szCs w:val="24"/>
-        </w:rPr>
-        <w:t>sections,</w:t>
-      </w:r>
-      <w:r>
-        <w:rPr>
-          <w:rFonts w:cstheme="minorHAnsi"/>
-          <w:sz w:val="24"/>
-          <w:szCs w:val="24"/>
-        </w:rPr>
-        <w:t xml:space="preserve"> and</w:t>
-      </w:r>
-      <w:proofErr w:type="gramEnd"/>
-      <w:r>
-        <w:rPr>
-          <w:rFonts w:cstheme="minorHAnsi"/>
-          <w:sz w:val="24"/>
-          <w:szCs w:val="24"/>
-        </w:rPr>
-        <w:t xml:space="preserve"> fill them in with ideas for paragraphs. Think about/put in relevant figures at this point.</w:t>
+        <w:t>This is the first step to writing a chapter. Come up with likely sections,</w:t>
+      </w:r>
+      <w:r>
+        <w:rPr>
+          <w:rFonts w:cstheme="minorHAnsi"/>
+          <w:sz w:val="24"/>
+          <w:szCs w:val="24"/>
+        </w:rPr>
+        <w:t xml:space="preserve"> and fill them in with ideas for paragraphs. Think about/put in relevant figures at this point.</w:t>
       </w:r>
     </w:p>
     <w:p>
@@ -185,69 +167,15 @@
           <w:sz w:val="24"/>
           <w:szCs w:val="24"/>
         </w:rPr>
-        <w:t xml:space="preserve">writing. </w:t>
-      </w:r>
-      <w:proofErr w:type="gramStart"/>
-      <w:r>
-        <w:rPr>
-          <w:rFonts w:cstheme="minorHAnsi"/>
-          <w:sz w:val="24"/>
-          <w:szCs w:val="24"/>
-        </w:rPr>
-        <w:t>The majority of</w:t>
-      </w:r>
-      <w:proofErr w:type="gramEnd"/>
-      <w:r>
-        <w:rPr>
-          <w:rFonts w:cstheme="minorHAnsi"/>
-          <w:sz w:val="24"/>
-          <w:szCs w:val="24"/>
-        </w:rPr>
-        <w:t xml:space="preserve"> the content of the chapter (&lt;90%) will be written by the end of this draft</w:t>
-      </w:r>
-      <w:r>
-        <w:rPr>
-          <w:rFonts w:cstheme="minorHAnsi"/>
-          <w:sz w:val="24"/>
-          <w:szCs w:val="24"/>
-        </w:rPr>
-        <w:t xml:space="preserve">. The writing at this point may be ‘stream of </w:t>
-      </w:r>
-      <w:proofErr w:type="spellStart"/>
-      <w:r>
-        <w:rPr>
-          <w:rFonts w:cstheme="minorHAnsi"/>
-          <w:sz w:val="24"/>
-          <w:szCs w:val="24"/>
-        </w:rPr>
-        <w:t>conciouness</w:t>
-      </w:r>
-      <w:proofErr w:type="spellEnd"/>
-      <w:r>
-        <w:rPr>
-          <w:rFonts w:cstheme="minorHAnsi"/>
-          <w:sz w:val="24"/>
-          <w:szCs w:val="24"/>
-        </w:rPr>
-        <w:t>`-</w:t>
-      </w:r>
-      <w:proofErr w:type="spellStart"/>
-      <w:r>
-        <w:rPr>
-          <w:rFonts w:cstheme="minorHAnsi"/>
-          <w:sz w:val="24"/>
-          <w:szCs w:val="24"/>
-        </w:rPr>
-        <w:t>esk</w:t>
-      </w:r>
-      <w:proofErr w:type="spellEnd"/>
-      <w:r>
-        <w:rPr>
-          <w:rFonts w:cstheme="minorHAnsi"/>
-          <w:sz w:val="24"/>
-          <w:szCs w:val="24"/>
-        </w:rPr>
-        <w:t xml:space="preserve">, but it should have had an attempt at making it clear. </w:t>
+        <w:t>writing. The majority of the content of the chapter (&lt;90%) will be written by the end of this draft</w:t>
+      </w:r>
+      <w:r>
+        <w:rPr>
+          <w:rFonts w:cstheme="minorHAnsi"/>
+          <w:sz w:val="24"/>
+          <w:szCs w:val="24"/>
+        </w:rPr>
+        <w:t xml:space="preserve">. The writing at this point may be ‘stream of conciouness`-esk, but it should have had an attempt at making it clear. </w:t>
       </w:r>
       <w:r>
         <w:rPr>
@@ -399,25 +327,7 @@
           <w:sz w:val="24"/>
           <w:szCs w:val="24"/>
         </w:rPr>
-        <w:t xml:space="preserve">organising the paragraphs. If it becomes obvious that there </w:t>
-      </w:r>
-      <w:proofErr w:type="gramStart"/>
-      <w:r>
-        <w:rPr>
-          <w:rFonts w:cstheme="minorHAnsi"/>
-          <w:sz w:val="24"/>
-          <w:szCs w:val="24"/>
-        </w:rPr>
-        <w:t>are</w:t>
-      </w:r>
-      <w:proofErr w:type="gramEnd"/>
-      <w:r>
-        <w:rPr>
-          <w:rFonts w:cstheme="minorHAnsi"/>
-          <w:sz w:val="24"/>
-          <w:szCs w:val="24"/>
-        </w:rPr>
-        <w:t xml:space="preserve"> bit which are missing, then they shall be added at this point. They will be completed to the same quality as the rest of the contents of the second draft.</w:t>
+        <w:t>organising the paragraphs. If it becomes obvious that there are bit which are missing, then they shall be added at this point. They will be completed to the same quality as the rest of the contents of the second draft.</w:t>
       </w:r>
     </w:p>
     <w:p>
@@ -441,23 +351,7 @@
           <w:sz w:val="24"/>
           <w:szCs w:val="24"/>
         </w:rPr>
-        <w:t>Third</w:t>
-      </w:r>
-      <w:r>
-        <w:rPr>
-          <w:rFonts w:cstheme="minorHAnsi"/>
-          <w:sz w:val="24"/>
-          <w:szCs w:val="24"/>
-        </w:rPr>
-        <w:t xml:space="preserve"> draft will be figure focussed: All the figures will be made to their final form (hopefully), and captions will be written to their final form. </w:t>
-      </w:r>
-      <w:r>
-        <w:rPr>
-          <w:rFonts w:cstheme="minorHAnsi"/>
-          <w:sz w:val="24"/>
-          <w:szCs w:val="24"/>
-        </w:rPr>
-        <w:t>The second drafting may reveal points where a figure would help explain something.</w:t>
+        <w:t>Third draft will be figure focussed: All the figures will be made to their final form (hopefully), and captions will be written to their final form. The second drafting may reveal points where a figure would help explain something.</w:t>
       </w:r>
     </w:p>
     <w:p>
@@ -561,25 +455,7 @@
           <w:sz w:val="24"/>
           <w:szCs w:val="24"/>
         </w:rPr>
-        <w:t>word level. This involves checking the spellings of words (</w:t>
-      </w:r>
-      <w:proofErr w:type="spellStart"/>
-      <w:r>
-        <w:rPr>
-          <w:rFonts w:cstheme="minorHAnsi"/>
-          <w:sz w:val="24"/>
-          <w:szCs w:val="24"/>
-        </w:rPr>
-        <w:t>eg.</w:t>
-      </w:r>
-      <w:proofErr w:type="spellEnd"/>
-      <w:r>
-        <w:rPr>
-          <w:rFonts w:cstheme="minorHAnsi"/>
-          <w:sz w:val="24"/>
-          <w:szCs w:val="24"/>
-        </w:rPr>
-        <w:t xml:space="preserve"> Effect or affect). The</w:t>
+        <w:t>word level. This involves checking the spellings of words (eg. Effect or affect). The</w:t>
       </w:r>
       <w:r>
         <w:rPr>
@@ -704,39 +580,7 @@
           <w:sz w:val="24"/>
           <w:szCs w:val="24"/>
         </w:rPr>
-        <w:t>Figures shall be saved as eps when using matplotlib or '</w:t>
-      </w:r>
-      <w:proofErr w:type="spellStart"/>
-      <w:r>
-        <w:rPr>
-          <w:sz w:val="24"/>
-          <w:szCs w:val="24"/>
-        </w:rPr>
-        <w:t>epsc</w:t>
-      </w:r>
-      <w:proofErr w:type="spellEnd"/>
-      <w:r>
-        <w:rPr>
-          <w:sz w:val="24"/>
-          <w:szCs w:val="24"/>
-        </w:rPr>
-        <w:t xml:space="preserve">' when using </w:t>
-      </w:r>
-      <w:proofErr w:type="spellStart"/>
-      <w:r>
-        <w:rPr>
-          <w:sz w:val="24"/>
-          <w:szCs w:val="24"/>
-        </w:rPr>
-        <w:t>matlab</w:t>
-      </w:r>
-      <w:proofErr w:type="spellEnd"/>
-      <w:r>
-        <w:rPr>
-          <w:sz w:val="24"/>
-          <w:szCs w:val="24"/>
-        </w:rPr>
-        <w:t>. This is to prevent a latex warning.</w:t>
+        <w:t>Figures shall be saved as eps when using matplotlib or 'epsc' when using matlab. This is to prevent a latex warning.</w:t>
       </w:r>
     </w:p>
     <w:p>
@@ -776,23 +620,7 @@
           <w:sz w:val="24"/>
           <w:szCs w:val="24"/>
         </w:rPr>
-        <w:t xml:space="preserve">Figure names shall be 'chapter </w:t>
-      </w:r>
-      <w:proofErr w:type="spellStart"/>
-      <w:r>
-        <w:rPr>
-          <w:sz w:val="24"/>
-          <w:szCs w:val="24"/>
-        </w:rPr>
-        <w:t>description'_chapter_'figure</w:t>
-      </w:r>
-      <w:proofErr w:type="spellEnd"/>
-      <w:r>
-        <w:rPr>
-          <w:sz w:val="24"/>
-          <w:szCs w:val="24"/>
-        </w:rPr>
-        <w:t xml:space="preserve"> description'. For</w:t>
+        <w:t>Figure names shall be 'chapter description'_chapter_'figure description'. For</w:t>
       </w:r>
       <w:r>
         <w:rPr>
@@ -806,23 +634,7 @@
           <w:sz w:val="24"/>
           <w:szCs w:val="24"/>
         </w:rPr>
-        <w:t>example, '</w:t>
-      </w:r>
-      <w:proofErr w:type="spellStart"/>
-      <w:r>
-        <w:rPr>
-          <w:sz w:val="24"/>
-          <w:szCs w:val="24"/>
-        </w:rPr>
-        <w:t>sim_chapter_Zoom_in_ETM_tuning</w:t>
-      </w:r>
-      <w:proofErr w:type="spellEnd"/>
-      <w:r>
-        <w:rPr>
-          <w:sz w:val="24"/>
-          <w:szCs w:val="24"/>
-        </w:rPr>
-        <w:t>' refers to the figure being in the</w:t>
+        <w:t>example, 'sim_chapter_Zoom_in_ETM_tuning' refers to the figure being in the</w:t>
       </w:r>
       <w:r>
         <w:rPr>
@@ -876,23 +688,7 @@
           <w:sz w:val="24"/>
           <w:szCs w:val="24"/>
         </w:rPr>
-        <w:t xml:space="preserve">Are all lines visible/distinguishable? Changing thickness and </w:t>
-      </w:r>
-      <w:proofErr w:type="spellStart"/>
-      <w:r>
-        <w:rPr>
-          <w:sz w:val="24"/>
-          <w:szCs w:val="24"/>
-        </w:rPr>
-        <w:t>linestyle</w:t>
-      </w:r>
-      <w:proofErr w:type="spellEnd"/>
-      <w:r>
-        <w:rPr>
-          <w:sz w:val="24"/>
-          <w:szCs w:val="24"/>
-        </w:rPr>
-        <w:t xml:space="preserve"> can help.</w:t>
+        <w:t>Are all lines visible/distinguishable? Changing thickness and linestyle can help.</w:t>
       </w:r>
     </w:p>
     <w:p>
@@ -907,37 +703,12 @@
           <w:szCs w:val="24"/>
         </w:rPr>
       </w:pPr>
-      <w:proofErr w:type="gramStart"/>
-      <w:r>
-        <w:rPr>
-          <w:sz w:val="24"/>
-          <w:szCs w:val="24"/>
-        </w:rPr>
-        <w:t>Are</w:t>
-      </w:r>
-      <w:proofErr w:type="gramEnd"/>
-      <w:r>
-        <w:rPr>
-          <w:sz w:val="24"/>
-          <w:szCs w:val="24"/>
-        </w:rPr>
-        <w:t xml:space="preserve"> the axis labelled? The label is a sentence, so normal sentence capitalisation should be used. If </w:t>
-      </w:r>
-      <w:proofErr w:type="spellStart"/>
-      <w:r>
-        <w:rPr>
-          <w:sz w:val="24"/>
-          <w:szCs w:val="24"/>
-        </w:rPr>
-        <w:t>its</w:t>
-      </w:r>
-      <w:proofErr w:type="spellEnd"/>
-      <w:r>
-        <w:rPr>
-          <w:sz w:val="24"/>
-          <w:szCs w:val="24"/>
-        </w:rPr>
-        <w:t xml:space="preserve"> just one word, use a capital letter.</w:t>
+      <w:r>
+        <w:rPr>
+          <w:sz w:val="24"/>
+          <w:szCs w:val="24"/>
+        </w:rPr>
+        <w:t>Are the axis labelled? The label is a sentence, so normal sentence capitalisation should be used. If its just one word, use a capital letter.</w:t>
       </w:r>
     </w:p>
     <w:p>
@@ -972,22 +743,13 @@
           <w:szCs w:val="24"/>
         </w:rPr>
       </w:pPr>
-      <w:proofErr w:type="gramStart"/>
       <w:r>
         <w:rPr>
           <w:sz w:val="24"/>
           <w:szCs w:val="24"/>
         </w:rPr>
         <w:lastRenderedPageBreak/>
-        <w:t>Do</w:t>
-      </w:r>
-      <w:proofErr w:type="gramEnd"/>
-      <w:r>
-        <w:rPr>
-          <w:sz w:val="24"/>
-          <w:szCs w:val="24"/>
-        </w:rPr>
-        <w:t xml:space="preserve"> the axis have units? The units should be put in brackets like (m). No other shape of brackets should be used.</w:t>
+        <w:t>Do the axis have units? The units should be put in brackets like (m). No other shape of brackets should be used.</w:t>
       </w:r>
     </w:p>
     <w:p>
@@ -1027,23 +789,7 @@
           <w:sz w:val="24"/>
           <w:szCs w:val="24"/>
         </w:rPr>
-        <w:t xml:space="preserve">Are subscripts properly </w:t>
-      </w:r>
-      <w:proofErr w:type="spellStart"/>
-      <w:r>
-        <w:rPr>
-          <w:sz w:val="24"/>
-          <w:szCs w:val="24"/>
-        </w:rPr>
-        <w:t>typset</w:t>
-      </w:r>
-      <w:proofErr w:type="spellEnd"/>
-      <w:r>
-        <w:rPr>
-          <w:sz w:val="24"/>
-          <w:szCs w:val="24"/>
-        </w:rPr>
-        <w:t>?</w:t>
+        <w:t>Are subscripts properly typset?</w:t>
       </w:r>
     </w:p>
     <w:p>
@@ -1063,39 +809,7 @@
           <w:sz w:val="24"/>
           <w:szCs w:val="24"/>
         </w:rPr>
-        <w:t xml:space="preserve">Have standard unit labels been used? </w:t>
-      </w:r>
-      <w:proofErr w:type="gramStart"/>
-      <w:r>
-        <w:rPr>
-          <w:sz w:val="24"/>
-          <w:szCs w:val="24"/>
-        </w:rPr>
-        <w:t>A for</w:t>
-      </w:r>
-      <w:proofErr w:type="gramEnd"/>
-      <w:r>
-        <w:rPr>
-          <w:sz w:val="24"/>
-          <w:szCs w:val="24"/>
-        </w:rPr>
-        <w:t xml:space="preserve"> amps, degree symbols instead of '</w:t>
-      </w:r>
-      <w:proofErr w:type="spellStart"/>
-      <w:r>
-        <w:rPr>
-          <w:sz w:val="24"/>
-          <w:szCs w:val="24"/>
-        </w:rPr>
-        <w:t>deg</w:t>
-      </w:r>
-      <w:proofErr w:type="spellEnd"/>
-      <w:r>
-        <w:rPr>
-          <w:sz w:val="24"/>
-          <w:szCs w:val="24"/>
-        </w:rPr>
-        <w:t>' etc.</w:t>
+        <w:t>Have standard unit labels been used? A for amps, degree symbols instead of 'deg' etc.</w:t>
       </w:r>
     </w:p>
     <w:p>
@@ -1135,23 +849,7 @@
           <w:sz w:val="24"/>
           <w:szCs w:val="24"/>
         </w:rPr>
-        <w:t xml:space="preserve">Check for spelling mistakes! e.g. </w:t>
-      </w:r>
-      <w:proofErr w:type="spellStart"/>
-      <w:r>
-        <w:rPr>
-          <w:sz w:val="24"/>
-          <w:szCs w:val="24"/>
-        </w:rPr>
-        <w:t>freuqency</w:t>
-      </w:r>
-      <w:proofErr w:type="spellEnd"/>
-      <w:r>
-        <w:rPr>
-          <w:sz w:val="24"/>
-          <w:szCs w:val="24"/>
-        </w:rPr>
-        <w:t xml:space="preserve"> -&gt; frequency.</w:t>
+        <w:t>Check for spelling mistakes! e.g. freuqency -&gt; frequency.</w:t>
       </w:r>
     </w:p>
     <w:p>
@@ -1254,23 +952,7 @@
           <w:sz w:val="24"/>
           <w:szCs w:val="24"/>
         </w:rPr>
-        <w:t xml:space="preserve">Standard </w:t>
-      </w:r>
-      <w:proofErr w:type="spellStart"/>
-      <w:r>
-        <w:rPr>
-          <w:sz w:val="24"/>
-          <w:szCs w:val="24"/>
-        </w:rPr>
-        <w:t>matlab</w:t>
-      </w:r>
-      <w:proofErr w:type="spellEnd"/>
-      <w:r>
-        <w:rPr>
-          <w:sz w:val="24"/>
-          <w:szCs w:val="24"/>
-        </w:rPr>
-        <w:t xml:space="preserve"> and matplotlib fonts will be used. The following examples give</w:t>
+        <w:t>Standard matlab and matplotlib fonts will be used. The following examples give</w:t>
       </w:r>
       <w:r>
         <w:rPr>
@@ -1285,6 +967,81 @@
           <w:szCs w:val="24"/>
         </w:rPr>
         <w:t>a template to use which looks nice.</w:t>
+      </w:r>
+    </w:p>
+    <w:p>
+      <w:pPr>
+        <w:pStyle w:val="ListParagraph"/>
+        <w:numPr>
+          <w:ilvl w:val="0"/>
+          <w:numId w:val="2"/>
+        </w:numPr>
+        <w:rPr>
+          <w:sz w:val="24"/>
+          <w:szCs w:val="24"/>
+        </w:rPr>
+      </w:pPr>
+      <w:r>
+        <w:rPr>
+          <w:sz w:val="24"/>
+          <w:szCs w:val="24"/>
+        </w:rPr>
+        <w:t>Figure ratios will be (6,4) for single plots, (6,6) for ‘Bode type’ plots</w:t>
+      </w:r>
+      <w:r>
+        <w:rPr>
+          <w:sz w:val="24"/>
+          <w:szCs w:val="24"/>
+        </w:rPr>
+        <w:t xml:space="preserve"> (one on top of the other). Sometimes this rule can be ignored. </w:t>
+      </w:r>
+      <w:r>
+        <w:rPr>
+          <w:sz w:val="24"/>
+          <w:szCs w:val="24"/>
+        </w:rPr>
+        <w:t xml:space="preserve"> </w:t>
+      </w:r>
+    </w:p>
+    <w:p>
+      <w:pPr>
+        <w:pStyle w:val="ListParagraph"/>
+        <w:numPr>
+          <w:ilvl w:val="0"/>
+          <w:numId w:val="2"/>
+        </w:numPr>
+        <w:rPr>
+          <w:sz w:val="24"/>
+          <w:szCs w:val="24"/>
+        </w:rPr>
+      </w:pPr>
+      <w:r>
+        <w:rPr>
+          <w:sz w:val="24"/>
+          <w:szCs w:val="24"/>
+        </w:rPr>
+        <w:t xml:space="preserve">If making a plot </w:t>
+      </w:r>
+      <w:r>
+        <w:rPr>
+          <w:sz w:val="24"/>
+          <w:szCs w:val="24"/>
+        </w:rPr>
+        <w:t xml:space="preserve">with subplots </w:t>
+      </w:r>
+      <w:r>
+        <w:rPr>
+          <w:sz w:val="24"/>
+          <w:szCs w:val="24"/>
+        </w:rPr>
+        <w:t xml:space="preserve">which </w:t>
+      </w:r>
+      <w:r>
+        <w:rPr>
+          <w:sz w:val="24"/>
+          <w:szCs w:val="24"/>
+        </w:rPr>
+        <w:t>have ‘shared axis’, only label one of the axis. If it’s the xaxis, then label the bottom one. If it’s the y axis, label the left one.</w:t>
       </w:r>
     </w:p>
     <w:p>
@@ -1320,107 +1077,119 @@
           <w:sz w:val="24"/>
           <w:szCs w:val="24"/>
         </w:rPr>
-        <w:t>In general, for matplotlib figures use:</w:t>
-      </w:r>
-    </w:p>
-    <w:p>
-      <w:pPr>
-        <w:rPr>
-          <w:sz w:val="24"/>
-          <w:szCs w:val="24"/>
-        </w:rPr>
-      </w:pPr>
-    </w:p>
-    <w:p>
-      <w:pPr>
-        <w:rPr>
-          <w:rFonts w:ascii="SimSun" w:eastAsia="SimSun" w:hAnsi="SimSun"/>
-          <w:sz w:val="24"/>
-          <w:szCs w:val="24"/>
-        </w:rPr>
-      </w:pPr>
-      <w:proofErr w:type="spellStart"/>
-      <w:r>
-        <w:rPr>
-          <w:rFonts w:ascii="SimSun" w:eastAsia="SimSun" w:hAnsi="SimSun"/>
-          <w:sz w:val="24"/>
-          <w:szCs w:val="24"/>
-        </w:rPr>
-        <w:t>figure_size</w:t>
-      </w:r>
-      <w:proofErr w:type="spellEnd"/>
-      <w:r>
-        <w:rPr>
-          <w:rFonts w:ascii="SimSun" w:eastAsia="SimSun" w:hAnsi="SimSun"/>
-          <w:sz w:val="24"/>
-          <w:szCs w:val="24"/>
-        </w:rPr>
-        <w:t xml:space="preserve"> = (6,4)</w:t>
-      </w:r>
-    </w:p>
-    <w:p>
-      <w:pPr>
-        <w:rPr>
-          <w:rFonts w:ascii="SimSun" w:eastAsia="SimSun" w:hAnsi="SimSun"/>
-          <w:sz w:val="24"/>
-          <w:szCs w:val="24"/>
-        </w:rPr>
-      </w:pPr>
-      <w:proofErr w:type="spellStart"/>
-      <w:proofErr w:type="gramStart"/>
-      <w:r>
-        <w:rPr>
-          <w:rFonts w:ascii="SimSun" w:eastAsia="SimSun" w:hAnsi="SimSun"/>
-          <w:sz w:val="24"/>
-          <w:szCs w:val="24"/>
-        </w:rPr>
-        <w:t>plt.figure</w:t>
-      </w:r>
-      <w:proofErr w:type="spellEnd"/>
-      <w:proofErr w:type="gramEnd"/>
-      <w:r>
-        <w:rPr>
-          <w:rFonts w:ascii="SimSun" w:eastAsia="SimSun" w:hAnsi="SimSun"/>
-          <w:sz w:val="24"/>
-          <w:szCs w:val="24"/>
-        </w:rPr>
-        <w:t>(</w:t>
-      </w:r>
-      <w:proofErr w:type="spellStart"/>
-      <w:r>
-        <w:rPr>
-          <w:rFonts w:ascii="SimSun" w:eastAsia="SimSun" w:hAnsi="SimSun"/>
-          <w:sz w:val="24"/>
-          <w:szCs w:val="24"/>
-        </w:rPr>
-        <w:t>figsize</w:t>
-      </w:r>
-      <w:proofErr w:type="spellEnd"/>
-      <w:r>
-        <w:rPr>
-          <w:rFonts w:ascii="SimSun" w:eastAsia="SimSun" w:hAnsi="SimSun"/>
-          <w:sz w:val="24"/>
-          <w:szCs w:val="24"/>
-        </w:rPr>
-        <w:t xml:space="preserve"> = </w:t>
-      </w:r>
-      <w:proofErr w:type="spellStart"/>
-      <w:r>
-        <w:rPr>
-          <w:rFonts w:ascii="SimSun" w:eastAsia="SimSun" w:hAnsi="SimSun"/>
-          <w:sz w:val="24"/>
-          <w:szCs w:val="24"/>
-        </w:rPr>
-        <w:t>figure_size,dpi</w:t>
-      </w:r>
-      <w:proofErr w:type="spellEnd"/>
-      <w:r>
-        <w:rPr>
-          <w:rFonts w:ascii="SimSun" w:eastAsia="SimSun" w:hAnsi="SimSun"/>
-          <w:sz w:val="24"/>
-          <w:szCs w:val="24"/>
-        </w:rPr>
-        <w:t xml:space="preserve"> = </w:t>
+        <w:t>In general, for matplotlib figures use</w:t>
+      </w:r>
+      <w:r>
+        <w:rPr>
+          <w:sz w:val="24"/>
+          <w:szCs w:val="24"/>
+        </w:rPr>
+        <w:t xml:space="preserve"> line width = </w:t>
+      </w:r>
+      <w:r>
+        <w:rPr>
+          <w:sz w:val="24"/>
+          <w:szCs w:val="24"/>
+        </w:rPr>
+        <w:t xml:space="preserve">3 for easy to see lines, for lines which need some detail, use 1 or 2. </w:t>
+      </w:r>
+      <w:r>
+        <w:rPr>
+          <w:sz w:val="24"/>
+          <w:szCs w:val="24"/>
+        </w:rPr>
+        <w:t xml:space="preserve"> fontsize = 10 on axis</w:t>
+      </w:r>
+      <w:r>
+        <w:rPr>
+          <w:sz w:val="24"/>
+          <w:szCs w:val="24"/>
+        </w:rPr>
+        <w:t xml:space="preserve"> and legend. If the legend looks too big, try splitting it into multiple columns. If this doesn’t work, reduce the</w:t>
+      </w:r>
+      <w:r>
+        <w:rPr>
+          <w:sz w:val="24"/>
+          <w:szCs w:val="24"/>
+        </w:rPr>
+        <w:t xml:space="preserve"> fontsize </w:t>
+      </w:r>
+      <w:r>
+        <w:rPr>
+          <w:sz w:val="24"/>
+          <w:szCs w:val="24"/>
+        </w:rPr>
+        <w:t>to</w:t>
+      </w:r>
+      <w:r>
+        <w:rPr>
+          <w:sz w:val="24"/>
+          <w:szCs w:val="24"/>
+        </w:rPr>
+        <w:t xml:space="preserve"> 8 for</w:t>
+      </w:r>
+      <w:r>
+        <w:rPr>
+          <w:sz w:val="24"/>
+          <w:szCs w:val="24"/>
+        </w:rPr>
+        <w:t xml:space="preserve"> the</w:t>
+      </w:r>
+      <w:r>
+        <w:rPr>
+          <w:sz w:val="24"/>
+          <w:szCs w:val="24"/>
+        </w:rPr>
+        <w:t xml:space="preserve"> legend. </w:t>
+      </w:r>
+      <w:r>
+        <w:rPr>
+          <w:sz w:val="24"/>
+          <w:szCs w:val="24"/>
+        </w:rPr>
+        <w:t>Standard matplotlib colours are nice. Standard font is nice</w:t>
+      </w:r>
+    </w:p>
+    <w:p>
+      <w:pPr>
+        <w:rPr>
+          <w:sz w:val="24"/>
+          <w:szCs w:val="24"/>
+        </w:rPr>
+      </w:pPr>
+    </w:p>
+    <w:p>
+      <w:pPr>
+        <w:rPr>
+          <w:rFonts w:ascii="SimSun" w:eastAsia="SimSun" w:hAnsi="SimSun"/>
+          <w:sz w:val="24"/>
+          <w:szCs w:val="24"/>
+        </w:rPr>
+      </w:pPr>
+      <w:r>
+        <w:rPr>
+          <w:rFonts w:ascii="SimSun" w:eastAsia="SimSun" w:hAnsi="SimSun"/>
+          <w:sz w:val="24"/>
+          <w:szCs w:val="24"/>
+        </w:rPr>
+        <w:t>figure_size = (6,4)</w:t>
+      </w:r>
+    </w:p>
+    <w:p>
+      <w:pPr>
+        <w:rPr>
+          <w:rFonts w:ascii="SimSun" w:eastAsia="SimSun" w:hAnsi="SimSun"/>
+          <w:sz w:val="24"/>
+          <w:szCs w:val="24"/>
+        </w:rPr>
+      </w:pPr>
+      <w:r>
+        <w:rPr>
+          <w:rFonts w:ascii="SimSun" w:eastAsia="SimSun" w:hAnsi="SimSun"/>
+          <w:sz w:val="24"/>
+          <w:szCs w:val="24"/>
+        </w:rPr>
+        <w:t xml:space="preserve">plt.figure(figsize = figure_size,dpi = </w:t>
       </w:r>
       <w:r>
         <w:rPr>
@@ -1447,119 +1216,47 @@
           <w:szCs w:val="24"/>
         </w:rPr>
       </w:pPr>
-      <w:proofErr w:type="spellStart"/>
-      <w:proofErr w:type="gramStart"/>
-      <w:r>
-        <w:rPr>
-          <w:rFonts w:ascii="SimSun" w:eastAsia="SimSun" w:hAnsi="SimSun"/>
-          <w:sz w:val="24"/>
-          <w:szCs w:val="24"/>
-        </w:rPr>
-        <w:t>plt.plot</w:t>
-      </w:r>
-      <w:proofErr w:type="spellEnd"/>
-      <w:proofErr w:type="gramEnd"/>
-      <w:r>
-        <w:rPr>
-          <w:rFonts w:ascii="SimSun" w:eastAsia="SimSun" w:hAnsi="SimSun"/>
-          <w:sz w:val="24"/>
-          <w:szCs w:val="24"/>
-        </w:rPr>
-        <w:t>(</w:t>
-      </w:r>
-      <w:proofErr w:type="spellStart"/>
-      <w:r>
-        <w:rPr>
-          <w:rFonts w:ascii="SimSun" w:eastAsia="SimSun" w:hAnsi="SimSun"/>
-          <w:sz w:val="24"/>
-          <w:szCs w:val="24"/>
-        </w:rPr>
-        <w:t>x,y,label</w:t>
-      </w:r>
-      <w:proofErr w:type="spellEnd"/>
-      <w:r>
-        <w:rPr>
-          <w:rFonts w:ascii="SimSun" w:eastAsia="SimSun" w:hAnsi="SimSun"/>
-          <w:sz w:val="24"/>
-          <w:szCs w:val="24"/>
-        </w:rPr>
-        <w:t xml:space="preserve"> = 'Name of line')</w:t>
-      </w:r>
-    </w:p>
-    <w:p>
-      <w:pPr>
-        <w:rPr>
-          <w:rFonts w:ascii="SimSun" w:eastAsia="SimSun" w:hAnsi="SimSun"/>
-          <w:sz w:val="24"/>
-          <w:szCs w:val="24"/>
-        </w:rPr>
-      </w:pPr>
-      <w:proofErr w:type="spellStart"/>
-      <w:proofErr w:type="gramStart"/>
-      <w:r>
-        <w:rPr>
-          <w:rFonts w:ascii="SimSun" w:eastAsia="SimSun" w:hAnsi="SimSun"/>
-          <w:sz w:val="24"/>
-          <w:szCs w:val="24"/>
-        </w:rPr>
-        <w:t>plt.legend</w:t>
-      </w:r>
-      <w:proofErr w:type="spellEnd"/>
-      <w:proofErr w:type="gramEnd"/>
-      <w:r>
-        <w:rPr>
-          <w:rFonts w:ascii="SimSun" w:eastAsia="SimSun" w:hAnsi="SimSun"/>
-          <w:sz w:val="24"/>
-          <w:szCs w:val="24"/>
-        </w:rPr>
-        <w:t>(prop={'size': 8},</w:t>
-      </w:r>
-      <w:proofErr w:type="spellStart"/>
-      <w:r>
-        <w:rPr>
-          <w:rFonts w:ascii="SimSun" w:eastAsia="SimSun" w:hAnsi="SimSun"/>
-          <w:sz w:val="24"/>
-          <w:szCs w:val="24"/>
-        </w:rPr>
-        <w:t>loc</w:t>
-      </w:r>
-      <w:proofErr w:type="spellEnd"/>
-      <w:r>
-        <w:rPr>
-          <w:rFonts w:ascii="SimSun" w:eastAsia="SimSun" w:hAnsi="SimSun"/>
-          <w:sz w:val="24"/>
-          <w:szCs w:val="24"/>
-        </w:rPr>
-        <w:t xml:space="preserve"> = 'lower left')</w:t>
-      </w:r>
-    </w:p>
-    <w:p>
-      <w:pPr>
-        <w:rPr>
-          <w:rFonts w:ascii="SimSun" w:eastAsia="SimSun" w:hAnsi="SimSun"/>
-          <w:sz w:val="24"/>
-          <w:szCs w:val="24"/>
-        </w:rPr>
-      </w:pPr>
-      <w:proofErr w:type="spellStart"/>
-      <w:proofErr w:type="gramStart"/>
-      <w:r>
-        <w:rPr>
-          <w:rFonts w:ascii="SimSun" w:eastAsia="SimSun" w:hAnsi="SimSun"/>
-          <w:sz w:val="24"/>
-          <w:szCs w:val="24"/>
-        </w:rPr>
-        <w:t>plt.xlabel</w:t>
-      </w:r>
-      <w:proofErr w:type="spellEnd"/>
-      <w:proofErr w:type="gramEnd"/>
-      <w:r>
-        <w:rPr>
-          <w:rFonts w:ascii="SimSun" w:eastAsia="SimSun" w:hAnsi="SimSun"/>
-          <w:sz w:val="24"/>
-          <w:szCs w:val="24"/>
-        </w:rPr>
-        <w:t>('x axis (units)'</w:t>
+      <w:r>
+        <w:rPr>
+          <w:rFonts w:ascii="SimSun" w:eastAsia="SimSun" w:hAnsi="SimSun"/>
+          <w:sz w:val="24"/>
+          <w:szCs w:val="24"/>
+        </w:rPr>
+        <w:t>plt.plot(x,y,label = 'Name of line')</w:t>
+      </w:r>
+    </w:p>
+    <w:p>
+      <w:pPr>
+        <w:rPr>
+          <w:rFonts w:ascii="SimSun" w:eastAsia="SimSun" w:hAnsi="SimSun"/>
+          <w:sz w:val="24"/>
+          <w:szCs w:val="24"/>
+        </w:rPr>
+      </w:pPr>
+      <w:r>
+        <w:rPr>
+          <w:rFonts w:ascii="SimSun" w:eastAsia="SimSun" w:hAnsi="SimSun"/>
+          <w:sz w:val="24"/>
+          <w:szCs w:val="24"/>
+        </w:rPr>
+        <w:t>plt.legend(prop={'size': 8},loc = 'lower left')</w:t>
+      </w:r>
+    </w:p>
+    <w:p>
+      <w:pPr>
+        <w:rPr>
+          <w:rFonts w:ascii="SimSun" w:eastAsia="SimSun" w:hAnsi="SimSun"/>
+          <w:sz w:val="24"/>
+          <w:szCs w:val="24"/>
+        </w:rPr>
+      </w:pPr>
+      <w:r>
+        <w:rPr>
+          <w:rFonts w:ascii="SimSun" w:eastAsia="SimSun" w:hAnsi="SimSun"/>
+          <w:sz w:val="24"/>
+          <w:szCs w:val="24"/>
+        </w:rPr>
+        <w:t>plt.xlabel('x axis (units)'</w:t>
       </w:r>
       <w:r>
         <w:rPr>
@@ -1572,23 +1269,13 @@
       <w:r>
         <w:t xml:space="preserve"> </w:t>
       </w:r>
-      <w:proofErr w:type="spellStart"/>
-      <w:r>
-        <w:rPr>
-          <w:rFonts w:ascii="SimSun" w:eastAsia="SimSun" w:hAnsi="SimSun"/>
-          <w:sz w:val="24"/>
-          <w:szCs w:val="24"/>
-        </w:rPr>
-        <w:t>fontsize</w:t>
-      </w:r>
-      <w:proofErr w:type="spellEnd"/>
-      <w:r>
-        <w:rPr>
-          <w:rFonts w:ascii="SimSun" w:eastAsia="SimSun" w:hAnsi="SimSun"/>
-          <w:sz w:val="24"/>
-          <w:szCs w:val="24"/>
-        </w:rPr>
-        <w:t xml:space="preserve"> = 10</w:t>
+      <w:r>
+        <w:rPr>
+          <w:rFonts w:ascii="SimSun" w:eastAsia="SimSun" w:hAnsi="SimSun"/>
+          <w:sz w:val="24"/>
+          <w:szCs w:val="24"/>
+        </w:rPr>
+        <w:t>fontsize = 10</w:t>
       </w:r>
       <w:r>
         <w:rPr>
@@ -1607,25 +1294,13 @@
           <w:szCs w:val="24"/>
         </w:rPr>
       </w:pPr>
-      <w:proofErr w:type="spellStart"/>
-      <w:proofErr w:type="gramStart"/>
-      <w:r>
-        <w:rPr>
-          <w:rFonts w:ascii="SimSun" w:eastAsia="SimSun" w:hAnsi="SimSun"/>
-          <w:sz w:val="24"/>
-          <w:szCs w:val="24"/>
-        </w:rPr>
-        <w:t>plt.ylabel</w:t>
-      </w:r>
-      <w:proofErr w:type="spellEnd"/>
-      <w:proofErr w:type="gramEnd"/>
-      <w:r>
-        <w:rPr>
-          <w:rFonts w:ascii="SimSun" w:eastAsia="SimSun" w:hAnsi="SimSun"/>
-          <w:sz w:val="24"/>
-          <w:szCs w:val="24"/>
-        </w:rPr>
-        <w:t>('y axis (units)'</w:t>
+      <w:r>
+        <w:rPr>
+          <w:rFonts w:ascii="SimSun" w:eastAsia="SimSun" w:hAnsi="SimSun"/>
+          <w:sz w:val="24"/>
+          <w:szCs w:val="24"/>
+        </w:rPr>
+        <w:t>plt.ylabel('y axis (units)'</w:t>
       </w:r>
       <w:r>
         <w:rPr>
@@ -1638,23 +1313,13 @@
       <w:r>
         <w:t xml:space="preserve"> </w:t>
       </w:r>
-      <w:proofErr w:type="spellStart"/>
-      <w:r>
-        <w:rPr>
-          <w:rFonts w:ascii="SimSun" w:eastAsia="SimSun" w:hAnsi="SimSun"/>
-          <w:sz w:val="24"/>
-          <w:szCs w:val="24"/>
-        </w:rPr>
-        <w:t>fontsize</w:t>
-      </w:r>
-      <w:proofErr w:type="spellEnd"/>
-      <w:r>
-        <w:rPr>
-          <w:rFonts w:ascii="SimSun" w:eastAsia="SimSun" w:hAnsi="SimSun"/>
-          <w:sz w:val="24"/>
-          <w:szCs w:val="24"/>
-        </w:rPr>
-        <w:t xml:space="preserve"> = 10</w:t>
+      <w:r>
+        <w:rPr>
+          <w:rFonts w:ascii="SimSun" w:eastAsia="SimSun" w:hAnsi="SimSun"/>
+          <w:sz w:val="24"/>
+          <w:szCs w:val="24"/>
+        </w:rPr>
+        <w:t>fontsize = 10</w:t>
       </w:r>
       <w:r>
         <w:rPr>
@@ -1673,138 +1338,65 @@
           <w:szCs w:val="24"/>
         </w:rPr>
       </w:pPr>
-      <w:proofErr w:type="spellStart"/>
-      <w:proofErr w:type="gramStart"/>
-      <w:r>
-        <w:rPr>
-          <w:rFonts w:ascii="SimSun" w:eastAsia="SimSun" w:hAnsi="SimSun"/>
-          <w:sz w:val="24"/>
-          <w:szCs w:val="24"/>
-        </w:rPr>
-        <w:t>plt.tight</w:t>
-      </w:r>
-      <w:proofErr w:type="gramEnd"/>
-      <w:r>
-        <w:rPr>
-          <w:rFonts w:ascii="SimSun" w:eastAsia="SimSun" w:hAnsi="SimSun"/>
-          <w:sz w:val="24"/>
-          <w:szCs w:val="24"/>
-        </w:rPr>
-        <w:t>_layout</w:t>
-      </w:r>
-      <w:proofErr w:type="spellEnd"/>
-      <w:r>
-        <w:rPr>
-          <w:rFonts w:ascii="SimSun" w:eastAsia="SimSun" w:hAnsi="SimSun"/>
-          <w:sz w:val="24"/>
-          <w:szCs w:val="24"/>
-        </w:rPr>
-        <w:t>()</w:t>
-      </w:r>
-    </w:p>
-    <w:p>
-      <w:pPr>
-        <w:rPr>
-          <w:rFonts w:ascii="SimSun" w:eastAsia="SimSun" w:hAnsi="SimSun"/>
-          <w:sz w:val="24"/>
-          <w:szCs w:val="24"/>
-        </w:rPr>
-      </w:pPr>
-      <w:proofErr w:type="spellStart"/>
-      <w:proofErr w:type="gramStart"/>
-      <w:r>
-        <w:rPr>
-          <w:rFonts w:ascii="SimSun" w:eastAsia="SimSun" w:hAnsi="SimSun"/>
-          <w:sz w:val="24"/>
-          <w:szCs w:val="24"/>
-        </w:rPr>
-        <w:t>plt.grid</w:t>
-      </w:r>
-      <w:proofErr w:type="spellEnd"/>
-      <w:proofErr w:type="gramEnd"/>
-      <w:r>
-        <w:rPr>
-          <w:rFonts w:ascii="SimSun" w:eastAsia="SimSun" w:hAnsi="SimSun"/>
-          <w:sz w:val="24"/>
-          <w:szCs w:val="24"/>
-        </w:rPr>
-        <w:t>()</w:t>
-      </w:r>
-    </w:p>
-    <w:p>
-      <w:pPr>
-        <w:rPr>
-          <w:rFonts w:ascii="SimSun" w:eastAsia="SimSun" w:hAnsi="SimSun"/>
-          <w:sz w:val="24"/>
-          <w:szCs w:val="24"/>
-        </w:rPr>
-      </w:pPr>
-      <w:proofErr w:type="spellStart"/>
-      <w:proofErr w:type="gramStart"/>
-      <w:r>
-        <w:rPr>
-          <w:rFonts w:ascii="SimSun" w:eastAsia="SimSun" w:hAnsi="SimSun"/>
-          <w:sz w:val="24"/>
-          <w:szCs w:val="24"/>
-        </w:rPr>
-        <w:t>plt.savefig</w:t>
-      </w:r>
-      <w:proofErr w:type="spellEnd"/>
-      <w:proofErr w:type="gramEnd"/>
-      <w:r>
-        <w:rPr>
-          <w:rFonts w:ascii="SimSun" w:eastAsia="SimSun" w:hAnsi="SimSun"/>
-          <w:sz w:val="24"/>
-          <w:szCs w:val="24"/>
-        </w:rPr>
-        <w:t>('</w:t>
-      </w:r>
-      <w:proofErr w:type="spellStart"/>
-      <w:r>
-        <w:rPr>
-          <w:rFonts w:ascii="SimSun" w:eastAsia="SimSun" w:hAnsi="SimSun"/>
-          <w:sz w:val="24"/>
-          <w:szCs w:val="24"/>
-        </w:rPr>
-        <w:t>sim_chapter_Zoom_in_ETM_tuning.eps</w:t>
-      </w:r>
-      <w:proofErr w:type="spellEnd"/>
-      <w:r>
-        <w:rPr>
-          <w:rFonts w:ascii="SimSun" w:eastAsia="SimSun" w:hAnsi="SimSun"/>
-          <w:sz w:val="24"/>
-          <w:szCs w:val="24"/>
-        </w:rPr>
-        <w:t>')</w:t>
-      </w:r>
-    </w:p>
-    <w:p>
-      <w:pPr>
-        <w:rPr>
-          <w:rFonts w:ascii="SimSun" w:eastAsia="SimSun" w:hAnsi="SimSun"/>
-          <w:sz w:val="24"/>
-          <w:szCs w:val="24"/>
-        </w:rPr>
-      </w:pPr>
-      <w:proofErr w:type="spellStart"/>
-      <w:proofErr w:type="gramStart"/>
-      <w:r>
-        <w:rPr>
-          <w:rFonts w:ascii="SimSun" w:eastAsia="SimSun" w:hAnsi="SimSun"/>
-          <w:sz w:val="24"/>
-          <w:szCs w:val="24"/>
-        </w:rPr>
-        <w:t>plt.show</w:t>
-      </w:r>
-      <w:proofErr w:type="spellEnd"/>
-      <w:proofErr w:type="gramEnd"/>
-      <w:r>
-        <w:rPr>
-          <w:rFonts w:ascii="SimSun" w:eastAsia="SimSun" w:hAnsi="SimSun"/>
-          <w:sz w:val="24"/>
-          <w:szCs w:val="24"/>
-        </w:rPr>
-        <w:t>()</w:t>
+      <w:r>
+        <w:rPr>
+          <w:rFonts w:ascii="SimSun" w:eastAsia="SimSun" w:hAnsi="SimSun"/>
+          <w:sz w:val="24"/>
+          <w:szCs w:val="24"/>
+        </w:rPr>
+        <w:t>plt.tight_layout()</w:t>
+      </w:r>
+    </w:p>
+    <w:p>
+      <w:pPr>
+        <w:rPr>
+          <w:rFonts w:ascii="SimSun" w:eastAsia="SimSun" w:hAnsi="SimSun"/>
+          <w:sz w:val="24"/>
+          <w:szCs w:val="24"/>
+        </w:rPr>
+      </w:pPr>
+      <w:r>
+        <w:rPr>
+          <w:rFonts w:ascii="SimSun" w:eastAsia="SimSun" w:hAnsi="SimSun"/>
+          <w:sz w:val="24"/>
+          <w:szCs w:val="24"/>
+        </w:rPr>
+        <w:t>plt.grid()</w:t>
+      </w:r>
+    </w:p>
+    <w:p>
+      <w:pPr>
+        <w:rPr>
+          <w:rFonts w:ascii="SimSun" w:eastAsia="SimSun" w:hAnsi="SimSun"/>
+          <w:sz w:val="24"/>
+          <w:szCs w:val="24"/>
+        </w:rPr>
+      </w:pPr>
+      <w:r>
+        <w:rPr>
+          <w:rFonts w:ascii="SimSun" w:eastAsia="SimSun" w:hAnsi="SimSun"/>
+          <w:sz w:val="24"/>
+          <w:szCs w:val="24"/>
+        </w:rPr>
+        <w:t>plt.savefig('sim_chapter_Zoom_in_ETM_tuning.eps')</w:t>
+      </w:r>
+    </w:p>
+    <w:p>
+      <w:pPr>
+        <w:rPr>
+          <w:rFonts w:ascii="SimSun" w:eastAsia="SimSun" w:hAnsi="SimSun"/>
+          <w:sz w:val="24"/>
+          <w:szCs w:val="24"/>
+        </w:rPr>
+      </w:pPr>
+      <w:r>
+        <w:rPr>
+          <w:rFonts w:ascii="SimSun" w:eastAsia="SimSun" w:hAnsi="SimSun"/>
+          <w:sz w:val="24"/>
+          <w:szCs w:val="24"/>
+        </w:rPr>
+        <w:lastRenderedPageBreak/>
+        <w:t>plt.show()</w:t>
       </w:r>
     </w:p>
     <w:p>
@@ -1841,66 +1433,35 @@
           <w:szCs w:val="24"/>
         </w:rPr>
       </w:pPr>
-      <w:proofErr w:type="spellStart"/>
-      <w:proofErr w:type="gramStart"/>
-      <w:r>
-        <w:rPr>
-          <w:rFonts w:ascii="SimSun" w:eastAsia="SimSun" w:hAnsi="SimSun"/>
-          <w:sz w:val="24"/>
-          <w:szCs w:val="24"/>
-        </w:rPr>
-        <w:t>plt.figure</w:t>
-      </w:r>
-      <w:proofErr w:type="spellEnd"/>
-      <w:proofErr w:type="gramEnd"/>
-      <w:r>
-        <w:rPr>
-          <w:rFonts w:ascii="SimSun" w:eastAsia="SimSun" w:hAnsi="SimSun"/>
-          <w:sz w:val="24"/>
-          <w:szCs w:val="24"/>
-        </w:rPr>
-        <w:t>(</w:t>
-      </w:r>
-      <w:proofErr w:type="spellStart"/>
-      <w:r>
-        <w:rPr>
-          <w:rFonts w:ascii="SimSun" w:eastAsia="SimSun" w:hAnsi="SimSun"/>
-          <w:sz w:val="24"/>
-          <w:szCs w:val="24"/>
-        </w:rPr>
-        <w:t>figsize</w:t>
-      </w:r>
-      <w:proofErr w:type="spellEnd"/>
-      <w:r>
-        <w:rPr>
-          <w:rFonts w:ascii="SimSun" w:eastAsia="SimSun" w:hAnsi="SimSun"/>
-          <w:sz w:val="24"/>
-          <w:szCs w:val="24"/>
-        </w:rPr>
-        <w:t>=(6, 6), dpi=150)</w:t>
-      </w:r>
-    </w:p>
-    <w:p>
-      <w:pPr>
-        <w:rPr>
-          <w:sz w:val="24"/>
-          <w:szCs w:val="24"/>
-        </w:rPr>
-      </w:pPr>
-    </w:p>
-    <w:p>
-      <w:pPr>
-        <w:rPr>
-          <w:sz w:val="24"/>
-          <w:szCs w:val="24"/>
-        </w:rPr>
-      </w:pPr>
-      <w:r>
-        <w:rPr>
-          <w:sz w:val="24"/>
-          <w:szCs w:val="24"/>
-        </w:rPr>
-        <w:lastRenderedPageBreak/>
+      <w:r>
+        <w:rPr>
+          <w:rFonts w:ascii="SimSun" w:eastAsia="SimSun" w:hAnsi="SimSun"/>
+          <w:sz w:val="24"/>
+          <w:szCs w:val="24"/>
+        </w:rPr>
+        <w:t>plt.figure(figsize=(6, 6), dpi=150)</w:t>
+      </w:r>
+    </w:p>
+    <w:p>
+      <w:pPr>
+        <w:rPr>
+          <w:sz w:val="24"/>
+          <w:szCs w:val="24"/>
+        </w:rPr>
+      </w:pPr>
+    </w:p>
+    <w:p>
+      <w:pPr>
+        <w:rPr>
+          <w:sz w:val="24"/>
+          <w:szCs w:val="24"/>
+        </w:rPr>
+      </w:pPr>
+      <w:r>
+        <w:rPr>
+          <w:sz w:val="24"/>
+          <w:szCs w:val="24"/>
+        </w:rPr>
         <w:t xml:space="preserve">when there </w:t>
       </w:r>
       <w:r>
@@ -1936,7 +1497,6 @@
           <w:szCs w:val="24"/>
         </w:rPr>
       </w:pPr>
-      <w:proofErr w:type="spellStart"/>
       <w:r>
         <w:rPr>
           <w:rFonts w:asciiTheme="majorHAnsi" w:hAnsiTheme="majorHAnsi"/>
@@ -1947,69 +1507,20 @@
         </w:rPr>
         <w:t>Matlab</w:t>
       </w:r>
-      <w:proofErr w:type="spellEnd"/>
-    </w:p>
-    <w:p>
-      <w:pPr>
-        <w:rPr>
-          <w:sz w:val="24"/>
-          <w:szCs w:val="24"/>
-        </w:rPr>
-      </w:pPr>
-      <w:r>
-        <w:rPr>
-          <w:sz w:val="24"/>
-          <w:szCs w:val="24"/>
-        </w:rPr>
-        <w:t xml:space="preserve">For </w:t>
-      </w:r>
-      <w:proofErr w:type="spellStart"/>
-      <w:r>
-        <w:rPr>
-          <w:sz w:val="24"/>
-          <w:szCs w:val="24"/>
-        </w:rPr>
-        <w:t>matlab</w:t>
-      </w:r>
-      <w:proofErr w:type="spellEnd"/>
-      <w:r>
-        <w:rPr>
-          <w:sz w:val="24"/>
-          <w:szCs w:val="24"/>
-        </w:rPr>
-        <w:t xml:space="preserve"> figures, use the </w:t>
-      </w:r>
-      <w:proofErr w:type="spellStart"/>
-      <w:r>
-        <w:rPr>
-          <w:sz w:val="24"/>
-          <w:szCs w:val="24"/>
-        </w:rPr>
-        <w:t>linspecer</w:t>
-      </w:r>
-      <w:proofErr w:type="spellEnd"/>
-      <w:r>
-        <w:rPr>
-          <w:sz w:val="24"/>
-          <w:szCs w:val="24"/>
-        </w:rPr>
-        <w:t xml:space="preserve"> (from </w:t>
-      </w:r>
-      <w:proofErr w:type="spellStart"/>
-      <w:r>
-        <w:rPr>
-          <w:sz w:val="24"/>
-          <w:szCs w:val="24"/>
-        </w:rPr>
-        <w:t>mathworks</w:t>
-      </w:r>
-      <w:proofErr w:type="spellEnd"/>
-      <w:r>
-        <w:rPr>
-          <w:sz w:val="24"/>
-          <w:szCs w:val="24"/>
-        </w:rPr>
-        <w:t xml:space="preserve"> file exchange) function to </w:t>
+    </w:p>
+    <w:p>
+      <w:pPr>
+        <w:rPr>
+          <w:sz w:val="24"/>
+          <w:szCs w:val="24"/>
+        </w:rPr>
+      </w:pPr>
+      <w:r>
+        <w:rPr>
+          <w:sz w:val="24"/>
+          <w:szCs w:val="24"/>
+        </w:rPr>
+        <w:t xml:space="preserve">For matlab figures, use the linspecer (from mathworks file exchange) function to </w:t>
       </w:r>
     </w:p>
     <w:p>
@@ -2041,260 +1552,84 @@
           <w:sz w:val="24"/>
           <w:szCs w:val="24"/>
         </w:rPr>
-        <w:t xml:space="preserve">c = </w:t>
-      </w:r>
-      <w:proofErr w:type="spellStart"/>
-      <w:proofErr w:type="gramStart"/>
-      <w:r>
-        <w:rPr>
-          <w:rFonts w:ascii="SimSun" w:eastAsia="SimSun" w:hAnsi="SimSun"/>
-          <w:sz w:val="24"/>
-          <w:szCs w:val="24"/>
-        </w:rPr>
-        <w:t>linspecer</w:t>
-      </w:r>
-      <w:proofErr w:type="spellEnd"/>
-      <w:r>
-        <w:rPr>
-          <w:rFonts w:ascii="SimSun" w:eastAsia="SimSun" w:hAnsi="SimSun"/>
-          <w:sz w:val="24"/>
-          <w:szCs w:val="24"/>
-        </w:rPr>
-        <w:t>(</w:t>
-      </w:r>
-      <w:proofErr w:type="gramEnd"/>
-      <w:r>
-        <w:rPr>
-          <w:rFonts w:ascii="SimSun" w:eastAsia="SimSun" w:hAnsi="SimSun"/>
-          <w:sz w:val="24"/>
-          <w:szCs w:val="24"/>
-        </w:rPr>
-        <w:t>2);</w:t>
-      </w:r>
-    </w:p>
-    <w:p>
-      <w:pPr>
-        <w:rPr>
-          <w:rFonts w:ascii="SimSun" w:eastAsia="SimSun" w:hAnsi="SimSun"/>
-          <w:sz w:val="24"/>
-          <w:szCs w:val="24"/>
-        </w:rPr>
-      </w:pPr>
-      <w:r>
-        <w:rPr>
-          <w:rFonts w:ascii="SimSun" w:eastAsia="SimSun" w:hAnsi="SimSun"/>
-          <w:sz w:val="24"/>
-          <w:szCs w:val="24"/>
-        </w:rPr>
-        <w:t xml:space="preserve">size = </w:t>
-      </w:r>
-      <w:proofErr w:type="gramStart"/>
-      <w:r>
-        <w:rPr>
-          <w:rFonts w:ascii="SimSun" w:eastAsia="SimSun" w:hAnsi="SimSun"/>
-          <w:sz w:val="24"/>
-          <w:szCs w:val="24"/>
-        </w:rPr>
-        <w:t>1.1;</w:t>
-      </w:r>
-      <w:proofErr w:type="gramEnd"/>
-    </w:p>
-    <w:p>
-      <w:pPr>
-        <w:rPr>
-          <w:rFonts w:ascii="SimSun" w:eastAsia="SimSun" w:hAnsi="SimSun"/>
-          <w:sz w:val="24"/>
-          <w:szCs w:val="24"/>
-        </w:rPr>
-      </w:pPr>
-      <w:proofErr w:type="spellStart"/>
-      <w:r>
-        <w:rPr>
-          <w:rFonts w:ascii="SimSun" w:eastAsia="SimSun" w:hAnsi="SimSun"/>
-          <w:sz w:val="24"/>
-          <w:szCs w:val="24"/>
-        </w:rPr>
-        <w:t>aspect_ratio</w:t>
-      </w:r>
-      <w:proofErr w:type="spellEnd"/>
-      <w:r>
-        <w:rPr>
-          <w:rFonts w:ascii="SimSun" w:eastAsia="SimSun" w:hAnsi="SimSun"/>
-          <w:sz w:val="24"/>
-          <w:szCs w:val="24"/>
-        </w:rPr>
-        <w:t xml:space="preserve"> = </w:t>
-      </w:r>
-      <w:proofErr w:type="gramStart"/>
-      <w:r>
-        <w:rPr>
-          <w:rFonts w:ascii="SimSun" w:eastAsia="SimSun" w:hAnsi="SimSun"/>
-          <w:sz w:val="24"/>
-          <w:szCs w:val="24"/>
-        </w:rPr>
-        <w:t>size.*</w:t>
-      </w:r>
-      <w:proofErr w:type="gramEnd"/>
-      <w:r>
-        <w:rPr>
-          <w:rFonts w:ascii="SimSun" w:eastAsia="SimSun" w:hAnsi="SimSun"/>
-          <w:sz w:val="24"/>
-          <w:szCs w:val="24"/>
-        </w:rPr>
-        <w:t>[6,4];</w:t>
-      </w:r>
-    </w:p>
-    <w:p>
-      <w:pPr>
-        <w:rPr>
-          <w:rFonts w:ascii="SimSun" w:eastAsia="SimSun" w:hAnsi="SimSun"/>
-          <w:sz w:val="24"/>
-          <w:szCs w:val="24"/>
-        </w:rPr>
-      </w:pPr>
-    </w:p>
-    <w:p>
-      <w:pPr>
-        <w:rPr>
-          <w:rFonts w:ascii="SimSun" w:eastAsia="SimSun" w:hAnsi="SimSun"/>
-          <w:sz w:val="24"/>
-          <w:szCs w:val="24"/>
-        </w:rPr>
-      </w:pPr>
-      <w:proofErr w:type="gramStart"/>
-      <w:r>
-        <w:rPr>
-          <w:rFonts w:ascii="SimSun" w:eastAsia="SimSun" w:hAnsi="SimSun"/>
-          <w:sz w:val="24"/>
-          <w:szCs w:val="24"/>
-        </w:rPr>
-        <w:t>figure(</w:t>
-      </w:r>
-      <w:proofErr w:type="gramEnd"/>
-      <w:r>
-        <w:rPr>
-          <w:rFonts w:ascii="SimSun" w:eastAsia="SimSun" w:hAnsi="SimSun"/>
-          <w:sz w:val="24"/>
-          <w:szCs w:val="24"/>
-        </w:rPr>
-        <w:t>'</w:t>
-      </w:r>
-      <w:proofErr w:type="spellStart"/>
-      <w:r>
-        <w:rPr>
-          <w:rFonts w:ascii="SimSun" w:eastAsia="SimSun" w:hAnsi="SimSun"/>
-          <w:sz w:val="24"/>
-          <w:szCs w:val="24"/>
-        </w:rPr>
-        <w:t>Name','dark</w:t>
-      </w:r>
-      <w:proofErr w:type="spellEnd"/>
-      <w:r>
-        <w:rPr>
-          <w:rFonts w:ascii="SimSun" w:eastAsia="SimSun" w:hAnsi="SimSun"/>
-          <w:sz w:val="24"/>
-          <w:szCs w:val="24"/>
-        </w:rPr>
-        <w:t xml:space="preserve"> </w:t>
-      </w:r>
-      <w:proofErr w:type="spellStart"/>
-      <w:r>
-        <w:rPr>
-          <w:rFonts w:ascii="SimSun" w:eastAsia="SimSun" w:hAnsi="SimSun"/>
-          <w:sz w:val="24"/>
-          <w:szCs w:val="24"/>
-        </w:rPr>
-        <w:t>noise','units','inches','position</w:t>
-      </w:r>
-      <w:proofErr w:type="spellEnd"/>
-      <w:r>
-        <w:rPr>
-          <w:rFonts w:ascii="SimSun" w:eastAsia="SimSun" w:hAnsi="SimSun"/>
-          <w:sz w:val="24"/>
-          <w:szCs w:val="24"/>
-        </w:rPr>
-        <w:t xml:space="preserve">',[0 0 </w:t>
-      </w:r>
-      <w:proofErr w:type="spellStart"/>
-      <w:r>
-        <w:rPr>
-          <w:rFonts w:ascii="SimSun" w:eastAsia="SimSun" w:hAnsi="SimSun"/>
-          <w:sz w:val="24"/>
-          <w:szCs w:val="24"/>
-        </w:rPr>
-        <w:t>aspect_ratio</w:t>
-      </w:r>
-      <w:proofErr w:type="spellEnd"/>
-      <w:r>
-        <w:rPr>
-          <w:rFonts w:ascii="SimSun" w:eastAsia="SimSun" w:hAnsi="SimSun"/>
-          <w:sz w:val="24"/>
-          <w:szCs w:val="24"/>
-        </w:rPr>
-        <w:t xml:space="preserve">(1) </w:t>
-      </w:r>
-      <w:proofErr w:type="spellStart"/>
-      <w:r>
-        <w:rPr>
-          <w:rFonts w:ascii="SimSun" w:eastAsia="SimSun" w:hAnsi="SimSun"/>
-          <w:sz w:val="24"/>
-          <w:szCs w:val="24"/>
-        </w:rPr>
-        <w:t>aspect_ratio</w:t>
-      </w:r>
-      <w:proofErr w:type="spellEnd"/>
-      <w:r>
-        <w:rPr>
-          <w:rFonts w:ascii="SimSun" w:eastAsia="SimSun" w:hAnsi="SimSun"/>
-          <w:sz w:val="24"/>
-          <w:szCs w:val="24"/>
-        </w:rPr>
-        <w:t>(2)])</w:t>
-      </w:r>
-    </w:p>
-    <w:p>
-      <w:pPr>
-        <w:rPr>
-          <w:rFonts w:ascii="SimSun" w:eastAsia="SimSun" w:hAnsi="SimSun"/>
-          <w:sz w:val="24"/>
-          <w:szCs w:val="24"/>
-        </w:rPr>
-      </w:pPr>
-      <w:proofErr w:type="gramStart"/>
-      <w:r>
-        <w:rPr>
-          <w:rFonts w:ascii="SimSun" w:eastAsia="SimSun" w:hAnsi="SimSun"/>
-          <w:sz w:val="24"/>
-          <w:szCs w:val="24"/>
-        </w:rPr>
-        <w:t>loglog(</w:t>
-      </w:r>
-      <w:proofErr w:type="gramEnd"/>
-      <w:r>
-        <w:rPr>
-          <w:rFonts w:ascii="SimSun" w:eastAsia="SimSun" w:hAnsi="SimSun"/>
-          <w:sz w:val="24"/>
-          <w:szCs w:val="24"/>
-        </w:rPr>
-        <w:t>x1, y1, '</w:t>
-      </w:r>
-      <w:proofErr w:type="spellStart"/>
-      <w:r>
-        <w:rPr>
-          <w:rFonts w:ascii="SimSun" w:eastAsia="SimSun" w:hAnsi="SimSun"/>
-          <w:sz w:val="24"/>
-          <w:szCs w:val="24"/>
-        </w:rPr>
-        <w:t>color</w:t>
-      </w:r>
-      <w:proofErr w:type="spellEnd"/>
-      <w:r>
-        <w:rPr>
-          <w:rFonts w:ascii="SimSun" w:eastAsia="SimSun" w:hAnsi="SimSun"/>
-          <w:sz w:val="24"/>
-          <w:szCs w:val="24"/>
-        </w:rPr>
-        <w:t>',c(1,:))</w:t>
+        <w:t>c = linspecer(2);</w:t>
+      </w:r>
+    </w:p>
+    <w:p>
+      <w:pPr>
+        <w:rPr>
+          <w:rFonts w:ascii="SimSun" w:eastAsia="SimSun" w:hAnsi="SimSun"/>
+          <w:sz w:val="24"/>
+          <w:szCs w:val="24"/>
+        </w:rPr>
+      </w:pPr>
+      <w:r>
+        <w:rPr>
+          <w:rFonts w:ascii="SimSun" w:eastAsia="SimSun" w:hAnsi="SimSun"/>
+          <w:sz w:val="24"/>
+          <w:szCs w:val="24"/>
+        </w:rPr>
+        <w:t>size = 1.1;</w:t>
+      </w:r>
+    </w:p>
+    <w:p>
+      <w:pPr>
+        <w:rPr>
+          <w:rFonts w:ascii="SimSun" w:eastAsia="SimSun" w:hAnsi="SimSun"/>
+          <w:sz w:val="24"/>
+          <w:szCs w:val="24"/>
+        </w:rPr>
+      </w:pPr>
+      <w:r>
+        <w:rPr>
+          <w:rFonts w:ascii="SimSun" w:eastAsia="SimSun" w:hAnsi="SimSun"/>
+          <w:sz w:val="24"/>
+          <w:szCs w:val="24"/>
+        </w:rPr>
+        <w:t>aspect_ratio = size.*[6,4];</w:t>
+      </w:r>
+    </w:p>
+    <w:p>
+      <w:pPr>
+        <w:rPr>
+          <w:rFonts w:ascii="SimSun" w:eastAsia="SimSun" w:hAnsi="SimSun"/>
+          <w:sz w:val="24"/>
+          <w:szCs w:val="24"/>
+        </w:rPr>
+      </w:pPr>
+    </w:p>
+    <w:p>
+      <w:pPr>
+        <w:rPr>
+          <w:rFonts w:ascii="SimSun" w:eastAsia="SimSun" w:hAnsi="SimSun"/>
+          <w:sz w:val="24"/>
+          <w:szCs w:val="24"/>
+        </w:rPr>
+      </w:pPr>
+      <w:r>
+        <w:rPr>
+          <w:rFonts w:ascii="SimSun" w:eastAsia="SimSun" w:hAnsi="SimSun"/>
+          <w:sz w:val="24"/>
+          <w:szCs w:val="24"/>
+        </w:rPr>
+        <w:t>figure('Name','dark noise','units','inches','position',[0 0 aspect_ratio(1) aspect_ratio(2)])</w:t>
+      </w:r>
+    </w:p>
+    <w:p>
+      <w:pPr>
+        <w:rPr>
+          <w:rFonts w:ascii="SimSun" w:eastAsia="SimSun" w:hAnsi="SimSun"/>
+          <w:sz w:val="24"/>
+          <w:szCs w:val="24"/>
+        </w:rPr>
+      </w:pPr>
+      <w:r>
+        <w:rPr>
+          <w:rFonts w:ascii="SimSun" w:eastAsia="SimSun" w:hAnsi="SimSun"/>
+          <w:sz w:val="24"/>
+          <w:szCs w:val="24"/>
+        </w:rPr>
+        <w:t>loglog(x1, y1, 'color',c(1,:))</w:t>
       </w:r>
     </w:p>
     <w:p>
@@ -2322,41 +1657,13 @@
           <w:szCs w:val="24"/>
         </w:rPr>
       </w:pPr>
-      <w:proofErr w:type="gramStart"/>
-      <w:r>
-        <w:rPr>
-          <w:rFonts w:ascii="SimSun" w:eastAsia="SimSun" w:hAnsi="SimSun"/>
-          <w:sz w:val="24"/>
-          <w:szCs w:val="24"/>
-        </w:rPr>
-        <w:t>loglog(</w:t>
-      </w:r>
-      <w:proofErr w:type="gramEnd"/>
-      <w:r>
-        <w:rPr>
-          <w:rFonts w:ascii="SimSun" w:eastAsia="SimSun" w:hAnsi="SimSun"/>
-          <w:sz w:val="24"/>
-          <w:szCs w:val="24"/>
-        </w:rPr>
-        <w:t>x2, y2, '</w:t>
-      </w:r>
-      <w:proofErr w:type="spellStart"/>
-      <w:r>
-        <w:rPr>
-          <w:rFonts w:ascii="SimSun" w:eastAsia="SimSun" w:hAnsi="SimSun"/>
-          <w:sz w:val="24"/>
-          <w:szCs w:val="24"/>
-        </w:rPr>
-        <w:t>color</w:t>
-      </w:r>
-      <w:proofErr w:type="spellEnd"/>
-      <w:r>
-        <w:rPr>
-          <w:rFonts w:ascii="SimSun" w:eastAsia="SimSun" w:hAnsi="SimSun"/>
-          <w:sz w:val="24"/>
-          <w:szCs w:val="24"/>
-        </w:rPr>
-        <w:t>',c(2,:))</w:t>
+      <w:r>
+        <w:rPr>
+          <w:rFonts w:ascii="SimSun" w:eastAsia="SimSun" w:hAnsi="SimSun"/>
+          <w:sz w:val="24"/>
+          <w:szCs w:val="24"/>
+        </w:rPr>
+        <w:t>loglog(x2, y2, 'color',c(2,:))</w:t>
       </w:r>
     </w:p>
     <w:p>
@@ -2401,96 +1708,30 @@
           <w:szCs w:val="24"/>
         </w:rPr>
       </w:pPr>
-      <w:proofErr w:type="spellStart"/>
-      <w:proofErr w:type="gramStart"/>
-      <w:r>
-        <w:rPr>
-          <w:rFonts w:ascii="SimSun" w:eastAsia="SimSun" w:hAnsi="SimSun"/>
-          <w:sz w:val="24"/>
-          <w:szCs w:val="24"/>
-        </w:rPr>
-        <w:t>xlabel</w:t>
-      </w:r>
-      <w:proofErr w:type="spellEnd"/>
-      <w:r>
-        <w:rPr>
-          <w:rFonts w:ascii="SimSun" w:eastAsia="SimSun" w:hAnsi="SimSun"/>
-          <w:sz w:val="24"/>
-          <w:szCs w:val="24"/>
-        </w:rPr>
-        <w:t>(</w:t>
-      </w:r>
-      <w:proofErr w:type="gramEnd"/>
-      <w:r>
-        <w:rPr>
-          <w:rFonts w:ascii="SimSun" w:eastAsia="SimSun" w:hAnsi="SimSun"/>
-          <w:sz w:val="24"/>
-          <w:szCs w:val="24"/>
-        </w:rPr>
-        <w:t>'Frequency (Hz)')</w:t>
-      </w:r>
-    </w:p>
-    <w:p>
-      <w:pPr>
-        <w:rPr>
-          <w:rFonts w:ascii="SimSun" w:eastAsia="SimSun" w:hAnsi="SimSun"/>
-          <w:sz w:val="24"/>
-          <w:szCs w:val="24"/>
-        </w:rPr>
-      </w:pPr>
-      <w:proofErr w:type="spellStart"/>
-      <w:r>
-        <w:rPr>
-          <w:rFonts w:ascii="SimSun" w:eastAsia="SimSun" w:hAnsi="SimSun"/>
-          <w:sz w:val="24"/>
-          <w:szCs w:val="24"/>
-        </w:rPr>
-        <w:t>ylabel</w:t>
-      </w:r>
-      <w:proofErr w:type="spellEnd"/>
-      <w:r>
-        <w:rPr>
-          <w:rFonts w:ascii="SimSun" w:eastAsia="SimSun" w:hAnsi="SimSun"/>
-          <w:sz w:val="24"/>
-          <w:szCs w:val="24"/>
-        </w:rPr>
-        <w:t>('</w:t>
-      </w:r>
-      <w:proofErr w:type="spellStart"/>
-      <w:r>
-        <w:rPr>
-          <w:rFonts w:ascii="SimSun" w:eastAsia="SimSun" w:hAnsi="SimSun"/>
-          <w:sz w:val="24"/>
-          <w:szCs w:val="24"/>
-        </w:rPr>
-        <w:t>I_r_m_s</w:t>
-      </w:r>
-      <w:proofErr w:type="spellEnd"/>
-      <w:r>
-        <w:rPr>
-          <w:rFonts w:ascii="SimSun" w:eastAsia="SimSun" w:hAnsi="SimSun"/>
-          <w:sz w:val="24"/>
-          <w:szCs w:val="24"/>
-        </w:rPr>
-        <w:t>/\</w:t>
-      </w:r>
-      <w:proofErr w:type="gramStart"/>
-      <w:r>
-        <w:rPr>
-          <w:rFonts w:ascii="SimSun" w:eastAsia="SimSun" w:hAnsi="SimSun"/>
-          <w:sz w:val="24"/>
-          <w:szCs w:val="24"/>
-        </w:rPr>
-        <w:t>surd(</w:t>
-      </w:r>
-      <w:proofErr w:type="gramEnd"/>
-      <w:r>
-        <w:rPr>
-          <w:rFonts w:ascii="SimSun" w:eastAsia="SimSun" w:hAnsi="SimSun"/>
-          <w:sz w:val="24"/>
-          <w:szCs w:val="24"/>
-        </w:rPr>
-        <w:t>Hz)')</w:t>
+      <w:r>
+        <w:rPr>
+          <w:rFonts w:ascii="SimSun" w:eastAsia="SimSun" w:hAnsi="SimSun"/>
+          <w:sz w:val="24"/>
+          <w:szCs w:val="24"/>
+        </w:rPr>
+        <w:t>xlabel('Frequency (Hz)')</w:t>
+      </w:r>
+    </w:p>
+    <w:p>
+      <w:pPr>
+        <w:rPr>
+          <w:rFonts w:ascii="SimSun" w:eastAsia="SimSun" w:hAnsi="SimSun"/>
+          <w:sz w:val="24"/>
+          <w:szCs w:val="24"/>
+        </w:rPr>
+      </w:pPr>
+      <w:r>
+        <w:rPr>
+          <w:rFonts w:ascii="SimSun" w:eastAsia="SimSun" w:hAnsi="SimSun"/>
+          <w:sz w:val="24"/>
+          <w:szCs w:val="24"/>
+        </w:rPr>
+        <w:t>ylabel('I_r_m_s/\surd(Hz)')</w:t>
       </w:r>
     </w:p>
     <w:p>
@@ -2541,25 +1782,7 @@
           <w:sz w:val="24"/>
           <w:szCs w:val="24"/>
         </w:rPr>
-        <w:t>print('Noise_low_f','-</w:t>
-      </w:r>
-      <w:proofErr w:type="spellStart"/>
-      <w:r>
-        <w:rPr>
-          <w:rFonts w:ascii="SimSun" w:eastAsia="SimSun" w:hAnsi="SimSun"/>
-          <w:sz w:val="24"/>
-          <w:szCs w:val="24"/>
-        </w:rPr>
-        <w:t>depsc</w:t>
-      </w:r>
-      <w:proofErr w:type="spellEnd"/>
-      <w:r>
-        <w:rPr>
-          <w:rFonts w:ascii="SimSun" w:eastAsia="SimSun" w:hAnsi="SimSun"/>
-          <w:sz w:val="24"/>
-          <w:szCs w:val="24"/>
-        </w:rPr>
-        <w:t>')</w:t>
+        <w:t>print('Noise_low_f','-depsc')</w:t>
       </w:r>
     </w:p>
     <w:p>
@@ -2625,6 +1848,7 @@
           <w:sz w:val="24"/>
           <w:szCs w:val="24"/>
         </w:rPr>
+        <w:lastRenderedPageBreak/>
         <w:t>decouple grounds for ease of reading.</w:t>
       </w:r>
     </w:p>
@@ -2665,23 +1889,7 @@
           <w:sz w:val="24"/>
           <w:szCs w:val="24"/>
         </w:rPr>
-        <w:t xml:space="preserve">have </w:t>
-      </w:r>
-      <w:proofErr w:type="spellStart"/>
-      <w:r>
-        <w:rPr>
-          <w:sz w:val="24"/>
-          <w:szCs w:val="24"/>
-        </w:rPr>
-        <w:t>gnd</w:t>
-      </w:r>
-      <w:proofErr w:type="spellEnd"/>
-      <w:r>
-        <w:rPr>
-          <w:sz w:val="24"/>
-          <w:szCs w:val="24"/>
-        </w:rPr>
-        <w:t xml:space="preserve"> at the bottom of the diagram.</w:t>
+        <w:t>have gnd at the bottom of the diagram.</w:t>
       </w:r>
     </w:p>
     <w:p>

</xml_diff>

<commit_message>
written introduction to the BHD for ligo chapter
</commit_message>
<xml_diff>
--- a/Structuring.docx
+++ b/Structuring.docx
@@ -78,15 +78,33 @@
           <w:sz w:val="24"/>
           <w:szCs w:val="24"/>
         </w:rPr>
-        <w:t>This is the first step to writing a chapter. Come up with likely sections,</w:t>
-      </w:r>
-      <w:r>
-        <w:rPr>
-          <w:rFonts w:cstheme="minorHAnsi"/>
-          <w:sz w:val="24"/>
-          <w:szCs w:val="24"/>
-        </w:rPr>
-        <w:t xml:space="preserve"> and fill them in with ideas for paragraphs. Think about/put in relevant figures at this point.</w:t>
+        <w:t xml:space="preserve">This is the first step to writing a chapter. Come up with likely </w:t>
+      </w:r>
+      <w:proofErr w:type="gramStart"/>
+      <w:r>
+        <w:rPr>
+          <w:rFonts w:cstheme="minorHAnsi"/>
+          <w:sz w:val="24"/>
+          <w:szCs w:val="24"/>
+        </w:rPr>
+        <w:t>sections,</w:t>
+      </w:r>
+      <w:r>
+        <w:rPr>
+          <w:rFonts w:cstheme="minorHAnsi"/>
+          <w:sz w:val="24"/>
+          <w:szCs w:val="24"/>
+        </w:rPr>
+        <w:t xml:space="preserve"> and</w:t>
+      </w:r>
+      <w:proofErr w:type="gramEnd"/>
+      <w:r>
+        <w:rPr>
+          <w:rFonts w:cstheme="minorHAnsi"/>
+          <w:sz w:val="24"/>
+          <w:szCs w:val="24"/>
+        </w:rPr>
+        <w:t xml:space="preserve"> fill them in with ideas for paragraphs. Think about/put in relevant figures at this point.</w:t>
       </w:r>
     </w:p>
     <w:p>
@@ -167,15 +185,69 @@
           <w:sz w:val="24"/>
           <w:szCs w:val="24"/>
         </w:rPr>
-        <w:t>writing. The majority of the content of the chapter (&lt;90%) will be written by the end of this draft</w:t>
-      </w:r>
-      <w:r>
-        <w:rPr>
-          <w:rFonts w:cstheme="minorHAnsi"/>
-          <w:sz w:val="24"/>
-          <w:szCs w:val="24"/>
-        </w:rPr>
-        <w:t xml:space="preserve">. The writing at this point may be ‘stream of conciouness`-esk, but it should have had an attempt at making it clear. </w:t>
+        <w:t xml:space="preserve">writing. </w:t>
+      </w:r>
+      <w:proofErr w:type="gramStart"/>
+      <w:r>
+        <w:rPr>
+          <w:rFonts w:cstheme="minorHAnsi"/>
+          <w:sz w:val="24"/>
+          <w:szCs w:val="24"/>
+        </w:rPr>
+        <w:t>The majority of</w:t>
+      </w:r>
+      <w:proofErr w:type="gramEnd"/>
+      <w:r>
+        <w:rPr>
+          <w:rFonts w:cstheme="minorHAnsi"/>
+          <w:sz w:val="24"/>
+          <w:szCs w:val="24"/>
+        </w:rPr>
+        <w:t xml:space="preserve"> the content of the chapter (&lt;90%) will be written by the end of this draft</w:t>
+      </w:r>
+      <w:r>
+        <w:rPr>
+          <w:rFonts w:cstheme="minorHAnsi"/>
+          <w:sz w:val="24"/>
+          <w:szCs w:val="24"/>
+        </w:rPr>
+        <w:t xml:space="preserve">. The writing at this point may be ‘stream of </w:t>
+      </w:r>
+      <w:proofErr w:type="spellStart"/>
+      <w:r>
+        <w:rPr>
+          <w:rFonts w:cstheme="minorHAnsi"/>
+          <w:sz w:val="24"/>
+          <w:szCs w:val="24"/>
+        </w:rPr>
+        <w:t>conciouness</w:t>
+      </w:r>
+      <w:proofErr w:type="spellEnd"/>
+      <w:r>
+        <w:rPr>
+          <w:rFonts w:cstheme="minorHAnsi"/>
+          <w:sz w:val="24"/>
+          <w:szCs w:val="24"/>
+        </w:rPr>
+        <w:t>`-</w:t>
+      </w:r>
+      <w:proofErr w:type="spellStart"/>
+      <w:r>
+        <w:rPr>
+          <w:rFonts w:cstheme="minorHAnsi"/>
+          <w:sz w:val="24"/>
+          <w:szCs w:val="24"/>
+        </w:rPr>
+        <w:t>esk</w:t>
+      </w:r>
+      <w:proofErr w:type="spellEnd"/>
+      <w:r>
+        <w:rPr>
+          <w:rFonts w:cstheme="minorHAnsi"/>
+          <w:sz w:val="24"/>
+          <w:szCs w:val="24"/>
+        </w:rPr>
+        <w:t xml:space="preserve">, but it should have had an attempt at making it clear. </w:t>
       </w:r>
       <w:r>
         <w:rPr>
@@ -327,7 +399,25 @@
           <w:sz w:val="24"/>
           <w:szCs w:val="24"/>
         </w:rPr>
-        <w:t>organising the paragraphs. If it becomes obvious that there are bit which are missing, then they shall be added at this point. They will be completed to the same quality as the rest of the contents of the second draft.</w:t>
+        <w:t xml:space="preserve">organising the paragraphs. If it becomes obvious that there </w:t>
+      </w:r>
+      <w:proofErr w:type="gramStart"/>
+      <w:r>
+        <w:rPr>
+          <w:rFonts w:cstheme="minorHAnsi"/>
+          <w:sz w:val="24"/>
+          <w:szCs w:val="24"/>
+        </w:rPr>
+        <w:t>are</w:t>
+      </w:r>
+      <w:proofErr w:type="gramEnd"/>
+      <w:r>
+        <w:rPr>
+          <w:rFonts w:cstheme="minorHAnsi"/>
+          <w:sz w:val="24"/>
+          <w:szCs w:val="24"/>
+        </w:rPr>
+        <w:t xml:space="preserve"> bit which are missing, then they shall be added at this point. They will be completed to the same quality as the rest of the contents of the second draft.</w:t>
       </w:r>
     </w:p>
     <w:p>
@@ -455,7 +545,25 @@
           <w:sz w:val="24"/>
           <w:szCs w:val="24"/>
         </w:rPr>
-        <w:t>word level. This involves checking the spellings of words (eg. Effect or affect). The</w:t>
+        <w:t>word level. This involves checking the spellings of words (</w:t>
+      </w:r>
+      <w:proofErr w:type="spellStart"/>
+      <w:r>
+        <w:rPr>
+          <w:rFonts w:cstheme="minorHAnsi"/>
+          <w:sz w:val="24"/>
+          <w:szCs w:val="24"/>
+        </w:rPr>
+        <w:t>eg.</w:t>
+      </w:r>
+      <w:proofErr w:type="spellEnd"/>
+      <w:r>
+        <w:rPr>
+          <w:rFonts w:cstheme="minorHAnsi"/>
+          <w:sz w:val="24"/>
+          <w:szCs w:val="24"/>
+        </w:rPr>
+        <w:t xml:space="preserve"> Effect or affect). The</w:t>
       </w:r>
       <w:r>
         <w:rPr>
@@ -580,7 +688,39 @@
           <w:sz w:val="24"/>
           <w:szCs w:val="24"/>
         </w:rPr>
-        <w:t>Figures shall be saved as eps when using matplotlib or 'epsc' when using matlab. This is to prevent a latex warning.</w:t>
+        <w:t>Figures shall be saved as eps when using matplotlib or '</w:t>
+      </w:r>
+      <w:proofErr w:type="spellStart"/>
+      <w:r>
+        <w:rPr>
+          <w:sz w:val="24"/>
+          <w:szCs w:val="24"/>
+        </w:rPr>
+        <w:t>epsc</w:t>
+      </w:r>
+      <w:proofErr w:type="spellEnd"/>
+      <w:r>
+        <w:rPr>
+          <w:sz w:val="24"/>
+          <w:szCs w:val="24"/>
+        </w:rPr>
+        <w:t xml:space="preserve">' when using </w:t>
+      </w:r>
+      <w:proofErr w:type="spellStart"/>
+      <w:r>
+        <w:rPr>
+          <w:sz w:val="24"/>
+          <w:szCs w:val="24"/>
+        </w:rPr>
+        <w:t>matlab</w:t>
+      </w:r>
+      <w:proofErr w:type="spellEnd"/>
+      <w:r>
+        <w:rPr>
+          <w:sz w:val="24"/>
+          <w:szCs w:val="24"/>
+        </w:rPr>
+        <w:t>. This is to prevent a latex warning.</w:t>
       </w:r>
     </w:p>
     <w:p>
@@ -620,7 +760,23 @@
           <w:sz w:val="24"/>
           <w:szCs w:val="24"/>
         </w:rPr>
-        <w:t>Figure names shall be 'chapter description'_chapter_'figure description'. For</w:t>
+        <w:t xml:space="preserve">Figure names shall be 'chapter </w:t>
+      </w:r>
+      <w:proofErr w:type="spellStart"/>
+      <w:r>
+        <w:rPr>
+          <w:sz w:val="24"/>
+          <w:szCs w:val="24"/>
+        </w:rPr>
+        <w:t>description'_chapter_'figure</w:t>
+      </w:r>
+      <w:proofErr w:type="spellEnd"/>
+      <w:r>
+        <w:rPr>
+          <w:sz w:val="24"/>
+          <w:szCs w:val="24"/>
+        </w:rPr>
+        <w:t xml:space="preserve"> description'. For</w:t>
       </w:r>
       <w:r>
         <w:rPr>
@@ -634,7 +790,23 @@
           <w:sz w:val="24"/>
           <w:szCs w:val="24"/>
         </w:rPr>
-        <w:t>example, 'sim_chapter_Zoom_in_ETM_tuning' refers to the figure being in the</w:t>
+        <w:t>example, '</w:t>
+      </w:r>
+      <w:proofErr w:type="spellStart"/>
+      <w:r>
+        <w:rPr>
+          <w:sz w:val="24"/>
+          <w:szCs w:val="24"/>
+        </w:rPr>
+        <w:t>sim_chapter_Zoom_in_ETM_tuning</w:t>
+      </w:r>
+      <w:proofErr w:type="spellEnd"/>
+      <w:r>
+        <w:rPr>
+          <w:sz w:val="24"/>
+          <w:szCs w:val="24"/>
+        </w:rPr>
+        <w:t>' refers to the figure being in the</w:t>
       </w:r>
       <w:r>
         <w:rPr>
@@ -688,7 +860,23 @@
           <w:sz w:val="24"/>
           <w:szCs w:val="24"/>
         </w:rPr>
-        <w:t>Are all lines visible/distinguishable? Changing thickness and linestyle can help.</w:t>
+        <w:t xml:space="preserve">Are all lines visible/distinguishable? Changing thickness and </w:t>
+      </w:r>
+      <w:proofErr w:type="spellStart"/>
+      <w:r>
+        <w:rPr>
+          <w:sz w:val="24"/>
+          <w:szCs w:val="24"/>
+        </w:rPr>
+        <w:t>linestyle</w:t>
+      </w:r>
+      <w:proofErr w:type="spellEnd"/>
+      <w:r>
+        <w:rPr>
+          <w:sz w:val="24"/>
+          <w:szCs w:val="24"/>
+        </w:rPr>
+        <w:t xml:space="preserve"> can help.</w:t>
       </w:r>
     </w:p>
     <w:p>
@@ -703,12 +891,37 @@
           <w:szCs w:val="24"/>
         </w:rPr>
       </w:pPr>
-      <w:r>
-        <w:rPr>
-          <w:sz w:val="24"/>
-          <w:szCs w:val="24"/>
-        </w:rPr>
-        <w:t>Are the axis labelled? The label is a sentence, so normal sentence capitalisation should be used. If its just one word, use a capital letter.</w:t>
+      <w:proofErr w:type="gramStart"/>
+      <w:r>
+        <w:rPr>
+          <w:sz w:val="24"/>
+          <w:szCs w:val="24"/>
+        </w:rPr>
+        <w:t>Are</w:t>
+      </w:r>
+      <w:proofErr w:type="gramEnd"/>
+      <w:r>
+        <w:rPr>
+          <w:sz w:val="24"/>
+          <w:szCs w:val="24"/>
+        </w:rPr>
+        <w:t xml:space="preserve"> the axis labelled? The label is a sentence, so normal sentence capitalisation should be used. If </w:t>
+      </w:r>
+      <w:proofErr w:type="spellStart"/>
+      <w:r>
+        <w:rPr>
+          <w:sz w:val="24"/>
+          <w:szCs w:val="24"/>
+        </w:rPr>
+        <w:t>its</w:t>
+      </w:r>
+      <w:proofErr w:type="spellEnd"/>
+      <w:r>
+        <w:rPr>
+          <w:sz w:val="24"/>
+          <w:szCs w:val="24"/>
+        </w:rPr>
+        <w:t xml:space="preserve"> just one word, use a capital letter.</w:t>
       </w:r>
     </w:p>
     <w:p>
@@ -743,13 +956,22 @@
           <w:szCs w:val="24"/>
         </w:rPr>
       </w:pPr>
+      <w:proofErr w:type="gramStart"/>
       <w:r>
         <w:rPr>
           <w:sz w:val="24"/>
           <w:szCs w:val="24"/>
         </w:rPr>
         <w:lastRenderedPageBreak/>
-        <w:t>Do the axis have units? The units should be put in brackets like (m). No other shape of brackets should be used.</w:t>
+        <w:t>Do</w:t>
+      </w:r>
+      <w:proofErr w:type="gramEnd"/>
+      <w:r>
+        <w:rPr>
+          <w:sz w:val="24"/>
+          <w:szCs w:val="24"/>
+        </w:rPr>
+        <w:t xml:space="preserve"> the axis have units? The units should be put in brackets like (m). No other shape of brackets should be used.</w:t>
       </w:r>
     </w:p>
     <w:p>
@@ -789,7 +1011,23 @@
           <w:sz w:val="24"/>
           <w:szCs w:val="24"/>
         </w:rPr>
-        <w:t>Are subscripts properly typset?</w:t>
+        <w:t xml:space="preserve">Are subscripts properly </w:t>
+      </w:r>
+      <w:proofErr w:type="spellStart"/>
+      <w:r>
+        <w:rPr>
+          <w:sz w:val="24"/>
+          <w:szCs w:val="24"/>
+        </w:rPr>
+        <w:t>typset</w:t>
+      </w:r>
+      <w:proofErr w:type="spellEnd"/>
+      <w:r>
+        <w:rPr>
+          <w:sz w:val="24"/>
+          <w:szCs w:val="24"/>
+        </w:rPr>
+        <w:t>?</w:t>
       </w:r>
     </w:p>
     <w:p>
@@ -809,7 +1047,39 @@
           <w:sz w:val="24"/>
           <w:szCs w:val="24"/>
         </w:rPr>
-        <w:t>Have standard unit labels been used? A for amps, degree symbols instead of 'deg' etc.</w:t>
+        <w:t xml:space="preserve">Have standard unit labels been used? </w:t>
+      </w:r>
+      <w:proofErr w:type="gramStart"/>
+      <w:r>
+        <w:rPr>
+          <w:sz w:val="24"/>
+          <w:szCs w:val="24"/>
+        </w:rPr>
+        <w:t>A for</w:t>
+      </w:r>
+      <w:proofErr w:type="gramEnd"/>
+      <w:r>
+        <w:rPr>
+          <w:sz w:val="24"/>
+          <w:szCs w:val="24"/>
+        </w:rPr>
+        <w:t xml:space="preserve"> amps, degree symbols instead of '</w:t>
+      </w:r>
+      <w:proofErr w:type="spellStart"/>
+      <w:r>
+        <w:rPr>
+          <w:sz w:val="24"/>
+          <w:szCs w:val="24"/>
+        </w:rPr>
+        <w:t>deg</w:t>
+      </w:r>
+      <w:proofErr w:type="spellEnd"/>
+      <w:r>
+        <w:rPr>
+          <w:sz w:val="24"/>
+          <w:szCs w:val="24"/>
+        </w:rPr>
+        <w:t>' etc.</w:t>
       </w:r>
     </w:p>
     <w:p>
@@ -849,7 +1119,23 @@
           <w:sz w:val="24"/>
           <w:szCs w:val="24"/>
         </w:rPr>
-        <w:t>Check for spelling mistakes! e.g. freuqency -&gt; frequency.</w:t>
+        <w:t xml:space="preserve">Check for spelling mistakes! e.g. </w:t>
+      </w:r>
+      <w:proofErr w:type="spellStart"/>
+      <w:r>
+        <w:rPr>
+          <w:sz w:val="24"/>
+          <w:szCs w:val="24"/>
+        </w:rPr>
+        <w:t>freuqency</w:t>
+      </w:r>
+      <w:proofErr w:type="spellEnd"/>
+      <w:r>
+        <w:rPr>
+          <w:sz w:val="24"/>
+          <w:szCs w:val="24"/>
+        </w:rPr>
+        <w:t xml:space="preserve"> -&gt; frequency.</w:t>
       </w:r>
     </w:p>
     <w:p>
@@ -952,7 +1238,23 @@
           <w:sz w:val="24"/>
           <w:szCs w:val="24"/>
         </w:rPr>
-        <w:t>Standard matlab and matplotlib fonts will be used. The following examples give</w:t>
+        <w:t xml:space="preserve">Standard </w:t>
+      </w:r>
+      <w:proofErr w:type="spellStart"/>
+      <w:r>
+        <w:rPr>
+          <w:sz w:val="24"/>
+          <w:szCs w:val="24"/>
+        </w:rPr>
+        <w:t>matlab</w:t>
+      </w:r>
+      <w:proofErr w:type="spellEnd"/>
+      <w:r>
+        <w:rPr>
+          <w:sz w:val="24"/>
+          <w:szCs w:val="24"/>
+        </w:rPr>
+        <w:t xml:space="preserve"> and matplotlib fonts will be used. The following examples give</w:t>
       </w:r>
       <w:r>
         <w:rPr>
@@ -1041,7 +1343,55 @@
           <w:sz w:val="24"/>
           <w:szCs w:val="24"/>
         </w:rPr>
-        <w:t>have ‘shared axis’, only label one of the axis. If it’s the xaxis, then label the bottom one. If it’s the y axis, label the left one.</w:t>
+        <w:t xml:space="preserve">have ‘shared axis’, only label one of the axis. If </w:t>
+      </w:r>
+      <w:proofErr w:type="gramStart"/>
+      <w:r>
+        <w:rPr>
+          <w:sz w:val="24"/>
+          <w:szCs w:val="24"/>
+        </w:rPr>
+        <w:t>it’s</w:t>
+      </w:r>
+      <w:proofErr w:type="gramEnd"/>
+      <w:r>
+        <w:rPr>
+          <w:sz w:val="24"/>
+          <w:szCs w:val="24"/>
+        </w:rPr>
+        <w:t xml:space="preserve"> the </w:t>
+      </w:r>
+      <w:proofErr w:type="spellStart"/>
+      <w:r>
+        <w:rPr>
+          <w:sz w:val="24"/>
+          <w:szCs w:val="24"/>
+        </w:rPr>
+        <w:t>xaxis</w:t>
+      </w:r>
+      <w:proofErr w:type="spellEnd"/>
+      <w:r>
+        <w:rPr>
+          <w:sz w:val="24"/>
+          <w:szCs w:val="24"/>
+        </w:rPr>
+        <w:t xml:space="preserve">, then label the bottom one. If </w:t>
+      </w:r>
+      <w:proofErr w:type="gramStart"/>
+      <w:r>
+        <w:rPr>
+          <w:sz w:val="24"/>
+          <w:szCs w:val="24"/>
+        </w:rPr>
+        <w:t>it’s</w:t>
+      </w:r>
+      <w:proofErr w:type="gramEnd"/>
+      <w:r>
+        <w:rPr>
+          <w:sz w:val="24"/>
+          <w:szCs w:val="24"/>
+        </w:rPr>
+        <w:t xml:space="preserve"> the y axis, label the left one.</w:t>
       </w:r>
     </w:p>
     <w:p>
@@ -1098,21 +1448,69 @@
           <w:sz w:val="24"/>
           <w:szCs w:val="24"/>
         </w:rPr>
-        <w:t xml:space="preserve"> fontsize = 10 on axis</w:t>
-      </w:r>
-      <w:r>
-        <w:rPr>
-          <w:sz w:val="24"/>
-          <w:szCs w:val="24"/>
-        </w:rPr>
-        <w:t xml:space="preserve"> and legend. If the legend looks too big, try splitting it into multiple columns. If this doesn’t work, reduce the</w:t>
-      </w:r>
-      <w:r>
-        <w:rPr>
-          <w:sz w:val="24"/>
-          <w:szCs w:val="24"/>
-        </w:rPr>
-        <w:t xml:space="preserve"> fontsize </w:t>
+        <w:t xml:space="preserve"> </w:t>
+      </w:r>
+      <w:proofErr w:type="spellStart"/>
+      <w:r>
+        <w:rPr>
+          <w:sz w:val="24"/>
+          <w:szCs w:val="24"/>
+        </w:rPr>
+        <w:t>fontsize</w:t>
+      </w:r>
+      <w:proofErr w:type="spellEnd"/>
+      <w:r>
+        <w:rPr>
+          <w:sz w:val="24"/>
+          <w:szCs w:val="24"/>
+        </w:rPr>
+        <w:t xml:space="preserve"> = 10 on axis</w:t>
+      </w:r>
+      <w:r>
+        <w:rPr>
+          <w:sz w:val="24"/>
+          <w:szCs w:val="24"/>
+        </w:rPr>
+        <w:t xml:space="preserve"> and legend. If the legend looks too big, try splitting it into multiple columns. If this </w:t>
+      </w:r>
+      <w:proofErr w:type="gramStart"/>
+      <w:r>
+        <w:rPr>
+          <w:sz w:val="24"/>
+          <w:szCs w:val="24"/>
+        </w:rPr>
+        <w:t>doesn’t</w:t>
+      </w:r>
+      <w:proofErr w:type="gramEnd"/>
+      <w:r>
+        <w:rPr>
+          <w:sz w:val="24"/>
+          <w:szCs w:val="24"/>
+        </w:rPr>
+        <w:t xml:space="preserve"> work, reduce the</w:t>
+      </w:r>
+      <w:r>
+        <w:rPr>
+          <w:sz w:val="24"/>
+          <w:szCs w:val="24"/>
+        </w:rPr>
+        <w:t xml:space="preserve"> </w:t>
+      </w:r>
+      <w:proofErr w:type="spellStart"/>
+      <w:r>
+        <w:rPr>
+          <w:sz w:val="24"/>
+          <w:szCs w:val="24"/>
+        </w:rPr>
+        <w:t>fontsize</w:t>
+      </w:r>
+      <w:proofErr w:type="spellEnd"/>
+      <w:r>
+        <w:rPr>
+          <w:sz w:val="24"/>
+          <w:szCs w:val="24"/>
+        </w:rPr>
+        <w:t xml:space="preserve"> </w:t>
       </w:r>
       <w:r>
         <w:rPr>
@@ -1166,30 +1564,88 @@
           <w:szCs w:val="24"/>
         </w:rPr>
       </w:pPr>
-      <w:r>
-        <w:rPr>
-          <w:rFonts w:ascii="SimSun" w:eastAsia="SimSun" w:hAnsi="SimSun"/>
-          <w:sz w:val="24"/>
-          <w:szCs w:val="24"/>
-        </w:rPr>
-        <w:t>figure_size = (6,4)</w:t>
-      </w:r>
-    </w:p>
-    <w:p>
-      <w:pPr>
-        <w:rPr>
-          <w:rFonts w:ascii="SimSun" w:eastAsia="SimSun" w:hAnsi="SimSun"/>
-          <w:sz w:val="24"/>
-          <w:szCs w:val="24"/>
-        </w:rPr>
-      </w:pPr>
-      <w:r>
-        <w:rPr>
-          <w:rFonts w:ascii="SimSun" w:eastAsia="SimSun" w:hAnsi="SimSun"/>
-          <w:sz w:val="24"/>
-          <w:szCs w:val="24"/>
-        </w:rPr>
-        <w:t xml:space="preserve">plt.figure(figsize = figure_size,dpi = </w:t>
+      <w:proofErr w:type="spellStart"/>
+      <w:r>
+        <w:rPr>
+          <w:rFonts w:ascii="SimSun" w:eastAsia="SimSun" w:hAnsi="SimSun"/>
+          <w:sz w:val="24"/>
+          <w:szCs w:val="24"/>
+        </w:rPr>
+        <w:t>figure_size</w:t>
+      </w:r>
+      <w:proofErr w:type="spellEnd"/>
+      <w:r>
+        <w:rPr>
+          <w:rFonts w:ascii="SimSun" w:eastAsia="SimSun" w:hAnsi="SimSun"/>
+          <w:sz w:val="24"/>
+          <w:szCs w:val="24"/>
+        </w:rPr>
+        <w:t xml:space="preserve"> = (6,4)</w:t>
+      </w:r>
+    </w:p>
+    <w:p>
+      <w:pPr>
+        <w:rPr>
+          <w:rFonts w:ascii="SimSun" w:eastAsia="SimSun" w:hAnsi="SimSun"/>
+          <w:sz w:val="24"/>
+          <w:szCs w:val="24"/>
+        </w:rPr>
+      </w:pPr>
+      <w:proofErr w:type="spellStart"/>
+      <w:proofErr w:type="gramStart"/>
+      <w:r>
+        <w:rPr>
+          <w:rFonts w:ascii="SimSun" w:eastAsia="SimSun" w:hAnsi="SimSun"/>
+          <w:sz w:val="24"/>
+          <w:szCs w:val="24"/>
+        </w:rPr>
+        <w:t>plt.figure</w:t>
+      </w:r>
+      <w:proofErr w:type="spellEnd"/>
+      <w:proofErr w:type="gramEnd"/>
+      <w:r>
+        <w:rPr>
+          <w:rFonts w:ascii="SimSun" w:eastAsia="SimSun" w:hAnsi="SimSun"/>
+          <w:sz w:val="24"/>
+          <w:szCs w:val="24"/>
+        </w:rPr>
+        <w:t>(</w:t>
+      </w:r>
+      <w:proofErr w:type="spellStart"/>
+      <w:r>
+        <w:rPr>
+          <w:rFonts w:ascii="SimSun" w:eastAsia="SimSun" w:hAnsi="SimSun"/>
+          <w:sz w:val="24"/>
+          <w:szCs w:val="24"/>
+        </w:rPr>
+        <w:t>figsize</w:t>
+      </w:r>
+      <w:proofErr w:type="spellEnd"/>
+      <w:r>
+        <w:rPr>
+          <w:rFonts w:ascii="SimSun" w:eastAsia="SimSun" w:hAnsi="SimSun"/>
+          <w:sz w:val="24"/>
+          <w:szCs w:val="24"/>
+        </w:rPr>
+        <w:t xml:space="preserve"> = </w:t>
+      </w:r>
+      <w:proofErr w:type="spellStart"/>
+      <w:r>
+        <w:rPr>
+          <w:rFonts w:ascii="SimSun" w:eastAsia="SimSun" w:hAnsi="SimSun"/>
+          <w:sz w:val="24"/>
+          <w:szCs w:val="24"/>
+        </w:rPr>
+        <w:t>figure_size,dpi</w:t>
+      </w:r>
+      <w:proofErr w:type="spellEnd"/>
+      <w:r>
+        <w:rPr>
+          <w:rFonts w:ascii="SimSun" w:eastAsia="SimSun" w:hAnsi="SimSun"/>
+          <w:sz w:val="24"/>
+          <w:szCs w:val="24"/>
+        </w:rPr>
+        <w:t xml:space="preserve"> = </w:t>
       </w:r>
       <w:r>
         <w:rPr>
@@ -1216,47 +1672,119 @@
           <w:szCs w:val="24"/>
         </w:rPr>
       </w:pPr>
-      <w:r>
-        <w:rPr>
-          <w:rFonts w:ascii="SimSun" w:eastAsia="SimSun" w:hAnsi="SimSun"/>
-          <w:sz w:val="24"/>
-          <w:szCs w:val="24"/>
-        </w:rPr>
-        <w:t>plt.plot(x,y,label = 'Name of line')</w:t>
-      </w:r>
-    </w:p>
-    <w:p>
-      <w:pPr>
-        <w:rPr>
-          <w:rFonts w:ascii="SimSun" w:eastAsia="SimSun" w:hAnsi="SimSun"/>
-          <w:sz w:val="24"/>
-          <w:szCs w:val="24"/>
-        </w:rPr>
-      </w:pPr>
-      <w:r>
-        <w:rPr>
-          <w:rFonts w:ascii="SimSun" w:eastAsia="SimSun" w:hAnsi="SimSun"/>
-          <w:sz w:val="24"/>
-          <w:szCs w:val="24"/>
-        </w:rPr>
-        <w:t>plt.legend(prop={'size': 8},loc = 'lower left')</w:t>
-      </w:r>
-    </w:p>
-    <w:p>
-      <w:pPr>
-        <w:rPr>
-          <w:rFonts w:ascii="SimSun" w:eastAsia="SimSun" w:hAnsi="SimSun"/>
-          <w:sz w:val="24"/>
-          <w:szCs w:val="24"/>
-        </w:rPr>
-      </w:pPr>
-      <w:r>
-        <w:rPr>
-          <w:rFonts w:ascii="SimSun" w:eastAsia="SimSun" w:hAnsi="SimSun"/>
-          <w:sz w:val="24"/>
-          <w:szCs w:val="24"/>
-        </w:rPr>
-        <w:t>plt.xlabel('x axis (units)'</w:t>
+      <w:proofErr w:type="spellStart"/>
+      <w:proofErr w:type="gramStart"/>
+      <w:r>
+        <w:rPr>
+          <w:rFonts w:ascii="SimSun" w:eastAsia="SimSun" w:hAnsi="SimSun"/>
+          <w:sz w:val="24"/>
+          <w:szCs w:val="24"/>
+        </w:rPr>
+        <w:t>plt.plot</w:t>
+      </w:r>
+      <w:proofErr w:type="spellEnd"/>
+      <w:proofErr w:type="gramEnd"/>
+      <w:r>
+        <w:rPr>
+          <w:rFonts w:ascii="SimSun" w:eastAsia="SimSun" w:hAnsi="SimSun"/>
+          <w:sz w:val="24"/>
+          <w:szCs w:val="24"/>
+        </w:rPr>
+        <w:t>(</w:t>
+      </w:r>
+      <w:proofErr w:type="spellStart"/>
+      <w:r>
+        <w:rPr>
+          <w:rFonts w:ascii="SimSun" w:eastAsia="SimSun" w:hAnsi="SimSun"/>
+          <w:sz w:val="24"/>
+          <w:szCs w:val="24"/>
+        </w:rPr>
+        <w:t>x,y,label</w:t>
+      </w:r>
+      <w:proofErr w:type="spellEnd"/>
+      <w:r>
+        <w:rPr>
+          <w:rFonts w:ascii="SimSun" w:eastAsia="SimSun" w:hAnsi="SimSun"/>
+          <w:sz w:val="24"/>
+          <w:szCs w:val="24"/>
+        </w:rPr>
+        <w:t xml:space="preserve"> = 'Name of line')</w:t>
+      </w:r>
+    </w:p>
+    <w:p>
+      <w:pPr>
+        <w:rPr>
+          <w:rFonts w:ascii="SimSun" w:eastAsia="SimSun" w:hAnsi="SimSun"/>
+          <w:sz w:val="24"/>
+          <w:szCs w:val="24"/>
+        </w:rPr>
+      </w:pPr>
+      <w:proofErr w:type="spellStart"/>
+      <w:proofErr w:type="gramStart"/>
+      <w:r>
+        <w:rPr>
+          <w:rFonts w:ascii="SimSun" w:eastAsia="SimSun" w:hAnsi="SimSun"/>
+          <w:sz w:val="24"/>
+          <w:szCs w:val="24"/>
+        </w:rPr>
+        <w:t>plt.legend</w:t>
+      </w:r>
+      <w:proofErr w:type="spellEnd"/>
+      <w:proofErr w:type="gramEnd"/>
+      <w:r>
+        <w:rPr>
+          <w:rFonts w:ascii="SimSun" w:eastAsia="SimSun" w:hAnsi="SimSun"/>
+          <w:sz w:val="24"/>
+          <w:szCs w:val="24"/>
+        </w:rPr>
+        <w:t>(prop={'size': 8},</w:t>
+      </w:r>
+      <w:proofErr w:type="spellStart"/>
+      <w:r>
+        <w:rPr>
+          <w:rFonts w:ascii="SimSun" w:eastAsia="SimSun" w:hAnsi="SimSun"/>
+          <w:sz w:val="24"/>
+          <w:szCs w:val="24"/>
+        </w:rPr>
+        <w:t>loc</w:t>
+      </w:r>
+      <w:proofErr w:type="spellEnd"/>
+      <w:r>
+        <w:rPr>
+          <w:rFonts w:ascii="SimSun" w:eastAsia="SimSun" w:hAnsi="SimSun"/>
+          <w:sz w:val="24"/>
+          <w:szCs w:val="24"/>
+        </w:rPr>
+        <w:t xml:space="preserve"> = 'lower left')</w:t>
+      </w:r>
+    </w:p>
+    <w:p>
+      <w:pPr>
+        <w:rPr>
+          <w:rFonts w:ascii="SimSun" w:eastAsia="SimSun" w:hAnsi="SimSun"/>
+          <w:sz w:val="24"/>
+          <w:szCs w:val="24"/>
+        </w:rPr>
+      </w:pPr>
+      <w:proofErr w:type="spellStart"/>
+      <w:proofErr w:type="gramStart"/>
+      <w:r>
+        <w:rPr>
+          <w:rFonts w:ascii="SimSun" w:eastAsia="SimSun" w:hAnsi="SimSun"/>
+          <w:sz w:val="24"/>
+          <w:szCs w:val="24"/>
+        </w:rPr>
+        <w:t>plt.xlabel</w:t>
+      </w:r>
+      <w:proofErr w:type="spellEnd"/>
+      <w:proofErr w:type="gramEnd"/>
+      <w:r>
+        <w:rPr>
+          <w:rFonts w:ascii="SimSun" w:eastAsia="SimSun" w:hAnsi="SimSun"/>
+          <w:sz w:val="24"/>
+          <w:szCs w:val="24"/>
+        </w:rPr>
+        <w:t>('x axis (units)'</w:t>
       </w:r>
       <w:r>
         <w:rPr>
@@ -1269,13 +1797,23 @@
       <w:r>
         <w:t xml:space="preserve"> </w:t>
       </w:r>
-      <w:r>
-        <w:rPr>
-          <w:rFonts w:ascii="SimSun" w:eastAsia="SimSun" w:hAnsi="SimSun"/>
-          <w:sz w:val="24"/>
-          <w:szCs w:val="24"/>
-        </w:rPr>
-        <w:t>fontsize = 10</w:t>
+      <w:proofErr w:type="spellStart"/>
+      <w:r>
+        <w:rPr>
+          <w:rFonts w:ascii="SimSun" w:eastAsia="SimSun" w:hAnsi="SimSun"/>
+          <w:sz w:val="24"/>
+          <w:szCs w:val="24"/>
+        </w:rPr>
+        <w:t>fontsize</w:t>
+      </w:r>
+      <w:proofErr w:type="spellEnd"/>
+      <w:r>
+        <w:rPr>
+          <w:rFonts w:ascii="SimSun" w:eastAsia="SimSun" w:hAnsi="SimSun"/>
+          <w:sz w:val="24"/>
+          <w:szCs w:val="24"/>
+        </w:rPr>
+        <w:t xml:space="preserve"> = 10</w:t>
       </w:r>
       <w:r>
         <w:rPr>
@@ -1294,13 +1832,25 @@
           <w:szCs w:val="24"/>
         </w:rPr>
       </w:pPr>
-      <w:r>
-        <w:rPr>
-          <w:rFonts w:ascii="SimSun" w:eastAsia="SimSun" w:hAnsi="SimSun"/>
-          <w:sz w:val="24"/>
-          <w:szCs w:val="24"/>
-        </w:rPr>
-        <w:t>plt.ylabel('y axis (units)'</w:t>
+      <w:proofErr w:type="spellStart"/>
+      <w:proofErr w:type="gramStart"/>
+      <w:r>
+        <w:rPr>
+          <w:rFonts w:ascii="SimSun" w:eastAsia="SimSun" w:hAnsi="SimSun"/>
+          <w:sz w:val="24"/>
+          <w:szCs w:val="24"/>
+        </w:rPr>
+        <w:t>plt.ylabel</w:t>
+      </w:r>
+      <w:proofErr w:type="spellEnd"/>
+      <w:proofErr w:type="gramEnd"/>
+      <w:r>
+        <w:rPr>
+          <w:rFonts w:ascii="SimSun" w:eastAsia="SimSun" w:hAnsi="SimSun"/>
+          <w:sz w:val="24"/>
+          <w:szCs w:val="24"/>
+        </w:rPr>
+        <w:t>('y axis (units)'</w:t>
       </w:r>
       <w:r>
         <w:rPr>
@@ -1313,13 +1863,23 @@
       <w:r>
         <w:t xml:space="preserve"> </w:t>
       </w:r>
-      <w:r>
-        <w:rPr>
-          <w:rFonts w:ascii="SimSun" w:eastAsia="SimSun" w:hAnsi="SimSun"/>
-          <w:sz w:val="24"/>
-          <w:szCs w:val="24"/>
-        </w:rPr>
-        <w:t>fontsize = 10</w:t>
+      <w:proofErr w:type="spellStart"/>
+      <w:r>
+        <w:rPr>
+          <w:rFonts w:ascii="SimSun" w:eastAsia="SimSun" w:hAnsi="SimSun"/>
+          <w:sz w:val="24"/>
+          <w:szCs w:val="24"/>
+        </w:rPr>
+        <w:t>fontsize</w:t>
+      </w:r>
+      <w:proofErr w:type="spellEnd"/>
+      <w:r>
+        <w:rPr>
+          <w:rFonts w:ascii="SimSun" w:eastAsia="SimSun" w:hAnsi="SimSun"/>
+          <w:sz w:val="24"/>
+          <w:szCs w:val="24"/>
+        </w:rPr>
+        <w:t xml:space="preserve"> = 10</w:t>
       </w:r>
       <w:r>
         <w:rPr>
@@ -1338,57 +1898,121 @@
           <w:szCs w:val="24"/>
         </w:rPr>
       </w:pPr>
-      <w:r>
-        <w:rPr>
-          <w:rFonts w:ascii="SimSun" w:eastAsia="SimSun" w:hAnsi="SimSun"/>
-          <w:sz w:val="24"/>
-          <w:szCs w:val="24"/>
-        </w:rPr>
-        <w:t>plt.tight_layout()</w:t>
-      </w:r>
-    </w:p>
-    <w:p>
-      <w:pPr>
-        <w:rPr>
-          <w:rFonts w:ascii="SimSun" w:eastAsia="SimSun" w:hAnsi="SimSun"/>
-          <w:sz w:val="24"/>
-          <w:szCs w:val="24"/>
-        </w:rPr>
-      </w:pPr>
-      <w:r>
-        <w:rPr>
-          <w:rFonts w:ascii="SimSun" w:eastAsia="SimSun" w:hAnsi="SimSun"/>
-          <w:sz w:val="24"/>
-          <w:szCs w:val="24"/>
-        </w:rPr>
-        <w:t>plt.grid()</w:t>
-      </w:r>
-    </w:p>
-    <w:p>
-      <w:pPr>
-        <w:rPr>
-          <w:rFonts w:ascii="SimSun" w:eastAsia="SimSun" w:hAnsi="SimSun"/>
-          <w:sz w:val="24"/>
-          <w:szCs w:val="24"/>
-        </w:rPr>
-      </w:pPr>
-      <w:r>
-        <w:rPr>
-          <w:rFonts w:ascii="SimSun" w:eastAsia="SimSun" w:hAnsi="SimSun"/>
-          <w:sz w:val="24"/>
-          <w:szCs w:val="24"/>
-        </w:rPr>
-        <w:t>plt.savefig('sim_chapter_Zoom_in_ETM_tuning.eps')</w:t>
-      </w:r>
-    </w:p>
-    <w:p>
-      <w:pPr>
-        <w:rPr>
-          <w:rFonts w:ascii="SimSun" w:eastAsia="SimSun" w:hAnsi="SimSun"/>
-          <w:sz w:val="24"/>
-          <w:szCs w:val="24"/>
-        </w:rPr>
-      </w:pPr>
+      <w:proofErr w:type="spellStart"/>
+      <w:proofErr w:type="gramStart"/>
+      <w:r>
+        <w:rPr>
+          <w:rFonts w:ascii="SimSun" w:eastAsia="SimSun" w:hAnsi="SimSun"/>
+          <w:sz w:val="24"/>
+          <w:szCs w:val="24"/>
+        </w:rPr>
+        <w:t>plt.tight</w:t>
+      </w:r>
+      <w:proofErr w:type="gramEnd"/>
+      <w:r>
+        <w:rPr>
+          <w:rFonts w:ascii="SimSun" w:eastAsia="SimSun" w:hAnsi="SimSun"/>
+          <w:sz w:val="24"/>
+          <w:szCs w:val="24"/>
+        </w:rPr>
+        <w:t>_layout</w:t>
+      </w:r>
+      <w:proofErr w:type="spellEnd"/>
+      <w:r>
+        <w:rPr>
+          <w:rFonts w:ascii="SimSun" w:eastAsia="SimSun" w:hAnsi="SimSun"/>
+          <w:sz w:val="24"/>
+          <w:szCs w:val="24"/>
+        </w:rPr>
+        <w:t>()</w:t>
+      </w:r>
+    </w:p>
+    <w:p>
+      <w:pPr>
+        <w:rPr>
+          <w:rFonts w:ascii="SimSun" w:eastAsia="SimSun" w:hAnsi="SimSun"/>
+          <w:sz w:val="24"/>
+          <w:szCs w:val="24"/>
+        </w:rPr>
+      </w:pPr>
+      <w:proofErr w:type="spellStart"/>
+      <w:proofErr w:type="gramStart"/>
+      <w:r>
+        <w:rPr>
+          <w:rFonts w:ascii="SimSun" w:eastAsia="SimSun" w:hAnsi="SimSun"/>
+          <w:sz w:val="24"/>
+          <w:szCs w:val="24"/>
+        </w:rPr>
+        <w:t>plt.grid</w:t>
+      </w:r>
+      <w:proofErr w:type="spellEnd"/>
+      <w:proofErr w:type="gramEnd"/>
+      <w:r>
+        <w:rPr>
+          <w:rFonts w:ascii="SimSun" w:eastAsia="SimSun" w:hAnsi="SimSun"/>
+          <w:sz w:val="24"/>
+          <w:szCs w:val="24"/>
+        </w:rPr>
+        <w:t>()</w:t>
+      </w:r>
+    </w:p>
+    <w:p>
+      <w:pPr>
+        <w:rPr>
+          <w:rFonts w:ascii="SimSun" w:eastAsia="SimSun" w:hAnsi="SimSun"/>
+          <w:sz w:val="24"/>
+          <w:szCs w:val="24"/>
+        </w:rPr>
+      </w:pPr>
+      <w:proofErr w:type="spellStart"/>
+      <w:proofErr w:type="gramStart"/>
+      <w:r>
+        <w:rPr>
+          <w:rFonts w:ascii="SimSun" w:eastAsia="SimSun" w:hAnsi="SimSun"/>
+          <w:sz w:val="24"/>
+          <w:szCs w:val="24"/>
+        </w:rPr>
+        <w:t>plt.savefig</w:t>
+      </w:r>
+      <w:proofErr w:type="spellEnd"/>
+      <w:proofErr w:type="gramEnd"/>
+      <w:r>
+        <w:rPr>
+          <w:rFonts w:ascii="SimSun" w:eastAsia="SimSun" w:hAnsi="SimSun"/>
+          <w:sz w:val="24"/>
+          <w:szCs w:val="24"/>
+        </w:rPr>
+        <w:t>('</w:t>
+      </w:r>
+      <w:proofErr w:type="spellStart"/>
+      <w:r>
+        <w:rPr>
+          <w:rFonts w:ascii="SimSun" w:eastAsia="SimSun" w:hAnsi="SimSun"/>
+          <w:sz w:val="24"/>
+          <w:szCs w:val="24"/>
+        </w:rPr>
+        <w:t>sim_chapter_Zoom_in_ETM_tuning.eps</w:t>
+      </w:r>
+      <w:proofErr w:type="spellEnd"/>
+      <w:r>
+        <w:rPr>
+          <w:rFonts w:ascii="SimSun" w:eastAsia="SimSun" w:hAnsi="SimSun"/>
+          <w:sz w:val="24"/>
+          <w:szCs w:val="24"/>
+        </w:rPr>
+        <w:t>')</w:t>
+      </w:r>
+    </w:p>
+    <w:p>
+      <w:pPr>
+        <w:rPr>
+          <w:rFonts w:ascii="SimSun" w:eastAsia="SimSun" w:hAnsi="SimSun"/>
+          <w:sz w:val="24"/>
+          <w:szCs w:val="24"/>
+        </w:rPr>
+      </w:pPr>
+      <w:proofErr w:type="spellStart"/>
+      <w:proofErr w:type="gramStart"/>
       <w:r>
         <w:rPr>
           <w:rFonts w:ascii="SimSun" w:eastAsia="SimSun" w:hAnsi="SimSun"/>
@@ -1396,7 +2020,17 @@
           <w:szCs w:val="24"/>
         </w:rPr>
         <w:lastRenderedPageBreak/>
-        <w:t>plt.show()</w:t>
+        <w:t>plt.show</w:t>
+      </w:r>
+      <w:proofErr w:type="spellEnd"/>
+      <w:proofErr w:type="gramEnd"/>
+      <w:r>
+        <w:rPr>
+          <w:rFonts w:ascii="SimSun" w:eastAsia="SimSun" w:hAnsi="SimSun"/>
+          <w:sz w:val="24"/>
+          <w:szCs w:val="24"/>
+        </w:rPr>
+        <w:t>()</w:t>
       </w:r>
     </w:p>
     <w:p>
@@ -1433,13 +2067,43 @@
           <w:szCs w:val="24"/>
         </w:rPr>
       </w:pPr>
-      <w:r>
-        <w:rPr>
-          <w:rFonts w:ascii="SimSun" w:eastAsia="SimSun" w:hAnsi="SimSun"/>
-          <w:sz w:val="24"/>
-          <w:szCs w:val="24"/>
-        </w:rPr>
-        <w:t>plt.figure(figsize=(6, 6), dpi=150)</w:t>
+      <w:proofErr w:type="spellStart"/>
+      <w:proofErr w:type="gramStart"/>
+      <w:r>
+        <w:rPr>
+          <w:rFonts w:ascii="SimSun" w:eastAsia="SimSun" w:hAnsi="SimSun"/>
+          <w:sz w:val="24"/>
+          <w:szCs w:val="24"/>
+        </w:rPr>
+        <w:t>plt.figure</w:t>
+      </w:r>
+      <w:proofErr w:type="spellEnd"/>
+      <w:proofErr w:type="gramEnd"/>
+      <w:r>
+        <w:rPr>
+          <w:rFonts w:ascii="SimSun" w:eastAsia="SimSun" w:hAnsi="SimSun"/>
+          <w:sz w:val="24"/>
+          <w:szCs w:val="24"/>
+        </w:rPr>
+        <w:t>(</w:t>
+      </w:r>
+      <w:proofErr w:type="spellStart"/>
+      <w:r>
+        <w:rPr>
+          <w:rFonts w:ascii="SimSun" w:eastAsia="SimSun" w:hAnsi="SimSun"/>
+          <w:sz w:val="24"/>
+          <w:szCs w:val="24"/>
+        </w:rPr>
+        <w:t>figsize</w:t>
+      </w:r>
+      <w:proofErr w:type="spellEnd"/>
+      <w:r>
+        <w:rPr>
+          <w:rFonts w:ascii="SimSun" w:eastAsia="SimSun" w:hAnsi="SimSun"/>
+          <w:sz w:val="24"/>
+          <w:szCs w:val="24"/>
+        </w:rPr>
+        <w:t>=(6, 6), dpi=150)</w:t>
       </w:r>
     </w:p>
     <w:p>
@@ -1497,6 +2161,7 @@
           <w:szCs w:val="24"/>
         </w:rPr>
       </w:pPr>
+      <w:proofErr w:type="spellStart"/>
       <w:r>
         <w:rPr>
           <w:rFonts w:asciiTheme="majorHAnsi" w:hAnsiTheme="majorHAnsi"/>
@@ -1507,29 +2172,82 @@
         </w:rPr>
         <w:t>Matlab</w:t>
       </w:r>
-    </w:p>
-    <w:p>
-      <w:pPr>
-        <w:rPr>
-          <w:sz w:val="24"/>
-          <w:szCs w:val="24"/>
-        </w:rPr>
-      </w:pPr>
-      <w:r>
-        <w:rPr>
-          <w:sz w:val="24"/>
-          <w:szCs w:val="24"/>
-        </w:rPr>
-        <w:t xml:space="preserve">For matlab figures, use the linspecer (from mathworks file exchange) function to </w:t>
-      </w:r>
-    </w:p>
-    <w:p>
-      <w:pPr>
-        <w:rPr>
-          <w:sz w:val="24"/>
-          <w:szCs w:val="24"/>
-        </w:rPr>
-      </w:pPr>
+      <w:proofErr w:type="spellEnd"/>
+    </w:p>
+    <w:p>
+      <w:pPr>
+        <w:pStyle w:val="ListParagraph"/>
+        <w:numPr>
+          <w:ilvl w:val="0"/>
+          <w:numId w:val="5"/>
+        </w:numPr>
+        <w:rPr>
+          <w:sz w:val="24"/>
+          <w:szCs w:val="24"/>
+        </w:rPr>
+      </w:pPr>
+      <w:r>
+        <w:rPr>
+          <w:sz w:val="24"/>
+          <w:szCs w:val="24"/>
+        </w:rPr>
+        <w:t xml:space="preserve">For </w:t>
+      </w:r>
+      <w:proofErr w:type="spellStart"/>
+      <w:r>
+        <w:rPr>
+          <w:sz w:val="24"/>
+          <w:szCs w:val="24"/>
+        </w:rPr>
+        <w:t>matlab</w:t>
+      </w:r>
+      <w:proofErr w:type="spellEnd"/>
+      <w:r>
+        <w:rPr>
+          <w:sz w:val="24"/>
+          <w:szCs w:val="24"/>
+        </w:rPr>
+        <w:t xml:space="preserve"> figures, use the </w:t>
+      </w:r>
+      <w:proofErr w:type="spellStart"/>
+      <w:r>
+        <w:rPr>
+          <w:sz w:val="24"/>
+          <w:szCs w:val="24"/>
+        </w:rPr>
+        <w:t>linspecer</w:t>
+      </w:r>
+      <w:proofErr w:type="spellEnd"/>
+      <w:r>
+        <w:rPr>
+          <w:sz w:val="24"/>
+          <w:szCs w:val="24"/>
+        </w:rPr>
+        <w:t xml:space="preserve"> (from </w:t>
+      </w:r>
+      <w:proofErr w:type="spellStart"/>
+      <w:r>
+        <w:rPr>
+          <w:sz w:val="24"/>
+          <w:szCs w:val="24"/>
+        </w:rPr>
+        <w:t>mathworks</w:t>
+      </w:r>
+      <w:proofErr w:type="spellEnd"/>
+      <w:r>
+        <w:rPr>
+          <w:sz w:val="24"/>
+          <w:szCs w:val="24"/>
+        </w:rPr>
+        <w:t xml:space="preserve"> file exchange) function to</w:t>
+      </w:r>
+      <w:r>
+        <w:rPr>
+          <w:sz w:val="24"/>
+          <w:szCs w:val="24"/>
+        </w:rPr>
+        <w:t xml:space="preserve"> </w:t>
+      </w:r>
       <w:r>
         <w:rPr>
           <w:sz w:val="24"/>
@@ -1540,96 +2258,416 @@
     </w:p>
     <w:p>
       <w:pPr>
-        <w:rPr>
-          <w:rFonts w:ascii="SimSun" w:eastAsia="SimSun" w:hAnsi="SimSun"/>
-          <w:sz w:val="24"/>
-          <w:szCs w:val="24"/>
-        </w:rPr>
-      </w:pPr>
-      <w:r>
-        <w:rPr>
-          <w:rFonts w:ascii="SimSun" w:eastAsia="SimSun" w:hAnsi="SimSun"/>
-          <w:sz w:val="24"/>
-          <w:szCs w:val="24"/>
-        </w:rPr>
-        <w:t>c = linspecer(2);</w:t>
-      </w:r>
-    </w:p>
-    <w:p>
-      <w:pPr>
-        <w:rPr>
-          <w:rFonts w:ascii="SimSun" w:eastAsia="SimSun" w:hAnsi="SimSun"/>
-          <w:sz w:val="24"/>
-          <w:szCs w:val="24"/>
-        </w:rPr>
-      </w:pPr>
-      <w:r>
-        <w:rPr>
-          <w:rFonts w:ascii="SimSun" w:eastAsia="SimSun" w:hAnsi="SimSun"/>
-          <w:sz w:val="24"/>
-          <w:szCs w:val="24"/>
-        </w:rPr>
-        <w:t>size = 1.1;</w:t>
-      </w:r>
-    </w:p>
-    <w:p>
-      <w:pPr>
-        <w:rPr>
-          <w:rFonts w:ascii="SimSun" w:eastAsia="SimSun" w:hAnsi="SimSun"/>
-          <w:sz w:val="24"/>
-          <w:szCs w:val="24"/>
-        </w:rPr>
-      </w:pPr>
-      <w:r>
-        <w:rPr>
-          <w:rFonts w:ascii="SimSun" w:eastAsia="SimSun" w:hAnsi="SimSun"/>
-          <w:sz w:val="24"/>
-          <w:szCs w:val="24"/>
-        </w:rPr>
-        <w:t>aspect_ratio = size.*[6,4];</w:t>
-      </w:r>
-    </w:p>
-    <w:p>
-      <w:pPr>
-        <w:rPr>
-          <w:rFonts w:ascii="SimSun" w:eastAsia="SimSun" w:hAnsi="SimSun"/>
-          <w:sz w:val="24"/>
-          <w:szCs w:val="24"/>
-        </w:rPr>
-      </w:pPr>
-    </w:p>
-    <w:p>
-      <w:pPr>
-        <w:rPr>
-          <w:rFonts w:ascii="SimSun" w:eastAsia="SimSun" w:hAnsi="SimSun"/>
-          <w:sz w:val="24"/>
-          <w:szCs w:val="24"/>
-        </w:rPr>
-      </w:pPr>
-      <w:r>
-        <w:rPr>
-          <w:rFonts w:ascii="SimSun" w:eastAsia="SimSun" w:hAnsi="SimSun"/>
-          <w:sz w:val="24"/>
-          <w:szCs w:val="24"/>
-        </w:rPr>
-        <w:t>figure('Name','dark noise','units','inches','position',[0 0 aspect_ratio(1) aspect_ratio(2)])</w:t>
-      </w:r>
-    </w:p>
-    <w:p>
-      <w:pPr>
-        <w:rPr>
-          <w:rFonts w:ascii="SimSun" w:eastAsia="SimSun" w:hAnsi="SimSun"/>
-          <w:sz w:val="24"/>
-          <w:szCs w:val="24"/>
-        </w:rPr>
-      </w:pPr>
-      <w:r>
-        <w:rPr>
-          <w:rFonts w:ascii="SimSun" w:eastAsia="SimSun" w:hAnsi="SimSun"/>
-          <w:sz w:val="24"/>
-          <w:szCs w:val="24"/>
-        </w:rPr>
-        <w:t>loglog(x1, y1, 'color',c(1,:))</w:t>
+        <w:pStyle w:val="ListParagraph"/>
+        <w:numPr>
+          <w:ilvl w:val="0"/>
+          <w:numId w:val="5"/>
+        </w:numPr>
+        <w:autoSpaceDE w:val="0"/>
+        <w:autoSpaceDN w:val="0"/>
+        <w:adjustRightInd w:val="0"/>
+        <w:spacing w:after="0" w:line="240" w:lineRule="auto"/>
+        <w:rPr>
+          <w:rFonts w:cstheme="minorHAnsi"/>
+          <w:sz w:val="24"/>
+          <w:szCs w:val="24"/>
+        </w:rPr>
+      </w:pPr>
+      <w:r>
+        <w:rPr>
+          <w:rFonts w:cstheme="minorHAnsi"/>
+          <w:color w:val="000000"/>
+          <w:sz w:val="24"/>
+          <w:szCs w:val="24"/>
+        </w:rPr>
+        <w:t xml:space="preserve">The font should be set to </w:t>
+      </w:r>
+      <w:proofErr w:type="spellStart"/>
+      <w:r>
+        <w:rPr>
+          <w:rFonts w:cstheme="minorHAnsi"/>
+          <w:color w:val="000000"/>
+          <w:sz w:val="24"/>
+          <w:szCs w:val="24"/>
+        </w:rPr>
+        <w:t>Deja</w:t>
+      </w:r>
+      <w:r>
+        <w:rPr>
+          <w:rFonts w:cstheme="minorHAnsi"/>
+          <w:color w:val="000000"/>
+          <w:sz w:val="24"/>
+          <w:szCs w:val="24"/>
+        </w:rPr>
+        <w:t>Vu</w:t>
+      </w:r>
+      <w:proofErr w:type="spellEnd"/>
+      <w:r>
+        <w:rPr>
+          <w:rFonts w:cstheme="minorHAnsi"/>
+          <w:color w:val="000000"/>
+          <w:sz w:val="24"/>
+          <w:szCs w:val="24"/>
+        </w:rPr>
+        <w:t xml:space="preserve"> Sans, do this with: </w:t>
+      </w:r>
+      <w:proofErr w:type="gramStart"/>
+      <w:r>
+        <w:rPr>
+          <w:rFonts w:cstheme="minorHAnsi"/>
+          <w:color w:val="000000"/>
+          <w:sz w:val="24"/>
+          <w:szCs w:val="24"/>
+        </w:rPr>
+        <w:t>set(</w:t>
+      </w:r>
+      <w:proofErr w:type="spellStart"/>
+      <w:proofErr w:type="gramEnd"/>
+      <w:r>
+        <w:rPr>
+          <w:rFonts w:cstheme="minorHAnsi"/>
+          <w:color w:val="000000"/>
+          <w:sz w:val="24"/>
+          <w:szCs w:val="24"/>
+        </w:rPr>
+        <w:t>gca</w:t>
+      </w:r>
+      <w:proofErr w:type="spellEnd"/>
+      <w:r>
+        <w:rPr>
+          <w:rFonts w:cstheme="minorHAnsi"/>
+          <w:color w:val="000000"/>
+          <w:sz w:val="24"/>
+          <w:szCs w:val="24"/>
+        </w:rPr>
+        <w:t>,</w:t>
+      </w:r>
+      <w:r>
+        <w:rPr>
+          <w:rFonts w:cstheme="minorHAnsi"/>
+          <w:sz w:val="24"/>
+          <w:szCs w:val="24"/>
+        </w:rPr>
+        <w:t>'</w:t>
+      </w:r>
+      <w:proofErr w:type="spellStart"/>
+      <w:r>
+        <w:rPr>
+          <w:rFonts w:cstheme="minorHAnsi"/>
+          <w:sz w:val="24"/>
+          <w:szCs w:val="24"/>
+        </w:rPr>
+        <w:t>fontname</w:t>
+      </w:r>
+      <w:proofErr w:type="spellEnd"/>
+      <w:r>
+        <w:rPr>
+          <w:rFonts w:cstheme="minorHAnsi"/>
+          <w:sz w:val="24"/>
+          <w:szCs w:val="24"/>
+        </w:rPr>
+        <w:t>','</w:t>
+      </w:r>
+      <w:proofErr w:type="spellStart"/>
+      <w:r>
+        <w:rPr>
+          <w:rFonts w:cstheme="minorHAnsi"/>
+          <w:sz w:val="24"/>
+          <w:szCs w:val="24"/>
+        </w:rPr>
+        <w:t>DejaVu</w:t>
+      </w:r>
+      <w:proofErr w:type="spellEnd"/>
+      <w:r>
+        <w:rPr>
+          <w:rFonts w:cstheme="minorHAnsi"/>
+          <w:sz w:val="24"/>
+          <w:szCs w:val="24"/>
+        </w:rPr>
+        <w:t xml:space="preserve"> Sans')</w:t>
+      </w:r>
+    </w:p>
+    <w:p>
+      <w:pPr>
+        <w:pStyle w:val="ListParagraph"/>
+        <w:numPr>
+          <w:ilvl w:val="0"/>
+          <w:numId w:val="5"/>
+        </w:numPr>
+        <w:rPr>
+          <w:sz w:val="24"/>
+          <w:szCs w:val="24"/>
+        </w:rPr>
+      </w:pPr>
+    </w:p>
+    <w:p>
+      <w:pPr>
+        <w:rPr>
+          <w:rFonts w:ascii="SimSun" w:eastAsia="SimSun" w:hAnsi="SimSun"/>
+          <w:sz w:val="24"/>
+          <w:szCs w:val="24"/>
+        </w:rPr>
+      </w:pPr>
+      <w:r>
+        <w:rPr>
+          <w:rFonts w:ascii="SimSun" w:eastAsia="SimSun" w:hAnsi="SimSun"/>
+          <w:sz w:val="24"/>
+          <w:szCs w:val="24"/>
+        </w:rPr>
+        <w:t xml:space="preserve">c = </w:t>
+      </w:r>
+      <w:proofErr w:type="spellStart"/>
+      <w:proofErr w:type="gramStart"/>
+      <w:r>
+        <w:rPr>
+          <w:rFonts w:ascii="SimSun" w:eastAsia="SimSun" w:hAnsi="SimSun"/>
+          <w:sz w:val="24"/>
+          <w:szCs w:val="24"/>
+        </w:rPr>
+        <w:t>linspecer</w:t>
+      </w:r>
+      <w:proofErr w:type="spellEnd"/>
+      <w:r>
+        <w:rPr>
+          <w:rFonts w:ascii="SimSun" w:eastAsia="SimSun" w:hAnsi="SimSun"/>
+          <w:sz w:val="24"/>
+          <w:szCs w:val="24"/>
+        </w:rPr>
+        <w:t>(</w:t>
+      </w:r>
+      <w:proofErr w:type="gramEnd"/>
+      <w:r>
+        <w:rPr>
+          <w:rFonts w:ascii="SimSun" w:eastAsia="SimSun" w:hAnsi="SimSun"/>
+          <w:sz w:val="24"/>
+          <w:szCs w:val="24"/>
+        </w:rPr>
+        <w:t>2);</w:t>
+      </w:r>
+    </w:p>
+    <w:p>
+      <w:pPr>
+        <w:rPr>
+          <w:rFonts w:ascii="SimSun" w:eastAsia="SimSun" w:hAnsi="SimSun"/>
+          <w:sz w:val="24"/>
+          <w:szCs w:val="24"/>
+        </w:rPr>
+      </w:pPr>
+      <w:r>
+        <w:rPr>
+          <w:rFonts w:ascii="SimSun" w:eastAsia="SimSun" w:hAnsi="SimSun"/>
+          <w:sz w:val="24"/>
+          <w:szCs w:val="24"/>
+        </w:rPr>
+        <w:t xml:space="preserve">size = </w:t>
+      </w:r>
+      <w:proofErr w:type="gramStart"/>
+      <w:r>
+        <w:rPr>
+          <w:rFonts w:ascii="SimSun" w:eastAsia="SimSun" w:hAnsi="SimSun"/>
+          <w:sz w:val="24"/>
+          <w:szCs w:val="24"/>
+        </w:rPr>
+        <w:t>1.1;</w:t>
+      </w:r>
+      <w:proofErr w:type="gramEnd"/>
+    </w:p>
+    <w:p>
+      <w:pPr>
+        <w:rPr>
+          <w:rFonts w:ascii="SimSun" w:eastAsia="SimSun" w:hAnsi="SimSun"/>
+          <w:sz w:val="24"/>
+          <w:szCs w:val="24"/>
+        </w:rPr>
+      </w:pPr>
+      <w:proofErr w:type="spellStart"/>
+      <w:r>
+        <w:rPr>
+          <w:rFonts w:ascii="SimSun" w:eastAsia="SimSun" w:hAnsi="SimSun"/>
+          <w:sz w:val="24"/>
+          <w:szCs w:val="24"/>
+        </w:rPr>
+        <w:t>aspect_ratio</w:t>
+      </w:r>
+      <w:proofErr w:type="spellEnd"/>
+      <w:r>
+        <w:rPr>
+          <w:rFonts w:ascii="SimSun" w:eastAsia="SimSun" w:hAnsi="SimSun"/>
+          <w:sz w:val="24"/>
+          <w:szCs w:val="24"/>
+        </w:rPr>
+        <w:t xml:space="preserve"> = </w:t>
+      </w:r>
+      <w:proofErr w:type="gramStart"/>
+      <w:r>
+        <w:rPr>
+          <w:rFonts w:ascii="SimSun" w:eastAsia="SimSun" w:hAnsi="SimSun"/>
+          <w:sz w:val="24"/>
+          <w:szCs w:val="24"/>
+        </w:rPr>
+        <w:t>size.*</w:t>
+      </w:r>
+      <w:proofErr w:type="gramEnd"/>
+      <w:r>
+        <w:rPr>
+          <w:rFonts w:ascii="SimSun" w:eastAsia="SimSun" w:hAnsi="SimSun"/>
+          <w:sz w:val="24"/>
+          <w:szCs w:val="24"/>
+        </w:rPr>
+        <w:t>[6,4];</w:t>
+      </w:r>
+    </w:p>
+    <w:p>
+      <w:pPr>
+        <w:rPr>
+          <w:rFonts w:ascii="SimSun" w:eastAsia="SimSun" w:hAnsi="SimSun"/>
+          <w:sz w:val="24"/>
+          <w:szCs w:val="24"/>
+        </w:rPr>
+      </w:pPr>
+    </w:p>
+    <w:p>
+      <w:pPr>
+        <w:rPr>
+          <w:rFonts w:ascii="SimSun" w:eastAsia="SimSun" w:hAnsi="SimSun"/>
+          <w:sz w:val="24"/>
+          <w:szCs w:val="24"/>
+        </w:rPr>
+      </w:pPr>
+      <w:proofErr w:type="gramStart"/>
+      <w:r>
+        <w:rPr>
+          <w:rFonts w:ascii="SimSun" w:eastAsia="SimSun" w:hAnsi="SimSun"/>
+          <w:sz w:val="24"/>
+          <w:szCs w:val="24"/>
+        </w:rPr>
+        <w:t>figure(</w:t>
+      </w:r>
+      <w:proofErr w:type="gramEnd"/>
+      <w:r>
+        <w:rPr>
+          <w:rFonts w:ascii="SimSun" w:eastAsia="SimSun" w:hAnsi="SimSun"/>
+          <w:sz w:val="24"/>
+          <w:szCs w:val="24"/>
+        </w:rPr>
+        <w:t>'</w:t>
+      </w:r>
+      <w:proofErr w:type="spellStart"/>
+      <w:r>
+        <w:rPr>
+          <w:rFonts w:ascii="SimSun" w:eastAsia="SimSun" w:hAnsi="SimSun"/>
+          <w:sz w:val="24"/>
+          <w:szCs w:val="24"/>
+        </w:rPr>
+        <w:t>Name','dark</w:t>
+      </w:r>
+      <w:proofErr w:type="spellEnd"/>
+      <w:r>
+        <w:rPr>
+          <w:rFonts w:ascii="SimSun" w:eastAsia="SimSun" w:hAnsi="SimSun"/>
+          <w:sz w:val="24"/>
+          <w:szCs w:val="24"/>
+        </w:rPr>
+        <w:t xml:space="preserve"> </w:t>
+      </w:r>
+      <w:proofErr w:type="spellStart"/>
+      <w:r>
+        <w:rPr>
+          <w:rFonts w:ascii="SimSun" w:eastAsia="SimSun" w:hAnsi="SimSun"/>
+          <w:sz w:val="24"/>
+          <w:szCs w:val="24"/>
+        </w:rPr>
+        <w:t>noise','units','inches','position</w:t>
+      </w:r>
+      <w:proofErr w:type="spellEnd"/>
+      <w:r>
+        <w:rPr>
+          <w:rFonts w:ascii="SimSun" w:eastAsia="SimSun" w:hAnsi="SimSun"/>
+          <w:sz w:val="24"/>
+          <w:szCs w:val="24"/>
+        </w:rPr>
+        <w:t xml:space="preserve">',[0 0 </w:t>
+      </w:r>
+      <w:proofErr w:type="spellStart"/>
+      <w:r>
+        <w:rPr>
+          <w:rFonts w:ascii="SimSun" w:eastAsia="SimSun" w:hAnsi="SimSun"/>
+          <w:sz w:val="24"/>
+          <w:szCs w:val="24"/>
+        </w:rPr>
+        <w:t>aspect_ratio</w:t>
+      </w:r>
+      <w:proofErr w:type="spellEnd"/>
+      <w:r>
+        <w:rPr>
+          <w:rFonts w:ascii="SimSun" w:eastAsia="SimSun" w:hAnsi="SimSun"/>
+          <w:sz w:val="24"/>
+          <w:szCs w:val="24"/>
+        </w:rPr>
+        <w:t xml:space="preserve">(1) </w:t>
+      </w:r>
+      <w:proofErr w:type="spellStart"/>
+      <w:r>
+        <w:rPr>
+          <w:rFonts w:ascii="SimSun" w:eastAsia="SimSun" w:hAnsi="SimSun"/>
+          <w:sz w:val="24"/>
+          <w:szCs w:val="24"/>
+        </w:rPr>
+        <w:t>aspect_ratio</w:t>
+      </w:r>
+      <w:proofErr w:type="spellEnd"/>
+      <w:r>
+        <w:rPr>
+          <w:rFonts w:ascii="SimSun" w:eastAsia="SimSun" w:hAnsi="SimSun"/>
+          <w:sz w:val="24"/>
+          <w:szCs w:val="24"/>
+        </w:rPr>
+        <w:t>(2)])</w:t>
+      </w:r>
+    </w:p>
+    <w:p>
+      <w:pPr>
+        <w:rPr>
+          <w:rFonts w:ascii="SimSun" w:eastAsia="SimSun" w:hAnsi="SimSun"/>
+          <w:sz w:val="24"/>
+          <w:szCs w:val="24"/>
+        </w:rPr>
+      </w:pPr>
+      <w:proofErr w:type="gramStart"/>
+      <w:r>
+        <w:rPr>
+          <w:rFonts w:ascii="SimSun" w:eastAsia="SimSun" w:hAnsi="SimSun"/>
+          <w:sz w:val="24"/>
+          <w:szCs w:val="24"/>
+        </w:rPr>
+        <w:t>loglog(</w:t>
+      </w:r>
+      <w:proofErr w:type="gramEnd"/>
+      <w:r>
+        <w:rPr>
+          <w:rFonts w:ascii="SimSun" w:eastAsia="SimSun" w:hAnsi="SimSun"/>
+          <w:sz w:val="24"/>
+          <w:szCs w:val="24"/>
+        </w:rPr>
+        <w:t>x1, y1, '</w:t>
+      </w:r>
+      <w:proofErr w:type="spellStart"/>
+      <w:r>
+        <w:rPr>
+          <w:rFonts w:ascii="SimSun" w:eastAsia="SimSun" w:hAnsi="SimSun"/>
+          <w:sz w:val="24"/>
+          <w:szCs w:val="24"/>
+        </w:rPr>
+        <w:t>color</w:t>
+      </w:r>
+      <w:proofErr w:type="spellEnd"/>
+      <w:r>
+        <w:rPr>
+          <w:rFonts w:ascii="SimSun" w:eastAsia="SimSun" w:hAnsi="SimSun"/>
+          <w:sz w:val="24"/>
+          <w:szCs w:val="24"/>
+        </w:rPr>
+        <w:t>',c(1,:))</w:t>
       </w:r>
     </w:p>
     <w:p>
@@ -1657,13 +2695,41 @@
           <w:szCs w:val="24"/>
         </w:rPr>
       </w:pPr>
-      <w:r>
-        <w:rPr>
-          <w:rFonts w:ascii="SimSun" w:eastAsia="SimSun" w:hAnsi="SimSun"/>
-          <w:sz w:val="24"/>
-          <w:szCs w:val="24"/>
-        </w:rPr>
-        <w:t>loglog(x2, y2, 'color',c(2,:))</w:t>
+      <w:proofErr w:type="gramStart"/>
+      <w:r>
+        <w:rPr>
+          <w:rFonts w:ascii="SimSun" w:eastAsia="SimSun" w:hAnsi="SimSun"/>
+          <w:sz w:val="24"/>
+          <w:szCs w:val="24"/>
+        </w:rPr>
+        <w:t>loglog(</w:t>
+      </w:r>
+      <w:proofErr w:type="gramEnd"/>
+      <w:r>
+        <w:rPr>
+          <w:rFonts w:ascii="SimSun" w:eastAsia="SimSun" w:hAnsi="SimSun"/>
+          <w:sz w:val="24"/>
+          <w:szCs w:val="24"/>
+        </w:rPr>
+        <w:t>x2, y2, '</w:t>
+      </w:r>
+      <w:proofErr w:type="spellStart"/>
+      <w:r>
+        <w:rPr>
+          <w:rFonts w:ascii="SimSun" w:eastAsia="SimSun" w:hAnsi="SimSun"/>
+          <w:sz w:val="24"/>
+          <w:szCs w:val="24"/>
+        </w:rPr>
+        <w:t>color</w:t>
+      </w:r>
+      <w:proofErr w:type="spellEnd"/>
+      <w:r>
+        <w:rPr>
+          <w:rFonts w:ascii="SimSun" w:eastAsia="SimSun" w:hAnsi="SimSun"/>
+          <w:sz w:val="24"/>
+          <w:szCs w:val="24"/>
+        </w:rPr>
+        <w:t>',c(2,:))</w:t>
       </w:r>
     </w:p>
     <w:p>
@@ -1708,30 +2774,189 @@
           <w:szCs w:val="24"/>
         </w:rPr>
       </w:pPr>
-      <w:r>
-        <w:rPr>
-          <w:rFonts w:ascii="SimSun" w:eastAsia="SimSun" w:hAnsi="SimSun"/>
-          <w:sz w:val="24"/>
-          <w:szCs w:val="24"/>
-        </w:rPr>
-        <w:t>xlabel('Frequency (Hz)')</w:t>
-      </w:r>
-    </w:p>
-    <w:p>
-      <w:pPr>
-        <w:rPr>
-          <w:rFonts w:ascii="SimSun" w:eastAsia="SimSun" w:hAnsi="SimSun"/>
-          <w:sz w:val="24"/>
-          <w:szCs w:val="24"/>
-        </w:rPr>
-      </w:pPr>
-      <w:r>
-        <w:rPr>
-          <w:rFonts w:ascii="SimSun" w:eastAsia="SimSun" w:hAnsi="SimSun"/>
-          <w:sz w:val="24"/>
-          <w:szCs w:val="24"/>
-        </w:rPr>
-        <w:t>ylabel('I_r_m_s/\surd(Hz)')</w:t>
+      <w:proofErr w:type="spellStart"/>
+      <w:proofErr w:type="gramStart"/>
+      <w:r>
+        <w:rPr>
+          <w:rFonts w:ascii="SimSun" w:eastAsia="SimSun" w:hAnsi="SimSun"/>
+          <w:sz w:val="24"/>
+          <w:szCs w:val="24"/>
+        </w:rPr>
+        <w:t>xlabel</w:t>
+      </w:r>
+      <w:proofErr w:type="spellEnd"/>
+      <w:r>
+        <w:rPr>
+          <w:rFonts w:ascii="SimSun" w:eastAsia="SimSun" w:hAnsi="SimSun"/>
+          <w:sz w:val="24"/>
+          <w:szCs w:val="24"/>
+        </w:rPr>
+        <w:t>(</w:t>
+      </w:r>
+      <w:proofErr w:type="gramEnd"/>
+      <w:r>
+        <w:rPr>
+          <w:rFonts w:ascii="SimSun" w:eastAsia="SimSun" w:hAnsi="SimSun"/>
+          <w:sz w:val="24"/>
+          <w:szCs w:val="24"/>
+        </w:rPr>
+        <w:t>'Frequency (Hz)')</w:t>
+      </w:r>
+    </w:p>
+    <w:p>
+      <w:pPr>
+        <w:rPr>
+          <w:rFonts w:ascii="SimSun" w:eastAsia="SimSun" w:hAnsi="SimSun"/>
+          <w:sz w:val="24"/>
+          <w:szCs w:val="24"/>
+        </w:rPr>
+      </w:pPr>
+      <w:proofErr w:type="spellStart"/>
+      <w:r>
+        <w:rPr>
+          <w:rFonts w:ascii="SimSun" w:eastAsia="SimSun" w:hAnsi="SimSun"/>
+          <w:sz w:val="24"/>
+          <w:szCs w:val="24"/>
+        </w:rPr>
+        <w:t>ylabel</w:t>
+      </w:r>
+      <w:proofErr w:type="spellEnd"/>
+      <w:r>
+        <w:rPr>
+          <w:rFonts w:ascii="SimSun" w:eastAsia="SimSun" w:hAnsi="SimSun"/>
+          <w:sz w:val="24"/>
+          <w:szCs w:val="24"/>
+        </w:rPr>
+        <w:t>('</w:t>
+      </w:r>
+      <w:proofErr w:type="spellStart"/>
+      <w:r>
+        <w:rPr>
+          <w:rFonts w:ascii="SimSun" w:eastAsia="SimSun" w:hAnsi="SimSun"/>
+          <w:sz w:val="24"/>
+          <w:szCs w:val="24"/>
+        </w:rPr>
+        <w:t>I_r_m_s</w:t>
+      </w:r>
+      <w:proofErr w:type="spellEnd"/>
+      <w:r>
+        <w:rPr>
+          <w:rFonts w:ascii="SimSun" w:eastAsia="SimSun" w:hAnsi="SimSun"/>
+          <w:sz w:val="24"/>
+          <w:szCs w:val="24"/>
+        </w:rPr>
+        <w:t>/\</w:t>
+      </w:r>
+      <w:proofErr w:type="gramStart"/>
+      <w:r>
+        <w:rPr>
+          <w:rFonts w:ascii="SimSun" w:eastAsia="SimSun" w:hAnsi="SimSun"/>
+          <w:sz w:val="24"/>
+          <w:szCs w:val="24"/>
+        </w:rPr>
+        <w:t>surd(</w:t>
+      </w:r>
+      <w:proofErr w:type="gramEnd"/>
+      <w:r>
+        <w:rPr>
+          <w:rFonts w:ascii="SimSun" w:eastAsia="SimSun" w:hAnsi="SimSun"/>
+          <w:sz w:val="24"/>
+          <w:szCs w:val="24"/>
+        </w:rPr>
+        <w:t>Hz)')</w:t>
+      </w:r>
+    </w:p>
+    <w:p>
+      <w:pPr>
+        <w:rPr>
+          <w:rFonts w:ascii="SimSun" w:eastAsia="SimSun" w:hAnsi="SimSun"/>
+          <w:sz w:val="24"/>
+          <w:szCs w:val="24"/>
+        </w:rPr>
+      </w:pPr>
+      <w:proofErr w:type="gramStart"/>
+      <w:r>
+        <w:rPr>
+          <w:rFonts w:ascii="SimSun" w:eastAsia="SimSun" w:hAnsi="SimSun" w:cs="Courier New"/>
+          <w:color w:val="000000"/>
+          <w:sz w:val="24"/>
+          <w:szCs w:val="24"/>
+        </w:rPr>
+        <w:t>set(</w:t>
+      </w:r>
+      <w:proofErr w:type="spellStart"/>
+      <w:proofErr w:type="gramEnd"/>
+      <w:r>
+        <w:rPr>
+          <w:rFonts w:ascii="SimSun" w:eastAsia="SimSun" w:hAnsi="SimSun" w:cs="Courier New"/>
+          <w:color w:val="000000"/>
+          <w:sz w:val="24"/>
+          <w:szCs w:val="24"/>
+        </w:rPr>
+        <w:t>gca</w:t>
+      </w:r>
+      <w:proofErr w:type="spellEnd"/>
+      <w:r>
+        <w:rPr>
+          <w:rFonts w:ascii="SimSun" w:eastAsia="SimSun" w:hAnsi="SimSun" w:cs="Courier New"/>
+          <w:color w:val="000000"/>
+          <w:sz w:val="24"/>
+          <w:szCs w:val="24"/>
+        </w:rPr>
+        <w:t>,</w:t>
+      </w:r>
+      <w:r>
+        <w:rPr>
+          <w:rFonts w:ascii="SimSun" w:eastAsia="SimSun" w:hAnsi="SimSun" w:cs="Courier New"/>
+          <w:sz w:val="24"/>
+          <w:szCs w:val="24"/>
+        </w:rPr>
+        <w:t>'</w:t>
+      </w:r>
+      <w:proofErr w:type="spellStart"/>
+      <w:r>
+        <w:rPr>
+          <w:rFonts w:ascii="SimSun" w:eastAsia="SimSun" w:hAnsi="SimSun" w:cs="Courier New"/>
+          <w:sz w:val="24"/>
+          <w:szCs w:val="24"/>
+        </w:rPr>
+        <w:t>fontname</w:t>
+      </w:r>
+      <w:proofErr w:type="spellEnd"/>
+      <w:r>
+        <w:rPr>
+          <w:rFonts w:ascii="SimSun" w:eastAsia="SimSun" w:hAnsi="SimSun" w:cs="Courier New"/>
+          <w:sz w:val="24"/>
+          <w:szCs w:val="24"/>
+        </w:rPr>
+        <w:t>','</w:t>
+      </w:r>
+      <w:proofErr w:type="spellStart"/>
+      <w:r>
+        <w:rPr>
+          <w:rFonts w:ascii="SimSun" w:eastAsia="SimSun" w:hAnsi="SimSun" w:cs="Courier New"/>
+          <w:sz w:val="24"/>
+          <w:szCs w:val="24"/>
+        </w:rPr>
+        <w:t>DejaVu</w:t>
+      </w:r>
+      <w:proofErr w:type="spellEnd"/>
+      <w:r>
+        <w:rPr>
+          <w:rFonts w:ascii="SimSun" w:eastAsia="SimSun" w:hAnsi="SimSun" w:cs="Courier New"/>
+          <w:sz w:val="24"/>
+          <w:szCs w:val="24"/>
+        </w:rPr>
+        <w:t xml:space="preserve"> Sans'</w:t>
+      </w:r>
+      <w:r>
+        <w:rPr>
+          <w:rFonts w:ascii="SimSun" w:eastAsia="SimSun" w:hAnsi="SimSun" w:cs="Courier New"/>
+          <w:color w:val="000000"/>
+          <w:sz w:val="24"/>
+          <w:szCs w:val="24"/>
+        </w:rPr>
+        <w:t>)</w:t>
       </w:r>
     </w:p>
     <w:p>
@@ -1782,7 +3007,25 @@
           <w:sz w:val="24"/>
           <w:szCs w:val="24"/>
         </w:rPr>
-        <w:t>print('Noise_low_f','-depsc')</w:t>
+        <w:t>print('Noise_low_f','-</w:t>
+      </w:r>
+      <w:proofErr w:type="spellStart"/>
+      <w:r>
+        <w:rPr>
+          <w:rFonts w:ascii="SimSun" w:eastAsia="SimSun" w:hAnsi="SimSun"/>
+          <w:sz w:val="24"/>
+          <w:szCs w:val="24"/>
+        </w:rPr>
+        <w:t>depsc</w:t>
+      </w:r>
+      <w:proofErr w:type="spellEnd"/>
+      <w:r>
+        <w:rPr>
+          <w:rFonts w:ascii="SimSun" w:eastAsia="SimSun" w:hAnsi="SimSun"/>
+          <w:sz w:val="24"/>
+          <w:szCs w:val="24"/>
+        </w:rPr>
+        <w:t>')</w:t>
       </w:r>
     </w:p>
     <w:p>
@@ -1848,7 +3091,6 @@
           <w:sz w:val="24"/>
           <w:szCs w:val="24"/>
         </w:rPr>
-        <w:lastRenderedPageBreak/>
         <w:t>decouple grounds for ease of reading.</w:t>
       </w:r>
     </w:p>
@@ -1889,7 +3131,23 @@
           <w:sz w:val="24"/>
           <w:szCs w:val="24"/>
         </w:rPr>
-        <w:t>have gnd at the bottom of the diagram.</w:t>
+        <w:t xml:space="preserve">have </w:t>
+      </w:r>
+      <w:proofErr w:type="spellStart"/>
+      <w:r>
+        <w:rPr>
+          <w:sz w:val="24"/>
+          <w:szCs w:val="24"/>
+        </w:rPr>
+        <w:t>gnd</w:t>
+      </w:r>
+      <w:proofErr w:type="spellEnd"/>
+      <w:r>
+        <w:rPr>
+          <w:sz w:val="24"/>
+          <w:szCs w:val="24"/>
+        </w:rPr>
+        <w:t xml:space="preserve"> at the bottom of the diagram.</w:t>
       </w:r>
     </w:p>
     <w:p>
@@ -2201,9 +3459,9 @@
     </w:lvl>
   </w:abstractNum>
   <w:abstractNum w:abstractNumId="2" w15:restartNumberingAfterBreak="0">
-    <w:nsid w:val="47AB2572"/>
+    <w:nsid w:val="3A686BDA"/>
     <w:multiLevelType w:val="hybridMultilevel"/>
-    <w:tmpl w:val="2124AB0C"/>
+    <w:tmpl w:val="D536F6DC"/>
     <w:lvl w:ilvl="0" w:tplc="08090001">
       <w:start w:val="1"/>
       <w:numFmt w:val="bullet"/>
@@ -2314,6 +3572,119 @@
     </w:lvl>
   </w:abstractNum>
   <w:abstractNum w:abstractNumId="3" w15:restartNumberingAfterBreak="0">
+    <w:nsid w:val="47AB2572"/>
+    <w:multiLevelType w:val="hybridMultilevel"/>
+    <w:tmpl w:val="2124AB0C"/>
+    <w:lvl w:ilvl="0" w:tplc="08090001">
+      <w:start w:val="1"/>
+      <w:numFmt w:val="bullet"/>
+      <w:lvlText w:val=""/>
+      <w:lvlJc w:val="left"/>
+      <w:pPr>
+        <w:ind w:left="720" w:hanging="360"/>
+      </w:pPr>
+      <w:rPr>
+        <w:rFonts w:ascii="Symbol" w:hAnsi="Symbol" w:hint="default"/>
+      </w:rPr>
+    </w:lvl>
+    <w:lvl w:ilvl="1" w:tplc="08090003" w:tentative="1">
+      <w:start w:val="1"/>
+      <w:numFmt w:val="bullet"/>
+      <w:lvlText w:val="o"/>
+      <w:lvlJc w:val="left"/>
+      <w:pPr>
+        <w:ind w:left="1440" w:hanging="360"/>
+      </w:pPr>
+      <w:rPr>
+        <w:rFonts w:ascii="Courier New" w:hAnsi="Courier New" w:cs="Courier New" w:hint="default"/>
+      </w:rPr>
+    </w:lvl>
+    <w:lvl w:ilvl="2" w:tplc="08090005" w:tentative="1">
+      <w:start w:val="1"/>
+      <w:numFmt w:val="bullet"/>
+      <w:lvlText w:val=""/>
+      <w:lvlJc w:val="left"/>
+      <w:pPr>
+        <w:ind w:left="2160" w:hanging="360"/>
+      </w:pPr>
+      <w:rPr>
+        <w:rFonts w:ascii="Wingdings" w:hAnsi="Wingdings" w:hint="default"/>
+      </w:rPr>
+    </w:lvl>
+    <w:lvl w:ilvl="3" w:tplc="08090001" w:tentative="1">
+      <w:start w:val="1"/>
+      <w:numFmt w:val="bullet"/>
+      <w:lvlText w:val=""/>
+      <w:lvlJc w:val="left"/>
+      <w:pPr>
+        <w:ind w:left="2880" w:hanging="360"/>
+      </w:pPr>
+      <w:rPr>
+        <w:rFonts w:ascii="Symbol" w:hAnsi="Symbol" w:hint="default"/>
+      </w:rPr>
+    </w:lvl>
+    <w:lvl w:ilvl="4" w:tplc="08090003" w:tentative="1">
+      <w:start w:val="1"/>
+      <w:numFmt w:val="bullet"/>
+      <w:lvlText w:val="o"/>
+      <w:lvlJc w:val="left"/>
+      <w:pPr>
+        <w:ind w:left="3600" w:hanging="360"/>
+      </w:pPr>
+      <w:rPr>
+        <w:rFonts w:ascii="Courier New" w:hAnsi="Courier New" w:cs="Courier New" w:hint="default"/>
+      </w:rPr>
+    </w:lvl>
+    <w:lvl w:ilvl="5" w:tplc="08090005" w:tentative="1">
+      <w:start w:val="1"/>
+      <w:numFmt w:val="bullet"/>
+      <w:lvlText w:val=""/>
+      <w:lvlJc w:val="left"/>
+      <w:pPr>
+        <w:ind w:left="4320" w:hanging="360"/>
+      </w:pPr>
+      <w:rPr>
+        <w:rFonts w:ascii="Wingdings" w:hAnsi="Wingdings" w:hint="default"/>
+      </w:rPr>
+    </w:lvl>
+    <w:lvl w:ilvl="6" w:tplc="08090001" w:tentative="1">
+      <w:start w:val="1"/>
+      <w:numFmt w:val="bullet"/>
+      <w:lvlText w:val=""/>
+      <w:lvlJc w:val="left"/>
+      <w:pPr>
+        <w:ind w:left="5040" w:hanging="360"/>
+      </w:pPr>
+      <w:rPr>
+        <w:rFonts w:ascii="Symbol" w:hAnsi="Symbol" w:hint="default"/>
+      </w:rPr>
+    </w:lvl>
+    <w:lvl w:ilvl="7" w:tplc="08090003" w:tentative="1">
+      <w:start w:val="1"/>
+      <w:numFmt w:val="bullet"/>
+      <w:lvlText w:val="o"/>
+      <w:lvlJc w:val="left"/>
+      <w:pPr>
+        <w:ind w:left="5760" w:hanging="360"/>
+      </w:pPr>
+      <w:rPr>
+        <w:rFonts w:ascii="Courier New" w:hAnsi="Courier New" w:cs="Courier New" w:hint="default"/>
+      </w:rPr>
+    </w:lvl>
+    <w:lvl w:ilvl="8" w:tplc="08090005" w:tentative="1">
+      <w:start w:val="1"/>
+      <w:numFmt w:val="bullet"/>
+      <w:lvlText w:val=""/>
+      <w:lvlJc w:val="left"/>
+      <w:pPr>
+        <w:ind w:left="6480" w:hanging="360"/>
+      </w:pPr>
+      <w:rPr>
+        <w:rFonts w:ascii="Wingdings" w:hAnsi="Wingdings" w:hint="default"/>
+      </w:rPr>
+    </w:lvl>
+  </w:abstractNum>
+  <w:abstractNum w:abstractNumId="4" w15:restartNumberingAfterBreak="0">
     <w:nsid w:val="6E25443C"/>
     <w:multiLevelType w:val="hybridMultilevel"/>
     <w:tmpl w:val="17463BD8"/>
@@ -2430,13 +3801,16 @@
     <w:abstractNumId w:val="0"/>
   </w:num>
   <w:num w:numId="2">
-    <w:abstractNumId w:val="3"/>
+    <w:abstractNumId w:val="4"/>
   </w:num>
   <w:num w:numId="3">
-    <w:abstractNumId w:val="2"/>
+    <w:abstractNumId w:val="3"/>
   </w:num>
   <w:num w:numId="4">
     <w:abstractNumId w:val="1"/>
+  </w:num>
+  <w:num w:numId="5">
+    <w:abstractNumId w:val="2"/>
   </w:num>
 </w:numbering>
 </file>

</xml_diff>

<commit_message>
Updated figures for BHD chapter
</commit_message>
<xml_diff>
--- a/Structuring.docx
+++ b/Structuring.docx
@@ -533,7 +533,7 @@
     </w:p>
     <w:p>
       <w:pPr>
-        <w:ind w:left="720"/>
+        <w:pStyle w:val="ListParagraph"/>
         <w:rPr>
           <w:rFonts w:cstheme="minorHAnsi"/>
           <w:b/>
@@ -746,14 +746,6 @@
     <w:p>
       <w:pPr>
         <w:rPr>
-          <w:sz w:val="24"/>
-          <w:szCs w:val="24"/>
-        </w:rPr>
-      </w:pPr>
-    </w:p>
-    <w:p>
-      <w:pPr>
-        <w:rPr>
           <w:rFonts w:asciiTheme="majorHAnsi" w:hAnsiTheme="majorHAnsi"/>
           <w:b/>
           <w:bCs/>
@@ -769,7 +761,7 @@
           <w:sz w:val="32"/>
           <w:szCs w:val="32"/>
         </w:rPr>
-        <w:t xml:space="preserve">Presentation of </w:t>
+        <w:t>Fourth</w:t>
       </w:r>
       <w:r>
         <w:rPr>
@@ -779,6 +771,323 @@
           <w:sz w:val="32"/>
           <w:szCs w:val="32"/>
         </w:rPr>
+        <w:t xml:space="preserve"> level Editing</w:t>
+      </w:r>
+    </w:p>
+    <w:p>
+      <w:pPr>
+        <w:pStyle w:val="ListParagraph"/>
+        <w:numPr>
+          <w:ilvl w:val="0"/>
+          <w:numId w:val="7"/>
+        </w:numPr>
+        <w:rPr>
+          <w:rFonts w:cstheme="minorHAnsi"/>
+          <w:sz w:val="24"/>
+          <w:szCs w:val="24"/>
+        </w:rPr>
+      </w:pPr>
+      <w:r>
+        <w:rPr>
+          <w:rFonts w:cstheme="minorHAnsi"/>
+          <w:sz w:val="24"/>
+          <w:szCs w:val="24"/>
+        </w:rPr>
+        <w:t>Comma rules:</w:t>
+      </w:r>
+    </w:p>
+    <w:p>
+      <w:pPr>
+        <w:pStyle w:val="ListParagraph"/>
+        <w:numPr>
+          <w:ilvl w:val="0"/>
+          <w:numId w:val="7"/>
+        </w:numPr>
+        <w:rPr>
+          <w:rFonts w:cstheme="minorHAnsi"/>
+          <w:sz w:val="24"/>
+          <w:szCs w:val="24"/>
+        </w:rPr>
+      </w:pPr>
+      <w:r>
+        <w:rPr>
+          <w:rFonts w:cstheme="minorHAnsi"/>
+          <w:sz w:val="24"/>
+          <w:szCs w:val="24"/>
+        </w:rPr>
+        <w:t>Passive voice, except where necessary.</w:t>
+      </w:r>
+    </w:p>
+    <w:p>
+      <w:pPr>
+        <w:rPr>
+          <w:rFonts w:asciiTheme="majorHAnsi" w:hAnsiTheme="majorHAnsi"/>
+          <w:b/>
+          <w:bCs/>
+          <w:sz w:val="32"/>
+          <w:szCs w:val="32"/>
+        </w:rPr>
+      </w:pPr>
+      <w:r>
+        <w:rPr>
+          <w:rFonts w:asciiTheme="majorHAnsi" w:hAnsiTheme="majorHAnsi"/>
+          <w:b/>
+          <w:bCs/>
+          <w:sz w:val="32"/>
+          <w:szCs w:val="32"/>
+        </w:rPr>
+        <w:t>Fifth level Editing</w:t>
+      </w:r>
+    </w:p>
+    <w:p>
+      <w:pPr>
+        <w:pStyle w:val="ListParagraph"/>
+        <w:numPr>
+          <w:ilvl w:val="0"/>
+          <w:numId w:val="6"/>
+        </w:numPr>
+        <w:rPr>
+          <w:sz w:val="24"/>
+          <w:szCs w:val="24"/>
+        </w:rPr>
+      </w:pPr>
+      <w:proofErr w:type="spellStart"/>
+      <w:r>
+        <w:rPr>
+          <w:sz w:val="24"/>
+          <w:szCs w:val="24"/>
+        </w:rPr>
+        <w:lastRenderedPageBreak/>
+        <w:t>Ctrl+f</w:t>
+      </w:r>
+      <w:proofErr w:type="spellEnd"/>
+      <w:r>
+        <w:rPr>
+          <w:sz w:val="24"/>
+          <w:szCs w:val="24"/>
+        </w:rPr>
+        <w:t xml:space="preserve"> 1, 2, 3, 4, 5, 6, 7, 8, 9 and 10, replace with one, two, three …</w:t>
+      </w:r>
+    </w:p>
+    <w:p>
+      <w:pPr>
+        <w:pStyle w:val="ListParagraph"/>
+        <w:numPr>
+          <w:ilvl w:val="0"/>
+          <w:numId w:val="6"/>
+        </w:numPr>
+        <w:rPr>
+          <w:sz w:val="24"/>
+          <w:szCs w:val="24"/>
+        </w:rPr>
+      </w:pPr>
+      <w:proofErr w:type="spellStart"/>
+      <w:r>
+        <w:rPr>
+          <w:sz w:val="24"/>
+          <w:szCs w:val="24"/>
+        </w:rPr>
+        <w:t>Ctrl+f</w:t>
+      </w:r>
+      <w:proofErr w:type="spellEnd"/>
+      <w:r>
+        <w:rPr>
+          <w:sz w:val="24"/>
+          <w:szCs w:val="24"/>
+        </w:rPr>
+        <w:t xml:space="preserve"> there, </w:t>
+      </w:r>
+      <w:proofErr w:type="gramStart"/>
+      <w:r>
+        <w:rPr>
+          <w:sz w:val="24"/>
+          <w:szCs w:val="24"/>
+        </w:rPr>
+        <w:t>they’re</w:t>
+      </w:r>
+      <w:proofErr w:type="gramEnd"/>
+      <w:r>
+        <w:rPr>
+          <w:sz w:val="24"/>
+          <w:szCs w:val="24"/>
+        </w:rPr>
+        <w:t xml:space="preserve">, </w:t>
+      </w:r>
+      <w:proofErr w:type="spellStart"/>
+      <w:r>
+        <w:rPr>
+          <w:sz w:val="24"/>
+          <w:szCs w:val="24"/>
+        </w:rPr>
+        <w:t>their</w:t>
+      </w:r>
+      <w:proofErr w:type="spellEnd"/>
+      <w:r>
+        <w:rPr>
+          <w:sz w:val="24"/>
+          <w:szCs w:val="24"/>
+        </w:rPr>
+        <w:t xml:space="preserve"> and check it’s the right one</w:t>
+      </w:r>
+    </w:p>
+    <w:p>
+      <w:pPr>
+        <w:pStyle w:val="ListParagraph"/>
+        <w:numPr>
+          <w:ilvl w:val="0"/>
+          <w:numId w:val="6"/>
+        </w:numPr>
+        <w:rPr>
+          <w:sz w:val="24"/>
+          <w:szCs w:val="24"/>
+        </w:rPr>
+      </w:pPr>
+      <w:proofErr w:type="spellStart"/>
+      <w:r>
+        <w:rPr>
+          <w:sz w:val="24"/>
+          <w:szCs w:val="24"/>
+        </w:rPr>
+        <w:t>Ctrl+f</w:t>
+      </w:r>
+      <w:proofErr w:type="spellEnd"/>
+      <w:r>
+        <w:rPr>
+          <w:sz w:val="24"/>
+          <w:szCs w:val="24"/>
+        </w:rPr>
+        <w:t xml:space="preserve"> effect and affect</w:t>
+      </w:r>
+    </w:p>
+    <w:p>
+      <w:pPr>
+        <w:pStyle w:val="ListParagraph"/>
+        <w:numPr>
+          <w:ilvl w:val="0"/>
+          <w:numId w:val="6"/>
+        </w:numPr>
+        <w:rPr>
+          <w:sz w:val="24"/>
+          <w:szCs w:val="24"/>
+        </w:rPr>
+      </w:pPr>
+      <w:proofErr w:type="spellStart"/>
+      <w:r>
+        <w:rPr>
+          <w:sz w:val="24"/>
+          <w:szCs w:val="24"/>
+        </w:rPr>
+        <w:t>Ctrl+f</w:t>
+      </w:r>
+      <w:proofErr w:type="spellEnd"/>
+      <w:r>
+        <w:rPr>
+          <w:sz w:val="24"/>
+          <w:szCs w:val="24"/>
+        </w:rPr>
+        <w:t xml:space="preserve"> </w:t>
+      </w:r>
+      <w:r>
+        <w:rPr>
+          <w:sz w:val="24"/>
+          <w:szCs w:val="24"/>
+        </w:rPr>
+        <w:t xml:space="preserve">the </w:t>
+      </w:r>
+      <w:proofErr w:type="spellStart"/>
+      <w:r>
+        <w:rPr>
+          <w:sz w:val="24"/>
+          <w:szCs w:val="24"/>
+        </w:rPr>
+        <w:t>the</w:t>
+      </w:r>
+      <w:proofErr w:type="spellEnd"/>
+    </w:p>
+    <w:p>
+      <w:pPr>
+        <w:pStyle w:val="ListParagraph"/>
+        <w:numPr>
+          <w:ilvl w:val="0"/>
+          <w:numId w:val="6"/>
+        </w:numPr>
+        <w:rPr>
+          <w:sz w:val="24"/>
+          <w:szCs w:val="24"/>
+        </w:rPr>
+      </w:pPr>
+      <w:r>
+        <w:rPr>
+          <w:sz w:val="24"/>
+          <w:szCs w:val="24"/>
+        </w:rPr>
+        <w:t xml:space="preserve">Look for etc. </w:t>
+      </w:r>
+      <w:proofErr w:type="gramStart"/>
+      <w:r>
+        <w:rPr>
+          <w:sz w:val="24"/>
+          <w:szCs w:val="24"/>
+        </w:rPr>
+        <w:t>and etc.</w:t>
+      </w:r>
+      <w:proofErr w:type="gramEnd"/>
+      <w:r>
+        <w:rPr>
+          <w:sz w:val="24"/>
+          <w:szCs w:val="24"/>
+        </w:rPr>
+        <w:t>~</w:t>
+      </w:r>
+    </w:p>
+    <w:p>
+      <w:pPr>
+        <w:pStyle w:val="ListParagraph"/>
+        <w:numPr>
+          <w:ilvl w:val="0"/>
+          <w:numId w:val="6"/>
+        </w:numPr>
+        <w:rPr>
+          <w:sz w:val="24"/>
+          <w:szCs w:val="24"/>
+        </w:rPr>
+      </w:pPr>
+      <w:r>
+        <w:rPr>
+          <w:sz w:val="24"/>
+          <w:szCs w:val="24"/>
+        </w:rPr>
+        <w:t>Check `` quote marks.</w:t>
+      </w:r>
+    </w:p>
+    <w:p>
+      <w:pPr>
+        <w:rPr>
+          <w:rFonts w:asciiTheme="majorHAnsi" w:hAnsiTheme="majorHAnsi"/>
+          <w:b/>
+          <w:bCs/>
+          <w:sz w:val="32"/>
+          <w:szCs w:val="32"/>
+        </w:rPr>
+      </w:pPr>
+      <w:r>
+        <w:rPr>
+          <w:rFonts w:asciiTheme="majorHAnsi" w:hAnsiTheme="majorHAnsi"/>
+          <w:b/>
+          <w:bCs/>
+          <w:sz w:val="32"/>
+          <w:szCs w:val="32"/>
+        </w:rPr>
+        <w:t xml:space="preserve">Presentation of </w:t>
+      </w:r>
+      <w:r>
+        <w:rPr>
+          <w:rFonts w:asciiTheme="majorHAnsi" w:hAnsiTheme="majorHAnsi"/>
+          <w:b/>
+          <w:bCs/>
+          <w:sz w:val="32"/>
+          <w:szCs w:val="32"/>
+        </w:rPr>
         <w:t>Graphs</w:t>
       </w:r>
     </w:p>
@@ -851,8 +1160,21 @@
           <w:sz w:val="24"/>
           <w:szCs w:val="24"/>
         </w:rPr>
-        <w:lastRenderedPageBreak/>
-        <w:t>Figures will have their width in Latex set to 0.95\linewidth.</w:t>
+        <w:t xml:space="preserve">Figures will have their width in Latex set to </w:t>
+      </w:r>
+      <w:r>
+        <w:rPr>
+          <w:sz w:val="24"/>
+          <w:szCs w:val="24"/>
+        </w:rPr>
+        <w:t>1</w:t>
+      </w:r>
+      <w:r>
+        <w:rPr>
+          <w:sz w:val="24"/>
+          <w:szCs w:val="24"/>
+        </w:rPr>
+        <w:t>\linewidth.</w:t>
       </w:r>
     </w:p>
     <w:p>
@@ -1399,7 +1721,21 @@
           <w:sz w:val="24"/>
           <w:szCs w:val="24"/>
         </w:rPr>
-        <w:t>Figure ratios will be (6,4) for single plots, (6,6) for ‘Bode type’ plots</w:t>
+        <w:t>Figure ratios will be (6,</w:t>
+      </w:r>
+      <w:r>
+        <w:rPr>
+          <w:sz w:val="24"/>
+          <w:szCs w:val="24"/>
+        </w:rPr>
+        <w:t>3.5</w:t>
+      </w:r>
+      <w:r>
+        <w:rPr>
+          <w:sz w:val="24"/>
+          <w:szCs w:val="24"/>
+        </w:rPr>
+        <w:t>) for single plots, (6,6) for ‘Bode type’ plots</w:t>
       </w:r>
       <w:r>
         <w:rPr>
@@ -1538,6 +1874,7 @@
           <w:sz w:val="24"/>
           <w:szCs w:val="24"/>
         </w:rPr>
+        <w:lastRenderedPageBreak/>
         <w:t>In general, for matplotlib figures use</w:t>
       </w:r>
       <w:r>
@@ -1575,14 +1912,56 @@
           <w:sz w:val="24"/>
           <w:szCs w:val="24"/>
         </w:rPr>
-        <w:t xml:space="preserve"> = 10 on axis</w:t>
-      </w:r>
-      <w:r>
-        <w:rPr>
-          <w:sz w:val="24"/>
-          <w:szCs w:val="24"/>
-        </w:rPr>
-        <w:t xml:space="preserve"> and legend. If the legend looks too big, try splitting it into multiple columns. If this </w:t>
+        <w:t xml:space="preserve"> = </w:t>
+      </w:r>
+      <w:r>
+        <w:rPr>
+          <w:sz w:val="24"/>
+          <w:szCs w:val="24"/>
+        </w:rPr>
+        <w:t>11.5</w:t>
+      </w:r>
+      <w:r>
+        <w:rPr>
+          <w:sz w:val="24"/>
+          <w:szCs w:val="24"/>
+        </w:rPr>
+        <w:t xml:space="preserve"> on axis</w:t>
+      </w:r>
+      <w:r>
+        <w:rPr>
+          <w:sz w:val="24"/>
+          <w:szCs w:val="24"/>
+        </w:rPr>
+        <w:t xml:space="preserve">.  Font size set to </w:t>
+      </w:r>
+      <w:r>
+        <w:rPr>
+          <w:sz w:val="24"/>
+          <w:szCs w:val="24"/>
+        </w:rPr>
+        <w:t>10</w:t>
+      </w:r>
+      <w:r>
+        <w:rPr>
+          <w:sz w:val="24"/>
+          <w:szCs w:val="24"/>
+        </w:rPr>
+        <w:t xml:space="preserve"> in the legend</w:t>
+      </w:r>
+      <w:r>
+        <w:rPr>
+          <w:sz w:val="24"/>
+          <w:szCs w:val="24"/>
+        </w:rPr>
+        <w:t>. Axis set to default</w:t>
+      </w:r>
+      <w:r>
+        <w:rPr>
+          <w:sz w:val="24"/>
+          <w:szCs w:val="24"/>
+        </w:rPr>
+        <w:t xml:space="preserve">. If the legend looks too big, try splitting it into multiple columns. If this </w:t>
       </w:r>
       <w:proofErr w:type="gramStart"/>
       <w:r>
@@ -1635,7 +2014,21 @@
           <w:sz w:val="24"/>
           <w:szCs w:val="24"/>
         </w:rPr>
-        <w:t xml:space="preserve"> 8 for</w:t>
+        <w:t xml:space="preserve"> </w:t>
+      </w:r>
+      <w:r>
+        <w:rPr>
+          <w:sz w:val="24"/>
+          <w:szCs w:val="24"/>
+        </w:rPr>
+        <w:t>10 or 8</w:t>
+      </w:r>
+      <w:r>
+        <w:rPr>
+          <w:sz w:val="24"/>
+          <w:szCs w:val="24"/>
+        </w:rPr>
+        <w:t xml:space="preserve"> for</w:t>
       </w:r>
       <w:r>
         <w:rPr>
@@ -1691,7 +2084,23 @@
           <w:sz w:val="24"/>
           <w:szCs w:val="24"/>
         </w:rPr>
-        <w:t xml:space="preserve"> = (6,4)</w:t>
+        <w:t xml:space="preserve"> = (6,</w:t>
+      </w:r>
+      <w:r>
+        <w:rPr>
+          <w:rFonts w:ascii="SimSun" w:eastAsia="SimSun" w:hAnsi="SimSun"/>
+          <w:sz w:val="24"/>
+          <w:szCs w:val="24"/>
+        </w:rPr>
+        <w:t>3.5</w:t>
+      </w:r>
+      <w:r>
+        <w:rPr>
+          <w:rFonts w:ascii="SimSun" w:eastAsia="SimSun" w:hAnsi="SimSun"/>
+          <w:sz w:val="24"/>
+          <w:szCs w:val="24"/>
+        </w:rPr>
+        <w:t>)</w:t>
       </w:r>
     </w:p>
     <w:p>
@@ -1838,7 +2247,6 @@
           <w:sz w:val="24"/>
           <w:szCs w:val="24"/>
         </w:rPr>
-        <w:lastRenderedPageBreak/>
         <w:t>plt.legend</w:t>
       </w:r>
       <w:proofErr w:type="spellEnd"/>
@@ -1925,7 +2333,15 @@
           <w:sz w:val="24"/>
           <w:szCs w:val="24"/>
         </w:rPr>
-        <w:t xml:space="preserve"> = 10</w:t>
+        <w:t xml:space="preserve"> = 1</w:t>
+      </w:r>
+      <w:r>
+        <w:rPr>
+          <w:rFonts w:ascii="SimSun" w:eastAsia="SimSun" w:hAnsi="SimSun"/>
+          <w:sz w:val="24"/>
+          <w:szCs w:val="24"/>
+        </w:rPr>
+        <w:t>2</w:t>
       </w:r>
       <w:r>
         <w:rPr>
@@ -1991,7 +2407,15 @@
           <w:sz w:val="24"/>
           <w:szCs w:val="24"/>
         </w:rPr>
-        <w:t xml:space="preserve"> = 10</w:t>
+        <w:t xml:space="preserve"> = 1</w:t>
+      </w:r>
+      <w:r>
+        <w:rPr>
+          <w:rFonts w:ascii="SimSun" w:eastAsia="SimSun" w:hAnsi="SimSun"/>
+          <w:sz w:val="24"/>
+          <w:szCs w:val="24"/>
+        </w:rPr>
+        <w:t>2</w:t>
       </w:r>
       <w:r>
         <w:rPr>
@@ -2893,7 +3317,6 @@
           <w:sz w:val="24"/>
           <w:szCs w:val="24"/>
         </w:rPr>
-        <w:lastRenderedPageBreak/>
         <w:t>xlabel</w:t>
       </w:r>
       <w:proofErr w:type="spellEnd"/>
@@ -3343,6 +3766,119 @@
 <file path=word/numbering.xml><?xml version="1.0" encoding="utf-8"?>
 <w:numbering xmlns:wpc="http://schemas.microsoft.com/office/word/2010/wordprocessingCanvas" xmlns:cx="http://schemas.microsoft.com/office/drawing/2014/chartex" xmlns:cx1="http://schemas.microsoft.com/office/drawing/2015/9/8/chartex" xmlns:cx2="http://schemas.microsoft.com/office/drawing/2015/10/21/chartex" xmlns:cx3="http://schemas.microsoft.com/office/drawing/2016/5/9/chartex" xmlns:cx4="http://schemas.microsoft.com/office/drawing/2016/5/10/chartex" xmlns:cx5="http://schemas.microsoft.com/office/drawing/2016/5/11/chartex" xmlns:cx6="http://schemas.microsoft.com/office/drawing/2016/5/12/chartex" xmlns:cx7="http://schemas.microsoft.com/office/drawing/2016/5/13/chartex" xmlns:cx8="http://schemas.microsoft.com/office/drawing/2016/5/14/chartex" xmlns:mc="http://schemas.openxmlformats.org/markup-compatibility/2006" xmlns:aink="http://schemas.microsoft.com/office/drawing/2016/ink" xmlns:am3d="http://schemas.microsoft.com/office/drawing/2017/model3d" xmlns:o="urn:schemas-microsoft-com:office:office" xmlns:r="http://schemas.openxmlformats.org/officeDocument/2006/relationships" xmlns:m="http://schemas.openxmlformats.org/officeDocument/2006/math" xmlns:v="urn:schemas-microsoft-com:vml" xmlns:wp14="http://schemas.microsoft.com/office/word/2010/wordprocessingDrawing" xmlns:wp="http://schemas.openxmlformats.org/drawingml/2006/wordprocessingDrawing" xmlns:w10="urn:schemas-microsoft-com:office:word" xmlns:w="http://schemas.openxmlformats.org/wordprocessingml/2006/main" xmlns:w14="http://schemas.microsoft.com/office/word/2010/wordml" xmlns:w15="http://schemas.microsoft.com/office/word/2012/wordml" xmlns:w16cex="http://schemas.microsoft.com/office/word/2018/wordml/cex" xmlns:w16cid="http://schemas.microsoft.com/office/word/2016/wordml/cid" xmlns:w16="http://schemas.microsoft.com/office/word/2018/wordml" xmlns:w16se="http://schemas.microsoft.com/office/word/2015/wordml/symex" xmlns:wpg="http://schemas.microsoft.com/office/word/2010/wordprocessingGroup" xmlns:wpi="http://schemas.microsoft.com/office/word/2010/wordprocessingInk" xmlns:wne="http://schemas.microsoft.com/office/word/2006/wordml" xmlns:wps="http://schemas.microsoft.com/office/word/2010/wordprocessingShape" mc:Ignorable="w14 w15 w16se w16cid w16 w16cex wp14">
   <w:abstractNum w:abstractNumId="0" w15:restartNumberingAfterBreak="0">
+    <w:nsid w:val="26606CF0"/>
+    <w:multiLevelType w:val="hybridMultilevel"/>
+    <w:tmpl w:val="239A0F60"/>
+    <w:lvl w:ilvl="0" w:tplc="08090001">
+      <w:start w:val="1"/>
+      <w:numFmt w:val="bullet"/>
+      <w:lvlText w:val=""/>
+      <w:lvlJc w:val="left"/>
+      <w:pPr>
+        <w:ind w:left="720" w:hanging="360"/>
+      </w:pPr>
+      <w:rPr>
+        <w:rFonts w:ascii="Symbol" w:hAnsi="Symbol" w:hint="default"/>
+      </w:rPr>
+    </w:lvl>
+    <w:lvl w:ilvl="1" w:tplc="08090003" w:tentative="1">
+      <w:start w:val="1"/>
+      <w:numFmt w:val="bullet"/>
+      <w:lvlText w:val="o"/>
+      <w:lvlJc w:val="left"/>
+      <w:pPr>
+        <w:ind w:left="1440" w:hanging="360"/>
+      </w:pPr>
+      <w:rPr>
+        <w:rFonts w:ascii="Courier New" w:hAnsi="Courier New" w:cs="Courier New" w:hint="default"/>
+      </w:rPr>
+    </w:lvl>
+    <w:lvl w:ilvl="2" w:tplc="08090005" w:tentative="1">
+      <w:start w:val="1"/>
+      <w:numFmt w:val="bullet"/>
+      <w:lvlText w:val=""/>
+      <w:lvlJc w:val="left"/>
+      <w:pPr>
+        <w:ind w:left="2160" w:hanging="360"/>
+      </w:pPr>
+      <w:rPr>
+        <w:rFonts w:ascii="Wingdings" w:hAnsi="Wingdings" w:hint="default"/>
+      </w:rPr>
+    </w:lvl>
+    <w:lvl w:ilvl="3" w:tplc="08090001" w:tentative="1">
+      <w:start w:val="1"/>
+      <w:numFmt w:val="bullet"/>
+      <w:lvlText w:val=""/>
+      <w:lvlJc w:val="left"/>
+      <w:pPr>
+        <w:ind w:left="2880" w:hanging="360"/>
+      </w:pPr>
+      <w:rPr>
+        <w:rFonts w:ascii="Symbol" w:hAnsi="Symbol" w:hint="default"/>
+      </w:rPr>
+    </w:lvl>
+    <w:lvl w:ilvl="4" w:tplc="08090003" w:tentative="1">
+      <w:start w:val="1"/>
+      <w:numFmt w:val="bullet"/>
+      <w:lvlText w:val="o"/>
+      <w:lvlJc w:val="left"/>
+      <w:pPr>
+        <w:ind w:left="3600" w:hanging="360"/>
+      </w:pPr>
+      <w:rPr>
+        <w:rFonts w:ascii="Courier New" w:hAnsi="Courier New" w:cs="Courier New" w:hint="default"/>
+      </w:rPr>
+    </w:lvl>
+    <w:lvl w:ilvl="5" w:tplc="08090005" w:tentative="1">
+      <w:start w:val="1"/>
+      <w:numFmt w:val="bullet"/>
+      <w:lvlText w:val=""/>
+      <w:lvlJc w:val="left"/>
+      <w:pPr>
+        <w:ind w:left="4320" w:hanging="360"/>
+      </w:pPr>
+      <w:rPr>
+        <w:rFonts w:ascii="Wingdings" w:hAnsi="Wingdings" w:hint="default"/>
+      </w:rPr>
+    </w:lvl>
+    <w:lvl w:ilvl="6" w:tplc="08090001" w:tentative="1">
+      <w:start w:val="1"/>
+      <w:numFmt w:val="bullet"/>
+      <w:lvlText w:val=""/>
+      <w:lvlJc w:val="left"/>
+      <w:pPr>
+        <w:ind w:left="5040" w:hanging="360"/>
+      </w:pPr>
+      <w:rPr>
+        <w:rFonts w:ascii="Symbol" w:hAnsi="Symbol" w:hint="default"/>
+      </w:rPr>
+    </w:lvl>
+    <w:lvl w:ilvl="7" w:tplc="08090003" w:tentative="1">
+      <w:start w:val="1"/>
+      <w:numFmt w:val="bullet"/>
+      <w:lvlText w:val="o"/>
+      <w:lvlJc w:val="left"/>
+      <w:pPr>
+        <w:ind w:left="5760" w:hanging="360"/>
+      </w:pPr>
+      <w:rPr>
+        <w:rFonts w:ascii="Courier New" w:hAnsi="Courier New" w:cs="Courier New" w:hint="default"/>
+      </w:rPr>
+    </w:lvl>
+    <w:lvl w:ilvl="8" w:tplc="08090005" w:tentative="1">
+      <w:start w:val="1"/>
+      <w:numFmt w:val="bullet"/>
+      <w:lvlText w:val=""/>
+      <w:lvlJc w:val="left"/>
+      <w:pPr>
+        <w:ind w:left="6480" w:hanging="360"/>
+      </w:pPr>
+      <w:rPr>
+        <w:rFonts w:ascii="Wingdings" w:hAnsi="Wingdings" w:hint="default"/>
+      </w:rPr>
+    </w:lvl>
+  </w:abstractNum>
+  <w:abstractNum w:abstractNumId="1" w15:restartNumberingAfterBreak="0">
     <w:nsid w:val="28797360"/>
     <w:multiLevelType w:val="hybridMultilevel"/>
     <w:tmpl w:val="CFE05850"/>
@@ -3455,7 +3991,7 @@
       </w:rPr>
     </w:lvl>
   </w:abstractNum>
-  <w:abstractNum w:abstractNumId="1" w15:restartNumberingAfterBreak="0">
+  <w:abstractNum w:abstractNumId="2" w15:restartNumberingAfterBreak="0">
     <w:nsid w:val="38380739"/>
     <w:multiLevelType w:val="hybridMultilevel"/>
     <w:tmpl w:val="CBBA359A"/>
@@ -3570,7 +4106,7 @@
       </w:rPr>
     </w:lvl>
   </w:abstractNum>
-  <w:abstractNum w:abstractNumId="2" w15:restartNumberingAfterBreak="0">
+  <w:abstractNum w:abstractNumId="3" w15:restartNumberingAfterBreak="0">
     <w:nsid w:val="3A686BDA"/>
     <w:multiLevelType w:val="hybridMultilevel"/>
     <w:tmpl w:val="D536F6DC"/>
@@ -3683,7 +4219,7 @@
       </w:rPr>
     </w:lvl>
   </w:abstractNum>
-  <w:abstractNum w:abstractNumId="3" w15:restartNumberingAfterBreak="0">
+  <w:abstractNum w:abstractNumId="4" w15:restartNumberingAfterBreak="0">
     <w:nsid w:val="47AB2572"/>
     <w:multiLevelType w:val="hybridMultilevel"/>
     <w:tmpl w:val="2124AB0C"/>
@@ -3796,7 +4332,120 @@
       </w:rPr>
     </w:lvl>
   </w:abstractNum>
-  <w:abstractNum w:abstractNumId="4" w15:restartNumberingAfterBreak="0">
+  <w:abstractNum w:abstractNumId="5" w15:restartNumberingAfterBreak="0">
+    <w:nsid w:val="6AAD3347"/>
+    <w:multiLevelType w:val="hybridMultilevel"/>
+    <w:tmpl w:val="DB783B6A"/>
+    <w:lvl w:ilvl="0" w:tplc="08090001">
+      <w:start w:val="1"/>
+      <w:numFmt w:val="bullet"/>
+      <w:lvlText w:val=""/>
+      <w:lvlJc w:val="left"/>
+      <w:pPr>
+        <w:ind w:left="1080" w:hanging="360"/>
+      </w:pPr>
+      <w:rPr>
+        <w:rFonts w:ascii="Symbol" w:hAnsi="Symbol" w:hint="default"/>
+      </w:rPr>
+    </w:lvl>
+    <w:lvl w:ilvl="1" w:tplc="08090003" w:tentative="1">
+      <w:start w:val="1"/>
+      <w:numFmt w:val="bullet"/>
+      <w:lvlText w:val="o"/>
+      <w:lvlJc w:val="left"/>
+      <w:pPr>
+        <w:ind w:left="1800" w:hanging="360"/>
+      </w:pPr>
+      <w:rPr>
+        <w:rFonts w:ascii="Courier New" w:hAnsi="Courier New" w:cs="Courier New" w:hint="default"/>
+      </w:rPr>
+    </w:lvl>
+    <w:lvl w:ilvl="2" w:tplc="08090005" w:tentative="1">
+      <w:start w:val="1"/>
+      <w:numFmt w:val="bullet"/>
+      <w:lvlText w:val=""/>
+      <w:lvlJc w:val="left"/>
+      <w:pPr>
+        <w:ind w:left="2520" w:hanging="360"/>
+      </w:pPr>
+      <w:rPr>
+        <w:rFonts w:ascii="Wingdings" w:hAnsi="Wingdings" w:hint="default"/>
+      </w:rPr>
+    </w:lvl>
+    <w:lvl w:ilvl="3" w:tplc="08090001" w:tentative="1">
+      <w:start w:val="1"/>
+      <w:numFmt w:val="bullet"/>
+      <w:lvlText w:val=""/>
+      <w:lvlJc w:val="left"/>
+      <w:pPr>
+        <w:ind w:left="3240" w:hanging="360"/>
+      </w:pPr>
+      <w:rPr>
+        <w:rFonts w:ascii="Symbol" w:hAnsi="Symbol" w:hint="default"/>
+      </w:rPr>
+    </w:lvl>
+    <w:lvl w:ilvl="4" w:tplc="08090003" w:tentative="1">
+      <w:start w:val="1"/>
+      <w:numFmt w:val="bullet"/>
+      <w:lvlText w:val="o"/>
+      <w:lvlJc w:val="left"/>
+      <w:pPr>
+        <w:ind w:left="3960" w:hanging="360"/>
+      </w:pPr>
+      <w:rPr>
+        <w:rFonts w:ascii="Courier New" w:hAnsi="Courier New" w:cs="Courier New" w:hint="default"/>
+      </w:rPr>
+    </w:lvl>
+    <w:lvl w:ilvl="5" w:tplc="08090005" w:tentative="1">
+      <w:start w:val="1"/>
+      <w:numFmt w:val="bullet"/>
+      <w:lvlText w:val=""/>
+      <w:lvlJc w:val="left"/>
+      <w:pPr>
+        <w:ind w:left="4680" w:hanging="360"/>
+      </w:pPr>
+      <w:rPr>
+        <w:rFonts w:ascii="Wingdings" w:hAnsi="Wingdings" w:hint="default"/>
+      </w:rPr>
+    </w:lvl>
+    <w:lvl w:ilvl="6" w:tplc="08090001" w:tentative="1">
+      <w:start w:val="1"/>
+      <w:numFmt w:val="bullet"/>
+      <w:lvlText w:val=""/>
+      <w:lvlJc w:val="left"/>
+      <w:pPr>
+        <w:ind w:left="5400" w:hanging="360"/>
+      </w:pPr>
+      <w:rPr>
+        <w:rFonts w:ascii="Symbol" w:hAnsi="Symbol" w:hint="default"/>
+      </w:rPr>
+    </w:lvl>
+    <w:lvl w:ilvl="7" w:tplc="08090003" w:tentative="1">
+      <w:start w:val="1"/>
+      <w:numFmt w:val="bullet"/>
+      <w:lvlText w:val="o"/>
+      <w:lvlJc w:val="left"/>
+      <w:pPr>
+        <w:ind w:left="6120" w:hanging="360"/>
+      </w:pPr>
+      <w:rPr>
+        <w:rFonts w:ascii="Courier New" w:hAnsi="Courier New" w:cs="Courier New" w:hint="default"/>
+      </w:rPr>
+    </w:lvl>
+    <w:lvl w:ilvl="8" w:tplc="08090005" w:tentative="1">
+      <w:start w:val="1"/>
+      <w:numFmt w:val="bullet"/>
+      <w:lvlText w:val=""/>
+      <w:lvlJc w:val="left"/>
+      <w:pPr>
+        <w:ind w:left="6840" w:hanging="360"/>
+      </w:pPr>
+      <w:rPr>
+        <w:rFonts w:ascii="Wingdings" w:hAnsi="Wingdings" w:hint="default"/>
+      </w:rPr>
+    </w:lvl>
+  </w:abstractNum>
+  <w:abstractNum w:abstractNumId="6" w15:restartNumberingAfterBreak="0">
     <w:nsid w:val="6E25443C"/>
     <w:multiLevelType w:val="hybridMultilevel"/>
     <w:tmpl w:val="17463BD8"/>
@@ -3910,19 +4559,25 @@
     </w:lvl>
   </w:abstractNum>
   <w:num w:numId="1">
+    <w:abstractNumId w:val="1"/>
+  </w:num>
+  <w:num w:numId="2">
+    <w:abstractNumId w:val="6"/>
+  </w:num>
+  <w:num w:numId="3">
+    <w:abstractNumId w:val="4"/>
+  </w:num>
+  <w:num w:numId="4">
+    <w:abstractNumId w:val="2"/>
+  </w:num>
+  <w:num w:numId="5">
+    <w:abstractNumId w:val="3"/>
+  </w:num>
+  <w:num w:numId="6">
     <w:abstractNumId w:val="0"/>
   </w:num>
-  <w:num w:numId="2">
-    <w:abstractNumId w:val="4"/>
-  </w:num>
-  <w:num w:numId="3">
-    <w:abstractNumId w:val="3"/>
-  </w:num>
-  <w:num w:numId="4">
-    <w:abstractNumId w:val="1"/>
-  </w:num>
-  <w:num w:numId="5">
-    <w:abstractNumId w:val="2"/>
+  <w:num w:numId="7">
+    <w:abstractNumId w:val="5"/>
   </w:num>
 </w:numbering>
 </file>

</xml_diff>

<commit_message>
grammar check first of BHD chapter, and added references
</commit_message>
<xml_diff>
--- a/Structuring.docx
+++ b/Structuring.docx
@@ -838,15 +838,7 @@
           <w:sz w:val="24"/>
           <w:szCs w:val="24"/>
         </w:rPr>
-        <w:t>Simple sentence: &lt;subject&gt; &lt;verb&gt;</w:t>
-      </w:r>
-      <w:r>
-        <w:rPr>
-          <w:rFonts w:cstheme="minorHAnsi"/>
-          <w:sz w:val="24"/>
-          <w:szCs w:val="24"/>
-        </w:rPr>
-        <w:t>&lt;object&gt;</w:t>
+        <w:t>Simple sentence: &lt;subject&gt; &lt;verb&gt;&lt;object&gt;</w:t>
       </w:r>
       <w:r>
         <w:rPr>
@@ -1506,15 +1498,7 @@
           <w:sz w:val="24"/>
           <w:szCs w:val="24"/>
         </w:rPr>
-        <w:t>ain</w:t>
-      </w:r>
-      <w:r>
-        <w:rPr>
-          <w:rFonts w:cstheme="minorHAnsi"/>
-          <w:sz w:val="24"/>
-          <w:szCs w:val="24"/>
-        </w:rPr>
-        <w:t xml:space="preserve"> and subordinate</w:t>
+        <w:t>ain and subordinate</w:t>
       </w:r>
       <w:r>
         <w:rPr>
@@ -1648,15 +1632,7 @@
           <w:sz w:val="24"/>
           <w:szCs w:val="24"/>
         </w:rPr>
-        <w:t>Subordinate clause:</w:t>
-      </w:r>
-      <w:r>
-        <w:rPr>
-          <w:rFonts w:cstheme="minorHAnsi"/>
-          <w:sz w:val="24"/>
-          <w:szCs w:val="24"/>
-        </w:rPr>
-        <w:t xml:space="preserve"> It doesn’t stand alone.</w:t>
+        <w:t>Subordinate clause: It doesn’t stand alone.</w:t>
       </w:r>
     </w:p>
     <w:p>
@@ -1871,47 +1847,7 @@
           <w:szCs w:val="24"/>
         </w:rPr>
         <w:lastRenderedPageBreak/>
-        <w:t>the rat</w:t>
-      </w:r>
-      <w:r>
-        <w:rPr>
-          <w:rFonts w:cstheme="minorHAnsi"/>
-          <w:sz w:val="24"/>
-          <w:szCs w:val="24"/>
-        </w:rPr>
-        <w:t>, h</w:t>
-      </w:r>
-      <w:r>
-        <w:rPr>
-          <w:rFonts w:cstheme="minorHAnsi"/>
-          <w:sz w:val="24"/>
-          <w:szCs w:val="24"/>
-        </w:rPr>
-        <w:t>aving eaten the poison</w:t>
-      </w:r>
-      <w:r>
-        <w:rPr>
-          <w:rFonts w:cstheme="minorHAnsi"/>
-          <w:sz w:val="24"/>
-          <w:szCs w:val="24"/>
-        </w:rPr>
-        <w:t>,</w:t>
-      </w:r>
-      <w:r>
-        <w:rPr>
-          <w:rFonts w:cstheme="minorHAnsi"/>
-          <w:sz w:val="24"/>
-          <w:szCs w:val="24"/>
-        </w:rPr>
-        <w:t xml:space="preserve"> was dead</w:t>
-      </w:r>
-      <w:r>
-        <w:rPr>
-          <w:rFonts w:cstheme="minorHAnsi"/>
-          <w:sz w:val="24"/>
-          <w:szCs w:val="24"/>
-        </w:rPr>
-        <w:t>.</w:t>
+        <w:t>the rat, having eaten the poison, was dead.</w:t>
       </w:r>
     </w:p>
     <w:p>
@@ -1933,15 +1869,7 @@
           <w:sz w:val="24"/>
           <w:szCs w:val="24"/>
         </w:rPr>
-        <w:t>The rat was dead h</w:t>
-      </w:r>
-      <w:r>
-        <w:rPr>
-          <w:rFonts w:cstheme="minorHAnsi"/>
-          <w:sz w:val="24"/>
-          <w:szCs w:val="24"/>
-        </w:rPr>
-        <w:t>aving eaten the poison</w:t>
+        <w:t>The rat was dead having eaten the poison</w:t>
       </w:r>
     </w:p>
     <w:p>
@@ -2117,23 +2045,7 @@
           <w:sz w:val="24"/>
           <w:szCs w:val="24"/>
         </w:rPr>
-        <w:t xml:space="preserve">In a compound predicate that contains two verbs, </w:t>
-      </w:r>
-      <w:r>
-        <w:rPr>
-          <w:rFonts w:cstheme="minorHAnsi"/>
-          <w:sz w:val="24"/>
-          <w:szCs w:val="24"/>
-        </w:rPr>
-        <w:t>do not</w:t>
-      </w:r>
-      <w:r>
-        <w:rPr>
-          <w:rFonts w:cstheme="minorHAnsi"/>
-          <w:sz w:val="24"/>
-          <w:szCs w:val="24"/>
-        </w:rPr>
-        <w:t xml:space="preserve"> separate them with a comma</w:t>
+        <w:t>In a compound predicate that contains two verbs, do not separate them with a comma</w:t>
       </w:r>
       <w:r>
         <w:rPr>
@@ -2221,7 +2133,7 @@
           <w:sz w:val="24"/>
           <w:szCs w:val="24"/>
         </w:rPr>
-        <w:t xml:space="preserve">Section </w:t>
+        <w:t>Section 2 discusses the functionality needed from the HAM6 layout</w:t>
       </w:r>
       <w:r>
         <w:rPr>
@@ -2230,7 +2142,7 @@
           <w:sz w:val="24"/>
           <w:szCs w:val="24"/>
         </w:rPr>
-        <w:t>2</w:t>
+        <w:t xml:space="preserve"> and</w:t>
       </w:r>
       <w:r>
         <w:rPr>
@@ -2239,7 +2151,7 @@
           <w:sz w:val="24"/>
           <w:szCs w:val="24"/>
         </w:rPr>
-        <w:t xml:space="preserve"> discusses the functionality needed from the HAM6 layout</w:t>
+        <w:t xml:space="preserve"> </w:t>
       </w:r>
       <w:r>
         <w:rPr>
@@ -2248,7 +2160,7 @@
           <w:sz w:val="24"/>
           <w:szCs w:val="24"/>
         </w:rPr>
-        <w:t xml:space="preserve"> and</w:t>
+        <w:t>analyses the</w:t>
       </w:r>
       <w:r>
         <w:rPr>
@@ -2257,34 +2169,7 @@
           <w:sz w:val="24"/>
           <w:szCs w:val="24"/>
         </w:rPr>
-        <w:t xml:space="preserve"> </w:t>
-      </w:r>
-      <w:r>
-        <w:rPr>
-          <w:rFonts w:cstheme="minorHAnsi"/>
-          <w:color w:val="70AD47" w:themeColor="accent6"/>
-          <w:sz w:val="24"/>
-          <w:szCs w:val="24"/>
-        </w:rPr>
-        <w:t>analyses the</w:t>
-      </w:r>
-      <w:r>
-        <w:rPr>
-          <w:rFonts w:cstheme="minorHAnsi"/>
-          <w:color w:val="70AD47" w:themeColor="accent6"/>
-          <w:sz w:val="24"/>
-          <w:szCs w:val="24"/>
-        </w:rPr>
-        <w:t xml:space="preserve"> </w:t>
-      </w:r>
-      <w:r>
-        <w:rPr>
-          <w:rFonts w:cstheme="minorHAnsi"/>
-          <w:color w:val="70AD47" w:themeColor="accent6"/>
-          <w:sz w:val="24"/>
-          <w:szCs w:val="24"/>
-        </w:rPr>
-        <w:t>proposed HAM6 layout</w:t>
+        <w:t xml:space="preserve"> proposed HAM6 layout</w:t>
       </w:r>
       <w:r>
         <w:rPr>
@@ -2487,25 +2372,7 @@
           <w:sz w:val="24"/>
           <w:szCs w:val="24"/>
         </w:rPr>
-        <w:t>Alice goes fishing by the lake</w:t>
-      </w:r>
-      <w:r>
-        <w:rPr>
-          <w:rFonts w:cstheme="minorHAnsi"/>
-          <w:color w:val="FF0000"/>
-          <w:sz w:val="24"/>
-          <w:szCs w:val="24"/>
-        </w:rPr>
-        <w:t xml:space="preserve">, and </w:t>
-      </w:r>
-      <w:r>
-        <w:rPr>
-          <w:rFonts w:cstheme="minorHAnsi"/>
-          <w:color w:val="FF0000"/>
-          <w:sz w:val="24"/>
-          <w:szCs w:val="24"/>
-        </w:rPr>
-        <w:t>catches fish.</w:t>
+        <w:t>Alice goes fishing by the lake, and catches fish.</w:t>
       </w:r>
     </w:p>
     <w:p>
@@ -3502,7 +3369,7 @@
           <w:sz w:val="24"/>
           <w:szCs w:val="24"/>
         </w:rPr>
-        <w:t>Ctrl+f there, they’re, their and check it’s the right one</w:t>
+        <w:t>Ctrl+f effect and affect</w:t>
       </w:r>
     </w:p>
     <w:p>
@@ -3522,7 +3389,14 @@
           <w:sz w:val="24"/>
           <w:szCs w:val="24"/>
         </w:rPr>
-        <w:t>Ctrl+f effect and affect</w:t>
+        <w:t xml:space="preserve">Ctrl+f </w:t>
+      </w:r>
+      <w:r>
+        <w:rPr>
+          <w:sz w:val="24"/>
+          <w:szCs w:val="24"/>
+        </w:rPr>
+        <w:t>the the</w:t>
       </w:r>
     </w:p>
     <w:p>
@@ -3542,14 +3416,7 @@
           <w:sz w:val="24"/>
           <w:szCs w:val="24"/>
         </w:rPr>
-        <w:t xml:space="preserve">Ctrl+f </w:t>
-      </w:r>
-      <w:r>
-        <w:rPr>
-          <w:sz w:val="24"/>
-          <w:szCs w:val="24"/>
-        </w:rPr>
-        <w:t>the the</w:t>
+        <w:t>Look for etc. and etc.~</w:t>
       </w:r>
     </w:p>
     <w:p>
@@ -3569,7 +3436,7 @@
           <w:sz w:val="24"/>
           <w:szCs w:val="24"/>
         </w:rPr>
-        <w:t>Look for etc. and etc.~</w:t>
+        <w:t>Check `` quote marks.</w:t>
       </w:r>
     </w:p>
     <w:p>
@@ -3589,7 +3456,7 @@
           <w:sz w:val="24"/>
           <w:szCs w:val="24"/>
         </w:rPr>
-        <w:t>Check `` quote marks.</w:t>
+        <w:t>Beam splitter, not beamsplitter</w:t>
       </w:r>
     </w:p>
     <w:p>
@@ -3609,8 +3476,498 @@
           <w:sz w:val="24"/>
           <w:szCs w:val="24"/>
         </w:rPr>
-        <w:t>Beam splitter, not beamsplitter</w:t>
-      </w:r>
+        <w:t>Equation (1.1), not Equation 1.1</w:t>
+      </w:r>
+      <w:r>
+        <w:rPr>
+          <w:sz w:val="24"/>
+          <w:szCs w:val="24"/>
+        </w:rPr>
+        <w:t>.</w:t>
+      </w:r>
+    </w:p>
+    <w:p>
+      <w:pPr>
+        <w:pStyle w:val="ListParagraph"/>
+        <w:numPr>
+          <w:ilvl w:val="0"/>
+          <w:numId w:val="6"/>
+        </w:numPr>
+        <w:rPr>
+          <w:sz w:val="24"/>
+          <w:szCs w:val="24"/>
+        </w:rPr>
+      </w:pPr>
+      <w:r>
+        <w:rPr>
+          <w:sz w:val="24"/>
+          <w:szCs w:val="24"/>
+        </w:rPr>
+        <w:t>Remove doesn’t, replace with does not, etc.</w:t>
+      </w:r>
+    </w:p>
+    <w:p>
+      <w:pPr>
+        <w:pStyle w:val="ListParagraph"/>
+        <w:numPr>
+          <w:ilvl w:val="0"/>
+          <w:numId w:val="6"/>
+        </w:numPr>
+        <w:rPr>
+          <w:sz w:val="24"/>
+          <w:szCs w:val="24"/>
+        </w:rPr>
+      </w:pPr>
+      <w:r>
+        <w:rPr>
+          <w:sz w:val="24"/>
+          <w:szCs w:val="24"/>
+        </w:rPr>
+        <w:t xml:space="preserve">Effect is a noun, affect is a verb. </w:t>
+      </w:r>
+      <w:r>
+        <w:rPr>
+          <w:sz w:val="24"/>
+          <w:szCs w:val="24"/>
+        </w:rPr>
+        <w:t>E.g. ‘the first effect’, ‘the optical spring effect’</w:t>
+      </w:r>
+      <w:r>
+        <w:rPr>
+          <w:sz w:val="24"/>
+          <w:szCs w:val="24"/>
+        </w:rPr>
+        <w:t>. ‘optical springs affect’</w:t>
+      </w:r>
+      <w:r>
+        <w:rPr>
+          <w:sz w:val="24"/>
+          <w:szCs w:val="24"/>
+        </w:rPr>
+        <w:t xml:space="preserve">. </w:t>
+      </w:r>
+    </w:p>
+    <w:p>
+      <w:pPr>
+        <w:pStyle w:val="ListParagraph"/>
+        <w:numPr>
+          <w:ilvl w:val="1"/>
+          <w:numId w:val="6"/>
+        </w:numPr>
+        <w:rPr>
+          <w:sz w:val="24"/>
+          <w:szCs w:val="24"/>
+        </w:rPr>
+      </w:pPr>
+      <w:r>
+        <w:rPr>
+          <w:sz w:val="24"/>
+          <w:szCs w:val="24"/>
+        </w:rPr>
+        <w:t>A</w:t>
+      </w:r>
+      <w:r>
+        <w:rPr>
+          <w:sz w:val="24"/>
+          <w:szCs w:val="24"/>
+        </w:rPr>
+        <w:t>ffect</w:t>
+      </w:r>
+      <w:r>
+        <w:rPr>
+          <w:sz w:val="24"/>
+          <w:szCs w:val="24"/>
+        </w:rPr>
+        <w:t xml:space="preserve"> -&gt;</w:t>
+      </w:r>
+      <w:r>
+        <w:rPr>
+          <w:sz w:val="24"/>
+          <w:szCs w:val="24"/>
+        </w:rPr>
+        <w:t xml:space="preserve"> </w:t>
+      </w:r>
+      <w:r>
+        <w:rPr>
+          <w:sz w:val="24"/>
+          <w:szCs w:val="24"/>
+        </w:rPr>
+        <w:t>alter, change, disturb</w:t>
+      </w:r>
+      <w:r>
+        <w:rPr>
+          <w:sz w:val="24"/>
+          <w:szCs w:val="24"/>
+        </w:rPr>
+        <w:t>,</w:t>
+      </w:r>
+      <w:r>
+        <w:rPr>
+          <w:sz w:val="24"/>
+          <w:szCs w:val="24"/>
+        </w:rPr>
+        <w:t xml:space="preserve"> </w:t>
+      </w:r>
+      <w:r>
+        <w:rPr>
+          <w:sz w:val="24"/>
+          <w:szCs w:val="24"/>
+        </w:rPr>
+        <w:t>influence</w:t>
+      </w:r>
+    </w:p>
+    <w:p>
+      <w:pPr>
+        <w:pStyle w:val="ListParagraph"/>
+        <w:numPr>
+          <w:ilvl w:val="1"/>
+          <w:numId w:val="6"/>
+        </w:numPr>
+        <w:rPr>
+          <w:sz w:val="24"/>
+          <w:szCs w:val="24"/>
+        </w:rPr>
+      </w:pPr>
+      <w:r>
+        <w:rPr>
+          <w:sz w:val="24"/>
+          <w:szCs w:val="24"/>
+        </w:rPr>
+        <w:t xml:space="preserve">Effect </w:t>
+      </w:r>
+      <w:r>
+        <w:rPr>
+          <w:sz w:val="24"/>
+          <w:szCs w:val="24"/>
+        </w:rPr>
+        <w:t xml:space="preserve">-&gt; </w:t>
+      </w:r>
+      <w:r>
+        <w:rPr>
+          <w:sz w:val="24"/>
+          <w:szCs w:val="24"/>
+        </w:rPr>
+        <w:t>consequence</w:t>
+      </w:r>
+      <w:r>
+        <w:rPr>
+          <w:sz w:val="24"/>
+          <w:szCs w:val="24"/>
+        </w:rPr>
+        <w:t>,</w:t>
+      </w:r>
+      <w:r>
+        <w:rPr>
+          <w:sz w:val="24"/>
+          <w:szCs w:val="24"/>
+        </w:rPr>
+        <w:t xml:space="preserve"> </w:t>
+      </w:r>
+      <w:r>
+        <w:rPr>
+          <w:sz w:val="24"/>
+          <w:szCs w:val="24"/>
+        </w:rPr>
+        <w:t>fate, product, result</w:t>
+      </w:r>
+    </w:p>
+    <w:p>
+      <w:pPr>
+        <w:pStyle w:val="ListParagraph"/>
+        <w:numPr>
+          <w:ilvl w:val="0"/>
+          <w:numId w:val="6"/>
+        </w:numPr>
+        <w:rPr>
+          <w:sz w:val="24"/>
+          <w:szCs w:val="24"/>
+        </w:rPr>
+      </w:pPr>
+      <w:r>
+        <w:rPr>
+          <w:sz w:val="24"/>
+          <w:szCs w:val="24"/>
+        </w:rPr>
+        <w:t xml:space="preserve">Remove </w:t>
+      </w:r>
+      <w:r>
+        <w:rPr>
+          <w:sz w:val="24"/>
+          <w:szCs w:val="24"/>
+        </w:rPr>
+        <w:t>adverbs: very,</w:t>
+      </w:r>
+    </w:p>
+    <w:p>
+      <w:pPr>
+        <w:pStyle w:val="ListParagraph"/>
+        <w:numPr>
+          <w:ilvl w:val="1"/>
+          <w:numId w:val="6"/>
+        </w:numPr>
+        <w:rPr>
+          <w:sz w:val="24"/>
+          <w:szCs w:val="24"/>
+        </w:rPr>
+      </w:pPr>
+      <w:r>
+        <w:rPr>
+          <w:sz w:val="24"/>
+          <w:szCs w:val="24"/>
+        </w:rPr>
+        <w:t>Lots end in ‘ly’</w:t>
+      </w:r>
+    </w:p>
+    <w:p>
+      <w:pPr>
+        <w:pStyle w:val="ListParagraph"/>
+        <w:numPr>
+          <w:ilvl w:val="0"/>
+          <w:numId w:val="6"/>
+        </w:numPr>
+        <w:rPr>
+          <w:sz w:val="24"/>
+          <w:szCs w:val="24"/>
+        </w:rPr>
+      </w:pPr>
+      <w:r>
+        <w:rPr>
+          <w:sz w:val="24"/>
+          <w:szCs w:val="24"/>
+        </w:rPr>
+        <w:t>H</w:t>
+      </w:r>
+      <w:r>
+        <w:rPr>
+          <w:sz w:val="24"/>
+          <w:szCs w:val="24"/>
+        </w:rPr>
+        <w:t>yphens</w:t>
+      </w:r>
+      <w:r>
+        <w:rPr>
+          <w:sz w:val="24"/>
+          <w:szCs w:val="24"/>
+        </w:rPr>
+        <w:t xml:space="preserve">: </w:t>
+      </w:r>
+    </w:p>
+    <w:p>
+      <w:pPr>
+        <w:pStyle w:val="ListParagraph"/>
+        <w:numPr>
+          <w:ilvl w:val="1"/>
+          <w:numId w:val="6"/>
+        </w:numPr>
+        <w:rPr>
+          <w:sz w:val="24"/>
+          <w:szCs w:val="24"/>
+        </w:rPr>
+      </w:pPr>
+      <w:r>
+        <w:rPr>
+          <w:sz w:val="24"/>
+          <w:szCs w:val="24"/>
+        </w:rPr>
+        <w:t>&lt;adjective&gt;-&lt;adjective&gt;</w:t>
+      </w:r>
+      <w:r>
+        <w:rPr>
+          <w:sz w:val="24"/>
+          <w:szCs w:val="24"/>
+        </w:rPr>
+        <w:tab/>
+        <w:t>&lt;noun&gt;</w:t>
+      </w:r>
+    </w:p>
+    <w:p>
+      <w:pPr>
+        <w:pStyle w:val="ListParagraph"/>
+        <w:numPr>
+          <w:ilvl w:val="1"/>
+          <w:numId w:val="6"/>
+        </w:numPr>
+        <w:rPr>
+          <w:sz w:val="24"/>
+          <w:szCs w:val="24"/>
+        </w:rPr>
+      </w:pPr>
+      <w:r>
+        <w:rPr>
+          <w:sz w:val="24"/>
+          <w:szCs w:val="24"/>
+        </w:rPr>
+        <w:t xml:space="preserve">Majority of papers go with mode mismatch, not </w:t>
+      </w:r>
+      <w:r>
+        <w:rPr>
+          <w:sz w:val="24"/>
+          <w:szCs w:val="24"/>
+        </w:rPr>
+        <w:t>M</w:t>
+      </w:r>
+      <w:r>
+        <w:rPr>
+          <w:sz w:val="24"/>
+          <w:szCs w:val="24"/>
+        </w:rPr>
+        <w:t>ode</w:t>
+      </w:r>
+      <w:r>
+        <w:rPr>
+          <w:sz w:val="24"/>
+          <w:szCs w:val="24"/>
+        </w:rPr>
+        <w:t>-mismatch</w:t>
+      </w:r>
+    </w:p>
+    <w:p>
+      <w:pPr>
+        <w:pStyle w:val="ListParagraph"/>
+        <w:numPr>
+          <w:ilvl w:val="1"/>
+          <w:numId w:val="6"/>
+        </w:numPr>
+        <w:rPr>
+          <w:sz w:val="24"/>
+          <w:szCs w:val="24"/>
+        </w:rPr>
+      </w:pPr>
+      <w:r>
+        <w:rPr>
+          <w:sz w:val="24"/>
+          <w:szCs w:val="24"/>
+        </w:rPr>
+        <w:t>Photo-diode</w:t>
+      </w:r>
+    </w:p>
+    <w:p>
+      <w:pPr>
+        <w:pStyle w:val="ListParagraph"/>
+        <w:numPr>
+          <w:ilvl w:val="0"/>
+          <w:numId w:val="6"/>
+        </w:numPr>
+        <w:rPr>
+          <w:sz w:val="24"/>
+          <w:szCs w:val="24"/>
+        </w:rPr>
+      </w:pPr>
+      <w:r>
+        <w:rPr>
+          <w:sz w:val="24"/>
+          <w:szCs w:val="24"/>
+        </w:rPr>
+        <w:t xml:space="preserve">Made up </w:t>
+      </w:r>
+      <w:r>
+        <w:rPr>
+          <w:sz w:val="24"/>
+          <w:szCs w:val="24"/>
+        </w:rPr>
+        <w:t>verbs:</w:t>
+      </w:r>
+    </w:p>
+    <w:p>
+      <w:pPr>
+        <w:pStyle w:val="ListParagraph"/>
+        <w:numPr>
+          <w:ilvl w:val="1"/>
+          <w:numId w:val="6"/>
+        </w:numPr>
+        <w:rPr>
+          <w:sz w:val="24"/>
+          <w:szCs w:val="24"/>
+        </w:rPr>
+      </w:pPr>
+      <w:r>
+        <w:rPr>
+          <w:sz w:val="24"/>
+          <w:szCs w:val="24"/>
+        </w:rPr>
+        <w:lastRenderedPageBreak/>
+        <w:t xml:space="preserve">E.g </w:t>
+      </w:r>
+      <w:r>
+        <w:rPr>
+          <w:sz w:val="24"/>
+          <w:szCs w:val="24"/>
+        </w:rPr>
+        <w:t xml:space="preserve">Mode </w:t>
+      </w:r>
+      <w:r>
+        <w:rPr>
+          <w:sz w:val="24"/>
+          <w:szCs w:val="24"/>
+        </w:rPr>
+        <w:t>mis</w:t>
+      </w:r>
+      <w:r>
+        <w:rPr>
+          <w:sz w:val="24"/>
+          <w:szCs w:val="24"/>
+        </w:rPr>
+        <w:t xml:space="preserve">matching </w:t>
+      </w:r>
+    </w:p>
+    <w:p>
+      <w:pPr>
+        <w:pStyle w:val="ListParagraph"/>
+        <w:numPr>
+          <w:ilvl w:val="0"/>
+          <w:numId w:val="6"/>
+        </w:numPr>
+        <w:rPr>
+          <w:sz w:val="24"/>
+          <w:szCs w:val="24"/>
+        </w:rPr>
+      </w:pPr>
+      <w:r>
+        <w:rPr>
+          <w:sz w:val="24"/>
+          <w:szCs w:val="24"/>
+        </w:rPr>
+        <w:t>Current detector = aLIGO, future detector = LIGO A+, the detector in a general abstract sense = LIGO</w:t>
+      </w:r>
+    </w:p>
+    <w:p>
+      <w:pPr>
+        <w:pStyle w:val="ListParagraph"/>
+        <w:numPr>
+          <w:ilvl w:val="0"/>
+          <w:numId w:val="6"/>
+        </w:numPr>
+        <w:rPr>
+          <w:sz w:val="24"/>
+          <w:szCs w:val="24"/>
+        </w:rPr>
+      </w:pPr>
+      <w:r>
+        <w:rPr>
+          <w:sz w:val="24"/>
+          <w:szCs w:val="24"/>
+        </w:rPr>
+        <w:t>None classical -&gt; non-classical</w:t>
+      </w:r>
+    </w:p>
+    <w:p>
+      <w:pPr>
+        <w:ind w:left="720"/>
+        <w:rPr>
+          <w:sz w:val="24"/>
+          <w:szCs w:val="24"/>
+        </w:rPr>
+      </w:pPr>
+    </w:p>
+    <w:p>
+      <w:pPr>
+        <w:pStyle w:val="ListParagraph"/>
+        <w:ind w:left="1440"/>
+        <w:rPr>
+          <w:sz w:val="24"/>
+          <w:szCs w:val="24"/>
+        </w:rPr>
+      </w:pPr>
     </w:p>
     <w:p>
       <w:pPr>
@@ -3802,7 +4159,6 @@
           <w:sz w:val="24"/>
           <w:szCs w:val="24"/>
         </w:rPr>
-        <w:lastRenderedPageBreak/>
         <w:t>Are the axis labelled? The label is a sentence, so normal sentence capitalisation should be used. If its just one word, use a capital letter.</w:t>
       </w:r>
     </w:p>
@@ -4170,6 +4526,7 @@
           <w:sz w:val="24"/>
           <w:szCs w:val="24"/>
         </w:rPr>
+        <w:lastRenderedPageBreak/>
         <w:t>Matplotlib</w:t>
       </w:r>
     </w:p>
@@ -4557,7 +4914,6 @@
           <w:sz w:val="24"/>
           <w:szCs w:val="24"/>
         </w:rPr>
-        <w:lastRenderedPageBreak/>
         <w:t>plt.grid()</w:t>
       </w:r>
     </w:p>
@@ -4852,6 +5208,7 @@
           <w:sz w:val="24"/>
           <w:szCs w:val="24"/>
         </w:rPr>
+        <w:lastRenderedPageBreak/>
         <w:t>aspect_ratio = size.*[6,4];</w:t>
       </w:r>
     </w:p>
@@ -5066,7 +5423,6 @@
           <w:sz w:val="24"/>
           <w:szCs w:val="24"/>
         </w:rPr>
-        <w:lastRenderedPageBreak/>
         <w:t>axis tight</w:t>
       </w:r>
     </w:p>
@@ -5289,7 +5645,7 @@
         <w:rFonts w:ascii="Symbol" w:hAnsi="Symbol" w:hint="default"/>
       </w:rPr>
     </w:lvl>
-    <w:lvl w:ilvl="1" w:tplc="08090003" w:tentative="1">
+    <w:lvl w:ilvl="1" w:tplc="08090003">
       <w:start w:val="1"/>
       <w:numFmt w:val="bullet"/>
       <w:lvlText w:val="o"/>
@@ -5301,7 +5657,7 @@
         <w:rFonts w:ascii="Courier New" w:hAnsi="Courier New" w:cs="Courier New" w:hint="default"/>
       </w:rPr>
     </w:lvl>
-    <w:lvl w:ilvl="2" w:tplc="08090005" w:tentative="1">
+    <w:lvl w:ilvl="2" w:tplc="08090005">
       <w:start w:val="1"/>
       <w:numFmt w:val="bullet"/>
       <w:lvlText w:val=""/>

</xml_diff>

<commit_message>
4th level editing for first part of Pentagram layout chapter
completed up to WS visualisation section
</commit_message>
<xml_diff>
--- a/Structuring.docx
+++ b/Structuring.docx
@@ -78,15 +78,33 @@
           <w:sz w:val="24"/>
           <w:szCs w:val="24"/>
         </w:rPr>
-        <w:t>This is the first step to writing a chapter. Come up with likely sections,</w:t>
-      </w:r>
-      <w:r>
-        <w:rPr>
-          <w:rFonts w:cstheme="minorHAnsi"/>
-          <w:sz w:val="24"/>
-          <w:szCs w:val="24"/>
-        </w:rPr>
-        <w:t xml:space="preserve"> and fill them in with ideas for paragraphs. Think about/put in relevant figures at this point.</w:t>
+        <w:t xml:space="preserve">This is the first step to writing a chapter. Come up with likely </w:t>
+      </w:r>
+      <w:proofErr w:type="gramStart"/>
+      <w:r>
+        <w:rPr>
+          <w:rFonts w:cstheme="minorHAnsi"/>
+          <w:sz w:val="24"/>
+          <w:szCs w:val="24"/>
+        </w:rPr>
+        <w:t>sections,</w:t>
+      </w:r>
+      <w:r>
+        <w:rPr>
+          <w:rFonts w:cstheme="minorHAnsi"/>
+          <w:sz w:val="24"/>
+          <w:szCs w:val="24"/>
+        </w:rPr>
+        <w:t xml:space="preserve"> and</w:t>
+      </w:r>
+      <w:proofErr w:type="gramEnd"/>
+      <w:r>
+        <w:rPr>
+          <w:rFonts w:cstheme="minorHAnsi"/>
+          <w:sz w:val="24"/>
+          <w:szCs w:val="24"/>
+        </w:rPr>
+        <w:t xml:space="preserve"> fill them in with ideas for paragraphs. Think about/put in relevant figures at this point.</w:t>
       </w:r>
     </w:p>
     <w:p>
@@ -167,15 +185,69 @@
           <w:sz w:val="24"/>
           <w:szCs w:val="24"/>
         </w:rPr>
-        <w:t>writing. The majority of the content of the chapter (&lt;90%) will be written by the end of this draft</w:t>
-      </w:r>
-      <w:r>
-        <w:rPr>
-          <w:rFonts w:cstheme="minorHAnsi"/>
-          <w:sz w:val="24"/>
-          <w:szCs w:val="24"/>
-        </w:rPr>
-        <w:t xml:space="preserve">. The writing at this point may be ‘stream of conciouness`-esk, but it should have had an attempt at making it clear. </w:t>
+        <w:t xml:space="preserve">writing. </w:t>
+      </w:r>
+      <w:proofErr w:type="gramStart"/>
+      <w:r>
+        <w:rPr>
+          <w:rFonts w:cstheme="minorHAnsi"/>
+          <w:sz w:val="24"/>
+          <w:szCs w:val="24"/>
+        </w:rPr>
+        <w:t>The majority of</w:t>
+      </w:r>
+      <w:proofErr w:type="gramEnd"/>
+      <w:r>
+        <w:rPr>
+          <w:rFonts w:cstheme="minorHAnsi"/>
+          <w:sz w:val="24"/>
+          <w:szCs w:val="24"/>
+        </w:rPr>
+        <w:t xml:space="preserve"> the content of the chapter (&lt;90%) will be written by the end of this draft</w:t>
+      </w:r>
+      <w:r>
+        <w:rPr>
+          <w:rFonts w:cstheme="minorHAnsi"/>
+          <w:sz w:val="24"/>
+          <w:szCs w:val="24"/>
+        </w:rPr>
+        <w:t xml:space="preserve">. The writing at this point may be ‘stream of </w:t>
+      </w:r>
+      <w:proofErr w:type="spellStart"/>
+      <w:r>
+        <w:rPr>
+          <w:rFonts w:cstheme="minorHAnsi"/>
+          <w:sz w:val="24"/>
+          <w:szCs w:val="24"/>
+        </w:rPr>
+        <w:t>conciouness</w:t>
+      </w:r>
+      <w:proofErr w:type="spellEnd"/>
+      <w:r>
+        <w:rPr>
+          <w:rFonts w:cstheme="minorHAnsi"/>
+          <w:sz w:val="24"/>
+          <w:szCs w:val="24"/>
+        </w:rPr>
+        <w:t>`-</w:t>
+      </w:r>
+      <w:proofErr w:type="spellStart"/>
+      <w:r>
+        <w:rPr>
+          <w:rFonts w:cstheme="minorHAnsi"/>
+          <w:sz w:val="24"/>
+          <w:szCs w:val="24"/>
+        </w:rPr>
+        <w:t>esk</w:t>
+      </w:r>
+      <w:proofErr w:type="spellEnd"/>
+      <w:r>
+        <w:rPr>
+          <w:rFonts w:cstheme="minorHAnsi"/>
+          <w:sz w:val="24"/>
+          <w:szCs w:val="24"/>
+        </w:rPr>
+        <w:t xml:space="preserve">, but it should have had an attempt at making it clear. </w:t>
       </w:r>
       <w:r>
         <w:rPr>
@@ -401,7 +473,25 @@
           <w:sz w:val="24"/>
           <w:szCs w:val="24"/>
         </w:rPr>
-        <w:t>. Consider if some information can be made into an appendix, or if the chapter could be made into two chapters. For the purpose of editing, continue editing them as if they were one chapter.</w:t>
+        <w:t xml:space="preserve">. Consider if some information can be made into an appendix, or if the chapter could be made into two chapters. </w:t>
+      </w:r>
+      <w:proofErr w:type="gramStart"/>
+      <w:r>
+        <w:rPr>
+          <w:rFonts w:cstheme="minorHAnsi"/>
+          <w:sz w:val="24"/>
+          <w:szCs w:val="24"/>
+        </w:rPr>
+        <w:t>For the purpose of</w:t>
+      </w:r>
+      <w:proofErr w:type="gramEnd"/>
+      <w:r>
+        <w:rPr>
+          <w:rFonts w:cstheme="minorHAnsi"/>
+          <w:sz w:val="24"/>
+          <w:szCs w:val="24"/>
+        </w:rPr>
+        <w:t xml:space="preserve"> editing, continue editing them as if they were one chapter.</w:t>
       </w:r>
     </w:p>
     <w:p>
@@ -566,7 +656,25 @@
           <w:sz w:val="24"/>
           <w:szCs w:val="24"/>
         </w:rPr>
-        <w:t>word level. This involves checking the spellings of words (eg. Effect or affect). The</w:t>
+        <w:t>word level. This involves checking the spellings of words (</w:t>
+      </w:r>
+      <w:proofErr w:type="spellStart"/>
+      <w:r>
+        <w:rPr>
+          <w:rFonts w:cstheme="minorHAnsi"/>
+          <w:sz w:val="24"/>
+          <w:szCs w:val="24"/>
+        </w:rPr>
+        <w:t>eg.</w:t>
+      </w:r>
+      <w:proofErr w:type="spellEnd"/>
+      <w:r>
+        <w:rPr>
+          <w:rFonts w:cstheme="minorHAnsi"/>
+          <w:sz w:val="24"/>
+          <w:szCs w:val="24"/>
+        </w:rPr>
+        <w:t xml:space="preserve"> Effect or affect). The</w:t>
       </w:r>
       <w:r>
         <w:rPr>
@@ -723,7 +831,25 @@
           <w:sz w:val="24"/>
           <w:szCs w:val="24"/>
         </w:rPr>
-        <w:t>nalyse the subject, the verb and the object</w:t>
+        <w:t xml:space="preserve">nalyse the subject, the </w:t>
+      </w:r>
+      <w:proofErr w:type="gramStart"/>
+      <w:r>
+        <w:rPr>
+          <w:rFonts w:cstheme="minorHAnsi"/>
+          <w:sz w:val="24"/>
+          <w:szCs w:val="24"/>
+        </w:rPr>
+        <w:t>verb</w:t>
+      </w:r>
+      <w:proofErr w:type="gramEnd"/>
+      <w:r>
+        <w:rPr>
+          <w:rFonts w:cstheme="minorHAnsi"/>
+          <w:sz w:val="24"/>
+          <w:szCs w:val="24"/>
+        </w:rPr>
+        <w:t xml:space="preserve"> and the object</w:t>
       </w:r>
       <w:r>
         <w:rPr>
@@ -1240,7 +1366,25 @@
           <w:sz w:val="24"/>
           <w:szCs w:val="24"/>
         </w:rPr>
-        <w:t xml:space="preserve"> Its hard to miss out ones you need. Err on the side of caution.</w:t>
+        <w:t xml:space="preserve"> </w:t>
+      </w:r>
+      <w:proofErr w:type="spellStart"/>
+      <w:r>
+        <w:rPr>
+          <w:rFonts w:cstheme="minorHAnsi"/>
+          <w:sz w:val="24"/>
+          <w:szCs w:val="24"/>
+        </w:rPr>
+        <w:t>Its</w:t>
+      </w:r>
+      <w:proofErr w:type="spellEnd"/>
+      <w:r>
+        <w:rPr>
+          <w:rFonts w:cstheme="minorHAnsi"/>
+          <w:sz w:val="24"/>
+          <w:szCs w:val="24"/>
+        </w:rPr>
+        <w:t xml:space="preserve"> hard to miss out ones you need. Err on the side of caution.</w:t>
       </w:r>
       <w:r>
         <w:rPr>
@@ -1308,15 +1452,33 @@
           <w:sz w:val="24"/>
           <w:szCs w:val="24"/>
         </w:rPr>
-        <w:t>People get confused by compound sentences and complex sentences</w:t>
-      </w:r>
-      <w:r>
-        <w:rPr>
-          <w:rFonts w:cstheme="minorHAnsi"/>
-          <w:sz w:val="24"/>
-          <w:szCs w:val="24"/>
-        </w:rPr>
-        <w:t>, I suppose.</w:t>
+        <w:t xml:space="preserve">People get confused by compound sentences and complex </w:t>
+      </w:r>
+      <w:proofErr w:type="gramStart"/>
+      <w:r>
+        <w:rPr>
+          <w:rFonts w:cstheme="minorHAnsi"/>
+          <w:sz w:val="24"/>
+          <w:szCs w:val="24"/>
+        </w:rPr>
+        <w:t>sentences</w:t>
+      </w:r>
+      <w:r>
+        <w:rPr>
+          <w:rFonts w:cstheme="minorHAnsi"/>
+          <w:sz w:val="24"/>
+          <w:szCs w:val="24"/>
+        </w:rPr>
+        <w:t>,</w:t>
+      </w:r>
+      <w:proofErr w:type="gramEnd"/>
+      <w:r>
+        <w:rPr>
+          <w:rFonts w:cstheme="minorHAnsi"/>
+          <w:sz w:val="24"/>
+          <w:szCs w:val="24"/>
+        </w:rPr>
+        <w:t xml:space="preserve"> I suppose.</w:t>
       </w:r>
     </w:p>
     <w:p>
@@ -1582,13 +1744,23 @@
           <w:szCs w:val="24"/>
         </w:rPr>
       </w:pPr>
-      <w:r>
-        <w:rPr>
-          <w:rFonts w:cstheme="minorHAnsi"/>
-          <w:sz w:val="24"/>
-          <w:szCs w:val="24"/>
-        </w:rPr>
-        <w:t>E.g the rat is dead.</w:t>
+      <w:proofErr w:type="spellStart"/>
+      <w:r>
+        <w:rPr>
+          <w:rFonts w:cstheme="minorHAnsi"/>
+          <w:sz w:val="24"/>
+          <w:szCs w:val="24"/>
+        </w:rPr>
+        <w:t>E.g</w:t>
+      </w:r>
+      <w:proofErr w:type="spellEnd"/>
+      <w:r>
+        <w:rPr>
+          <w:rFonts w:cstheme="minorHAnsi"/>
+          <w:sz w:val="24"/>
+          <w:szCs w:val="24"/>
+        </w:rPr>
+        <w:t xml:space="preserve"> the rat is dead.</w:t>
       </w:r>
     </w:p>
     <w:p>
@@ -1610,7 +1782,25 @@
           <w:sz w:val="24"/>
           <w:szCs w:val="24"/>
         </w:rPr>
-        <w:t>The rat is dead has a subject and a verb</w:t>
+        <w:t xml:space="preserve">The rat is dead </w:t>
+      </w:r>
+      <w:proofErr w:type="gramStart"/>
+      <w:r>
+        <w:rPr>
+          <w:rFonts w:cstheme="minorHAnsi"/>
+          <w:sz w:val="24"/>
+          <w:szCs w:val="24"/>
+        </w:rPr>
+        <w:t>has</w:t>
+      </w:r>
+      <w:proofErr w:type="gramEnd"/>
+      <w:r>
+        <w:rPr>
+          <w:rFonts w:cstheme="minorHAnsi"/>
+          <w:sz w:val="24"/>
+          <w:szCs w:val="24"/>
+        </w:rPr>
+        <w:t xml:space="preserve"> a subject and a verb</w:t>
       </w:r>
     </w:p>
     <w:p>
@@ -1632,7 +1822,25 @@
           <w:sz w:val="24"/>
           <w:szCs w:val="24"/>
         </w:rPr>
-        <w:t>Subordinate clause: It doesn’t stand alone.</w:t>
+        <w:t xml:space="preserve">Subordinate clause: It </w:t>
+      </w:r>
+      <w:proofErr w:type="gramStart"/>
+      <w:r>
+        <w:rPr>
+          <w:rFonts w:cstheme="minorHAnsi"/>
+          <w:sz w:val="24"/>
+          <w:szCs w:val="24"/>
+        </w:rPr>
+        <w:t>doesn’t</w:t>
+      </w:r>
+      <w:proofErr w:type="gramEnd"/>
+      <w:r>
+        <w:rPr>
+          <w:rFonts w:cstheme="minorHAnsi"/>
+          <w:sz w:val="24"/>
+          <w:szCs w:val="24"/>
+        </w:rPr>
+        <w:t xml:space="preserve"> stand alone.</w:t>
       </w:r>
     </w:p>
     <w:p>
@@ -1648,13 +1856,23 @@
           <w:szCs w:val="24"/>
         </w:rPr>
       </w:pPr>
-      <w:r>
-        <w:rPr>
-          <w:rFonts w:cstheme="minorHAnsi"/>
-          <w:sz w:val="24"/>
-          <w:szCs w:val="24"/>
-        </w:rPr>
-        <w:t xml:space="preserve">E.g </w:t>
+      <w:proofErr w:type="spellStart"/>
+      <w:r>
+        <w:rPr>
+          <w:rFonts w:cstheme="minorHAnsi"/>
+          <w:sz w:val="24"/>
+          <w:szCs w:val="24"/>
+        </w:rPr>
+        <w:t>E.g</w:t>
+      </w:r>
+      <w:proofErr w:type="spellEnd"/>
+      <w:r>
+        <w:rPr>
+          <w:rFonts w:cstheme="minorHAnsi"/>
+          <w:sz w:val="24"/>
+          <w:szCs w:val="24"/>
+        </w:rPr>
+        <w:t xml:space="preserve"> </w:t>
       </w:r>
       <w:r>
         <w:rPr>
@@ -1742,7 +1960,25 @@
           <w:sz w:val="24"/>
           <w:szCs w:val="24"/>
         </w:rPr>
-        <w:t xml:space="preserve"> (not particularly well formed sentence)</w:t>
+        <w:t xml:space="preserve"> (not particularly </w:t>
+      </w:r>
+      <w:proofErr w:type="gramStart"/>
+      <w:r>
+        <w:rPr>
+          <w:rFonts w:cstheme="minorHAnsi"/>
+          <w:sz w:val="24"/>
+          <w:szCs w:val="24"/>
+        </w:rPr>
+        <w:t>well formed</w:t>
+      </w:r>
+      <w:proofErr w:type="gramEnd"/>
+      <w:r>
+        <w:rPr>
+          <w:rFonts w:cstheme="minorHAnsi"/>
+          <w:sz w:val="24"/>
+          <w:szCs w:val="24"/>
+        </w:rPr>
+        <w:t xml:space="preserve"> sentence)</w:t>
       </w:r>
     </w:p>
     <w:p>
@@ -1995,7 +2231,25 @@
           <w:sz w:val="24"/>
           <w:szCs w:val="24"/>
         </w:rPr>
-        <w:t xml:space="preserve"> are indicated by ’and’ and both sides should stand alone as main clauses. This means no comma is required between the two clauses (around the and).</w:t>
+        <w:t xml:space="preserve"> are indicated by ’and’ and both sides should stand alone as main clauses. This means no comma is required between the two clauses (around the </w:t>
+      </w:r>
+      <w:proofErr w:type="spellStart"/>
+      <w:r>
+        <w:rPr>
+          <w:rFonts w:cstheme="minorHAnsi"/>
+          <w:sz w:val="24"/>
+          <w:szCs w:val="24"/>
+        </w:rPr>
+        <w:t>and</w:t>
+      </w:r>
+      <w:proofErr w:type="spellEnd"/>
+      <w:r>
+        <w:rPr>
+          <w:rFonts w:cstheme="minorHAnsi"/>
+          <w:sz w:val="24"/>
+          <w:szCs w:val="24"/>
+        </w:rPr>
+        <w:t>).</w:t>
       </w:r>
     </w:p>
     <w:p>
@@ -2202,7 +2456,38 @@
           <w:sz w:val="24"/>
           <w:szCs w:val="24"/>
         </w:rPr>
-        <w:t>Object, verb, subject,verb,subject.</w:t>
+        <w:t xml:space="preserve">Object, verb, </w:t>
+      </w:r>
+      <w:proofErr w:type="spellStart"/>
+      <w:proofErr w:type="gramStart"/>
+      <w:r>
+        <w:rPr>
+          <w:rFonts w:cstheme="minorHAnsi"/>
+          <w:color w:val="70AD47" w:themeColor="accent6"/>
+          <w:sz w:val="24"/>
+          <w:szCs w:val="24"/>
+        </w:rPr>
+        <w:t>subject,verb</w:t>
+      </w:r>
+      <w:proofErr w:type="gramEnd"/>
+      <w:r>
+        <w:rPr>
+          <w:rFonts w:cstheme="minorHAnsi"/>
+          <w:color w:val="70AD47" w:themeColor="accent6"/>
+          <w:sz w:val="24"/>
+          <w:szCs w:val="24"/>
+        </w:rPr>
+        <w:t>,subject</w:t>
+      </w:r>
+      <w:proofErr w:type="spellEnd"/>
+      <w:r>
+        <w:rPr>
+          <w:rFonts w:cstheme="minorHAnsi"/>
+          <w:color w:val="70AD47" w:themeColor="accent6"/>
+          <w:sz w:val="24"/>
+          <w:szCs w:val="24"/>
+        </w:rPr>
+        <w:t>.</w:t>
       </w:r>
     </w:p>
     <w:p>
@@ -2319,7 +2604,17 @@
           <w:sz w:val="24"/>
           <w:szCs w:val="24"/>
         </w:rPr>
-        <w:t>Section 2 discusses the functionality needed from the HAM6 layout</w:t>
+        <w:t xml:space="preserve">Section 2 discusses the functionality needed from the HAM6 </w:t>
+      </w:r>
+      <w:proofErr w:type="gramStart"/>
+      <w:r>
+        <w:rPr>
+          <w:rFonts w:cstheme="minorHAnsi"/>
+          <w:color w:val="FF0000"/>
+          <w:sz w:val="24"/>
+          <w:szCs w:val="24"/>
+        </w:rPr>
+        <w:t>layout</w:t>
       </w:r>
       <w:r>
         <w:rPr>
@@ -2339,7 +2634,17 @@
           <w:sz w:val="24"/>
           <w:szCs w:val="24"/>
         </w:rPr>
-        <w:t xml:space="preserve"> and analyses the proposed HAM6 layout</w:t>
+        <w:t xml:space="preserve"> and</w:t>
+      </w:r>
+      <w:proofErr w:type="gramEnd"/>
+      <w:r>
+        <w:rPr>
+          <w:rFonts w:cstheme="minorHAnsi"/>
+          <w:color w:val="FF0000"/>
+          <w:sz w:val="24"/>
+          <w:szCs w:val="24"/>
+        </w:rPr>
+        <w:t xml:space="preserve"> analyses the proposed HAM6 layout</w:t>
       </w:r>
       <w:r>
         <w:rPr>
@@ -2372,7 +2677,27 @@
           <w:sz w:val="24"/>
           <w:szCs w:val="24"/>
         </w:rPr>
-        <w:t>Alice goes fishing by the lake, and catches fish.</w:t>
+        <w:t xml:space="preserve">Alice goes fishing by the </w:t>
+      </w:r>
+      <w:proofErr w:type="gramStart"/>
+      <w:r>
+        <w:rPr>
+          <w:rFonts w:cstheme="minorHAnsi"/>
+          <w:color w:val="FF0000"/>
+          <w:sz w:val="24"/>
+          <w:szCs w:val="24"/>
+        </w:rPr>
+        <w:t>lake, and</w:t>
+      </w:r>
+      <w:proofErr w:type="gramEnd"/>
+      <w:r>
+        <w:rPr>
+          <w:rFonts w:cstheme="minorHAnsi"/>
+          <w:color w:val="FF0000"/>
+          <w:sz w:val="24"/>
+          <w:szCs w:val="24"/>
+        </w:rPr>
+        <w:t xml:space="preserve"> catches fish.</w:t>
       </w:r>
     </w:p>
     <w:p>
@@ -2418,7 +2743,25 @@
           <w:sz w:val="24"/>
           <w:szCs w:val="24"/>
         </w:rPr>
-        <w:t>noun (it’s a ‘thing’)</w:t>
+        <w:t>noun (</w:t>
+      </w:r>
+      <w:proofErr w:type="gramStart"/>
+      <w:r>
+        <w:rPr>
+          <w:rFonts w:cstheme="minorHAnsi"/>
+          <w:sz w:val="24"/>
+          <w:szCs w:val="24"/>
+        </w:rPr>
+        <w:t>it’s</w:t>
+      </w:r>
+      <w:proofErr w:type="gramEnd"/>
+      <w:r>
+        <w:rPr>
+          <w:rFonts w:cstheme="minorHAnsi"/>
+          <w:sz w:val="24"/>
+          <w:szCs w:val="24"/>
+        </w:rPr>
+        <w:t xml:space="preserve"> a ‘thing’)</w:t>
       </w:r>
       <w:r>
         <w:rPr>
@@ -2727,7 +3070,27 @@
           <w:sz w:val="24"/>
           <w:szCs w:val="24"/>
         </w:rPr>
-        <w:t>BHD is a method of measuring information encoded by a light field, it forms a key part of many quantum optics experiments.</w:t>
+        <w:t xml:space="preserve">BHD is a method of measuring information encoded by a light </w:t>
+      </w:r>
+      <w:proofErr w:type="gramStart"/>
+      <w:r>
+        <w:rPr>
+          <w:rFonts w:cstheme="minorHAnsi"/>
+          <w:color w:val="FF0000"/>
+          <w:sz w:val="24"/>
+          <w:szCs w:val="24"/>
+        </w:rPr>
+        <w:t>field,</w:t>
+      </w:r>
+      <w:proofErr w:type="gramEnd"/>
+      <w:r>
+        <w:rPr>
+          <w:rFonts w:cstheme="minorHAnsi"/>
+          <w:color w:val="FF0000"/>
+          <w:sz w:val="24"/>
+          <w:szCs w:val="24"/>
+        </w:rPr>
+        <w:t xml:space="preserve"> it forms a key part of many quantum optics experiments.</w:t>
       </w:r>
     </w:p>
     <w:p>
@@ -2827,6 +3190,486 @@
     </w:p>
     <w:p>
       <w:pPr>
+        <w:pStyle w:val="ListParagraph"/>
+        <w:numPr>
+          <w:ilvl w:val="1"/>
+          <w:numId w:val="7"/>
+        </w:numPr>
+        <w:rPr>
+          <w:rFonts w:cstheme="minorHAnsi"/>
+          <w:sz w:val="24"/>
+          <w:szCs w:val="24"/>
+        </w:rPr>
+      </w:pPr>
+      <w:proofErr w:type="gramStart"/>
+      <w:r>
+        <w:rPr>
+          <w:rFonts w:cstheme="minorHAnsi"/>
+          <w:sz w:val="24"/>
+          <w:szCs w:val="24"/>
+        </w:rPr>
+        <w:t>However</w:t>
+      </w:r>
+      <w:proofErr w:type="gramEnd"/>
+      <w:r>
+        <w:rPr>
+          <w:rFonts w:cstheme="minorHAnsi"/>
+          <w:sz w:val="24"/>
+          <w:szCs w:val="24"/>
+        </w:rPr>
+        <w:t xml:space="preserve"> is a </w:t>
+      </w:r>
+      <w:r>
+        <w:rPr>
+          <w:rFonts w:cstheme="minorHAnsi"/>
+          <w:sz w:val="24"/>
+          <w:szCs w:val="24"/>
+        </w:rPr>
+        <w:t xml:space="preserve">conjunctive adverb. It is not </w:t>
+      </w:r>
+      <w:r>
+        <w:rPr>
+          <w:rFonts w:cstheme="minorHAnsi"/>
+          <w:sz w:val="24"/>
+          <w:szCs w:val="24"/>
+        </w:rPr>
+        <w:t>preceded</w:t>
+      </w:r>
+      <w:r>
+        <w:rPr>
+          <w:rFonts w:cstheme="minorHAnsi"/>
+          <w:sz w:val="24"/>
+          <w:szCs w:val="24"/>
+        </w:rPr>
+        <w:t xml:space="preserve"> by a comma</w:t>
+      </w:r>
+      <w:r>
+        <w:rPr>
+          <w:rFonts w:cstheme="minorHAnsi"/>
+          <w:sz w:val="24"/>
+          <w:szCs w:val="24"/>
+        </w:rPr>
+        <w:t xml:space="preserve"> </w:t>
+      </w:r>
+      <w:proofErr w:type="spellStart"/>
+      <w:r>
+        <w:rPr>
+          <w:rFonts w:cstheme="minorHAnsi"/>
+          <w:sz w:val="24"/>
+          <w:szCs w:val="24"/>
+        </w:rPr>
+        <w:t>e.g</w:t>
+      </w:r>
+      <w:proofErr w:type="spellEnd"/>
+      <w:r>
+        <w:rPr>
+          <w:rFonts w:cstheme="minorHAnsi"/>
+          <w:sz w:val="24"/>
+          <w:szCs w:val="24"/>
+        </w:rPr>
+        <w:t>:</w:t>
+      </w:r>
+    </w:p>
+    <w:p>
+      <w:pPr>
+        <w:pStyle w:val="ListParagraph"/>
+        <w:numPr>
+          <w:ilvl w:val="2"/>
+          <w:numId w:val="7"/>
+        </w:numPr>
+        <w:rPr>
+          <w:rFonts w:cstheme="minorHAnsi"/>
+          <w:color w:val="FF0000"/>
+          <w:sz w:val="24"/>
+          <w:szCs w:val="24"/>
+        </w:rPr>
+      </w:pPr>
+      <w:r>
+        <w:rPr>
+          <w:rFonts w:cstheme="minorHAnsi"/>
+          <w:color w:val="FF0000"/>
+          <w:sz w:val="24"/>
+          <w:szCs w:val="24"/>
+        </w:rPr>
+        <w:t xml:space="preserve">The rat was </w:t>
+      </w:r>
+      <w:proofErr w:type="gramStart"/>
+      <w:r>
+        <w:rPr>
+          <w:rFonts w:cstheme="minorHAnsi"/>
+          <w:color w:val="FF0000"/>
+          <w:sz w:val="24"/>
+          <w:szCs w:val="24"/>
+        </w:rPr>
+        <w:t>gone,</w:t>
+      </w:r>
+      <w:proofErr w:type="gramEnd"/>
+      <w:r>
+        <w:rPr>
+          <w:rFonts w:cstheme="minorHAnsi"/>
+          <w:color w:val="FF0000"/>
+          <w:sz w:val="24"/>
+          <w:szCs w:val="24"/>
+        </w:rPr>
+        <w:t xml:space="preserve"> however it was not forgotten.</w:t>
+      </w:r>
+    </w:p>
+    <w:p>
+      <w:pPr>
+        <w:pStyle w:val="ListParagraph"/>
+        <w:numPr>
+          <w:ilvl w:val="2"/>
+          <w:numId w:val="7"/>
+        </w:numPr>
+        <w:rPr>
+          <w:rFonts w:cstheme="minorHAnsi"/>
+          <w:color w:val="70AD47" w:themeColor="accent6"/>
+          <w:sz w:val="24"/>
+          <w:szCs w:val="24"/>
+        </w:rPr>
+      </w:pPr>
+      <w:r>
+        <w:rPr>
+          <w:rFonts w:cstheme="minorHAnsi"/>
+          <w:color w:val="70AD47" w:themeColor="accent6"/>
+          <w:sz w:val="24"/>
+          <w:szCs w:val="24"/>
+        </w:rPr>
+        <w:t>The rat was gone how</w:t>
+      </w:r>
+      <w:r>
+        <w:rPr>
+          <w:rFonts w:cstheme="minorHAnsi"/>
+          <w:color w:val="70AD47" w:themeColor="accent6"/>
+          <w:sz w:val="24"/>
+          <w:szCs w:val="24"/>
+        </w:rPr>
+        <w:t>ever it was not forgotten.</w:t>
+      </w:r>
+    </w:p>
+    <w:p>
+      <w:pPr>
+        <w:pStyle w:val="ListParagraph"/>
+        <w:numPr>
+          <w:ilvl w:val="2"/>
+          <w:numId w:val="7"/>
+        </w:numPr>
+        <w:rPr>
+          <w:rFonts w:cstheme="minorHAnsi"/>
+          <w:color w:val="70AD47" w:themeColor="accent6"/>
+          <w:sz w:val="24"/>
+          <w:szCs w:val="24"/>
+        </w:rPr>
+      </w:pPr>
+      <w:r>
+        <w:rPr>
+          <w:rFonts w:cstheme="minorHAnsi"/>
+          <w:color w:val="70AD47" w:themeColor="accent6"/>
+          <w:sz w:val="24"/>
+          <w:szCs w:val="24"/>
+        </w:rPr>
+        <w:lastRenderedPageBreak/>
+        <w:t>The rat was gone</w:t>
+      </w:r>
+      <w:r>
+        <w:rPr>
+          <w:rFonts w:cstheme="minorHAnsi"/>
+          <w:color w:val="70AD47" w:themeColor="accent6"/>
+          <w:sz w:val="24"/>
+          <w:szCs w:val="24"/>
+        </w:rPr>
+        <w:t>;</w:t>
+      </w:r>
+      <w:r>
+        <w:rPr>
+          <w:rFonts w:cstheme="minorHAnsi"/>
+          <w:color w:val="70AD47" w:themeColor="accent6"/>
+          <w:sz w:val="24"/>
+          <w:szCs w:val="24"/>
+        </w:rPr>
+        <w:t xml:space="preserve"> however</w:t>
+      </w:r>
+      <w:r>
+        <w:rPr>
+          <w:rFonts w:cstheme="minorHAnsi"/>
+          <w:color w:val="70AD47" w:themeColor="accent6"/>
+          <w:sz w:val="24"/>
+          <w:szCs w:val="24"/>
+        </w:rPr>
+        <w:t>,</w:t>
+      </w:r>
+      <w:r>
+        <w:rPr>
+          <w:rFonts w:cstheme="minorHAnsi"/>
+          <w:color w:val="70AD47" w:themeColor="accent6"/>
+          <w:sz w:val="24"/>
+          <w:szCs w:val="24"/>
+        </w:rPr>
+        <w:t xml:space="preserve"> it was not forgotten. </w:t>
+      </w:r>
+    </w:p>
+    <w:p>
+      <w:pPr>
+        <w:pStyle w:val="ListParagraph"/>
+        <w:numPr>
+          <w:ilvl w:val="1"/>
+          <w:numId w:val="7"/>
+        </w:numPr>
+        <w:rPr>
+          <w:rFonts w:cstheme="minorHAnsi"/>
+          <w:sz w:val="24"/>
+          <w:szCs w:val="24"/>
+        </w:rPr>
+      </w:pPr>
+      <w:r>
+        <w:rPr>
+          <w:rFonts w:cstheme="minorHAnsi"/>
+          <w:sz w:val="24"/>
+          <w:szCs w:val="24"/>
+        </w:rPr>
+        <w:t>FANBOYS: For and nor but or yet so.</w:t>
+      </w:r>
+    </w:p>
+    <w:p>
+      <w:pPr>
+        <w:pStyle w:val="ListParagraph"/>
+        <w:numPr>
+          <w:ilvl w:val="2"/>
+          <w:numId w:val="7"/>
+        </w:numPr>
+        <w:rPr>
+          <w:rFonts w:cstheme="minorHAnsi"/>
+          <w:color w:val="70AD47" w:themeColor="accent6"/>
+          <w:sz w:val="24"/>
+          <w:szCs w:val="24"/>
+        </w:rPr>
+      </w:pPr>
+      <w:r>
+        <w:rPr>
+          <w:rFonts w:cstheme="minorHAnsi"/>
+          <w:color w:val="70AD47" w:themeColor="accent6"/>
+          <w:sz w:val="24"/>
+          <w:szCs w:val="24"/>
+        </w:rPr>
+        <w:t xml:space="preserve">The rat </w:t>
+      </w:r>
+      <w:r>
+        <w:rPr>
+          <w:rFonts w:cstheme="minorHAnsi"/>
+          <w:color w:val="70AD47" w:themeColor="accent6"/>
+          <w:sz w:val="24"/>
+          <w:szCs w:val="24"/>
+        </w:rPr>
+        <w:t>squeaks and scurries.</w:t>
+      </w:r>
+    </w:p>
+    <w:p>
+      <w:pPr>
+        <w:pStyle w:val="ListParagraph"/>
+        <w:numPr>
+          <w:ilvl w:val="2"/>
+          <w:numId w:val="7"/>
+        </w:numPr>
+        <w:rPr>
+          <w:rFonts w:cstheme="minorHAnsi"/>
+          <w:color w:val="70AD47" w:themeColor="accent6"/>
+          <w:sz w:val="24"/>
+          <w:szCs w:val="24"/>
+        </w:rPr>
+      </w:pPr>
+      <w:r>
+        <w:rPr>
+          <w:rFonts w:cstheme="minorHAnsi"/>
+          <w:color w:val="70AD47" w:themeColor="accent6"/>
+          <w:sz w:val="24"/>
+          <w:szCs w:val="24"/>
+        </w:rPr>
+        <w:t>The rat squeaks, and the mouse scurries.</w:t>
+      </w:r>
+    </w:p>
+    <w:p>
+      <w:pPr>
+        <w:pStyle w:val="ListParagraph"/>
+        <w:numPr>
+          <w:ilvl w:val="1"/>
+          <w:numId w:val="7"/>
+        </w:numPr>
+        <w:rPr>
+          <w:rFonts w:cstheme="minorHAnsi"/>
+          <w:color w:val="70AD47" w:themeColor="accent6"/>
+          <w:sz w:val="24"/>
+          <w:szCs w:val="24"/>
+        </w:rPr>
+      </w:pPr>
+      <w:r>
+        <w:rPr>
+          <w:rFonts w:cstheme="minorHAnsi"/>
+          <w:sz w:val="24"/>
+          <w:szCs w:val="24"/>
+        </w:rPr>
+        <w:t>Be careful with ‘</w:t>
+      </w:r>
+      <w:proofErr w:type="gramStart"/>
+      <w:r>
+        <w:rPr>
+          <w:rFonts w:cstheme="minorHAnsi"/>
+          <w:sz w:val="24"/>
+          <w:szCs w:val="24"/>
+        </w:rPr>
+        <w:t>as’</w:t>
+      </w:r>
+      <w:proofErr w:type="gramEnd"/>
+      <w:r>
+        <w:rPr>
+          <w:rFonts w:cstheme="minorHAnsi"/>
+          <w:sz w:val="24"/>
+          <w:szCs w:val="24"/>
+        </w:rPr>
+        <w:t>. Without a comma as can be an adverb</w:t>
+      </w:r>
+      <w:r>
+        <w:rPr>
+          <w:rFonts w:cstheme="minorHAnsi"/>
+          <w:sz w:val="24"/>
+          <w:szCs w:val="24"/>
+        </w:rPr>
+        <w:t xml:space="preserve">: </w:t>
+      </w:r>
+      <w:r>
+        <w:rPr>
+          <w:rFonts w:cstheme="minorHAnsi"/>
+          <w:sz w:val="24"/>
+          <w:szCs w:val="24"/>
+        </w:rPr>
+        <w:t>I drove as it was snowing</w:t>
+      </w:r>
+      <w:r>
+        <w:rPr>
+          <w:rFonts w:cstheme="minorHAnsi"/>
+          <w:sz w:val="24"/>
+          <w:szCs w:val="24"/>
+        </w:rPr>
+        <w:t xml:space="preserve">. With a comma, </w:t>
+      </w:r>
+      <w:proofErr w:type="gramStart"/>
+      <w:r>
+        <w:rPr>
+          <w:rFonts w:cstheme="minorHAnsi"/>
+          <w:sz w:val="24"/>
+          <w:szCs w:val="24"/>
+        </w:rPr>
+        <w:t>it’s</w:t>
+      </w:r>
+      <w:proofErr w:type="gramEnd"/>
+      <w:r>
+        <w:rPr>
+          <w:rFonts w:cstheme="minorHAnsi"/>
+          <w:sz w:val="24"/>
+          <w:szCs w:val="24"/>
+        </w:rPr>
+        <w:t xml:space="preserve"> the start of a </w:t>
+      </w:r>
+      <w:r>
+        <w:rPr>
+          <w:rFonts w:cstheme="minorHAnsi"/>
+          <w:sz w:val="24"/>
+          <w:szCs w:val="24"/>
+        </w:rPr>
+        <w:t>clause</w:t>
+      </w:r>
+      <w:r>
+        <w:rPr>
+          <w:rFonts w:cstheme="minorHAnsi"/>
+          <w:sz w:val="24"/>
+          <w:szCs w:val="24"/>
+        </w:rPr>
+        <w:t xml:space="preserve">: I drove, as it was snowing. </w:t>
+      </w:r>
+      <w:r>
+        <w:rPr>
+          <w:rFonts w:cstheme="minorHAnsi"/>
+          <w:sz w:val="24"/>
+          <w:szCs w:val="24"/>
+        </w:rPr>
+        <w:t xml:space="preserve">To check if a comma is needed, try </w:t>
+      </w:r>
+      <w:r>
+        <w:rPr>
+          <w:rFonts w:cstheme="minorHAnsi"/>
+          <w:sz w:val="24"/>
+          <w:szCs w:val="24"/>
+        </w:rPr>
+        <w:t>replacing ‘</w:t>
+      </w:r>
+      <w:r>
+        <w:rPr>
+          <w:rFonts w:cstheme="minorHAnsi"/>
+          <w:sz w:val="24"/>
+          <w:szCs w:val="24"/>
+        </w:rPr>
+        <w:t xml:space="preserve">, </w:t>
+      </w:r>
+      <w:r>
+        <w:rPr>
+          <w:rFonts w:cstheme="minorHAnsi"/>
+          <w:sz w:val="24"/>
+          <w:szCs w:val="24"/>
+        </w:rPr>
+        <w:t>as’ with ‘since’</w:t>
+      </w:r>
+      <w:r>
+        <w:rPr>
+          <w:rFonts w:cstheme="minorHAnsi"/>
+          <w:sz w:val="24"/>
+          <w:szCs w:val="24"/>
+        </w:rPr>
+        <w:t xml:space="preserve"> or ‘because’</w:t>
+      </w:r>
+      <w:r>
+        <w:rPr>
+          <w:rFonts w:cstheme="minorHAnsi"/>
+          <w:sz w:val="24"/>
+          <w:szCs w:val="24"/>
+        </w:rPr>
+        <w:t xml:space="preserve">: I drove </w:t>
+      </w:r>
+      <w:r>
+        <w:rPr>
+          <w:rFonts w:cstheme="minorHAnsi"/>
+          <w:sz w:val="24"/>
+          <w:szCs w:val="24"/>
+        </w:rPr>
+        <w:t>because</w:t>
+      </w:r>
+      <w:r>
+        <w:rPr>
+          <w:rFonts w:cstheme="minorHAnsi"/>
+          <w:sz w:val="24"/>
+          <w:szCs w:val="24"/>
+        </w:rPr>
+        <w:t xml:space="preserve"> it was snowing</w:t>
+      </w:r>
+      <w:r>
+        <w:rPr>
+          <w:rFonts w:cstheme="minorHAnsi"/>
+          <w:sz w:val="24"/>
+          <w:szCs w:val="24"/>
+        </w:rPr>
+        <w:t>.</w:t>
+      </w:r>
+    </w:p>
+    <w:p>
+      <w:pPr>
+        <w:rPr>
+          <w:rFonts w:cstheme="minorHAnsi"/>
+          <w:color w:val="70AD47" w:themeColor="accent6"/>
+          <w:sz w:val="24"/>
+          <w:szCs w:val="24"/>
+        </w:rPr>
+      </w:pPr>
+    </w:p>
+    <w:p>
+      <w:pPr>
         <w:ind w:left="1080"/>
         <w:rPr>
           <w:rFonts w:cstheme="minorHAnsi"/>
@@ -2867,7 +3710,6 @@
           <w:sz w:val="24"/>
           <w:szCs w:val="24"/>
         </w:rPr>
-        <w:lastRenderedPageBreak/>
         <w:t>Passive voice, except where necessary.</w:t>
       </w:r>
     </w:p>
@@ -3344,12 +4186,21 @@
           <w:szCs w:val="24"/>
         </w:rPr>
       </w:pPr>
-      <w:r>
-        <w:rPr>
-          <w:sz w:val="24"/>
-          <w:szCs w:val="24"/>
-        </w:rPr>
-        <w:t>Ctrl+f 1, 2, 3, 4, 5, 6, 7, 8, 9 and 10, replace with one, two, three …</w:t>
+      <w:proofErr w:type="spellStart"/>
+      <w:r>
+        <w:rPr>
+          <w:sz w:val="24"/>
+          <w:szCs w:val="24"/>
+        </w:rPr>
+        <w:t>Ctrl+f</w:t>
+      </w:r>
+      <w:proofErr w:type="spellEnd"/>
+      <w:r>
+        <w:rPr>
+          <w:sz w:val="24"/>
+          <w:szCs w:val="24"/>
+        </w:rPr>
+        <w:t xml:space="preserve"> 1, 2, 3, 4, 5, 6, 7, 8, 9 and 10, replace with one, two, three …</w:t>
       </w:r>
     </w:p>
     <w:p>
@@ -3364,12 +4215,21 @@
           <w:szCs w:val="24"/>
         </w:rPr>
       </w:pPr>
-      <w:r>
-        <w:rPr>
-          <w:sz w:val="24"/>
-          <w:szCs w:val="24"/>
-        </w:rPr>
-        <w:t>Ctrl+f effect and affect</w:t>
+      <w:proofErr w:type="spellStart"/>
+      <w:r>
+        <w:rPr>
+          <w:sz w:val="24"/>
+          <w:szCs w:val="24"/>
+        </w:rPr>
+        <w:t>Ctrl+f</w:t>
+      </w:r>
+      <w:proofErr w:type="spellEnd"/>
+      <w:r>
+        <w:rPr>
+          <w:sz w:val="24"/>
+          <w:szCs w:val="24"/>
+        </w:rPr>
+        <w:t xml:space="preserve"> effect and affect</w:t>
       </w:r>
     </w:p>
     <w:p>
@@ -3384,20 +4244,38 @@
           <w:szCs w:val="24"/>
         </w:rPr>
       </w:pPr>
-      <w:r>
-        <w:rPr>
-          <w:sz w:val="24"/>
-          <w:szCs w:val="24"/>
-        </w:rPr>
-        <w:t xml:space="preserve">Ctrl+f </w:t>
-      </w:r>
-      <w:r>
-        <w:rPr>
-          <w:sz w:val="24"/>
-          <w:szCs w:val="24"/>
-        </w:rPr>
-        <w:t>the the</w:t>
-      </w:r>
+      <w:proofErr w:type="spellStart"/>
+      <w:r>
+        <w:rPr>
+          <w:sz w:val="24"/>
+          <w:szCs w:val="24"/>
+        </w:rPr>
+        <w:t>Ctrl+f</w:t>
+      </w:r>
+      <w:proofErr w:type="spellEnd"/>
+      <w:r>
+        <w:rPr>
+          <w:sz w:val="24"/>
+          <w:szCs w:val="24"/>
+        </w:rPr>
+        <w:t xml:space="preserve"> </w:t>
+      </w:r>
+      <w:r>
+        <w:rPr>
+          <w:sz w:val="24"/>
+          <w:szCs w:val="24"/>
+        </w:rPr>
+        <w:t xml:space="preserve">the </w:t>
+      </w:r>
+      <w:proofErr w:type="spellStart"/>
+      <w:r>
+        <w:rPr>
+          <w:sz w:val="24"/>
+          <w:szCs w:val="24"/>
+        </w:rPr>
+        <w:t>the</w:t>
+      </w:r>
+      <w:proofErr w:type="spellEnd"/>
     </w:p>
     <w:p>
       <w:pPr>
@@ -3416,7 +4294,23 @@
           <w:sz w:val="24"/>
           <w:szCs w:val="24"/>
         </w:rPr>
-        <w:t>Look for etc. and etc.~</w:t>
+        <w:t xml:space="preserve">Look for etc. </w:t>
+      </w:r>
+      <w:proofErr w:type="gramStart"/>
+      <w:r>
+        <w:rPr>
+          <w:sz w:val="24"/>
+          <w:szCs w:val="24"/>
+        </w:rPr>
+        <w:t>and etc.</w:t>
+      </w:r>
+      <w:proofErr w:type="gramEnd"/>
+      <w:r>
+        <w:rPr>
+          <w:sz w:val="24"/>
+          <w:szCs w:val="24"/>
+        </w:rPr>
+        <w:t>~</w:t>
       </w:r>
     </w:p>
     <w:p>
@@ -3456,8 +4350,17 @@
           <w:sz w:val="24"/>
           <w:szCs w:val="24"/>
         </w:rPr>
-        <w:t>Beam splitter, not beamsplitter</w:t>
-      </w:r>
+        <w:t xml:space="preserve">Beam splitter, not </w:t>
+      </w:r>
+      <w:proofErr w:type="spellStart"/>
+      <w:r>
+        <w:rPr>
+          <w:sz w:val="24"/>
+          <w:szCs w:val="24"/>
+        </w:rPr>
+        <w:t>beamsplitter</w:t>
+      </w:r>
+      <w:proofErr w:type="spellEnd"/>
     </w:p>
     <w:p>
       <w:pPr>
@@ -3503,7 +4406,24 @@
           <w:sz w:val="24"/>
           <w:szCs w:val="24"/>
         </w:rPr>
-        <w:t>Remove doesn’t, replace with does not, etc.</w:t>
+        <w:lastRenderedPageBreak/>
+        <w:t xml:space="preserve">Remove </w:t>
+      </w:r>
+      <w:proofErr w:type="gramStart"/>
+      <w:r>
+        <w:rPr>
+          <w:sz w:val="24"/>
+          <w:szCs w:val="24"/>
+        </w:rPr>
+        <w:t>doesn’t</w:t>
+      </w:r>
+      <w:proofErr w:type="gramEnd"/>
+      <w:r>
+        <w:rPr>
+          <w:sz w:val="24"/>
+          <w:szCs w:val="24"/>
+        </w:rPr>
+        <w:t>, replace with does not, etc.</w:t>
       </w:r>
     </w:p>
     <w:p>
@@ -3523,7 +4443,23 @@
           <w:sz w:val="24"/>
           <w:szCs w:val="24"/>
         </w:rPr>
-        <w:t xml:space="preserve">Effect is a noun, affect is a verb. </w:t>
+        <w:t xml:space="preserve">Effect is a </w:t>
+      </w:r>
+      <w:proofErr w:type="gramStart"/>
+      <w:r>
+        <w:rPr>
+          <w:sz w:val="24"/>
+          <w:szCs w:val="24"/>
+        </w:rPr>
+        <w:t>noun,</w:t>
+      </w:r>
+      <w:proofErr w:type="gramEnd"/>
+      <w:r>
+        <w:rPr>
+          <w:sz w:val="24"/>
+          <w:szCs w:val="24"/>
+        </w:rPr>
+        <w:t xml:space="preserve"> affect is a verb. </w:t>
       </w:r>
       <w:r>
         <w:rPr>
@@ -3715,7 +4651,23 @@
           <w:sz w:val="24"/>
           <w:szCs w:val="24"/>
         </w:rPr>
-        <w:t>Lots end in ‘ly’</w:t>
+        <w:t>Lots end in ‘</w:t>
+      </w:r>
+      <w:proofErr w:type="spellStart"/>
+      <w:r>
+        <w:rPr>
+          <w:sz w:val="24"/>
+          <w:szCs w:val="24"/>
+        </w:rPr>
+        <w:t>ly</w:t>
+      </w:r>
+      <w:proofErr w:type="spellEnd"/>
+      <w:r>
+        <w:rPr>
+          <w:sz w:val="24"/>
+          <w:szCs w:val="24"/>
+        </w:rPr>
+        <w:t>’</w:t>
       </w:r>
     </w:p>
     <w:p>
@@ -3833,6 +4785,7 @@
           <w:szCs w:val="24"/>
         </w:rPr>
       </w:pPr>
+      <w:proofErr w:type="gramStart"/>
       <w:r>
         <w:rPr>
           <w:sz w:val="24"/>
@@ -3840,6 +4793,7 @@
         </w:rPr>
         <w:t>Photo-diode</w:t>
       </w:r>
+      <w:proofErr w:type="gramEnd"/>
     </w:p>
     <w:p>
       <w:pPr>
@@ -3880,13 +4834,21 @@
           <w:szCs w:val="24"/>
         </w:rPr>
       </w:pPr>
-      <w:r>
-        <w:rPr>
-          <w:sz w:val="24"/>
-          <w:szCs w:val="24"/>
-        </w:rPr>
-        <w:lastRenderedPageBreak/>
-        <w:t xml:space="preserve">E.g </w:t>
+      <w:proofErr w:type="spellStart"/>
+      <w:r>
+        <w:rPr>
+          <w:sz w:val="24"/>
+          <w:szCs w:val="24"/>
+        </w:rPr>
+        <w:t>E.g</w:t>
+      </w:r>
+      <w:proofErr w:type="spellEnd"/>
+      <w:r>
+        <w:rPr>
+          <w:sz w:val="24"/>
+          <w:szCs w:val="24"/>
+        </w:rPr>
+        <w:t xml:space="preserve"> </w:t>
       </w:r>
       <w:r>
         <w:rPr>
@@ -3927,7 +4889,23 @@
           <w:sz w:val="24"/>
           <w:szCs w:val="24"/>
         </w:rPr>
-        <w:t>Current detector = aLIGO, future detector = LIGO A+, the detector in a general abstract sense = LIGO</w:t>
+        <w:t xml:space="preserve">Current detector = </w:t>
+      </w:r>
+      <w:proofErr w:type="spellStart"/>
+      <w:r>
+        <w:rPr>
+          <w:sz w:val="24"/>
+          <w:szCs w:val="24"/>
+        </w:rPr>
+        <w:t>aLIGO</w:t>
+      </w:r>
+      <w:proofErr w:type="spellEnd"/>
+      <w:r>
+        <w:rPr>
+          <w:sz w:val="24"/>
+          <w:szCs w:val="24"/>
+        </w:rPr>
+        <w:t>, future detector = LIGO A+, the detector in a general abstract sense = LIGO</w:t>
       </w:r>
     </w:p>
     <w:p>
@@ -3942,12 +4920,68 @@
           <w:szCs w:val="24"/>
         </w:rPr>
       </w:pPr>
-      <w:r>
-        <w:rPr>
-          <w:sz w:val="24"/>
-          <w:szCs w:val="24"/>
-        </w:rPr>
-        <w:t>None classical -&gt; non-classical</w:t>
+      <w:proofErr w:type="gramStart"/>
+      <w:r>
+        <w:rPr>
+          <w:sz w:val="24"/>
+          <w:szCs w:val="24"/>
+        </w:rPr>
+        <w:t>None classical</w:t>
+      </w:r>
+      <w:proofErr w:type="gramEnd"/>
+      <w:r>
+        <w:rPr>
+          <w:sz w:val="24"/>
+          <w:szCs w:val="24"/>
+        </w:rPr>
+        <w:t xml:space="preserve"> -&gt; non-classical</w:t>
+      </w:r>
+    </w:p>
+    <w:p>
+      <w:pPr>
+        <w:pStyle w:val="ListParagraph"/>
+        <w:numPr>
+          <w:ilvl w:val="0"/>
+          <w:numId w:val="6"/>
+        </w:numPr>
+        <w:rPr>
+          <w:sz w:val="24"/>
+          <w:szCs w:val="24"/>
+        </w:rPr>
+      </w:pPr>
+      <w:r>
+        <w:rPr>
+          <w:sz w:val="24"/>
+          <w:szCs w:val="24"/>
+        </w:rPr>
+        <w:t xml:space="preserve">Look for commas + conjunctive adverb </w:t>
+      </w:r>
+      <w:r>
+        <w:rPr>
+          <w:sz w:val="24"/>
+          <w:szCs w:val="24"/>
+        </w:rPr>
+        <w:t>error.</w:t>
+      </w:r>
+    </w:p>
+    <w:p>
+      <w:pPr>
+        <w:pStyle w:val="ListParagraph"/>
+        <w:numPr>
+          <w:ilvl w:val="0"/>
+          <w:numId w:val="6"/>
+        </w:numPr>
+        <w:rPr>
+          <w:sz w:val="24"/>
+          <w:szCs w:val="24"/>
+        </w:rPr>
+      </w:pPr>
+      <w:r>
+        <w:rPr>
+          <w:sz w:val="24"/>
+          <w:szCs w:val="24"/>
+        </w:rPr>
+        <w:t>Watch out for ‘ration’.</w:t>
       </w:r>
     </w:p>
     <w:p>
@@ -4017,7 +5051,39 @@
           <w:sz w:val="24"/>
           <w:szCs w:val="24"/>
         </w:rPr>
-        <w:t>Figures shall be saved as eps when using matplotlib or 'epsc' when using matlab. This is to prevent a latex warning.</w:t>
+        <w:t>Figures shall be saved as eps when using matplotlib or '</w:t>
+      </w:r>
+      <w:proofErr w:type="spellStart"/>
+      <w:r>
+        <w:rPr>
+          <w:sz w:val="24"/>
+          <w:szCs w:val="24"/>
+        </w:rPr>
+        <w:t>epsc</w:t>
+      </w:r>
+      <w:proofErr w:type="spellEnd"/>
+      <w:r>
+        <w:rPr>
+          <w:sz w:val="24"/>
+          <w:szCs w:val="24"/>
+        </w:rPr>
+        <w:t xml:space="preserve">' when using </w:t>
+      </w:r>
+      <w:proofErr w:type="spellStart"/>
+      <w:r>
+        <w:rPr>
+          <w:sz w:val="24"/>
+          <w:szCs w:val="24"/>
+        </w:rPr>
+        <w:t>matlab</w:t>
+      </w:r>
+      <w:proofErr w:type="spellEnd"/>
+      <w:r>
+        <w:rPr>
+          <w:sz w:val="24"/>
+          <w:szCs w:val="24"/>
+        </w:rPr>
+        <w:t>. This is to prevent a latex warning.</w:t>
       </w:r>
     </w:p>
     <w:p>
@@ -4071,7 +5137,23 @@
           <w:sz w:val="24"/>
           <w:szCs w:val="24"/>
         </w:rPr>
-        <w:t>Figure names shall be 'chapter description'_chapter_'figure description'. For</w:t>
+        <w:t xml:space="preserve">Figure names shall be 'chapter </w:t>
+      </w:r>
+      <w:proofErr w:type="spellStart"/>
+      <w:r>
+        <w:rPr>
+          <w:sz w:val="24"/>
+          <w:szCs w:val="24"/>
+        </w:rPr>
+        <w:t>description'_chapter_'figure</w:t>
+      </w:r>
+      <w:proofErr w:type="spellEnd"/>
+      <w:r>
+        <w:rPr>
+          <w:sz w:val="24"/>
+          <w:szCs w:val="24"/>
+        </w:rPr>
+        <w:t xml:space="preserve"> description'. For</w:t>
       </w:r>
       <w:r>
         <w:rPr>
@@ -4085,7 +5167,23 @@
           <w:sz w:val="24"/>
           <w:szCs w:val="24"/>
         </w:rPr>
-        <w:t>example, 'sim_chapter_Zoom_in_ETM_tuning' refers to the figure being in the</w:t>
+        <w:t>example, '</w:t>
+      </w:r>
+      <w:proofErr w:type="spellStart"/>
+      <w:r>
+        <w:rPr>
+          <w:sz w:val="24"/>
+          <w:szCs w:val="24"/>
+        </w:rPr>
+        <w:t>sim_chapter_Zoom_in_ETM_tuning</w:t>
+      </w:r>
+      <w:proofErr w:type="spellEnd"/>
+      <w:r>
+        <w:rPr>
+          <w:sz w:val="24"/>
+          <w:szCs w:val="24"/>
+        </w:rPr>
+        <w:t>' refers to the figure being in the</w:t>
       </w:r>
       <w:r>
         <w:rPr>
@@ -4139,7 +5237,23 @@
           <w:sz w:val="24"/>
           <w:szCs w:val="24"/>
         </w:rPr>
-        <w:t>Are all lines visible/distinguishable? Changing thickness and linestyle can help.</w:t>
+        <w:t xml:space="preserve">Are all lines visible/distinguishable? Changing thickness and </w:t>
+      </w:r>
+      <w:proofErr w:type="spellStart"/>
+      <w:r>
+        <w:rPr>
+          <w:sz w:val="24"/>
+          <w:szCs w:val="24"/>
+        </w:rPr>
+        <w:t>linestyle</w:t>
+      </w:r>
+      <w:proofErr w:type="spellEnd"/>
+      <w:r>
+        <w:rPr>
+          <w:sz w:val="24"/>
+          <w:szCs w:val="24"/>
+        </w:rPr>
+        <w:t xml:space="preserve"> can help.</w:t>
       </w:r>
     </w:p>
     <w:p>
@@ -4154,12 +5268,37 @@
           <w:szCs w:val="24"/>
         </w:rPr>
       </w:pPr>
-      <w:r>
-        <w:rPr>
-          <w:sz w:val="24"/>
-          <w:szCs w:val="24"/>
-        </w:rPr>
-        <w:t>Are the axis labelled? The label is a sentence, so normal sentence capitalisation should be used. If its just one word, use a capital letter.</w:t>
+      <w:proofErr w:type="gramStart"/>
+      <w:r>
+        <w:rPr>
+          <w:sz w:val="24"/>
+          <w:szCs w:val="24"/>
+        </w:rPr>
+        <w:t>Are</w:t>
+      </w:r>
+      <w:proofErr w:type="gramEnd"/>
+      <w:r>
+        <w:rPr>
+          <w:sz w:val="24"/>
+          <w:szCs w:val="24"/>
+        </w:rPr>
+        <w:t xml:space="preserve"> the axis labelled? The label is a sentence, so normal sentence capitalisation should be used. If </w:t>
+      </w:r>
+      <w:proofErr w:type="spellStart"/>
+      <w:r>
+        <w:rPr>
+          <w:sz w:val="24"/>
+          <w:szCs w:val="24"/>
+        </w:rPr>
+        <w:t>its</w:t>
+      </w:r>
+      <w:proofErr w:type="spellEnd"/>
+      <w:r>
+        <w:rPr>
+          <w:sz w:val="24"/>
+          <w:szCs w:val="24"/>
+        </w:rPr>
+        <w:t xml:space="preserve"> just one word, use a capital letter.</w:t>
       </w:r>
     </w:p>
     <w:p>
@@ -4194,12 +5333,21 @@
           <w:szCs w:val="24"/>
         </w:rPr>
       </w:pPr>
-      <w:r>
-        <w:rPr>
-          <w:sz w:val="24"/>
-          <w:szCs w:val="24"/>
-        </w:rPr>
-        <w:t>Do the axis have units? The units should be put in brackets like (m). No other shape of brackets should be used.</w:t>
+      <w:proofErr w:type="gramStart"/>
+      <w:r>
+        <w:rPr>
+          <w:sz w:val="24"/>
+          <w:szCs w:val="24"/>
+        </w:rPr>
+        <w:t>Do</w:t>
+      </w:r>
+      <w:proofErr w:type="gramEnd"/>
+      <w:r>
+        <w:rPr>
+          <w:sz w:val="24"/>
+          <w:szCs w:val="24"/>
+        </w:rPr>
+        <w:t xml:space="preserve"> the axis have units? The units should be put in brackets like (m). No other shape of brackets should be used.</w:t>
       </w:r>
     </w:p>
     <w:p>
@@ -4239,7 +5387,23 @@
           <w:sz w:val="24"/>
           <w:szCs w:val="24"/>
         </w:rPr>
-        <w:t>Are subscripts properly typset?</w:t>
+        <w:t xml:space="preserve">Are subscripts properly </w:t>
+      </w:r>
+      <w:proofErr w:type="spellStart"/>
+      <w:r>
+        <w:rPr>
+          <w:sz w:val="24"/>
+          <w:szCs w:val="24"/>
+        </w:rPr>
+        <w:t>typset</w:t>
+      </w:r>
+      <w:proofErr w:type="spellEnd"/>
+      <w:r>
+        <w:rPr>
+          <w:sz w:val="24"/>
+          <w:szCs w:val="24"/>
+        </w:rPr>
+        <w:t>?</w:t>
       </w:r>
     </w:p>
     <w:p>
@@ -4259,7 +5423,39 @@
           <w:sz w:val="24"/>
           <w:szCs w:val="24"/>
         </w:rPr>
-        <w:t>Have standard unit labels been used? A for amps, degree symbols instead of 'deg' etc.</w:t>
+        <w:t xml:space="preserve">Have standard unit labels been used? </w:t>
+      </w:r>
+      <w:proofErr w:type="gramStart"/>
+      <w:r>
+        <w:rPr>
+          <w:sz w:val="24"/>
+          <w:szCs w:val="24"/>
+        </w:rPr>
+        <w:t>A for</w:t>
+      </w:r>
+      <w:proofErr w:type="gramEnd"/>
+      <w:r>
+        <w:rPr>
+          <w:sz w:val="24"/>
+          <w:szCs w:val="24"/>
+        </w:rPr>
+        <w:t xml:space="preserve"> amps, degree symbols instead of '</w:t>
+      </w:r>
+      <w:proofErr w:type="spellStart"/>
+      <w:r>
+        <w:rPr>
+          <w:sz w:val="24"/>
+          <w:szCs w:val="24"/>
+        </w:rPr>
+        <w:t>deg</w:t>
+      </w:r>
+      <w:proofErr w:type="spellEnd"/>
+      <w:r>
+        <w:rPr>
+          <w:sz w:val="24"/>
+          <w:szCs w:val="24"/>
+        </w:rPr>
+        <w:t>' etc.</w:t>
       </w:r>
     </w:p>
     <w:p>
@@ -4299,7 +5495,24 @@
           <w:sz w:val="24"/>
           <w:szCs w:val="24"/>
         </w:rPr>
-        <w:t>Check for spelling mistakes! e.g. freuqency -&gt; frequency.</w:t>
+        <w:lastRenderedPageBreak/>
+        <w:t xml:space="preserve">Check for spelling mistakes! e.g. </w:t>
+      </w:r>
+      <w:proofErr w:type="spellStart"/>
+      <w:r>
+        <w:rPr>
+          <w:sz w:val="24"/>
+          <w:szCs w:val="24"/>
+        </w:rPr>
+        <w:t>freuqency</w:t>
+      </w:r>
+      <w:proofErr w:type="spellEnd"/>
+      <w:r>
+        <w:rPr>
+          <w:sz w:val="24"/>
+          <w:szCs w:val="24"/>
+        </w:rPr>
+        <w:t xml:space="preserve"> -&gt; frequency.</w:t>
       </w:r>
     </w:p>
     <w:p>
@@ -4402,7 +5615,23 @@
           <w:sz w:val="24"/>
           <w:szCs w:val="24"/>
         </w:rPr>
-        <w:t>Standard matlab and matplotlib fonts will be used. The following examples give</w:t>
+        <w:t xml:space="preserve">Standard </w:t>
+      </w:r>
+      <w:proofErr w:type="spellStart"/>
+      <w:r>
+        <w:rPr>
+          <w:sz w:val="24"/>
+          <w:szCs w:val="24"/>
+        </w:rPr>
+        <w:t>matlab</w:t>
+      </w:r>
+      <w:proofErr w:type="spellEnd"/>
+      <w:r>
+        <w:rPr>
+          <w:sz w:val="24"/>
+          <w:szCs w:val="24"/>
+        </w:rPr>
+        <w:t xml:space="preserve"> and matplotlib fonts will be used. The following examples give</w:t>
       </w:r>
       <w:r>
         <w:rPr>
@@ -4505,7 +5734,55 @@
           <w:sz w:val="24"/>
           <w:szCs w:val="24"/>
         </w:rPr>
-        <w:t>have ‘shared axis’, only label one of the axis. If it’s the xaxis, then label the bottom one. If it’s the y axis, label the left one.</w:t>
+        <w:t xml:space="preserve">have ‘shared axis’, only label one of the axis. If </w:t>
+      </w:r>
+      <w:proofErr w:type="gramStart"/>
+      <w:r>
+        <w:rPr>
+          <w:sz w:val="24"/>
+          <w:szCs w:val="24"/>
+        </w:rPr>
+        <w:t>it’s</w:t>
+      </w:r>
+      <w:proofErr w:type="gramEnd"/>
+      <w:r>
+        <w:rPr>
+          <w:sz w:val="24"/>
+          <w:szCs w:val="24"/>
+        </w:rPr>
+        <w:t xml:space="preserve"> the </w:t>
+      </w:r>
+      <w:proofErr w:type="spellStart"/>
+      <w:r>
+        <w:rPr>
+          <w:sz w:val="24"/>
+          <w:szCs w:val="24"/>
+        </w:rPr>
+        <w:t>xaxis</w:t>
+      </w:r>
+      <w:proofErr w:type="spellEnd"/>
+      <w:r>
+        <w:rPr>
+          <w:sz w:val="24"/>
+          <w:szCs w:val="24"/>
+        </w:rPr>
+        <w:t xml:space="preserve">, then label the bottom one. If </w:t>
+      </w:r>
+      <w:proofErr w:type="gramStart"/>
+      <w:r>
+        <w:rPr>
+          <w:sz w:val="24"/>
+          <w:szCs w:val="24"/>
+        </w:rPr>
+        <w:t>it’s</w:t>
+      </w:r>
+      <w:proofErr w:type="gramEnd"/>
+      <w:r>
+        <w:rPr>
+          <w:sz w:val="24"/>
+          <w:szCs w:val="24"/>
+        </w:rPr>
+        <w:t xml:space="preserve"> the y axis, label the left one.</w:t>
       </w:r>
     </w:p>
     <w:p>
@@ -4526,494 +5803,808 @@
           <w:sz w:val="24"/>
           <w:szCs w:val="24"/>
         </w:rPr>
+        <w:t>Matplotlib</w:t>
+      </w:r>
+    </w:p>
+    <w:p>
+      <w:pPr>
+        <w:rPr>
+          <w:sz w:val="24"/>
+          <w:szCs w:val="24"/>
+        </w:rPr>
+      </w:pPr>
+      <w:r>
+        <w:rPr>
+          <w:sz w:val="24"/>
+          <w:szCs w:val="24"/>
+        </w:rPr>
+        <w:t>In general, for matplotlib figures use</w:t>
+      </w:r>
+      <w:r>
+        <w:rPr>
+          <w:sz w:val="24"/>
+          <w:szCs w:val="24"/>
+        </w:rPr>
+        <w:t xml:space="preserve"> line width = </w:t>
+      </w:r>
+      <w:r>
+        <w:rPr>
+          <w:sz w:val="24"/>
+          <w:szCs w:val="24"/>
+        </w:rPr>
+        <w:t xml:space="preserve">3 for easy to see lines, for lines which need some detail, use 1 or 2. </w:t>
+      </w:r>
+      <w:r>
+        <w:rPr>
+          <w:sz w:val="24"/>
+          <w:szCs w:val="24"/>
+        </w:rPr>
+        <w:t xml:space="preserve"> </w:t>
+      </w:r>
+      <w:proofErr w:type="spellStart"/>
+      <w:r>
+        <w:rPr>
+          <w:sz w:val="24"/>
+          <w:szCs w:val="24"/>
+        </w:rPr>
+        <w:t>fontsize</w:t>
+      </w:r>
+      <w:proofErr w:type="spellEnd"/>
+      <w:r>
+        <w:rPr>
+          <w:sz w:val="24"/>
+          <w:szCs w:val="24"/>
+        </w:rPr>
+        <w:t xml:space="preserve"> = </w:t>
+      </w:r>
+      <w:r>
+        <w:rPr>
+          <w:sz w:val="24"/>
+          <w:szCs w:val="24"/>
+        </w:rPr>
+        <w:t>11.5</w:t>
+      </w:r>
+      <w:r>
+        <w:rPr>
+          <w:sz w:val="24"/>
+          <w:szCs w:val="24"/>
+        </w:rPr>
+        <w:t xml:space="preserve"> on axis</w:t>
+      </w:r>
+      <w:r>
+        <w:rPr>
+          <w:sz w:val="24"/>
+          <w:szCs w:val="24"/>
+        </w:rPr>
+        <w:t xml:space="preserve">.  Font size set to </w:t>
+      </w:r>
+      <w:r>
+        <w:rPr>
+          <w:sz w:val="24"/>
+          <w:szCs w:val="24"/>
+        </w:rPr>
+        <w:t>10</w:t>
+      </w:r>
+      <w:r>
+        <w:rPr>
+          <w:sz w:val="24"/>
+          <w:szCs w:val="24"/>
+        </w:rPr>
+        <w:t xml:space="preserve"> in the legend</w:t>
+      </w:r>
+      <w:r>
+        <w:rPr>
+          <w:sz w:val="24"/>
+          <w:szCs w:val="24"/>
+        </w:rPr>
+        <w:t>. Axis set to default</w:t>
+      </w:r>
+      <w:r>
+        <w:rPr>
+          <w:sz w:val="24"/>
+          <w:szCs w:val="24"/>
+        </w:rPr>
+        <w:t xml:space="preserve">. If the legend looks too big, try splitting it into multiple columns. If this </w:t>
+      </w:r>
+      <w:proofErr w:type="gramStart"/>
+      <w:r>
+        <w:rPr>
+          <w:sz w:val="24"/>
+          <w:szCs w:val="24"/>
+        </w:rPr>
+        <w:t>doesn’t</w:t>
+      </w:r>
+      <w:proofErr w:type="gramEnd"/>
+      <w:r>
+        <w:rPr>
+          <w:sz w:val="24"/>
+          <w:szCs w:val="24"/>
+        </w:rPr>
+        <w:t xml:space="preserve"> work, reduce the</w:t>
+      </w:r>
+      <w:r>
+        <w:rPr>
+          <w:sz w:val="24"/>
+          <w:szCs w:val="24"/>
+        </w:rPr>
+        <w:t xml:space="preserve"> </w:t>
+      </w:r>
+      <w:proofErr w:type="spellStart"/>
+      <w:r>
+        <w:rPr>
+          <w:sz w:val="24"/>
+          <w:szCs w:val="24"/>
+        </w:rPr>
+        <w:t>fontsize</w:t>
+      </w:r>
+      <w:proofErr w:type="spellEnd"/>
+      <w:r>
+        <w:rPr>
+          <w:sz w:val="24"/>
+          <w:szCs w:val="24"/>
+        </w:rPr>
+        <w:t xml:space="preserve"> </w:t>
+      </w:r>
+      <w:r>
+        <w:rPr>
+          <w:sz w:val="24"/>
+          <w:szCs w:val="24"/>
+        </w:rPr>
+        <w:t>to</w:t>
+      </w:r>
+      <w:r>
+        <w:rPr>
+          <w:sz w:val="24"/>
+          <w:szCs w:val="24"/>
+        </w:rPr>
+        <w:t xml:space="preserve"> </w:t>
+      </w:r>
+      <w:r>
+        <w:rPr>
+          <w:sz w:val="24"/>
+          <w:szCs w:val="24"/>
+        </w:rPr>
+        <w:t>10 or 8</w:t>
+      </w:r>
+      <w:r>
+        <w:rPr>
+          <w:sz w:val="24"/>
+          <w:szCs w:val="24"/>
+        </w:rPr>
+        <w:t xml:space="preserve"> for</w:t>
+      </w:r>
+      <w:r>
+        <w:rPr>
+          <w:sz w:val="24"/>
+          <w:szCs w:val="24"/>
+        </w:rPr>
+        <w:t xml:space="preserve"> the</w:t>
+      </w:r>
+      <w:r>
+        <w:rPr>
+          <w:sz w:val="24"/>
+          <w:szCs w:val="24"/>
+        </w:rPr>
+        <w:t xml:space="preserve"> legend. </w:t>
+      </w:r>
+      <w:r>
+        <w:rPr>
+          <w:sz w:val="24"/>
+          <w:szCs w:val="24"/>
+        </w:rPr>
+        <w:t>Standard matplotlib colours are nice. Standard font is nice</w:t>
+      </w:r>
+    </w:p>
+    <w:p>
+      <w:pPr>
+        <w:rPr>
+          <w:sz w:val="24"/>
+          <w:szCs w:val="24"/>
+        </w:rPr>
+      </w:pPr>
+    </w:p>
+    <w:p>
+      <w:pPr>
+        <w:rPr>
+          <w:rFonts w:ascii="SimSun" w:eastAsia="SimSun" w:hAnsi="SimSun"/>
+          <w:sz w:val="24"/>
+          <w:szCs w:val="24"/>
+        </w:rPr>
+      </w:pPr>
+      <w:proofErr w:type="spellStart"/>
+      <w:r>
+        <w:rPr>
+          <w:rFonts w:ascii="SimSun" w:eastAsia="SimSun" w:hAnsi="SimSun"/>
+          <w:sz w:val="24"/>
+          <w:szCs w:val="24"/>
+        </w:rPr>
+        <w:t>figure_size</w:t>
+      </w:r>
+      <w:proofErr w:type="spellEnd"/>
+      <w:r>
+        <w:rPr>
+          <w:rFonts w:ascii="SimSun" w:eastAsia="SimSun" w:hAnsi="SimSun"/>
+          <w:sz w:val="24"/>
+          <w:szCs w:val="24"/>
+        </w:rPr>
+        <w:t xml:space="preserve"> = (6,</w:t>
+      </w:r>
+      <w:r>
+        <w:rPr>
+          <w:rFonts w:ascii="SimSun" w:eastAsia="SimSun" w:hAnsi="SimSun"/>
+          <w:sz w:val="24"/>
+          <w:szCs w:val="24"/>
+        </w:rPr>
+        <w:t>3.5</w:t>
+      </w:r>
+      <w:r>
+        <w:rPr>
+          <w:rFonts w:ascii="SimSun" w:eastAsia="SimSun" w:hAnsi="SimSun"/>
+          <w:sz w:val="24"/>
+          <w:szCs w:val="24"/>
+        </w:rPr>
+        <w:t>)</w:t>
+      </w:r>
+    </w:p>
+    <w:p>
+      <w:pPr>
+        <w:rPr>
+          <w:rFonts w:ascii="SimSun" w:eastAsia="SimSun" w:hAnsi="SimSun"/>
+          <w:sz w:val="24"/>
+          <w:szCs w:val="24"/>
+        </w:rPr>
+      </w:pPr>
+      <w:proofErr w:type="spellStart"/>
+      <w:proofErr w:type="gramStart"/>
+      <w:r>
+        <w:rPr>
+          <w:rFonts w:ascii="SimSun" w:eastAsia="SimSun" w:hAnsi="SimSun"/>
+          <w:sz w:val="24"/>
+          <w:szCs w:val="24"/>
+        </w:rPr>
+        <w:t>plt.figure</w:t>
+      </w:r>
+      <w:proofErr w:type="spellEnd"/>
+      <w:proofErr w:type="gramEnd"/>
+      <w:r>
+        <w:rPr>
+          <w:rFonts w:ascii="SimSun" w:eastAsia="SimSun" w:hAnsi="SimSun"/>
+          <w:sz w:val="24"/>
+          <w:szCs w:val="24"/>
+        </w:rPr>
+        <w:t>(</w:t>
+      </w:r>
+      <w:proofErr w:type="spellStart"/>
+      <w:r>
+        <w:rPr>
+          <w:rFonts w:ascii="SimSun" w:eastAsia="SimSun" w:hAnsi="SimSun"/>
+          <w:sz w:val="24"/>
+          <w:szCs w:val="24"/>
+        </w:rPr>
+        <w:t>figsize</w:t>
+      </w:r>
+      <w:proofErr w:type="spellEnd"/>
+      <w:r>
+        <w:rPr>
+          <w:rFonts w:ascii="SimSun" w:eastAsia="SimSun" w:hAnsi="SimSun"/>
+          <w:sz w:val="24"/>
+          <w:szCs w:val="24"/>
+        </w:rPr>
+        <w:t xml:space="preserve"> = </w:t>
+      </w:r>
+      <w:proofErr w:type="spellStart"/>
+      <w:r>
+        <w:rPr>
+          <w:rFonts w:ascii="SimSun" w:eastAsia="SimSun" w:hAnsi="SimSun"/>
+          <w:sz w:val="24"/>
+          <w:szCs w:val="24"/>
+        </w:rPr>
+        <w:t>figure_size,dpi</w:t>
+      </w:r>
+      <w:proofErr w:type="spellEnd"/>
+      <w:r>
+        <w:rPr>
+          <w:rFonts w:ascii="SimSun" w:eastAsia="SimSun" w:hAnsi="SimSun"/>
+          <w:sz w:val="24"/>
+          <w:szCs w:val="24"/>
+        </w:rPr>
+        <w:t xml:space="preserve"> = </w:t>
+      </w:r>
+      <w:r>
+        <w:rPr>
+          <w:rFonts w:ascii="SimSun" w:eastAsia="SimSun" w:hAnsi="SimSun"/>
+          <w:sz w:val="24"/>
+          <w:szCs w:val="24"/>
+        </w:rPr>
+        <w:t>15</w:t>
+      </w:r>
+      <w:r>
+        <w:rPr>
+          <w:rFonts w:ascii="SimSun" w:eastAsia="SimSun" w:hAnsi="SimSun"/>
+          <w:sz w:val="24"/>
+          <w:szCs w:val="24"/>
+        </w:rPr>
+        <w:t>0)</w:t>
+      </w:r>
+    </w:p>
+    <w:p>
+      <w:pPr>
+        <w:rPr>
+          <w:rFonts w:ascii="SimSun" w:eastAsia="SimSun" w:hAnsi="SimSun"/>
+          <w:sz w:val="24"/>
+          <w:szCs w:val="24"/>
+        </w:rPr>
+      </w:pPr>
+      <w:proofErr w:type="spellStart"/>
+      <w:proofErr w:type="gramStart"/>
+      <w:r>
+        <w:rPr>
+          <w:rFonts w:ascii="SimSun" w:eastAsia="SimSun" w:hAnsi="SimSun"/>
+          <w:sz w:val="24"/>
+          <w:szCs w:val="24"/>
+        </w:rPr>
+        <w:t>plt.plot</w:t>
+      </w:r>
+      <w:proofErr w:type="spellEnd"/>
+      <w:proofErr w:type="gramEnd"/>
+      <w:r>
+        <w:rPr>
+          <w:rFonts w:ascii="SimSun" w:eastAsia="SimSun" w:hAnsi="SimSun"/>
+          <w:sz w:val="24"/>
+          <w:szCs w:val="24"/>
+        </w:rPr>
+        <w:t>(</w:t>
+      </w:r>
+      <w:proofErr w:type="spellStart"/>
+      <w:r>
+        <w:rPr>
+          <w:rFonts w:ascii="SimSun" w:eastAsia="SimSun" w:hAnsi="SimSun"/>
+          <w:sz w:val="24"/>
+          <w:szCs w:val="24"/>
+        </w:rPr>
+        <w:t>x,y,label</w:t>
+      </w:r>
+      <w:proofErr w:type="spellEnd"/>
+      <w:r>
+        <w:rPr>
+          <w:rFonts w:ascii="SimSun" w:eastAsia="SimSun" w:hAnsi="SimSun"/>
+          <w:sz w:val="24"/>
+          <w:szCs w:val="24"/>
+        </w:rPr>
+        <w:t xml:space="preserve"> = 'Name of line')</w:t>
+      </w:r>
+    </w:p>
+    <w:p>
+      <w:pPr>
+        <w:rPr>
+          <w:rFonts w:ascii="SimSun" w:eastAsia="SimSun" w:hAnsi="SimSun"/>
+          <w:sz w:val="24"/>
+          <w:szCs w:val="24"/>
+        </w:rPr>
+      </w:pPr>
+      <w:proofErr w:type="spellStart"/>
+      <w:proofErr w:type="gramStart"/>
+      <w:r>
+        <w:rPr>
+          <w:rFonts w:ascii="SimSun" w:eastAsia="SimSun" w:hAnsi="SimSun"/>
+          <w:sz w:val="24"/>
+          <w:szCs w:val="24"/>
+        </w:rPr>
+        <w:t>plt.legend</w:t>
+      </w:r>
+      <w:proofErr w:type="spellEnd"/>
+      <w:proofErr w:type="gramEnd"/>
+      <w:r>
+        <w:rPr>
+          <w:rFonts w:ascii="SimSun" w:eastAsia="SimSun" w:hAnsi="SimSun"/>
+          <w:sz w:val="24"/>
+          <w:szCs w:val="24"/>
+        </w:rPr>
+        <w:t>(prop={'size': 8},</w:t>
+      </w:r>
+      <w:proofErr w:type="spellStart"/>
+      <w:r>
+        <w:rPr>
+          <w:rFonts w:ascii="SimSun" w:eastAsia="SimSun" w:hAnsi="SimSun"/>
+          <w:sz w:val="24"/>
+          <w:szCs w:val="24"/>
+        </w:rPr>
+        <w:t>loc</w:t>
+      </w:r>
+      <w:proofErr w:type="spellEnd"/>
+      <w:r>
+        <w:rPr>
+          <w:rFonts w:ascii="SimSun" w:eastAsia="SimSun" w:hAnsi="SimSun"/>
+          <w:sz w:val="24"/>
+          <w:szCs w:val="24"/>
+        </w:rPr>
+        <w:t xml:space="preserve"> = 'lower left')</w:t>
+      </w:r>
+    </w:p>
+    <w:p>
+      <w:pPr>
+        <w:rPr>
+          <w:rFonts w:ascii="SimSun" w:eastAsia="SimSun" w:hAnsi="SimSun"/>
+          <w:sz w:val="24"/>
+          <w:szCs w:val="24"/>
+        </w:rPr>
+      </w:pPr>
+      <w:proofErr w:type="spellStart"/>
+      <w:proofErr w:type="gramStart"/>
+      <w:r>
+        <w:rPr>
+          <w:rFonts w:ascii="SimSun" w:eastAsia="SimSun" w:hAnsi="SimSun"/>
+          <w:sz w:val="24"/>
+          <w:szCs w:val="24"/>
+        </w:rPr>
+        <w:t>plt.xlabel</w:t>
+      </w:r>
+      <w:proofErr w:type="spellEnd"/>
+      <w:proofErr w:type="gramEnd"/>
+      <w:r>
+        <w:rPr>
+          <w:rFonts w:ascii="SimSun" w:eastAsia="SimSun" w:hAnsi="SimSun"/>
+          <w:sz w:val="24"/>
+          <w:szCs w:val="24"/>
+        </w:rPr>
+        <w:t>('x axis (units)'</w:t>
+      </w:r>
+      <w:r>
+        <w:rPr>
+          <w:rFonts w:ascii="SimSun" w:eastAsia="SimSun" w:hAnsi="SimSun"/>
+          <w:sz w:val="24"/>
+          <w:szCs w:val="24"/>
+        </w:rPr>
+        <w:t>,</w:t>
+      </w:r>
+      <w:r>
+        <w:t xml:space="preserve"> </w:t>
+      </w:r>
+      <w:proofErr w:type="spellStart"/>
+      <w:r>
+        <w:rPr>
+          <w:rFonts w:ascii="SimSun" w:eastAsia="SimSun" w:hAnsi="SimSun"/>
+          <w:sz w:val="24"/>
+          <w:szCs w:val="24"/>
+        </w:rPr>
+        <w:t>fontsize</w:t>
+      </w:r>
+      <w:proofErr w:type="spellEnd"/>
+      <w:r>
+        <w:rPr>
+          <w:rFonts w:ascii="SimSun" w:eastAsia="SimSun" w:hAnsi="SimSun"/>
+          <w:sz w:val="24"/>
+          <w:szCs w:val="24"/>
+        </w:rPr>
+        <w:t xml:space="preserve"> = 1</w:t>
+      </w:r>
+      <w:r>
+        <w:rPr>
+          <w:rFonts w:ascii="SimSun" w:eastAsia="SimSun" w:hAnsi="SimSun"/>
+          <w:sz w:val="24"/>
+          <w:szCs w:val="24"/>
+        </w:rPr>
+        <w:t>2</w:t>
+      </w:r>
+      <w:r>
+        <w:rPr>
+          <w:rFonts w:ascii="SimSun" w:eastAsia="SimSun" w:hAnsi="SimSun"/>
+          <w:sz w:val="24"/>
+          <w:szCs w:val="24"/>
+        </w:rPr>
+        <w:t>)</w:t>
+      </w:r>
+    </w:p>
+    <w:p>
+      <w:pPr>
+        <w:rPr>
+          <w:rFonts w:ascii="SimSun" w:eastAsia="SimSun" w:hAnsi="SimSun"/>
+          <w:sz w:val="24"/>
+          <w:szCs w:val="24"/>
+        </w:rPr>
+      </w:pPr>
+      <w:proofErr w:type="spellStart"/>
+      <w:proofErr w:type="gramStart"/>
+      <w:r>
+        <w:rPr>
+          <w:rFonts w:ascii="SimSun" w:eastAsia="SimSun" w:hAnsi="SimSun"/>
+          <w:sz w:val="24"/>
+          <w:szCs w:val="24"/>
+        </w:rPr>
+        <w:t>plt.ylabel</w:t>
+      </w:r>
+      <w:proofErr w:type="spellEnd"/>
+      <w:proofErr w:type="gramEnd"/>
+      <w:r>
+        <w:rPr>
+          <w:rFonts w:ascii="SimSun" w:eastAsia="SimSun" w:hAnsi="SimSun"/>
+          <w:sz w:val="24"/>
+          <w:szCs w:val="24"/>
+        </w:rPr>
+        <w:t>('y axis (units)'</w:t>
+      </w:r>
+      <w:r>
+        <w:rPr>
+          <w:rFonts w:ascii="SimSun" w:eastAsia="SimSun" w:hAnsi="SimSun"/>
+          <w:sz w:val="24"/>
+          <w:szCs w:val="24"/>
+        </w:rPr>
+        <w:t>,</w:t>
+      </w:r>
+      <w:r>
+        <w:t xml:space="preserve"> </w:t>
+      </w:r>
+      <w:proofErr w:type="spellStart"/>
+      <w:r>
+        <w:rPr>
+          <w:rFonts w:ascii="SimSun" w:eastAsia="SimSun" w:hAnsi="SimSun"/>
+          <w:sz w:val="24"/>
+          <w:szCs w:val="24"/>
+        </w:rPr>
+        <w:t>fontsize</w:t>
+      </w:r>
+      <w:proofErr w:type="spellEnd"/>
+      <w:r>
+        <w:rPr>
+          <w:rFonts w:ascii="SimSun" w:eastAsia="SimSun" w:hAnsi="SimSun"/>
+          <w:sz w:val="24"/>
+          <w:szCs w:val="24"/>
+        </w:rPr>
+        <w:t xml:space="preserve"> = 1</w:t>
+      </w:r>
+      <w:r>
+        <w:rPr>
+          <w:rFonts w:ascii="SimSun" w:eastAsia="SimSun" w:hAnsi="SimSun"/>
+          <w:sz w:val="24"/>
+          <w:szCs w:val="24"/>
+        </w:rPr>
+        <w:t>2</w:t>
+      </w:r>
+      <w:r>
+        <w:rPr>
+          <w:rFonts w:ascii="SimSun" w:eastAsia="SimSun" w:hAnsi="SimSun"/>
+          <w:sz w:val="24"/>
+          <w:szCs w:val="24"/>
+        </w:rPr>
+        <w:t>)</w:t>
+      </w:r>
+    </w:p>
+    <w:p>
+      <w:pPr>
+        <w:rPr>
+          <w:rFonts w:ascii="SimSun" w:eastAsia="SimSun" w:hAnsi="SimSun"/>
+          <w:sz w:val="24"/>
+          <w:szCs w:val="24"/>
+        </w:rPr>
+      </w:pPr>
+      <w:proofErr w:type="spellStart"/>
+      <w:proofErr w:type="gramStart"/>
+      <w:r>
+        <w:rPr>
+          <w:rFonts w:ascii="SimSun" w:eastAsia="SimSun" w:hAnsi="SimSun"/>
+          <w:sz w:val="24"/>
+          <w:szCs w:val="24"/>
+        </w:rPr>
+        <w:t>plt.tight</w:t>
+      </w:r>
+      <w:proofErr w:type="gramEnd"/>
+      <w:r>
+        <w:rPr>
+          <w:rFonts w:ascii="SimSun" w:eastAsia="SimSun" w:hAnsi="SimSun"/>
+          <w:sz w:val="24"/>
+          <w:szCs w:val="24"/>
+        </w:rPr>
+        <w:t>_layout</w:t>
+      </w:r>
+      <w:proofErr w:type="spellEnd"/>
+      <w:r>
+        <w:rPr>
+          <w:rFonts w:ascii="SimSun" w:eastAsia="SimSun" w:hAnsi="SimSun"/>
+          <w:sz w:val="24"/>
+          <w:szCs w:val="24"/>
+        </w:rPr>
+        <w:t>()</w:t>
+      </w:r>
+    </w:p>
+    <w:p>
+      <w:pPr>
+        <w:rPr>
+          <w:rFonts w:ascii="SimSun" w:eastAsia="SimSun" w:hAnsi="SimSun"/>
+          <w:sz w:val="24"/>
+          <w:szCs w:val="24"/>
+        </w:rPr>
+      </w:pPr>
+      <w:proofErr w:type="spellStart"/>
+      <w:proofErr w:type="gramStart"/>
+      <w:r>
+        <w:rPr>
+          <w:rFonts w:ascii="SimSun" w:eastAsia="SimSun" w:hAnsi="SimSun"/>
+          <w:sz w:val="24"/>
+          <w:szCs w:val="24"/>
+        </w:rPr>
+        <w:t>plt.grid</w:t>
+      </w:r>
+      <w:proofErr w:type="spellEnd"/>
+      <w:proofErr w:type="gramEnd"/>
+      <w:r>
+        <w:rPr>
+          <w:rFonts w:ascii="SimSun" w:eastAsia="SimSun" w:hAnsi="SimSun"/>
+          <w:sz w:val="24"/>
+          <w:szCs w:val="24"/>
+        </w:rPr>
+        <w:t>()</w:t>
+      </w:r>
+    </w:p>
+    <w:p>
+      <w:pPr>
+        <w:rPr>
+          <w:rFonts w:ascii="SimSun" w:eastAsia="SimSun" w:hAnsi="SimSun"/>
+          <w:sz w:val="24"/>
+          <w:szCs w:val="24"/>
+        </w:rPr>
+      </w:pPr>
+      <w:proofErr w:type="spellStart"/>
+      <w:proofErr w:type="gramStart"/>
+      <w:r>
+        <w:rPr>
+          <w:rFonts w:ascii="SimSun" w:eastAsia="SimSun" w:hAnsi="SimSun"/>
+          <w:sz w:val="24"/>
+          <w:szCs w:val="24"/>
+        </w:rPr>
+        <w:t>plt.savefig</w:t>
+      </w:r>
+      <w:proofErr w:type="spellEnd"/>
+      <w:proofErr w:type="gramEnd"/>
+      <w:r>
+        <w:rPr>
+          <w:rFonts w:ascii="SimSun" w:eastAsia="SimSun" w:hAnsi="SimSun"/>
+          <w:sz w:val="24"/>
+          <w:szCs w:val="24"/>
+        </w:rPr>
+        <w:t>('</w:t>
+      </w:r>
+      <w:proofErr w:type="spellStart"/>
+      <w:r>
+        <w:rPr>
+          <w:rFonts w:ascii="SimSun" w:eastAsia="SimSun" w:hAnsi="SimSun"/>
+          <w:sz w:val="24"/>
+          <w:szCs w:val="24"/>
+        </w:rPr>
+        <w:t>sim_chapter_Zoom_in_ETM_tuning.eps</w:t>
+      </w:r>
+      <w:proofErr w:type="spellEnd"/>
+      <w:r>
+        <w:rPr>
+          <w:rFonts w:ascii="SimSun" w:eastAsia="SimSun" w:hAnsi="SimSun"/>
+          <w:sz w:val="24"/>
+          <w:szCs w:val="24"/>
+        </w:rPr>
+        <w:t>')</w:t>
+      </w:r>
+    </w:p>
+    <w:p>
+      <w:pPr>
+        <w:rPr>
+          <w:rFonts w:ascii="SimSun" w:eastAsia="SimSun" w:hAnsi="SimSun"/>
+          <w:sz w:val="24"/>
+          <w:szCs w:val="24"/>
+        </w:rPr>
+      </w:pPr>
+      <w:proofErr w:type="spellStart"/>
+      <w:proofErr w:type="gramStart"/>
+      <w:r>
+        <w:rPr>
+          <w:rFonts w:ascii="SimSun" w:eastAsia="SimSun" w:hAnsi="SimSun"/>
+          <w:sz w:val="24"/>
+          <w:szCs w:val="24"/>
+        </w:rPr>
+        <w:t>plt.show</w:t>
+      </w:r>
+      <w:proofErr w:type="spellEnd"/>
+      <w:proofErr w:type="gramEnd"/>
+      <w:r>
+        <w:rPr>
+          <w:rFonts w:ascii="SimSun" w:eastAsia="SimSun" w:hAnsi="SimSun"/>
+          <w:sz w:val="24"/>
+          <w:szCs w:val="24"/>
+        </w:rPr>
+        <w:t>()</w:t>
+      </w:r>
+    </w:p>
+    <w:p>
+      <w:pPr>
+        <w:rPr>
+          <w:rFonts w:ascii="SimSun" w:eastAsia="SimSun" w:hAnsi="SimSun"/>
+          <w:sz w:val="24"/>
+          <w:szCs w:val="24"/>
+        </w:rPr>
+      </w:pPr>
+    </w:p>
+    <w:p>
+      <w:pPr>
+        <w:rPr>
+          <w:rFonts w:ascii="SimSun" w:eastAsia="SimSun" w:hAnsi="SimSun"/>
+          <w:sz w:val="24"/>
+          <w:szCs w:val="24"/>
+        </w:rPr>
+      </w:pPr>
+      <w:r>
+        <w:rPr>
+          <w:rFonts w:ascii="SimSun" w:eastAsia="SimSun" w:hAnsi="SimSun"/>
+          <w:sz w:val="24"/>
+          <w:szCs w:val="24"/>
+        </w:rPr>
+        <w:t>For 2x1 subplots, use</w:t>
+      </w:r>
+    </w:p>
+    <w:p>
+      <w:pPr>
+        <w:rPr>
+          <w:rFonts w:ascii="SimSun" w:eastAsia="SimSun" w:hAnsi="SimSun"/>
+          <w:sz w:val="24"/>
+          <w:szCs w:val="24"/>
+        </w:rPr>
+      </w:pPr>
+      <w:proofErr w:type="spellStart"/>
+      <w:proofErr w:type="gramStart"/>
+      <w:r>
+        <w:rPr>
+          <w:rFonts w:ascii="SimSun" w:eastAsia="SimSun" w:hAnsi="SimSun"/>
+          <w:sz w:val="24"/>
+          <w:szCs w:val="24"/>
+        </w:rPr>
+        <w:t>plt.figure</w:t>
+      </w:r>
+      <w:proofErr w:type="spellEnd"/>
+      <w:proofErr w:type="gramEnd"/>
+      <w:r>
+        <w:rPr>
+          <w:rFonts w:ascii="SimSun" w:eastAsia="SimSun" w:hAnsi="SimSun"/>
+          <w:sz w:val="24"/>
+          <w:szCs w:val="24"/>
+        </w:rPr>
+        <w:t>(</w:t>
+      </w:r>
+      <w:proofErr w:type="spellStart"/>
+      <w:r>
+        <w:rPr>
+          <w:rFonts w:ascii="SimSun" w:eastAsia="SimSun" w:hAnsi="SimSun"/>
+          <w:sz w:val="24"/>
+          <w:szCs w:val="24"/>
+        </w:rPr>
+        <w:t>figsize</w:t>
+      </w:r>
+      <w:proofErr w:type="spellEnd"/>
+      <w:r>
+        <w:rPr>
+          <w:rFonts w:ascii="SimSun" w:eastAsia="SimSun" w:hAnsi="SimSun"/>
+          <w:sz w:val="24"/>
+          <w:szCs w:val="24"/>
+        </w:rPr>
+        <w:t>=(6, 6), dpi=150)</w:t>
+      </w:r>
+    </w:p>
+    <w:p>
+      <w:pPr>
+        <w:rPr>
+          <w:sz w:val="24"/>
+          <w:szCs w:val="24"/>
+        </w:rPr>
+      </w:pPr>
+    </w:p>
+    <w:p>
+      <w:pPr>
+        <w:rPr>
+          <w:sz w:val="24"/>
+          <w:szCs w:val="24"/>
+        </w:rPr>
+      </w:pPr>
+      <w:r>
+        <w:rPr>
+          <w:sz w:val="24"/>
+          <w:szCs w:val="24"/>
+        </w:rPr>
         <w:lastRenderedPageBreak/>
-        <w:t>Matplotlib</w:t>
-      </w:r>
-    </w:p>
-    <w:p>
-      <w:pPr>
-        <w:rPr>
-          <w:sz w:val="24"/>
-          <w:szCs w:val="24"/>
-        </w:rPr>
-      </w:pPr>
-      <w:r>
-        <w:rPr>
-          <w:sz w:val="24"/>
-          <w:szCs w:val="24"/>
-        </w:rPr>
-        <w:t>In general, for matplotlib figures use</w:t>
-      </w:r>
-      <w:r>
-        <w:rPr>
-          <w:sz w:val="24"/>
-          <w:szCs w:val="24"/>
-        </w:rPr>
-        <w:t xml:space="preserve"> line width = </w:t>
-      </w:r>
-      <w:r>
-        <w:rPr>
-          <w:sz w:val="24"/>
-          <w:szCs w:val="24"/>
-        </w:rPr>
-        <w:t xml:space="preserve">3 for easy to see lines, for lines which need some detail, use 1 or 2. </w:t>
-      </w:r>
-      <w:r>
-        <w:rPr>
-          <w:sz w:val="24"/>
-          <w:szCs w:val="24"/>
-        </w:rPr>
-        <w:t xml:space="preserve"> fontsize = </w:t>
-      </w:r>
-      <w:r>
-        <w:rPr>
-          <w:sz w:val="24"/>
-          <w:szCs w:val="24"/>
-        </w:rPr>
-        <w:t>11.5</w:t>
-      </w:r>
-      <w:r>
-        <w:rPr>
-          <w:sz w:val="24"/>
-          <w:szCs w:val="24"/>
-        </w:rPr>
-        <w:t xml:space="preserve"> on axis</w:t>
-      </w:r>
-      <w:r>
-        <w:rPr>
-          <w:sz w:val="24"/>
-          <w:szCs w:val="24"/>
-        </w:rPr>
-        <w:t xml:space="preserve">.  Font size set to </w:t>
-      </w:r>
-      <w:r>
-        <w:rPr>
-          <w:sz w:val="24"/>
-          <w:szCs w:val="24"/>
-        </w:rPr>
-        <w:t>10</w:t>
-      </w:r>
-      <w:r>
-        <w:rPr>
-          <w:sz w:val="24"/>
-          <w:szCs w:val="24"/>
-        </w:rPr>
-        <w:t xml:space="preserve"> in the legend</w:t>
-      </w:r>
-      <w:r>
-        <w:rPr>
-          <w:sz w:val="24"/>
-          <w:szCs w:val="24"/>
-        </w:rPr>
-        <w:t>. Axis set to default</w:t>
-      </w:r>
-      <w:r>
-        <w:rPr>
-          <w:sz w:val="24"/>
-          <w:szCs w:val="24"/>
-        </w:rPr>
-        <w:t>. If the legend looks too big, try splitting it into multiple columns. If this doesn’t work, reduce the</w:t>
-      </w:r>
-      <w:r>
-        <w:rPr>
-          <w:sz w:val="24"/>
-          <w:szCs w:val="24"/>
-        </w:rPr>
-        <w:t xml:space="preserve"> fontsize </w:t>
-      </w:r>
-      <w:r>
-        <w:rPr>
-          <w:sz w:val="24"/>
-          <w:szCs w:val="24"/>
-        </w:rPr>
-        <w:t>to</w:t>
-      </w:r>
-      <w:r>
-        <w:rPr>
-          <w:sz w:val="24"/>
-          <w:szCs w:val="24"/>
-        </w:rPr>
-        <w:t xml:space="preserve"> </w:t>
-      </w:r>
-      <w:r>
-        <w:rPr>
-          <w:sz w:val="24"/>
-          <w:szCs w:val="24"/>
-        </w:rPr>
-        <w:t>10 or 8</w:t>
-      </w:r>
-      <w:r>
-        <w:rPr>
-          <w:sz w:val="24"/>
-          <w:szCs w:val="24"/>
-        </w:rPr>
-        <w:t xml:space="preserve"> for</w:t>
-      </w:r>
-      <w:r>
-        <w:rPr>
-          <w:sz w:val="24"/>
-          <w:szCs w:val="24"/>
-        </w:rPr>
-        <w:t xml:space="preserve"> the</w:t>
-      </w:r>
-      <w:r>
-        <w:rPr>
-          <w:sz w:val="24"/>
-          <w:szCs w:val="24"/>
-        </w:rPr>
-        <w:t xml:space="preserve"> legend. </w:t>
-      </w:r>
-      <w:r>
-        <w:rPr>
-          <w:sz w:val="24"/>
-          <w:szCs w:val="24"/>
-        </w:rPr>
-        <w:t>Standard matplotlib colours are nice. Standard font is nice</w:t>
-      </w:r>
-    </w:p>
-    <w:p>
-      <w:pPr>
-        <w:rPr>
-          <w:sz w:val="24"/>
-          <w:szCs w:val="24"/>
-        </w:rPr>
-      </w:pPr>
-    </w:p>
-    <w:p>
-      <w:pPr>
-        <w:rPr>
-          <w:rFonts w:ascii="SimSun" w:eastAsia="SimSun" w:hAnsi="SimSun"/>
-          <w:sz w:val="24"/>
-          <w:szCs w:val="24"/>
-        </w:rPr>
-      </w:pPr>
-      <w:r>
-        <w:rPr>
-          <w:rFonts w:ascii="SimSun" w:eastAsia="SimSun" w:hAnsi="SimSun"/>
-          <w:sz w:val="24"/>
-          <w:szCs w:val="24"/>
-        </w:rPr>
-        <w:t>figure_size = (6,</w:t>
-      </w:r>
-      <w:r>
-        <w:rPr>
-          <w:rFonts w:ascii="SimSun" w:eastAsia="SimSun" w:hAnsi="SimSun"/>
-          <w:sz w:val="24"/>
-          <w:szCs w:val="24"/>
-        </w:rPr>
-        <w:t>3.5</w:t>
-      </w:r>
-      <w:r>
-        <w:rPr>
-          <w:rFonts w:ascii="SimSun" w:eastAsia="SimSun" w:hAnsi="SimSun"/>
-          <w:sz w:val="24"/>
-          <w:szCs w:val="24"/>
-        </w:rPr>
-        <w:t>)</w:t>
-      </w:r>
-    </w:p>
-    <w:p>
-      <w:pPr>
-        <w:rPr>
-          <w:rFonts w:ascii="SimSun" w:eastAsia="SimSun" w:hAnsi="SimSun"/>
-          <w:sz w:val="24"/>
-          <w:szCs w:val="24"/>
-        </w:rPr>
-      </w:pPr>
-      <w:r>
-        <w:rPr>
-          <w:rFonts w:ascii="SimSun" w:eastAsia="SimSun" w:hAnsi="SimSun"/>
-          <w:sz w:val="24"/>
-          <w:szCs w:val="24"/>
-        </w:rPr>
-        <w:t xml:space="preserve">plt.figure(figsize = figure_size,dpi = </w:t>
-      </w:r>
-      <w:r>
-        <w:rPr>
-          <w:rFonts w:ascii="SimSun" w:eastAsia="SimSun" w:hAnsi="SimSun"/>
-          <w:sz w:val="24"/>
-          <w:szCs w:val="24"/>
-        </w:rPr>
-        <w:t>15</w:t>
-      </w:r>
-      <w:r>
-        <w:rPr>
-          <w:rFonts w:ascii="SimSun" w:eastAsia="SimSun" w:hAnsi="SimSun"/>
-          <w:sz w:val="24"/>
-          <w:szCs w:val="24"/>
-        </w:rPr>
-        <w:t>0)</w:t>
-      </w:r>
-    </w:p>
-    <w:p>
-      <w:pPr>
-        <w:rPr>
-          <w:rFonts w:ascii="SimSun" w:eastAsia="SimSun" w:hAnsi="SimSun"/>
-          <w:sz w:val="24"/>
-          <w:szCs w:val="24"/>
-        </w:rPr>
-      </w:pPr>
-      <w:r>
-        <w:rPr>
-          <w:rFonts w:ascii="SimSun" w:eastAsia="SimSun" w:hAnsi="SimSun"/>
-          <w:sz w:val="24"/>
-          <w:szCs w:val="24"/>
-        </w:rPr>
-        <w:t>plt.plot(x,y,label = 'Name of line')</w:t>
-      </w:r>
-    </w:p>
-    <w:p>
-      <w:pPr>
-        <w:rPr>
-          <w:rFonts w:ascii="SimSun" w:eastAsia="SimSun" w:hAnsi="SimSun"/>
-          <w:sz w:val="24"/>
-          <w:szCs w:val="24"/>
-        </w:rPr>
-      </w:pPr>
-      <w:r>
-        <w:rPr>
-          <w:rFonts w:ascii="SimSun" w:eastAsia="SimSun" w:hAnsi="SimSun"/>
-          <w:sz w:val="24"/>
-          <w:szCs w:val="24"/>
-        </w:rPr>
-        <w:t>plt.legend(prop={'size': 8},loc = 'lower left')</w:t>
-      </w:r>
-    </w:p>
-    <w:p>
-      <w:pPr>
-        <w:rPr>
-          <w:rFonts w:ascii="SimSun" w:eastAsia="SimSun" w:hAnsi="SimSun"/>
-          <w:sz w:val="24"/>
-          <w:szCs w:val="24"/>
-        </w:rPr>
-      </w:pPr>
-      <w:r>
-        <w:rPr>
-          <w:rFonts w:ascii="SimSun" w:eastAsia="SimSun" w:hAnsi="SimSun"/>
-          <w:sz w:val="24"/>
-          <w:szCs w:val="24"/>
-        </w:rPr>
-        <w:t>plt.xlabel('x axis (units)'</w:t>
-      </w:r>
-      <w:r>
-        <w:rPr>
-          <w:rFonts w:ascii="SimSun" w:eastAsia="SimSun" w:hAnsi="SimSun"/>
-          <w:sz w:val="24"/>
-          <w:szCs w:val="24"/>
-        </w:rPr>
-        <w:t>,</w:t>
-      </w:r>
-      <w:r>
-        <w:t xml:space="preserve"> </w:t>
-      </w:r>
-      <w:r>
-        <w:rPr>
-          <w:rFonts w:ascii="SimSun" w:eastAsia="SimSun" w:hAnsi="SimSun"/>
-          <w:sz w:val="24"/>
-          <w:szCs w:val="24"/>
-        </w:rPr>
-        <w:t>fontsize = 1</w:t>
-      </w:r>
-      <w:r>
-        <w:rPr>
-          <w:rFonts w:ascii="SimSun" w:eastAsia="SimSun" w:hAnsi="SimSun"/>
-          <w:sz w:val="24"/>
-          <w:szCs w:val="24"/>
-        </w:rPr>
-        <w:t>2</w:t>
-      </w:r>
-      <w:r>
-        <w:rPr>
-          <w:rFonts w:ascii="SimSun" w:eastAsia="SimSun" w:hAnsi="SimSun"/>
-          <w:sz w:val="24"/>
-          <w:szCs w:val="24"/>
-        </w:rPr>
-        <w:t>)</w:t>
-      </w:r>
-    </w:p>
-    <w:p>
-      <w:pPr>
-        <w:rPr>
-          <w:rFonts w:ascii="SimSun" w:eastAsia="SimSun" w:hAnsi="SimSun"/>
-          <w:sz w:val="24"/>
-          <w:szCs w:val="24"/>
-        </w:rPr>
-      </w:pPr>
-      <w:r>
-        <w:rPr>
-          <w:rFonts w:ascii="SimSun" w:eastAsia="SimSun" w:hAnsi="SimSun"/>
-          <w:sz w:val="24"/>
-          <w:szCs w:val="24"/>
-        </w:rPr>
-        <w:t>plt.ylabel('y axis (units)'</w:t>
-      </w:r>
-      <w:r>
-        <w:rPr>
-          <w:rFonts w:ascii="SimSun" w:eastAsia="SimSun" w:hAnsi="SimSun"/>
-          <w:sz w:val="24"/>
-          <w:szCs w:val="24"/>
-        </w:rPr>
-        <w:t>,</w:t>
-      </w:r>
-      <w:r>
-        <w:t xml:space="preserve"> </w:t>
-      </w:r>
-      <w:r>
-        <w:rPr>
-          <w:rFonts w:ascii="SimSun" w:eastAsia="SimSun" w:hAnsi="SimSun"/>
-          <w:sz w:val="24"/>
-          <w:szCs w:val="24"/>
-        </w:rPr>
-        <w:t>fontsize = 1</w:t>
-      </w:r>
-      <w:r>
-        <w:rPr>
-          <w:rFonts w:ascii="SimSun" w:eastAsia="SimSun" w:hAnsi="SimSun"/>
-          <w:sz w:val="24"/>
-          <w:szCs w:val="24"/>
-        </w:rPr>
-        <w:t>2</w:t>
-      </w:r>
-      <w:r>
-        <w:rPr>
-          <w:rFonts w:ascii="SimSun" w:eastAsia="SimSun" w:hAnsi="SimSun"/>
-          <w:sz w:val="24"/>
-          <w:szCs w:val="24"/>
-        </w:rPr>
-        <w:t>)</w:t>
-      </w:r>
-    </w:p>
-    <w:p>
-      <w:pPr>
-        <w:rPr>
-          <w:rFonts w:ascii="SimSun" w:eastAsia="SimSun" w:hAnsi="SimSun"/>
-          <w:sz w:val="24"/>
-          <w:szCs w:val="24"/>
-        </w:rPr>
-      </w:pPr>
-      <w:r>
-        <w:rPr>
-          <w:rFonts w:ascii="SimSun" w:eastAsia="SimSun" w:hAnsi="SimSun"/>
-          <w:sz w:val="24"/>
-          <w:szCs w:val="24"/>
-        </w:rPr>
-        <w:t>plt.tight_layout()</w:t>
-      </w:r>
-    </w:p>
-    <w:p>
-      <w:pPr>
-        <w:rPr>
-          <w:rFonts w:ascii="SimSun" w:eastAsia="SimSun" w:hAnsi="SimSun"/>
-          <w:sz w:val="24"/>
-          <w:szCs w:val="24"/>
-        </w:rPr>
-      </w:pPr>
-      <w:r>
-        <w:rPr>
-          <w:rFonts w:ascii="SimSun" w:eastAsia="SimSun" w:hAnsi="SimSun"/>
-          <w:sz w:val="24"/>
-          <w:szCs w:val="24"/>
-        </w:rPr>
-        <w:t>plt.grid()</w:t>
-      </w:r>
-    </w:p>
-    <w:p>
-      <w:pPr>
-        <w:rPr>
-          <w:rFonts w:ascii="SimSun" w:eastAsia="SimSun" w:hAnsi="SimSun"/>
-          <w:sz w:val="24"/>
-          <w:szCs w:val="24"/>
-        </w:rPr>
-      </w:pPr>
-      <w:r>
-        <w:rPr>
-          <w:rFonts w:ascii="SimSun" w:eastAsia="SimSun" w:hAnsi="SimSun"/>
-          <w:sz w:val="24"/>
-          <w:szCs w:val="24"/>
-        </w:rPr>
-        <w:t>plt.savefig('sim_chapter_Zoom_in_ETM_tuning.eps')</w:t>
-      </w:r>
-    </w:p>
-    <w:p>
-      <w:pPr>
-        <w:rPr>
-          <w:rFonts w:ascii="SimSun" w:eastAsia="SimSun" w:hAnsi="SimSun"/>
-          <w:sz w:val="24"/>
-          <w:szCs w:val="24"/>
-        </w:rPr>
-      </w:pPr>
-      <w:r>
-        <w:rPr>
-          <w:rFonts w:ascii="SimSun" w:eastAsia="SimSun" w:hAnsi="SimSun"/>
-          <w:sz w:val="24"/>
-          <w:szCs w:val="24"/>
-        </w:rPr>
-        <w:t>plt.show()</w:t>
-      </w:r>
-    </w:p>
-    <w:p>
-      <w:pPr>
-        <w:rPr>
-          <w:rFonts w:ascii="SimSun" w:eastAsia="SimSun" w:hAnsi="SimSun"/>
-          <w:sz w:val="24"/>
-          <w:szCs w:val="24"/>
-        </w:rPr>
-      </w:pPr>
-    </w:p>
-    <w:p>
-      <w:pPr>
-        <w:rPr>
-          <w:rFonts w:ascii="SimSun" w:eastAsia="SimSun" w:hAnsi="SimSun"/>
-          <w:sz w:val="24"/>
-          <w:szCs w:val="24"/>
-        </w:rPr>
-      </w:pPr>
-      <w:r>
-        <w:rPr>
-          <w:rFonts w:ascii="SimSun" w:eastAsia="SimSun" w:hAnsi="SimSun"/>
-          <w:sz w:val="24"/>
-          <w:szCs w:val="24"/>
-        </w:rPr>
-        <w:t>For 2x1 subplots, use</w:t>
-      </w:r>
-    </w:p>
-    <w:p>
-      <w:pPr>
-        <w:rPr>
-          <w:rFonts w:ascii="SimSun" w:eastAsia="SimSun" w:hAnsi="SimSun"/>
-          <w:sz w:val="24"/>
-          <w:szCs w:val="24"/>
-        </w:rPr>
-      </w:pPr>
-      <w:r>
-        <w:rPr>
-          <w:rFonts w:ascii="SimSun" w:eastAsia="SimSun" w:hAnsi="SimSun"/>
-          <w:sz w:val="24"/>
-          <w:szCs w:val="24"/>
-        </w:rPr>
-        <w:t>plt.figure(figsize=(6, 6), dpi=150)</w:t>
-      </w:r>
-    </w:p>
-    <w:p>
-      <w:pPr>
-        <w:rPr>
-          <w:sz w:val="24"/>
-          <w:szCs w:val="24"/>
-        </w:rPr>
-      </w:pPr>
-    </w:p>
-    <w:p>
-      <w:pPr>
-        <w:rPr>
-          <w:sz w:val="24"/>
-          <w:szCs w:val="24"/>
-        </w:rPr>
-      </w:pPr>
-      <w:r>
-        <w:rPr>
-          <w:sz w:val="24"/>
-          <w:szCs w:val="24"/>
-        </w:rPr>
         <w:t xml:space="preserve">when there </w:t>
       </w:r>
       <w:r>
@@ -5049,6 +6640,7 @@
           <w:szCs w:val="24"/>
         </w:rPr>
       </w:pPr>
+      <w:proofErr w:type="spellStart"/>
       <w:r>
         <w:rPr>
           <w:rFonts w:asciiTheme="majorHAnsi" w:hAnsiTheme="majorHAnsi"/>
@@ -5059,6 +6651,7 @@
         </w:rPr>
         <w:t>Matlab</w:t>
       </w:r>
+      <w:proofErr w:type="spellEnd"/>
     </w:p>
     <w:p>
       <w:pPr>
@@ -5077,7 +6670,55 @@
           <w:sz w:val="24"/>
           <w:szCs w:val="24"/>
         </w:rPr>
-        <w:t>For matlab figures, use the linspecer (from mathworks file exchange) function to</w:t>
+        <w:t xml:space="preserve">For </w:t>
+      </w:r>
+      <w:proofErr w:type="spellStart"/>
+      <w:r>
+        <w:rPr>
+          <w:sz w:val="24"/>
+          <w:szCs w:val="24"/>
+        </w:rPr>
+        <w:t>matlab</w:t>
+      </w:r>
+      <w:proofErr w:type="spellEnd"/>
+      <w:r>
+        <w:rPr>
+          <w:sz w:val="24"/>
+          <w:szCs w:val="24"/>
+        </w:rPr>
+        <w:t xml:space="preserve"> figures, use the </w:t>
+      </w:r>
+      <w:proofErr w:type="spellStart"/>
+      <w:r>
+        <w:rPr>
+          <w:sz w:val="24"/>
+          <w:szCs w:val="24"/>
+        </w:rPr>
+        <w:t>linspecer</w:t>
+      </w:r>
+      <w:proofErr w:type="spellEnd"/>
+      <w:r>
+        <w:rPr>
+          <w:sz w:val="24"/>
+          <w:szCs w:val="24"/>
+        </w:rPr>
+        <w:t xml:space="preserve"> (from </w:t>
+      </w:r>
+      <w:proofErr w:type="spellStart"/>
+      <w:r>
+        <w:rPr>
+          <w:sz w:val="24"/>
+          <w:szCs w:val="24"/>
+        </w:rPr>
+        <w:t>mathworks</w:t>
+      </w:r>
+      <w:proofErr w:type="spellEnd"/>
+      <w:r>
+        <w:rPr>
+          <w:sz w:val="24"/>
+          <w:szCs w:val="24"/>
+        </w:rPr>
+        <w:t xml:space="preserve"> file exchange) function to</w:t>
       </w:r>
       <w:r>
         <w:rPr>
@@ -5118,8 +6759,9 @@
           <w:sz w:val="24"/>
           <w:szCs w:val="24"/>
         </w:rPr>
-        <w:t>The font should be set to Deja</w:t>
-      </w:r>
+        <w:t xml:space="preserve">The font should be set to </w:t>
+      </w:r>
+      <w:proofErr w:type="spellStart"/>
       <w:r>
         <w:rPr>
           <w:rFonts w:cstheme="minorHAnsi"/>
@@ -5127,7 +6769,7 @@
           <w:sz w:val="24"/>
           <w:szCs w:val="24"/>
         </w:rPr>
-        <w:t xml:space="preserve">Vu Sans, do this with: </w:t>
+        <w:t>Deja</w:t>
       </w:r>
       <w:r>
         <w:rPr>
@@ -5136,15 +6778,92 @@
           <w:sz w:val="24"/>
           <w:szCs w:val="24"/>
         </w:rPr>
-        <w:t>set(gca,</w:t>
-      </w:r>
-      <w:r>
-        <w:rPr>
-          <w:rFonts w:cstheme="minorHAnsi"/>
-          <w:sz w:val="24"/>
-          <w:szCs w:val="24"/>
-        </w:rPr>
-        <w:t>'fontname','DejaVu Sans')</w:t>
+        <w:t>Vu</w:t>
+      </w:r>
+      <w:proofErr w:type="spellEnd"/>
+      <w:r>
+        <w:rPr>
+          <w:rFonts w:cstheme="minorHAnsi"/>
+          <w:color w:val="000000"/>
+          <w:sz w:val="24"/>
+          <w:szCs w:val="24"/>
+        </w:rPr>
+        <w:t xml:space="preserve"> Sans, do this with: </w:t>
+      </w:r>
+      <w:proofErr w:type="gramStart"/>
+      <w:r>
+        <w:rPr>
+          <w:rFonts w:cstheme="minorHAnsi"/>
+          <w:color w:val="000000"/>
+          <w:sz w:val="24"/>
+          <w:szCs w:val="24"/>
+        </w:rPr>
+        <w:t>set(</w:t>
+      </w:r>
+      <w:proofErr w:type="spellStart"/>
+      <w:proofErr w:type="gramEnd"/>
+      <w:r>
+        <w:rPr>
+          <w:rFonts w:cstheme="minorHAnsi"/>
+          <w:color w:val="000000"/>
+          <w:sz w:val="24"/>
+          <w:szCs w:val="24"/>
+        </w:rPr>
+        <w:t>gca</w:t>
+      </w:r>
+      <w:proofErr w:type="spellEnd"/>
+      <w:r>
+        <w:rPr>
+          <w:rFonts w:cstheme="minorHAnsi"/>
+          <w:color w:val="000000"/>
+          <w:sz w:val="24"/>
+          <w:szCs w:val="24"/>
+        </w:rPr>
+        <w:t>,</w:t>
+      </w:r>
+      <w:r>
+        <w:rPr>
+          <w:rFonts w:cstheme="minorHAnsi"/>
+          <w:sz w:val="24"/>
+          <w:szCs w:val="24"/>
+        </w:rPr>
+        <w:t>'</w:t>
+      </w:r>
+      <w:proofErr w:type="spellStart"/>
+      <w:r>
+        <w:rPr>
+          <w:rFonts w:cstheme="minorHAnsi"/>
+          <w:sz w:val="24"/>
+          <w:szCs w:val="24"/>
+        </w:rPr>
+        <w:t>fontname</w:t>
+      </w:r>
+      <w:proofErr w:type="spellEnd"/>
+      <w:r>
+        <w:rPr>
+          <w:rFonts w:cstheme="minorHAnsi"/>
+          <w:sz w:val="24"/>
+          <w:szCs w:val="24"/>
+        </w:rPr>
+        <w:t>','</w:t>
+      </w:r>
+      <w:proofErr w:type="spellStart"/>
+      <w:r>
+        <w:rPr>
+          <w:rFonts w:cstheme="minorHAnsi"/>
+          <w:sz w:val="24"/>
+          <w:szCs w:val="24"/>
+        </w:rPr>
+        <w:t>DejaVu</w:t>
+      </w:r>
+      <w:proofErr w:type="spellEnd"/>
+      <w:r>
+        <w:rPr>
+          <w:rFonts w:cstheme="minorHAnsi"/>
+          <w:sz w:val="24"/>
+          <w:szCs w:val="24"/>
+        </w:rPr>
+        <w:t xml:space="preserve"> Sans')</w:t>
       </w:r>
     </w:p>
     <w:p>
@@ -5174,85 +6893,260 @@
           <w:sz w:val="24"/>
           <w:szCs w:val="24"/>
         </w:rPr>
-        <w:t>c = linspecer(2);</w:t>
-      </w:r>
-    </w:p>
-    <w:p>
-      <w:pPr>
-        <w:rPr>
-          <w:rFonts w:ascii="SimSun" w:eastAsia="SimSun" w:hAnsi="SimSun"/>
-          <w:sz w:val="24"/>
-          <w:szCs w:val="24"/>
-        </w:rPr>
-      </w:pPr>
-      <w:r>
-        <w:rPr>
-          <w:rFonts w:ascii="SimSun" w:eastAsia="SimSun" w:hAnsi="SimSun"/>
-          <w:sz w:val="24"/>
-          <w:szCs w:val="24"/>
-        </w:rPr>
-        <w:t>size = 1.1;</w:t>
-      </w:r>
-    </w:p>
-    <w:p>
-      <w:pPr>
-        <w:rPr>
-          <w:rFonts w:ascii="SimSun" w:eastAsia="SimSun" w:hAnsi="SimSun"/>
-          <w:sz w:val="24"/>
-          <w:szCs w:val="24"/>
-        </w:rPr>
-      </w:pPr>
-      <w:r>
-        <w:rPr>
-          <w:rFonts w:ascii="SimSun" w:eastAsia="SimSun" w:hAnsi="SimSun"/>
-          <w:sz w:val="24"/>
-          <w:szCs w:val="24"/>
-        </w:rPr>
-        <w:lastRenderedPageBreak/>
-        <w:t>aspect_ratio = size.*[6,4];</w:t>
-      </w:r>
-    </w:p>
-    <w:p>
-      <w:pPr>
-        <w:rPr>
-          <w:rFonts w:ascii="SimSun" w:eastAsia="SimSun" w:hAnsi="SimSun"/>
-          <w:sz w:val="24"/>
-          <w:szCs w:val="24"/>
-        </w:rPr>
-      </w:pPr>
-    </w:p>
-    <w:p>
-      <w:pPr>
-        <w:rPr>
-          <w:rFonts w:ascii="SimSun" w:eastAsia="SimSun" w:hAnsi="SimSun"/>
-          <w:sz w:val="24"/>
-          <w:szCs w:val="24"/>
-        </w:rPr>
-      </w:pPr>
-      <w:r>
-        <w:rPr>
-          <w:rFonts w:ascii="SimSun" w:eastAsia="SimSun" w:hAnsi="SimSun"/>
-          <w:sz w:val="24"/>
-          <w:szCs w:val="24"/>
-        </w:rPr>
-        <w:t>figure('Name','dark noise','units','inches','position',[0 0 aspect_ratio(1) aspect_ratio(2)])</w:t>
-      </w:r>
-    </w:p>
-    <w:p>
-      <w:pPr>
-        <w:rPr>
-          <w:rFonts w:ascii="SimSun" w:eastAsia="SimSun" w:hAnsi="SimSun"/>
-          <w:sz w:val="24"/>
-          <w:szCs w:val="24"/>
-        </w:rPr>
-      </w:pPr>
-      <w:r>
-        <w:rPr>
-          <w:rFonts w:ascii="SimSun" w:eastAsia="SimSun" w:hAnsi="SimSun"/>
-          <w:sz w:val="24"/>
-          <w:szCs w:val="24"/>
-        </w:rPr>
-        <w:t>loglog(x1, y1, 'color',c(1,:))</w:t>
+        <w:t xml:space="preserve">c = </w:t>
+      </w:r>
+      <w:proofErr w:type="spellStart"/>
+      <w:proofErr w:type="gramStart"/>
+      <w:r>
+        <w:rPr>
+          <w:rFonts w:ascii="SimSun" w:eastAsia="SimSun" w:hAnsi="SimSun"/>
+          <w:sz w:val="24"/>
+          <w:szCs w:val="24"/>
+        </w:rPr>
+        <w:t>linspecer</w:t>
+      </w:r>
+      <w:proofErr w:type="spellEnd"/>
+      <w:r>
+        <w:rPr>
+          <w:rFonts w:ascii="SimSun" w:eastAsia="SimSun" w:hAnsi="SimSun"/>
+          <w:sz w:val="24"/>
+          <w:szCs w:val="24"/>
+        </w:rPr>
+        <w:t>(</w:t>
+      </w:r>
+      <w:proofErr w:type="gramEnd"/>
+      <w:r>
+        <w:rPr>
+          <w:rFonts w:ascii="SimSun" w:eastAsia="SimSun" w:hAnsi="SimSun"/>
+          <w:sz w:val="24"/>
+          <w:szCs w:val="24"/>
+        </w:rPr>
+        <w:t>2);</w:t>
+      </w:r>
+    </w:p>
+    <w:p>
+      <w:pPr>
+        <w:rPr>
+          <w:rFonts w:ascii="SimSun" w:eastAsia="SimSun" w:hAnsi="SimSun"/>
+          <w:sz w:val="24"/>
+          <w:szCs w:val="24"/>
+        </w:rPr>
+      </w:pPr>
+      <w:r>
+        <w:rPr>
+          <w:rFonts w:ascii="SimSun" w:eastAsia="SimSun" w:hAnsi="SimSun"/>
+          <w:sz w:val="24"/>
+          <w:szCs w:val="24"/>
+        </w:rPr>
+        <w:t xml:space="preserve">size = </w:t>
+      </w:r>
+      <w:proofErr w:type="gramStart"/>
+      <w:r>
+        <w:rPr>
+          <w:rFonts w:ascii="SimSun" w:eastAsia="SimSun" w:hAnsi="SimSun"/>
+          <w:sz w:val="24"/>
+          <w:szCs w:val="24"/>
+        </w:rPr>
+        <w:t>1.1;</w:t>
+      </w:r>
+      <w:proofErr w:type="gramEnd"/>
+    </w:p>
+    <w:p>
+      <w:pPr>
+        <w:rPr>
+          <w:rFonts w:ascii="SimSun" w:eastAsia="SimSun" w:hAnsi="SimSun"/>
+          <w:sz w:val="24"/>
+          <w:szCs w:val="24"/>
+        </w:rPr>
+      </w:pPr>
+      <w:proofErr w:type="spellStart"/>
+      <w:r>
+        <w:rPr>
+          <w:rFonts w:ascii="SimSun" w:eastAsia="SimSun" w:hAnsi="SimSun"/>
+          <w:sz w:val="24"/>
+          <w:szCs w:val="24"/>
+        </w:rPr>
+        <w:t>aspect_ratio</w:t>
+      </w:r>
+      <w:proofErr w:type="spellEnd"/>
+      <w:r>
+        <w:rPr>
+          <w:rFonts w:ascii="SimSun" w:eastAsia="SimSun" w:hAnsi="SimSun"/>
+          <w:sz w:val="24"/>
+          <w:szCs w:val="24"/>
+        </w:rPr>
+        <w:t xml:space="preserve"> = </w:t>
+      </w:r>
+      <w:proofErr w:type="gramStart"/>
+      <w:r>
+        <w:rPr>
+          <w:rFonts w:ascii="SimSun" w:eastAsia="SimSun" w:hAnsi="SimSun"/>
+          <w:sz w:val="24"/>
+          <w:szCs w:val="24"/>
+        </w:rPr>
+        <w:t>size.*</w:t>
+      </w:r>
+      <w:proofErr w:type="gramEnd"/>
+      <w:r>
+        <w:rPr>
+          <w:rFonts w:ascii="SimSun" w:eastAsia="SimSun" w:hAnsi="SimSun"/>
+          <w:sz w:val="24"/>
+          <w:szCs w:val="24"/>
+        </w:rPr>
+        <w:t>[6,4];</w:t>
+      </w:r>
+    </w:p>
+    <w:p>
+      <w:pPr>
+        <w:rPr>
+          <w:rFonts w:ascii="SimSun" w:eastAsia="SimSun" w:hAnsi="SimSun"/>
+          <w:sz w:val="24"/>
+          <w:szCs w:val="24"/>
+        </w:rPr>
+      </w:pPr>
+    </w:p>
+    <w:p>
+      <w:pPr>
+        <w:rPr>
+          <w:rFonts w:ascii="SimSun" w:eastAsia="SimSun" w:hAnsi="SimSun"/>
+          <w:sz w:val="24"/>
+          <w:szCs w:val="24"/>
+        </w:rPr>
+      </w:pPr>
+      <w:proofErr w:type="gramStart"/>
+      <w:r>
+        <w:rPr>
+          <w:rFonts w:ascii="SimSun" w:eastAsia="SimSun" w:hAnsi="SimSun"/>
+          <w:sz w:val="24"/>
+          <w:szCs w:val="24"/>
+        </w:rPr>
+        <w:t>figure(</w:t>
+      </w:r>
+      <w:proofErr w:type="gramEnd"/>
+      <w:r>
+        <w:rPr>
+          <w:rFonts w:ascii="SimSun" w:eastAsia="SimSun" w:hAnsi="SimSun"/>
+          <w:sz w:val="24"/>
+          <w:szCs w:val="24"/>
+        </w:rPr>
+        <w:t>'</w:t>
+      </w:r>
+      <w:proofErr w:type="spellStart"/>
+      <w:r>
+        <w:rPr>
+          <w:rFonts w:ascii="SimSun" w:eastAsia="SimSun" w:hAnsi="SimSun"/>
+          <w:sz w:val="24"/>
+          <w:szCs w:val="24"/>
+        </w:rPr>
+        <w:t>Name','dark</w:t>
+      </w:r>
+      <w:proofErr w:type="spellEnd"/>
+      <w:r>
+        <w:rPr>
+          <w:rFonts w:ascii="SimSun" w:eastAsia="SimSun" w:hAnsi="SimSun"/>
+          <w:sz w:val="24"/>
+          <w:szCs w:val="24"/>
+        </w:rPr>
+        <w:t xml:space="preserve"> </w:t>
+      </w:r>
+      <w:proofErr w:type="spellStart"/>
+      <w:r>
+        <w:rPr>
+          <w:rFonts w:ascii="SimSun" w:eastAsia="SimSun" w:hAnsi="SimSun"/>
+          <w:sz w:val="24"/>
+          <w:szCs w:val="24"/>
+        </w:rPr>
+        <w:t>noise','units','inches','position</w:t>
+      </w:r>
+      <w:proofErr w:type="spellEnd"/>
+      <w:r>
+        <w:rPr>
+          <w:rFonts w:ascii="SimSun" w:eastAsia="SimSun" w:hAnsi="SimSun"/>
+          <w:sz w:val="24"/>
+          <w:szCs w:val="24"/>
+        </w:rPr>
+        <w:t xml:space="preserve">',[0 0 </w:t>
+      </w:r>
+      <w:proofErr w:type="spellStart"/>
+      <w:r>
+        <w:rPr>
+          <w:rFonts w:ascii="SimSun" w:eastAsia="SimSun" w:hAnsi="SimSun"/>
+          <w:sz w:val="24"/>
+          <w:szCs w:val="24"/>
+        </w:rPr>
+        <w:t>aspect_ratio</w:t>
+      </w:r>
+      <w:proofErr w:type="spellEnd"/>
+      <w:r>
+        <w:rPr>
+          <w:rFonts w:ascii="SimSun" w:eastAsia="SimSun" w:hAnsi="SimSun"/>
+          <w:sz w:val="24"/>
+          <w:szCs w:val="24"/>
+        </w:rPr>
+        <w:t xml:space="preserve">(1) </w:t>
+      </w:r>
+      <w:proofErr w:type="spellStart"/>
+      <w:r>
+        <w:rPr>
+          <w:rFonts w:ascii="SimSun" w:eastAsia="SimSun" w:hAnsi="SimSun"/>
+          <w:sz w:val="24"/>
+          <w:szCs w:val="24"/>
+        </w:rPr>
+        <w:t>aspect_ratio</w:t>
+      </w:r>
+      <w:proofErr w:type="spellEnd"/>
+      <w:r>
+        <w:rPr>
+          <w:rFonts w:ascii="SimSun" w:eastAsia="SimSun" w:hAnsi="SimSun"/>
+          <w:sz w:val="24"/>
+          <w:szCs w:val="24"/>
+        </w:rPr>
+        <w:t>(2)])</w:t>
+      </w:r>
+    </w:p>
+    <w:p>
+      <w:pPr>
+        <w:rPr>
+          <w:rFonts w:ascii="SimSun" w:eastAsia="SimSun" w:hAnsi="SimSun"/>
+          <w:sz w:val="24"/>
+          <w:szCs w:val="24"/>
+        </w:rPr>
+      </w:pPr>
+      <w:proofErr w:type="gramStart"/>
+      <w:r>
+        <w:rPr>
+          <w:rFonts w:ascii="SimSun" w:eastAsia="SimSun" w:hAnsi="SimSun"/>
+          <w:sz w:val="24"/>
+          <w:szCs w:val="24"/>
+        </w:rPr>
+        <w:t>loglog(</w:t>
+      </w:r>
+      <w:proofErr w:type="gramEnd"/>
+      <w:r>
+        <w:rPr>
+          <w:rFonts w:ascii="SimSun" w:eastAsia="SimSun" w:hAnsi="SimSun"/>
+          <w:sz w:val="24"/>
+          <w:szCs w:val="24"/>
+        </w:rPr>
+        <w:t>x1, y1, '</w:t>
+      </w:r>
+      <w:proofErr w:type="spellStart"/>
+      <w:r>
+        <w:rPr>
+          <w:rFonts w:ascii="SimSun" w:eastAsia="SimSun" w:hAnsi="SimSun"/>
+          <w:sz w:val="24"/>
+          <w:szCs w:val="24"/>
+        </w:rPr>
+        <w:t>color</w:t>
+      </w:r>
+      <w:proofErr w:type="spellEnd"/>
+      <w:r>
+        <w:rPr>
+          <w:rFonts w:ascii="SimSun" w:eastAsia="SimSun" w:hAnsi="SimSun"/>
+          <w:sz w:val="24"/>
+          <w:szCs w:val="24"/>
+        </w:rPr>
+        <w:t>',c(1,:))</w:t>
       </w:r>
     </w:p>
     <w:p>
@@ -5280,13 +7174,41 @@
           <w:szCs w:val="24"/>
         </w:rPr>
       </w:pPr>
-      <w:r>
-        <w:rPr>
-          <w:rFonts w:ascii="SimSun" w:eastAsia="SimSun" w:hAnsi="SimSun"/>
-          <w:sz w:val="24"/>
-          <w:szCs w:val="24"/>
-        </w:rPr>
-        <w:t>loglog(x2, y2, 'color',c(2,:))</w:t>
+      <w:proofErr w:type="gramStart"/>
+      <w:r>
+        <w:rPr>
+          <w:rFonts w:ascii="SimSun" w:eastAsia="SimSun" w:hAnsi="SimSun"/>
+          <w:sz w:val="24"/>
+          <w:szCs w:val="24"/>
+        </w:rPr>
+        <w:t>loglog(</w:t>
+      </w:r>
+      <w:proofErr w:type="gramEnd"/>
+      <w:r>
+        <w:rPr>
+          <w:rFonts w:ascii="SimSun" w:eastAsia="SimSun" w:hAnsi="SimSun"/>
+          <w:sz w:val="24"/>
+          <w:szCs w:val="24"/>
+        </w:rPr>
+        <w:t>x2, y2, '</w:t>
+      </w:r>
+      <w:proofErr w:type="spellStart"/>
+      <w:r>
+        <w:rPr>
+          <w:rFonts w:ascii="SimSun" w:eastAsia="SimSun" w:hAnsi="SimSun"/>
+          <w:sz w:val="24"/>
+          <w:szCs w:val="24"/>
+        </w:rPr>
+        <w:t>color</w:t>
+      </w:r>
+      <w:proofErr w:type="spellEnd"/>
+      <w:r>
+        <w:rPr>
+          <w:rFonts w:ascii="SimSun" w:eastAsia="SimSun" w:hAnsi="SimSun"/>
+          <w:sz w:val="24"/>
+          <w:szCs w:val="24"/>
+        </w:rPr>
+        <w:t>',c(2,:))</w:t>
       </w:r>
     </w:p>
     <w:p>
@@ -5331,40 +7253,107 @@
           <w:szCs w:val="24"/>
         </w:rPr>
       </w:pPr>
-      <w:r>
-        <w:rPr>
-          <w:rFonts w:ascii="SimSun" w:eastAsia="SimSun" w:hAnsi="SimSun"/>
-          <w:sz w:val="24"/>
-          <w:szCs w:val="24"/>
-        </w:rPr>
-        <w:t>xlabel('Frequency (Hz)')</w:t>
-      </w:r>
-    </w:p>
-    <w:p>
-      <w:pPr>
-        <w:rPr>
-          <w:rFonts w:ascii="SimSun" w:eastAsia="SimSun" w:hAnsi="SimSun"/>
-          <w:sz w:val="24"/>
-          <w:szCs w:val="24"/>
-        </w:rPr>
-      </w:pPr>
-      <w:r>
-        <w:rPr>
-          <w:rFonts w:ascii="SimSun" w:eastAsia="SimSun" w:hAnsi="SimSun"/>
-          <w:sz w:val="24"/>
-          <w:szCs w:val="24"/>
-        </w:rPr>
-        <w:t>ylabel('I_r_m_s/\surd(Hz)')</w:t>
-      </w:r>
-    </w:p>
-    <w:p>
-      <w:pPr>
-        <w:rPr>
-          <w:rFonts w:ascii="SimSun" w:eastAsia="SimSun" w:hAnsi="SimSun"/>
-          <w:sz w:val="24"/>
-          <w:szCs w:val="24"/>
-        </w:rPr>
-      </w:pPr>
+      <w:proofErr w:type="spellStart"/>
+      <w:proofErr w:type="gramStart"/>
+      <w:r>
+        <w:rPr>
+          <w:rFonts w:ascii="SimSun" w:eastAsia="SimSun" w:hAnsi="SimSun"/>
+          <w:sz w:val="24"/>
+          <w:szCs w:val="24"/>
+        </w:rPr>
+        <w:t>xlabel</w:t>
+      </w:r>
+      <w:proofErr w:type="spellEnd"/>
+      <w:r>
+        <w:rPr>
+          <w:rFonts w:ascii="SimSun" w:eastAsia="SimSun" w:hAnsi="SimSun"/>
+          <w:sz w:val="24"/>
+          <w:szCs w:val="24"/>
+        </w:rPr>
+        <w:t>(</w:t>
+      </w:r>
+      <w:proofErr w:type="gramEnd"/>
+      <w:r>
+        <w:rPr>
+          <w:rFonts w:ascii="SimSun" w:eastAsia="SimSun" w:hAnsi="SimSun"/>
+          <w:sz w:val="24"/>
+          <w:szCs w:val="24"/>
+        </w:rPr>
+        <w:t>'Frequency (Hz)')</w:t>
+      </w:r>
+    </w:p>
+    <w:p>
+      <w:pPr>
+        <w:rPr>
+          <w:rFonts w:ascii="SimSun" w:eastAsia="SimSun" w:hAnsi="SimSun"/>
+          <w:sz w:val="24"/>
+          <w:szCs w:val="24"/>
+        </w:rPr>
+      </w:pPr>
+      <w:proofErr w:type="spellStart"/>
+      <w:r>
+        <w:rPr>
+          <w:rFonts w:ascii="SimSun" w:eastAsia="SimSun" w:hAnsi="SimSun"/>
+          <w:sz w:val="24"/>
+          <w:szCs w:val="24"/>
+        </w:rPr>
+        <w:t>ylabel</w:t>
+      </w:r>
+      <w:proofErr w:type="spellEnd"/>
+      <w:r>
+        <w:rPr>
+          <w:rFonts w:ascii="SimSun" w:eastAsia="SimSun" w:hAnsi="SimSun"/>
+          <w:sz w:val="24"/>
+          <w:szCs w:val="24"/>
+        </w:rPr>
+        <w:t>('</w:t>
+      </w:r>
+      <w:proofErr w:type="spellStart"/>
+      <w:r>
+        <w:rPr>
+          <w:rFonts w:ascii="SimSun" w:eastAsia="SimSun" w:hAnsi="SimSun"/>
+          <w:sz w:val="24"/>
+          <w:szCs w:val="24"/>
+        </w:rPr>
+        <w:t>I_r_m_s</w:t>
+      </w:r>
+      <w:proofErr w:type="spellEnd"/>
+      <w:r>
+        <w:rPr>
+          <w:rFonts w:ascii="SimSun" w:eastAsia="SimSun" w:hAnsi="SimSun"/>
+          <w:sz w:val="24"/>
+          <w:szCs w:val="24"/>
+        </w:rPr>
+        <w:t>/\</w:t>
+      </w:r>
+      <w:proofErr w:type="gramStart"/>
+      <w:r>
+        <w:rPr>
+          <w:rFonts w:ascii="SimSun" w:eastAsia="SimSun" w:hAnsi="SimSun"/>
+          <w:sz w:val="24"/>
+          <w:szCs w:val="24"/>
+        </w:rPr>
+        <w:t>surd(</w:t>
+      </w:r>
+      <w:proofErr w:type="gramEnd"/>
+      <w:r>
+        <w:rPr>
+          <w:rFonts w:ascii="SimSun" w:eastAsia="SimSun" w:hAnsi="SimSun"/>
+          <w:sz w:val="24"/>
+          <w:szCs w:val="24"/>
+        </w:rPr>
+        <w:t>Hz)')</w:t>
+      </w:r>
+    </w:p>
+    <w:p>
+      <w:pPr>
+        <w:rPr>
+          <w:rFonts w:ascii="SimSun" w:eastAsia="SimSun" w:hAnsi="SimSun"/>
+          <w:sz w:val="24"/>
+          <w:szCs w:val="24"/>
+        </w:rPr>
+      </w:pPr>
+      <w:proofErr w:type="gramStart"/>
       <w:r>
         <w:rPr>
           <w:rFonts w:ascii="SimSun" w:eastAsia="SimSun" w:hAnsi="SimSun" w:cs="Courier New"/>
@@ -5372,16 +7361,10 @@
           <w:sz w:val="24"/>
           <w:szCs w:val="24"/>
         </w:rPr>
-        <w:t>set(gca,</w:t>
-      </w:r>
-      <w:r>
-        <w:rPr>
-          <w:rFonts w:ascii="SimSun" w:eastAsia="SimSun" w:hAnsi="SimSun" w:cs="Courier New"/>
-          <w:sz w:val="24"/>
-          <w:szCs w:val="24"/>
-        </w:rPr>
-        <w:t>'fontname','DejaVu Sans'</w:t>
-      </w:r>
+        <w:t>set(</w:t>
+      </w:r>
+      <w:proofErr w:type="spellStart"/>
+      <w:proofErr w:type="gramEnd"/>
       <w:r>
         <w:rPr>
           <w:rFonts w:ascii="SimSun" w:eastAsia="SimSun" w:hAnsi="SimSun" w:cs="Courier New"/>
@@ -5389,6 +7372,69 @@
           <w:sz w:val="24"/>
           <w:szCs w:val="24"/>
         </w:rPr>
+        <w:t>gca</w:t>
+      </w:r>
+      <w:proofErr w:type="spellEnd"/>
+      <w:r>
+        <w:rPr>
+          <w:rFonts w:ascii="SimSun" w:eastAsia="SimSun" w:hAnsi="SimSun" w:cs="Courier New"/>
+          <w:color w:val="000000"/>
+          <w:sz w:val="24"/>
+          <w:szCs w:val="24"/>
+        </w:rPr>
+        <w:t>,</w:t>
+      </w:r>
+      <w:r>
+        <w:rPr>
+          <w:rFonts w:ascii="SimSun" w:eastAsia="SimSun" w:hAnsi="SimSun" w:cs="Courier New"/>
+          <w:sz w:val="24"/>
+          <w:szCs w:val="24"/>
+        </w:rPr>
+        <w:t>'</w:t>
+      </w:r>
+      <w:proofErr w:type="spellStart"/>
+      <w:r>
+        <w:rPr>
+          <w:rFonts w:ascii="SimSun" w:eastAsia="SimSun" w:hAnsi="SimSun" w:cs="Courier New"/>
+          <w:sz w:val="24"/>
+          <w:szCs w:val="24"/>
+        </w:rPr>
+        <w:t>fontname</w:t>
+      </w:r>
+      <w:proofErr w:type="spellEnd"/>
+      <w:r>
+        <w:rPr>
+          <w:rFonts w:ascii="SimSun" w:eastAsia="SimSun" w:hAnsi="SimSun" w:cs="Courier New"/>
+          <w:sz w:val="24"/>
+          <w:szCs w:val="24"/>
+        </w:rPr>
+        <w:t>','</w:t>
+      </w:r>
+      <w:proofErr w:type="spellStart"/>
+      <w:r>
+        <w:rPr>
+          <w:rFonts w:ascii="SimSun" w:eastAsia="SimSun" w:hAnsi="SimSun" w:cs="Courier New"/>
+          <w:sz w:val="24"/>
+          <w:szCs w:val="24"/>
+        </w:rPr>
+        <w:t>DejaVu</w:t>
+      </w:r>
+      <w:proofErr w:type="spellEnd"/>
+      <w:r>
+        <w:rPr>
+          <w:rFonts w:ascii="SimSun" w:eastAsia="SimSun" w:hAnsi="SimSun" w:cs="Courier New"/>
+          <w:sz w:val="24"/>
+          <w:szCs w:val="24"/>
+        </w:rPr>
+        <w:t xml:space="preserve"> Sans'</w:t>
+      </w:r>
+      <w:r>
+        <w:rPr>
+          <w:rFonts w:ascii="SimSun" w:eastAsia="SimSun" w:hAnsi="SimSun" w:cs="Courier New"/>
+          <w:color w:val="000000"/>
+          <w:sz w:val="24"/>
+          <w:szCs w:val="24"/>
+        </w:rPr>
         <w:t>)</w:t>
       </w:r>
     </w:p>
@@ -5440,7 +7486,25 @@
           <w:sz w:val="24"/>
           <w:szCs w:val="24"/>
         </w:rPr>
-        <w:t>print('Noise_low_f','-depsc')</w:t>
+        <w:t>print('Noise_low_f','-</w:t>
+      </w:r>
+      <w:proofErr w:type="spellStart"/>
+      <w:r>
+        <w:rPr>
+          <w:rFonts w:ascii="SimSun" w:eastAsia="SimSun" w:hAnsi="SimSun"/>
+          <w:sz w:val="24"/>
+          <w:szCs w:val="24"/>
+        </w:rPr>
+        <w:t>depsc</w:t>
+      </w:r>
+      <w:proofErr w:type="spellEnd"/>
+      <w:r>
+        <w:rPr>
+          <w:rFonts w:ascii="SimSun" w:eastAsia="SimSun" w:hAnsi="SimSun"/>
+          <w:sz w:val="24"/>
+          <w:szCs w:val="24"/>
+        </w:rPr>
+        <w:t>')</w:t>
       </w:r>
     </w:p>
     <w:p>
@@ -5546,7 +7610,23 @@
           <w:sz w:val="24"/>
           <w:szCs w:val="24"/>
         </w:rPr>
-        <w:t>have gnd at the bottom of the diagram.</w:t>
+        <w:t xml:space="preserve">have </w:t>
+      </w:r>
+      <w:proofErr w:type="spellStart"/>
+      <w:r>
+        <w:rPr>
+          <w:sz w:val="24"/>
+          <w:szCs w:val="24"/>
+        </w:rPr>
+        <w:t>gnd</w:t>
+      </w:r>
+      <w:proofErr w:type="spellEnd"/>
+      <w:r>
+        <w:rPr>
+          <w:sz w:val="24"/>
+          <w:szCs w:val="24"/>
+        </w:rPr>
+        <w:t xml:space="preserve"> at the bottom of the diagram.</w:t>
       </w:r>
     </w:p>
     <w:p>
@@ -5566,6 +7646,7 @@
           <w:sz w:val="24"/>
           <w:szCs w:val="24"/>
         </w:rPr>
+        <w:lastRenderedPageBreak/>
         <w:t>clearly label pin numbers, part values polarities, connector inputs etc.</w:t>
       </w:r>
     </w:p>

</xml_diff>

<commit_message>
Finished 4th level edit of 2nd BHD for ligo chapter
</commit_message>
<xml_diff>
--- a/Structuring.docx
+++ b/Structuring.docx
@@ -78,33 +78,15 @@
           <w:sz w:val="24"/>
           <w:szCs w:val="24"/>
         </w:rPr>
-        <w:t xml:space="preserve">This is the first step to writing a chapter. Come up with likely </w:t>
-      </w:r>
-      <w:proofErr w:type="gramStart"/>
-      <w:r>
-        <w:rPr>
-          <w:rFonts w:cstheme="minorHAnsi"/>
-          <w:sz w:val="24"/>
-          <w:szCs w:val="24"/>
-        </w:rPr>
-        <w:t>sections,</w:t>
-      </w:r>
-      <w:r>
-        <w:rPr>
-          <w:rFonts w:cstheme="minorHAnsi"/>
-          <w:sz w:val="24"/>
-          <w:szCs w:val="24"/>
-        </w:rPr>
-        <w:t xml:space="preserve"> and</w:t>
-      </w:r>
-      <w:proofErr w:type="gramEnd"/>
-      <w:r>
-        <w:rPr>
-          <w:rFonts w:cstheme="minorHAnsi"/>
-          <w:sz w:val="24"/>
-          <w:szCs w:val="24"/>
-        </w:rPr>
-        <w:t xml:space="preserve"> fill them in with ideas for paragraphs. Think about/put in relevant figures at this point.</w:t>
+        <w:t>This is the first step to writing a chapter. Come up with likely sections,</w:t>
+      </w:r>
+      <w:r>
+        <w:rPr>
+          <w:rFonts w:cstheme="minorHAnsi"/>
+          <w:sz w:val="24"/>
+          <w:szCs w:val="24"/>
+        </w:rPr>
+        <w:t xml:space="preserve"> and fill them in with ideas for paragraphs. Think about/put in relevant figures at this point.</w:t>
       </w:r>
     </w:p>
     <w:p>
@@ -185,69 +167,15 @@
           <w:sz w:val="24"/>
           <w:szCs w:val="24"/>
         </w:rPr>
-        <w:t xml:space="preserve">writing. </w:t>
-      </w:r>
-      <w:proofErr w:type="gramStart"/>
-      <w:r>
-        <w:rPr>
-          <w:rFonts w:cstheme="minorHAnsi"/>
-          <w:sz w:val="24"/>
-          <w:szCs w:val="24"/>
-        </w:rPr>
-        <w:t>The majority of</w:t>
-      </w:r>
-      <w:proofErr w:type="gramEnd"/>
-      <w:r>
-        <w:rPr>
-          <w:rFonts w:cstheme="minorHAnsi"/>
-          <w:sz w:val="24"/>
-          <w:szCs w:val="24"/>
-        </w:rPr>
-        <w:t xml:space="preserve"> the content of the chapter (&lt;90%) will be written by the end of this draft</w:t>
-      </w:r>
-      <w:r>
-        <w:rPr>
-          <w:rFonts w:cstheme="minorHAnsi"/>
-          <w:sz w:val="24"/>
-          <w:szCs w:val="24"/>
-        </w:rPr>
-        <w:t xml:space="preserve">. The writing at this point may be ‘stream of </w:t>
-      </w:r>
-      <w:proofErr w:type="spellStart"/>
-      <w:r>
-        <w:rPr>
-          <w:rFonts w:cstheme="minorHAnsi"/>
-          <w:sz w:val="24"/>
-          <w:szCs w:val="24"/>
-        </w:rPr>
-        <w:t>conciouness</w:t>
-      </w:r>
-      <w:proofErr w:type="spellEnd"/>
-      <w:r>
-        <w:rPr>
-          <w:rFonts w:cstheme="minorHAnsi"/>
-          <w:sz w:val="24"/>
-          <w:szCs w:val="24"/>
-        </w:rPr>
-        <w:t>`-</w:t>
-      </w:r>
-      <w:proofErr w:type="spellStart"/>
-      <w:r>
-        <w:rPr>
-          <w:rFonts w:cstheme="minorHAnsi"/>
-          <w:sz w:val="24"/>
-          <w:szCs w:val="24"/>
-        </w:rPr>
-        <w:t>esk</w:t>
-      </w:r>
-      <w:proofErr w:type="spellEnd"/>
-      <w:r>
-        <w:rPr>
-          <w:rFonts w:cstheme="minorHAnsi"/>
-          <w:sz w:val="24"/>
-          <w:szCs w:val="24"/>
-        </w:rPr>
-        <w:t xml:space="preserve">, but it should have had an attempt at making it clear. </w:t>
+        <w:t>writing. The majority of the content of the chapter (&lt;90%) will be written by the end of this draft</w:t>
+      </w:r>
+      <w:r>
+        <w:rPr>
+          <w:rFonts w:cstheme="minorHAnsi"/>
+          <w:sz w:val="24"/>
+          <w:szCs w:val="24"/>
+        </w:rPr>
+        <w:t xml:space="preserve">. The writing at this point may be ‘stream of conciouness`-esk, but it should have had an attempt at making it clear. </w:t>
       </w:r>
       <w:r>
         <w:rPr>
@@ -473,25 +401,7 @@
           <w:sz w:val="24"/>
           <w:szCs w:val="24"/>
         </w:rPr>
-        <w:t xml:space="preserve">. Consider if some information can be made into an appendix, or if the chapter could be made into two chapters. </w:t>
-      </w:r>
-      <w:proofErr w:type="gramStart"/>
-      <w:r>
-        <w:rPr>
-          <w:rFonts w:cstheme="minorHAnsi"/>
-          <w:sz w:val="24"/>
-          <w:szCs w:val="24"/>
-        </w:rPr>
-        <w:t>For the purpose of</w:t>
-      </w:r>
-      <w:proofErr w:type="gramEnd"/>
-      <w:r>
-        <w:rPr>
-          <w:rFonts w:cstheme="minorHAnsi"/>
-          <w:sz w:val="24"/>
-          <w:szCs w:val="24"/>
-        </w:rPr>
-        <w:t xml:space="preserve"> editing, continue editing them as if they were one chapter.</w:t>
+        <w:t>. Consider if some information can be made into an appendix, or if the chapter could be made into two chapters. For the purpose of editing, continue editing them as if they were one chapter.</w:t>
       </w:r>
     </w:p>
     <w:p>
@@ -656,25 +566,7 @@
           <w:sz w:val="24"/>
           <w:szCs w:val="24"/>
         </w:rPr>
-        <w:t>word level. This involves checking the spellings of words (</w:t>
-      </w:r>
-      <w:proofErr w:type="spellStart"/>
-      <w:r>
-        <w:rPr>
-          <w:rFonts w:cstheme="minorHAnsi"/>
-          <w:sz w:val="24"/>
-          <w:szCs w:val="24"/>
-        </w:rPr>
-        <w:t>eg.</w:t>
-      </w:r>
-      <w:proofErr w:type="spellEnd"/>
-      <w:r>
-        <w:rPr>
-          <w:rFonts w:cstheme="minorHAnsi"/>
-          <w:sz w:val="24"/>
-          <w:szCs w:val="24"/>
-        </w:rPr>
-        <w:t xml:space="preserve"> Effect or affect). The</w:t>
+        <w:t>word level. This involves checking the spellings of words (eg. Effect or affect). The</w:t>
       </w:r>
       <w:r>
         <w:rPr>
@@ -831,25 +723,7 @@
           <w:sz w:val="24"/>
           <w:szCs w:val="24"/>
         </w:rPr>
-        <w:t xml:space="preserve">nalyse the subject, the </w:t>
-      </w:r>
-      <w:proofErr w:type="gramStart"/>
-      <w:r>
-        <w:rPr>
-          <w:rFonts w:cstheme="minorHAnsi"/>
-          <w:sz w:val="24"/>
-          <w:szCs w:val="24"/>
-        </w:rPr>
-        <w:t>verb</w:t>
-      </w:r>
-      <w:proofErr w:type="gramEnd"/>
-      <w:r>
-        <w:rPr>
-          <w:rFonts w:cstheme="minorHAnsi"/>
-          <w:sz w:val="24"/>
-          <w:szCs w:val="24"/>
-        </w:rPr>
-        <w:t xml:space="preserve"> and the object</w:t>
+        <w:t>nalyse the subject, the verb and the object</w:t>
       </w:r>
       <w:r>
         <w:rPr>
@@ -1366,25 +1240,7 @@
           <w:sz w:val="24"/>
           <w:szCs w:val="24"/>
         </w:rPr>
-        <w:t xml:space="preserve"> </w:t>
-      </w:r>
-      <w:proofErr w:type="spellStart"/>
-      <w:r>
-        <w:rPr>
-          <w:rFonts w:cstheme="minorHAnsi"/>
-          <w:sz w:val="24"/>
-          <w:szCs w:val="24"/>
-        </w:rPr>
-        <w:t>Its</w:t>
-      </w:r>
-      <w:proofErr w:type="spellEnd"/>
-      <w:r>
-        <w:rPr>
-          <w:rFonts w:cstheme="minorHAnsi"/>
-          <w:sz w:val="24"/>
-          <w:szCs w:val="24"/>
-        </w:rPr>
-        <w:t xml:space="preserve"> hard to miss out ones you need. Err on the side of caution.</w:t>
+        <w:t xml:space="preserve"> Its hard to miss out ones you need. Err on the side of caution.</w:t>
       </w:r>
       <w:r>
         <w:rPr>
@@ -1452,33 +1308,15 @@
           <w:sz w:val="24"/>
           <w:szCs w:val="24"/>
         </w:rPr>
-        <w:t xml:space="preserve">People get confused by compound sentences and complex </w:t>
-      </w:r>
-      <w:proofErr w:type="gramStart"/>
-      <w:r>
-        <w:rPr>
-          <w:rFonts w:cstheme="minorHAnsi"/>
-          <w:sz w:val="24"/>
-          <w:szCs w:val="24"/>
-        </w:rPr>
-        <w:t>sentences</w:t>
-      </w:r>
-      <w:r>
-        <w:rPr>
-          <w:rFonts w:cstheme="minorHAnsi"/>
-          <w:sz w:val="24"/>
-          <w:szCs w:val="24"/>
-        </w:rPr>
-        <w:t>,</w:t>
-      </w:r>
-      <w:proofErr w:type="gramEnd"/>
-      <w:r>
-        <w:rPr>
-          <w:rFonts w:cstheme="minorHAnsi"/>
-          <w:sz w:val="24"/>
-          <w:szCs w:val="24"/>
-        </w:rPr>
-        <w:t xml:space="preserve"> I suppose.</w:t>
+        <w:t>People get confused by compound sentences and complex sentences</w:t>
+      </w:r>
+      <w:r>
+        <w:rPr>
+          <w:rFonts w:cstheme="minorHAnsi"/>
+          <w:sz w:val="24"/>
+          <w:szCs w:val="24"/>
+        </w:rPr>
+        <w:t>, I suppose.</w:t>
       </w:r>
     </w:p>
     <w:p>
@@ -1744,23 +1582,13 @@
           <w:szCs w:val="24"/>
         </w:rPr>
       </w:pPr>
-      <w:proofErr w:type="spellStart"/>
-      <w:r>
-        <w:rPr>
-          <w:rFonts w:cstheme="minorHAnsi"/>
-          <w:sz w:val="24"/>
-          <w:szCs w:val="24"/>
-        </w:rPr>
-        <w:t>E.g</w:t>
-      </w:r>
-      <w:proofErr w:type="spellEnd"/>
-      <w:r>
-        <w:rPr>
-          <w:rFonts w:cstheme="minorHAnsi"/>
-          <w:sz w:val="24"/>
-          <w:szCs w:val="24"/>
-        </w:rPr>
-        <w:t xml:space="preserve"> the rat is dead.</w:t>
+      <w:r>
+        <w:rPr>
+          <w:rFonts w:cstheme="minorHAnsi"/>
+          <w:sz w:val="24"/>
+          <w:szCs w:val="24"/>
+        </w:rPr>
+        <w:t>E.g the rat is dead.</w:t>
       </w:r>
     </w:p>
     <w:p>
@@ -1782,25 +1610,7 @@
           <w:sz w:val="24"/>
           <w:szCs w:val="24"/>
         </w:rPr>
-        <w:t xml:space="preserve">The rat is dead </w:t>
-      </w:r>
-      <w:proofErr w:type="gramStart"/>
-      <w:r>
-        <w:rPr>
-          <w:rFonts w:cstheme="minorHAnsi"/>
-          <w:sz w:val="24"/>
-          <w:szCs w:val="24"/>
-        </w:rPr>
-        <w:t>has</w:t>
-      </w:r>
-      <w:proofErr w:type="gramEnd"/>
-      <w:r>
-        <w:rPr>
-          <w:rFonts w:cstheme="minorHAnsi"/>
-          <w:sz w:val="24"/>
-          <w:szCs w:val="24"/>
-        </w:rPr>
-        <w:t xml:space="preserve"> a subject and a verb</w:t>
+        <w:t>The rat is dead has a subject and a verb</w:t>
       </w:r>
     </w:p>
     <w:p>
@@ -1822,25 +1632,7 @@
           <w:sz w:val="24"/>
           <w:szCs w:val="24"/>
         </w:rPr>
-        <w:t xml:space="preserve">Subordinate clause: It </w:t>
-      </w:r>
-      <w:proofErr w:type="gramStart"/>
-      <w:r>
-        <w:rPr>
-          <w:rFonts w:cstheme="minorHAnsi"/>
-          <w:sz w:val="24"/>
-          <w:szCs w:val="24"/>
-        </w:rPr>
-        <w:t>doesn’t</w:t>
-      </w:r>
-      <w:proofErr w:type="gramEnd"/>
-      <w:r>
-        <w:rPr>
-          <w:rFonts w:cstheme="minorHAnsi"/>
-          <w:sz w:val="24"/>
-          <w:szCs w:val="24"/>
-        </w:rPr>
-        <w:t xml:space="preserve"> stand alone.</w:t>
+        <w:t>Subordinate clause: It doesn’t stand alone.</w:t>
       </w:r>
     </w:p>
     <w:p>
@@ -1856,23 +1648,13 @@
           <w:szCs w:val="24"/>
         </w:rPr>
       </w:pPr>
-      <w:proofErr w:type="spellStart"/>
-      <w:r>
-        <w:rPr>
-          <w:rFonts w:cstheme="minorHAnsi"/>
-          <w:sz w:val="24"/>
-          <w:szCs w:val="24"/>
-        </w:rPr>
-        <w:t>E.g</w:t>
-      </w:r>
-      <w:proofErr w:type="spellEnd"/>
-      <w:r>
-        <w:rPr>
-          <w:rFonts w:cstheme="minorHAnsi"/>
-          <w:sz w:val="24"/>
-          <w:szCs w:val="24"/>
-        </w:rPr>
-        <w:t xml:space="preserve"> </w:t>
+      <w:r>
+        <w:rPr>
+          <w:rFonts w:cstheme="minorHAnsi"/>
+          <w:sz w:val="24"/>
+          <w:szCs w:val="24"/>
+        </w:rPr>
+        <w:t xml:space="preserve">E.g </w:t>
       </w:r>
       <w:r>
         <w:rPr>
@@ -1960,25 +1742,7 @@
           <w:sz w:val="24"/>
           <w:szCs w:val="24"/>
         </w:rPr>
-        <w:t xml:space="preserve"> (not particularly </w:t>
-      </w:r>
-      <w:proofErr w:type="gramStart"/>
-      <w:r>
-        <w:rPr>
-          <w:rFonts w:cstheme="minorHAnsi"/>
-          <w:sz w:val="24"/>
-          <w:szCs w:val="24"/>
-        </w:rPr>
-        <w:t>well formed</w:t>
-      </w:r>
-      <w:proofErr w:type="gramEnd"/>
-      <w:r>
-        <w:rPr>
-          <w:rFonts w:cstheme="minorHAnsi"/>
-          <w:sz w:val="24"/>
-          <w:szCs w:val="24"/>
-        </w:rPr>
-        <w:t xml:space="preserve"> sentence)</w:t>
+        <w:t xml:space="preserve"> (not particularly well formed sentence)</w:t>
       </w:r>
     </w:p>
     <w:p>
@@ -2231,25 +1995,7 @@
           <w:sz w:val="24"/>
           <w:szCs w:val="24"/>
         </w:rPr>
-        <w:t xml:space="preserve"> are indicated by ’and’ and both sides should stand alone as main clauses. This means no comma is required between the two clauses (around the </w:t>
-      </w:r>
-      <w:proofErr w:type="spellStart"/>
-      <w:r>
-        <w:rPr>
-          <w:rFonts w:cstheme="minorHAnsi"/>
-          <w:sz w:val="24"/>
-          <w:szCs w:val="24"/>
-        </w:rPr>
-        <w:t>and</w:t>
-      </w:r>
-      <w:proofErr w:type="spellEnd"/>
-      <w:r>
-        <w:rPr>
-          <w:rFonts w:cstheme="minorHAnsi"/>
-          <w:sz w:val="24"/>
-          <w:szCs w:val="24"/>
-        </w:rPr>
-        <w:t>).</w:t>
+        <w:t xml:space="preserve"> are indicated by ’and’ and both sides should stand alone as main clauses. This means no comma is required between the two clauses (around the and).</w:t>
       </w:r>
     </w:p>
     <w:p>
@@ -2456,38 +2202,7 @@
           <w:sz w:val="24"/>
           <w:szCs w:val="24"/>
         </w:rPr>
-        <w:t xml:space="preserve">Object, verb, </w:t>
-      </w:r>
-      <w:proofErr w:type="spellStart"/>
-      <w:proofErr w:type="gramStart"/>
-      <w:r>
-        <w:rPr>
-          <w:rFonts w:cstheme="minorHAnsi"/>
-          <w:color w:val="70AD47" w:themeColor="accent6"/>
-          <w:sz w:val="24"/>
-          <w:szCs w:val="24"/>
-        </w:rPr>
-        <w:t>subject,verb</w:t>
-      </w:r>
-      <w:proofErr w:type="gramEnd"/>
-      <w:r>
-        <w:rPr>
-          <w:rFonts w:cstheme="minorHAnsi"/>
-          <w:color w:val="70AD47" w:themeColor="accent6"/>
-          <w:sz w:val="24"/>
-          <w:szCs w:val="24"/>
-        </w:rPr>
-        <w:t>,subject</w:t>
-      </w:r>
-      <w:proofErr w:type="spellEnd"/>
-      <w:r>
-        <w:rPr>
-          <w:rFonts w:cstheme="minorHAnsi"/>
-          <w:color w:val="70AD47" w:themeColor="accent6"/>
-          <w:sz w:val="24"/>
-          <w:szCs w:val="24"/>
-        </w:rPr>
-        <w:t>.</w:t>
+        <w:t>Object, verb, subject,verb,subject.</w:t>
       </w:r>
     </w:p>
     <w:p>
@@ -2604,17 +2319,7 @@
           <w:sz w:val="24"/>
           <w:szCs w:val="24"/>
         </w:rPr>
-        <w:t xml:space="preserve">Section 2 discusses the functionality needed from the HAM6 </w:t>
-      </w:r>
-      <w:proofErr w:type="gramStart"/>
-      <w:r>
-        <w:rPr>
-          <w:rFonts w:cstheme="minorHAnsi"/>
-          <w:color w:val="FF0000"/>
-          <w:sz w:val="24"/>
-          <w:szCs w:val="24"/>
-        </w:rPr>
-        <w:t>layout</w:t>
+        <w:t>Section 2 discusses the functionality needed from the HAM6 layout</w:t>
       </w:r>
       <w:r>
         <w:rPr>
@@ -2634,17 +2339,7 @@
           <w:sz w:val="24"/>
           <w:szCs w:val="24"/>
         </w:rPr>
-        <w:t xml:space="preserve"> and</w:t>
-      </w:r>
-      <w:proofErr w:type="gramEnd"/>
-      <w:r>
-        <w:rPr>
-          <w:rFonts w:cstheme="minorHAnsi"/>
-          <w:color w:val="FF0000"/>
-          <w:sz w:val="24"/>
-          <w:szCs w:val="24"/>
-        </w:rPr>
-        <w:t xml:space="preserve"> analyses the proposed HAM6 layout</w:t>
+        <w:t xml:space="preserve"> and analyses the proposed HAM6 layout</w:t>
       </w:r>
       <w:r>
         <w:rPr>
@@ -2677,27 +2372,7 @@
           <w:sz w:val="24"/>
           <w:szCs w:val="24"/>
         </w:rPr>
-        <w:t xml:space="preserve">Alice goes fishing by the </w:t>
-      </w:r>
-      <w:proofErr w:type="gramStart"/>
-      <w:r>
-        <w:rPr>
-          <w:rFonts w:cstheme="minorHAnsi"/>
-          <w:color w:val="FF0000"/>
-          <w:sz w:val="24"/>
-          <w:szCs w:val="24"/>
-        </w:rPr>
-        <w:t>lake, and</w:t>
-      </w:r>
-      <w:proofErr w:type="gramEnd"/>
-      <w:r>
-        <w:rPr>
-          <w:rFonts w:cstheme="minorHAnsi"/>
-          <w:color w:val="FF0000"/>
-          <w:sz w:val="24"/>
-          <w:szCs w:val="24"/>
-        </w:rPr>
-        <w:t xml:space="preserve"> catches fish.</w:t>
+        <w:t>Alice goes fishing by the lake, and catches fish.</w:t>
       </w:r>
     </w:p>
     <w:p>
@@ -2743,25 +2418,7 @@
           <w:sz w:val="24"/>
           <w:szCs w:val="24"/>
         </w:rPr>
-        <w:t>noun (</w:t>
-      </w:r>
-      <w:proofErr w:type="gramStart"/>
-      <w:r>
-        <w:rPr>
-          <w:rFonts w:cstheme="minorHAnsi"/>
-          <w:sz w:val="24"/>
-          <w:szCs w:val="24"/>
-        </w:rPr>
-        <w:t>it’s</w:t>
-      </w:r>
-      <w:proofErr w:type="gramEnd"/>
-      <w:r>
-        <w:rPr>
-          <w:rFonts w:cstheme="minorHAnsi"/>
-          <w:sz w:val="24"/>
-          <w:szCs w:val="24"/>
-        </w:rPr>
-        <w:t xml:space="preserve"> a ‘thing’)</w:t>
+        <w:t>noun (it’s a ‘thing’)</w:t>
       </w:r>
       <w:r>
         <w:rPr>
@@ -3070,27 +2727,7 @@
           <w:sz w:val="24"/>
           <w:szCs w:val="24"/>
         </w:rPr>
-        <w:t xml:space="preserve">BHD is a method of measuring information encoded by a light </w:t>
-      </w:r>
-      <w:proofErr w:type="gramStart"/>
-      <w:r>
-        <w:rPr>
-          <w:rFonts w:cstheme="minorHAnsi"/>
-          <w:color w:val="FF0000"/>
-          <w:sz w:val="24"/>
-          <w:szCs w:val="24"/>
-        </w:rPr>
-        <w:t>field,</w:t>
-      </w:r>
-      <w:proofErr w:type="gramEnd"/>
-      <w:r>
-        <w:rPr>
-          <w:rFonts w:cstheme="minorHAnsi"/>
-          <w:color w:val="FF0000"/>
-          <w:sz w:val="24"/>
-          <w:szCs w:val="24"/>
-        </w:rPr>
-        <w:t xml:space="preserve"> it forms a key part of many quantum optics experiments.</w:t>
+        <w:t>BHD is a method of measuring information encoded by a light field, it forms a key part of many quantum optics experiments.</w:t>
       </w:r>
     </w:p>
     <w:p>
@@ -3201,23 +2838,13 @@
           <w:szCs w:val="24"/>
         </w:rPr>
       </w:pPr>
-      <w:proofErr w:type="gramStart"/>
-      <w:r>
-        <w:rPr>
-          <w:rFonts w:cstheme="minorHAnsi"/>
-          <w:sz w:val="24"/>
-          <w:szCs w:val="24"/>
-        </w:rPr>
-        <w:t>However</w:t>
-      </w:r>
-      <w:proofErr w:type="gramEnd"/>
-      <w:r>
-        <w:rPr>
-          <w:rFonts w:cstheme="minorHAnsi"/>
-          <w:sz w:val="24"/>
-          <w:szCs w:val="24"/>
-        </w:rPr>
-        <w:t xml:space="preserve"> is a </w:t>
+      <w:r>
+        <w:rPr>
+          <w:rFonts w:cstheme="minorHAnsi"/>
+          <w:sz w:val="24"/>
+          <w:szCs w:val="24"/>
+        </w:rPr>
+        <w:t xml:space="preserve">However is a </w:t>
       </w:r>
       <w:r>
         <w:rPr>
@@ -3249,25 +2876,7 @@
           <w:sz w:val="24"/>
           <w:szCs w:val="24"/>
         </w:rPr>
-        <w:t xml:space="preserve"> </w:t>
-      </w:r>
-      <w:proofErr w:type="spellStart"/>
-      <w:r>
-        <w:rPr>
-          <w:rFonts w:cstheme="minorHAnsi"/>
-          <w:sz w:val="24"/>
-          <w:szCs w:val="24"/>
-        </w:rPr>
-        <w:t>e.g</w:t>
-      </w:r>
-      <w:proofErr w:type="spellEnd"/>
-      <w:r>
-        <w:rPr>
-          <w:rFonts w:cstheme="minorHAnsi"/>
-          <w:sz w:val="24"/>
-          <w:szCs w:val="24"/>
-        </w:rPr>
-        <w:t>:</w:t>
+        <w:t xml:space="preserve"> e.g:</w:t>
       </w:r>
     </w:p>
     <w:p>
@@ -3291,27 +2900,7 @@
           <w:sz w:val="24"/>
           <w:szCs w:val="24"/>
         </w:rPr>
-        <w:t xml:space="preserve">The rat was </w:t>
-      </w:r>
-      <w:proofErr w:type="gramStart"/>
-      <w:r>
-        <w:rPr>
-          <w:rFonts w:cstheme="minorHAnsi"/>
-          <w:color w:val="FF0000"/>
-          <w:sz w:val="24"/>
-          <w:szCs w:val="24"/>
-        </w:rPr>
-        <w:t>gone,</w:t>
-      </w:r>
-      <w:proofErr w:type="gramEnd"/>
-      <w:r>
-        <w:rPr>
-          <w:rFonts w:cstheme="minorHAnsi"/>
-          <w:color w:val="FF0000"/>
-          <w:sz w:val="24"/>
-          <w:szCs w:val="24"/>
-        </w:rPr>
-        <w:t xml:space="preserve"> however it was not forgotten.</w:t>
+        <w:t>The rat was gone, however it was not forgotten.</w:t>
       </w:r>
     </w:p>
     <w:p>
@@ -3507,25 +3096,7 @@
           <w:sz w:val="24"/>
           <w:szCs w:val="24"/>
         </w:rPr>
-        <w:t>Be careful with ‘</w:t>
-      </w:r>
-      <w:proofErr w:type="gramStart"/>
-      <w:r>
-        <w:rPr>
-          <w:rFonts w:cstheme="minorHAnsi"/>
-          <w:sz w:val="24"/>
-          <w:szCs w:val="24"/>
-        </w:rPr>
-        <w:t>as’</w:t>
-      </w:r>
-      <w:proofErr w:type="gramEnd"/>
-      <w:r>
-        <w:rPr>
-          <w:rFonts w:cstheme="minorHAnsi"/>
-          <w:sz w:val="24"/>
-          <w:szCs w:val="24"/>
-        </w:rPr>
-        <w:t>. Without a comma as can be an adverb</w:t>
+        <w:t>Be careful with ‘as’. Without a comma as can be an adverb</w:t>
       </w:r>
       <w:r>
         <w:rPr>
@@ -3551,23 +3122,13 @@
         </w:rPr>
         <w:t xml:space="preserve">. With a comma, </w:t>
       </w:r>
-      <w:proofErr w:type="gramStart"/>
-      <w:r>
-        <w:rPr>
-          <w:rFonts w:cstheme="minorHAnsi"/>
-          <w:sz w:val="24"/>
-          <w:szCs w:val="24"/>
-        </w:rPr>
-        <w:t>it’s</w:t>
-      </w:r>
-      <w:proofErr w:type="gramEnd"/>
-      <w:r>
-        <w:rPr>
-          <w:rFonts w:cstheme="minorHAnsi"/>
-          <w:sz w:val="24"/>
-          <w:szCs w:val="24"/>
-        </w:rPr>
-        <w:t xml:space="preserve"> the start of a </w:t>
+      <w:r>
+        <w:rPr>
+          <w:rFonts w:cstheme="minorHAnsi"/>
+          <w:sz w:val="24"/>
+          <w:szCs w:val="24"/>
+        </w:rPr>
+        <w:t xml:space="preserve">it’s the start of a </w:t>
       </w:r>
       <w:r>
         <w:rPr>
@@ -3656,6 +3217,68 @@
           <w:szCs w:val="24"/>
         </w:rPr>
         <w:t>.</w:t>
+      </w:r>
+    </w:p>
+    <w:p>
+      <w:pPr>
+        <w:pStyle w:val="ListParagraph"/>
+        <w:numPr>
+          <w:ilvl w:val="1"/>
+          <w:numId w:val="7"/>
+        </w:numPr>
+        <w:rPr>
+          <w:rFonts w:cstheme="minorHAnsi"/>
+          <w:color w:val="70AD47" w:themeColor="accent6"/>
+          <w:sz w:val="24"/>
+          <w:szCs w:val="24"/>
+        </w:rPr>
+      </w:pPr>
+      <w:r>
+        <w:rPr>
+          <w:rFonts w:cstheme="minorHAnsi"/>
+          <w:sz w:val="24"/>
+          <w:szCs w:val="24"/>
+        </w:rPr>
+        <w:t>Adverbial clause: this is a clause in a complex sentence that provides adverbial in formation about it</w:t>
+      </w:r>
+      <w:r>
+        <w:rPr>
+          <w:rFonts w:cstheme="minorHAnsi"/>
+          <w:sz w:val="24"/>
+          <w:szCs w:val="24"/>
+        </w:rPr>
+        <w:t>.</w:t>
+      </w:r>
+    </w:p>
+    <w:p>
+      <w:pPr>
+        <w:pStyle w:val="ListParagraph"/>
+        <w:numPr>
+          <w:ilvl w:val="2"/>
+          <w:numId w:val="7"/>
+        </w:numPr>
+        <w:rPr>
+          <w:rFonts w:cstheme="minorHAnsi"/>
+          <w:color w:val="70AD47" w:themeColor="accent6"/>
+          <w:sz w:val="24"/>
+          <w:szCs w:val="24"/>
+        </w:rPr>
+      </w:pPr>
+      <w:r>
+        <w:rPr>
+          <w:rFonts w:cstheme="minorHAnsi"/>
+          <w:sz w:val="24"/>
+          <w:szCs w:val="24"/>
+        </w:rPr>
+        <w:t xml:space="preserve">Because it was cold, there were goose bumps </w:t>
+      </w:r>
+      <w:r>
+        <w:rPr>
+          <w:rFonts w:cstheme="minorHAnsi"/>
+          <w:sz w:val="24"/>
+          <w:szCs w:val="24"/>
+        </w:rPr>
+        <w:t>on her arm.</w:t>
       </w:r>
     </w:p>
     <w:p>
@@ -4186,21 +3809,12 @@
           <w:szCs w:val="24"/>
         </w:rPr>
       </w:pPr>
-      <w:proofErr w:type="spellStart"/>
-      <w:r>
-        <w:rPr>
-          <w:sz w:val="24"/>
-          <w:szCs w:val="24"/>
-        </w:rPr>
-        <w:t>Ctrl+f</w:t>
-      </w:r>
-      <w:proofErr w:type="spellEnd"/>
-      <w:r>
-        <w:rPr>
-          <w:sz w:val="24"/>
-          <w:szCs w:val="24"/>
-        </w:rPr>
-        <w:t xml:space="preserve"> 1, 2, 3, 4, 5, 6, 7, 8, 9 and 10, replace with one, two, three …</w:t>
+      <w:r>
+        <w:rPr>
+          <w:sz w:val="24"/>
+          <w:szCs w:val="24"/>
+        </w:rPr>
+        <w:t>Ctrl+f 1, 2, 3, 4, 5, 6, 7, 8, 9 and 10, replace with one, two, three …</w:t>
       </w:r>
     </w:p>
     <w:p>
@@ -4215,21 +3829,12 @@
           <w:szCs w:val="24"/>
         </w:rPr>
       </w:pPr>
-      <w:proofErr w:type="spellStart"/>
-      <w:r>
-        <w:rPr>
-          <w:sz w:val="24"/>
-          <w:szCs w:val="24"/>
-        </w:rPr>
-        <w:t>Ctrl+f</w:t>
-      </w:r>
-      <w:proofErr w:type="spellEnd"/>
-      <w:r>
-        <w:rPr>
-          <w:sz w:val="24"/>
-          <w:szCs w:val="24"/>
-        </w:rPr>
-        <w:t xml:space="preserve"> effect and affect</w:t>
+      <w:r>
+        <w:rPr>
+          <w:sz w:val="24"/>
+          <w:szCs w:val="24"/>
+        </w:rPr>
+        <w:t>Ctrl+f effect and affect</w:t>
       </w:r>
     </w:p>
     <w:p>
@@ -4244,38 +3849,20 @@
           <w:szCs w:val="24"/>
         </w:rPr>
       </w:pPr>
-      <w:proofErr w:type="spellStart"/>
-      <w:r>
-        <w:rPr>
-          <w:sz w:val="24"/>
-          <w:szCs w:val="24"/>
-        </w:rPr>
-        <w:t>Ctrl+f</w:t>
-      </w:r>
-      <w:proofErr w:type="spellEnd"/>
-      <w:r>
-        <w:rPr>
-          <w:sz w:val="24"/>
-          <w:szCs w:val="24"/>
-        </w:rPr>
-        <w:t xml:space="preserve"> </w:t>
-      </w:r>
-      <w:r>
-        <w:rPr>
-          <w:sz w:val="24"/>
-          <w:szCs w:val="24"/>
-        </w:rPr>
-        <w:t xml:space="preserve">the </w:t>
-      </w:r>
-      <w:proofErr w:type="spellStart"/>
-      <w:r>
-        <w:rPr>
-          <w:sz w:val="24"/>
-          <w:szCs w:val="24"/>
-        </w:rPr>
-        <w:t>the</w:t>
-      </w:r>
-      <w:proofErr w:type="spellEnd"/>
+      <w:r>
+        <w:rPr>
+          <w:sz w:val="24"/>
+          <w:szCs w:val="24"/>
+        </w:rPr>
+        <w:t xml:space="preserve">Ctrl+f </w:t>
+      </w:r>
+      <w:r>
+        <w:rPr>
+          <w:sz w:val="24"/>
+          <w:szCs w:val="24"/>
+        </w:rPr>
+        <w:t>the the</w:t>
+      </w:r>
     </w:p>
     <w:p>
       <w:pPr>
@@ -4294,23 +3881,7 @@
           <w:sz w:val="24"/>
           <w:szCs w:val="24"/>
         </w:rPr>
-        <w:t xml:space="preserve">Look for etc. </w:t>
-      </w:r>
-      <w:proofErr w:type="gramStart"/>
-      <w:r>
-        <w:rPr>
-          <w:sz w:val="24"/>
-          <w:szCs w:val="24"/>
-        </w:rPr>
-        <w:t>and etc.</w:t>
-      </w:r>
-      <w:proofErr w:type="gramEnd"/>
-      <w:r>
-        <w:rPr>
-          <w:sz w:val="24"/>
-          <w:szCs w:val="24"/>
-        </w:rPr>
-        <w:t>~</w:t>
+        <w:t>Look for etc. and etc.~</w:t>
       </w:r>
     </w:p>
     <w:p>
@@ -4330,6 +3901,7 @@
           <w:sz w:val="24"/>
           <w:szCs w:val="24"/>
         </w:rPr>
+        <w:lastRenderedPageBreak/>
         <w:t>Check `` quote marks.</w:t>
       </w:r>
     </w:p>
@@ -4350,17 +3922,8 @@
           <w:sz w:val="24"/>
           <w:szCs w:val="24"/>
         </w:rPr>
-        <w:t xml:space="preserve">Beam splitter, not </w:t>
-      </w:r>
-      <w:proofErr w:type="spellStart"/>
-      <w:r>
-        <w:rPr>
-          <w:sz w:val="24"/>
-          <w:szCs w:val="24"/>
-        </w:rPr>
-        <w:t>beamsplitter</w:t>
-      </w:r>
-      <w:proofErr w:type="spellEnd"/>
+        <w:t>Beam splitter, not beamsplitter</w:t>
+      </w:r>
     </w:p>
     <w:p>
       <w:pPr>
@@ -4406,24 +3969,7 @@
           <w:sz w:val="24"/>
           <w:szCs w:val="24"/>
         </w:rPr>
-        <w:lastRenderedPageBreak/>
-        <w:t xml:space="preserve">Remove </w:t>
-      </w:r>
-      <w:proofErr w:type="gramStart"/>
-      <w:r>
-        <w:rPr>
-          <w:sz w:val="24"/>
-          <w:szCs w:val="24"/>
-        </w:rPr>
-        <w:t>doesn’t</w:t>
-      </w:r>
-      <w:proofErr w:type="gramEnd"/>
-      <w:r>
-        <w:rPr>
-          <w:sz w:val="24"/>
-          <w:szCs w:val="24"/>
-        </w:rPr>
-        <w:t>, replace with does not, etc.</w:t>
+        <w:t>Remove doesn’t, replace with does not, etc.</w:t>
       </w:r>
     </w:p>
     <w:p>
@@ -4443,23 +3989,7 @@
           <w:sz w:val="24"/>
           <w:szCs w:val="24"/>
         </w:rPr>
-        <w:t xml:space="preserve">Effect is a </w:t>
-      </w:r>
-      <w:proofErr w:type="gramStart"/>
-      <w:r>
-        <w:rPr>
-          <w:sz w:val="24"/>
-          <w:szCs w:val="24"/>
-        </w:rPr>
-        <w:t>noun,</w:t>
-      </w:r>
-      <w:proofErr w:type="gramEnd"/>
-      <w:r>
-        <w:rPr>
-          <w:sz w:val="24"/>
-          <w:szCs w:val="24"/>
-        </w:rPr>
-        <w:t xml:space="preserve"> affect is a verb. </w:t>
+        <w:t xml:space="preserve">Effect is a noun, affect is a verb. </w:t>
       </w:r>
       <w:r>
         <w:rPr>
@@ -4651,23 +4181,7 @@
           <w:sz w:val="24"/>
           <w:szCs w:val="24"/>
         </w:rPr>
-        <w:t>Lots end in ‘</w:t>
-      </w:r>
-      <w:proofErr w:type="spellStart"/>
-      <w:r>
-        <w:rPr>
-          <w:sz w:val="24"/>
-          <w:szCs w:val="24"/>
-        </w:rPr>
-        <w:t>ly</w:t>
-      </w:r>
-      <w:proofErr w:type="spellEnd"/>
-      <w:r>
-        <w:rPr>
-          <w:sz w:val="24"/>
-          <w:szCs w:val="24"/>
-        </w:rPr>
-        <w:t>’</w:t>
+        <w:t>Lots end in ‘ly’</w:t>
       </w:r>
     </w:p>
     <w:p>
@@ -4785,7 +4299,13 @@
           <w:szCs w:val="24"/>
         </w:rPr>
       </w:pPr>
-      <w:proofErr w:type="gramStart"/>
+      <w:r>
+        <w:rPr>
+          <w:sz w:val="24"/>
+          <w:szCs w:val="24"/>
+        </w:rPr>
+        <w:t xml:space="preserve">Photodiode, not </w:t>
+      </w:r>
       <w:r>
         <w:rPr>
           <w:sz w:val="24"/>
@@ -4793,7 +4313,26 @@
         </w:rPr>
         <w:t>Photo-diode</w:t>
       </w:r>
-      <w:proofErr w:type="gramEnd"/>
+    </w:p>
+    <w:p>
+      <w:pPr>
+        <w:pStyle w:val="ListParagraph"/>
+        <w:numPr>
+          <w:ilvl w:val="1"/>
+          <w:numId w:val="6"/>
+        </w:numPr>
+        <w:rPr>
+          <w:sz w:val="24"/>
+          <w:szCs w:val="24"/>
+        </w:rPr>
+      </w:pPr>
+      <w:r>
+        <w:rPr>
+          <w:sz w:val="24"/>
+          <w:szCs w:val="24"/>
+        </w:rPr>
+        <w:t>Check ngram viewer if unsure.</w:t>
+      </w:r>
     </w:p>
     <w:p>
       <w:pPr>
@@ -4834,21 +4373,12 @@
           <w:szCs w:val="24"/>
         </w:rPr>
       </w:pPr>
-      <w:proofErr w:type="spellStart"/>
-      <w:r>
-        <w:rPr>
-          <w:sz w:val="24"/>
-          <w:szCs w:val="24"/>
-        </w:rPr>
-        <w:t>E.g</w:t>
-      </w:r>
-      <w:proofErr w:type="spellEnd"/>
-      <w:r>
-        <w:rPr>
-          <w:sz w:val="24"/>
-          <w:szCs w:val="24"/>
-        </w:rPr>
-        <w:t xml:space="preserve"> </w:t>
+      <w:r>
+        <w:rPr>
+          <w:sz w:val="24"/>
+          <w:szCs w:val="24"/>
+        </w:rPr>
+        <w:t xml:space="preserve">E.g </w:t>
       </w:r>
       <w:r>
         <w:rPr>
@@ -4889,23 +4419,7 @@
           <w:sz w:val="24"/>
           <w:szCs w:val="24"/>
         </w:rPr>
-        <w:t xml:space="preserve">Current detector = </w:t>
-      </w:r>
-      <w:proofErr w:type="spellStart"/>
-      <w:r>
-        <w:rPr>
-          <w:sz w:val="24"/>
-          <w:szCs w:val="24"/>
-        </w:rPr>
-        <w:t>aLIGO</w:t>
-      </w:r>
-      <w:proofErr w:type="spellEnd"/>
-      <w:r>
-        <w:rPr>
-          <w:sz w:val="24"/>
-          <w:szCs w:val="24"/>
-        </w:rPr>
-        <w:t>, future detector = LIGO A+, the detector in a general abstract sense = LIGO</w:t>
+        <w:t>Current detector = aLIGO, future detector = LIGO A+, the detector in a general abstract sense = LIGO</w:t>
       </w:r>
     </w:p>
     <w:p>
@@ -4920,21 +4434,12 @@
           <w:szCs w:val="24"/>
         </w:rPr>
       </w:pPr>
-      <w:proofErr w:type="gramStart"/>
-      <w:r>
-        <w:rPr>
-          <w:sz w:val="24"/>
-          <w:szCs w:val="24"/>
-        </w:rPr>
-        <w:t>None classical</w:t>
-      </w:r>
-      <w:proofErr w:type="gramEnd"/>
-      <w:r>
-        <w:rPr>
-          <w:sz w:val="24"/>
-          <w:szCs w:val="24"/>
-        </w:rPr>
-        <w:t xml:space="preserve"> -&gt; non-classical</w:t>
+      <w:r>
+        <w:rPr>
+          <w:sz w:val="24"/>
+          <w:szCs w:val="24"/>
+        </w:rPr>
+        <w:t>None classical -&gt; non-classical</w:t>
       </w:r>
     </w:p>
     <w:p>
@@ -4982,6 +4487,82 @@
           <w:szCs w:val="24"/>
         </w:rPr>
         <w:t>Watch out for ‘ration’.</w:t>
+      </w:r>
+    </w:p>
+    <w:p>
+      <w:pPr>
+        <w:pStyle w:val="ListParagraph"/>
+        <w:numPr>
+          <w:ilvl w:val="0"/>
+          <w:numId w:val="6"/>
+        </w:numPr>
+        <w:rPr>
+          <w:sz w:val="24"/>
+          <w:szCs w:val="24"/>
+        </w:rPr>
+      </w:pPr>
+      <w:r>
+        <w:rPr>
+          <w:sz w:val="24"/>
+          <w:szCs w:val="24"/>
+        </w:rPr>
+        <w:t xml:space="preserve">Check </w:t>
+      </w:r>
+      <w:r>
+        <w:rPr>
+          <w:sz w:val="24"/>
+          <w:szCs w:val="24"/>
+        </w:rPr>
+        <w:t>‘</w:t>
+      </w:r>
+      <w:r>
+        <w:rPr>
+          <w:sz w:val="24"/>
+          <w:szCs w:val="24"/>
+        </w:rPr>
+        <w:t>&lt;</w:t>
+      </w:r>
+      <w:r>
+        <w:rPr>
+          <w:sz w:val="24"/>
+          <w:szCs w:val="24"/>
+        </w:rPr>
+        <w:t>’</w:t>
+      </w:r>
+      <w:r>
+        <w:rPr>
+          <w:sz w:val="24"/>
+          <w:szCs w:val="24"/>
+        </w:rPr>
+        <w:t xml:space="preserve"> and </w:t>
+      </w:r>
+      <w:r>
+        <w:rPr>
+          <w:sz w:val="24"/>
+          <w:szCs w:val="24"/>
+        </w:rPr>
+        <w:t>‘</w:t>
+      </w:r>
+      <w:r>
+        <w:rPr>
+          <w:sz w:val="24"/>
+          <w:szCs w:val="24"/>
+        </w:rPr>
+        <w:t>&gt;</w:t>
+      </w:r>
+      <w:r>
+        <w:rPr>
+          <w:sz w:val="24"/>
+          <w:szCs w:val="24"/>
+        </w:rPr>
+        <w:t>’</w:t>
+      </w:r>
+      <w:r>
+        <w:rPr>
+          <w:sz w:val="24"/>
+          <w:szCs w:val="24"/>
+        </w:rPr>
+        <w:t xml:space="preserve"> signs.</w:t>
       </w:r>
     </w:p>
     <w:p>
@@ -5051,39 +4632,7 @@
           <w:sz w:val="24"/>
           <w:szCs w:val="24"/>
         </w:rPr>
-        <w:t>Figures shall be saved as eps when using matplotlib or '</w:t>
-      </w:r>
-      <w:proofErr w:type="spellStart"/>
-      <w:r>
-        <w:rPr>
-          <w:sz w:val="24"/>
-          <w:szCs w:val="24"/>
-        </w:rPr>
-        <w:t>epsc</w:t>
-      </w:r>
-      <w:proofErr w:type="spellEnd"/>
-      <w:r>
-        <w:rPr>
-          <w:sz w:val="24"/>
-          <w:szCs w:val="24"/>
-        </w:rPr>
-        <w:t xml:space="preserve">' when using </w:t>
-      </w:r>
-      <w:proofErr w:type="spellStart"/>
-      <w:r>
-        <w:rPr>
-          <w:sz w:val="24"/>
-          <w:szCs w:val="24"/>
-        </w:rPr>
-        <w:t>matlab</w:t>
-      </w:r>
-      <w:proofErr w:type="spellEnd"/>
-      <w:r>
-        <w:rPr>
-          <w:sz w:val="24"/>
-          <w:szCs w:val="24"/>
-        </w:rPr>
-        <w:t>. This is to prevent a latex warning.</w:t>
+        <w:t>Figures shall be saved as eps when using matplotlib or 'epsc' when using matlab. This is to prevent a latex warning.</w:t>
       </w:r>
     </w:p>
     <w:p>
@@ -5137,23 +4686,7 @@
           <w:sz w:val="24"/>
           <w:szCs w:val="24"/>
         </w:rPr>
-        <w:t xml:space="preserve">Figure names shall be 'chapter </w:t>
-      </w:r>
-      <w:proofErr w:type="spellStart"/>
-      <w:r>
-        <w:rPr>
-          <w:sz w:val="24"/>
-          <w:szCs w:val="24"/>
-        </w:rPr>
-        <w:t>description'_chapter_'figure</w:t>
-      </w:r>
-      <w:proofErr w:type="spellEnd"/>
-      <w:r>
-        <w:rPr>
-          <w:sz w:val="24"/>
-          <w:szCs w:val="24"/>
-        </w:rPr>
-        <w:t xml:space="preserve"> description'. For</w:t>
+        <w:t>Figure names shall be 'chapter description'_chapter_'figure description'. For</w:t>
       </w:r>
       <w:r>
         <w:rPr>
@@ -5167,23 +4700,7 @@
           <w:sz w:val="24"/>
           <w:szCs w:val="24"/>
         </w:rPr>
-        <w:t>example, '</w:t>
-      </w:r>
-      <w:proofErr w:type="spellStart"/>
-      <w:r>
-        <w:rPr>
-          <w:sz w:val="24"/>
-          <w:szCs w:val="24"/>
-        </w:rPr>
-        <w:t>sim_chapter_Zoom_in_ETM_tuning</w:t>
-      </w:r>
-      <w:proofErr w:type="spellEnd"/>
-      <w:r>
-        <w:rPr>
-          <w:sz w:val="24"/>
-          <w:szCs w:val="24"/>
-        </w:rPr>
-        <w:t>' refers to the figure being in the</w:t>
+        <w:t>example, 'sim_chapter_Zoom_in_ETM_tuning' refers to the figure being in the</w:t>
       </w:r>
       <w:r>
         <w:rPr>
@@ -5237,23 +4754,7 @@
           <w:sz w:val="24"/>
           <w:szCs w:val="24"/>
         </w:rPr>
-        <w:t xml:space="preserve">Are all lines visible/distinguishable? Changing thickness and </w:t>
-      </w:r>
-      <w:proofErr w:type="spellStart"/>
-      <w:r>
-        <w:rPr>
-          <w:sz w:val="24"/>
-          <w:szCs w:val="24"/>
-        </w:rPr>
-        <w:t>linestyle</w:t>
-      </w:r>
-      <w:proofErr w:type="spellEnd"/>
-      <w:r>
-        <w:rPr>
-          <w:sz w:val="24"/>
-          <w:szCs w:val="24"/>
-        </w:rPr>
-        <w:t xml:space="preserve"> can help.</w:t>
+        <w:t>Are all lines visible/distinguishable? Changing thickness and linestyle can help.</w:t>
       </w:r>
     </w:p>
     <w:p>
@@ -5268,37 +4769,12 @@
           <w:szCs w:val="24"/>
         </w:rPr>
       </w:pPr>
-      <w:proofErr w:type="gramStart"/>
-      <w:r>
-        <w:rPr>
-          <w:sz w:val="24"/>
-          <w:szCs w:val="24"/>
-        </w:rPr>
-        <w:t>Are</w:t>
-      </w:r>
-      <w:proofErr w:type="gramEnd"/>
-      <w:r>
-        <w:rPr>
-          <w:sz w:val="24"/>
-          <w:szCs w:val="24"/>
-        </w:rPr>
-        <w:t xml:space="preserve"> the axis labelled? The label is a sentence, so normal sentence capitalisation should be used. If </w:t>
-      </w:r>
-      <w:proofErr w:type="spellStart"/>
-      <w:r>
-        <w:rPr>
-          <w:sz w:val="24"/>
-          <w:szCs w:val="24"/>
-        </w:rPr>
-        <w:t>its</w:t>
-      </w:r>
-      <w:proofErr w:type="spellEnd"/>
-      <w:r>
-        <w:rPr>
-          <w:sz w:val="24"/>
-          <w:szCs w:val="24"/>
-        </w:rPr>
-        <w:t xml:space="preserve"> just one word, use a capital letter.</w:t>
+      <w:r>
+        <w:rPr>
+          <w:sz w:val="24"/>
+          <w:szCs w:val="24"/>
+        </w:rPr>
+        <w:t>Are the axis labelled? The label is a sentence, so normal sentence capitalisation should be used. If its just one word, use a capital letter.</w:t>
       </w:r>
     </w:p>
     <w:p>
@@ -5333,21 +4809,12 @@
           <w:szCs w:val="24"/>
         </w:rPr>
       </w:pPr>
-      <w:proofErr w:type="gramStart"/>
-      <w:r>
-        <w:rPr>
-          <w:sz w:val="24"/>
-          <w:szCs w:val="24"/>
-        </w:rPr>
-        <w:t>Do</w:t>
-      </w:r>
-      <w:proofErr w:type="gramEnd"/>
-      <w:r>
-        <w:rPr>
-          <w:sz w:val="24"/>
-          <w:szCs w:val="24"/>
-        </w:rPr>
-        <w:t xml:space="preserve"> the axis have units? The units should be put in brackets like (m). No other shape of brackets should be used.</w:t>
+      <w:r>
+        <w:rPr>
+          <w:sz w:val="24"/>
+          <w:szCs w:val="24"/>
+        </w:rPr>
+        <w:t>Do the axis have units? The units should be put in brackets like (m). No other shape of brackets should be used.</w:t>
       </w:r>
     </w:p>
     <w:p>
@@ -5367,6 +4834,7 @@
           <w:sz w:val="24"/>
           <w:szCs w:val="24"/>
         </w:rPr>
+        <w:lastRenderedPageBreak/>
         <w:t xml:space="preserve">Does the figure need a grid? This is useful for when precise values need reading off from the plot. </w:t>
       </w:r>
     </w:p>
@@ -5387,23 +4855,7 @@
           <w:sz w:val="24"/>
           <w:szCs w:val="24"/>
         </w:rPr>
-        <w:t xml:space="preserve">Are subscripts properly </w:t>
-      </w:r>
-      <w:proofErr w:type="spellStart"/>
-      <w:r>
-        <w:rPr>
-          <w:sz w:val="24"/>
-          <w:szCs w:val="24"/>
-        </w:rPr>
-        <w:t>typset</w:t>
-      </w:r>
-      <w:proofErr w:type="spellEnd"/>
-      <w:r>
-        <w:rPr>
-          <w:sz w:val="24"/>
-          <w:szCs w:val="24"/>
-        </w:rPr>
-        <w:t>?</w:t>
+        <w:t>Are subscripts properly typset?</w:t>
       </w:r>
     </w:p>
     <w:p>
@@ -5423,39 +4875,7 @@
           <w:sz w:val="24"/>
           <w:szCs w:val="24"/>
         </w:rPr>
-        <w:t xml:space="preserve">Have standard unit labels been used? </w:t>
-      </w:r>
-      <w:proofErr w:type="gramStart"/>
-      <w:r>
-        <w:rPr>
-          <w:sz w:val="24"/>
-          <w:szCs w:val="24"/>
-        </w:rPr>
-        <w:t>A for</w:t>
-      </w:r>
-      <w:proofErr w:type="gramEnd"/>
-      <w:r>
-        <w:rPr>
-          <w:sz w:val="24"/>
-          <w:szCs w:val="24"/>
-        </w:rPr>
-        <w:t xml:space="preserve"> amps, degree symbols instead of '</w:t>
-      </w:r>
-      <w:proofErr w:type="spellStart"/>
-      <w:r>
-        <w:rPr>
-          <w:sz w:val="24"/>
-          <w:szCs w:val="24"/>
-        </w:rPr>
-        <w:t>deg</w:t>
-      </w:r>
-      <w:proofErr w:type="spellEnd"/>
-      <w:r>
-        <w:rPr>
-          <w:sz w:val="24"/>
-          <w:szCs w:val="24"/>
-        </w:rPr>
-        <w:t>' etc.</w:t>
+        <w:t>Have standard unit labels been used? A for amps, degree symbols instead of 'deg' etc.</w:t>
       </w:r>
     </w:p>
     <w:p>
@@ -5495,24 +4915,7 @@
           <w:sz w:val="24"/>
           <w:szCs w:val="24"/>
         </w:rPr>
-        <w:lastRenderedPageBreak/>
-        <w:t xml:space="preserve">Check for spelling mistakes! e.g. </w:t>
-      </w:r>
-      <w:proofErr w:type="spellStart"/>
-      <w:r>
-        <w:rPr>
-          <w:sz w:val="24"/>
-          <w:szCs w:val="24"/>
-        </w:rPr>
-        <w:t>freuqency</w:t>
-      </w:r>
-      <w:proofErr w:type="spellEnd"/>
-      <w:r>
-        <w:rPr>
-          <w:sz w:val="24"/>
-          <w:szCs w:val="24"/>
-        </w:rPr>
-        <w:t xml:space="preserve"> -&gt; frequency.</w:t>
+        <w:t>Check for spelling mistakes! e.g. freuqency -&gt; frequency.</w:t>
       </w:r>
     </w:p>
     <w:p>
@@ -5615,23 +5018,7 @@
           <w:sz w:val="24"/>
           <w:szCs w:val="24"/>
         </w:rPr>
-        <w:t xml:space="preserve">Standard </w:t>
-      </w:r>
-      <w:proofErr w:type="spellStart"/>
-      <w:r>
-        <w:rPr>
-          <w:sz w:val="24"/>
-          <w:szCs w:val="24"/>
-        </w:rPr>
-        <w:t>matlab</w:t>
-      </w:r>
-      <w:proofErr w:type="spellEnd"/>
-      <w:r>
-        <w:rPr>
-          <w:sz w:val="24"/>
-          <w:szCs w:val="24"/>
-        </w:rPr>
-        <w:t xml:space="preserve"> and matplotlib fonts will be used. The following examples give</w:t>
+        <w:t>Standard matlab and matplotlib fonts will be used. The following examples give</w:t>
       </w:r>
       <w:r>
         <w:rPr>
@@ -5734,55 +5121,7 @@
           <w:sz w:val="24"/>
           <w:szCs w:val="24"/>
         </w:rPr>
-        <w:t xml:space="preserve">have ‘shared axis’, only label one of the axis. If </w:t>
-      </w:r>
-      <w:proofErr w:type="gramStart"/>
-      <w:r>
-        <w:rPr>
-          <w:sz w:val="24"/>
-          <w:szCs w:val="24"/>
-        </w:rPr>
-        <w:t>it’s</w:t>
-      </w:r>
-      <w:proofErr w:type="gramEnd"/>
-      <w:r>
-        <w:rPr>
-          <w:sz w:val="24"/>
-          <w:szCs w:val="24"/>
-        </w:rPr>
-        <w:t xml:space="preserve"> the </w:t>
-      </w:r>
-      <w:proofErr w:type="spellStart"/>
-      <w:r>
-        <w:rPr>
-          <w:sz w:val="24"/>
-          <w:szCs w:val="24"/>
-        </w:rPr>
-        <w:t>xaxis</w:t>
-      </w:r>
-      <w:proofErr w:type="spellEnd"/>
-      <w:r>
-        <w:rPr>
-          <w:sz w:val="24"/>
-          <w:szCs w:val="24"/>
-        </w:rPr>
-        <w:t xml:space="preserve">, then label the bottom one. If </w:t>
-      </w:r>
-      <w:proofErr w:type="gramStart"/>
-      <w:r>
-        <w:rPr>
-          <w:sz w:val="24"/>
-          <w:szCs w:val="24"/>
-        </w:rPr>
-        <w:t>it’s</w:t>
-      </w:r>
-      <w:proofErr w:type="gramEnd"/>
-      <w:r>
-        <w:rPr>
-          <w:sz w:val="24"/>
-          <w:szCs w:val="24"/>
-        </w:rPr>
-        <w:t xml:space="preserve"> the y axis, label the left one.</w:t>
+        <w:t>have ‘shared axis’, only label one of the axis. If it’s the xaxis, then label the bottom one. If it’s the y axis, label the left one.</w:t>
       </w:r>
     </w:p>
     <w:p>
@@ -5839,211 +5178,341 @@
           <w:sz w:val="24"/>
           <w:szCs w:val="24"/>
         </w:rPr>
+        <w:t xml:space="preserve"> fontsize = </w:t>
+      </w:r>
+      <w:r>
+        <w:rPr>
+          <w:sz w:val="24"/>
+          <w:szCs w:val="24"/>
+        </w:rPr>
+        <w:t>11.5</w:t>
+      </w:r>
+      <w:r>
+        <w:rPr>
+          <w:sz w:val="24"/>
+          <w:szCs w:val="24"/>
+        </w:rPr>
+        <w:t xml:space="preserve"> on axis</w:t>
+      </w:r>
+      <w:r>
+        <w:rPr>
+          <w:sz w:val="24"/>
+          <w:szCs w:val="24"/>
+        </w:rPr>
+        <w:t xml:space="preserve">.  Font size set to </w:t>
+      </w:r>
+      <w:r>
+        <w:rPr>
+          <w:sz w:val="24"/>
+          <w:szCs w:val="24"/>
+        </w:rPr>
+        <w:t>10</w:t>
+      </w:r>
+      <w:r>
+        <w:rPr>
+          <w:sz w:val="24"/>
+          <w:szCs w:val="24"/>
+        </w:rPr>
+        <w:t xml:space="preserve"> in the legend</w:t>
+      </w:r>
+      <w:r>
+        <w:rPr>
+          <w:sz w:val="24"/>
+          <w:szCs w:val="24"/>
+        </w:rPr>
+        <w:t>. Axis set to default</w:t>
+      </w:r>
+      <w:r>
+        <w:rPr>
+          <w:sz w:val="24"/>
+          <w:szCs w:val="24"/>
+        </w:rPr>
+        <w:t>. If the legend looks too big, try splitting it into multiple columns. If this doesn’t work, reduce the</w:t>
+      </w:r>
+      <w:r>
+        <w:rPr>
+          <w:sz w:val="24"/>
+          <w:szCs w:val="24"/>
+        </w:rPr>
+        <w:t xml:space="preserve"> fontsize </w:t>
+      </w:r>
+      <w:r>
+        <w:rPr>
+          <w:sz w:val="24"/>
+          <w:szCs w:val="24"/>
+        </w:rPr>
+        <w:t>to</w:t>
+      </w:r>
+      <w:r>
+        <w:rPr>
+          <w:sz w:val="24"/>
+          <w:szCs w:val="24"/>
+        </w:rPr>
         <w:t xml:space="preserve"> </w:t>
       </w:r>
-      <w:proofErr w:type="spellStart"/>
-      <w:r>
-        <w:rPr>
-          <w:sz w:val="24"/>
-          <w:szCs w:val="24"/>
-        </w:rPr>
-        <w:t>fontsize</w:t>
-      </w:r>
-      <w:proofErr w:type="spellEnd"/>
-      <w:r>
-        <w:rPr>
-          <w:sz w:val="24"/>
-          <w:szCs w:val="24"/>
-        </w:rPr>
-        <w:t xml:space="preserve"> = </w:t>
-      </w:r>
-      <w:r>
-        <w:rPr>
-          <w:sz w:val="24"/>
-          <w:szCs w:val="24"/>
-        </w:rPr>
-        <w:t>11.5</w:t>
-      </w:r>
-      <w:r>
-        <w:rPr>
-          <w:sz w:val="24"/>
-          <w:szCs w:val="24"/>
-        </w:rPr>
-        <w:t xml:space="preserve"> on axis</w:t>
-      </w:r>
-      <w:r>
-        <w:rPr>
-          <w:sz w:val="24"/>
-          <w:szCs w:val="24"/>
-        </w:rPr>
-        <w:t xml:space="preserve">.  Font size set to </w:t>
-      </w:r>
-      <w:r>
-        <w:rPr>
-          <w:sz w:val="24"/>
-          <w:szCs w:val="24"/>
-        </w:rPr>
-        <w:t>10</w:t>
-      </w:r>
-      <w:r>
-        <w:rPr>
-          <w:sz w:val="24"/>
-          <w:szCs w:val="24"/>
-        </w:rPr>
-        <w:t xml:space="preserve"> in the legend</w:t>
-      </w:r>
-      <w:r>
-        <w:rPr>
-          <w:sz w:val="24"/>
-          <w:szCs w:val="24"/>
-        </w:rPr>
-        <w:t>. Axis set to default</w:t>
-      </w:r>
-      <w:r>
-        <w:rPr>
-          <w:sz w:val="24"/>
-          <w:szCs w:val="24"/>
-        </w:rPr>
-        <w:t xml:space="preserve">. If the legend looks too big, try splitting it into multiple columns. If this </w:t>
-      </w:r>
-      <w:proofErr w:type="gramStart"/>
-      <w:r>
-        <w:rPr>
-          <w:sz w:val="24"/>
-          <w:szCs w:val="24"/>
-        </w:rPr>
-        <w:t>doesn’t</w:t>
-      </w:r>
-      <w:proofErr w:type="gramEnd"/>
-      <w:r>
-        <w:rPr>
-          <w:sz w:val="24"/>
-          <w:szCs w:val="24"/>
-        </w:rPr>
-        <w:t xml:space="preserve"> work, reduce the</w:t>
-      </w:r>
-      <w:r>
-        <w:rPr>
-          <w:sz w:val="24"/>
-          <w:szCs w:val="24"/>
-        </w:rPr>
+      <w:r>
+        <w:rPr>
+          <w:sz w:val="24"/>
+          <w:szCs w:val="24"/>
+        </w:rPr>
+        <w:t>10 or 8</w:t>
+      </w:r>
+      <w:r>
+        <w:rPr>
+          <w:sz w:val="24"/>
+          <w:szCs w:val="24"/>
+        </w:rPr>
+        <w:t xml:space="preserve"> for</w:t>
+      </w:r>
+      <w:r>
+        <w:rPr>
+          <w:sz w:val="24"/>
+          <w:szCs w:val="24"/>
+        </w:rPr>
+        <w:t xml:space="preserve"> the</w:t>
+      </w:r>
+      <w:r>
+        <w:rPr>
+          <w:sz w:val="24"/>
+          <w:szCs w:val="24"/>
+        </w:rPr>
+        <w:t xml:space="preserve"> legend. </w:t>
+      </w:r>
+      <w:r>
+        <w:rPr>
+          <w:sz w:val="24"/>
+          <w:szCs w:val="24"/>
+        </w:rPr>
+        <w:t>Standard matplotlib colours are nice. Standard font is nice</w:t>
+      </w:r>
+    </w:p>
+    <w:p>
+      <w:pPr>
+        <w:rPr>
+          <w:sz w:val="24"/>
+          <w:szCs w:val="24"/>
+        </w:rPr>
+      </w:pPr>
+    </w:p>
+    <w:p>
+      <w:pPr>
+        <w:rPr>
+          <w:rFonts w:ascii="SimSun" w:eastAsia="SimSun" w:hAnsi="SimSun"/>
+          <w:sz w:val="24"/>
+          <w:szCs w:val="24"/>
+        </w:rPr>
+      </w:pPr>
+      <w:r>
+        <w:rPr>
+          <w:rFonts w:ascii="SimSun" w:eastAsia="SimSun" w:hAnsi="SimSun"/>
+          <w:sz w:val="24"/>
+          <w:szCs w:val="24"/>
+        </w:rPr>
+        <w:t>figure_size = (6,</w:t>
+      </w:r>
+      <w:r>
+        <w:rPr>
+          <w:rFonts w:ascii="SimSun" w:eastAsia="SimSun" w:hAnsi="SimSun"/>
+          <w:sz w:val="24"/>
+          <w:szCs w:val="24"/>
+        </w:rPr>
+        <w:t>3.5</w:t>
+      </w:r>
+      <w:r>
+        <w:rPr>
+          <w:rFonts w:ascii="SimSun" w:eastAsia="SimSun" w:hAnsi="SimSun"/>
+          <w:sz w:val="24"/>
+          <w:szCs w:val="24"/>
+        </w:rPr>
+        <w:t>)</w:t>
+      </w:r>
+    </w:p>
+    <w:p>
+      <w:pPr>
+        <w:rPr>
+          <w:rFonts w:ascii="SimSun" w:eastAsia="SimSun" w:hAnsi="SimSun"/>
+          <w:sz w:val="24"/>
+          <w:szCs w:val="24"/>
+        </w:rPr>
+      </w:pPr>
+      <w:r>
+        <w:rPr>
+          <w:rFonts w:ascii="SimSun" w:eastAsia="SimSun" w:hAnsi="SimSun"/>
+          <w:sz w:val="24"/>
+          <w:szCs w:val="24"/>
+        </w:rPr>
+        <w:t xml:space="preserve">plt.figure(figsize = figure_size,dpi = </w:t>
+      </w:r>
+      <w:r>
+        <w:rPr>
+          <w:rFonts w:ascii="SimSun" w:eastAsia="SimSun" w:hAnsi="SimSun"/>
+          <w:sz w:val="24"/>
+          <w:szCs w:val="24"/>
+        </w:rPr>
+        <w:t>15</w:t>
+      </w:r>
+      <w:r>
+        <w:rPr>
+          <w:rFonts w:ascii="SimSun" w:eastAsia="SimSun" w:hAnsi="SimSun"/>
+          <w:sz w:val="24"/>
+          <w:szCs w:val="24"/>
+        </w:rPr>
+        <w:t>0)</w:t>
+      </w:r>
+    </w:p>
+    <w:p>
+      <w:pPr>
+        <w:rPr>
+          <w:rFonts w:ascii="SimSun" w:eastAsia="SimSun" w:hAnsi="SimSun"/>
+          <w:sz w:val="24"/>
+          <w:szCs w:val="24"/>
+        </w:rPr>
+      </w:pPr>
+      <w:r>
+        <w:rPr>
+          <w:rFonts w:ascii="SimSun" w:eastAsia="SimSun" w:hAnsi="SimSun"/>
+          <w:sz w:val="24"/>
+          <w:szCs w:val="24"/>
+        </w:rPr>
+        <w:t>plt.plot(x,y,label = 'Name of line')</w:t>
+      </w:r>
+    </w:p>
+    <w:p>
+      <w:pPr>
+        <w:rPr>
+          <w:rFonts w:ascii="SimSun" w:eastAsia="SimSun" w:hAnsi="SimSun"/>
+          <w:sz w:val="24"/>
+          <w:szCs w:val="24"/>
+        </w:rPr>
+      </w:pPr>
+      <w:r>
+        <w:rPr>
+          <w:rFonts w:ascii="SimSun" w:eastAsia="SimSun" w:hAnsi="SimSun"/>
+          <w:sz w:val="24"/>
+          <w:szCs w:val="24"/>
+        </w:rPr>
+        <w:t>plt.legend(prop={'size': 8},loc = 'lower left')</w:t>
+      </w:r>
+    </w:p>
+    <w:p>
+      <w:pPr>
+        <w:rPr>
+          <w:rFonts w:ascii="SimSun" w:eastAsia="SimSun" w:hAnsi="SimSun"/>
+          <w:sz w:val="24"/>
+          <w:szCs w:val="24"/>
+        </w:rPr>
+      </w:pPr>
+      <w:r>
+        <w:rPr>
+          <w:rFonts w:ascii="SimSun" w:eastAsia="SimSun" w:hAnsi="SimSun"/>
+          <w:sz w:val="24"/>
+          <w:szCs w:val="24"/>
+        </w:rPr>
+        <w:t>plt.xlabel('x axis (units)'</w:t>
+      </w:r>
+      <w:r>
+        <w:rPr>
+          <w:rFonts w:ascii="SimSun" w:eastAsia="SimSun" w:hAnsi="SimSun"/>
+          <w:sz w:val="24"/>
+          <w:szCs w:val="24"/>
+        </w:rPr>
+        <w:t>,</w:t>
+      </w:r>
+      <w:r>
         <w:t xml:space="preserve"> </w:t>
       </w:r>
-      <w:proofErr w:type="spellStart"/>
-      <w:r>
-        <w:rPr>
-          <w:sz w:val="24"/>
-          <w:szCs w:val="24"/>
-        </w:rPr>
-        <w:t>fontsize</w:t>
-      </w:r>
-      <w:proofErr w:type="spellEnd"/>
-      <w:r>
-        <w:rPr>
-          <w:sz w:val="24"/>
-          <w:szCs w:val="24"/>
-        </w:rPr>
+      <w:r>
+        <w:rPr>
+          <w:rFonts w:ascii="SimSun" w:eastAsia="SimSun" w:hAnsi="SimSun"/>
+          <w:sz w:val="24"/>
+          <w:szCs w:val="24"/>
+        </w:rPr>
+        <w:t>fontsize = 1</w:t>
+      </w:r>
+      <w:r>
+        <w:rPr>
+          <w:rFonts w:ascii="SimSun" w:eastAsia="SimSun" w:hAnsi="SimSun"/>
+          <w:sz w:val="24"/>
+          <w:szCs w:val="24"/>
+        </w:rPr>
+        <w:t>2</w:t>
+      </w:r>
+      <w:r>
+        <w:rPr>
+          <w:rFonts w:ascii="SimSun" w:eastAsia="SimSun" w:hAnsi="SimSun"/>
+          <w:sz w:val="24"/>
+          <w:szCs w:val="24"/>
+        </w:rPr>
+        <w:t>)</w:t>
+      </w:r>
+    </w:p>
+    <w:p>
+      <w:pPr>
+        <w:rPr>
+          <w:rFonts w:ascii="SimSun" w:eastAsia="SimSun" w:hAnsi="SimSun"/>
+          <w:sz w:val="24"/>
+          <w:szCs w:val="24"/>
+        </w:rPr>
+      </w:pPr>
+      <w:r>
+        <w:rPr>
+          <w:rFonts w:ascii="SimSun" w:eastAsia="SimSun" w:hAnsi="SimSun"/>
+          <w:sz w:val="24"/>
+          <w:szCs w:val="24"/>
+        </w:rPr>
+        <w:t>plt.ylabel('y axis (units)'</w:t>
+      </w:r>
+      <w:r>
+        <w:rPr>
+          <w:rFonts w:ascii="SimSun" w:eastAsia="SimSun" w:hAnsi="SimSun"/>
+          <w:sz w:val="24"/>
+          <w:szCs w:val="24"/>
+        </w:rPr>
+        <w:t>,</w:t>
+      </w:r>
+      <w:r>
         <w:t xml:space="preserve"> </w:t>
       </w:r>
       <w:r>
         <w:rPr>
-          <w:sz w:val="24"/>
-          <w:szCs w:val="24"/>
-        </w:rPr>
-        <w:t>to</w:t>
-      </w:r>
-      <w:r>
-        <w:rPr>
-          <w:sz w:val="24"/>
-          <w:szCs w:val="24"/>
-        </w:rPr>
-        <w:t xml:space="preserve"> </w:t>
-      </w:r>
-      <w:r>
-        <w:rPr>
-          <w:sz w:val="24"/>
-          <w:szCs w:val="24"/>
-        </w:rPr>
-        <w:t>10 or 8</w:t>
-      </w:r>
-      <w:r>
-        <w:rPr>
-          <w:sz w:val="24"/>
-          <w:szCs w:val="24"/>
-        </w:rPr>
-        <w:t xml:space="preserve"> for</w:t>
-      </w:r>
-      <w:r>
-        <w:rPr>
-          <w:sz w:val="24"/>
-          <w:szCs w:val="24"/>
-        </w:rPr>
-        <w:t xml:space="preserve"> the</w:t>
-      </w:r>
-      <w:r>
-        <w:rPr>
-          <w:sz w:val="24"/>
-          <w:szCs w:val="24"/>
-        </w:rPr>
-        <w:t xml:space="preserve"> legend. </w:t>
-      </w:r>
-      <w:r>
-        <w:rPr>
-          <w:sz w:val="24"/>
-          <w:szCs w:val="24"/>
-        </w:rPr>
-        <w:t>Standard matplotlib colours are nice. Standard font is nice</w:t>
-      </w:r>
-    </w:p>
-    <w:p>
-      <w:pPr>
-        <w:rPr>
-          <w:sz w:val="24"/>
-          <w:szCs w:val="24"/>
-        </w:rPr>
-      </w:pPr>
-    </w:p>
-    <w:p>
-      <w:pPr>
-        <w:rPr>
           <w:rFonts w:ascii="SimSun" w:eastAsia="SimSun" w:hAnsi="SimSun"/>
           <w:sz w:val="24"/>
           <w:szCs w:val="24"/>
         </w:rPr>
-      </w:pPr>
-      <w:proofErr w:type="spellStart"/>
+        <w:t>fontsize = 1</w:t>
+      </w:r>
       <w:r>
         <w:rPr>
           <w:rFonts w:ascii="SimSun" w:eastAsia="SimSun" w:hAnsi="SimSun"/>
           <w:sz w:val="24"/>
           <w:szCs w:val="24"/>
         </w:rPr>
-        <w:t>figure_size</w:t>
-      </w:r>
-      <w:proofErr w:type="spellEnd"/>
+        <w:t>2</w:t>
+      </w:r>
       <w:r>
         <w:rPr>
           <w:rFonts w:ascii="SimSun" w:eastAsia="SimSun" w:hAnsi="SimSun"/>
           <w:sz w:val="24"/>
           <w:szCs w:val="24"/>
         </w:rPr>
-        <w:t xml:space="preserve"> = (6,</w:t>
-      </w:r>
-      <w:r>
+        <w:t>)</w:t>
+      </w:r>
+    </w:p>
+    <w:p>
+      <w:pPr>
         <w:rPr>
           <w:rFonts w:ascii="SimSun" w:eastAsia="SimSun" w:hAnsi="SimSun"/>
           <w:sz w:val="24"/>
           <w:szCs w:val="24"/>
         </w:rPr>
-        <w:t>3.5</w:t>
-      </w:r>
+      </w:pPr>
       <w:r>
         <w:rPr>
           <w:rFonts w:ascii="SimSun" w:eastAsia="SimSun" w:hAnsi="SimSun"/>
           <w:sz w:val="24"/>
           <w:szCs w:val="24"/>
         </w:rPr>
-        <w:t>)</w:t>
+        <w:t>plt.tight_layout()</w:t>
       </w:r>
     </w:p>
     <w:p>
@@ -6054,77 +5523,73 @@
           <w:szCs w:val="24"/>
         </w:rPr>
       </w:pPr>
-      <w:proofErr w:type="spellStart"/>
-      <w:proofErr w:type="gramStart"/>
       <w:r>
         <w:rPr>
           <w:rFonts w:ascii="SimSun" w:eastAsia="SimSun" w:hAnsi="SimSun"/>
           <w:sz w:val="24"/>
           <w:szCs w:val="24"/>
         </w:rPr>
-        <w:t>plt.figure</w:t>
-      </w:r>
-      <w:proofErr w:type="spellEnd"/>
-      <w:proofErr w:type="gramEnd"/>
-      <w:r>
+        <w:t>plt.grid()</w:t>
+      </w:r>
+    </w:p>
+    <w:p>
+      <w:pPr>
         <w:rPr>
           <w:rFonts w:ascii="SimSun" w:eastAsia="SimSun" w:hAnsi="SimSun"/>
           <w:sz w:val="24"/>
           <w:szCs w:val="24"/>
         </w:rPr>
-        <w:t>(</w:t>
-      </w:r>
-      <w:proofErr w:type="spellStart"/>
+      </w:pPr>
       <w:r>
         <w:rPr>
           <w:rFonts w:ascii="SimSun" w:eastAsia="SimSun" w:hAnsi="SimSun"/>
           <w:sz w:val="24"/>
           <w:szCs w:val="24"/>
         </w:rPr>
-        <w:t>figsize</w:t>
-      </w:r>
-      <w:proofErr w:type="spellEnd"/>
-      <w:r>
+        <w:t>plt.savefig('sim_chapter_Zoom_in_ETM_tuning.eps')</w:t>
+      </w:r>
+    </w:p>
+    <w:p>
+      <w:pPr>
         <w:rPr>
           <w:rFonts w:ascii="SimSun" w:eastAsia="SimSun" w:hAnsi="SimSun"/>
           <w:sz w:val="24"/>
           <w:szCs w:val="24"/>
         </w:rPr>
-        <w:t xml:space="preserve"> = </w:t>
-      </w:r>
-      <w:proofErr w:type="spellStart"/>
+      </w:pPr>
       <w:r>
         <w:rPr>
           <w:rFonts w:ascii="SimSun" w:eastAsia="SimSun" w:hAnsi="SimSun"/>
           <w:sz w:val="24"/>
           <w:szCs w:val="24"/>
         </w:rPr>
-        <w:t>figure_size,dpi</w:t>
-      </w:r>
-      <w:proofErr w:type="spellEnd"/>
-      <w:r>
+        <w:t>plt.show()</w:t>
+      </w:r>
+    </w:p>
+    <w:p>
+      <w:pPr>
         <w:rPr>
           <w:rFonts w:ascii="SimSun" w:eastAsia="SimSun" w:hAnsi="SimSun"/>
           <w:sz w:val="24"/>
           <w:szCs w:val="24"/>
         </w:rPr>
-        <w:t xml:space="preserve"> = </w:t>
-      </w:r>
-      <w:r>
+      </w:pPr>
+    </w:p>
+    <w:p>
+      <w:pPr>
         <w:rPr>
           <w:rFonts w:ascii="SimSun" w:eastAsia="SimSun" w:hAnsi="SimSun"/>
           <w:sz w:val="24"/>
           <w:szCs w:val="24"/>
         </w:rPr>
-        <w:t>15</w:t>
-      </w:r>
+      </w:pPr>
       <w:r>
         <w:rPr>
           <w:rFonts w:ascii="SimSun" w:eastAsia="SimSun" w:hAnsi="SimSun"/>
           <w:sz w:val="24"/>
           <w:szCs w:val="24"/>
         </w:rPr>
-        <w:t>0)</w:t>
+        <w:t>For 2x1 subplots, use</w:t>
       </w:r>
     </w:p>
     <w:p>
@@ -6135,476 +5600,35 @@
           <w:szCs w:val="24"/>
         </w:rPr>
       </w:pPr>
-      <w:proofErr w:type="spellStart"/>
-      <w:proofErr w:type="gramStart"/>
       <w:r>
         <w:rPr>
           <w:rFonts w:ascii="SimSun" w:eastAsia="SimSun" w:hAnsi="SimSun"/>
           <w:sz w:val="24"/>
           <w:szCs w:val="24"/>
         </w:rPr>
-        <w:t>plt.plot</w:t>
-      </w:r>
-      <w:proofErr w:type="spellEnd"/>
-      <w:proofErr w:type="gramEnd"/>
-      <w:r>
-        <w:rPr>
-          <w:rFonts w:ascii="SimSun" w:eastAsia="SimSun" w:hAnsi="SimSun"/>
-          <w:sz w:val="24"/>
-          <w:szCs w:val="24"/>
-        </w:rPr>
-        <w:t>(</w:t>
-      </w:r>
-      <w:proofErr w:type="spellStart"/>
-      <w:r>
-        <w:rPr>
-          <w:rFonts w:ascii="SimSun" w:eastAsia="SimSun" w:hAnsi="SimSun"/>
-          <w:sz w:val="24"/>
-          <w:szCs w:val="24"/>
-        </w:rPr>
-        <w:t>x,y,label</w:t>
-      </w:r>
-      <w:proofErr w:type="spellEnd"/>
-      <w:r>
-        <w:rPr>
-          <w:rFonts w:ascii="SimSun" w:eastAsia="SimSun" w:hAnsi="SimSun"/>
-          <w:sz w:val="24"/>
-          <w:szCs w:val="24"/>
-        </w:rPr>
-        <w:t xml:space="preserve"> = 'Name of line')</w:t>
-      </w:r>
-    </w:p>
-    <w:p>
-      <w:pPr>
-        <w:rPr>
-          <w:rFonts w:ascii="SimSun" w:eastAsia="SimSun" w:hAnsi="SimSun"/>
-          <w:sz w:val="24"/>
-          <w:szCs w:val="24"/>
-        </w:rPr>
-      </w:pPr>
-      <w:proofErr w:type="spellStart"/>
-      <w:proofErr w:type="gramStart"/>
-      <w:r>
-        <w:rPr>
-          <w:rFonts w:ascii="SimSun" w:eastAsia="SimSun" w:hAnsi="SimSun"/>
-          <w:sz w:val="24"/>
-          <w:szCs w:val="24"/>
-        </w:rPr>
-        <w:t>plt.legend</w:t>
-      </w:r>
-      <w:proofErr w:type="spellEnd"/>
-      <w:proofErr w:type="gramEnd"/>
-      <w:r>
-        <w:rPr>
-          <w:rFonts w:ascii="SimSun" w:eastAsia="SimSun" w:hAnsi="SimSun"/>
-          <w:sz w:val="24"/>
-          <w:szCs w:val="24"/>
-        </w:rPr>
-        <w:t>(prop={'size': 8},</w:t>
-      </w:r>
-      <w:proofErr w:type="spellStart"/>
-      <w:r>
-        <w:rPr>
-          <w:rFonts w:ascii="SimSun" w:eastAsia="SimSun" w:hAnsi="SimSun"/>
-          <w:sz w:val="24"/>
-          <w:szCs w:val="24"/>
-        </w:rPr>
-        <w:t>loc</w:t>
-      </w:r>
-      <w:proofErr w:type="spellEnd"/>
-      <w:r>
-        <w:rPr>
-          <w:rFonts w:ascii="SimSun" w:eastAsia="SimSun" w:hAnsi="SimSun"/>
-          <w:sz w:val="24"/>
-          <w:szCs w:val="24"/>
-        </w:rPr>
-        <w:t xml:space="preserve"> = 'lower left')</w:t>
-      </w:r>
-    </w:p>
-    <w:p>
-      <w:pPr>
-        <w:rPr>
-          <w:rFonts w:ascii="SimSun" w:eastAsia="SimSun" w:hAnsi="SimSun"/>
-          <w:sz w:val="24"/>
-          <w:szCs w:val="24"/>
-        </w:rPr>
-      </w:pPr>
-      <w:proofErr w:type="spellStart"/>
-      <w:proofErr w:type="gramStart"/>
-      <w:r>
-        <w:rPr>
-          <w:rFonts w:ascii="SimSun" w:eastAsia="SimSun" w:hAnsi="SimSun"/>
-          <w:sz w:val="24"/>
-          <w:szCs w:val="24"/>
-        </w:rPr>
-        <w:t>plt.xlabel</w:t>
-      </w:r>
-      <w:proofErr w:type="spellEnd"/>
-      <w:proofErr w:type="gramEnd"/>
-      <w:r>
-        <w:rPr>
-          <w:rFonts w:ascii="SimSun" w:eastAsia="SimSun" w:hAnsi="SimSun"/>
-          <w:sz w:val="24"/>
-          <w:szCs w:val="24"/>
-        </w:rPr>
-        <w:t>('x axis (units)'</w:t>
-      </w:r>
-      <w:r>
-        <w:rPr>
-          <w:rFonts w:ascii="SimSun" w:eastAsia="SimSun" w:hAnsi="SimSun"/>
-          <w:sz w:val="24"/>
-          <w:szCs w:val="24"/>
-        </w:rPr>
-        <w:t>,</w:t>
-      </w:r>
-      <w:r>
-        <w:t xml:space="preserve"> </w:t>
-      </w:r>
-      <w:proofErr w:type="spellStart"/>
-      <w:r>
-        <w:rPr>
-          <w:rFonts w:ascii="SimSun" w:eastAsia="SimSun" w:hAnsi="SimSun"/>
-          <w:sz w:val="24"/>
-          <w:szCs w:val="24"/>
-        </w:rPr>
-        <w:t>fontsize</w:t>
-      </w:r>
-      <w:proofErr w:type="spellEnd"/>
-      <w:r>
-        <w:rPr>
-          <w:rFonts w:ascii="SimSun" w:eastAsia="SimSun" w:hAnsi="SimSun"/>
-          <w:sz w:val="24"/>
-          <w:szCs w:val="24"/>
-        </w:rPr>
-        <w:t xml:space="preserve"> = 1</w:t>
-      </w:r>
-      <w:r>
-        <w:rPr>
-          <w:rFonts w:ascii="SimSun" w:eastAsia="SimSun" w:hAnsi="SimSun"/>
-          <w:sz w:val="24"/>
-          <w:szCs w:val="24"/>
-        </w:rPr>
-        <w:t>2</w:t>
-      </w:r>
-      <w:r>
-        <w:rPr>
-          <w:rFonts w:ascii="SimSun" w:eastAsia="SimSun" w:hAnsi="SimSun"/>
-          <w:sz w:val="24"/>
-          <w:szCs w:val="24"/>
-        </w:rPr>
-        <w:t>)</w:t>
-      </w:r>
-    </w:p>
-    <w:p>
-      <w:pPr>
-        <w:rPr>
-          <w:rFonts w:ascii="SimSun" w:eastAsia="SimSun" w:hAnsi="SimSun"/>
-          <w:sz w:val="24"/>
-          <w:szCs w:val="24"/>
-        </w:rPr>
-      </w:pPr>
-      <w:proofErr w:type="spellStart"/>
-      <w:proofErr w:type="gramStart"/>
-      <w:r>
-        <w:rPr>
-          <w:rFonts w:ascii="SimSun" w:eastAsia="SimSun" w:hAnsi="SimSun"/>
-          <w:sz w:val="24"/>
-          <w:szCs w:val="24"/>
-        </w:rPr>
-        <w:t>plt.ylabel</w:t>
-      </w:r>
-      <w:proofErr w:type="spellEnd"/>
-      <w:proofErr w:type="gramEnd"/>
-      <w:r>
-        <w:rPr>
-          <w:rFonts w:ascii="SimSun" w:eastAsia="SimSun" w:hAnsi="SimSun"/>
-          <w:sz w:val="24"/>
-          <w:szCs w:val="24"/>
-        </w:rPr>
-        <w:t>('y axis (units)'</w:t>
-      </w:r>
-      <w:r>
-        <w:rPr>
-          <w:rFonts w:ascii="SimSun" w:eastAsia="SimSun" w:hAnsi="SimSun"/>
-          <w:sz w:val="24"/>
-          <w:szCs w:val="24"/>
-        </w:rPr>
-        <w:t>,</w:t>
-      </w:r>
-      <w:r>
-        <w:t xml:space="preserve"> </w:t>
-      </w:r>
-      <w:proofErr w:type="spellStart"/>
-      <w:r>
-        <w:rPr>
-          <w:rFonts w:ascii="SimSun" w:eastAsia="SimSun" w:hAnsi="SimSun"/>
-          <w:sz w:val="24"/>
-          <w:szCs w:val="24"/>
-        </w:rPr>
-        <w:t>fontsize</w:t>
-      </w:r>
-      <w:proofErr w:type="spellEnd"/>
-      <w:r>
-        <w:rPr>
-          <w:rFonts w:ascii="SimSun" w:eastAsia="SimSun" w:hAnsi="SimSun"/>
-          <w:sz w:val="24"/>
-          <w:szCs w:val="24"/>
-        </w:rPr>
-        <w:t xml:space="preserve"> = 1</w:t>
-      </w:r>
-      <w:r>
-        <w:rPr>
-          <w:rFonts w:ascii="SimSun" w:eastAsia="SimSun" w:hAnsi="SimSun"/>
-          <w:sz w:val="24"/>
-          <w:szCs w:val="24"/>
-        </w:rPr>
-        <w:t>2</w:t>
-      </w:r>
-      <w:r>
-        <w:rPr>
-          <w:rFonts w:ascii="SimSun" w:eastAsia="SimSun" w:hAnsi="SimSun"/>
-          <w:sz w:val="24"/>
-          <w:szCs w:val="24"/>
-        </w:rPr>
-        <w:t>)</w:t>
-      </w:r>
-    </w:p>
-    <w:p>
-      <w:pPr>
-        <w:rPr>
-          <w:rFonts w:ascii="SimSun" w:eastAsia="SimSun" w:hAnsi="SimSun"/>
-          <w:sz w:val="24"/>
-          <w:szCs w:val="24"/>
-        </w:rPr>
-      </w:pPr>
-      <w:proofErr w:type="spellStart"/>
-      <w:proofErr w:type="gramStart"/>
-      <w:r>
-        <w:rPr>
-          <w:rFonts w:ascii="SimSun" w:eastAsia="SimSun" w:hAnsi="SimSun"/>
-          <w:sz w:val="24"/>
-          <w:szCs w:val="24"/>
-        </w:rPr>
-        <w:t>plt.tight</w:t>
-      </w:r>
-      <w:proofErr w:type="gramEnd"/>
-      <w:r>
-        <w:rPr>
-          <w:rFonts w:ascii="SimSun" w:eastAsia="SimSun" w:hAnsi="SimSun"/>
-          <w:sz w:val="24"/>
-          <w:szCs w:val="24"/>
-        </w:rPr>
-        <w:t>_layout</w:t>
-      </w:r>
-      <w:proofErr w:type="spellEnd"/>
-      <w:r>
-        <w:rPr>
-          <w:rFonts w:ascii="SimSun" w:eastAsia="SimSun" w:hAnsi="SimSun"/>
-          <w:sz w:val="24"/>
-          <w:szCs w:val="24"/>
-        </w:rPr>
-        <w:t>()</w:t>
-      </w:r>
-    </w:p>
-    <w:p>
-      <w:pPr>
-        <w:rPr>
-          <w:rFonts w:ascii="SimSun" w:eastAsia="SimSun" w:hAnsi="SimSun"/>
-          <w:sz w:val="24"/>
-          <w:szCs w:val="24"/>
-        </w:rPr>
-      </w:pPr>
-      <w:proofErr w:type="spellStart"/>
-      <w:proofErr w:type="gramStart"/>
-      <w:r>
-        <w:rPr>
-          <w:rFonts w:ascii="SimSun" w:eastAsia="SimSun" w:hAnsi="SimSun"/>
-          <w:sz w:val="24"/>
-          <w:szCs w:val="24"/>
-        </w:rPr>
-        <w:t>plt.grid</w:t>
-      </w:r>
-      <w:proofErr w:type="spellEnd"/>
-      <w:proofErr w:type="gramEnd"/>
-      <w:r>
-        <w:rPr>
-          <w:rFonts w:ascii="SimSun" w:eastAsia="SimSun" w:hAnsi="SimSun"/>
-          <w:sz w:val="24"/>
-          <w:szCs w:val="24"/>
-        </w:rPr>
-        <w:t>()</w:t>
-      </w:r>
-    </w:p>
-    <w:p>
-      <w:pPr>
-        <w:rPr>
-          <w:rFonts w:ascii="SimSun" w:eastAsia="SimSun" w:hAnsi="SimSun"/>
-          <w:sz w:val="24"/>
-          <w:szCs w:val="24"/>
-        </w:rPr>
-      </w:pPr>
-      <w:proofErr w:type="spellStart"/>
-      <w:proofErr w:type="gramStart"/>
-      <w:r>
-        <w:rPr>
-          <w:rFonts w:ascii="SimSun" w:eastAsia="SimSun" w:hAnsi="SimSun"/>
-          <w:sz w:val="24"/>
-          <w:szCs w:val="24"/>
-        </w:rPr>
-        <w:t>plt.savefig</w:t>
-      </w:r>
-      <w:proofErr w:type="spellEnd"/>
-      <w:proofErr w:type="gramEnd"/>
-      <w:r>
-        <w:rPr>
-          <w:rFonts w:ascii="SimSun" w:eastAsia="SimSun" w:hAnsi="SimSun"/>
-          <w:sz w:val="24"/>
-          <w:szCs w:val="24"/>
-        </w:rPr>
-        <w:t>('</w:t>
-      </w:r>
-      <w:proofErr w:type="spellStart"/>
-      <w:r>
-        <w:rPr>
-          <w:rFonts w:ascii="SimSun" w:eastAsia="SimSun" w:hAnsi="SimSun"/>
-          <w:sz w:val="24"/>
-          <w:szCs w:val="24"/>
-        </w:rPr>
-        <w:t>sim_chapter_Zoom_in_ETM_tuning.eps</w:t>
-      </w:r>
-      <w:proofErr w:type="spellEnd"/>
-      <w:r>
-        <w:rPr>
-          <w:rFonts w:ascii="SimSun" w:eastAsia="SimSun" w:hAnsi="SimSun"/>
-          <w:sz w:val="24"/>
-          <w:szCs w:val="24"/>
-        </w:rPr>
-        <w:t>')</w:t>
-      </w:r>
-    </w:p>
-    <w:p>
-      <w:pPr>
-        <w:rPr>
-          <w:rFonts w:ascii="SimSun" w:eastAsia="SimSun" w:hAnsi="SimSun"/>
-          <w:sz w:val="24"/>
-          <w:szCs w:val="24"/>
-        </w:rPr>
-      </w:pPr>
-      <w:proofErr w:type="spellStart"/>
-      <w:proofErr w:type="gramStart"/>
-      <w:r>
-        <w:rPr>
-          <w:rFonts w:ascii="SimSun" w:eastAsia="SimSun" w:hAnsi="SimSun"/>
-          <w:sz w:val="24"/>
-          <w:szCs w:val="24"/>
-        </w:rPr>
-        <w:t>plt.show</w:t>
-      </w:r>
-      <w:proofErr w:type="spellEnd"/>
-      <w:proofErr w:type="gramEnd"/>
-      <w:r>
-        <w:rPr>
-          <w:rFonts w:ascii="SimSun" w:eastAsia="SimSun" w:hAnsi="SimSun"/>
-          <w:sz w:val="24"/>
-          <w:szCs w:val="24"/>
-        </w:rPr>
-        <w:t>()</w:t>
-      </w:r>
-    </w:p>
-    <w:p>
-      <w:pPr>
-        <w:rPr>
-          <w:rFonts w:ascii="SimSun" w:eastAsia="SimSun" w:hAnsi="SimSun"/>
-          <w:sz w:val="24"/>
-          <w:szCs w:val="24"/>
-        </w:rPr>
-      </w:pPr>
-    </w:p>
-    <w:p>
-      <w:pPr>
-        <w:rPr>
-          <w:rFonts w:ascii="SimSun" w:eastAsia="SimSun" w:hAnsi="SimSun"/>
-          <w:sz w:val="24"/>
-          <w:szCs w:val="24"/>
-        </w:rPr>
-      </w:pPr>
-      <w:r>
-        <w:rPr>
-          <w:rFonts w:ascii="SimSun" w:eastAsia="SimSun" w:hAnsi="SimSun"/>
-          <w:sz w:val="24"/>
-          <w:szCs w:val="24"/>
-        </w:rPr>
-        <w:t>For 2x1 subplots, use</w:t>
-      </w:r>
-    </w:p>
-    <w:p>
-      <w:pPr>
-        <w:rPr>
-          <w:rFonts w:ascii="SimSun" w:eastAsia="SimSun" w:hAnsi="SimSun"/>
-          <w:sz w:val="24"/>
-          <w:szCs w:val="24"/>
-        </w:rPr>
-      </w:pPr>
-      <w:proofErr w:type="spellStart"/>
-      <w:proofErr w:type="gramStart"/>
-      <w:r>
-        <w:rPr>
-          <w:rFonts w:ascii="SimSun" w:eastAsia="SimSun" w:hAnsi="SimSun"/>
-          <w:sz w:val="24"/>
-          <w:szCs w:val="24"/>
-        </w:rPr>
-        <w:t>plt.figure</w:t>
-      </w:r>
-      <w:proofErr w:type="spellEnd"/>
-      <w:proofErr w:type="gramEnd"/>
-      <w:r>
-        <w:rPr>
-          <w:rFonts w:ascii="SimSun" w:eastAsia="SimSun" w:hAnsi="SimSun"/>
-          <w:sz w:val="24"/>
-          <w:szCs w:val="24"/>
-        </w:rPr>
-        <w:t>(</w:t>
-      </w:r>
-      <w:proofErr w:type="spellStart"/>
-      <w:r>
-        <w:rPr>
-          <w:rFonts w:ascii="SimSun" w:eastAsia="SimSun" w:hAnsi="SimSun"/>
-          <w:sz w:val="24"/>
-          <w:szCs w:val="24"/>
-        </w:rPr>
-        <w:t>figsize</w:t>
-      </w:r>
-      <w:proofErr w:type="spellEnd"/>
-      <w:r>
-        <w:rPr>
-          <w:rFonts w:ascii="SimSun" w:eastAsia="SimSun" w:hAnsi="SimSun"/>
-          <w:sz w:val="24"/>
-          <w:szCs w:val="24"/>
-        </w:rPr>
-        <w:t>=(6, 6), dpi=150)</w:t>
-      </w:r>
-    </w:p>
-    <w:p>
-      <w:pPr>
-        <w:rPr>
-          <w:sz w:val="24"/>
-          <w:szCs w:val="24"/>
-        </w:rPr>
-      </w:pPr>
-    </w:p>
-    <w:p>
-      <w:pPr>
-        <w:rPr>
-          <w:sz w:val="24"/>
-          <w:szCs w:val="24"/>
-        </w:rPr>
-      </w:pPr>
-      <w:r>
-        <w:rPr>
-          <w:sz w:val="24"/>
-          <w:szCs w:val="24"/>
-        </w:rPr>
-        <w:lastRenderedPageBreak/>
+        <w:t>plt.figure(figsize=(6, 6), dpi=150)</w:t>
+      </w:r>
+    </w:p>
+    <w:p>
+      <w:pPr>
+        <w:rPr>
+          <w:sz w:val="24"/>
+          <w:szCs w:val="24"/>
+        </w:rPr>
+      </w:pPr>
+    </w:p>
+    <w:p>
+      <w:pPr>
+        <w:rPr>
+          <w:sz w:val="24"/>
+          <w:szCs w:val="24"/>
+        </w:rPr>
+      </w:pPr>
+      <w:r>
+        <w:rPr>
+          <w:sz w:val="24"/>
+          <w:szCs w:val="24"/>
+        </w:rPr>
         <w:t xml:space="preserve">when there </w:t>
       </w:r>
       <w:r>
@@ -6640,7 +5664,6 @@
           <w:szCs w:val="24"/>
         </w:rPr>
       </w:pPr>
-      <w:proofErr w:type="spellStart"/>
       <w:r>
         <w:rPr>
           <w:rFonts w:asciiTheme="majorHAnsi" w:hAnsiTheme="majorHAnsi"/>
@@ -6651,7 +5674,6 @@
         </w:rPr>
         <w:t>Matlab</w:t>
       </w:r>
-      <w:proofErr w:type="spellEnd"/>
     </w:p>
     <w:p>
       <w:pPr>
@@ -6670,55 +5692,7 @@
           <w:sz w:val="24"/>
           <w:szCs w:val="24"/>
         </w:rPr>
-        <w:t xml:space="preserve">For </w:t>
-      </w:r>
-      <w:proofErr w:type="spellStart"/>
-      <w:r>
-        <w:rPr>
-          <w:sz w:val="24"/>
-          <w:szCs w:val="24"/>
-        </w:rPr>
-        <w:t>matlab</w:t>
-      </w:r>
-      <w:proofErr w:type="spellEnd"/>
-      <w:r>
-        <w:rPr>
-          <w:sz w:val="24"/>
-          <w:szCs w:val="24"/>
-        </w:rPr>
-        <w:t xml:space="preserve"> figures, use the </w:t>
-      </w:r>
-      <w:proofErr w:type="spellStart"/>
-      <w:r>
-        <w:rPr>
-          <w:sz w:val="24"/>
-          <w:szCs w:val="24"/>
-        </w:rPr>
-        <w:t>linspecer</w:t>
-      </w:r>
-      <w:proofErr w:type="spellEnd"/>
-      <w:r>
-        <w:rPr>
-          <w:sz w:val="24"/>
-          <w:szCs w:val="24"/>
-        </w:rPr>
-        <w:t xml:space="preserve"> (from </w:t>
-      </w:r>
-      <w:proofErr w:type="spellStart"/>
-      <w:r>
-        <w:rPr>
-          <w:sz w:val="24"/>
-          <w:szCs w:val="24"/>
-        </w:rPr>
-        <w:t>mathworks</w:t>
-      </w:r>
-      <w:proofErr w:type="spellEnd"/>
-      <w:r>
-        <w:rPr>
-          <w:sz w:val="24"/>
-          <w:szCs w:val="24"/>
-        </w:rPr>
-        <w:t xml:space="preserve"> file exchange) function to</w:t>
+        <w:t>For matlab figures, use the linspecer (from mathworks file exchange) function to</w:t>
       </w:r>
       <w:r>
         <w:rPr>
@@ -6759,9 +5733,8 @@
           <w:sz w:val="24"/>
           <w:szCs w:val="24"/>
         </w:rPr>
-        <w:t xml:space="preserve">The font should be set to </w:t>
-      </w:r>
-      <w:proofErr w:type="spellStart"/>
+        <w:t>The font should be set to Deja</w:t>
+      </w:r>
       <w:r>
         <w:rPr>
           <w:rFonts w:cstheme="minorHAnsi"/>
@@ -6769,7 +5742,7 @@
           <w:sz w:val="24"/>
           <w:szCs w:val="24"/>
         </w:rPr>
-        <w:t>Deja</w:t>
+        <w:t xml:space="preserve">Vu Sans, do this with: </w:t>
       </w:r>
       <w:r>
         <w:rPr>
@@ -6778,92 +5751,15 @@
           <w:sz w:val="24"/>
           <w:szCs w:val="24"/>
         </w:rPr>
-        <w:t>Vu</w:t>
-      </w:r>
-      <w:proofErr w:type="spellEnd"/>
-      <w:r>
-        <w:rPr>
-          <w:rFonts w:cstheme="minorHAnsi"/>
-          <w:color w:val="000000"/>
-          <w:sz w:val="24"/>
-          <w:szCs w:val="24"/>
-        </w:rPr>
-        <w:t xml:space="preserve"> Sans, do this with: </w:t>
-      </w:r>
-      <w:proofErr w:type="gramStart"/>
-      <w:r>
-        <w:rPr>
-          <w:rFonts w:cstheme="minorHAnsi"/>
-          <w:color w:val="000000"/>
-          <w:sz w:val="24"/>
-          <w:szCs w:val="24"/>
-        </w:rPr>
-        <w:t>set(</w:t>
-      </w:r>
-      <w:proofErr w:type="spellStart"/>
-      <w:proofErr w:type="gramEnd"/>
-      <w:r>
-        <w:rPr>
-          <w:rFonts w:cstheme="minorHAnsi"/>
-          <w:color w:val="000000"/>
-          <w:sz w:val="24"/>
-          <w:szCs w:val="24"/>
-        </w:rPr>
-        <w:t>gca</w:t>
-      </w:r>
-      <w:proofErr w:type="spellEnd"/>
-      <w:r>
-        <w:rPr>
-          <w:rFonts w:cstheme="minorHAnsi"/>
-          <w:color w:val="000000"/>
-          <w:sz w:val="24"/>
-          <w:szCs w:val="24"/>
-        </w:rPr>
-        <w:t>,</w:t>
-      </w:r>
-      <w:r>
-        <w:rPr>
-          <w:rFonts w:cstheme="minorHAnsi"/>
-          <w:sz w:val="24"/>
-          <w:szCs w:val="24"/>
-        </w:rPr>
-        <w:t>'</w:t>
-      </w:r>
-      <w:proofErr w:type="spellStart"/>
-      <w:r>
-        <w:rPr>
-          <w:rFonts w:cstheme="minorHAnsi"/>
-          <w:sz w:val="24"/>
-          <w:szCs w:val="24"/>
-        </w:rPr>
-        <w:t>fontname</w:t>
-      </w:r>
-      <w:proofErr w:type="spellEnd"/>
-      <w:r>
-        <w:rPr>
-          <w:rFonts w:cstheme="minorHAnsi"/>
-          <w:sz w:val="24"/>
-          <w:szCs w:val="24"/>
-        </w:rPr>
-        <w:t>','</w:t>
-      </w:r>
-      <w:proofErr w:type="spellStart"/>
-      <w:r>
-        <w:rPr>
-          <w:rFonts w:cstheme="minorHAnsi"/>
-          <w:sz w:val="24"/>
-          <w:szCs w:val="24"/>
-        </w:rPr>
-        <w:t>DejaVu</w:t>
-      </w:r>
-      <w:proofErr w:type="spellEnd"/>
-      <w:r>
-        <w:rPr>
-          <w:rFonts w:cstheme="minorHAnsi"/>
-          <w:sz w:val="24"/>
-          <w:szCs w:val="24"/>
-        </w:rPr>
-        <w:t xml:space="preserve"> Sans')</w:t>
+        <w:t>set(gca,</w:t>
+      </w:r>
+      <w:r>
+        <w:rPr>
+          <w:rFonts w:cstheme="minorHAnsi"/>
+          <w:sz w:val="24"/>
+          <w:szCs w:val="24"/>
+        </w:rPr>
+        <w:t>'fontname','DejaVu Sans')</w:t>
       </w:r>
     </w:p>
     <w:p>
@@ -6893,107 +5789,101 @@
           <w:sz w:val="24"/>
           <w:szCs w:val="24"/>
         </w:rPr>
-        <w:t xml:space="preserve">c = </w:t>
-      </w:r>
-      <w:proofErr w:type="spellStart"/>
-      <w:proofErr w:type="gramStart"/>
-      <w:r>
+        <w:t>c = linspecer(2);</w:t>
+      </w:r>
+    </w:p>
+    <w:p>
+      <w:pPr>
         <w:rPr>
           <w:rFonts w:ascii="SimSun" w:eastAsia="SimSun" w:hAnsi="SimSun"/>
           <w:sz w:val="24"/>
           <w:szCs w:val="24"/>
         </w:rPr>
-        <w:t>linspecer</w:t>
-      </w:r>
-      <w:proofErr w:type="spellEnd"/>
+      </w:pPr>
       <w:r>
         <w:rPr>
           <w:rFonts w:ascii="SimSun" w:eastAsia="SimSun" w:hAnsi="SimSun"/>
           <w:sz w:val="24"/>
           <w:szCs w:val="24"/>
         </w:rPr>
-        <w:t>(</w:t>
-      </w:r>
-      <w:proofErr w:type="gramEnd"/>
-      <w:r>
+        <w:t>size = 1.1;</w:t>
+      </w:r>
+    </w:p>
+    <w:p>
+      <w:pPr>
         <w:rPr>
           <w:rFonts w:ascii="SimSun" w:eastAsia="SimSun" w:hAnsi="SimSun"/>
           <w:sz w:val="24"/>
           <w:szCs w:val="24"/>
         </w:rPr>
-        <w:t>2);</w:t>
-      </w:r>
-    </w:p>
-    <w:p>
-      <w:pPr>
+      </w:pPr>
+      <w:r>
         <w:rPr>
           <w:rFonts w:ascii="SimSun" w:eastAsia="SimSun" w:hAnsi="SimSun"/>
           <w:sz w:val="24"/>
           <w:szCs w:val="24"/>
         </w:rPr>
-      </w:pPr>
-      <w:r>
+        <w:t>aspect_ratio = size.*[6,4];</w:t>
+      </w:r>
+    </w:p>
+    <w:p>
+      <w:pPr>
         <w:rPr>
           <w:rFonts w:ascii="SimSun" w:eastAsia="SimSun" w:hAnsi="SimSun"/>
           <w:sz w:val="24"/>
           <w:szCs w:val="24"/>
         </w:rPr>
-        <w:t xml:space="preserve">size = </w:t>
-      </w:r>
-      <w:proofErr w:type="gramStart"/>
-      <w:r>
+      </w:pPr>
+    </w:p>
+    <w:p>
+      <w:pPr>
         <w:rPr>
           <w:rFonts w:ascii="SimSun" w:eastAsia="SimSun" w:hAnsi="SimSun"/>
           <w:sz w:val="24"/>
           <w:szCs w:val="24"/>
         </w:rPr>
-        <w:t>1.1;</w:t>
-      </w:r>
-      <w:proofErr w:type="gramEnd"/>
-    </w:p>
-    <w:p>
-      <w:pPr>
+      </w:pPr>
+      <w:r>
         <w:rPr>
           <w:rFonts w:ascii="SimSun" w:eastAsia="SimSun" w:hAnsi="SimSun"/>
           <w:sz w:val="24"/>
           <w:szCs w:val="24"/>
         </w:rPr>
-      </w:pPr>
-      <w:proofErr w:type="spellStart"/>
-      <w:r>
+        <w:t>figure('Name','dark noise','units','inches','position',[0 0 aspect_ratio(1) aspect_ratio(2)])</w:t>
+      </w:r>
+    </w:p>
+    <w:p>
+      <w:pPr>
         <w:rPr>
           <w:rFonts w:ascii="SimSun" w:eastAsia="SimSun" w:hAnsi="SimSun"/>
           <w:sz w:val="24"/>
           <w:szCs w:val="24"/>
         </w:rPr>
-        <w:t>aspect_ratio</w:t>
-      </w:r>
-      <w:proofErr w:type="spellEnd"/>
+      </w:pPr>
       <w:r>
         <w:rPr>
           <w:rFonts w:ascii="SimSun" w:eastAsia="SimSun" w:hAnsi="SimSun"/>
           <w:sz w:val="24"/>
           <w:szCs w:val="24"/>
         </w:rPr>
-        <w:t xml:space="preserve"> = </w:t>
-      </w:r>
-      <w:proofErr w:type="gramStart"/>
-      <w:r>
+        <w:t>loglog(x1, y1, 'color',c(1,:))</w:t>
+      </w:r>
+    </w:p>
+    <w:p>
+      <w:pPr>
         <w:rPr>
           <w:rFonts w:ascii="SimSun" w:eastAsia="SimSun" w:hAnsi="SimSun"/>
           <w:sz w:val="24"/>
           <w:szCs w:val="24"/>
         </w:rPr>
-        <w:t>size.*</w:t>
-      </w:r>
-      <w:proofErr w:type="gramEnd"/>
+      </w:pPr>
       <w:r>
         <w:rPr>
           <w:rFonts w:ascii="SimSun" w:eastAsia="SimSun" w:hAnsi="SimSun"/>
           <w:sz w:val="24"/>
           <w:szCs w:val="24"/>
         </w:rPr>
-        <w:t>[6,4];</w:t>
+        <w:t>hold on</w:t>
       </w:r>
     </w:p>
     <w:p>
@@ -7004,356 +5894,91 @@
           <w:szCs w:val="24"/>
         </w:rPr>
       </w:pPr>
-    </w:p>
-    <w:p>
-      <w:pPr>
+      <w:r>
         <w:rPr>
           <w:rFonts w:ascii="SimSun" w:eastAsia="SimSun" w:hAnsi="SimSun"/>
           <w:sz w:val="24"/>
           <w:szCs w:val="24"/>
         </w:rPr>
-      </w:pPr>
-      <w:proofErr w:type="gramStart"/>
-      <w:r>
+        <w:t>loglog(x2, y2, 'color',c(2,:))</w:t>
+      </w:r>
+    </w:p>
+    <w:p>
+      <w:pPr>
         <w:rPr>
           <w:rFonts w:ascii="SimSun" w:eastAsia="SimSun" w:hAnsi="SimSun"/>
           <w:sz w:val="24"/>
           <w:szCs w:val="24"/>
         </w:rPr>
-        <w:t>figure(</w:t>
-      </w:r>
-      <w:proofErr w:type="gramEnd"/>
+      </w:pPr>
       <w:r>
         <w:rPr>
           <w:rFonts w:ascii="SimSun" w:eastAsia="SimSun" w:hAnsi="SimSun"/>
           <w:sz w:val="24"/>
           <w:szCs w:val="24"/>
         </w:rPr>
-        <w:t>'</w:t>
-      </w:r>
-      <w:proofErr w:type="spellStart"/>
-      <w:r>
+        <w:t>hold off</w:t>
+      </w:r>
+    </w:p>
+    <w:p>
+      <w:pPr>
         <w:rPr>
           <w:rFonts w:ascii="SimSun" w:eastAsia="SimSun" w:hAnsi="SimSun"/>
           <w:sz w:val="24"/>
           <w:szCs w:val="24"/>
         </w:rPr>
-        <w:t>Name','dark</w:t>
-      </w:r>
-      <w:proofErr w:type="spellEnd"/>
+      </w:pPr>
       <w:r>
         <w:rPr>
           <w:rFonts w:ascii="SimSun" w:eastAsia="SimSun" w:hAnsi="SimSun"/>
           <w:sz w:val="24"/>
           <w:szCs w:val="24"/>
         </w:rPr>
-        <w:t xml:space="preserve"> </w:t>
-      </w:r>
-      <w:proofErr w:type="spellStart"/>
-      <w:r>
+        <w:t>set(gca,'fontsize',12)</w:t>
+      </w:r>
+    </w:p>
+    <w:p>
+      <w:pPr>
         <w:rPr>
           <w:rFonts w:ascii="SimSun" w:eastAsia="SimSun" w:hAnsi="SimSun"/>
           <w:sz w:val="24"/>
           <w:szCs w:val="24"/>
         </w:rPr>
-        <w:t>noise','units','inches','position</w:t>
-      </w:r>
-      <w:proofErr w:type="spellEnd"/>
+      </w:pPr>
       <w:r>
         <w:rPr>
           <w:rFonts w:ascii="SimSun" w:eastAsia="SimSun" w:hAnsi="SimSun"/>
           <w:sz w:val="24"/>
           <w:szCs w:val="24"/>
         </w:rPr>
-        <w:t xml:space="preserve">',[0 0 </w:t>
-      </w:r>
-      <w:proofErr w:type="spellStart"/>
-      <w:r>
+        <w:t>xlabel('Frequency (Hz)')</w:t>
+      </w:r>
+    </w:p>
+    <w:p>
+      <w:pPr>
         <w:rPr>
           <w:rFonts w:ascii="SimSun" w:eastAsia="SimSun" w:hAnsi="SimSun"/>
           <w:sz w:val="24"/>
           <w:szCs w:val="24"/>
         </w:rPr>
-        <w:t>aspect_ratio</w:t>
-      </w:r>
-      <w:proofErr w:type="spellEnd"/>
+      </w:pPr>
       <w:r>
         <w:rPr>
           <w:rFonts w:ascii="SimSun" w:eastAsia="SimSun" w:hAnsi="SimSun"/>
           <w:sz w:val="24"/>
           <w:szCs w:val="24"/>
         </w:rPr>
-        <w:t xml:space="preserve">(1) </w:t>
-      </w:r>
-      <w:proofErr w:type="spellStart"/>
-      <w:r>
+        <w:t>ylabel('I_r_m_s/\surd(Hz)')</w:t>
+      </w:r>
+    </w:p>
+    <w:p>
+      <w:pPr>
         <w:rPr>
           <w:rFonts w:ascii="SimSun" w:eastAsia="SimSun" w:hAnsi="SimSun"/>
           <w:sz w:val="24"/>
           <w:szCs w:val="24"/>
         </w:rPr>
-        <w:t>aspect_ratio</w:t>
-      </w:r>
-      <w:proofErr w:type="spellEnd"/>
-      <w:r>
-        <w:rPr>
-          <w:rFonts w:ascii="SimSun" w:eastAsia="SimSun" w:hAnsi="SimSun"/>
-          <w:sz w:val="24"/>
-          <w:szCs w:val="24"/>
-        </w:rPr>
-        <w:t>(2)])</w:t>
-      </w:r>
-    </w:p>
-    <w:p>
-      <w:pPr>
-        <w:rPr>
-          <w:rFonts w:ascii="SimSun" w:eastAsia="SimSun" w:hAnsi="SimSun"/>
-          <w:sz w:val="24"/>
-          <w:szCs w:val="24"/>
-        </w:rPr>
-      </w:pPr>
-      <w:proofErr w:type="gramStart"/>
-      <w:r>
-        <w:rPr>
-          <w:rFonts w:ascii="SimSun" w:eastAsia="SimSun" w:hAnsi="SimSun"/>
-          <w:sz w:val="24"/>
-          <w:szCs w:val="24"/>
-        </w:rPr>
-        <w:t>loglog(</w:t>
-      </w:r>
-      <w:proofErr w:type="gramEnd"/>
-      <w:r>
-        <w:rPr>
-          <w:rFonts w:ascii="SimSun" w:eastAsia="SimSun" w:hAnsi="SimSun"/>
-          <w:sz w:val="24"/>
-          <w:szCs w:val="24"/>
-        </w:rPr>
-        <w:t>x1, y1, '</w:t>
-      </w:r>
-      <w:proofErr w:type="spellStart"/>
-      <w:r>
-        <w:rPr>
-          <w:rFonts w:ascii="SimSun" w:eastAsia="SimSun" w:hAnsi="SimSun"/>
-          <w:sz w:val="24"/>
-          <w:szCs w:val="24"/>
-        </w:rPr>
-        <w:t>color</w:t>
-      </w:r>
-      <w:proofErr w:type="spellEnd"/>
-      <w:r>
-        <w:rPr>
-          <w:rFonts w:ascii="SimSun" w:eastAsia="SimSun" w:hAnsi="SimSun"/>
-          <w:sz w:val="24"/>
-          <w:szCs w:val="24"/>
-        </w:rPr>
-        <w:t>',c(1,:))</w:t>
-      </w:r>
-    </w:p>
-    <w:p>
-      <w:pPr>
-        <w:rPr>
-          <w:rFonts w:ascii="SimSun" w:eastAsia="SimSun" w:hAnsi="SimSun"/>
-          <w:sz w:val="24"/>
-          <w:szCs w:val="24"/>
-        </w:rPr>
-      </w:pPr>
-      <w:r>
-        <w:rPr>
-          <w:rFonts w:ascii="SimSun" w:eastAsia="SimSun" w:hAnsi="SimSun"/>
-          <w:sz w:val="24"/>
-          <w:szCs w:val="24"/>
-        </w:rPr>
-        <w:t>hold on</w:t>
-      </w:r>
-    </w:p>
-    <w:p>
-      <w:pPr>
-        <w:rPr>
-          <w:rFonts w:ascii="SimSun" w:eastAsia="SimSun" w:hAnsi="SimSun"/>
-          <w:sz w:val="24"/>
-          <w:szCs w:val="24"/>
-        </w:rPr>
-      </w:pPr>
-      <w:proofErr w:type="gramStart"/>
-      <w:r>
-        <w:rPr>
-          <w:rFonts w:ascii="SimSun" w:eastAsia="SimSun" w:hAnsi="SimSun"/>
-          <w:sz w:val="24"/>
-          <w:szCs w:val="24"/>
-        </w:rPr>
-        <w:t>loglog(</w:t>
-      </w:r>
-      <w:proofErr w:type="gramEnd"/>
-      <w:r>
-        <w:rPr>
-          <w:rFonts w:ascii="SimSun" w:eastAsia="SimSun" w:hAnsi="SimSun"/>
-          <w:sz w:val="24"/>
-          <w:szCs w:val="24"/>
-        </w:rPr>
-        <w:t>x2, y2, '</w:t>
-      </w:r>
-      <w:proofErr w:type="spellStart"/>
-      <w:r>
-        <w:rPr>
-          <w:rFonts w:ascii="SimSun" w:eastAsia="SimSun" w:hAnsi="SimSun"/>
-          <w:sz w:val="24"/>
-          <w:szCs w:val="24"/>
-        </w:rPr>
-        <w:t>color</w:t>
-      </w:r>
-      <w:proofErr w:type="spellEnd"/>
-      <w:r>
-        <w:rPr>
-          <w:rFonts w:ascii="SimSun" w:eastAsia="SimSun" w:hAnsi="SimSun"/>
-          <w:sz w:val="24"/>
-          <w:szCs w:val="24"/>
-        </w:rPr>
-        <w:t>',c(2,:))</w:t>
-      </w:r>
-    </w:p>
-    <w:p>
-      <w:pPr>
-        <w:rPr>
-          <w:rFonts w:ascii="SimSun" w:eastAsia="SimSun" w:hAnsi="SimSun"/>
-          <w:sz w:val="24"/>
-          <w:szCs w:val="24"/>
-        </w:rPr>
-      </w:pPr>
-      <w:r>
-        <w:rPr>
-          <w:rFonts w:ascii="SimSun" w:eastAsia="SimSun" w:hAnsi="SimSun"/>
-          <w:sz w:val="24"/>
-          <w:szCs w:val="24"/>
-        </w:rPr>
-        <w:t>hold off</w:t>
-      </w:r>
-    </w:p>
-    <w:p>
-      <w:pPr>
-        <w:rPr>
-          <w:rFonts w:ascii="SimSun" w:eastAsia="SimSun" w:hAnsi="SimSun"/>
-          <w:sz w:val="24"/>
-          <w:szCs w:val="24"/>
-        </w:rPr>
-      </w:pPr>
-      <w:r>
-        <w:rPr>
-          <w:rFonts w:ascii="SimSun" w:eastAsia="SimSun" w:hAnsi="SimSun"/>
-          <w:sz w:val="24"/>
-          <w:szCs w:val="24"/>
-        </w:rPr>
-        <w:t>set(gca,'fontsize',12)</w:t>
-      </w:r>
-    </w:p>
-    <w:p>
-      <w:pPr>
-        <w:rPr>
-          <w:rFonts w:ascii="SimSun" w:eastAsia="SimSun" w:hAnsi="SimSun"/>
-          <w:sz w:val="24"/>
-          <w:szCs w:val="24"/>
-        </w:rPr>
-      </w:pPr>
-      <w:proofErr w:type="spellStart"/>
-      <w:proofErr w:type="gramStart"/>
-      <w:r>
-        <w:rPr>
-          <w:rFonts w:ascii="SimSun" w:eastAsia="SimSun" w:hAnsi="SimSun"/>
-          <w:sz w:val="24"/>
-          <w:szCs w:val="24"/>
-        </w:rPr>
-        <w:t>xlabel</w:t>
-      </w:r>
-      <w:proofErr w:type="spellEnd"/>
-      <w:r>
-        <w:rPr>
-          <w:rFonts w:ascii="SimSun" w:eastAsia="SimSun" w:hAnsi="SimSun"/>
-          <w:sz w:val="24"/>
-          <w:szCs w:val="24"/>
-        </w:rPr>
-        <w:t>(</w:t>
-      </w:r>
-      <w:proofErr w:type="gramEnd"/>
-      <w:r>
-        <w:rPr>
-          <w:rFonts w:ascii="SimSun" w:eastAsia="SimSun" w:hAnsi="SimSun"/>
-          <w:sz w:val="24"/>
-          <w:szCs w:val="24"/>
-        </w:rPr>
-        <w:t>'Frequency (Hz)')</w:t>
-      </w:r>
-    </w:p>
-    <w:p>
-      <w:pPr>
-        <w:rPr>
-          <w:rFonts w:ascii="SimSun" w:eastAsia="SimSun" w:hAnsi="SimSun"/>
-          <w:sz w:val="24"/>
-          <w:szCs w:val="24"/>
-        </w:rPr>
-      </w:pPr>
-      <w:proofErr w:type="spellStart"/>
-      <w:r>
-        <w:rPr>
-          <w:rFonts w:ascii="SimSun" w:eastAsia="SimSun" w:hAnsi="SimSun"/>
-          <w:sz w:val="24"/>
-          <w:szCs w:val="24"/>
-        </w:rPr>
-        <w:t>ylabel</w:t>
-      </w:r>
-      <w:proofErr w:type="spellEnd"/>
-      <w:r>
-        <w:rPr>
-          <w:rFonts w:ascii="SimSun" w:eastAsia="SimSun" w:hAnsi="SimSun"/>
-          <w:sz w:val="24"/>
-          <w:szCs w:val="24"/>
-        </w:rPr>
-        <w:t>('</w:t>
-      </w:r>
-      <w:proofErr w:type="spellStart"/>
-      <w:r>
-        <w:rPr>
-          <w:rFonts w:ascii="SimSun" w:eastAsia="SimSun" w:hAnsi="SimSun"/>
-          <w:sz w:val="24"/>
-          <w:szCs w:val="24"/>
-        </w:rPr>
-        <w:t>I_r_m_s</w:t>
-      </w:r>
-      <w:proofErr w:type="spellEnd"/>
-      <w:r>
-        <w:rPr>
-          <w:rFonts w:ascii="SimSun" w:eastAsia="SimSun" w:hAnsi="SimSun"/>
-          <w:sz w:val="24"/>
-          <w:szCs w:val="24"/>
-        </w:rPr>
-        <w:t>/\</w:t>
-      </w:r>
-      <w:proofErr w:type="gramStart"/>
-      <w:r>
-        <w:rPr>
-          <w:rFonts w:ascii="SimSun" w:eastAsia="SimSun" w:hAnsi="SimSun"/>
-          <w:sz w:val="24"/>
-          <w:szCs w:val="24"/>
-        </w:rPr>
-        <w:t>surd(</w:t>
-      </w:r>
-      <w:proofErr w:type="gramEnd"/>
-      <w:r>
-        <w:rPr>
-          <w:rFonts w:ascii="SimSun" w:eastAsia="SimSun" w:hAnsi="SimSun"/>
-          <w:sz w:val="24"/>
-          <w:szCs w:val="24"/>
-        </w:rPr>
-        <w:t>Hz)')</w:t>
-      </w:r>
-    </w:p>
-    <w:p>
-      <w:pPr>
-        <w:rPr>
-          <w:rFonts w:ascii="SimSun" w:eastAsia="SimSun" w:hAnsi="SimSun"/>
-          <w:sz w:val="24"/>
-          <w:szCs w:val="24"/>
-        </w:rPr>
-      </w:pPr>
-      <w:proofErr w:type="gramStart"/>
+      </w:pPr>
       <w:r>
         <w:rPr>
           <w:rFonts w:ascii="SimSun" w:eastAsia="SimSun" w:hAnsi="SimSun" w:cs="Courier New"/>
@@ -7361,10 +5986,16 @@
           <w:sz w:val="24"/>
           <w:szCs w:val="24"/>
         </w:rPr>
-        <w:t>set(</w:t>
-      </w:r>
-      <w:proofErr w:type="spellStart"/>
-      <w:proofErr w:type="gramEnd"/>
+        <w:t>set(gca,</w:t>
+      </w:r>
+      <w:r>
+        <w:rPr>
+          <w:rFonts w:ascii="SimSun" w:eastAsia="SimSun" w:hAnsi="SimSun" w:cs="Courier New"/>
+          <w:sz w:val="24"/>
+          <w:szCs w:val="24"/>
+        </w:rPr>
+        <w:t>'fontname','DejaVu Sans'</w:t>
+      </w:r>
       <w:r>
         <w:rPr>
           <w:rFonts w:ascii="SimSun" w:eastAsia="SimSun" w:hAnsi="SimSun" w:cs="Courier New"/>
@@ -7372,69 +6003,6 @@
           <w:sz w:val="24"/>
           <w:szCs w:val="24"/>
         </w:rPr>
-        <w:t>gca</w:t>
-      </w:r>
-      <w:proofErr w:type="spellEnd"/>
-      <w:r>
-        <w:rPr>
-          <w:rFonts w:ascii="SimSun" w:eastAsia="SimSun" w:hAnsi="SimSun" w:cs="Courier New"/>
-          <w:color w:val="000000"/>
-          <w:sz w:val="24"/>
-          <w:szCs w:val="24"/>
-        </w:rPr>
-        <w:t>,</w:t>
-      </w:r>
-      <w:r>
-        <w:rPr>
-          <w:rFonts w:ascii="SimSun" w:eastAsia="SimSun" w:hAnsi="SimSun" w:cs="Courier New"/>
-          <w:sz w:val="24"/>
-          <w:szCs w:val="24"/>
-        </w:rPr>
-        <w:t>'</w:t>
-      </w:r>
-      <w:proofErr w:type="spellStart"/>
-      <w:r>
-        <w:rPr>
-          <w:rFonts w:ascii="SimSun" w:eastAsia="SimSun" w:hAnsi="SimSun" w:cs="Courier New"/>
-          <w:sz w:val="24"/>
-          <w:szCs w:val="24"/>
-        </w:rPr>
-        <w:t>fontname</w:t>
-      </w:r>
-      <w:proofErr w:type="spellEnd"/>
-      <w:r>
-        <w:rPr>
-          <w:rFonts w:ascii="SimSun" w:eastAsia="SimSun" w:hAnsi="SimSun" w:cs="Courier New"/>
-          <w:sz w:val="24"/>
-          <w:szCs w:val="24"/>
-        </w:rPr>
-        <w:t>','</w:t>
-      </w:r>
-      <w:proofErr w:type="spellStart"/>
-      <w:r>
-        <w:rPr>
-          <w:rFonts w:ascii="SimSun" w:eastAsia="SimSun" w:hAnsi="SimSun" w:cs="Courier New"/>
-          <w:sz w:val="24"/>
-          <w:szCs w:val="24"/>
-        </w:rPr>
-        <w:t>DejaVu</w:t>
-      </w:r>
-      <w:proofErr w:type="spellEnd"/>
-      <w:r>
-        <w:rPr>
-          <w:rFonts w:ascii="SimSun" w:eastAsia="SimSun" w:hAnsi="SimSun" w:cs="Courier New"/>
-          <w:sz w:val="24"/>
-          <w:szCs w:val="24"/>
-        </w:rPr>
-        <w:t xml:space="preserve"> Sans'</w:t>
-      </w:r>
-      <w:r>
-        <w:rPr>
-          <w:rFonts w:ascii="SimSun" w:eastAsia="SimSun" w:hAnsi="SimSun" w:cs="Courier New"/>
-          <w:color w:val="000000"/>
-          <w:sz w:val="24"/>
-          <w:szCs w:val="24"/>
-        </w:rPr>
         <w:t>)</w:t>
       </w:r>
     </w:p>
@@ -7486,25 +6054,7 @@
           <w:sz w:val="24"/>
           <w:szCs w:val="24"/>
         </w:rPr>
-        <w:t>print('Noise_low_f','-</w:t>
-      </w:r>
-      <w:proofErr w:type="spellStart"/>
-      <w:r>
-        <w:rPr>
-          <w:rFonts w:ascii="SimSun" w:eastAsia="SimSun" w:hAnsi="SimSun"/>
-          <w:sz w:val="24"/>
-          <w:szCs w:val="24"/>
-        </w:rPr>
-        <w:t>depsc</w:t>
-      </w:r>
-      <w:proofErr w:type="spellEnd"/>
-      <w:r>
-        <w:rPr>
-          <w:rFonts w:ascii="SimSun" w:eastAsia="SimSun" w:hAnsi="SimSun"/>
-          <w:sz w:val="24"/>
-          <w:szCs w:val="24"/>
-        </w:rPr>
-        <w:t>')</w:t>
+        <w:t>print('Noise_low_f','-depsc')</w:t>
       </w:r>
     </w:p>
     <w:p>
@@ -7530,6 +6080,7 @@
           <w:sz w:val="24"/>
           <w:szCs w:val="24"/>
         </w:rPr>
+        <w:lastRenderedPageBreak/>
         <w:t>Circuits</w:t>
       </w:r>
     </w:p>
@@ -7610,23 +6161,7 @@
           <w:sz w:val="24"/>
           <w:szCs w:val="24"/>
         </w:rPr>
-        <w:t xml:space="preserve">have </w:t>
-      </w:r>
-      <w:proofErr w:type="spellStart"/>
-      <w:r>
-        <w:rPr>
-          <w:sz w:val="24"/>
-          <w:szCs w:val="24"/>
-        </w:rPr>
-        <w:t>gnd</w:t>
-      </w:r>
-      <w:proofErr w:type="spellEnd"/>
-      <w:r>
-        <w:rPr>
-          <w:sz w:val="24"/>
-          <w:szCs w:val="24"/>
-        </w:rPr>
-        <w:t xml:space="preserve"> at the bottom of the diagram.</w:t>
+        <w:t>have gnd at the bottom of the diagram.</w:t>
       </w:r>
     </w:p>
     <w:p>
@@ -7646,7 +6181,6 @@
           <w:sz w:val="24"/>
           <w:szCs w:val="24"/>
         </w:rPr>
-        <w:lastRenderedPageBreak/>
         <w:t>clearly label pin numbers, part values polarities, connector inputs etc.</w:t>
       </w:r>
     </w:p>

</xml_diff>

<commit_message>
Stage 4 edit finished for BHD for LIGO 2 chapter.
All thats left is to add some references, and check some grammar rules
</commit_message>
<xml_diff>
--- a/Structuring.docx
+++ b/Structuring.docx
@@ -175,7 +175,43 @@
           <w:sz w:val="24"/>
           <w:szCs w:val="24"/>
         </w:rPr>
-        <w:t xml:space="preserve">. The writing at this point may be ‘stream of conciouness`-esk, but it should have had an attempt at making it clear. </w:t>
+        <w:t xml:space="preserve">. The writing at this point may be ‘stream of </w:t>
+      </w:r>
+      <w:proofErr w:type="spellStart"/>
+      <w:r>
+        <w:rPr>
+          <w:rFonts w:cstheme="minorHAnsi"/>
+          <w:sz w:val="24"/>
+          <w:szCs w:val="24"/>
+        </w:rPr>
+        <w:t>conciouness</w:t>
+      </w:r>
+      <w:proofErr w:type="spellEnd"/>
+      <w:r>
+        <w:rPr>
+          <w:rFonts w:cstheme="minorHAnsi"/>
+          <w:sz w:val="24"/>
+          <w:szCs w:val="24"/>
+        </w:rPr>
+        <w:t>`-</w:t>
+      </w:r>
+      <w:proofErr w:type="spellStart"/>
+      <w:r>
+        <w:rPr>
+          <w:rFonts w:cstheme="minorHAnsi"/>
+          <w:sz w:val="24"/>
+          <w:szCs w:val="24"/>
+        </w:rPr>
+        <w:t>esk</w:t>
+      </w:r>
+      <w:proofErr w:type="spellEnd"/>
+      <w:r>
+        <w:rPr>
+          <w:rFonts w:cstheme="minorHAnsi"/>
+          <w:sz w:val="24"/>
+          <w:szCs w:val="24"/>
+        </w:rPr>
+        <w:t xml:space="preserve">, but it should have had an attempt at making it clear. </w:t>
       </w:r>
       <w:r>
         <w:rPr>
@@ -566,7 +602,25 @@
           <w:sz w:val="24"/>
           <w:szCs w:val="24"/>
         </w:rPr>
-        <w:t>word level. This involves checking the spellings of words (eg. Effect or affect). The</w:t>
+        <w:t>word level. This involves checking the spellings of words (</w:t>
+      </w:r>
+      <w:proofErr w:type="spellStart"/>
+      <w:r>
+        <w:rPr>
+          <w:rFonts w:cstheme="minorHAnsi"/>
+          <w:sz w:val="24"/>
+          <w:szCs w:val="24"/>
+        </w:rPr>
+        <w:t>eg.</w:t>
+      </w:r>
+      <w:proofErr w:type="spellEnd"/>
+      <w:r>
+        <w:rPr>
+          <w:rFonts w:cstheme="minorHAnsi"/>
+          <w:sz w:val="24"/>
+          <w:szCs w:val="24"/>
+        </w:rPr>
+        <w:t xml:space="preserve"> Effect or affect). The</w:t>
       </w:r>
       <w:r>
         <w:rPr>
@@ -1240,7 +1294,25 @@
           <w:sz w:val="24"/>
           <w:szCs w:val="24"/>
         </w:rPr>
-        <w:t xml:space="preserve"> Its hard to miss out ones you need. Err on the side of caution.</w:t>
+        <w:t xml:space="preserve"> </w:t>
+      </w:r>
+      <w:proofErr w:type="spellStart"/>
+      <w:r>
+        <w:rPr>
+          <w:rFonts w:cstheme="minorHAnsi"/>
+          <w:sz w:val="24"/>
+          <w:szCs w:val="24"/>
+        </w:rPr>
+        <w:t>Its</w:t>
+      </w:r>
+      <w:proofErr w:type="spellEnd"/>
+      <w:r>
+        <w:rPr>
+          <w:rFonts w:cstheme="minorHAnsi"/>
+          <w:sz w:val="24"/>
+          <w:szCs w:val="24"/>
+        </w:rPr>
+        <w:t xml:space="preserve"> hard to miss out ones you need. Err on the side of caution.</w:t>
       </w:r>
       <w:r>
         <w:rPr>
@@ -1582,13 +1654,23 @@
           <w:szCs w:val="24"/>
         </w:rPr>
       </w:pPr>
-      <w:r>
-        <w:rPr>
-          <w:rFonts w:cstheme="minorHAnsi"/>
-          <w:sz w:val="24"/>
-          <w:szCs w:val="24"/>
-        </w:rPr>
-        <w:t>E.g the rat is dead.</w:t>
+      <w:proofErr w:type="spellStart"/>
+      <w:r>
+        <w:rPr>
+          <w:rFonts w:cstheme="minorHAnsi"/>
+          <w:sz w:val="24"/>
+          <w:szCs w:val="24"/>
+        </w:rPr>
+        <w:t>E.g</w:t>
+      </w:r>
+      <w:proofErr w:type="spellEnd"/>
+      <w:r>
+        <w:rPr>
+          <w:rFonts w:cstheme="minorHAnsi"/>
+          <w:sz w:val="24"/>
+          <w:szCs w:val="24"/>
+        </w:rPr>
+        <w:t xml:space="preserve"> the rat is dead.</w:t>
       </w:r>
     </w:p>
     <w:p>
@@ -1648,13 +1730,23 @@
           <w:szCs w:val="24"/>
         </w:rPr>
       </w:pPr>
-      <w:r>
-        <w:rPr>
-          <w:rFonts w:cstheme="minorHAnsi"/>
-          <w:sz w:val="24"/>
-          <w:szCs w:val="24"/>
-        </w:rPr>
-        <w:t xml:space="preserve">E.g </w:t>
+      <w:proofErr w:type="spellStart"/>
+      <w:r>
+        <w:rPr>
+          <w:rFonts w:cstheme="minorHAnsi"/>
+          <w:sz w:val="24"/>
+          <w:szCs w:val="24"/>
+        </w:rPr>
+        <w:t>E.g</w:t>
+      </w:r>
+      <w:proofErr w:type="spellEnd"/>
+      <w:r>
+        <w:rPr>
+          <w:rFonts w:cstheme="minorHAnsi"/>
+          <w:sz w:val="24"/>
+          <w:szCs w:val="24"/>
+        </w:rPr>
+        <w:t xml:space="preserve"> </w:t>
       </w:r>
       <w:r>
         <w:rPr>
@@ -1995,7 +2087,25 @@
           <w:sz w:val="24"/>
           <w:szCs w:val="24"/>
         </w:rPr>
-        <w:t xml:space="preserve"> are indicated by ’and’ and both sides should stand alone as main clauses. This means no comma is required between the two clauses (around the and).</w:t>
+        <w:t xml:space="preserve"> are indicated by ’and’ and both sides should stand alone as main clauses. This means no comma is required between the two clauses (around the </w:t>
+      </w:r>
+      <w:proofErr w:type="spellStart"/>
+      <w:r>
+        <w:rPr>
+          <w:rFonts w:cstheme="minorHAnsi"/>
+          <w:sz w:val="24"/>
+          <w:szCs w:val="24"/>
+        </w:rPr>
+        <w:t>and</w:t>
+      </w:r>
+      <w:proofErr w:type="spellEnd"/>
+      <w:r>
+        <w:rPr>
+          <w:rFonts w:cstheme="minorHAnsi"/>
+          <w:sz w:val="24"/>
+          <w:szCs w:val="24"/>
+        </w:rPr>
+        <w:t>).</w:t>
       </w:r>
     </w:p>
     <w:p>
@@ -2202,7 +2312,27 @@
           <w:sz w:val="24"/>
           <w:szCs w:val="24"/>
         </w:rPr>
-        <w:t>Object, verb, subject,verb,subject.</w:t>
+        <w:t xml:space="preserve">Object, verb, </w:t>
+      </w:r>
+      <w:proofErr w:type="spellStart"/>
+      <w:r>
+        <w:rPr>
+          <w:rFonts w:cstheme="minorHAnsi"/>
+          <w:color w:val="70AD47" w:themeColor="accent6"/>
+          <w:sz w:val="24"/>
+          <w:szCs w:val="24"/>
+        </w:rPr>
+        <w:t>subject,verb,subject</w:t>
+      </w:r>
+      <w:proofErr w:type="spellEnd"/>
+      <w:r>
+        <w:rPr>
+          <w:rFonts w:cstheme="minorHAnsi"/>
+          <w:color w:val="70AD47" w:themeColor="accent6"/>
+          <w:sz w:val="24"/>
+          <w:szCs w:val="24"/>
+        </w:rPr>
+        <w:t>.</w:t>
       </w:r>
     </w:p>
     <w:p>
@@ -2876,7 +3006,25 @@
           <w:sz w:val="24"/>
           <w:szCs w:val="24"/>
         </w:rPr>
-        <w:t xml:space="preserve"> e.g:</w:t>
+        <w:t xml:space="preserve"> </w:t>
+      </w:r>
+      <w:proofErr w:type="spellStart"/>
+      <w:r>
+        <w:rPr>
+          <w:rFonts w:cstheme="minorHAnsi"/>
+          <w:sz w:val="24"/>
+          <w:szCs w:val="24"/>
+        </w:rPr>
+        <w:t>e.g</w:t>
+      </w:r>
+      <w:proofErr w:type="spellEnd"/>
+      <w:r>
+        <w:rPr>
+          <w:rFonts w:cstheme="minorHAnsi"/>
+          <w:sz w:val="24"/>
+          <w:szCs w:val="24"/>
+        </w:rPr>
+        <w:t>:</w:t>
       </w:r>
     </w:p>
     <w:p>
@@ -3278,8 +3426,106 @@
           <w:sz w:val="24"/>
           <w:szCs w:val="24"/>
         </w:rPr>
-        <w:t>on her arm.</w:t>
-      </w:r>
+        <w:t>on her arm</w:t>
+      </w:r>
+      <w:r>
+        <w:rPr>
+          <w:rFonts w:cstheme="minorHAnsi"/>
+          <w:sz w:val="24"/>
+          <w:szCs w:val="24"/>
+        </w:rPr>
+        <w:t>.</w:t>
+      </w:r>
+    </w:p>
+    <w:p>
+      <w:pPr>
+        <w:pStyle w:val="ListParagraph"/>
+        <w:numPr>
+          <w:ilvl w:val="1"/>
+          <w:numId w:val="7"/>
+        </w:numPr>
+        <w:rPr>
+          <w:rFonts w:cstheme="minorHAnsi"/>
+          <w:color w:val="70AD47" w:themeColor="accent6"/>
+          <w:sz w:val="24"/>
+          <w:szCs w:val="24"/>
+        </w:rPr>
+      </w:pPr>
+      <w:r>
+        <w:rPr>
+          <w:rFonts w:cstheme="minorHAnsi"/>
+          <w:sz w:val="24"/>
+          <w:szCs w:val="24"/>
+        </w:rPr>
+        <w:t>Sometimes</w:t>
+      </w:r>
+      <w:r>
+        <w:rPr>
+          <w:rFonts w:cstheme="minorHAnsi"/>
+          <w:sz w:val="24"/>
+          <w:szCs w:val="24"/>
+        </w:rPr>
+        <w:t xml:space="preserve"> i</w:t>
+      </w:r>
+      <w:r>
+        <w:rPr>
+          <w:rFonts w:cstheme="minorHAnsi"/>
+          <w:sz w:val="24"/>
+          <w:szCs w:val="24"/>
+        </w:rPr>
+        <w:t>f a sentence starts</w:t>
+      </w:r>
+      <w:r>
+        <w:rPr>
+          <w:rFonts w:cstheme="minorHAnsi"/>
+          <w:sz w:val="24"/>
+          <w:szCs w:val="24"/>
+        </w:rPr>
+        <w:t xml:space="preserve"> or ends</w:t>
+      </w:r>
+      <w:r>
+        <w:rPr>
+          <w:rFonts w:cstheme="minorHAnsi"/>
+          <w:sz w:val="24"/>
+          <w:szCs w:val="24"/>
+        </w:rPr>
+        <w:t xml:space="preserve"> with an adverb that sets the tone of the sentence, such  as ‘fundamentally’, </w:t>
+      </w:r>
+      <w:r>
+        <w:rPr>
+          <w:rFonts w:cstheme="minorHAnsi"/>
+          <w:sz w:val="24"/>
+          <w:szCs w:val="24"/>
+        </w:rPr>
+        <w:t>the adverb should be followed or preceded by a comma.</w:t>
+      </w:r>
+      <w:r>
+        <w:rPr>
+          <w:rFonts w:cstheme="minorHAnsi"/>
+          <w:sz w:val="24"/>
+          <w:szCs w:val="24"/>
+        </w:rPr>
+        <w:t xml:space="preserve"> Check the word.</w:t>
+      </w:r>
+      <w:r>
+        <w:rPr>
+          <w:rFonts w:cstheme="minorHAnsi"/>
+          <w:sz w:val="24"/>
+          <w:szCs w:val="24"/>
+        </w:rPr>
+        <w:t xml:space="preserve"> </w:t>
+      </w:r>
+      <w:hyperlink r:id="rId7" w:history="1">
+        <w:r>
+          <w:rPr>
+            <w:rStyle w:val="Hyperlink"/>
+            <w:rFonts w:cstheme="minorHAnsi"/>
+            <w:sz w:val="24"/>
+            <w:szCs w:val="24"/>
+          </w:rPr>
+          <w:t>https://www.ef.com/wwen/english-resources/english-grammar/viewpoint-and-commenting-adverbs/</w:t>
+        </w:r>
+      </w:hyperlink>
     </w:p>
     <w:p>
       <w:pPr>
@@ -3809,12 +4055,22 @@
           <w:szCs w:val="24"/>
         </w:rPr>
       </w:pPr>
-      <w:r>
-        <w:rPr>
-          <w:sz w:val="24"/>
-          <w:szCs w:val="24"/>
-        </w:rPr>
-        <w:t>Ctrl+f 1, 2, 3, 4, 5, 6, 7, 8, 9 and 10, replace with one, two, three …</w:t>
+      <w:proofErr w:type="spellStart"/>
+      <w:r>
+        <w:rPr>
+          <w:sz w:val="24"/>
+          <w:szCs w:val="24"/>
+        </w:rPr>
+        <w:lastRenderedPageBreak/>
+        <w:t>Ctrl+f</w:t>
+      </w:r>
+      <w:proofErr w:type="spellEnd"/>
+      <w:r>
+        <w:rPr>
+          <w:sz w:val="24"/>
+          <w:szCs w:val="24"/>
+        </w:rPr>
+        <w:t xml:space="preserve"> 1, 2, 3, 4, 5, 6, 7, 8, 9 and 10, replace with one, two, three …</w:t>
       </w:r>
     </w:p>
     <w:p>
@@ -3829,12 +4085,21 @@
           <w:szCs w:val="24"/>
         </w:rPr>
       </w:pPr>
-      <w:r>
-        <w:rPr>
-          <w:sz w:val="24"/>
-          <w:szCs w:val="24"/>
-        </w:rPr>
-        <w:t>Ctrl+f effect and affect</w:t>
+      <w:proofErr w:type="spellStart"/>
+      <w:r>
+        <w:rPr>
+          <w:sz w:val="24"/>
+          <w:szCs w:val="24"/>
+        </w:rPr>
+        <w:t>Ctrl+f</w:t>
+      </w:r>
+      <w:proofErr w:type="spellEnd"/>
+      <w:r>
+        <w:rPr>
+          <w:sz w:val="24"/>
+          <w:szCs w:val="24"/>
+        </w:rPr>
+        <w:t xml:space="preserve"> effect and affect</w:t>
       </w:r>
     </w:p>
     <w:p>
@@ -3849,20 +4114,38 @@
           <w:szCs w:val="24"/>
         </w:rPr>
       </w:pPr>
-      <w:r>
-        <w:rPr>
-          <w:sz w:val="24"/>
-          <w:szCs w:val="24"/>
-        </w:rPr>
-        <w:t xml:space="preserve">Ctrl+f </w:t>
-      </w:r>
-      <w:r>
-        <w:rPr>
-          <w:sz w:val="24"/>
-          <w:szCs w:val="24"/>
-        </w:rPr>
-        <w:t>the the</w:t>
-      </w:r>
+      <w:proofErr w:type="spellStart"/>
+      <w:r>
+        <w:rPr>
+          <w:sz w:val="24"/>
+          <w:szCs w:val="24"/>
+        </w:rPr>
+        <w:t>Ctrl+f</w:t>
+      </w:r>
+      <w:proofErr w:type="spellEnd"/>
+      <w:r>
+        <w:rPr>
+          <w:sz w:val="24"/>
+          <w:szCs w:val="24"/>
+        </w:rPr>
+        <w:t xml:space="preserve"> </w:t>
+      </w:r>
+      <w:r>
+        <w:rPr>
+          <w:sz w:val="24"/>
+          <w:szCs w:val="24"/>
+        </w:rPr>
+        <w:t xml:space="preserve">the </w:t>
+      </w:r>
+      <w:proofErr w:type="spellStart"/>
+      <w:r>
+        <w:rPr>
+          <w:sz w:val="24"/>
+          <w:szCs w:val="24"/>
+        </w:rPr>
+        <w:t>the</w:t>
+      </w:r>
+      <w:proofErr w:type="spellEnd"/>
     </w:p>
     <w:p>
       <w:pPr>
@@ -3901,7 +4184,6 @@
           <w:sz w:val="24"/>
           <w:szCs w:val="24"/>
         </w:rPr>
-        <w:lastRenderedPageBreak/>
         <w:t>Check `` quote marks.</w:t>
       </w:r>
     </w:p>
@@ -3922,8 +4204,17 @@
           <w:sz w:val="24"/>
           <w:szCs w:val="24"/>
         </w:rPr>
-        <w:t>Beam splitter, not beamsplitter</w:t>
-      </w:r>
+        <w:t xml:space="preserve">Beam splitter, not </w:t>
+      </w:r>
+      <w:proofErr w:type="spellStart"/>
+      <w:r>
+        <w:rPr>
+          <w:sz w:val="24"/>
+          <w:szCs w:val="24"/>
+        </w:rPr>
+        <w:t>beamsplitter</w:t>
+      </w:r>
+      <w:proofErr w:type="spellEnd"/>
     </w:p>
     <w:p>
       <w:pPr>
@@ -4181,7 +4472,23 @@
           <w:sz w:val="24"/>
           <w:szCs w:val="24"/>
         </w:rPr>
-        <w:t>Lots end in ‘ly’</w:t>
+        <w:t>Lots end in ‘</w:t>
+      </w:r>
+      <w:proofErr w:type="spellStart"/>
+      <w:r>
+        <w:rPr>
+          <w:sz w:val="24"/>
+          <w:szCs w:val="24"/>
+        </w:rPr>
+        <w:t>ly</w:t>
+      </w:r>
+      <w:proofErr w:type="spellEnd"/>
+      <w:r>
+        <w:rPr>
+          <w:sz w:val="24"/>
+          <w:szCs w:val="24"/>
+        </w:rPr>
+        <w:t>’</w:t>
       </w:r>
     </w:p>
     <w:p>
@@ -4331,7 +4638,23 @@
           <w:sz w:val="24"/>
           <w:szCs w:val="24"/>
         </w:rPr>
-        <w:t>Check ngram viewer if unsure.</w:t>
+        <w:t xml:space="preserve">Check </w:t>
+      </w:r>
+      <w:proofErr w:type="spellStart"/>
+      <w:r>
+        <w:rPr>
+          <w:sz w:val="24"/>
+          <w:szCs w:val="24"/>
+        </w:rPr>
+        <w:t>ngram</w:t>
+      </w:r>
+      <w:proofErr w:type="spellEnd"/>
+      <w:r>
+        <w:rPr>
+          <w:sz w:val="24"/>
+          <w:szCs w:val="24"/>
+        </w:rPr>
+        <w:t xml:space="preserve"> viewer if unsure.</w:t>
       </w:r>
     </w:p>
     <w:p>
@@ -4373,12 +4696,21 @@
           <w:szCs w:val="24"/>
         </w:rPr>
       </w:pPr>
-      <w:r>
-        <w:rPr>
-          <w:sz w:val="24"/>
-          <w:szCs w:val="24"/>
-        </w:rPr>
-        <w:t xml:space="preserve">E.g </w:t>
+      <w:proofErr w:type="spellStart"/>
+      <w:r>
+        <w:rPr>
+          <w:sz w:val="24"/>
+          <w:szCs w:val="24"/>
+        </w:rPr>
+        <w:t>E.g</w:t>
+      </w:r>
+      <w:proofErr w:type="spellEnd"/>
+      <w:r>
+        <w:rPr>
+          <w:sz w:val="24"/>
+          <w:szCs w:val="24"/>
+        </w:rPr>
+        <w:t xml:space="preserve"> </w:t>
       </w:r>
       <w:r>
         <w:rPr>
@@ -4419,7 +4751,23 @@
           <w:sz w:val="24"/>
           <w:szCs w:val="24"/>
         </w:rPr>
-        <w:t>Current detector = aLIGO, future detector = LIGO A+, the detector in a general abstract sense = LIGO</w:t>
+        <w:t xml:space="preserve">Current detector = </w:t>
+      </w:r>
+      <w:proofErr w:type="spellStart"/>
+      <w:r>
+        <w:rPr>
+          <w:sz w:val="24"/>
+          <w:szCs w:val="24"/>
+        </w:rPr>
+        <w:t>aLIGO</w:t>
+      </w:r>
+      <w:proofErr w:type="spellEnd"/>
+      <w:r>
+        <w:rPr>
+          <w:sz w:val="24"/>
+          <w:szCs w:val="24"/>
+        </w:rPr>
+        <w:t>, future detector = LIGO A+, the detector in a general abstract sense = LIGO</w:t>
       </w:r>
     </w:p>
     <w:p>
@@ -4632,7 +4980,39 @@
           <w:sz w:val="24"/>
           <w:szCs w:val="24"/>
         </w:rPr>
-        <w:t>Figures shall be saved as eps when using matplotlib or 'epsc' when using matlab. This is to prevent a latex warning.</w:t>
+        <w:t>Figures shall be saved as eps when using matplotlib or '</w:t>
+      </w:r>
+      <w:proofErr w:type="spellStart"/>
+      <w:r>
+        <w:rPr>
+          <w:sz w:val="24"/>
+          <w:szCs w:val="24"/>
+        </w:rPr>
+        <w:t>epsc</w:t>
+      </w:r>
+      <w:proofErr w:type="spellEnd"/>
+      <w:r>
+        <w:rPr>
+          <w:sz w:val="24"/>
+          <w:szCs w:val="24"/>
+        </w:rPr>
+        <w:t xml:space="preserve">' when using </w:t>
+      </w:r>
+      <w:proofErr w:type="spellStart"/>
+      <w:r>
+        <w:rPr>
+          <w:sz w:val="24"/>
+          <w:szCs w:val="24"/>
+        </w:rPr>
+        <w:t>matlab</w:t>
+      </w:r>
+      <w:proofErr w:type="spellEnd"/>
+      <w:r>
+        <w:rPr>
+          <w:sz w:val="24"/>
+          <w:szCs w:val="24"/>
+        </w:rPr>
+        <w:t>. This is to prevent a latex warning.</w:t>
       </w:r>
     </w:p>
     <w:p>
@@ -4686,7 +5066,23 @@
           <w:sz w:val="24"/>
           <w:szCs w:val="24"/>
         </w:rPr>
-        <w:t>Figure names shall be 'chapter description'_chapter_'figure description'. For</w:t>
+        <w:t xml:space="preserve">Figure names shall be 'chapter </w:t>
+      </w:r>
+      <w:proofErr w:type="spellStart"/>
+      <w:r>
+        <w:rPr>
+          <w:sz w:val="24"/>
+          <w:szCs w:val="24"/>
+        </w:rPr>
+        <w:t>description'_chapter_'figure</w:t>
+      </w:r>
+      <w:proofErr w:type="spellEnd"/>
+      <w:r>
+        <w:rPr>
+          <w:sz w:val="24"/>
+          <w:szCs w:val="24"/>
+        </w:rPr>
+        <w:t xml:space="preserve"> description'. For</w:t>
       </w:r>
       <w:r>
         <w:rPr>
@@ -4700,7 +5096,23 @@
           <w:sz w:val="24"/>
           <w:szCs w:val="24"/>
         </w:rPr>
-        <w:t>example, 'sim_chapter_Zoom_in_ETM_tuning' refers to the figure being in the</w:t>
+        <w:t>example, '</w:t>
+      </w:r>
+      <w:proofErr w:type="spellStart"/>
+      <w:r>
+        <w:rPr>
+          <w:sz w:val="24"/>
+          <w:szCs w:val="24"/>
+        </w:rPr>
+        <w:t>sim_chapter_Zoom_in_ETM_tuning</w:t>
+      </w:r>
+      <w:proofErr w:type="spellEnd"/>
+      <w:r>
+        <w:rPr>
+          <w:sz w:val="24"/>
+          <w:szCs w:val="24"/>
+        </w:rPr>
+        <w:t>' refers to the figure being in the</w:t>
       </w:r>
       <w:r>
         <w:rPr>
@@ -4754,7 +5166,23 @@
           <w:sz w:val="24"/>
           <w:szCs w:val="24"/>
         </w:rPr>
-        <w:t>Are all lines visible/distinguishable? Changing thickness and linestyle can help.</w:t>
+        <w:t xml:space="preserve">Are all lines visible/distinguishable? Changing thickness and </w:t>
+      </w:r>
+      <w:proofErr w:type="spellStart"/>
+      <w:r>
+        <w:rPr>
+          <w:sz w:val="24"/>
+          <w:szCs w:val="24"/>
+        </w:rPr>
+        <w:t>linestyle</w:t>
+      </w:r>
+      <w:proofErr w:type="spellEnd"/>
+      <w:r>
+        <w:rPr>
+          <w:sz w:val="24"/>
+          <w:szCs w:val="24"/>
+        </w:rPr>
+        <w:t xml:space="preserve"> can help.</w:t>
       </w:r>
     </w:p>
     <w:p>
@@ -4774,7 +5202,23 @@
           <w:sz w:val="24"/>
           <w:szCs w:val="24"/>
         </w:rPr>
-        <w:t>Are the axis labelled? The label is a sentence, so normal sentence capitalisation should be used. If its just one word, use a capital letter.</w:t>
+        <w:t xml:space="preserve">Are the axis labelled? The label is a sentence, so normal sentence capitalisation should be used. If </w:t>
+      </w:r>
+      <w:proofErr w:type="spellStart"/>
+      <w:r>
+        <w:rPr>
+          <w:sz w:val="24"/>
+          <w:szCs w:val="24"/>
+        </w:rPr>
+        <w:t>its</w:t>
+      </w:r>
+      <w:proofErr w:type="spellEnd"/>
+      <w:r>
+        <w:rPr>
+          <w:sz w:val="24"/>
+          <w:szCs w:val="24"/>
+        </w:rPr>
+        <w:t xml:space="preserve"> just one word, use a capital letter.</w:t>
       </w:r>
     </w:p>
     <w:p>
@@ -4794,6 +5238,7 @@
           <w:sz w:val="24"/>
           <w:szCs w:val="24"/>
         </w:rPr>
+        <w:lastRenderedPageBreak/>
         <w:t>Capitalisation should follow normal grammar rules in the legend.</w:t>
       </w:r>
     </w:p>
@@ -4834,7 +5279,6 @@
           <w:sz w:val="24"/>
           <w:szCs w:val="24"/>
         </w:rPr>
-        <w:lastRenderedPageBreak/>
         <w:t xml:space="preserve">Does the figure need a grid? This is useful for when precise values need reading off from the plot. </w:t>
       </w:r>
     </w:p>
@@ -4855,7 +5299,23 @@
           <w:sz w:val="24"/>
           <w:szCs w:val="24"/>
         </w:rPr>
-        <w:t>Are subscripts properly typset?</w:t>
+        <w:t xml:space="preserve">Are subscripts properly </w:t>
+      </w:r>
+      <w:proofErr w:type="spellStart"/>
+      <w:r>
+        <w:rPr>
+          <w:sz w:val="24"/>
+          <w:szCs w:val="24"/>
+        </w:rPr>
+        <w:t>typset</w:t>
+      </w:r>
+      <w:proofErr w:type="spellEnd"/>
+      <w:r>
+        <w:rPr>
+          <w:sz w:val="24"/>
+          <w:szCs w:val="24"/>
+        </w:rPr>
+        <w:t>?</w:t>
       </w:r>
     </w:p>
     <w:p>
@@ -4875,7 +5335,23 @@
           <w:sz w:val="24"/>
           <w:szCs w:val="24"/>
         </w:rPr>
-        <w:t>Have standard unit labels been used? A for amps, degree symbols instead of 'deg' etc.</w:t>
+        <w:t>Have standard unit labels been used? A for amps, degree symbols instead of '</w:t>
+      </w:r>
+      <w:proofErr w:type="spellStart"/>
+      <w:r>
+        <w:rPr>
+          <w:sz w:val="24"/>
+          <w:szCs w:val="24"/>
+        </w:rPr>
+        <w:t>deg</w:t>
+      </w:r>
+      <w:proofErr w:type="spellEnd"/>
+      <w:r>
+        <w:rPr>
+          <w:sz w:val="24"/>
+          <w:szCs w:val="24"/>
+        </w:rPr>
+        <w:t>' etc.</w:t>
       </w:r>
     </w:p>
     <w:p>
@@ -4915,7 +5391,23 @@
           <w:sz w:val="24"/>
           <w:szCs w:val="24"/>
         </w:rPr>
-        <w:t>Check for spelling mistakes! e.g. freuqency -&gt; frequency.</w:t>
+        <w:t xml:space="preserve">Check for spelling mistakes! e.g. </w:t>
+      </w:r>
+      <w:proofErr w:type="spellStart"/>
+      <w:r>
+        <w:rPr>
+          <w:sz w:val="24"/>
+          <w:szCs w:val="24"/>
+        </w:rPr>
+        <w:t>freuqency</w:t>
+      </w:r>
+      <w:proofErr w:type="spellEnd"/>
+      <w:r>
+        <w:rPr>
+          <w:sz w:val="24"/>
+          <w:szCs w:val="24"/>
+        </w:rPr>
+        <w:t xml:space="preserve"> -&gt; frequency.</w:t>
       </w:r>
     </w:p>
     <w:p>
@@ -5018,7 +5510,23 @@
           <w:sz w:val="24"/>
           <w:szCs w:val="24"/>
         </w:rPr>
-        <w:t>Standard matlab and matplotlib fonts will be used. The following examples give</w:t>
+        <w:t xml:space="preserve">Standard </w:t>
+      </w:r>
+      <w:proofErr w:type="spellStart"/>
+      <w:r>
+        <w:rPr>
+          <w:sz w:val="24"/>
+          <w:szCs w:val="24"/>
+        </w:rPr>
+        <w:t>matlab</w:t>
+      </w:r>
+      <w:proofErr w:type="spellEnd"/>
+      <w:r>
+        <w:rPr>
+          <w:sz w:val="24"/>
+          <w:szCs w:val="24"/>
+        </w:rPr>
+        <w:t xml:space="preserve"> and matplotlib fonts will be used. The following examples give</w:t>
       </w:r>
       <w:r>
         <w:rPr>
@@ -5121,7 +5629,23 @@
           <w:sz w:val="24"/>
           <w:szCs w:val="24"/>
         </w:rPr>
-        <w:t>have ‘shared axis’, only label one of the axis. If it’s the xaxis, then label the bottom one. If it’s the y axis, label the left one.</w:t>
+        <w:t xml:space="preserve">have ‘shared axis’, only label one of the axis. If it’s the </w:t>
+      </w:r>
+      <w:proofErr w:type="spellStart"/>
+      <w:r>
+        <w:rPr>
+          <w:sz w:val="24"/>
+          <w:szCs w:val="24"/>
+        </w:rPr>
+        <w:t>xaxis</w:t>
+      </w:r>
+      <w:proofErr w:type="spellEnd"/>
+      <w:r>
+        <w:rPr>
+          <w:sz w:val="24"/>
+          <w:szCs w:val="24"/>
+        </w:rPr>
+        <w:t>, then label the bottom one. If it’s the y axis, label the left one.</w:t>
       </w:r>
     </w:p>
     <w:p>
@@ -5178,7 +5702,23 @@
           <w:sz w:val="24"/>
           <w:szCs w:val="24"/>
         </w:rPr>
-        <w:t xml:space="preserve"> fontsize = </w:t>
+        <w:t xml:space="preserve"> </w:t>
+      </w:r>
+      <w:proofErr w:type="spellStart"/>
+      <w:r>
+        <w:rPr>
+          <w:sz w:val="24"/>
+          <w:szCs w:val="24"/>
+        </w:rPr>
+        <w:t>fontsize</w:t>
+      </w:r>
+      <w:proofErr w:type="spellEnd"/>
+      <w:r>
+        <w:rPr>
+          <w:sz w:val="24"/>
+          <w:szCs w:val="24"/>
+        </w:rPr>
+        <w:t xml:space="preserve"> = </w:t>
       </w:r>
       <w:r>
         <w:rPr>
@@ -5234,7 +5774,23 @@
           <w:sz w:val="24"/>
           <w:szCs w:val="24"/>
         </w:rPr>
-        <w:t xml:space="preserve"> fontsize </w:t>
+        <w:t xml:space="preserve"> </w:t>
+      </w:r>
+      <w:proofErr w:type="spellStart"/>
+      <w:r>
+        <w:rPr>
+          <w:sz w:val="24"/>
+          <w:szCs w:val="24"/>
+        </w:rPr>
+        <w:t>fontsize</w:t>
+      </w:r>
+      <w:proofErr w:type="spellEnd"/>
+      <w:r>
+        <w:rPr>
+          <w:sz w:val="24"/>
+          <w:szCs w:val="24"/>
+        </w:rPr>
+        <w:t xml:space="preserve"> </w:t>
       </w:r>
       <w:r>
         <w:rPr>
@@ -5302,13 +5858,23 @@
           <w:szCs w:val="24"/>
         </w:rPr>
       </w:pPr>
-      <w:r>
-        <w:rPr>
-          <w:rFonts w:ascii="SimSun" w:eastAsia="SimSun" w:hAnsi="SimSun"/>
-          <w:sz w:val="24"/>
-          <w:szCs w:val="24"/>
-        </w:rPr>
-        <w:t>figure_size = (6,</w:t>
+      <w:proofErr w:type="spellStart"/>
+      <w:r>
+        <w:rPr>
+          <w:rFonts w:ascii="SimSun" w:eastAsia="SimSun" w:hAnsi="SimSun"/>
+          <w:sz w:val="24"/>
+          <w:szCs w:val="24"/>
+        </w:rPr>
+        <w:t>figure_size</w:t>
+      </w:r>
+      <w:proofErr w:type="spellEnd"/>
+      <w:r>
+        <w:rPr>
+          <w:rFonts w:ascii="SimSun" w:eastAsia="SimSun" w:hAnsi="SimSun"/>
+          <w:sz w:val="24"/>
+          <w:szCs w:val="24"/>
+        </w:rPr>
+        <w:t xml:space="preserve"> = (6,</w:t>
       </w:r>
       <w:r>
         <w:rPr>
@@ -5335,13 +5901,59 @@
           <w:szCs w:val="24"/>
         </w:rPr>
       </w:pPr>
-      <w:r>
-        <w:rPr>
-          <w:rFonts w:ascii="SimSun" w:eastAsia="SimSun" w:hAnsi="SimSun"/>
-          <w:sz w:val="24"/>
-          <w:szCs w:val="24"/>
-        </w:rPr>
-        <w:t xml:space="preserve">plt.figure(figsize = figure_size,dpi = </w:t>
+      <w:proofErr w:type="spellStart"/>
+      <w:r>
+        <w:rPr>
+          <w:rFonts w:ascii="SimSun" w:eastAsia="SimSun" w:hAnsi="SimSun"/>
+          <w:sz w:val="24"/>
+          <w:szCs w:val="24"/>
+        </w:rPr>
+        <w:t>plt.figure</w:t>
+      </w:r>
+      <w:proofErr w:type="spellEnd"/>
+      <w:r>
+        <w:rPr>
+          <w:rFonts w:ascii="SimSun" w:eastAsia="SimSun" w:hAnsi="SimSun"/>
+          <w:sz w:val="24"/>
+          <w:szCs w:val="24"/>
+        </w:rPr>
+        <w:t>(</w:t>
+      </w:r>
+      <w:proofErr w:type="spellStart"/>
+      <w:r>
+        <w:rPr>
+          <w:rFonts w:ascii="SimSun" w:eastAsia="SimSun" w:hAnsi="SimSun"/>
+          <w:sz w:val="24"/>
+          <w:szCs w:val="24"/>
+        </w:rPr>
+        <w:t>figsize</w:t>
+      </w:r>
+      <w:proofErr w:type="spellEnd"/>
+      <w:r>
+        <w:rPr>
+          <w:rFonts w:ascii="SimSun" w:eastAsia="SimSun" w:hAnsi="SimSun"/>
+          <w:sz w:val="24"/>
+          <w:szCs w:val="24"/>
+        </w:rPr>
+        <w:t xml:space="preserve"> = </w:t>
+      </w:r>
+      <w:proofErr w:type="spellStart"/>
+      <w:r>
+        <w:rPr>
+          <w:rFonts w:ascii="SimSun" w:eastAsia="SimSun" w:hAnsi="SimSun"/>
+          <w:sz w:val="24"/>
+          <w:szCs w:val="24"/>
+        </w:rPr>
+        <w:t>figure_size,dpi</w:t>
+      </w:r>
+      <w:proofErr w:type="spellEnd"/>
+      <w:r>
+        <w:rPr>
+          <w:rFonts w:ascii="SimSun" w:eastAsia="SimSun" w:hAnsi="SimSun"/>
+          <w:sz w:val="24"/>
+          <w:szCs w:val="24"/>
+        </w:rPr>
+        <w:t xml:space="preserve"> = </w:t>
       </w:r>
       <w:r>
         <w:rPr>
@@ -5368,47 +5980,113 @@
           <w:szCs w:val="24"/>
         </w:rPr>
       </w:pPr>
-      <w:r>
-        <w:rPr>
-          <w:rFonts w:ascii="SimSun" w:eastAsia="SimSun" w:hAnsi="SimSun"/>
-          <w:sz w:val="24"/>
-          <w:szCs w:val="24"/>
-        </w:rPr>
-        <w:t>plt.plot(x,y,label = 'Name of line')</w:t>
-      </w:r>
-    </w:p>
-    <w:p>
-      <w:pPr>
-        <w:rPr>
-          <w:rFonts w:ascii="SimSun" w:eastAsia="SimSun" w:hAnsi="SimSun"/>
-          <w:sz w:val="24"/>
-          <w:szCs w:val="24"/>
-        </w:rPr>
-      </w:pPr>
-      <w:r>
-        <w:rPr>
-          <w:rFonts w:ascii="SimSun" w:eastAsia="SimSun" w:hAnsi="SimSun"/>
-          <w:sz w:val="24"/>
-          <w:szCs w:val="24"/>
-        </w:rPr>
-        <w:t>plt.legend(prop={'size': 8},loc = 'lower left')</w:t>
-      </w:r>
-    </w:p>
-    <w:p>
-      <w:pPr>
-        <w:rPr>
-          <w:rFonts w:ascii="SimSun" w:eastAsia="SimSun" w:hAnsi="SimSun"/>
-          <w:sz w:val="24"/>
-          <w:szCs w:val="24"/>
-        </w:rPr>
-      </w:pPr>
-      <w:r>
-        <w:rPr>
-          <w:rFonts w:ascii="SimSun" w:eastAsia="SimSun" w:hAnsi="SimSun"/>
-          <w:sz w:val="24"/>
-          <w:szCs w:val="24"/>
-        </w:rPr>
-        <w:t>plt.xlabel('x axis (units)'</w:t>
+      <w:proofErr w:type="spellStart"/>
+      <w:r>
+        <w:rPr>
+          <w:rFonts w:ascii="SimSun" w:eastAsia="SimSun" w:hAnsi="SimSun"/>
+          <w:sz w:val="24"/>
+          <w:szCs w:val="24"/>
+        </w:rPr>
+        <w:t>plt.plot</w:t>
+      </w:r>
+      <w:proofErr w:type="spellEnd"/>
+      <w:r>
+        <w:rPr>
+          <w:rFonts w:ascii="SimSun" w:eastAsia="SimSun" w:hAnsi="SimSun"/>
+          <w:sz w:val="24"/>
+          <w:szCs w:val="24"/>
+        </w:rPr>
+        <w:t>(</w:t>
+      </w:r>
+      <w:proofErr w:type="spellStart"/>
+      <w:r>
+        <w:rPr>
+          <w:rFonts w:ascii="SimSun" w:eastAsia="SimSun" w:hAnsi="SimSun"/>
+          <w:sz w:val="24"/>
+          <w:szCs w:val="24"/>
+        </w:rPr>
+        <w:t>x,y,label</w:t>
+      </w:r>
+      <w:proofErr w:type="spellEnd"/>
+      <w:r>
+        <w:rPr>
+          <w:rFonts w:ascii="SimSun" w:eastAsia="SimSun" w:hAnsi="SimSun"/>
+          <w:sz w:val="24"/>
+          <w:szCs w:val="24"/>
+        </w:rPr>
+        <w:t xml:space="preserve"> = 'Name of line')</w:t>
+      </w:r>
+    </w:p>
+    <w:p>
+      <w:pPr>
+        <w:rPr>
+          <w:rFonts w:ascii="SimSun" w:eastAsia="SimSun" w:hAnsi="SimSun"/>
+          <w:sz w:val="24"/>
+          <w:szCs w:val="24"/>
+        </w:rPr>
+      </w:pPr>
+      <w:proofErr w:type="spellStart"/>
+      <w:r>
+        <w:rPr>
+          <w:rFonts w:ascii="SimSun" w:eastAsia="SimSun" w:hAnsi="SimSun"/>
+          <w:sz w:val="24"/>
+          <w:szCs w:val="24"/>
+        </w:rPr>
+        <w:t>plt.legend</w:t>
+      </w:r>
+      <w:proofErr w:type="spellEnd"/>
+      <w:r>
+        <w:rPr>
+          <w:rFonts w:ascii="SimSun" w:eastAsia="SimSun" w:hAnsi="SimSun"/>
+          <w:sz w:val="24"/>
+          <w:szCs w:val="24"/>
+        </w:rPr>
+        <w:t>(prop={'size': 8},</w:t>
+      </w:r>
+      <w:proofErr w:type="spellStart"/>
+      <w:r>
+        <w:rPr>
+          <w:rFonts w:ascii="SimSun" w:eastAsia="SimSun" w:hAnsi="SimSun"/>
+          <w:sz w:val="24"/>
+          <w:szCs w:val="24"/>
+        </w:rPr>
+        <w:t>loc</w:t>
+      </w:r>
+      <w:proofErr w:type="spellEnd"/>
+      <w:r>
+        <w:rPr>
+          <w:rFonts w:ascii="SimSun" w:eastAsia="SimSun" w:hAnsi="SimSun"/>
+          <w:sz w:val="24"/>
+          <w:szCs w:val="24"/>
+        </w:rPr>
+        <w:t xml:space="preserve"> = 'lower left')</w:t>
+      </w:r>
+    </w:p>
+    <w:p>
+      <w:pPr>
+        <w:rPr>
+          <w:rFonts w:ascii="SimSun" w:eastAsia="SimSun" w:hAnsi="SimSun"/>
+          <w:sz w:val="24"/>
+          <w:szCs w:val="24"/>
+        </w:rPr>
+      </w:pPr>
+      <w:proofErr w:type="spellStart"/>
+      <w:r>
+        <w:rPr>
+          <w:rFonts w:ascii="SimSun" w:eastAsia="SimSun" w:hAnsi="SimSun"/>
+          <w:sz w:val="24"/>
+          <w:szCs w:val="24"/>
+        </w:rPr>
+        <w:t>plt.xlabel</w:t>
+      </w:r>
+      <w:proofErr w:type="spellEnd"/>
+      <w:r>
+        <w:rPr>
+          <w:rFonts w:ascii="SimSun" w:eastAsia="SimSun" w:hAnsi="SimSun"/>
+          <w:sz w:val="24"/>
+          <w:szCs w:val="24"/>
+        </w:rPr>
+        <w:t>('x axis (units)'</w:t>
       </w:r>
       <w:r>
         <w:rPr>
@@ -5421,13 +6099,23 @@
       <w:r>
         <w:t xml:space="preserve"> </w:t>
       </w:r>
-      <w:r>
-        <w:rPr>
-          <w:rFonts w:ascii="SimSun" w:eastAsia="SimSun" w:hAnsi="SimSun"/>
-          <w:sz w:val="24"/>
-          <w:szCs w:val="24"/>
-        </w:rPr>
-        <w:t>fontsize = 1</w:t>
+      <w:proofErr w:type="spellStart"/>
+      <w:r>
+        <w:rPr>
+          <w:rFonts w:ascii="SimSun" w:eastAsia="SimSun" w:hAnsi="SimSun"/>
+          <w:sz w:val="24"/>
+          <w:szCs w:val="24"/>
+        </w:rPr>
+        <w:t>fontsize</w:t>
+      </w:r>
+      <w:proofErr w:type="spellEnd"/>
+      <w:r>
+        <w:rPr>
+          <w:rFonts w:ascii="SimSun" w:eastAsia="SimSun" w:hAnsi="SimSun"/>
+          <w:sz w:val="24"/>
+          <w:szCs w:val="24"/>
+        </w:rPr>
+        <w:t xml:space="preserve"> = 1</w:t>
       </w:r>
       <w:r>
         <w:rPr>
@@ -5454,13 +6142,23 @@
           <w:szCs w:val="24"/>
         </w:rPr>
       </w:pPr>
-      <w:r>
-        <w:rPr>
-          <w:rFonts w:ascii="SimSun" w:eastAsia="SimSun" w:hAnsi="SimSun"/>
-          <w:sz w:val="24"/>
-          <w:szCs w:val="24"/>
-        </w:rPr>
-        <w:t>plt.ylabel('y axis (units)'</w:t>
+      <w:proofErr w:type="spellStart"/>
+      <w:r>
+        <w:rPr>
+          <w:rFonts w:ascii="SimSun" w:eastAsia="SimSun" w:hAnsi="SimSun"/>
+          <w:sz w:val="24"/>
+          <w:szCs w:val="24"/>
+        </w:rPr>
+        <w:t>plt.ylabel</w:t>
+      </w:r>
+      <w:proofErr w:type="spellEnd"/>
+      <w:r>
+        <w:rPr>
+          <w:rFonts w:ascii="SimSun" w:eastAsia="SimSun" w:hAnsi="SimSun"/>
+          <w:sz w:val="24"/>
+          <w:szCs w:val="24"/>
+        </w:rPr>
+        <w:t>('y axis (units)'</w:t>
       </w:r>
       <w:r>
         <w:rPr>
@@ -5473,13 +6171,23 @@
       <w:r>
         <w:t xml:space="preserve"> </w:t>
       </w:r>
-      <w:r>
-        <w:rPr>
-          <w:rFonts w:ascii="SimSun" w:eastAsia="SimSun" w:hAnsi="SimSun"/>
-          <w:sz w:val="24"/>
-          <w:szCs w:val="24"/>
-        </w:rPr>
-        <w:t>fontsize = 1</w:t>
+      <w:proofErr w:type="spellStart"/>
+      <w:r>
+        <w:rPr>
+          <w:rFonts w:ascii="SimSun" w:eastAsia="SimSun" w:hAnsi="SimSun"/>
+          <w:sz w:val="24"/>
+          <w:szCs w:val="24"/>
+        </w:rPr>
+        <w:t>fontsize</w:t>
+      </w:r>
+      <w:proofErr w:type="spellEnd"/>
+      <w:r>
+        <w:rPr>
+          <w:rFonts w:ascii="SimSun" w:eastAsia="SimSun" w:hAnsi="SimSun"/>
+          <w:sz w:val="24"/>
+          <w:szCs w:val="24"/>
+        </w:rPr>
+        <w:t xml:space="preserve"> = 1</w:t>
       </w:r>
       <w:r>
         <w:rPr>
@@ -5506,64 +6214,123 @@
           <w:szCs w:val="24"/>
         </w:rPr>
       </w:pPr>
-      <w:r>
-        <w:rPr>
-          <w:rFonts w:ascii="SimSun" w:eastAsia="SimSun" w:hAnsi="SimSun"/>
-          <w:sz w:val="24"/>
-          <w:szCs w:val="24"/>
-        </w:rPr>
-        <w:t>plt.tight_layout()</w:t>
-      </w:r>
-    </w:p>
-    <w:p>
-      <w:pPr>
-        <w:rPr>
-          <w:rFonts w:ascii="SimSun" w:eastAsia="SimSun" w:hAnsi="SimSun"/>
-          <w:sz w:val="24"/>
-          <w:szCs w:val="24"/>
-        </w:rPr>
-      </w:pPr>
-      <w:r>
-        <w:rPr>
-          <w:rFonts w:ascii="SimSun" w:eastAsia="SimSun" w:hAnsi="SimSun"/>
-          <w:sz w:val="24"/>
-          <w:szCs w:val="24"/>
-        </w:rPr>
-        <w:t>plt.grid()</w:t>
-      </w:r>
-    </w:p>
-    <w:p>
-      <w:pPr>
-        <w:rPr>
-          <w:rFonts w:ascii="SimSun" w:eastAsia="SimSun" w:hAnsi="SimSun"/>
-          <w:sz w:val="24"/>
-          <w:szCs w:val="24"/>
-        </w:rPr>
-      </w:pPr>
-      <w:r>
-        <w:rPr>
-          <w:rFonts w:ascii="SimSun" w:eastAsia="SimSun" w:hAnsi="SimSun"/>
-          <w:sz w:val="24"/>
-          <w:szCs w:val="24"/>
-        </w:rPr>
-        <w:t>plt.savefig('sim_chapter_Zoom_in_ETM_tuning.eps')</w:t>
-      </w:r>
-    </w:p>
-    <w:p>
-      <w:pPr>
-        <w:rPr>
-          <w:rFonts w:ascii="SimSun" w:eastAsia="SimSun" w:hAnsi="SimSun"/>
-          <w:sz w:val="24"/>
-          <w:szCs w:val="24"/>
-        </w:rPr>
-      </w:pPr>
-      <w:r>
-        <w:rPr>
-          <w:rFonts w:ascii="SimSun" w:eastAsia="SimSun" w:hAnsi="SimSun"/>
-          <w:sz w:val="24"/>
-          <w:szCs w:val="24"/>
-        </w:rPr>
-        <w:t>plt.show()</w:t>
+      <w:proofErr w:type="spellStart"/>
+      <w:r>
+        <w:rPr>
+          <w:rFonts w:ascii="SimSun" w:eastAsia="SimSun" w:hAnsi="SimSun"/>
+          <w:sz w:val="24"/>
+          <w:szCs w:val="24"/>
+        </w:rPr>
+        <w:t>plt.tight_layout</w:t>
+      </w:r>
+      <w:proofErr w:type="spellEnd"/>
+      <w:r>
+        <w:rPr>
+          <w:rFonts w:ascii="SimSun" w:eastAsia="SimSun" w:hAnsi="SimSun"/>
+          <w:sz w:val="24"/>
+          <w:szCs w:val="24"/>
+        </w:rPr>
+        <w:t>()</w:t>
+      </w:r>
+    </w:p>
+    <w:p>
+      <w:pPr>
+        <w:rPr>
+          <w:rFonts w:ascii="SimSun" w:eastAsia="SimSun" w:hAnsi="SimSun"/>
+          <w:sz w:val="24"/>
+          <w:szCs w:val="24"/>
+        </w:rPr>
+      </w:pPr>
+      <w:proofErr w:type="spellStart"/>
+      <w:r>
+        <w:rPr>
+          <w:rFonts w:ascii="SimSun" w:eastAsia="SimSun" w:hAnsi="SimSun"/>
+          <w:sz w:val="24"/>
+          <w:szCs w:val="24"/>
+        </w:rPr>
+        <w:t>plt.grid</w:t>
+      </w:r>
+      <w:proofErr w:type="spellEnd"/>
+      <w:r>
+        <w:rPr>
+          <w:rFonts w:ascii="SimSun" w:eastAsia="SimSun" w:hAnsi="SimSun"/>
+          <w:sz w:val="24"/>
+          <w:szCs w:val="24"/>
+        </w:rPr>
+        <w:t>()</w:t>
+      </w:r>
+    </w:p>
+    <w:p>
+      <w:pPr>
+        <w:rPr>
+          <w:rFonts w:ascii="SimSun" w:eastAsia="SimSun" w:hAnsi="SimSun"/>
+          <w:sz w:val="24"/>
+          <w:szCs w:val="24"/>
+        </w:rPr>
+      </w:pPr>
+      <w:proofErr w:type="spellStart"/>
+      <w:r>
+        <w:rPr>
+          <w:rFonts w:ascii="SimSun" w:eastAsia="SimSun" w:hAnsi="SimSun"/>
+          <w:sz w:val="24"/>
+          <w:szCs w:val="24"/>
+        </w:rPr>
+        <w:lastRenderedPageBreak/>
+        <w:t>plt.savefig</w:t>
+      </w:r>
+      <w:proofErr w:type="spellEnd"/>
+      <w:r>
+        <w:rPr>
+          <w:rFonts w:ascii="SimSun" w:eastAsia="SimSun" w:hAnsi="SimSun"/>
+          <w:sz w:val="24"/>
+          <w:szCs w:val="24"/>
+        </w:rPr>
+        <w:t>('</w:t>
+      </w:r>
+      <w:proofErr w:type="spellStart"/>
+      <w:r>
+        <w:rPr>
+          <w:rFonts w:ascii="SimSun" w:eastAsia="SimSun" w:hAnsi="SimSun"/>
+          <w:sz w:val="24"/>
+          <w:szCs w:val="24"/>
+        </w:rPr>
+        <w:t>sim_chapter_Zoom_in_ETM_tuning.eps</w:t>
+      </w:r>
+      <w:proofErr w:type="spellEnd"/>
+      <w:r>
+        <w:rPr>
+          <w:rFonts w:ascii="SimSun" w:eastAsia="SimSun" w:hAnsi="SimSun"/>
+          <w:sz w:val="24"/>
+          <w:szCs w:val="24"/>
+        </w:rPr>
+        <w:t>')</w:t>
+      </w:r>
+    </w:p>
+    <w:p>
+      <w:pPr>
+        <w:rPr>
+          <w:rFonts w:ascii="SimSun" w:eastAsia="SimSun" w:hAnsi="SimSun"/>
+          <w:sz w:val="24"/>
+          <w:szCs w:val="24"/>
+        </w:rPr>
+      </w:pPr>
+      <w:proofErr w:type="spellStart"/>
+      <w:r>
+        <w:rPr>
+          <w:rFonts w:ascii="SimSun" w:eastAsia="SimSun" w:hAnsi="SimSun"/>
+          <w:sz w:val="24"/>
+          <w:szCs w:val="24"/>
+        </w:rPr>
+        <w:t>plt.show</w:t>
+      </w:r>
+      <w:proofErr w:type="spellEnd"/>
+      <w:r>
+        <w:rPr>
+          <w:rFonts w:ascii="SimSun" w:eastAsia="SimSun" w:hAnsi="SimSun"/>
+          <w:sz w:val="24"/>
+          <w:szCs w:val="24"/>
+        </w:rPr>
+        <w:t>()</w:t>
       </w:r>
     </w:p>
     <w:p>
@@ -5600,13 +6367,41 @@
           <w:szCs w:val="24"/>
         </w:rPr>
       </w:pPr>
-      <w:r>
-        <w:rPr>
-          <w:rFonts w:ascii="SimSun" w:eastAsia="SimSun" w:hAnsi="SimSun"/>
-          <w:sz w:val="24"/>
-          <w:szCs w:val="24"/>
-        </w:rPr>
-        <w:t>plt.figure(figsize=(6, 6), dpi=150)</w:t>
+      <w:proofErr w:type="spellStart"/>
+      <w:r>
+        <w:rPr>
+          <w:rFonts w:ascii="SimSun" w:eastAsia="SimSun" w:hAnsi="SimSun"/>
+          <w:sz w:val="24"/>
+          <w:szCs w:val="24"/>
+        </w:rPr>
+        <w:t>plt.figure</w:t>
+      </w:r>
+      <w:proofErr w:type="spellEnd"/>
+      <w:r>
+        <w:rPr>
+          <w:rFonts w:ascii="SimSun" w:eastAsia="SimSun" w:hAnsi="SimSun"/>
+          <w:sz w:val="24"/>
+          <w:szCs w:val="24"/>
+        </w:rPr>
+        <w:t>(</w:t>
+      </w:r>
+      <w:proofErr w:type="spellStart"/>
+      <w:r>
+        <w:rPr>
+          <w:rFonts w:ascii="SimSun" w:eastAsia="SimSun" w:hAnsi="SimSun"/>
+          <w:sz w:val="24"/>
+          <w:szCs w:val="24"/>
+        </w:rPr>
+        <w:t>figsize</w:t>
+      </w:r>
+      <w:proofErr w:type="spellEnd"/>
+      <w:r>
+        <w:rPr>
+          <w:rFonts w:ascii="SimSun" w:eastAsia="SimSun" w:hAnsi="SimSun"/>
+          <w:sz w:val="24"/>
+          <w:szCs w:val="24"/>
+        </w:rPr>
+        <w:t>=(6, 6), dpi=150)</w:t>
       </w:r>
     </w:p>
     <w:p>
@@ -5664,6 +6459,7 @@
           <w:szCs w:val="24"/>
         </w:rPr>
       </w:pPr>
+      <w:proofErr w:type="spellStart"/>
       <w:r>
         <w:rPr>
           <w:rFonts w:asciiTheme="majorHAnsi" w:hAnsiTheme="majorHAnsi"/>
@@ -5674,6 +6470,7 @@
         </w:rPr>
         <w:t>Matlab</w:t>
       </w:r>
+      <w:proofErr w:type="spellEnd"/>
     </w:p>
     <w:p>
       <w:pPr>
@@ -5692,7 +6489,55 @@
           <w:sz w:val="24"/>
           <w:szCs w:val="24"/>
         </w:rPr>
-        <w:t>For matlab figures, use the linspecer (from mathworks file exchange) function to</w:t>
+        <w:t xml:space="preserve">For </w:t>
+      </w:r>
+      <w:proofErr w:type="spellStart"/>
+      <w:r>
+        <w:rPr>
+          <w:sz w:val="24"/>
+          <w:szCs w:val="24"/>
+        </w:rPr>
+        <w:t>matlab</w:t>
+      </w:r>
+      <w:proofErr w:type="spellEnd"/>
+      <w:r>
+        <w:rPr>
+          <w:sz w:val="24"/>
+          <w:szCs w:val="24"/>
+        </w:rPr>
+        <w:t xml:space="preserve"> figures, use the </w:t>
+      </w:r>
+      <w:proofErr w:type="spellStart"/>
+      <w:r>
+        <w:rPr>
+          <w:sz w:val="24"/>
+          <w:szCs w:val="24"/>
+        </w:rPr>
+        <w:t>linspecer</w:t>
+      </w:r>
+      <w:proofErr w:type="spellEnd"/>
+      <w:r>
+        <w:rPr>
+          <w:sz w:val="24"/>
+          <w:szCs w:val="24"/>
+        </w:rPr>
+        <w:t xml:space="preserve"> (from </w:t>
+      </w:r>
+      <w:proofErr w:type="spellStart"/>
+      <w:r>
+        <w:rPr>
+          <w:sz w:val="24"/>
+          <w:szCs w:val="24"/>
+        </w:rPr>
+        <w:t>mathworks</w:t>
+      </w:r>
+      <w:proofErr w:type="spellEnd"/>
+      <w:r>
+        <w:rPr>
+          <w:sz w:val="24"/>
+          <w:szCs w:val="24"/>
+        </w:rPr>
+        <w:t xml:space="preserve"> file exchange) function to</w:t>
       </w:r>
       <w:r>
         <w:rPr>
@@ -5733,8 +6578,9 @@
           <w:sz w:val="24"/>
           <w:szCs w:val="24"/>
         </w:rPr>
-        <w:t>The font should be set to Deja</w:t>
-      </w:r>
+        <w:t xml:space="preserve">The font should be set to </w:t>
+      </w:r>
+      <w:proofErr w:type="spellStart"/>
       <w:r>
         <w:rPr>
           <w:rFonts w:cstheme="minorHAnsi"/>
@@ -5742,7 +6588,7 @@
           <w:sz w:val="24"/>
           <w:szCs w:val="24"/>
         </w:rPr>
-        <w:t xml:space="preserve">Vu Sans, do this with: </w:t>
+        <w:t>Deja</w:t>
       </w:r>
       <w:r>
         <w:rPr>
@@ -5751,15 +6597,90 @@
           <w:sz w:val="24"/>
           <w:szCs w:val="24"/>
         </w:rPr>
-        <w:t>set(gca,</w:t>
-      </w:r>
-      <w:r>
-        <w:rPr>
-          <w:rFonts w:cstheme="minorHAnsi"/>
-          <w:sz w:val="24"/>
-          <w:szCs w:val="24"/>
-        </w:rPr>
-        <w:t>'fontname','DejaVu Sans')</w:t>
+        <w:t>Vu</w:t>
+      </w:r>
+      <w:proofErr w:type="spellEnd"/>
+      <w:r>
+        <w:rPr>
+          <w:rFonts w:cstheme="minorHAnsi"/>
+          <w:color w:val="000000"/>
+          <w:sz w:val="24"/>
+          <w:szCs w:val="24"/>
+        </w:rPr>
+        <w:t xml:space="preserve"> Sans, do this with: </w:t>
+      </w:r>
+      <w:r>
+        <w:rPr>
+          <w:rFonts w:cstheme="minorHAnsi"/>
+          <w:color w:val="000000"/>
+          <w:sz w:val="24"/>
+          <w:szCs w:val="24"/>
+        </w:rPr>
+        <w:t>set(</w:t>
+      </w:r>
+      <w:proofErr w:type="spellStart"/>
+      <w:r>
+        <w:rPr>
+          <w:rFonts w:cstheme="minorHAnsi"/>
+          <w:color w:val="000000"/>
+          <w:sz w:val="24"/>
+          <w:szCs w:val="24"/>
+        </w:rPr>
+        <w:t>gca</w:t>
+      </w:r>
+      <w:proofErr w:type="spellEnd"/>
+      <w:r>
+        <w:rPr>
+          <w:rFonts w:cstheme="minorHAnsi"/>
+          <w:color w:val="000000"/>
+          <w:sz w:val="24"/>
+          <w:szCs w:val="24"/>
+        </w:rPr>
+        <w:t>,</w:t>
+      </w:r>
+      <w:r>
+        <w:rPr>
+          <w:rFonts w:cstheme="minorHAnsi"/>
+          <w:sz w:val="24"/>
+          <w:szCs w:val="24"/>
+        </w:rPr>
+        <w:t>'</w:t>
+      </w:r>
+      <w:proofErr w:type="spellStart"/>
+      <w:r>
+        <w:rPr>
+          <w:rFonts w:cstheme="minorHAnsi"/>
+          <w:sz w:val="24"/>
+          <w:szCs w:val="24"/>
+        </w:rPr>
+        <w:t>fontname</w:t>
+      </w:r>
+      <w:proofErr w:type="spellEnd"/>
+      <w:r>
+        <w:rPr>
+          <w:rFonts w:cstheme="minorHAnsi"/>
+          <w:sz w:val="24"/>
+          <w:szCs w:val="24"/>
+        </w:rPr>
+        <w:t>','</w:t>
+      </w:r>
+      <w:proofErr w:type="spellStart"/>
+      <w:r>
+        <w:rPr>
+          <w:rFonts w:cstheme="minorHAnsi"/>
+          <w:sz w:val="24"/>
+          <w:szCs w:val="24"/>
+        </w:rPr>
+        <w:t>DejaVu</w:t>
+      </w:r>
+      <w:proofErr w:type="spellEnd"/>
+      <w:r>
+        <w:rPr>
+          <w:rFonts w:cstheme="minorHAnsi"/>
+          <w:sz w:val="24"/>
+          <w:szCs w:val="24"/>
+        </w:rPr>
+        <w:t xml:space="preserve"> Sans')</w:t>
       </w:r>
     </w:p>
     <w:p>
@@ -5789,7 +6710,25 @@
           <w:sz w:val="24"/>
           <w:szCs w:val="24"/>
         </w:rPr>
-        <w:t>c = linspecer(2);</w:t>
+        <w:t xml:space="preserve">c = </w:t>
+      </w:r>
+      <w:proofErr w:type="spellStart"/>
+      <w:r>
+        <w:rPr>
+          <w:rFonts w:ascii="SimSun" w:eastAsia="SimSun" w:hAnsi="SimSun"/>
+          <w:sz w:val="24"/>
+          <w:szCs w:val="24"/>
+        </w:rPr>
+        <w:t>linspecer</w:t>
+      </w:r>
+      <w:proofErr w:type="spellEnd"/>
+      <w:r>
+        <w:rPr>
+          <w:rFonts w:ascii="SimSun" w:eastAsia="SimSun" w:hAnsi="SimSun"/>
+          <w:sz w:val="24"/>
+          <w:szCs w:val="24"/>
+        </w:rPr>
+        <w:t>(2);</w:t>
       </w:r>
     </w:p>
     <w:p>
@@ -5817,56 +6756,156 @@
           <w:szCs w:val="24"/>
         </w:rPr>
       </w:pPr>
-      <w:r>
-        <w:rPr>
-          <w:rFonts w:ascii="SimSun" w:eastAsia="SimSun" w:hAnsi="SimSun"/>
-          <w:sz w:val="24"/>
-          <w:szCs w:val="24"/>
-        </w:rPr>
-        <w:t>aspect_ratio = size.*[6,4];</w:t>
-      </w:r>
-    </w:p>
-    <w:p>
-      <w:pPr>
-        <w:rPr>
-          <w:rFonts w:ascii="SimSun" w:eastAsia="SimSun" w:hAnsi="SimSun"/>
-          <w:sz w:val="24"/>
-          <w:szCs w:val="24"/>
-        </w:rPr>
-      </w:pPr>
-    </w:p>
-    <w:p>
-      <w:pPr>
-        <w:rPr>
-          <w:rFonts w:ascii="SimSun" w:eastAsia="SimSun" w:hAnsi="SimSun"/>
-          <w:sz w:val="24"/>
-          <w:szCs w:val="24"/>
-        </w:rPr>
-      </w:pPr>
-      <w:r>
-        <w:rPr>
-          <w:rFonts w:ascii="SimSun" w:eastAsia="SimSun" w:hAnsi="SimSun"/>
-          <w:sz w:val="24"/>
-          <w:szCs w:val="24"/>
-        </w:rPr>
-        <w:t>figure('Name','dark noise','units','inches','position',[0 0 aspect_ratio(1) aspect_ratio(2)])</w:t>
-      </w:r>
-    </w:p>
-    <w:p>
-      <w:pPr>
-        <w:rPr>
-          <w:rFonts w:ascii="SimSun" w:eastAsia="SimSun" w:hAnsi="SimSun"/>
-          <w:sz w:val="24"/>
-          <w:szCs w:val="24"/>
-        </w:rPr>
-      </w:pPr>
-      <w:r>
-        <w:rPr>
-          <w:rFonts w:ascii="SimSun" w:eastAsia="SimSun" w:hAnsi="SimSun"/>
-          <w:sz w:val="24"/>
-          <w:szCs w:val="24"/>
-        </w:rPr>
-        <w:t>loglog(x1, y1, 'color',c(1,:))</w:t>
+      <w:proofErr w:type="spellStart"/>
+      <w:r>
+        <w:rPr>
+          <w:rFonts w:ascii="SimSun" w:eastAsia="SimSun" w:hAnsi="SimSun"/>
+          <w:sz w:val="24"/>
+          <w:szCs w:val="24"/>
+        </w:rPr>
+        <w:t>aspect_ratio</w:t>
+      </w:r>
+      <w:proofErr w:type="spellEnd"/>
+      <w:r>
+        <w:rPr>
+          <w:rFonts w:ascii="SimSun" w:eastAsia="SimSun" w:hAnsi="SimSun"/>
+          <w:sz w:val="24"/>
+          <w:szCs w:val="24"/>
+        </w:rPr>
+        <w:t xml:space="preserve"> = size.*[6,4];</w:t>
+      </w:r>
+    </w:p>
+    <w:p>
+      <w:pPr>
+        <w:rPr>
+          <w:rFonts w:ascii="SimSun" w:eastAsia="SimSun" w:hAnsi="SimSun"/>
+          <w:sz w:val="24"/>
+          <w:szCs w:val="24"/>
+        </w:rPr>
+      </w:pPr>
+    </w:p>
+    <w:p>
+      <w:pPr>
+        <w:rPr>
+          <w:rFonts w:ascii="SimSun" w:eastAsia="SimSun" w:hAnsi="SimSun"/>
+          <w:sz w:val="24"/>
+          <w:szCs w:val="24"/>
+        </w:rPr>
+      </w:pPr>
+      <w:r>
+        <w:rPr>
+          <w:rFonts w:ascii="SimSun" w:eastAsia="SimSun" w:hAnsi="SimSun"/>
+          <w:sz w:val="24"/>
+          <w:szCs w:val="24"/>
+        </w:rPr>
+        <w:t>figure('</w:t>
+      </w:r>
+      <w:proofErr w:type="spellStart"/>
+      <w:r>
+        <w:rPr>
+          <w:rFonts w:ascii="SimSun" w:eastAsia="SimSun" w:hAnsi="SimSun"/>
+          <w:sz w:val="24"/>
+          <w:szCs w:val="24"/>
+        </w:rPr>
+        <w:t>Name','dark</w:t>
+      </w:r>
+      <w:proofErr w:type="spellEnd"/>
+      <w:r>
+        <w:rPr>
+          <w:rFonts w:ascii="SimSun" w:eastAsia="SimSun" w:hAnsi="SimSun"/>
+          <w:sz w:val="24"/>
+          <w:szCs w:val="24"/>
+        </w:rPr>
+        <w:t xml:space="preserve"> </w:t>
+      </w:r>
+      <w:proofErr w:type="spellStart"/>
+      <w:r>
+        <w:rPr>
+          <w:rFonts w:ascii="SimSun" w:eastAsia="SimSun" w:hAnsi="SimSun"/>
+          <w:sz w:val="24"/>
+          <w:szCs w:val="24"/>
+        </w:rPr>
+        <w:t>noise','units','inches','position</w:t>
+      </w:r>
+      <w:proofErr w:type="spellEnd"/>
+      <w:r>
+        <w:rPr>
+          <w:rFonts w:ascii="SimSun" w:eastAsia="SimSun" w:hAnsi="SimSun"/>
+          <w:sz w:val="24"/>
+          <w:szCs w:val="24"/>
+        </w:rPr>
+        <w:t xml:space="preserve">',[0 0 </w:t>
+      </w:r>
+      <w:proofErr w:type="spellStart"/>
+      <w:r>
+        <w:rPr>
+          <w:rFonts w:ascii="SimSun" w:eastAsia="SimSun" w:hAnsi="SimSun"/>
+          <w:sz w:val="24"/>
+          <w:szCs w:val="24"/>
+        </w:rPr>
+        <w:t>aspect_ratio</w:t>
+      </w:r>
+      <w:proofErr w:type="spellEnd"/>
+      <w:r>
+        <w:rPr>
+          <w:rFonts w:ascii="SimSun" w:eastAsia="SimSun" w:hAnsi="SimSun"/>
+          <w:sz w:val="24"/>
+          <w:szCs w:val="24"/>
+        </w:rPr>
+        <w:t xml:space="preserve">(1) </w:t>
+      </w:r>
+      <w:proofErr w:type="spellStart"/>
+      <w:r>
+        <w:rPr>
+          <w:rFonts w:ascii="SimSun" w:eastAsia="SimSun" w:hAnsi="SimSun"/>
+          <w:sz w:val="24"/>
+          <w:szCs w:val="24"/>
+        </w:rPr>
+        <w:t>aspect_ratio</w:t>
+      </w:r>
+      <w:proofErr w:type="spellEnd"/>
+      <w:r>
+        <w:rPr>
+          <w:rFonts w:ascii="SimSun" w:eastAsia="SimSun" w:hAnsi="SimSun"/>
+          <w:sz w:val="24"/>
+          <w:szCs w:val="24"/>
+        </w:rPr>
+        <w:t>(2)])</w:t>
+      </w:r>
+    </w:p>
+    <w:p>
+      <w:pPr>
+        <w:rPr>
+          <w:rFonts w:ascii="SimSun" w:eastAsia="SimSun" w:hAnsi="SimSun"/>
+          <w:sz w:val="24"/>
+          <w:szCs w:val="24"/>
+        </w:rPr>
+      </w:pPr>
+      <w:r>
+        <w:rPr>
+          <w:rFonts w:ascii="SimSun" w:eastAsia="SimSun" w:hAnsi="SimSun"/>
+          <w:sz w:val="24"/>
+          <w:szCs w:val="24"/>
+        </w:rPr>
+        <w:t>loglog(x1, y1, '</w:t>
+      </w:r>
+      <w:proofErr w:type="spellStart"/>
+      <w:r>
+        <w:rPr>
+          <w:rFonts w:ascii="SimSun" w:eastAsia="SimSun" w:hAnsi="SimSun"/>
+          <w:sz w:val="24"/>
+          <w:szCs w:val="24"/>
+        </w:rPr>
+        <w:t>color</w:t>
+      </w:r>
+      <w:proofErr w:type="spellEnd"/>
+      <w:r>
+        <w:rPr>
+          <w:rFonts w:ascii="SimSun" w:eastAsia="SimSun" w:hAnsi="SimSun"/>
+          <w:sz w:val="24"/>
+          <w:szCs w:val="24"/>
+        </w:rPr>
+        <w:t>',c(1,:))</w:t>
       </w:r>
     </w:p>
     <w:p>
@@ -5900,7 +6939,25 @@
           <w:sz w:val="24"/>
           <w:szCs w:val="24"/>
         </w:rPr>
-        <w:t>loglog(x2, y2, 'color',c(2,:))</w:t>
+        <w:t>loglog(x2, y2, '</w:t>
+      </w:r>
+      <w:proofErr w:type="spellStart"/>
+      <w:r>
+        <w:rPr>
+          <w:rFonts w:ascii="SimSun" w:eastAsia="SimSun" w:hAnsi="SimSun"/>
+          <w:sz w:val="24"/>
+          <w:szCs w:val="24"/>
+        </w:rPr>
+        <w:t>color</w:t>
+      </w:r>
+      <w:proofErr w:type="spellEnd"/>
+      <w:r>
+        <w:rPr>
+          <w:rFonts w:ascii="SimSun" w:eastAsia="SimSun" w:hAnsi="SimSun"/>
+          <w:sz w:val="24"/>
+          <w:szCs w:val="24"/>
+        </w:rPr>
+        <w:t>',c(2,:))</w:t>
       </w:r>
     </w:p>
     <w:p>
@@ -5945,30 +7002,68 @@
           <w:szCs w:val="24"/>
         </w:rPr>
       </w:pPr>
-      <w:r>
-        <w:rPr>
-          <w:rFonts w:ascii="SimSun" w:eastAsia="SimSun" w:hAnsi="SimSun"/>
-          <w:sz w:val="24"/>
-          <w:szCs w:val="24"/>
-        </w:rPr>
-        <w:t>xlabel('Frequency (Hz)')</w:t>
-      </w:r>
-    </w:p>
-    <w:p>
-      <w:pPr>
-        <w:rPr>
-          <w:rFonts w:ascii="SimSun" w:eastAsia="SimSun" w:hAnsi="SimSun"/>
-          <w:sz w:val="24"/>
-          <w:szCs w:val="24"/>
-        </w:rPr>
-      </w:pPr>
-      <w:r>
-        <w:rPr>
-          <w:rFonts w:ascii="SimSun" w:eastAsia="SimSun" w:hAnsi="SimSun"/>
-          <w:sz w:val="24"/>
-          <w:szCs w:val="24"/>
-        </w:rPr>
-        <w:t>ylabel('I_r_m_s/\surd(Hz)')</w:t>
+      <w:proofErr w:type="spellStart"/>
+      <w:r>
+        <w:rPr>
+          <w:rFonts w:ascii="SimSun" w:eastAsia="SimSun" w:hAnsi="SimSun"/>
+          <w:sz w:val="24"/>
+          <w:szCs w:val="24"/>
+        </w:rPr>
+        <w:t>xlabel</w:t>
+      </w:r>
+      <w:proofErr w:type="spellEnd"/>
+      <w:r>
+        <w:rPr>
+          <w:rFonts w:ascii="SimSun" w:eastAsia="SimSun" w:hAnsi="SimSun"/>
+          <w:sz w:val="24"/>
+          <w:szCs w:val="24"/>
+        </w:rPr>
+        <w:t>('Frequency (Hz)')</w:t>
+      </w:r>
+    </w:p>
+    <w:p>
+      <w:pPr>
+        <w:rPr>
+          <w:rFonts w:ascii="SimSun" w:eastAsia="SimSun" w:hAnsi="SimSun"/>
+          <w:sz w:val="24"/>
+          <w:szCs w:val="24"/>
+        </w:rPr>
+      </w:pPr>
+      <w:proofErr w:type="spellStart"/>
+      <w:r>
+        <w:rPr>
+          <w:rFonts w:ascii="SimSun" w:eastAsia="SimSun" w:hAnsi="SimSun"/>
+          <w:sz w:val="24"/>
+          <w:szCs w:val="24"/>
+        </w:rPr>
+        <w:t>ylabel</w:t>
+      </w:r>
+      <w:proofErr w:type="spellEnd"/>
+      <w:r>
+        <w:rPr>
+          <w:rFonts w:ascii="SimSun" w:eastAsia="SimSun" w:hAnsi="SimSun"/>
+          <w:sz w:val="24"/>
+          <w:szCs w:val="24"/>
+        </w:rPr>
+        <w:t>('</w:t>
+      </w:r>
+      <w:proofErr w:type="spellStart"/>
+      <w:r>
+        <w:rPr>
+          <w:rFonts w:ascii="SimSun" w:eastAsia="SimSun" w:hAnsi="SimSun"/>
+          <w:sz w:val="24"/>
+          <w:szCs w:val="24"/>
+        </w:rPr>
+        <w:t>I_r_m_s</w:t>
+      </w:r>
+      <w:proofErr w:type="spellEnd"/>
+      <w:r>
+        <w:rPr>
+          <w:rFonts w:ascii="SimSun" w:eastAsia="SimSun" w:hAnsi="SimSun"/>
+          <w:sz w:val="24"/>
+          <w:szCs w:val="24"/>
+        </w:rPr>
+        <w:t>/\surd(Hz)')</w:t>
       </w:r>
     </w:p>
     <w:p>
@@ -5986,16 +7081,9 @@
           <w:sz w:val="24"/>
           <w:szCs w:val="24"/>
         </w:rPr>
-        <w:t>set(gca,</w:t>
-      </w:r>
-      <w:r>
-        <w:rPr>
-          <w:rFonts w:ascii="SimSun" w:eastAsia="SimSun" w:hAnsi="SimSun" w:cs="Courier New"/>
-          <w:sz w:val="24"/>
-          <w:szCs w:val="24"/>
-        </w:rPr>
-        <w:t>'fontname','DejaVu Sans'</w:t>
-      </w:r>
+        <w:t>set(</w:t>
+      </w:r>
+      <w:proofErr w:type="spellStart"/>
       <w:r>
         <w:rPr>
           <w:rFonts w:ascii="SimSun" w:eastAsia="SimSun" w:hAnsi="SimSun" w:cs="Courier New"/>
@@ -6003,6 +7091,69 @@
           <w:sz w:val="24"/>
           <w:szCs w:val="24"/>
         </w:rPr>
+        <w:t>gca</w:t>
+      </w:r>
+      <w:proofErr w:type="spellEnd"/>
+      <w:r>
+        <w:rPr>
+          <w:rFonts w:ascii="SimSun" w:eastAsia="SimSun" w:hAnsi="SimSun" w:cs="Courier New"/>
+          <w:color w:val="000000"/>
+          <w:sz w:val="24"/>
+          <w:szCs w:val="24"/>
+        </w:rPr>
+        <w:t>,</w:t>
+      </w:r>
+      <w:r>
+        <w:rPr>
+          <w:rFonts w:ascii="SimSun" w:eastAsia="SimSun" w:hAnsi="SimSun" w:cs="Courier New"/>
+          <w:sz w:val="24"/>
+          <w:szCs w:val="24"/>
+        </w:rPr>
+        <w:t>'</w:t>
+      </w:r>
+      <w:proofErr w:type="spellStart"/>
+      <w:r>
+        <w:rPr>
+          <w:rFonts w:ascii="SimSun" w:eastAsia="SimSun" w:hAnsi="SimSun" w:cs="Courier New"/>
+          <w:sz w:val="24"/>
+          <w:szCs w:val="24"/>
+        </w:rPr>
+        <w:t>fontname</w:t>
+      </w:r>
+      <w:proofErr w:type="spellEnd"/>
+      <w:r>
+        <w:rPr>
+          <w:rFonts w:ascii="SimSun" w:eastAsia="SimSun" w:hAnsi="SimSun" w:cs="Courier New"/>
+          <w:sz w:val="24"/>
+          <w:szCs w:val="24"/>
+        </w:rPr>
+        <w:t>','</w:t>
+      </w:r>
+      <w:proofErr w:type="spellStart"/>
+      <w:r>
+        <w:rPr>
+          <w:rFonts w:ascii="SimSun" w:eastAsia="SimSun" w:hAnsi="SimSun" w:cs="Courier New"/>
+          <w:sz w:val="24"/>
+          <w:szCs w:val="24"/>
+        </w:rPr>
+        <w:t>DejaVu</w:t>
+      </w:r>
+      <w:proofErr w:type="spellEnd"/>
+      <w:r>
+        <w:rPr>
+          <w:rFonts w:ascii="SimSun" w:eastAsia="SimSun" w:hAnsi="SimSun" w:cs="Courier New"/>
+          <w:sz w:val="24"/>
+          <w:szCs w:val="24"/>
+        </w:rPr>
+        <w:t xml:space="preserve"> Sans'</w:t>
+      </w:r>
+      <w:r>
+        <w:rPr>
+          <w:rFonts w:ascii="SimSun" w:eastAsia="SimSun" w:hAnsi="SimSun" w:cs="Courier New"/>
+          <w:color w:val="000000"/>
+          <w:sz w:val="24"/>
+          <w:szCs w:val="24"/>
+        </w:rPr>
         <w:t>)</w:t>
       </w:r>
     </w:p>
@@ -6054,7 +7205,26 @@
           <w:sz w:val="24"/>
           <w:szCs w:val="24"/>
         </w:rPr>
-        <w:t>print('Noise_low_f','-depsc')</w:t>
+        <w:lastRenderedPageBreak/>
+        <w:t>print('Noise_low_f','-</w:t>
+      </w:r>
+      <w:proofErr w:type="spellStart"/>
+      <w:r>
+        <w:rPr>
+          <w:rFonts w:ascii="SimSun" w:eastAsia="SimSun" w:hAnsi="SimSun"/>
+          <w:sz w:val="24"/>
+          <w:szCs w:val="24"/>
+        </w:rPr>
+        <w:t>depsc</w:t>
+      </w:r>
+      <w:proofErr w:type="spellEnd"/>
+      <w:r>
+        <w:rPr>
+          <w:rFonts w:ascii="SimSun" w:eastAsia="SimSun" w:hAnsi="SimSun"/>
+          <w:sz w:val="24"/>
+          <w:szCs w:val="24"/>
+        </w:rPr>
+        <w:t>')</w:t>
       </w:r>
     </w:p>
     <w:p>
@@ -6080,7 +7250,6 @@
           <w:sz w:val="24"/>
           <w:szCs w:val="24"/>
         </w:rPr>
-        <w:lastRenderedPageBreak/>
         <w:t>Circuits</w:t>
       </w:r>
     </w:p>
@@ -6161,7 +7330,23 @@
           <w:sz w:val="24"/>
           <w:szCs w:val="24"/>
         </w:rPr>
-        <w:t>have gnd at the bottom of the diagram.</w:t>
+        <w:t xml:space="preserve">have </w:t>
+      </w:r>
+      <w:proofErr w:type="spellStart"/>
+      <w:r>
+        <w:rPr>
+          <w:sz w:val="24"/>
+          <w:szCs w:val="24"/>
+        </w:rPr>
+        <w:t>gnd</w:t>
+      </w:r>
+      <w:proofErr w:type="spellEnd"/>
+      <w:r>
+        <w:rPr>
+          <w:sz w:val="24"/>
+          <w:szCs w:val="24"/>
+        </w:rPr>
+        <w:t xml:space="preserve"> at the bottom of the diagram.</w:t>
       </w:r>
     </w:p>
     <w:p>

</xml_diff>

<commit_message>
Edit level 5 of bhd chapter 2
</commit_message>
<xml_diff>
--- a/Structuring.docx
+++ b/Structuring.docx
@@ -175,43 +175,7 @@
           <w:sz w:val="24"/>
           <w:szCs w:val="24"/>
         </w:rPr>
-        <w:t xml:space="preserve">. The writing at this point may be ‘stream of </w:t>
-      </w:r>
-      <w:proofErr w:type="spellStart"/>
-      <w:r>
-        <w:rPr>
-          <w:rFonts w:cstheme="minorHAnsi"/>
-          <w:sz w:val="24"/>
-          <w:szCs w:val="24"/>
-        </w:rPr>
-        <w:t>conciouness</w:t>
-      </w:r>
-      <w:proofErr w:type="spellEnd"/>
-      <w:r>
-        <w:rPr>
-          <w:rFonts w:cstheme="minorHAnsi"/>
-          <w:sz w:val="24"/>
-          <w:szCs w:val="24"/>
-        </w:rPr>
-        <w:t>`-</w:t>
-      </w:r>
-      <w:proofErr w:type="spellStart"/>
-      <w:r>
-        <w:rPr>
-          <w:rFonts w:cstheme="minorHAnsi"/>
-          <w:sz w:val="24"/>
-          <w:szCs w:val="24"/>
-        </w:rPr>
-        <w:t>esk</w:t>
-      </w:r>
-      <w:proofErr w:type="spellEnd"/>
-      <w:r>
-        <w:rPr>
-          <w:rFonts w:cstheme="minorHAnsi"/>
-          <w:sz w:val="24"/>
-          <w:szCs w:val="24"/>
-        </w:rPr>
-        <w:t xml:space="preserve">, but it should have had an attempt at making it clear. </w:t>
+        <w:t xml:space="preserve">. The writing at this point may be ‘stream of conciouness`-esk, but it should have had an attempt at making it clear. </w:t>
       </w:r>
       <w:r>
         <w:rPr>
@@ -602,25 +566,7 @@
           <w:sz w:val="24"/>
           <w:szCs w:val="24"/>
         </w:rPr>
-        <w:t>word level. This involves checking the spellings of words (</w:t>
-      </w:r>
-      <w:proofErr w:type="spellStart"/>
-      <w:r>
-        <w:rPr>
-          <w:rFonts w:cstheme="minorHAnsi"/>
-          <w:sz w:val="24"/>
-          <w:szCs w:val="24"/>
-        </w:rPr>
-        <w:t>eg.</w:t>
-      </w:r>
-      <w:proofErr w:type="spellEnd"/>
-      <w:r>
-        <w:rPr>
-          <w:rFonts w:cstheme="minorHAnsi"/>
-          <w:sz w:val="24"/>
-          <w:szCs w:val="24"/>
-        </w:rPr>
-        <w:t xml:space="preserve"> Effect or affect). The</w:t>
+        <w:t>word level. This involves checking the spellings of words (eg. Effect or affect). The</w:t>
       </w:r>
       <w:r>
         <w:rPr>
@@ -1294,25 +1240,7 @@
           <w:sz w:val="24"/>
           <w:szCs w:val="24"/>
         </w:rPr>
-        <w:t xml:space="preserve"> </w:t>
-      </w:r>
-      <w:proofErr w:type="spellStart"/>
-      <w:r>
-        <w:rPr>
-          <w:rFonts w:cstheme="minorHAnsi"/>
-          <w:sz w:val="24"/>
-          <w:szCs w:val="24"/>
-        </w:rPr>
-        <w:t>Its</w:t>
-      </w:r>
-      <w:proofErr w:type="spellEnd"/>
-      <w:r>
-        <w:rPr>
-          <w:rFonts w:cstheme="minorHAnsi"/>
-          <w:sz w:val="24"/>
-          <w:szCs w:val="24"/>
-        </w:rPr>
-        <w:t xml:space="preserve"> hard to miss out ones you need. Err on the side of caution.</w:t>
+        <w:t xml:space="preserve"> Its hard to miss out ones you need. Err on the side of caution.</w:t>
       </w:r>
       <w:r>
         <w:rPr>
@@ -1654,23 +1582,13 @@
           <w:szCs w:val="24"/>
         </w:rPr>
       </w:pPr>
-      <w:proofErr w:type="spellStart"/>
-      <w:r>
-        <w:rPr>
-          <w:rFonts w:cstheme="minorHAnsi"/>
-          <w:sz w:val="24"/>
-          <w:szCs w:val="24"/>
-        </w:rPr>
-        <w:t>E.g</w:t>
-      </w:r>
-      <w:proofErr w:type="spellEnd"/>
-      <w:r>
-        <w:rPr>
-          <w:rFonts w:cstheme="minorHAnsi"/>
-          <w:sz w:val="24"/>
-          <w:szCs w:val="24"/>
-        </w:rPr>
-        <w:t xml:space="preserve"> the rat is dead.</w:t>
+      <w:r>
+        <w:rPr>
+          <w:rFonts w:cstheme="minorHAnsi"/>
+          <w:sz w:val="24"/>
+          <w:szCs w:val="24"/>
+        </w:rPr>
+        <w:t>E.g the rat is dead.</w:t>
       </w:r>
     </w:p>
     <w:p>
@@ -1730,23 +1648,13 @@
           <w:szCs w:val="24"/>
         </w:rPr>
       </w:pPr>
-      <w:proofErr w:type="spellStart"/>
-      <w:r>
-        <w:rPr>
-          <w:rFonts w:cstheme="minorHAnsi"/>
-          <w:sz w:val="24"/>
-          <w:szCs w:val="24"/>
-        </w:rPr>
-        <w:t>E.g</w:t>
-      </w:r>
-      <w:proofErr w:type="spellEnd"/>
-      <w:r>
-        <w:rPr>
-          <w:rFonts w:cstheme="minorHAnsi"/>
-          <w:sz w:val="24"/>
-          <w:szCs w:val="24"/>
-        </w:rPr>
-        <w:t xml:space="preserve"> </w:t>
+      <w:r>
+        <w:rPr>
+          <w:rFonts w:cstheme="minorHAnsi"/>
+          <w:sz w:val="24"/>
+          <w:szCs w:val="24"/>
+        </w:rPr>
+        <w:t xml:space="preserve">E.g </w:t>
       </w:r>
       <w:r>
         <w:rPr>
@@ -2087,25 +1995,7 @@
           <w:sz w:val="24"/>
           <w:szCs w:val="24"/>
         </w:rPr>
-        <w:t xml:space="preserve"> are indicated by ’and’ and both sides should stand alone as main clauses. This means no comma is required between the two clauses (around the </w:t>
-      </w:r>
-      <w:proofErr w:type="spellStart"/>
-      <w:r>
-        <w:rPr>
-          <w:rFonts w:cstheme="minorHAnsi"/>
-          <w:sz w:val="24"/>
-          <w:szCs w:val="24"/>
-        </w:rPr>
-        <w:t>and</w:t>
-      </w:r>
-      <w:proofErr w:type="spellEnd"/>
-      <w:r>
-        <w:rPr>
-          <w:rFonts w:cstheme="minorHAnsi"/>
-          <w:sz w:val="24"/>
-          <w:szCs w:val="24"/>
-        </w:rPr>
-        <w:t>).</w:t>
+        <w:t xml:space="preserve"> are indicated by ’and’ and both sides should stand alone as main clauses. This means no comma is required between the two clauses (around the and).</w:t>
       </w:r>
     </w:p>
     <w:p>
@@ -2312,27 +2202,7 @@
           <w:sz w:val="24"/>
           <w:szCs w:val="24"/>
         </w:rPr>
-        <w:t xml:space="preserve">Object, verb, </w:t>
-      </w:r>
-      <w:proofErr w:type="spellStart"/>
-      <w:r>
-        <w:rPr>
-          <w:rFonts w:cstheme="minorHAnsi"/>
-          <w:color w:val="70AD47" w:themeColor="accent6"/>
-          <w:sz w:val="24"/>
-          <w:szCs w:val="24"/>
-        </w:rPr>
-        <w:t>subject,verb,subject</w:t>
-      </w:r>
-      <w:proofErr w:type="spellEnd"/>
-      <w:r>
-        <w:rPr>
-          <w:rFonts w:cstheme="minorHAnsi"/>
-          <w:color w:val="70AD47" w:themeColor="accent6"/>
-          <w:sz w:val="24"/>
-          <w:szCs w:val="24"/>
-        </w:rPr>
-        <w:t>.</w:t>
+        <w:t>Object, verb, subject,verb,subject.</w:t>
       </w:r>
     </w:p>
     <w:p>
@@ -3006,25 +2876,7 @@
           <w:sz w:val="24"/>
           <w:szCs w:val="24"/>
         </w:rPr>
-        <w:t xml:space="preserve"> </w:t>
-      </w:r>
-      <w:proofErr w:type="spellStart"/>
-      <w:r>
-        <w:rPr>
-          <w:rFonts w:cstheme="minorHAnsi"/>
-          <w:sz w:val="24"/>
-          <w:szCs w:val="24"/>
-        </w:rPr>
-        <w:t>e.g</w:t>
-      </w:r>
-      <w:proofErr w:type="spellEnd"/>
-      <w:r>
-        <w:rPr>
-          <w:rFonts w:cstheme="minorHAnsi"/>
-          <w:sz w:val="24"/>
-          <w:szCs w:val="24"/>
-        </w:rPr>
-        <w:t>:</w:t>
+        <w:t xml:space="preserve"> e.g:</w:t>
       </w:r>
     </w:p>
     <w:p>
@@ -4055,22 +3907,13 @@
           <w:szCs w:val="24"/>
         </w:rPr>
       </w:pPr>
-      <w:proofErr w:type="spellStart"/>
       <w:r>
         <w:rPr>
           <w:sz w:val="24"/>
           <w:szCs w:val="24"/>
         </w:rPr>
         <w:lastRenderedPageBreak/>
-        <w:t>Ctrl+f</w:t>
-      </w:r>
-      <w:proofErr w:type="spellEnd"/>
-      <w:r>
-        <w:rPr>
-          <w:sz w:val="24"/>
-          <w:szCs w:val="24"/>
-        </w:rPr>
-        <w:t xml:space="preserve"> 1, 2, 3, 4, 5, 6, 7, 8, 9 and 10, replace with one, two, three …</w:t>
+        <w:t>Ctrl+f 1, 2, 3, 4, 5, 6, 7, 8, 9 and 10, replace with one, two, three …</w:t>
       </w:r>
     </w:p>
     <w:p>
@@ -4085,21 +3928,12 @@
           <w:szCs w:val="24"/>
         </w:rPr>
       </w:pPr>
-      <w:proofErr w:type="spellStart"/>
-      <w:r>
-        <w:rPr>
-          <w:sz w:val="24"/>
-          <w:szCs w:val="24"/>
-        </w:rPr>
-        <w:t>Ctrl+f</w:t>
-      </w:r>
-      <w:proofErr w:type="spellEnd"/>
-      <w:r>
-        <w:rPr>
-          <w:sz w:val="24"/>
-          <w:szCs w:val="24"/>
-        </w:rPr>
-        <w:t xml:space="preserve"> effect and affect</w:t>
+      <w:r>
+        <w:rPr>
+          <w:sz w:val="24"/>
+          <w:szCs w:val="24"/>
+        </w:rPr>
+        <w:t>Ctrl+f effect and affect</w:t>
       </w:r>
     </w:p>
     <w:p>
@@ -4114,38 +3948,20 @@
           <w:szCs w:val="24"/>
         </w:rPr>
       </w:pPr>
-      <w:proofErr w:type="spellStart"/>
-      <w:r>
-        <w:rPr>
-          <w:sz w:val="24"/>
-          <w:szCs w:val="24"/>
-        </w:rPr>
-        <w:t>Ctrl+f</w:t>
-      </w:r>
-      <w:proofErr w:type="spellEnd"/>
-      <w:r>
-        <w:rPr>
-          <w:sz w:val="24"/>
-          <w:szCs w:val="24"/>
-        </w:rPr>
-        <w:t xml:space="preserve"> </w:t>
-      </w:r>
-      <w:r>
-        <w:rPr>
-          <w:sz w:val="24"/>
-          <w:szCs w:val="24"/>
-        </w:rPr>
-        <w:t xml:space="preserve">the </w:t>
-      </w:r>
-      <w:proofErr w:type="spellStart"/>
-      <w:r>
-        <w:rPr>
-          <w:sz w:val="24"/>
-          <w:szCs w:val="24"/>
-        </w:rPr>
-        <w:t>the</w:t>
-      </w:r>
-      <w:proofErr w:type="spellEnd"/>
+      <w:r>
+        <w:rPr>
+          <w:sz w:val="24"/>
+          <w:szCs w:val="24"/>
+        </w:rPr>
+        <w:t xml:space="preserve">Ctrl+f </w:t>
+      </w:r>
+      <w:r>
+        <w:rPr>
+          <w:sz w:val="24"/>
+          <w:szCs w:val="24"/>
+        </w:rPr>
+        <w:t>the the</w:t>
+      </w:r>
     </w:p>
     <w:p>
       <w:pPr>
@@ -4204,17 +4020,8 @@
           <w:sz w:val="24"/>
           <w:szCs w:val="24"/>
         </w:rPr>
-        <w:t xml:space="preserve">Beam splitter, not </w:t>
-      </w:r>
-      <w:proofErr w:type="spellStart"/>
-      <w:r>
-        <w:rPr>
-          <w:sz w:val="24"/>
-          <w:szCs w:val="24"/>
-        </w:rPr>
-        <w:t>beamsplitter</w:t>
-      </w:r>
-      <w:proofErr w:type="spellEnd"/>
+        <w:t>Beam splitter, not beamsplitter</w:t>
+      </w:r>
     </w:p>
     <w:p>
       <w:pPr>
@@ -4432,6 +4239,26 @@
       <w:pPr>
         <w:pStyle w:val="ListParagraph"/>
         <w:numPr>
+          <w:ilvl w:val="1"/>
+          <w:numId w:val="6"/>
+        </w:numPr>
+        <w:rPr>
+          <w:sz w:val="24"/>
+          <w:szCs w:val="24"/>
+        </w:rPr>
+      </w:pPr>
+      <w:r>
+        <w:rPr>
+          <w:sz w:val="24"/>
+          <w:szCs w:val="24"/>
+        </w:rPr>
+        <w:t>If unsure, check if the sentence has another verb in it.</w:t>
+      </w:r>
+    </w:p>
+    <w:p>
+      <w:pPr>
+        <w:pStyle w:val="ListParagraph"/>
+        <w:numPr>
           <w:ilvl w:val="0"/>
           <w:numId w:val="6"/>
         </w:numPr>
@@ -4472,23 +4299,7 @@
           <w:sz w:val="24"/>
           <w:szCs w:val="24"/>
         </w:rPr>
-        <w:t>Lots end in ‘</w:t>
-      </w:r>
-      <w:proofErr w:type="spellStart"/>
-      <w:r>
-        <w:rPr>
-          <w:sz w:val="24"/>
-          <w:szCs w:val="24"/>
-        </w:rPr>
-        <w:t>ly</w:t>
-      </w:r>
-      <w:proofErr w:type="spellEnd"/>
-      <w:r>
-        <w:rPr>
-          <w:sz w:val="24"/>
-          <w:szCs w:val="24"/>
-        </w:rPr>
-        <w:t>’</w:t>
+        <w:t>Lots end in ‘ly’</w:t>
       </w:r>
     </w:p>
     <w:p>
@@ -4638,23 +4449,7 @@
           <w:sz w:val="24"/>
           <w:szCs w:val="24"/>
         </w:rPr>
-        <w:t xml:space="preserve">Check </w:t>
-      </w:r>
-      <w:proofErr w:type="spellStart"/>
-      <w:r>
-        <w:rPr>
-          <w:sz w:val="24"/>
-          <w:szCs w:val="24"/>
-        </w:rPr>
-        <w:t>ngram</w:t>
-      </w:r>
-      <w:proofErr w:type="spellEnd"/>
-      <w:r>
-        <w:rPr>
-          <w:sz w:val="24"/>
-          <w:szCs w:val="24"/>
-        </w:rPr>
-        <w:t xml:space="preserve"> viewer if unsure.</w:t>
+        <w:t>Check ngram viewer if unsure.</w:t>
       </w:r>
     </w:p>
     <w:p>
@@ -4696,21 +4491,12 @@
           <w:szCs w:val="24"/>
         </w:rPr>
       </w:pPr>
-      <w:proofErr w:type="spellStart"/>
-      <w:r>
-        <w:rPr>
-          <w:sz w:val="24"/>
-          <w:szCs w:val="24"/>
-        </w:rPr>
-        <w:t>E.g</w:t>
-      </w:r>
-      <w:proofErr w:type="spellEnd"/>
-      <w:r>
-        <w:rPr>
-          <w:sz w:val="24"/>
-          <w:szCs w:val="24"/>
-        </w:rPr>
-        <w:t xml:space="preserve"> </w:t>
+      <w:r>
+        <w:rPr>
+          <w:sz w:val="24"/>
+          <w:szCs w:val="24"/>
+        </w:rPr>
+        <w:t xml:space="preserve">E.g </w:t>
       </w:r>
       <w:r>
         <w:rPr>
@@ -4751,23 +4537,7 @@
           <w:sz w:val="24"/>
           <w:szCs w:val="24"/>
         </w:rPr>
-        <w:t xml:space="preserve">Current detector = </w:t>
-      </w:r>
-      <w:proofErr w:type="spellStart"/>
-      <w:r>
-        <w:rPr>
-          <w:sz w:val="24"/>
-          <w:szCs w:val="24"/>
-        </w:rPr>
-        <w:t>aLIGO</w:t>
-      </w:r>
-      <w:proofErr w:type="spellEnd"/>
-      <w:r>
-        <w:rPr>
-          <w:sz w:val="24"/>
-          <w:szCs w:val="24"/>
-        </w:rPr>
-        <w:t>, future detector = LIGO A+, the detector in a general abstract sense = LIGO</w:t>
+        <w:t>Current detector = aLIGO, future detector = LIGO A+, the detector in a general abstract sense = LIGO</w:t>
       </w:r>
     </w:p>
     <w:p>
@@ -4911,6 +4681,33 @@
           <w:szCs w:val="24"/>
         </w:rPr>
         <w:t xml:space="preserve"> signs.</w:t>
+      </w:r>
+    </w:p>
+    <w:p>
+      <w:pPr>
+        <w:pStyle w:val="ListParagraph"/>
+        <w:numPr>
+          <w:ilvl w:val="0"/>
+          <w:numId w:val="6"/>
+        </w:numPr>
+        <w:rPr>
+          <w:sz w:val="24"/>
+          <w:szCs w:val="24"/>
+        </w:rPr>
+      </w:pPr>
+      <w:r>
+        <w:rPr>
+          <w:sz w:val="24"/>
+          <w:szCs w:val="24"/>
+        </w:rPr>
+        <w:t>Axes is the plural of axis</w:t>
+      </w:r>
+      <w:r>
+        <w:rPr>
+          <w:sz w:val="24"/>
+          <w:szCs w:val="24"/>
+        </w:rPr>
+        <w:t>.</w:t>
       </w:r>
     </w:p>
     <w:p>
@@ -4980,39 +4777,7 @@
           <w:sz w:val="24"/>
           <w:szCs w:val="24"/>
         </w:rPr>
-        <w:t>Figures shall be saved as eps when using matplotlib or '</w:t>
-      </w:r>
-      <w:proofErr w:type="spellStart"/>
-      <w:r>
-        <w:rPr>
-          <w:sz w:val="24"/>
-          <w:szCs w:val="24"/>
-        </w:rPr>
-        <w:t>epsc</w:t>
-      </w:r>
-      <w:proofErr w:type="spellEnd"/>
-      <w:r>
-        <w:rPr>
-          <w:sz w:val="24"/>
-          <w:szCs w:val="24"/>
-        </w:rPr>
-        <w:t xml:space="preserve">' when using </w:t>
-      </w:r>
-      <w:proofErr w:type="spellStart"/>
-      <w:r>
-        <w:rPr>
-          <w:sz w:val="24"/>
-          <w:szCs w:val="24"/>
-        </w:rPr>
-        <w:t>matlab</w:t>
-      </w:r>
-      <w:proofErr w:type="spellEnd"/>
-      <w:r>
-        <w:rPr>
-          <w:sz w:val="24"/>
-          <w:szCs w:val="24"/>
-        </w:rPr>
-        <w:t>. This is to prevent a latex warning.</w:t>
+        <w:t>Figures shall be saved as eps when using matplotlib or 'epsc' when using matlab. This is to prevent a latex warning.</w:t>
       </w:r>
     </w:p>
     <w:p>
@@ -5066,23 +4831,7 @@
           <w:sz w:val="24"/>
           <w:szCs w:val="24"/>
         </w:rPr>
-        <w:t xml:space="preserve">Figure names shall be 'chapter </w:t>
-      </w:r>
-      <w:proofErr w:type="spellStart"/>
-      <w:r>
-        <w:rPr>
-          <w:sz w:val="24"/>
-          <w:szCs w:val="24"/>
-        </w:rPr>
-        <w:t>description'_chapter_'figure</w:t>
-      </w:r>
-      <w:proofErr w:type="spellEnd"/>
-      <w:r>
-        <w:rPr>
-          <w:sz w:val="24"/>
-          <w:szCs w:val="24"/>
-        </w:rPr>
-        <w:t xml:space="preserve"> description'. For</w:t>
+        <w:t>Figure names shall be 'chapter description'_chapter_'figure description'. For</w:t>
       </w:r>
       <w:r>
         <w:rPr>
@@ -5096,23 +4845,7 @@
           <w:sz w:val="24"/>
           <w:szCs w:val="24"/>
         </w:rPr>
-        <w:t>example, '</w:t>
-      </w:r>
-      <w:proofErr w:type="spellStart"/>
-      <w:r>
-        <w:rPr>
-          <w:sz w:val="24"/>
-          <w:szCs w:val="24"/>
-        </w:rPr>
-        <w:t>sim_chapter_Zoom_in_ETM_tuning</w:t>
-      </w:r>
-      <w:proofErr w:type="spellEnd"/>
-      <w:r>
-        <w:rPr>
-          <w:sz w:val="24"/>
-          <w:szCs w:val="24"/>
-        </w:rPr>
-        <w:t>' refers to the figure being in the</w:t>
+        <w:t>example, 'sim_chapter_Zoom_in_ETM_tuning' refers to the figure being in the</w:t>
       </w:r>
       <w:r>
         <w:rPr>
@@ -5166,23 +4899,8 @@
           <w:sz w:val="24"/>
           <w:szCs w:val="24"/>
         </w:rPr>
-        <w:t xml:space="preserve">Are all lines visible/distinguishable? Changing thickness and </w:t>
-      </w:r>
-      <w:proofErr w:type="spellStart"/>
-      <w:r>
-        <w:rPr>
-          <w:sz w:val="24"/>
-          <w:szCs w:val="24"/>
-        </w:rPr>
-        <w:t>linestyle</w:t>
-      </w:r>
-      <w:proofErr w:type="spellEnd"/>
-      <w:r>
-        <w:rPr>
-          <w:sz w:val="24"/>
-          <w:szCs w:val="24"/>
-        </w:rPr>
-        <w:t xml:space="preserve"> can help.</w:t>
+        <w:lastRenderedPageBreak/>
+        <w:t>Are all lines visible/distinguishable? Changing thickness and linestyle can help.</w:t>
       </w:r>
     </w:p>
     <w:p>
@@ -5202,23 +4920,7 @@
           <w:sz w:val="24"/>
           <w:szCs w:val="24"/>
         </w:rPr>
-        <w:t xml:space="preserve">Are the axis labelled? The label is a sentence, so normal sentence capitalisation should be used. If </w:t>
-      </w:r>
-      <w:proofErr w:type="spellStart"/>
-      <w:r>
-        <w:rPr>
-          <w:sz w:val="24"/>
-          <w:szCs w:val="24"/>
-        </w:rPr>
-        <w:t>its</w:t>
-      </w:r>
-      <w:proofErr w:type="spellEnd"/>
-      <w:r>
-        <w:rPr>
-          <w:sz w:val="24"/>
-          <w:szCs w:val="24"/>
-        </w:rPr>
-        <w:t xml:space="preserve"> just one word, use a capital letter.</w:t>
+        <w:t>Are the axis labelled? The label is a sentence, so normal sentence capitalisation should be used. If its just one word, use a capital letter.</w:t>
       </w:r>
     </w:p>
     <w:p>
@@ -5238,7 +4940,6 @@
           <w:sz w:val="24"/>
           <w:szCs w:val="24"/>
         </w:rPr>
-        <w:lastRenderedPageBreak/>
         <w:t>Capitalisation should follow normal grammar rules in the legend.</w:t>
       </w:r>
     </w:p>
@@ -5299,23 +5000,7 @@
           <w:sz w:val="24"/>
           <w:szCs w:val="24"/>
         </w:rPr>
-        <w:t xml:space="preserve">Are subscripts properly </w:t>
-      </w:r>
-      <w:proofErr w:type="spellStart"/>
-      <w:r>
-        <w:rPr>
-          <w:sz w:val="24"/>
-          <w:szCs w:val="24"/>
-        </w:rPr>
-        <w:t>typset</w:t>
-      </w:r>
-      <w:proofErr w:type="spellEnd"/>
-      <w:r>
-        <w:rPr>
-          <w:sz w:val="24"/>
-          <w:szCs w:val="24"/>
-        </w:rPr>
-        <w:t>?</w:t>
+        <w:t>Are subscripts properly typset?</w:t>
       </w:r>
     </w:p>
     <w:p>
@@ -5335,23 +5020,7 @@
           <w:sz w:val="24"/>
           <w:szCs w:val="24"/>
         </w:rPr>
-        <w:t>Have standard unit labels been used? A for amps, degree symbols instead of '</w:t>
-      </w:r>
-      <w:proofErr w:type="spellStart"/>
-      <w:r>
-        <w:rPr>
-          <w:sz w:val="24"/>
-          <w:szCs w:val="24"/>
-        </w:rPr>
-        <w:t>deg</w:t>
-      </w:r>
-      <w:proofErr w:type="spellEnd"/>
-      <w:r>
-        <w:rPr>
-          <w:sz w:val="24"/>
-          <w:szCs w:val="24"/>
-        </w:rPr>
-        <w:t>' etc.</w:t>
+        <w:t>Have standard unit labels been used? A for amps, degree symbols instead of 'deg' etc.</w:t>
       </w:r>
     </w:p>
     <w:p>
@@ -5391,23 +5060,7 @@
           <w:sz w:val="24"/>
           <w:szCs w:val="24"/>
         </w:rPr>
-        <w:t xml:space="preserve">Check for spelling mistakes! e.g. </w:t>
-      </w:r>
-      <w:proofErr w:type="spellStart"/>
-      <w:r>
-        <w:rPr>
-          <w:sz w:val="24"/>
-          <w:szCs w:val="24"/>
-        </w:rPr>
-        <w:t>freuqency</w:t>
-      </w:r>
-      <w:proofErr w:type="spellEnd"/>
-      <w:r>
-        <w:rPr>
-          <w:sz w:val="24"/>
-          <w:szCs w:val="24"/>
-        </w:rPr>
-        <w:t xml:space="preserve"> -&gt; frequency.</w:t>
+        <w:t>Check for spelling mistakes! e.g. freuqency -&gt; frequency.</w:t>
       </w:r>
     </w:p>
     <w:p>
@@ -5510,23 +5163,7 @@
           <w:sz w:val="24"/>
           <w:szCs w:val="24"/>
         </w:rPr>
-        <w:t xml:space="preserve">Standard </w:t>
-      </w:r>
-      <w:proofErr w:type="spellStart"/>
-      <w:r>
-        <w:rPr>
-          <w:sz w:val="24"/>
-          <w:szCs w:val="24"/>
-        </w:rPr>
-        <w:t>matlab</w:t>
-      </w:r>
-      <w:proofErr w:type="spellEnd"/>
-      <w:r>
-        <w:rPr>
-          <w:sz w:val="24"/>
-          <w:szCs w:val="24"/>
-        </w:rPr>
-        <w:t xml:space="preserve"> and matplotlib fonts will be used. The following examples give</w:t>
+        <w:t>Standard matlab and matplotlib fonts will be used. The following examples give</w:t>
       </w:r>
       <w:r>
         <w:rPr>
@@ -5629,23 +5266,7 @@
           <w:sz w:val="24"/>
           <w:szCs w:val="24"/>
         </w:rPr>
-        <w:t xml:space="preserve">have ‘shared axis’, only label one of the axis. If it’s the </w:t>
-      </w:r>
-      <w:proofErr w:type="spellStart"/>
-      <w:r>
-        <w:rPr>
-          <w:sz w:val="24"/>
-          <w:szCs w:val="24"/>
-        </w:rPr>
-        <w:t>xaxis</w:t>
-      </w:r>
-      <w:proofErr w:type="spellEnd"/>
-      <w:r>
-        <w:rPr>
-          <w:sz w:val="24"/>
-          <w:szCs w:val="24"/>
-        </w:rPr>
-        <w:t>, then label the bottom one. If it’s the y axis, label the left one.</w:t>
+        <w:t>have ‘shared axis’, only label one of the axis. If it’s the xaxis, then label the bottom one. If it’s the y axis, label the left one.</w:t>
       </w:r>
     </w:p>
     <w:p>
@@ -5702,195 +5323,342 @@
           <w:sz w:val="24"/>
           <w:szCs w:val="24"/>
         </w:rPr>
+        <w:t xml:space="preserve"> fontsize = </w:t>
+      </w:r>
+      <w:r>
+        <w:rPr>
+          <w:sz w:val="24"/>
+          <w:szCs w:val="24"/>
+        </w:rPr>
+        <w:t>11.5</w:t>
+      </w:r>
+      <w:r>
+        <w:rPr>
+          <w:sz w:val="24"/>
+          <w:szCs w:val="24"/>
+        </w:rPr>
+        <w:t xml:space="preserve"> on axis</w:t>
+      </w:r>
+      <w:r>
+        <w:rPr>
+          <w:sz w:val="24"/>
+          <w:szCs w:val="24"/>
+        </w:rPr>
+        <w:t xml:space="preserve">.  Font size set to </w:t>
+      </w:r>
+      <w:r>
+        <w:rPr>
+          <w:sz w:val="24"/>
+          <w:szCs w:val="24"/>
+        </w:rPr>
+        <w:t>10</w:t>
+      </w:r>
+      <w:r>
+        <w:rPr>
+          <w:sz w:val="24"/>
+          <w:szCs w:val="24"/>
+        </w:rPr>
+        <w:t xml:space="preserve"> in the legend</w:t>
+      </w:r>
+      <w:r>
+        <w:rPr>
+          <w:sz w:val="24"/>
+          <w:szCs w:val="24"/>
+        </w:rPr>
+        <w:t>. Axis set to default</w:t>
+      </w:r>
+      <w:r>
+        <w:rPr>
+          <w:sz w:val="24"/>
+          <w:szCs w:val="24"/>
+        </w:rPr>
+        <w:t>. If the legend looks too big, try splitting it into multiple columns. If this doesn’t work, reduce the</w:t>
+      </w:r>
+      <w:r>
+        <w:rPr>
+          <w:sz w:val="24"/>
+          <w:szCs w:val="24"/>
+        </w:rPr>
+        <w:t xml:space="preserve"> fontsize </w:t>
+      </w:r>
+      <w:r>
+        <w:rPr>
+          <w:sz w:val="24"/>
+          <w:szCs w:val="24"/>
+        </w:rPr>
+        <w:t>to</w:t>
+      </w:r>
+      <w:r>
+        <w:rPr>
+          <w:sz w:val="24"/>
+          <w:szCs w:val="24"/>
+        </w:rPr>
         <w:t xml:space="preserve"> </w:t>
       </w:r>
-      <w:proofErr w:type="spellStart"/>
-      <w:r>
-        <w:rPr>
-          <w:sz w:val="24"/>
-          <w:szCs w:val="24"/>
-        </w:rPr>
-        <w:t>fontsize</w:t>
-      </w:r>
-      <w:proofErr w:type="spellEnd"/>
-      <w:r>
-        <w:rPr>
-          <w:sz w:val="24"/>
-          <w:szCs w:val="24"/>
-        </w:rPr>
-        <w:t xml:space="preserve"> = </w:t>
-      </w:r>
-      <w:r>
-        <w:rPr>
-          <w:sz w:val="24"/>
-          <w:szCs w:val="24"/>
-        </w:rPr>
-        <w:t>11.5</w:t>
-      </w:r>
-      <w:r>
-        <w:rPr>
-          <w:sz w:val="24"/>
-          <w:szCs w:val="24"/>
-        </w:rPr>
-        <w:t xml:space="preserve"> on axis</w:t>
-      </w:r>
-      <w:r>
-        <w:rPr>
-          <w:sz w:val="24"/>
-          <w:szCs w:val="24"/>
-        </w:rPr>
-        <w:t xml:space="preserve">.  Font size set to </w:t>
-      </w:r>
-      <w:r>
-        <w:rPr>
-          <w:sz w:val="24"/>
-          <w:szCs w:val="24"/>
-        </w:rPr>
-        <w:t>10</w:t>
-      </w:r>
-      <w:r>
-        <w:rPr>
-          <w:sz w:val="24"/>
-          <w:szCs w:val="24"/>
-        </w:rPr>
-        <w:t xml:space="preserve"> in the legend</w:t>
-      </w:r>
-      <w:r>
-        <w:rPr>
-          <w:sz w:val="24"/>
-          <w:szCs w:val="24"/>
-        </w:rPr>
-        <w:t>. Axis set to default</w:t>
-      </w:r>
-      <w:r>
-        <w:rPr>
-          <w:sz w:val="24"/>
-          <w:szCs w:val="24"/>
-        </w:rPr>
-        <w:t>. If the legend looks too big, try splitting it into multiple columns. If this doesn’t work, reduce the</w:t>
-      </w:r>
-      <w:r>
-        <w:rPr>
-          <w:sz w:val="24"/>
-          <w:szCs w:val="24"/>
-        </w:rPr>
+      <w:r>
+        <w:rPr>
+          <w:sz w:val="24"/>
+          <w:szCs w:val="24"/>
+        </w:rPr>
+        <w:t>10 or 8</w:t>
+      </w:r>
+      <w:r>
+        <w:rPr>
+          <w:sz w:val="24"/>
+          <w:szCs w:val="24"/>
+        </w:rPr>
+        <w:t xml:space="preserve"> for</w:t>
+      </w:r>
+      <w:r>
+        <w:rPr>
+          <w:sz w:val="24"/>
+          <w:szCs w:val="24"/>
+        </w:rPr>
+        <w:t xml:space="preserve"> the</w:t>
+      </w:r>
+      <w:r>
+        <w:rPr>
+          <w:sz w:val="24"/>
+          <w:szCs w:val="24"/>
+        </w:rPr>
+        <w:t xml:space="preserve"> legend. </w:t>
+      </w:r>
+      <w:r>
+        <w:rPr>
+          <w:sz w:val="24"/>
+          <w:szCs w:val="24"/>
+        </w:rPr>
+        <w:t>Standard matplotlib colours are nice. Standard font is nice</w:t>
+      </w:r>
+    </w:p>
+    <w:p>
+      <w:pPr>
+        <w:rPr>
+          <w:sz w:val="24"/>
+          <w:szCs w:val="24"/>
+        </w:rPr>
+      </w:pPr>
+    </w:p>
+    <w:p>
+      <w:pPr>
+        <w:rPr>
+          <w:rFonts w:ascii="SimSun" w:eastAsia="SimSun" w:hAnsi="SimSun"/>
+          <w:sz w:val="24"/>
+          <w:szCs w:val="24"/>
+        </w:rPr>
+      </w:pPr>
+      <w:r>
+        <w:rPr>
+          <w:rFonts w:ascii="SimSun" w:eastAsia="SimSun" w:hAnsi="SimSun"/>
+          <w:sz w:val="24"/>
+          <w:szCs w:val="24"/>
+        </w:rPr>
+        <w:t>figure_size = (6,</w:t>
+      </w:r>
+      <w:r>
+        <w:rPr>
+          <w:rFonts w:ascii="SimSun" w:eastAsia="SimSun" w:hAnsi="SimSun"/>
+          <w:sz w:val="24"/>
+          <w:szCs w:val="24"/>
+        </w:rPr>
+        <w:t>3.5</w:t>
+      </w:r>
+      <w:r>
+        <w:rPr>
+          <w:rFonts w:ascii="SimSun" w:eastAsia="SimSun" w:hAnsi="SimSun"/>
+          <w:sz w:val="24"/>
+          <w:szCs w:val="24"/>
+        </w:rPr>
+        <w:t>)</w:t>
+      </w:r>
+    </w:p>
+    <w:p>
+      <w:pPr>
+        <w:rPr>
+          <w:rFonts w:ascii="SimSun" w:eastAsia="SimSun" w:hAnsi="SimSun"/>
+          <w:sz w:val="24"/>
+          <w:szCs w:val="24"/>
+        </w:rPr>
+      </w:pPr>
+      <w:r>
+        <w:rPr>
+          <w:rFonts w:ascii="SimSun" w:eastAsia="SimSun" w:hAnsi="SimSun"/>
+          <w:sz w:val="24"/>
+          <w:szCs w:val="24"/>
+        </w:rPr>
+        <w:t xml:space="preserve">plt.figure(figsize = figure_size,dpi = </w:t>
+      </w:r>
+      <w:r>
+        <w:rPr>
+          <w:rFonts w:ascii="SimSun" w:eastAsia="SimSun" w:hAnsi="SimSun"/>
+          <w:sz w:val="24"/>
+          <w:szCs w:val="24"/>
+        </w:rPr>
+        <w:t>15</w:t>
+      </w:r>
+      <w:r>
+        <w:rPr>
+          <w:rFonts w:ascii="SimSun" w:eastAsia="SimSun" w:hAnsi="SimSun"/>
+          <w:sz w:val="24"/>
+          <w:szCs w:val="24"/>
+        </w:rPr>
+        <w:t>0)</w:t>
+      </w:r>
+    </w:p>
+    <w:p>
+      <w:pPr>
+        <w:rPr>
+          <w:rFonts w:ascii="SimSun" w:eastAsia="SimSun" w:hAnsi="SimSun"/>
+          <w:sz w:val="24"/>
+          <w:szCs w:val="24"/>
+        </w:rPr>
+      </w:pPr>
+      <w:r>
+        <w:rPr>
+          <w:rFonts w:ascii="SimSun" w:eastAsia="SimSun" w:hAnsi="SimSun"/>
+          <w:sz w:val="24"/>
+          <w:szCs w:val="24"/>
+        </w:rPr>
+        <w:t>plt.plot(x,y,label = 'Name of line')</w:t>
+      </w:r>
+    </w:p>
+    <w:p>
+      <w:pPr>
+        <w:rPr>
+          <w:rFonts w:ascii="SimSun" w:eastAsia="SimSun" w:hAnsi="SimSun"/>
+          <w:sz w:val="24"/>
+          <w:szCs w:val="24"/>
+        </w:rPr>
+      </w:pPr>
+      <w:r>
+        <w:rPr>
+          <w:rFonts w:ascii="SimSun" w:eastAsia="SimSun" w:hAnsi="SimSun"/>
+          <w:sz w:val="24"/>
+          <w:szCs w:val="24"/>
+        </w:rPr>
+        <w:t>plt.legend(prop={'size': 8},loc = 'lower left')</w:t>
+      </w:r>
+    </w:p>
+    <w:p>
+      <w:pPr>
+        <w:rPr>
+          <w:rFonts w:ascii="SimSun" w:eastAsia="SimSun" w:hAnsi="SimSun"/>
+          <w:sz w:val="24"/>
+          <w:szCs w:val="24"/>
+        </w:rPr>
+      </w:pPr>
+      <w:r>
+        <w:rPr>
+          <w:rFonts w:ascii="SimSun" w:eastAsia="SimSun" w:hAnsi="SimSun"/>
+          <w:sz w:val="24"/>
+          <w:szCs w:val="24"/>
+        </w:rPr>
+        <w:t>plt.xlabel('x axis (units)'</w:t>
+      </w:r>
+      <w:r>
+        <w:rPr>
+          <w:rFonts w:ascii="SimSun" w:eastAsia="SimSun" w:hAnsi="SimSun"/>
+          <w:sz w:val="24"/>
+          <w:szCs w:val="24"/>
+        </w:rPr>
+        <w:t>,</w:t>
+      </w:r>
+      <w:r>
         <w:t xml:space="preserve"> </w:t>
       </w:r>
-      <w:proofErr w:type="spellStart"/>
-      <w:r>
-        <w:rPr>
-          <w:sz w:val="24"/>
-          <w:szCs w:val="24"/>
-        </w:rPr>
-        <w:t>fontsize</w:t>
-      </w:r>
-      <w:proofErr w:type="spellEnd"/>
-      <w:r>
-        <w:rPr>
-          <w:sz w:val="24"/>
-          <w:szCs w:val="24"/>
-        </w:rPr>
+      <w:r>
+        <w:rPr>
+          <w:rFonts w:ascii="SimSun" w:eastAsia="SimSun" w:hAnsi="SimSun"/>
+          <w:sz w:val="24"/>
+          <w:szCs w:val="24"/>
+        </w:rPr>
+        <w:t>fontsize = 1</w:t>
+      </w:r>
+      <w:r>
+        <w:rPr>
+          <w:rFonts w:ascii="SimSun" w:eastAsia="SimSun" w:hAnsi="SimSun"/>
+          <w:sz w:val="24"/>
+          <w:szCs w:val="24"/>
+        </w:rPr>
+        <w:t>2</w:t>
+      </w:r>
+      <w:r>
+        <w:rPr>
+          <w:rFonts w:ascii="SimSun" w:eastAsia="SimSun" w:hAnsi="SimSun"/>
+          <w:sz w:val="24"/>
+          <w:szCs w:val="24"/>
+        </w:rPr>
+        <w:t>)</w:t>
+      </w:r>
+    </w:p>
+    <w:p>
+      <w:pPr>
+        <w:rPr>
+          <w:rFonts w:ascii="SimSun" w:eastAsia="SimSun" w:hAnsi="SimSun"/>
+          <w:sz w:val="24"/>
+          <w:szCs w:val="24"/>
+        </w:rPr>
+      </w:pPr>
+      <w:r>
+        <w:rPr>
+          <w:rFonts w:ascii="SimSun" w:eastAsia="SimSun" w:hAnsi="SimSun"/>
+          <w:sz w:val="24"/>
+          <w:szCs w:val="24"/>
+        </w:rPr>
+        <w:t>plt.ylabel('y axis (units)'</w:t>
+      </w:r>
+      <w:r>
+        <w:rPr>
+          <w:rFonts w:ascii="SimSun" w:eastAsia="SimSun" w:hAnsi="SimSun"/>
+          <w:sz w:val="24"/>
+          <w:szCs w:val="24"/>
+        </w:rPr>
+        <w:t>,</w:t>
+      </w:r>
+      <w:r>
         <w:t xml:space="preserve"> </w:t>
       </w:r>
       <w:r>
         <w:rPr>
-          <w:sz w:val="24"/>
-          <w:szCs w:val="24"/>
-        </w:rPr>
-        <w:t>to</w:t>
-      </w:r>
-      <w:r>
-        <w:rPr>
-          <w:sz w:val="24"/>
-          <w:szCs w:val="24"/>
-        </w:rPr>
-        <w:t xml:space="preserve"> </w:t>
-      </w:r>
-      <w:r>
-        <w:rPr>
-          <w:sz w:val="24"/>
-          <w:szCs w:val="24"/>
-        </w:rPr>
-        <w:t>10 or 8</w:t>
-      </w:r>
-      <w:r>
-        <w:rPr>
-          <w:sz w:val="24"/>
-          <w:szCs w:val="24"/>
-        </w:rPr>
-        <w:t xml:space="preserve"> for</w:t>
-      </w:r>
-      <w:r>
-        <w:rPr>
-          <w:sz w:val="24"/>
-          <w:szCs w:val="24"/>
-        </w:rPr>
-        <w:t xml:space="preserve"> the</w:t>
-      </w:r>
-      <w:r>
-        <w:rPr>
-          <w:sz w:val="24"/>
-          <w:szCs w:val="24"/>
-        </w:rPr>
-        <w:t xml:space="preserve"> legend. </w:t>
-      </w:r>
-      <w:r>
-        <w:rPr>
-          <w:sz w:val="24"/>
-          <w:szCs w:val="24"/>
-        </w:rPr>
-        <w:t>Standard matplotlib colours are nice. Standard font is nice</w:t>
-      </w:r>
-    </w:p>
-    <w:p>
-      <w:pPr>
-        <w:rPr>
-          <w:sz w:val="24"/>
-          <w:szCs w:val="24"/>
-        </w:rPr>
-      </w:pPr>
-    </w:p>
-    <w:p>
-      <w:pPr>
-        <w:rPr>
           <w:rFonts w:ascii="SimSun" w:eastAsia="SimSun" w:hAnsi="SimSun"/>
           <w:sz w:val="24"/>
           <w:szCs w:val="24"/>
         </w:rPr>
-      </w:pPr>
-      <w:proofErr w:type="spellStart"/>
+        <w:t>fontsize = 1</w:t>
+      </w:r>
       <w:r>
         <w:rPr>
           <w:rFonts w:ascii="SimSun" w:eastAsia="SimSun" w:hAnsi="SimSun"/>
           <w:sz w:val="24"/>
           <w:szCs w:val="24"/>
         </w:rPr>
-        <w:t>figure_size</w:t>
-      </w:r>
-      <w:proofErr w:type="spellEnd"/>
+        <w:t>2</w:t>
+      </w:r>
       <w:r>
         <w:rPr>
           <w:rFonts w:ascii="SimSun" w:eastAsia="SimSun" w:hAnsi="SimSun"/>
           <w:sz w:val="24"/>
           <w:szCs w:val="24"/>
         </w:rPr>
-        <w:t xml:space="preserve"> = (6,</w:t>
-      </w:r>
-      <w:r>
+        <w:t>)</w:t>
+      </w:r>
+    </w:p>
+    <w:p>
+      <w:pPr>
         <w:rPr>
           <w:rFonts w:ascii="SimSun" w:eastAsia="SimSun" w:hAnsi="SimSun"/>
           <w:sz w:val="24"/>
           <w:szCs w:val="24"/>
         </w:rPr>
-        <w:t>3.5</w:t>
-      </w:r>
+      </w:pPr>
       <w:r>
         <w:rPr>
           <w:rFonts w:ascii="SimSun" w:eastAsia="SimSun" w:hAnsi="SimSun"/>
           <w:sz w:val="24"/>
           <w:szCs w:val="24"/>
         </w:rPr>
-        <w:t>)</w:t>
+        <w:lastRenderedPageBreak/>
+        <w:t>plt.tight_layout()</w:t>
       </w:r>
     </w:p>
     <w:p>
@@ -5901,75 +5669,73 @@
           <w:szCs w:val="24"/>
         </w:rPr>
       </w:pPr>
-      <w:proofErr w:type="spellStart"/>
       <w:r>
         <w:rPr>
           <w:rFonts w:ascii="SimSun" w:eastAsia="SimSun" w:hAnsi="SimSun"/>
           <w:sz w:val="24"/>
           <w:szCs w:val="24"/>
         </w:rPr>
-        <w:t>plt.figure</w:t>
-      </w:r>
-      <w:proofErr w:type="spellEnd"/>
-      <w:r>
+        <w:t>plt.grid()</w:t>
+      </w:r>
+    </w:p>
+    <w:p>
+      <w:pPr>
         <w:rPr>
           <w:rFonts w:ascii="SimSun" w:eastAsia="SimSun" w:hAnsi="SimSun"/>
           <w:sz w:val="24"/>
           <w:szCs w:val="24"/>
         </w:rPr>
-        <w:t>(</w:t>
-      </w:r>
-      <w:proofErr w:type="spellStart"/>
+      </w:pPr>
       <w:r>
         <w:rPr>
           <w:rFonts w:ascii="SimSun" w:eastAsia="SimSun" w:hAnsi="SimSun"/>
           <w:sz w:val="24"/>
           <w:szCs w:val="24"/>
         </w:rPr>
-        <w:t>figsize</w:t>
-      </w:r>
-      <w:proofErr w:type="spellEnd"/>
-      <w:r>
+        <w:t>plt.savefig('sim_chapter_Zoom_in_ETM_tuning.eps')</w:t>
+      </w:r>
+    </w:p>
+    <w:p>
+      <w:pPr>
         <w:rPr>
           <w:rFonts w:ascii="SimSun" w:eastAsia="SimSun" w:hAnsi="SimSun"/>
           <w:sz w:val="24"/>
           <w:szCs w:val="24"/>
         </w:rPr>
-        <w:t xml:space="preserve"> = </w:t>
-      </w:r>
-      <w:proofErr w:type="spellStart"/>
+      </w:pPr>
       <w:r>
         <w:rPr>
           <w:rFonts w:ascii="SimSun" w:eastAsia="SimSun" w:hAnsi="SimSun"/>
           <w:sz w:val="24"/>
           <w:szCs w:val="24"/>
         </w:rPr>
-        <w:t>figure_size,dpi</w:t>
-      </w:r>
-      <w:proofErr w:type="spellEnd"/>
-      <w:r>
+        <w:t>plt.show()</w:t>
+      </w:r>
+    </w:p>
+    <w:p>
+      <w:pPr>
         <w:rPr>
           <w:rFonts w:ascii="SimSun" w:eastAsia="SimSun" w:hAnsi="SimSun"/>
           <w:sz w:val="24"/>
           <w:szCs w:val="24"/>
         </w:rPr>
-        <w:t xml:space="preserve"> = </w:t>
-      </w:r>
-      <w:r>
+      </w:pPr>
+    </w:p>
+    <w:p>
+      <w:pPr>
         <w:rPr>
           <w:rFonts w:ascii="SimSun" w:eastAsia="SimSun" w:hAnsi="SimSun"/>
           <w:sz w:val="24"/>
           <w:szCs w:val="24"/>
         </w:rPr>
-        <w:t>15</w:t>
-      </w:r>
+      </w:pPr>
       <w:r>
         <w:rPr>
           <w:rFonts w:ascii="SimSun" w:eastAsia="SimSun" w:hAnsi="SimSun"/>
           <w:sz w:val="24"/>
           <w:szCs w:val="24"/>
         </w:rPr>
-        <w:t>0)</w:t>
+        <w:t>For 2x1 subplots, use</w:t>
       </w:r>
     </w:p>
     <w:p>
@@ -5980,428 +5746,13 @@
           <w:szCs w:val="24"/>
         </w:rPr>
       </w:pPr>
-      <w:proofErr w:type="spellStart"/>
       <w:r>
         <w:rPr>
           <w:rFonts w:ascii="SimSun" w:eastAsia="SimSun" w:hAnsi="SimSun"/>
           <w:sz w:val="24"/>
           <w:szCs w:val="24"/>
         </w:rPr>
-        <w:t>plt.plot</w:t>
-      </w:r>
-      <w:proofErr w:type="spellEnd"/>
-      <w:r>
-        <w:rPr>
-          <w:rFonts w:ascii="SimSun" w:eastAsia="SimSun" w:hAnsi="SimSun"/>
-          <w:sz w:val="24"/>
-          <w:szCs w:val="24"/>
-        </w:rPr>
-        <w:t>(</w:t>
-      </w:r>
-      <w:proofErr w:type="spellStart"/>
-      <w:r>
-        <w:rPr>
-          <w:rFonts w:ascii="SimSun" w:eastAsia="SimSun" w:hAnsi="SimSun"/>
-          <w:sz w:val="24"/>
-          <w:szCs w:val="24"/>
-        </w:rPr>
-        <w:t>x,y,label</w:t>
-      </w:r>
-      <w:proofErr w:type="spellEnd"/>
-      <w:r>
-        <w:rPr>
-          <w:rFonts w:ascii="SimSun" w:eastAsia="SimSun" w:hAnsi="SimSun"/>
-          <w:sz w:val="24"/>
-          <w:szCs w:val="24"/>
-        </w:rPr>
-        <w:t xml:space="preserve"> = 'Name of line')</w:t>
-      </w:r>
-    </w:p>
-    <w:p>
-      <w:pPr>
-        <w:rPr>
-          <w:rFonts w:ascii="SimSun" w:eastAsia="SimSun" w:hAnsi="SimSun"/>
-          <w:sz w:val="24"/>
-          <w:szCs w:val="24"/>
-        </w:rPr>
-      </w:pPr>
-      <w:proofErr w:type="spellStart"/>
-      <w:r>
-        <w:rPr>
-          <w:rFonts w:ascii="SimSun" w:eastAsia="SimSun" w:hAnsi="SimSun"/>
-          <w:sz w:val="24"/>
-          <w:szCs w:val="24"/>
-        </w:rPr>
-        <w:t>plt.legend</w:t>
-      </w:r>
-      <w:proofErr w:type="spellEnd"/>
-      <w:r>
-        <w:rPr>
-          <w:rFonts w:ascii="SimSun" w:eastAsia="SimSun" w:hAnsi="SimSun"/>
-          <w:sz w:val="24"/>
-          <w:szCs w:val="24"/>
-        </w:rPr>
-        <w:t>(prop={'size': 8},</w:t>
-      </w:r>
-      <w:proofErr w:type="spellStart"/>
-      <w:r>
-        <w:rPr>
-          <w:rFonts w:ascii="SimSun" w:eastAsia="SimSun" w:hAnsi="SimSun"/>
-          <w:sz w:val="24"/>
-          <w:szCs w:val="24"/>
-        </w:rPr>
-        <w:t>loc</w:t>
-      </w:r>
-      <w:proofErr w:type="spellEnd"/>
-      <w:r>
-        <w:rPr>
-          <w:rFonts w:ascii="SimSun" w:eastAsia="SimSun" w:hAnsi="SimSun"/>
-          <w:sz w:val="24"/>
-          <w:szCs w:val="24"/>
-        </w:rPr>
-        <w:t xml:space="preserve"> = 'lower left')</w:t>
-      </w:r>
-    </w:p>
-    <w:p>
-      <w:pPr>
-        <w:rPr>
-          <w:rFonts w:ascii="SimSun" w:eastAsia="SimSun" w:hAnsi="SimSun"/>
-          <w:sz w:val="24"/>
-          <w:szCs w:val="24"/>
-        </w:rPr>
-      </w:pPr>
-      <w:proofErr w:type="spellStart"/>
-      <w:r>
-        <w:rPr>
-          <w:rFonts w:ascii="SimSun" w:eastAsia="SimSun" w:hAnsi="SimSun"/>
-          <w:sz w:val="24"/>
-          <w:szCs w:val="24"/>
-        </w:rPr>
-        <w:t>plt.xlabel</w:t>
-      </w:r>
-      <w:proofErr w:type="spellEnd"/>
-      <w:r>
-        <w:rPr>
-          <w:rFonts w:ascii="SimSun" w:eastAsia="SimSun" w:hAnsi="SimSun"/>
-          <w:sz w:val="24"/>
-          <w:szCs w:val="24"/>
-        </w:rPr>
-        <w:t>('x axis (units)'</w:t>
-      </w:r>
-      <w:r>
-        <w:rPr>
-          <w:rFonts w:ascii="SimSun" w:eastAsia="SimSun" w:hAnsi="SimSun"/>
-          <w:sz w:val="24"/>
-          <w:szCs w:val="24"/>
-        </w:rPr>
-        <w:t>,</w:t>
-      </w:r>
-      <w:r>
-        <w:t xml:space="preserve"> </w:t>
-      </w:r>
-      <w:proofErr w:type="spellStart"/>
-      <w:r>
-        <w:rPr>
-          <w:rFonts w:ascii="SimSun" w:eastAsia="SimSun" w:hAnsi="SimSun"/>
-          <w:sz w:val="24"/>
-          <w:szCs w:val="24"/>
-        </w:rPr>
-        <w:t>fontsize</w:t>
-      </w:r>
-      <w:proofErr w:type="spellEnd"/>
-      <w:r>
-        <w:rPr>
-          <w:rFonts w:ascii="SimSun" w:eastAsia="SimSun" w:hAnsi="SimSun"/>
-          <w:sz w:val="24"/>
-          <w:szCs w:val="24"/>
-        </w:rPr>
-        <w:t xml:space="preserve"> = 1</w:t>
-      </w:r>
-      <w:r>
-        <w:rPr>
-          <w:rFonts w:ascii="SimSun" w:eastAsia="SimSun" w:hAnsi="SimSun"/>
-          <w:sz w:val="24"/>
-          <w:szCs w:val="24"/>
-        </w:rPr>
-        <w:t>2</w:t>
-      </w:r>
-      <w:r>
-        <w:rPr>
-          <w:rFonts w:ascii="SimSun" w:eastAsia="SimSun" w:hAnsi="SimSun"/>
-          <w:sz w:val="24"/>
-          <w:szCs w:val="24"/>
-        </w:rPr>
-        <w:t>)</w:t>
-      </w:r>
-    </w:p>
-    <w:p>
-      <w:pPr>
-        <w:rPr>
-          <w:rFonts w:ascii="SimSun" w:eastAsia="SimSun" w:hAnsi="SimSun"/>
-          <w:sz w:val="24"/>
-          <w:szCs w:val="24"/>
-        </w:rPr>
-      </w:pPr>
-      <w:proofErr w:type="spellStart"/>
-      <w:r>
-        <w:rPr>
-          <w:rFonts w:ascii="SimSun" w:eastAsia="SimSun" w:hAnsi="SimSun"/>
-          <w:sz w:val="24"/>
-          <w:szCs w:val="24"/>
-        </w:rPr>
-        <w:t>plt.ylabel</w:t>
-      </w:r>
-      <w:proofErr w:type="spellEnd"/>
-      <w:r>
-        <w:rPr>
-          <w:rFonts w:ascii="SimSun" w:eastAsia="SimSun" w:hAnsi="SimSun"/>
-          <w:sz w:val="24"/>
-          <w:szCs w:val="24"/>
-        </w:rPr>
-        <w:t>('y axis (units)'</w:t>
-      </w:r>
-      <w:r>
-        <w:rPr>
-          <w:rFonts w:ascii="SimSun" w:eastAsia="SimSun" w:hAnsi="SimSun"/>
-          <w:sz w:val="24"/>
-          <w:szCs w:val="24"/>
-        </w:rPr>
-        <w:t>,</w:t>
-      </w:r>
-      <w:r>
-        <w:t xml:space="preserve"> </w:t>
-      </w:r>
-      <w:proofErr w:type="spellStart"/>
-      <w:r>
-        <w:rPr>
-          <w:rFonts w:ascii="SimSun" w:eastAsia="SimSun" w:hAnsi="SimSun"/>
-          <w:sz w:val="24"/>
-          <w:szCs w:val="24"/>
-        </w:rPr>
-        <w:t>fontsize</w:t>
-      </w:r>
-      <w:proofErr w:type="spellEnd"/>
-      <w:r>
-        <w:rPr>
-          <w:rFonts w:ascii="SimSun" w:eastAsia="SimSun" w:hAnsi="SimSun"/>
-          <w:sz w:val="24"/>
-          <w:szCs w:val="24"/>
-        </w:rPr>
-        <w:t xml:space="preserve"> = 1</w:t>
-      </w:r>
-      <w:r>
-        <w:rPr>
-          <w:rFonts w:ascii="SimSun" w:eastAsia="SimSun" w:hAnsi="SimSun"/>
-          <w:sz w:val="24"/>
-          <w:szCs w:val="24"/>
-        </w:rPr>
-        <w:t>2</w:t>
-      </w:r>
-      <w:r>
-        <w:rPr>
-          <w:rFonts w:ascii="SimSun" w:eastAsia="SimSun" w:hAnsi="SimSun"/>
-          <w:sz w:val="24"/>
-          <w:szCs w:val="24"/>
-        </w:rPr>
-        <w:t>)</w:t>
-      </w:r>
-    </w:p>
-    <w:p>
-      <w:pPr>
-        <w:rPr>
-          <w:rFonts w:ascii="SimSun" w:eastAsia="SimSun" w:hAnsi="SimSun"/>
-          <w:sz w:val="24"/>
-          <w:szCs w:val="24"/>
-        </w:rPr>
-      </w:pPr>
-      <w:proofErr w:type="spellStart"/>
-      <w:r>
-        <w:rPr>
-          <w:rFonts w:ascii="SimSun" w:eastAsia="SimSun" w:hAnsi="SimSun"/>
-          <w:sz w:val="24"/>
-          <w:szCs w:val="24"/>
-        </w:rPr>
-        <w:t>plt.tight_layout</w:t>
-      </w:r>
-      <w:proofErr w:type="spellEnd"/>
-      <w:r>
-        <w:rPr>
-          <w:rFonts w:ascii="SimSun" w:eastAsia="SimSun" w:hAnsi="SimSun"/>
-          <w:sz w:val="24"/>
-          <w:szCs w:val="24"/>
-        </w:rPr>
-        <w:t>()</w:t>
-      </w:r>
-    </w:p>
-    <w:p>
-      <w:pPr>
-        <w:rPr>
-          <w:rFonts w:ascii="SimSun" w:eastAsia="SimSun" w:hAnsi="SimSun"/>
-          <w:sz w:val="24"/>
-          <w:szCs w:val="24"/>
-        </w:rPr>
-      </w:pPr>
-      <w:proofErr w:type="spellStart"/>
-      <w:r>
-        <w:rPr>
-          <w:rFonts w:ascii="SimSun" w:eastAsia="SimSun" w:hAnsi="SimSun"/>
-          <w:sz w:val="24"/>
-          <w:szCs w:val="24"/>
-        </w:rPr>
-        <w:t>plt.grid</w:t>
-      </w:r>
-      <w:proofErr w:type="spellEnd"/>
-      <w:r>
-        <w:rPr>
-          <w:rFonts w:ascii="SimSun" w:eastAsia="SimSun" w:hAnsi="SimSun"/>
-          <w:sz w:val="24"/>
-          <w:szCs w:val="24"/>
-        </w:rPr>
-        <w:t>()</w:t>
-      </w:r>
-    </w:p>
-    <w:p>
-      <w:pPr>
-        <w:rPr>
-          <w:rFonts w:ascii="SimSun" w:eastAsia="SimSun" w:hAnsi="SimSun"/>
-          <w:sz w:val="24"/>
-          <w:szCs w:val="24"/>
-        </w:rPr>
-      </w:pPr>
-      <w:proofErr w:type="spellStart"/>
-      <w:r>
-        <w:rPr>
-          <w:rFonts w:ascii="SimSun" w:eastAsia="SimSun" w:hAnsi="SimSun"/>
-          <w:sz w:val="24"/>
-          <w:szCs w:val="24"/>
-        </w:rPr>
-        <w:lastRenderedPageBreak/>
-        <w:t>plt.savefig</w:t>
-      </w:r>
-      <w:proofErr w:type="spellEnd"/>
-      <w:r>
-        <w:rPr>
-          <w:rFonts w:ascii="SimSun" w:eastAsia="SimSun" w:hAnsi="SimSun"/>
-          <w:sz w:val="24"/>
-          <w:szCs w:val="24"/>
-        </w:rPr>
-        <w:t>('</w:t>
-      </w:r>
-      <w:proofErr w:type="spellStart"/>
-      <w:r>
-        <w:rPr>
-          <w:rFonts w:ascii="SimSun" w:eastAsia="SimSun" w:hAnsi="SimSun"/>
-          <w:sz w:val="24"/>
-          <w:szCs w:val="24"/>
-        </w:rPr>
-        <w:t>sim_chapter_Zoom_in_ETM_tuning.eps</w:t>
-      </w:r>
-      <w:proofErr w:type="spellEnd"/>
-      <w:r>
-        <w:rPr>
-          <w:rFonts w:ascii="SimSun" w:eastAsia="SimSun" w:hAnsi="SimSun"/>
-          <w:sz w:val="24"/>
-          <w:szCs w:val="24"/>
-        </w:rPr>
-        <w:t>')</w:t>
-      </w:r>
-    </w:p>
-    <w:p>
-      <w:pPr>
-        <w:rPr>
-          <w:rFonts w:ascii="SimSun" w:eastAsia="SimSun" w:hAnsi="SimSun"/>
-          <w:sz w:val="24"/>
-          <w:szCs w:val="24"/>
-        </w:rPr>
-      </w:pPr>
-      <w:proofErr w:type="spellStart"/>
-      <w:r>
-        <w:rPr>
-          <w:rFonts w:ascii="SimSun" w:eastAsia="SimSun" w:hAnsi="SimSun"/>
-          <w:sz w:val="24"/>
-          <w:szCs w:val="24"/>
-        </w:rPr>
-        <w:t>plt.show</w:t>
-      </w:r>
-      <w:proofErr w:type="spellEnd"/>
-      <w:r>
-        <w:rPr>
-          <w:rFonts w:ascii="SimSun" w:eastAsia="SimSun" w:hAnsi="SimSun"/>
-          <w:sz w:val="24"/>
-          <w:szCs w:val="24"/>
-        </w:rPr>
-        <w:t>()</w:t>
-      </w:r>
-    </w:p>
-    <w:p>
-      <w:pPr>
-        <w:rPr>
-          <w:rFonts w:ascii="SimSun" w:eastAsia="SimSun" w:hAnsi="SimSun"/>
-          <w:sz w:val="24"/>
-          <w:szCs w:val="24"/>
-        </w:rPr>
-      </w:pPr>
-    </w:p>
-    <w:p>
-      <w:pPr>
-        <w:rPr>
-          <w:rFonts w:ascii="SimSun" w:eastAsia="SimSun" w:hAnsi="SimSun"/>
-          <w:sz w:val="24"/>
-          <w:szCs w:val="24"/>
-        </w:rPr>
-      </w:pPr>
-      <w:r>
-        <w:rPr>
-          <w:rFonts w:ascii="SimSun" w:eastAsia="SimSun" w:hAnsi="SimSun"/>
-          <w:sz w:val="24"/>
-          <w:szCs w:val="24"/>
-        </w:rPr>
-        <w:t>For 2x1 subplots, use</w:t>
-      </w:r>
-    </w:p>
-    <w:p>
-      <w:pPr>
-        <w:rPr>
-          <w:rFonts w:ascii="SimSun" w:eastAsia="SimSun" w:hAnsi="SimSun"/>
-          <w:sz w:val="24"/>
-          <w:szCs w:val="24"/>
-        </w:rPr>
-      </w:pPr>
-      <w:proofErr w:type="spellStart"/>
-      <w:r>
-        <w:rPr>
-          <w:rFonts w:ascii="SimSun" w:eastAsia="SimSun" w:hAnsi="SimSun"/>
-          <w:sz w:val="24"/>
-          <w:szCs w:val="24"/>
-        </w:rPr>
-        <w:t>plt.figure</w:t>
-      </w:r>
-      <w:proofErr w:type="spellEnd"/>
-      <w:r>
-        <w:rPr>
-          <w:rFonts w:ascii="SimSun" w:eastAsia="SimSun" w:hAnsi="SimSun"/>
-          <w:sz w:val="24"/>
-          <w:szCs w:val="24"/>
-        </w:rPr>
-        <w:t>(</w:t>
-      </w:r>
-      <w:proofErr w:type="spellStart"/>
-      <w:r>
-        <w:rPr>
-          <w:rFonts w:ascii="SimSun" w:eastAsia="SimSun" w:hAnsi="SimSun"/>
-          <w:sz w:val="24"/>
-          <w:szCs w:val="24"/>
-        </w:rPr>
-        <w:t>figsize</w:t>
-      </w:r>
-      <w:proofErr w:type="spellEnd"/>
-      <w:r>
-        <w:rPr>
-          <w:rFonts w:ascii="SimSun" w:eastAsia="SimSun" w:hAnsi="SimSun"/>
-          <w:sz w:val="24"/>
-          <w:szCs w:val="24"/>
-        </w:rPr>
-        <w:t>=(6, 6), dpi=150)</w:t>
+        <w:t>plt.figure(figsize=(6, 6), dpi=150)</w:t>
       </w:r>
     </w:p>
     <w:p>
@@ -6459,7 +5810,6 @@
           <w:szCs w:val="24"/>
         </w:rPr>
       </w:pPr>
-      <w:proofErr w:type="spellStart"/>
       <w:r>
         <w:rPr>
           <w:rFonts w:asciiTheme="majorHAnsi" w:hAnsiTheme="majorHAnsi"/>
@@ -6470,7 +5820,6 @@
         </w:rPr>
         <w:t>Matlab</w:t>
       </w:r>
-      <w:proofErr w:type="spellEnd"/>
     </w:p>
     <w:p>
       <w:pPr>
@@ -6489,55 +5838,7 @@
           <w:sz w:val="24"/>
           <w:szCs w:val="24"/>
         </w:rPr>
-        <w:t xml:space="preserve">For </w:t>
-      </w:r>
-      <w:proofErr w:type="spellStart"/>
-      <w:r>
-        <w:rPr>
-          <w:sz w:val="24"/>
-          <w:szCs w:val="24"/>
-        </w:rPr>
-        <w:t>matlab</w:t>
-      </w:r>
-      <w:proofErr w:type="spellEnd"/>
-      <w:r>
-        <w:rPr>
-          <w:sz w:val="24"/>
-          <w:szCs w:val="24"/>
-        </w:rPr>
-        <w:t xml:space="preserve"> figures, use the </w:t>
-      </w:r>
-      <w:proofErr w:type="spellStart"/>
-      <w:r>
-        <w:rPr>
-          <w:sz w:val="24"/>
-          <w:szCs w:val="24"/>
-        </w:rPr>
-        <w:t>linspecer</w:t>
-      </w:r>
-      <w:proofErr w:type="spellEnd"/>
-      <w:r>
-        <w:rPr>
-          <w:sz w:val="24"/>
-          <w:szCs w:val="24"/>
-        </w:rPr>
-        <w:t xml:space="preserve"> (from </w:t>
-      </w:r>
-      <w:proofErr w:type="spellStart"/>
-      <w:r>
-        <w:rPr>
-          <w:sz w:val="24"/>
-          <w:szCs w:val="24"/>
-        </w:rPr>
-        <w:t>mathworks</w:t>
-      </w:r>
-      <w:proofErr w:type="spellEnd"/>
-      <w:r>
-        <w:rPr>
-          <w:sz w:val="24"/>
-          <w:szCs w:val="24"/>
-        </w:rPr>
-        <w:t xml:space="preserve"> file exchange) function to</w:t>
+        <w:t>For matlab figures, use the linspecer (from mathworks file exchange) function to</w:t>
       </w:r>
       <w:r>
         <w:rPr>
@@ -6578,9 +5879,8 @@
           <w:sz w:val="24"/>
           <w:szCs w:val="24"/>
         </w:rPr>
-        <w:t xml:space="preserve">The font should be set to </w:t>
-      </w:r>
-      <w:proofErr w:type="spellStart"/>
+        <w:t>The font should be set to Deja</w:t>
+      </w:r>
       <w:r>
         <w:rPr>
           <w:rFonts w:cstheme="minorHAnsi"/>
@@ -6588,7 +5888,7 @@
           <w:sz w:val="24"/>
           <w:szCs w:val="24"/>
         </w:rPr>
-        <w:t>Deja</w:t>
+        <w:t xml:space="preserve">Vu Sans, do this with: </w:t>
       </w:r>
       <w:r>
         <w:rPr>
@@ -6597,90 +5897,15 @@
           <w:sz w:val="24"/>
           <w:szCs w:val="24"/>
         </w:rPr>
-        <w:t>Vu</w:t>
-      </w:r>
-      <w:proofErr w:type="spellEnd"/>
-      <w:r>
-        <w:rPr>
-          <w:rFonts w:cstheme="minorHAnsi"/>
-          <w:color w:val="000000"/>
-          <w:sz w:val="24"/>
-          <w:szCs w:val="24"/>
-        </w:rPr>
-        <w:t xml:space="preserve"> Sans, do this with: </w:t>
-      </w:r>
-      <w:r>
-        <w:rPr>
-          <w:rFonts w:cstheme="minorHAnsi"/>
-          <w:color w:val="000000"/>
-          <w:sz w:val="24"/>
-          <w:szCs w:val="24"/>
-        </w:rPr>
-        <w:t>set(</w:t>
-      </w:r>
-      <w:proofErr w:type="spellStart"/>
-      <w:r>
-        <w:rPr>
-          <w:rFonts w:cstheme="minorHAnsi"/>
-          <w:color w:val="000000"/>
-          <w:sz w:val="24"/>
-          <w:szCs w:val="24"/>
-        </w:rPr>
-        <w:t>gca</w:t>
-      </w:r>
-      <w:proofErr w:type="spellEnd"/>
-      <w:r>
-        <w:rPr>
-          <w:rFonts w:cstheme="minorHAnsi"/>
-          <w:color w:val="000000"/>
-          <w:sz w:val="24"/>
-          <w:szCs w:val="24"/>
-        </w:rPr>
-        <w:t>,</w:t>
-      </w:r>
-      <w:r>
-        <w:rPr>
-          <w:rFonts w:cstheme="minorHAnsi"/>
-          <w:sz w:val="24"/>
-          <w:szCs w:val="24"/>
-        </w:rPr>
-        <w:t>'</w:t>
-      </w:r>
-      <w:proofErr w:type="spellStart"/>
-      <w:r>
-        <w:rPr>
-          <w:rFonts w:cstheme="minorHAnsi"/>
-          <w:sz w:val="24"/>
-          <w:szCs w:val="24"/>
-        </w:rPr>
-        <w:t>fontname</w:t>
-      </w:r>
-      <w:proofErr w:type="spellEnd"/>
-      <w:r>
-        <w:rPr>
-          <w:rFonts w:cstheme="minorHAnsi"/>
-          <w:sz w:val="24"/>
-          <w:szCs w:val="24"/>
-        </w:rPr>
-        <w:t>','</w:t>
-      </w:r>
-      <w:proofErr w:type="spellStart"/>
-      <w:r>
-        <w:rPr>
-          <w:rFonts w:cstheme="minorHAnsi"/>
-          <w:sz w:val="24"/>
-          <w:szCs w:val="24"/>
-        </w:rPr>
-        <w:t>DejaVu</w:t>
-      </w:r>
-      <w:proofErr w:type="spellEnd"/>
-      <w:r>
-        <w:rPr>
-          <w:rFonts w:cstheme="minorHAnsi"/>
-          <w:sz w:val="24"/>
-          <w:szCs w:val="24"/>
-        </w:rPr>
-        <w:t xml:space="preserve"> Sans')</w:t>
+        <w:t>set(gca,</w:t>
+      </w:r>
+      <w:r>
+        <w:rPr>
+          <w:rFonts w:cstheme="minorHAnsi"/>
+          <w:sz w:val="24"/>
+          <w:szCs w:val="24"/>
+        </w:rPr>
+        <w:t>'fontname','DejaVu Sans')</w:t>
       </w:r>
     </w:p>
     <w:p>
@@ -6710,25 +5935,24 @@
           <w:sz w:val="24"/>
           <w:szCs w:val="24"/>
         </w:rPr>
-        <w:t xml:space="preserve">c = </w:t>
-      </w:r>
-      <w:proofErr w:type="spellStart"/>
-      <w:r>
+        <w:t>c = linspecer(2);</w:t>
+      </w:r>
+    </w:p>
+    <w:p>
+      <w:pPr>
         <w:rPr>
           <w:rFonts w:ascii="SimSun" w:eastAsia="SimSun" w:hAnsi="SimSun"/>
           <w:sz w:val="24"/>
           <w:szCs w:val="24"/>
         </w:rPr>
-        <w:t>linspecer</w:t>
-      </w:r>
-      <w:proofErr w:type="spellEnd"/>
+      </w:pPr>
       <w:r>
         <w:rPr>
           <w:rFonts w:ascii="SimSun" w:eastAsia="SimSun" w:hAnsi="SimSun"/>
           <w:sz w:val="24"/>
           <w:szCs w:val="24"/>
         </w:rPr>
-        <w:t>(2);</w:t>
+        <w:t>size = 1.1;</w:t>
       </w:r>
     </w:p>
     <w:p>
@@ -6745,7 +5969,7 @@
           <w:sz w:val="24"/>
           <w:szCs w:val="24"/>
         </w:rPr>
-        <w:t>size = 1.1;</w:t>
+        <w:t>aspect_ratio = size.*[6,4];</w:t>
       </w:r>
     </w:p>
     <w:p>
@@ -6756,23 +5980,22 @@
           <w:szCs w:val="24"/>
         </w:rPr>
       </w:pPr>
-      <w:proofErr w:type="spellStart"/>
-      <w:r>
+    </w:p>
+    <w:p>
+      <w:pPr>
         <w:rPr>
           <w:rFonts w:ascii="SimSun" w:eastAsia="SimSun" w:hAnsi="SimSun"/>
           <w:sz w:val="24"/>
           <w:szCs w:val="24"/>
         </w:rPr>
-        <w:t>aspect_ratio</w:t>
-      </w:r>
-      <w:proofErr w:type="spellEnd"/>
+      </w:pPr>
       <w:r>
         <w:rPr>
           <w:rFonts w:ascii="SimSun" w:eastAsia="SimSun" w:hAnsi="SimSun"/>
           <w:sz w:val="24"/>
           <w:szCs w:val="24"/>
         </w:rPr>
-        <w:t xml:space="preserve"> = size.*[6,4];</w:t>
+        <w:t>figure('Name','dark noise','units','inches','position',[0 0 aspect_ratio(1) aspect_ratio(2)])</w:t>
       </w:r>
     </w:p>
     <w:p>
@@ -6783,287 +6006,115 @@
           <w:szCs w:val="24"/>
         </w:rPr>
       </w:pPr>
-    </w:p>
-    <w:p>
-      <w:pPr>
+      <w:r>
         <w:rPr>
           <w:rFonts w:ascii="SimSun" w:eastAsia="SimSun" w:hAnsi="SimSun"/>
           <w:sz w:val="24"/>
           <w:szCs w:val="24"/>
         </w:rPr>
-      </w:pPr>
-      <w:r>
+        <w:t>loglog(x1, y1, 'color',c(1,:))</w:t>
+      </w:r>
+    </w:p>
+    <w:p>
+      <w:pPr>
         <w:rPr>
           <w:rFonts w:ascii="SimSun" w:eastAsia="SimSun" w:hAnsi="SimSun"/>
           <w:sz w:val="24"/>
           <w:szCs w:val="24"/>
         </w:rPr>
-        <w:t>figure('</w:t>
-      </w:r>
-      <w:proofErr w:type="spellStart"/>
+      </w:pPr>
       <w:r>
         <w:rPr>
           <w:rFonts w:ascii="SimSun" w:eastAsia="SimSun" w:hAnsi="SimSun"/>
           <w:sz w:val="24"/>
           <w:szCs w:val="24"/>
         </w:rPr>
-        <w:t>Name','dark</w:t>
-      </w:r>
-      <w:proofErr w:type="spellEnd"/>
-      <w:r>
+        <w:t>hold on</w:t>
+      </w:r>
+    </w:p>
+    <w:p>
+      <w:pPr>
         <w:rPr>
           <w:rFonts w:ascii="SimSun" w:eastAsia="SimSun" w:hAnsi="SimSun"/>
           <w:sz w:val="24"/>
           <w:szCs w:val="24"/>
         </w:rPr>
-        <w:t xml:space="preserve"> </w:t>
-      </w:r>
-      <w:proofErr w:type="spellStart"/>
+      </w:pPr>
       <w:r>
         <w:rPr>
           <w:rFonts w:ascii="SimSun" w:eastAsia="SimSun" w:hAnsi="SimSun"/>
           <w:sz w:val="24"/>
           <w:szCs w:val="24"/>
         </w:rPr>
-        <w:t>noise','units','inches','position</w:t>
-      </w:r>
-      <w:proofErr w:type="spellEnd"/>
-      <w:r>
+        <w:t>loglog(x2, y2, 'color',c(2,:))</w:t>
+      </w:r>
+    </w:p>
+    <w:p>
+      <w:pPr>
         <w:rPr>
           <w:rFonts w:ascii="SimSun" w:eastAsia="SimSun" w:hAnsi="SimSun"/>
           <w:sz w:val="24"/>
           <w:szCs w:val="24"/>
         </w:rPr>
-        <w:t xml:space="preserve">',[0 0 </w:t>
-      </w:r>
-      <w:proofErr w:type="spellStart"/>
+      </w:pPr>
       <w:r>
         <w:rPr>
           <w:rFonts w:ascii="SimSun" w:eastAsia="SimSun" w:hAnsi="SimSun"/>
           <w:sz w:val="24"/>
           <w:szCs w:val="24"/>
         </w:rPr>
-        <w:t>aspect_ratio</w:t>
-      </w:r>
-      <w:proofErr w:type="spellEnd"/>
-      <w:r>
+        <w:t>hold off</w:t>
+      </w:r>
+    </w:p>
+    <w:p>
+      <w:pPr>
         <w:rPr>
           <w:rFonts w:ascii="SimSun" w:eastAsia="SimSun" w:hAnsi="SimSun"/>
           <w:sz w:val="24"/>
           <w:szCs w:val="24"/>
         </w:rPr>
-        <w:t xml:space="preserve">(1) </w:t>
-      </w:r>
-      <w:proofErr w:type="spellStart"/>
+      </w:pPr>
       <w:r>
         <w:rPr>
           <w:rFonts w:ascii="SimSun" w:eastAsia="SimSun" w:hAnsi="SimSun"/>
           <w:sz w:val="24"/>
           <w:szCs w:val="24"/>
         </w:rPr>
-        <w:t>aspect_ratio</w:t>
-      </w:r>
-      <w:proofErr w:type="spellEnd"/>
-      <w:r>
+        <w:t>set(gca,'fontsize',12)</w:t>
+      </w:r>
+    </w:p>
+    <w:p>
+      <w:pPr>
         <w:rPr>
           <w:rFonts w:ascii="SimSun" w:eastAsia="SimSun" w:hAnsi="SimSun"/>
           <w:sz w:val="24"/>
           <w:szCs w:val="24"/>
         </w:rPr>
-        <w:t>(2)])</w:t>
-      </w:r>
-    </w:p>
-    <w:p>
-      <w:pPr>
+      </w:pPr>
+      <w:r>
         <w:rPr>
           <w:rFonts w:ascii="SimSun" w:eastAsia="SimSun" w:hAnsi="SimSun"/>
           <w:sz w:val="24"/>
           <w:szCs w:val="24"/>
         </w:rPr>
-      </w:pPr>
-      <w:r>
+        <w:t>xlabel('Frequency (Hz)')</w:t>
+      </w:r>
+    </w:p>
+    <w:p>
+      <w:pPr>
         <w:rPr>
           <w:rFonts w:ascii="SimSun" w:eastAsia="SimSun" w:hAnsi="SimSun"/>
           <w:sz w:val="24"/>
           <w:szCs w:val="24"/>
         </w:rPr>
-        <w:t>loglog(x1, y1, '</w:t>
-      </w:r>
-      <w:proofErr w:type="spellStart"/>
+      </w:pPr>
       <w:r>
         <w:rPr>
           <w:rFonts w:ascii="SimSun" w:eastAsia="SimSun" w:hAnsi="SimSun"/>
           <w:sz w:val="24"/>
           <w:szCs w:val="24"/>
         </w:rPr>
-        <w:t>color</w:t>
-      </w:r>
-      <w:proofErr w:type="spellEnd"/>
-      <w:r>
-        <w:rPr>
-          <w:rFonts w:ascii="SimSun" w:eastAsia="SimSun" w:hAnsi="SimSun"/>
-          <w:sz w:val="24"/>
-          <w:szCs w:val="24"/>
-        </w:rPr>
-        <w:t>',c(1,:))</w:t>
-      </w:r>
-    </w:p>
-    <w:p>
-      <w:pPr>
-        <w:rPr>
-          <w:rFonts w:ascii="SimSun" w:eastAsia="SimSun" w:hAnsi="SimSun"/>
-          <w:sz w:val="24"/>
-          <w:szCs w:val="24"/>
-        </w:rPr>
-      </w:pPr>
-      <w:r>
-        <w:rPr>
-          <w:rFonts w:ascii="SimSun" w:eastAsia="SimSun" w:hAnsi="SimSun"/>
-          <w:sz w:val="24"/>
-          <w:szCs w:val="24"/>
-        </w:rPr>
-        <w:t>hold on</w:t>
-      </w:r>
-    </w:p>
-    <w:p>
-      <w:pPr>
-        <w:rPr>
-          <w:rFonts w:ascii="SimSun" w:eastAsia="SimSun" w:hAnsi="SimSun"/>
-          <w:sz w:val="24"/>
-          <w:szCs w:val="24"/>
-        </w:rPr>
-      </w:pPr>
-      <w:r>
-        <w:rPr>
-          <w:rFonts w:ascii="SimSun" w:eastAsia="SimSun" w:hAnsi="SimSun"/>
-          <w:sz w:val="24"/>
-          <w:szCs w:val="24"/>
-        </w:rPr>
-        <w:t>loglog(x2, y2, '</w:t>
-      </w:r>
-      <w:proofErr w:type="spellStart"/>
-      <w:r>
-        <w:rPr>
-          <w:rFonts w:ascii="SimSun" w:eastAsia="SimSun" w:hAnsi="SimSun"/>
-          <w:sz w:val="24"/>
-          <w:szCs w:val="24"/>
-        </w:rPr>
-        <w:t>color</w:t>
-      </w:r>
-      <w:proofErr w:type="spellEnd"/>
-      <w:r>
-        <w:rPr>
-          <w:rFonts w:ascii="SimSun" w:eastAsia="SimSun" w:hAnsi="SimSun"/>
-          <w:sz w:val="24"/>
-          <w:szCs w:val="24"/>
-        </w:rPr>
-        <w:t>',c(2,:))</w:t>
-      </w:r>
-    </w:p>
-    <w:p>
-      <w:pPr>
-        <w:rPr>
-          <w:rFonts w:ascii="SimSun" w:eastAsia="SimSun" w:hAnsi="SimSun"/>
-          <w:sz w:val="24"/>
-          <w:szCs w:val="24"/>
-        </w:rPr>
-      </w:pPr>
-      <w:r>
-        <w:rPr>
-          <w:rFonts w:ascii="SimSun" w:eastAsia="SimSun" w:hAnsi="SimSun"/>
-          <w:sz w:val="24"/>
-          <w:szCs w:val="24"/>
-        </w:rPr>
-        <w:t>hold off</w:t>
-      </w:r>
-    </w:p>
-    <w:p>
-      <w:pPr>
-        <w:rPr>
-          <w:rFonts w:ascii="SimSun" w:eastAsia="SimSun" w:hAnsi="SimSun"/>
-          <w:sz w:val="24"/>
-          <w:szCs w:val="24"/>
-        </w:rPr>
-      </w:pPr>
-      <w:r>
-        <w:rPr>
-          <w:rFonts w:ascii="SimSun" w:eastAsia="SimSun" w:hAnsi="SimSun"/>
-          <w:sz w:val="24"/>
-          <w:szCs w:val="24"/>
-        </w:rPr>
-        <w:t>set(gca,'fontsize',12)</w:t>
-      </w:r>
-    </w:p>
-    <w:p>
-      <w:pPr>
-        <w:rPr>
-          <w:rFonts w:ascii="SimSun" w:eastAsia="SimSun" w:hAnsi="SimSun"/>
-          <w:sz w:val="24"/>
-          <w:szCs w:val="24"/>
-        </w:rPr>
-      </w:pPr>
-      <w:proofErr w:type="spellStart"/>
-      <w:r>
-        <w:rPr>
-          <w:rFonts w:ascii="SimSun" w:eastAsia="SimSun" w:hAnsi="SimSun"/>
-          <w:sz w:val="24"/>
-          <w:szCs w:val="24"/>
-        </w:rPr>
-        <w:t>xlabel</w:t>
-      </w:r>
-      <w:proofErr w:type="spellEnd"/>
-      <w:r>
-        <w:rPr>
-          <w:rFonts w:ascii="SimSun" w:eastAsia="SimSun" w:hAnsi="SimSun"/>
-          <w:sz w:val="24"/>
-          <w:szCs w:val="24"/>
-        </w:rPr>
-        <w:t>('Frequency (Hz)')</w:t>
-      </w:r>
-    </w:p>
-    <w:p>
-      <w:pPr>
-        <w:rPr>
-          <w:rFonts w:ascii="SimSun" w:eastAsia="SimSun" w:hAnsi="SimSun"/>
-          <w:sz w:val="24"/>
-          <w:szCs w:val="24"/>
-        </w:rPr>
-      </w:pPr>
-      <w:proofErr w:type="spellStart"/>
-      <w:r>
-        <w:rPr>
-          <w:rFonts w:ascii="SimSun" w:eastAsia="SimSun" w:hAnsi="SimSun"/>
-          <w:sz w:val="24"/>
-          <w:szCs w:val="24"/>
-        </w:rPr>
-        <w:t>ylabel</w:t>
-      </w:r>
-      <w:proofErr w:type="spellEnd"/>
-      <w:r>
-        <w:rPr>
-          <w:rFonts w:ascii="SimSun" w:eastAsia="SimSun" w:hAnsi="SimSun"/>
-          <w:sz w:val="24"/>
-          <w:szCs w:val="24"/>
-        </w:rPr>
-        <w:t>('</w:t>
-      </w:r>
-      <w:proofErr w:type="spellStart"/>
-      <w:r>
-        <w:rPr>
-          <w:rFonts w:ascii="SimSun" w:eastAsia="SimSun" w:hAnsi="SimSun"/>
-          <w:sz w:val="24"/>
-          <w:szCs w:val="24"/>
-        </w:rPr>
-        <w:t>I_r_m_s</w:t>
-      </w:r>
-      <w:proofErr w:type="spellEnd"/>
-      <w:r>
-        <w:rPr>
-          <w:rFonts w:ascii="SimSun" w:eastAsia="SimSun" w:hAnsi="SimSun"/>
-          <w:sz w:val="24"/>
-          <w:szCs w:val="24"/>
-        </w:rPr>
-        <w:t>/\surd(Hz)')</w:t>
+        <w:t>ylabel('I_r_m_s/\surd(Hz)')</w:t>
       </w:r>
     </w:p>
     <w:p>
@@ -7081,9 +6132,16 @@
           <w:sz w:val="24"/>
           <w:szCs w:val="24"/>
         </w:rPr>
-        <w:t>set(</w:t>
-      </w:r>
-      <w:proofErr w:type="spellStart"/>
+        <w:t>set(gca,</w:t>
+      </w:r>
+      <w:r>
+        <w:rPr>
+          <w:rFonts w:ascii="SimSun" w:eastAsia="SimSun" w:hAnsi="SimSun" w:cs="Courier New"/>
+          <w:sz w:val="24"/>
+          <w:szCs w:val="24"/>
+        </w:rPr>
+        <w:t>'fontname','DejaVu Sans'</w:t>
+      </w:r>
       <w:r>
         <w:rPr>
           <w:rFonts w:ascii="SimSun" w:eastAsia="SimSun" w:hAnsi="SimSun" w:cs="Courier New"/>
@@ -7091,69 +6149,6 @@
           <w:sz w:val="24"/>
           <w:szCs w:val="24"/>
         </w:rPr>
-        <w:t>gca</w:t>
-      </w:r>
-      <w:proofErr w:type="spellEnd"/>
-      <w:r>
-        <w:rPr>
-          <w:rFonts w:ascii="SimSun" w:eastAsia="SimSun" w:hAnsi="SimSun" w:cs="Courier New"/>
-          <w:color w:val="000000"/>
-          <w:sz w:val="24"/>
-          <w:szCs w:val="24"/>
-        </w:rPr>
-        <w:t>,</w:t>
-      </w:r>
-      <w:r>
-        <w:rPr>
-          <w:rFonts w:ascii="SimSun" w:eastAsia="SimSun" w:hAnsi="SimSun" w:cs="Courier New"/>
-          <w:sz w:val="24"/>
-          <w:szCs w:val="24"/>
-        </w:rPr>
-        <w:t>'</w:t>
-      </w:r>
-      <w:proofErr w:type="spellStart"/>
-      <w:r>
-        <w:rPr>
-          <w:rFonts w:ascii="SimSun" w:eastAsia="SimSun" w:hAnsi="SimSun" w:cs="Courier New"/>
-          <w:sz w:val="24"/>
-          <w:szCs w:val="24"/>
-        </w:rPr>
-        <w:t>fontname</w:t>
-      </w:r>
-      <w:proofErr w:type="spellEnd"/>
-      <w:r>
-        <w:rPr>
-          <w:rFonts w:ascii="SimSun" w:eastAsia="SimSun" w:hAnsi="SimSun" w:cs="Courier New"/>
-          <w:sz w:val="24"/>
-          <w:szCs w:val="24"/>
-        </w:rPr>
-        <w:t>','</w:t>
-      </w:r>
-      <w:proofErr w:type="spellStart"/>
-      <w:r>
-        <w:rPr>
-          <w:rFonts w:ascii="SimSun" w:eastAsia="SimSun" w:hAnsi="SimSun" w:cs="Courier New"/>
-          <w:sz w:val="24"/>
-          <w:szCs w:val="24"/>
-        </w:rPr>
-        <w:t>DejaVu</w:t>
-      </w:r>
-      <w:proofErr w:type="spellEnd"/>
-      <w:r>
-        <w:rPr>
-          <w:rFonts w:ascii="SimSun" w:eastAsia="SimSun" w:hAnsi="SimSun" w:cs="Courier New"/>
-          <w:sz w:val="24"/>
-          <w:szCs w:val="24"/>
-        </w:rPr>
-        <w:t xml:space="preserve"> Sans'</w:t>
-      </w:r>
-      <w:r>
-        <w:rPr>
-          <w:rFonts w:ascii="SimSun" w:eastAsia="SimSun" w:hAnsi="SimSun" w:cs="Courier New"/>
-          <w:color w:val="000000"/>
-          <w:sz w:val="24"/>
-          <w:szCs w:val="24"/>
-        </w:rPr>
         <w:t>)</w:t>
       </w:r>
     </w:p>
@@ -7171,6 +6166,7 @@
           <w:sz w:val="24"/>
           <w:szCs w:val="24"/>
         </w:rPr>
+        <w:lastRenderedPageBreak/>
         <w:t>legend('0.00V','0.10V','numColumns',2,'location','northeast')</w:t>
       </w:r>
     </w:p>
@@ -7205,26 +6201,7 @@
           <w:sz w:val="24"/>
           <w:szCs w:val="24"/>
         </w:rPr>
-        <w:lastRenderedPageBreak/>
-        <w:t>print('Noise_low_f','-</w:t>
-      </w:r>
-      <w:proofErr w:type="spellStart"/>
-      <w:r>
-        <w:rPr>
-          <w:rFonts w:ascii="SimSun" w:eastAsia="SimSun" w:hAnsi="SimSun"/>
-          <w:sz w:val="24"/>
-          <w:szCs w:val="24"/>
-        </w:rPr>
-        <w:t>depsc</w:t>
-      </w:r>
-      <w:proofErr w:type="spellEnd"/>
-      <w:r>
-        <w:rPr>
-          <w:rFonts w:ascii="SimSun" w:eastAsia="SimSun" w:hAnsi="SimSun"/>
-          <w:sz w:val="24"/>
-          <w:szCs w:val="24"/>
-        </w:rPr>
-        <w:t>')</w:t>
+        <w:t>print('Noise_low_f','-depsc')</w:t>
       </w:r>
     </w:p>
     <w:p>
@@ -7330,23 +6307,7 @@
           <w:sz w:val="24"/>
           <w:szCs w:val="24"/>
         </w:rPr>
-        <w:t xml:space="preserve">have </w:t>
-      </w:r>
-      <w:proofErr w:type="spellStart"/>
-      <w:r>
-        <w:rPr>
-          <w:sz w:val="24"/>
-          <w:szCs w:val="24"/>
-        </w:rPr>
-        <w:t>gnd</w:t>
-      </w:r>
-      <w:proofErr w:type="spellEnd"/>
-      <w:r>
-        <w:rPr>
-          <w:sz w:val="24"/>
-          <w:szCs w:val="24"/>
-        </w:rPr>
-        <w:t xml:space="preserve"> at the bottom of the diagram.</w:t>
+        <w:t>have gnd at the bottom of the diagram.</w:t>
       </w:r>
     </w:p>
     <w:p>

</xml_diff>

<commit_message>
added set up section for psl work
</commit_message>
<xml_diff>
--- a/Structuring.docx
+++ b/Structuring.docx
@@ -5572,7 +5572,7 @@
           <w:sz w:val="24"/>
           <w:szCs w:val="24"/>
         </w:rPr>
-        <w:t>fontsize = 1</w:t>
+        <w:t xml:space="preserve">fontsize = </w:t>
       </w:r>
       <w:r>
         <w:rPr>
@@ -5580,7 +5580,7 @@
           <w:sz w:val="24"/>
           <w:szCs w:val="24"/>
         </w:rPr>
-        <w:t>2</w:t>
+        <w:t>11.5</w:t>
       </w:r>
       <w:r>
         <w:rPr>
@@ -5624,7 +5624,7 @@
           <w:sz w:val="24"/>
           <w:szCs w:val="24"/>
         </w:rPr>
-        <w:t>fontsize = 1</w:t>
+        <w:t xml:space="preserve">fontsize = </w:t>
       </w:r>
       <w:r>
         <w:rPr>
@@ -5632,7 +5632,7 @@
           <w:sz w:val="24"/>
           <w:szCs w:val="24"/>
         </w:rPr>
-        <w:t>2</w:t>
+        <w:t>11.5</w:t>
       </w:r>
       <w:r>
         <w:rPr>

</xml_diff>

<commit_message>
ligo laser chapter introduction finished!
</commit_message>
<xml_diff>
--- a/Structuring.docx
+++ b/Structuring.docx
@@ -78,15 +78,33 @@
           <w:sz w:val="24"/>
           <w:szCs w:val="24"/>
         </w:rPr>
-        <w:t>This is the first step to writing a chapter. Come up with likely sections,</w:t>
-      </w:r>
-      <w:r>
-        <w:rPr>
-          <w:rFonts w:cstheme="minorHAnsi"/>
-          <w:sz w:val="24"/>
-          <w:szCs w:val="24"/>
-        </w:rPr>
-        <w:t xml:space="preserve"> and fill them in with ideas for paragraphs. Think about/put in relevant figures at this point.</w:t>
+        <w:t xml:space="preserve">This is the first step to writing a chapter. Come up with likely </w:t>
+      </w:r>
+      <w:proofErr w:type="gramStart"/>
+      <w:r>
+        <w:rPr>
+          <w:rFonts w:cstheme="minorHAnsi"/>
+          <w:sz w:val="24"/>
+          <w:szCs w:val="24"/>
+        </w:rPr>
+        <w:t>sections,</w:t>
+      </w:r>
+      <w:r>
+        <w:rPr>
+          <w:rFonts w:cstheme="minorHAnsi"/>
+          <w:sz w:val="24"/>
+          <w:szCs w:val="24"/>
+        </w:rPr>
+        <w:t xml:space="preserve"> and</w:t>
+      </w:r>
+      <w:proofErr w:type="gramEnd"/>
+      <w:r>
+        <w:rPr>
+          <w:rFonts w:cstheme="minorHAnsi"/>
+          <w:sz w:val="24"/>
+          <w:szCs w:val="24"/>
+        </w:rPr>
+        <w:t xml:space="preserve"> fill them in with ideas for paragraphs. Think about/put in relevant figures at this point.</w:t>
       </w:r>
     </w:p>
     <w:p>
@@ -167,15 +185,69 @@
           <w:sz w:val="24"/>
           <w:szCs w:val="24"/>
         </w:rPr>
-        <w:t>writing. The majority of the content of the chapter (&lt;90%) will be written by the end of this draft</w:t>
-      </w:r>
-      <w:r>
-        <w:rPr>
-          <w:rFonts w:cstheme="minorHAnsi"/>
-          <w:sz w:val="24"/>
-          <w:szCs w:val="24"/>
-        </w:rPr>
-        <w:t xml:space="preserve">. The writing at this point may be ‘stream of conciouness`-esk, but it should have had an attempt at making it clear. </w:t>
+        <w:t xml:space="preserve">writing. </w:t>
+      </w:r>
+      <w:proofErr w:type="gramStart"/>
+      <w:r>
+        <w:rPr>
+          <w:rFonts w:cstheme="minorHAnsi"/>
+          <w:sz w:val="24"/>
+          <w:szCs w:val="24"/>
+        </w:rPr>
+        <w:t>The majority of</w:t>
+      </w:r>
+      <w:proofErr w:type="gramEnd"/>
+      <w:r>
+        <w:rPr>
+          <w:rFonts w:cstheme="minorHAnsi"/>
+          <w:sz w:val="24"/>
+          <w:szCs w:val="24"/>
+        </w:rPr>
+        <w:t xml:space="preserve"> the content of the chapter (&lt;90%) will be written by the end of this draft</w:t>
+      </w:r>
+      <w:r>
+        <w:rPr>
+          <w:rFonts w:cstheme="minorHAnsi"/>
+          <w:sz w:val="24"/>
+          <w:szCs w:val="24"/>
+        </w:rPr>
+        <w:t xml:space="preserve">. The writing at this point may be ‘stream of </w:t>
+      </w:r>
+      <w:proofErr w:type="spellStart"/>
+      <w:r>
+        <w:rPr>
+          <w:rFonts w:cstheme="minorHAnsi"/>
+          <w:sz w:val="24"/>
+          <w:szCs w:val="24"/>
+        </w:rPr>
+        <w:t>conciouness</w:t>
+      </w:r>
+      <w:proofErr w:type="spellEnd"/>
+      <w:r>
+        <w:rPr>
+          <w:rFonts w:cstheme="minorHAnsi"/>
+          <w:sz w:val="24"/>
+          <w:szCs w:val="24"/>
+        </w:rPr>
+        <w:t>`-</w:t>
+      </w:r>
+      <w:proofErr w:type="spellStart"/>
+      <w:r>
+        <w:rPr>
+          <w:rFonts w:cstheme="minorHAnsi"/>
+          <w:sz w:val="24"/>
+          <w:szCs w:val="24"/>
+        </w:rPr>
+        <w:t>esk</w:t>
+      </w:r>
+      <w:proofErr w:type="spellEnd"/>
+      <w:r>
+        <w:rPr>
+          <w:rFonts w:cstheme="minorHAnsi"/>
+          <w:sz w:val="24"/>
+          <w:szCs w:val="24"/>
+        </w:rPr>
+        <w:t xml:space="preserve">, but it should have had an attempt at making it clear. </w:t>
       </w:r>
       <w:r>
         <w:rPr>
@@ -401,7 +473,25 @@
           <w:sz w:val="24"/>
           <w:szCs w:val="24"/>
         </w:rPr>
-        <w:t>. Consider if some information can be made into an appendix, or if the chapter could be made into two chapters. For the purpose of editing, continue editing them as if they were one chapter.</w:t>
+        <w:t xml:space="preserve">. Consider if some information can be made into an appendix, or if the chapter could be made into two chapters. </w:t>
+      </w:r>
+      <w:proofErr w:type="gramStart"/>
+      <w:r>
+        <w:rPr>
+          <w:rFonts w:cstheme="minorHAnsi"/>
+          <w:sz w:val="24"/>
+          <w:szCs w:val="24"/>
+        </w:rPr>
+        <w:t>For the purpose of</w:t>
+      </w:r>
+      <w:proofErr w:type="gramEnd"/>
+      <w:r>
+        <w:rPr>
+          <w:rFonts w:cstheme="minorHAnsi"/>
+          <w:sz w:val="24"/>
+          <w:szCs w:val="24"/>
+        </w:rPr>
+        <w:t xml:space="preserve"> editing, continue editing them as if they were one chapter.</w:t>
       </w:r>
     </w:p>
     <w:p>
@@ -566,7 +656,25 @@
           <w:sz w:val="24"/>
           <w:szCs w:val="24"/>
         </w:rPr>
-        <w:t>word level. This involves checking the spellings of words (eg. Effect or affect). The</w:t>
+        <w:t>word level. This involves checking the spellings of words (</w:t>
+      </w:r>
+      <w:proofErr w:type="spellStart"/>
+      <w:r>
+        <w:rPr>
+          <w:rFonts w:cstheme="minorHAnsi"/>
+          <w:sz w:val="24"/>
+          <w:szCs w:val="24"/>
+        </w:rPr>
+        <w:t>eg.</w:t>
+      </w:r>
+      <w:proofErr w:type="spellEnd"/>
+      <w:r>
+        <w:rPr>
+          <w:rFonts w:cstheme="minorHAnsi"/>
+          <w:sz w:val="24"/>
+          <w:szCs w:val="24"/>
+        </w:rPr>
+        <w:t xml:space="preserve"> Effect or affect). The</w:t>
       </w:r>
       <w:r>
         <w:rPr>
@@ -723,7 +831,25 @@
           <w:sz w:val="24"/>
           <w:szCs w:val="24"/>
         </w:rPr>
-        <w:t>nalyse the subject, the verb and the object</w:t>
+        <w:t xml:space="preserve">nalyse the subject, the </w:t>
+      </w:r>
+      <w:proofErr w:type="gramStart"/>
+      <w:r>
+        <w:rPr>
+          <w:rFonts w:cstheme="minorHAnsi"/>
+          <w:sz w:val="24"/>
+          <w:szCs w:val="24"/>
+        </w:rPr>
+        <w:t>verb</w:t>
+      </w:r>
+      <w:proofErr w:type="gramEnd"/>
+      <w:r>
+        <w:rPr>
+          <w:rFonts w:cstheme="minorHAnsi"/>
+          <w:sz w:val="24"/>
+          <w:szCs w:val="24"/>
+        </w:rPr>
+        <w:t xml:space="preserve"> and the object</w:t>
       </w:r>
       <w:r>
         <w:rPr>
@@ -1240,7 +1366,25 @@
           <w:sz w:val="24"/>
           <w:szCs w:val="24"/>
         </w:rPr>
-        <w:t xml:space="preserve"> Its hard to miss out ones you need. Err on the side of caution.</w:t>
+        <w:t xml:space="preserve"> </w:t>
+      </w:r>
+      <w:proofErr w:type="spellStart"/>
+      <w:r>
+        <w:rPr>
+          <w:rFonts w:cstheme="minorHAnsi"/>
+          <w:sz w:val="24"/>
+          <w:szCs w:val="24"/>
+        </w:rPr>
+        <w:t>Its</w:t>
+      </w:r>
+      <w:proofErr w:type="spellEnd"/>
+      <w:r>
+        <w:rPr>
+          <w:rFonts w:cstheme="minorHAnsi"/>
+          <w:sz w:val="24"/>
+          <w:szCs w:val="24"/>
+        </w:rPr>
+        <w:t xml:space="preserve"> hard to miss out ones you need. Err on the side of caution.</w:t>
       </w:r>
       <w:r>
         <w:rPr>
@@ -1308,15 +1452,33 @@
           <w:sz w:val="24"/>
           <w:szCs w:val="24"/>
         </w:rPr>
-        <w:t>People get confused by compound sentences and complex sentences</w:t>
-      </w:r>
-      <w:r>
-        <w:rPr>
-          <w:rFonts w:cstheme="minorHAnsi"/>
-          <w:sz w:val="24"/>
-          <w:szCs w:val="24"/>
-        </w:rPr>
-        <w:t>, I suppose.</w:t>
+        <w:t xml:space="preserve">People get confused by compound sentences and complex </w:t>
+      </w:r>
+      <w:proofErr w:type="gramStart"/>
+      <w:r>
+        <w:rPr>
+          <w:rFonts w:cstheme="minorHAnsi"/>
+          <w:sz w:val="24"/>
+          <w:szCs w:val="24"/>
+        </w:rPr>
+        <w:t>sentences</w:t>
+      </w:r>
+      <w:r>
+        <w:rPr>
+          <w:rFonts w:cstheme="minorHAnsi"/>
+          <w:sz w:val="24"/>
+          <w:szCs w:val="24"/>
+        </w:rPr>
+        <w:t>,</w:t>
+      </w:r>
+      <w:proofErr w:type="gramEnd"/>
+      <w:r>
+        <w:rPr>
+          <w:rFonts w:cstheme="minorHAnsi"/>
+          <w:sz w:val="24"/>
+          <w:szCs w:val="24"/>
+        </w:rPr>
+        <w:t xml:space="preserve"> I suppose.</w:t>
       </w:r>
     </w:p>
     <w:p>
@@ -1582,13 +1744,23 @@
           <w:szCs w:val="24"/>
         </w:rPr>
       </w:pPr>
-      <w:r>
-        <w:rPr>
-          <w:rFonts w:cstheme="minorHAnsi"/>
-          <w:sz w:val="24"/>
-          <w:szCs w:val="24"/>
-        </w:rPr>
-        <w:t>E.g the rat is dead.</w:t>
+      <w:proofErr w:type="spellStart"/>
+      <w:r>
+        <w:rPr>
+          <w:rFonts w:cstheme="minorHAnsi"/>
+          <w:sz w:val="24"/>
+          <w:szCs w:val="24"/>
+        </w:rPr>
+        <w:t>E.g</w:t>
+      </w:r>
+      <w:proofErr w:type="spellEnd"/>
+      <w:r>
+        <w:rPr>
+          <w:rFonts w:cstheme="minorHAnsi"/>
+          <w:sz w:val="24"/>
+          <w:szCs w:val="24"/>
+        </w:rPr>
+        <w:t xml:space="preserve"> the rat is dead.</w:t>
       </w:r>
     </w:p>
     <w:p>
@@ -1610,7 +1782,25 @@
           <w:sz w:val="24"/>
           <w:szCs w:val="24"/>
         </w:rPr>
-        <w:t>The rat is dead has a subject and a verb</w:t>
+        <w:t xml:space="preserve">The rat is dead </w:t>
+      </w:r>
+      <w:proofErr w:type="gramStart"/>
+      <w:r>
+        <w:rPr>
+          <w:rFonts w:cstheme="minorHAnsi"/>
+          <w:sz w:val="24"/>
+          <w:szCs w:val="24"/>
+        </w:rPr>
+        <w:t>has</w:t>
+      </w:r>
+      <w:proofErr w:type="gramEnd"/>
+      <w:r>
+        <w:rPr>
+          <w:rFonts w:cstheme="minorHAnsi"/>
+          <w:sz w:val="24"/>
+          <w:szCs w:val="24"/>
+        </w:rPr>
+        <w:t xml:space="preserve"> a subject and a verb</w:t>
       </w:r>
     </w:p>
     <w:p>
@@ -1632,7 +1822,25 @@
           <w:sz w:val="24"/>
           <w:szCs w:val="24"/>
         </w:rPr>
-        <w:t>Subordinate clause: It doesn’t stand alone.</w:t>
+        <w:t xml:space="preserve">Subordinate clause: It </w:t>
+      </w:r>
+      <w:proofErr w:type="gramStart"/>
+      <w:r>
+        <w:rPr>
+          <w:rFonts w:cstheme="minorHAnsi"/>
+          <w:sz w:val="24"/>
+          <w:szCs w:val="24"/>
+        </w:rPr>
+        <w:t>doesn’t</w:t>
+      </w:r>
+      <w:proofErr w:type="gramEnd"/>
+      <w:r>
+        <w:rPr>
+          <w:rFonts w:cstheme="minorHAnsi"/>
+          <w:sz w:val="24"/>
+          <w:szCs w:val="24"/>
+        </w:rPr>
+        <w:t xml:space="preserve"> stand alone.</w:t>
       </w:r>
     </w:p>
     <w:p>
@@ -1648,13 +1856,23 @@
           <w:szCs w:val="24"/>
         </w:rPr>
       </w:pPr>
-      <w:r>
-        <w:rPr>
-          <w:rFonts w:cstheme="minorHAnsi"/>
-          <w:sz w:val="24"/>
-          <w:szCs w:val="24"/>
-        </w:rPr>
-        <w:t xml:space="preserve">E.g </w:t>
+      <w:proofErr w:type="spellStart"/>
+      <w:r>
+        <w:rPr>
+          <w:rFonts w:cstheme="minorHAnsi"/>
+          <w:sz w:val="24"/>
+          <w:szCs w:val="24"/>
+        </w:rPr>
+        <w:t>E.g</w:t>
+      </w:r>
+      <w:proofErr w:type="spellEnd"/>
+      <w:r>
+        <w:rPr>
+          <w:rFonts w:cstheme="minorHAnsi"/>
+          <w:sz w:val="24"/>
+          <w:szCs w:val="24"/>
+        </w:rPr>
+        <w:t xml:space="preserve"> </w:t>
       </w:r>
       <w:r>
         <w:rPr>
@@ -1742,7 +1960,25 @@
           <w:sz w:val="24"/>
           <w:szCs w:val="24"/>
         </w:rPr>
-        <w:t xml:space="preserve"> (not particularly well formed sentence)</w:t>
+        <w:t xml:space="preserve"> (not particularly </w:t>
+      </w:r>
+      <w:proofErr w:type="gramStart"/>
+      <w:r>
+        <w:rPr>
+          <w:rFonts w:cstheme="minorHAnsi"/>
+          <w:sz w:val="24"/>
+          <w:szCs w:val="24"/>
+        </w:rPr>
+        <w:t>well formed</w:t>
+      </w:r>
+      <w:proofErr w:type="gramEnd"/>
+      <w:r>
+        <w:rPr>
+          <w:rFonts w:cstheme="minorHAnsi"/>
+          <w:sz w:val="24"/>
+          <w:szCs w:val="24"/>
+        </w:rPr>
+        <w:t xml:space="preserve"> sentence)</w:t>
       </w:r>
     </w:p>
     <w:p>
@@ -1995,7 +2231,25 @@
           <w:sz w:val="24"/>
           <w:szCs w:val="24"/>
         </w:rPr>
-        <w:t xml:space="preserve"> are indicated by ’and’ and both sides should stand alone as main clauses. This means no comma is required between the two clauses (around the and).</w:t>
+        <w:t xml:space="preserve"> are indicated by ’and’ and both sides should stand alone as main clauses. This means no comma is required between the two clauses (around the </w:t>
+      </w:r>
+      <w:proofErr w:type="spellStart"/>
+      <w:r>
+        <w:rPr>
+          <w:rFonts w:cstheme="minorHAnsi"/>
+          <w:sz w:val="24"/>
+          <w:szCs w:val="24"/>
+        </w:rPr>
+        <w:t>and</w:t>
+      </w:r>
+      <w:proofErr w:type="spellEnd"/>
+      <w:r>
+        <w:rPr>
+          <w:rFonts w:cstheme="minorHAnsi"/>
+          <w:sz w:val="24"/>
+          <w:szCs w:val="24"/>
+        </w:rPr>
+        <w:t>).</w:t>
       </w:r>
     </w:p>
     <w:p>
@@ -2202,7 +2456,38 @@
           <w:sz w:val="24"/>
           <w:szCs w:val="24"/>
         </w:rPr>
-        <w:t>Object, verb, subject,verb,subject.</w:t>
+        <w:t xml:space="preserve">Object, verb, </w:t>
+      </w:r>
+      <w:proofErr w:type="spellStart"/>
+      <w:proofErr w:type="gramStart"/>
+      <w:r>
+        <w:rPr>
+          <w:rFonts w:cstheme="minorHAnsi"/>
+          <w:color w:val="70AD47" w:themeColor="accent6"/>
+          <w:sz w:val="24"/>
+          <w:szCs w:val="24"/>
+        </w:rPr>
+        <w:t>subject,verb</w:t>
+      </w:r>
+      <w:proofErr w:type="gramEnd"/>
+      <w:r>
+        <w:rPr>
+          <w:rFonts w:cstheme="minorHAnsi"/>
+          <w:color w:val="70AD47" w:themeColor="accent6"/>
+          <w:sz w:val="24"/>
+          <w:szCs w:val="24"/>
+        </w:rPr>
+        <w:t>,subject</w:t>
+      </w:r>
+      <w:proofErr w:type="spellEnd"/>
+      <w:r>
+        <w:rPr>
+          <w:rFonts w:cstheme="minorHAnsi"/>
+          <w:color w:val="70AD47" w:themeColor="accent6"/>
+          <w:sz w:val="24"/>
+          <w:szCs w:val="24"/>
+        </w:rPr>
+        <w:t>.</w:t>
       </w:r>
     </w:p>
     <w:p>
@@ -2319,7 +2604,17 @@
           <w:sz w:val="24"/>
           <w:szCs w:val="24"/>
         </w:rPr>
-        <w:t>Section 2 discusses the functionality needed from the HAM6 layout</w:t>
+        <w:t xml:space="preserve">Section 2 discusses the functionality needed from the HAM6 </w:t>
+      </w:r>
+      <w:proofErr w:type="gramStart"/>
+      <w:r>
+        <w:rPr>
+          <w:rFonts w:cstheme="minorHAnsi"/>
+          <w:color w:val="FF0000"/>
+          <w:sz w:val="24"/>
+          <w:szCs w:val="24"/>
+        </w:rPr>
+        <w:t>layout</w:t>
       </w:r>
       <w:r>
         <w:rPr>
@@ -2339,7 +2634,17 @@
           <w:sz w:val="24"/>
           <w:szCs w:val="24"/>
         </w:rPr>
-        <w:t xml:space="preserve"> and analyses the proposed HAM6 layout</w:t>
+        <w:t xml:space="preserve"> and</w:t>
+      </w:r>
+      <w:proofErr w:type="gramEnd"/>
+      <w:r>
+        <w:rPr>
+          <w:rFonts w:cstheme="minorHAnsi"/>
+          <w:color w:val="FF0000"/>
+          <w:sz w:val="24"/>
+          <w:szCs w:val="24"/>
+        </w:rPr>
+        <w:t xml:space="preserve"> analyses the proposed HAM6 layout</w:t>
       </w:r>
       <w:r>
         <w:rPr>
@@ -2372,7 +2677,27 @@
           <w:sz w:val="24"/>
           <w:szCs w:val="24"/>
         </w:rPr>
-        <w:t>Alice goes fishing by the lake, and catches fish.</w:t>
+        <w:t xml:space="preserve">Alice goes fishing by the </w:t>
+      </w:r>
+      <w:proofErr w:type="gramStart"/>
+      <w:r>
+        <w:rPr>
+          <w:rFonts w:cstheme="minorHAnsi"/>
+          <w:color w:val="FF0000"/>
+          <w:sz w:val="24"/>
+          <w:szCs w:val="24"/>
+        </w:rPr>
+        <w:t>lake, and</w:t>
+      </w:r>
+      <w:proofErr w:type="gramEnd"/>
+      <w:r>
+        <w:rPr>
+          <w:rFonts w:cstheme="minorHAnsi"/>
+          <w:color w:val="FF0000"/>
+          <w:sz w:val="24"/>
+          <w:szCs w:val="24"/>
+        </w:rPr>
+        <w:t xml:space="preserve"> catches fish.</w:t>
       </w:r>
     </w:p>
     <w:p>
@@ -2418,7 +2743,25 @@
           <w:sz w:val="24"/>
           <w:szCs w:val="24"/>
         </w:rPr>
-        <w:t>noun (it’s a ‘thing’)</w:t>
+        <w:t>noun (</w:t>
+      </w:r>
+      <w:proofErr w:type="gramStart"/>
+      <w:r>
+        <w:rPr>
+          <w:rFonts w:cstheme="minorHAnsi"/>
+          <w:sz w:val="24"/>
+          <w:szCs w:val="24"/>
+        </w:rPr>
+        <w:t>it’s</w:t>
+      </w:r>
+      <w:proofErr w:type="gramEnd"/>
+      <w:r>
+        <w:rPr>
+          <w:rFonts w:cstheme="minorHAnsi"/>
+          <w:sz w:val="24"/>
+          <w:szCs w:val="24"/>
+        </w:rPr>
+        <w:t xml:space="preserve"> a ‘thing’)</w:t>
       </w:r>
       <w:r>
         <w:rPr>
@@ -2611,7 +2954,25 @@
           <w:sz w:val="24"/>
           <w:szCs w:val="24"/>
         </w:rPr>
-        <w:t>conjunction (and, but, so)</w:t>
+        <w:t xml:space="preserve">conjunction (and, </w:t>
+      </w:r>
+      <w:proofErr w:type="gramStart"/>
+      <w:r>
+        <w:rPr>
+          <w:rFonts w:cstheme="minorHAnsi"/>
+          <w:sz w:val="24"/>
+          <w:szCs w:val="24"/>
+        </w:rPr>
+        <w:t>but,</w:t>
+      </w:r>
+      <w:proofErr w:type="gramEnd"/>
+      <w:r>
+        <w:rPr>
+          <w:rFonts w:cstheme="minorHAnsi"/>
+          <w:sz w:val="24"/>
+          <w:szCs w:val="24"/>
+        </w:rPr>
+        <w:t xml:space="preserve"> so)</w:t>
       </w:r>
       <w:r>
         <w:rPr>
@@ -2727,7 +3088,27 @@
           <w:sz w:val="24"/>
           <w:szCs w:val="24"/>
         </w:rPr>
-        <w:t>BHD is a method of measuring information encoded by a light field, it forms a key part of many quantum optics experiments.</w:t>
+        <w:t xml:space="preserve">BHD is a method of measuring information encoded by a light </w:t>
+      </w:r>
+      <w:proofErr w:type="gramStart"/>
+      <w:r>
+        <w:rPr>
+          <w:rFonts w:cstheme="minorHAnsi"/>
+          <w:color w:val="FF0000"/>
+          <w:sz w:val="24"/>
+          <w:szCs w:val="24"/>
+        </w:rPr>
+        <w:t>field,</w:t>
+      </w:r>
+      <w:proofErr w:type="gramEnd"/>
+      <w:r>
+        <w:rPr>
+          <w:rFonts w:cstheme="minorHAnsi"/>
+          <w:color w:val="FF0000"/>
+          <w:sz w:val="24"/>
+          <w:szCs w:val="24"/>
+        </w:rPr>
+        <w:t xml:space="preserve"> it forms a key part of many quantum optics experiments.</w:t>
       </w:r>
     </w:p>
     <w:p>
@@ -2782,15 +3163,33 @@
           <w:sz w:val="24"/>
           <w:szCs w:val="24"/>
         </w:rPr>
-        <w:t>Commas can be brackets</w:t>
-      </w:r>
-      <w:r>
-        <w:rPr>
-          <w:rFonts w:cstheme="minorHAnsi"/>
-          <w:sz w:val="24"/>
-          <w:szCs w:val="24"/>
-        </w:rPr>
-        <w:t xml:space="preserve">: e.g. The rat, which was </w:t>
+        <w:t xml:space="preserve">Commas can be </w:t>
+      </w:r>
+      <w:proofErr w:type="gramStart"/>
+      <w:r>
+        <w:rPr>
+          <w:rFonts w:cstheme="minorHAnsi"/>
+          <w:sz w:val="24"/>
+          <w:szCs w:val="24"/>
+        </w:rPr>
+        <w:t>brackets</w:t>
+      </w:r>
+      <w:r>
+        <w:rPr>
+          <w:rFonts w:cstheme="minorHAnsi"/>
+          <w:sz w:val="24"/>
+          <w:szCs w:val="24"/>
+        </w:rPr>
+        <w:t>:</w:t>
+      </w:r>
+      <w:proofErr w:type="gramEnd"/>
+      <w:r>
+        <w:rPr>
+          <w:rFonts w:cstheme="minorHAnsi"/>
+          <w:sz w:val="24"/>
+          <w:szCs w:val="24"/>
+        </w:rPr>
+        <w:t xml:space="preserve"> e.g. The rat, which was </w:t>
       </w:r>
       <w:r>
         <w:rPr>
@@ -2838,13 +3237,23 @@
           <w:szCs w:val="24"/>
         </w:rPr>
       </w:pPr>
-      <w:r>
-        <w:rPr>
-          <w:rFonts w:cstheme="minorHAnsi"/>
-          <w:sz w:val="24"/>
-          <w:szCs w:val="24"/>
-        </w:rPr>
-        <w:t xml:space="preserve">However is a </w:t>
+      <w:proofErr w:type="gramStart"/>
+      <w:r>
+        <w:rPr>
+          <w:rFonts w:cstheme="minorHAnsi"/>
+          <w:sz w:val="24"/>
+          <w:szCs w:val="24"/>
+        </w:rPr>
+        <w:t>However</w:t>
+      </w:r>
+      <w:proofErr w:type="gramEnd"/>
+      <w:r>
+        <w:rPr>
+          <w:rFonts w:cstheme="minorHAnsi"/>
+          <w:sz w:val="24"/>
+          <w:szCs w:val="24"/>
+        </w:rPr>
+        <w:t xml:space="preserve"> is a </w:t>
       </w:r>
       <w:r>
         <w:rPr>
@@ -2876,7 +3285,25 @@
           <w:sz w:val="24"/>
           <w:szCs w:val="24"/>
         </w:rPr>
-        <w:t xml:space="preserve"> e.g:</w:t>
+        <w:t xml:space="preserve"> </w:t>
+      </w:r>
+      <w:proofErr w:type="spellStart"/>
+      <w:r>
+        <w:rPr>
+          <w:rFonts w:cstheme="minorHAnsi"/>
+          <w:sz w:val="24"/>
+          <w:szCs w:val="24"/>
+        </w:rPr>
+        <w:t>e.g</w:t>
+      </w:r>
+      <w:proofErr w:type="spellEnd"/>
+      <w:r>
+        <w:rPr>
+          <w:rFonts w:cstheme="minorHAnsi"/>
+          <w:sz w:val="24"/>
+          <w:szCs w:val="24"/>
+        </w:rPr>
+        <w:t>:</w:t>
       </w:r>
     </w:p>
     <w:p>
@@ -2900,7 +3327,27 @@
           <w:sz w:val="24"/>
           <w:szCs w:val="24"/>
         </w:rPr>
-        <w:t>The rat was gone, however it was not forgotten.</w:t>
+        <w:t xml:space="preserve">The rat was </w:t>
+      </w:r>
+      <w:proofErr w:type="gramStart"/>
+      <w:r>
+        <w:rPr>
+          <w:rFonts w:cstheme="minorHAnsi"/>
+          <w:color w:val="FF0000"/>
+          <w:sz w:val="24"/>
+          <w:szCs w:val="24"/>
+        </w:rPr>
+        <w:t>gone,</w:t>
+      </w:r>
+      <w:proofErr w:type="gramEnd"/>
+      <w:r>
+        <w:rPr>
+          <w:rFonts w:cstheme="minorHAnsi"/>
+          <w:color w:val="FF0000"/>
+          <w:sz w:val="24"/>
+          <w:szCs w:val="24"/>
+        </w:rPr>
+        <w:t xml:space="preserve"> however it was not forgotten.</w:t>
       </w:r>
     </w:p>
     <w:p>
@@ -3096,7 +3543,25 @@
           <w:sz w:val="24"/>
           <w:szCs w:val="24"/>
         </w:rPr>
-        <w:t>Be careful with ‘as’. Without a comma as can be an adverb</w:t>
+        <w:t>Be careful with ‘</w:t>
+      </w:r>
+      <w:proofErr w:type="gramStart"/>
+      <w:r>
+        <w:rPr>
+          <w:rFonts w:cstheme="minorHAnsi"/>
+          <w:sz w:val="24"/>
+          <w:szCs w:val="24"/>
+        </w:rPr>
+        <w:t>as’</w:t>
+      </w:r>
+      <w:proofErr w:type="gramEnd"/>
+      <w:r>
+        <w:rPr>
+          <w:rFonts w:cstheme="minorHAnsi"/>
+          <w:sz w:val="24"/>
+          <w:szCs w:val="24"/>
+        </w:rPr>
+        <w:t>. Without a comma as can be an adverb</w:t>
       </w:r>
       <w:r>
         <w:rPr>
@@ -3122,13 +3587,23 @@
         </w:rPr>
         <w:t xml:space="preserve">. With a comma, </w:t>
       </w:r>
-      <w:r>
-        <w:rPr>
-          <w:rFonts w:cstheme="minorHAnsi"/>
-          <w:sz w:val="24"/>
-          <w:szCs w:val="24"/>
-        </w:rPr>
-        <w:t xml:space="preserve">it’s the start of a </w:t>
+      <w:proofErr w:type="gramStart"/>
+      <w:r>
+        <w:rPr>
+          <w:rFonts w:cstheme="minorHAnsi"/>
+          <w:sz w:val="24"/>
+          <w:szCs w:val="24"/>
+        </w:rPr>
+        <w:t>it’s</w:t>
+      </w:r>
+      <w:proofErr w:type="gramEnd"/>
+      <w:r>
+        <w:rPr>
+          <w:rFonts w:cstheme="minorHAnsi"/>
+          <w:sz w:val="24"/>
+          <w:szCs w:val="24"/>
+        </w:rPr>
+        <w:t xml:space="preserve"> the start of a </w:t>
       </w:r>
       <w:r>
         <w:rPr>
@@ -3239,7 +3714,25 @@
           <w:sz w:val="24"/>
           <w:szCs w:val="24"/>
         </w:rPr>
-        <w:t>Adverbial clause: this is a clause in a complex sentence that provides adverbial in formation about it</w:t>
+        <w:t xml:space="preserve">Adverbial clause: this is a clause in a complex sentence that provides adverbial </w:t>
+      </w:r>
+      <w:proofErr w:type="gramStart"/>
+      <w:r>
+        <w:rPr>
+          <w:rFonts w:cstheme="minorHAnsi"/>
+          <w:sz w:val="24"/>
+          <w:szCs w:val="24"/>
+        </w:rPr>
+        <w:t>in formation</w:t>
+      </w:r>
+      <w:proofErr w:type="gramEnd"/>
+      <w:r>
+        <w:rPr>
+          <w:rFonts w:cstheme="minorHAnsi"/>
+          <w:sz w:val="24"/>
+          <w:szCs w:val="24"/>
+        </w:rPr>
+        <w:t xml:space="preserve"> about it</w:t>
       </w:r>
       <w:r>
         <w:rPr>
@@ -3297,10 +3790,12 @@
           <w:numId w:val="7"/>
         </w:numPr>
         <w:rPr>
+          <w:rStyle w:val="Hyperlink"/>
           <w:rFonts w:cstheme="minorHAnsi"/>
           <w:color w:val="70AD47" w:themeColor="accent6"/>
           <w:sz w:val="24"/>
           <w:szCs w:val="24"/>
+          <w:u w:val="none"/>
         </w:rPr>
       </w:pPr>
       <w:r>
@@ -3341,7 +3836,25 @@
           <w:sz w:val="24"/>
           <w:szCs w:val="24"/>
         </w:rPr>
-        <w:t xml:space="preserve"> with an adverb that sets the tone of the sentence, such  as ‘fundamentally’, </w:t>
+        <w:t xml:space="preserve"> with an adverb that sets the tone of the sentence, </w:t>
+      </w:r>
+      <w:proofErr w:type="gramStart"/>
+      <w:r>
+        <w:rPr>
+          <w:rFonts w:cstheme="minorHAnsi"/>
+          <w:sz w:val="24"/>
+          <w:szCs w:val="24"/>
+        </w:rPr>
+        <w:t>such  as</w:t>
+      </w:r>
+      <w:proofErr w:type="gramEnd"/>
+      <w:r>
+        <w:rPr>
+          <w:rFonts w:cstheme="minorHAnsi"/>
+          <w:sz w:val="24"/>
+          <w:szCs w:val="24"/>
+        </w:rPr>
+        <w:t xml:space="preserve"> ‘fundamentally’, </w:t>
       </w:r>
       <w:r>
         <w:rPr>
@@ -3381,6 +3894,267 @@
     </w:p>
     <w:p>
       <w:pPr>
+        <w:pStyle w:val="ListParagraph"/>
+        <w:numPr>
+          <w:ilvl w:val="1"/>
+          <w:numId w:val="7"/>
+        </w:numPr>
+        <w:rPr>
+          <w:rFonts w:cstheme="minorHAnsi"/>
+          <w:b/>
+          <w:bCs/>
+          <w:color w:val="70AD47" w:themeColor="accent6"/>
+          <w:sz w:val="24"/>
+          <w:szCs w:val="24"/>
+        </w:rPr>
+      </w:pPr>
+      <w:r>
+        <w:rPr>
+          <w:rFonts w:cstheme="minorHAnsi"/>
+          <w:b/>
+          <w:bCs/>
+          <w:sz w:val="24"/>
+          <w:szCs w:val="24"/>
+        </w:rPr>
+        <w:t>SO</w:t>
+      </w:r>
+      <w:r>
+        <w:rPr>
+          <w:rFonts w:cstheme="minorHAnsi"/>
+          <w:b/>
+          <w:bCs/>
+          <w:sz w:val="24"/>
+          <w:szCs w:val="24"/>
+        </w:rPr>
+        <w:t>:</w:t>
+      </w:r>
+    </w:p>
+    <w:p>
+      <w:pPr>
+        <w:pStyle w:val="ListParagraph"/>
+        <w:numPr>
+          <w:ilvl w:val="2"/>
+          <w:numId w:val="7"/>
+        </w:numPr>
+        <w:rPr>
+          <w:rFonts w:cstheme="minorHAnsi"/>
+          <w:b/>
+          <w:bCs/>
+          <w:sz w:val="24"/>
+          <w:szCs w:val="24"/>
+        </w:rPr>
+      </w:pPr>
+      <w:r>
+        <w:rPr>
+          <w:rFonts w:cstheme="minorHAnsi"/>
+          <w:sz w:val="24"/>
+          <w:szCs w:val="24"/>
+        </w:rPr>
+        <w:t xml:space="preserve">If </w:t>
+      </w:r>
+      <w:proofErr w:type="gramStart"/>
+      <w:r>
+        <w:rPr>
+          <w:rFonts w:cstheme="minorHAnsi"/>
+          <w:sz w:val="24"/>
+          <w:szCs w:val="24"/>
+        </w:rPr>
+        <w:t>so</w:t>
+      </w:r>
+      <w:proofErr w:type="gramEnd"/>
+      <w:r>
+        <w:rPr>
+          <w:rFonts w:cstheme="minorHAnsi"/>
+          <w:sz w:val="24"/>
+          <w:szCs w:val="24"/>
+        </w:rPr>
+        <w:t xml:space="preserve"> is a coordinating conjunction, its is preceded by a comma:</w:t>
+      </w:r>
+    </w:p>
+    <w:p>
+      <w:pPr>
+        <w:pStyle w:val="ListParagraph"/>
+        <w:numPr>
+          <w:ilvl w:val="3"/>
+          <w:numId w:val="7"/>
+        </w:numPr>
+        <w:rPr>
+          <w:rFonts w:cstheme="minorHAnsi"/>
+          <w:b/>
+          <w:bCs/>
+          <w:sz w:val="24"/>
+          <w:szCs w:val="24"/>
+        </w:rPr>
+      </w:pPr>
+      <w:r>
+        <w:rPr>
+          <w:rFonts w:cstheme="minorHAnsi"/>
+          <w:sz w:val="24"/>
+          <w:szCs w:val="24"/>
+        </w:rPr>
+        <w:t>To check if this is true, replace so with and so. If the sentence still makes sense, then so is being a coordinating conjunction</w:t>
+      </w:r>
+      <w:r>
+        <w:rPr>
+          <w:rFonts w:cstheme="minorHAnsi"/>
+          <w:sz w:val="24"/>
+          <w:szCs w:val="24"/>
+        </w:rPr>
+        <w:t>.</w:t>
+      </w:r>
+      <w:r>
+        <w:rPr>
+          <w:rFonts w:cstheme="minorHAnsi"/>
+          <w:sz w:val="24"/>
+          <w:szCs w:val="24"/>
+        </w:rPr>
+        <w:t xml:space="preserve"> (this joins two independent clauses)</w:t>
+      </w:r>
+    </w:p>
+    <w:p>
+      <w:pPr>
+        <w:pStyle w:val="ListParagraph"/>
+        <w:numPr>
+          <w:ilvl w:val="2"/>
+          <w:numId w:val="7"/>
+        </w:numPr>
+        <w:rPr>
+          <w:rFonts w:cstheme="minorHAnsi"/>
+          <w:b/>
+          <w:bCs/>
+          <w:sz w:val="24"/>
+          <w:szCs w:val="24"/>
+        </w:rPr>
+      </w:pPr>
+      <w:r>
+        <w:rPr>
+          <w:rFonts w:cstheme="minorHAnsi"/>
+          <w:sz w:val="24"/>
+          <w:szCs w:val="24"/>
+        </w:rPr>
+        <w:t xml:space="preserve">If </w:t>
+      </w:r>
+      <w:proofErr w:type="gramStart"/>
+      <w:r>
+        <w:rPr>
+          <w:rFonts w:cstheme="minorHAnsi"/>
+          <w:sz w:val="24"/>
+          <w:szCs w:val="24"/>
+        </w:rPr>
+        <w:t>so</w:t>
+      </w:r>
+      <w:proofErr w:type="gramEnd"/>
+      <w:r>
+        <w:rPr>
+          <w:rFonts w:cstheme="minorHAnsi"/>
+          <w:sz w:val="24"/>
+          <w:szCs w:val="24"/>
+        </w:rPr>
+        <w:t xml:space="preserve"> is a subordinating conjunction, it is not preceded by a comma</w:t>
+      </w:r>
+    </w:p>
+    <w:p>
+      <w:pPr>
+        <w:pStyle w:val="ListParagraph"/>
+        <w:numPr>
+          <w:ilvl w:val="3"/>
+          <w:numId w:val="7"/>
+        </w:numPr>
+        <w:rPr>
+          <w:rFonts w:cstheme="minorHAnsi"/>
+          <w:b/>
+          <w:bCs/>
+          <w:sz w:val="24"/>
+          <w:szCs w:val="24"/>
+        </w:rPr>
+      </w:pPr>
+      <w:r>
+        <w:rPr>
+          <w:rFonts w:cstheme="minorHAnsi"/>
+          <w:sz w:val="24"/>
+          <w:szCs w:val="24"/>
+        </w:rPr>
+        <w:t xml:space="preserve">To check if this is true, replace so with so that. If the sentence meaning </w:t>
+      </w:r>
+      <w:proofErr w:type="gramStart"/>
+      <w:r>
+        <w:rPr>
+          <w:rFonts w:cstheme="minorHAnsi"/>
+          <w:sz w:val="24"/>
+          <w:szCs w:val="24"/>
+        </w:rPr>
+        <w:t>doesn’t</w:t>
+      </w:r>
+      <w:proofErr w:type="gramEnd"/>
+      <w:r>
+        <w:rPr>
+          <w:rFonts w:cstheme="minorHAnsi"/>
+          <w:sz w:val="24"/>
+          <w:szCs w:val="24"/>
+        </w:rPr>
+        <w:t xml:space="preserve"> change, then so is being used as a subordinating conjunction</w:t>
+      </w:r>
+      <w:r>
+        <w:rPr>
+          <w:rFonts w:cstheme="minorHAnsi"/>
+          <w:sz w:val="24"/>
+          <w:szCs w:val="24"/>
+        </w:rPr>
+        <w:t xml:space="preserve">. (this joins </w:t>
+      </w:r>
+      <w:proofErr w:type="spellStart"/>
+      <w:proofErr w:type="gramStart"/>
+      <w:r>
+        <w:rPr>
+          <w:rFonts w:cstheme="minorHAnsi"/>
+          <w:sz w:val="24"/>
+          <w:szCs w:val="24"/>
+        </w:rPr>
+        <w:t>a</w:t>
+      </w:r>
+      <w:proofErr w:type="spellEnd"/>
+      <w:proofErr w:type="gramEnd"/>
+      <w:r>
+        <w:rPr>
+          <w:rFonts w:cstheme="minorHAnsi"/>
+          <w:sz w:val="24"/>
+          <w:szCs w:val="24"/>
+        </w:rPr>
+        <w:t xml:space="preserve"> independent and </w:t>
+      </w:r>
+      <w:r>
+        <w:rPr>
+          <w:rFonts w:cstheme="minorHAnsi"/>
+          <w:sz w:val="24"/>
+          <w:szCs w:val="24"/>
+        </w:rPr>
+        <w:t>subordinate clause)</w:t>
+      </w:r>
+    </w:p>
+    <w:p>
+      <w:pPr>
+        <w:pStyle w:val="ListParagraph"/>
+        <w:numPr>
+          <w:ilvl w:val="2"/>
+          <w:numId w:val="7"/>
+        </w:numPr>
+        <w:rPr>
+          <w:rFonts w:cstheme="minorHAnsi"/>
+          <w:sz w:val="24"/>
+          <w:szCs w:val="24"/>
+        </w:rPr>
+      </w:pPr>
+      <w:r>
+        <w:rPr>
+          <w:rFonts w:cstheme="minorHAnsi"/>
+          <w:sz w:val="24"/>
+          <w:szCs w:val="24"/>
+        </w:rPr>
+        <w:t>A comma after so is ‘informal’.</w:t>
+      </w:r>
+    </w:p>
+    <w:p>
+      <w:pPr>
         <w:rPr>
           <w:rFonts w:cstheme="minorHAnsi"/>
           <w:color w:val="70AD47" w:themeColor="accent6"/>
@@ -3787,6 +4561,7 @@
           <w:sz w:val="24"/>
           <w:szCs w:val="24"/>
         </w:rPr>
+        <w:lastRenderedPageBreak/>
         <w:t>This chapter explore</w:t>
       </w:r>
       <w:r>
@@ -3907,13 +4682,21 @@
           <w:szCs w:val="24"/>
         </w:rPr>
       </w:pPr>
-      <w:r>
-        <w:rPr>
-          <w:sz w:val="24"/>
-          <w:szCs w:val="24"/>
-        </w:rPr>
-        <w:lastRenderedPageBreak/>
-        <w:t>Ctrl+f 1, 2, 3, 4, 5, 6, 7, 8, 9 and 10, replace with one, two, three …</w:t>
+      <w:proofErr w:type="spellStart"/>
+      <w:r>
+        <w:rPr>
+          <w:sz w:val="24"/>
+          <w:szCs w:val="24"/>
+        </w:rPr>
+        <w:t>Ctrl+f</w:t>
+      </w:r>
+      <w:proofErr w:type="spellEnd"/>
+      <w:r>
+        <w:rPr>
+          <w:sz w:val="24"/>
+          <w:szCs w:val="24"/>
+        </w:rPr>
+        <w:t xml:space="preserve"> 1, 2, 3, 4, 5, 6, 7, 8, 9 and 10, replace with one, two, three …</w:t>
       </w:r>
     </w:p>
     <w:p>
@@ -3928,12 +4711,21 @@
           <w:szCs w:val="24"/>
         </w:rPr>
       </w:pPr>
-      <w:r>
-        <w:rPr>
-          <w:sz w:val="24"/>
-          <w:szCs w:val="24"/>
-        </w:rPr>
-        <w:t>Ctrl+f effect and affect</w:t>
+      <w:proofErr w:type="spellStart"/>
+      <w:r>
+        <w:rPr>
+          <w:sz w:val="24"/>
+          <w:szCs w:val="24"/>
+        </w:rPr>
+        <w:t>Ctrl+f</w:t>
+      </w:r>
+      <w:proofErr w:type="spellEnd"/>
+      <w:r>
+        <w:rPr>
+          <w:sz w:val="24"/>
+          <w:szCs w:val="24"/>
+        </w:rPr>
+        <w:t xml:space="preserve"> effect and affect</w:t>
       </w:r>
     </w:p>
     <w:p>
@@ -3948,20 +4740,38 @@
           <w:szCs w:val="24"/>
         </w:rPr>
       </w:pPr>
-      <w:r>
-        <w:rPr>
-          <w:sz w:val="24"/>
-          <w:szCs w:val="24"/>
-        </w:rPr>
-        <w:t xml:space="preserve">Ctrl+f </w:t>
-      </w:r>
-      <w:r>
-        <w:rPr>
-          <w:sz w:val="24"/>
-          <w:szCs w:val="24"/>
-        </w:rPr>
-        <w:t>the the</w:t>
-      </w:r>
+      <w:proofErr w:type="spellStart"/>
+      <w:r>
+        <w:rPr>
+          <w:sz w:val="24"/>
+          <w:szCs w:val="24"/>
+        </w:rPr>
+        <w:t>Ctrl+f</w:t>
+      </w:r>
+      <w:proofErr w:type="spellEnd"/>
+      <w:r>
+        <w:rPr>
+          <w:sz w:val="24"/>
+          <w:szCs w:val="24"/>
+        </w:rPr>
+        <w:t xml:space="preserve"> </w:t>
+      </w:r>
+      <w:r>
+        <w:rPr>
+          <w:sz w:val="24"/>
+          <w:szCs w:val="24"/>
+        </w:rPr>
+        <w:t xml:space="preserve">the </w:t>
+      </w:r>
+      <w:proofErr w:type="spellStart"/>
+      <w:r>
+        <w:rPr>
+          <w:sz w:val="24"/>
+          <w:szCs w:val="24"/>
+        </w:rPr>
+        <w:t>the</w:t>
+      </w:r>
+      <w:proofErr w:type="spellEnd"/>
     </w:p>
     <w:p>
       <w:pPr>
@@ -3980,7 +4790,23 @@
           <w:sz w:val="24"/>
           <w:szCs w:val="24"/>
         </w:rPr>
-        <w:t>Look for etc. and etc.~</w:t>
+        <w:t xml:space="preserve">Look for etc. </w:t>
+      </w:r>
+      <w:proofErr w:type="gramStart"/>
+      <w:r>
+        <w:rPr>
+          <w:sz w:val="24"/>
+          <w:szCs w:val="24"/>
+        </w:rPr>
+        <w:t>and etc.</w:t>
+      </w:r>
+      <w:proofErr w:type="gramEnd"/>
+      <w:r>
+        <w:rPr>
+          <w:sz w:val="24"/>
+          <w:szCs w:val="24"/>
+        </w:rPr>
+        <w:t>~</w:t>
       </w:r>
     </w:p>
     <w:p>
@@ -4020,8 +4846,17 @@
           <w:sz w:val="24"/>
           <w:szCs w:val="24"/>
         </w:rPr>
-        <w:t>Beam splitter, not beamsplitter</w:t>
-      </w:r>
+        <w:t xml:space="preserve">Beam splitter, not </w:t>
+      </w:r>
+      <w:proofErr w:type="spellStart"/>
+      <w:r>
+        <w:rPr>
+          <w:sz w:val="24"/>
+          <w:szCs w:val="24"/>
+        </w:rPr>
+        <w:t>beamsplitter</w:t>
+      </w:r>
+      <w:proofErr w:type="spellEnd"/>
     </w:p>
     <w:p>
       <w:pPr>
@@ -4067,7 +4902,23 @@
           <w:sz w:val="24"/>
           <w:szCs w:val="24"/>
         </w:rPr>
-        <w:t>Remove doesn’t, replace with does not, etc.</w:t>
+        <w:t xml:space="preserve">Remove </w:t>
+      </w:r>
+      <w:proofErr w:type="gramStart"/>
+      <w:r>
+        <w:rPr>
+          <w:sz w:val="24"/>
+          <w:szCs w:val="24"/>
+        </w:rPr>
+        <w:t>doesn’t</w:t>
+      </w:r>
+      <w:proofErr w:type="gramEnd"/>
+      <w:r>
+        <w:rPr>
+          <w:sz w:val="24"/>
+          <w:szCs w:val="24"/>
+        </w:rPr>
+        <w:t>, replace with does not, etc.</w:t>
       </w:r>
     </w:p>
     <w:p>
@@ -4087,7 +4938,23 @@
           <w:sz w:val="24"/>
           <w:szCs w:val="24"/>
         </w:rPr>
-        <w:t xml:space="preserve">Effect is a noun, affect is a verb. </w:t>
+        <w:t xml:space="preserve">Effect is a </w:t>
+      </w:r>
+      <w:proofErr w:type="gramStart"/>
+      <w:r>
+        <w:rPr>
+          <w:sz w:val="24"/>
+          <w:szCs w:val="24"/>
+        </w:rPr>
+        <w:t>noun,</w:t>
+      </w:r>
+      <w:proofErr w:type="gramEnd"/>
+      <w:r>
+        <w:rPr>
+          <w:sz w:val="24"/>
+          <w:szCs w:val="24"/>
+        </w:rPr>
+        <w:t xml:space="preserve"> affect is a verb. </w:t>
       </w:r>
       <w:r>
         <w:rPr>
@@ -4299,7 +5166,23 @@
           <w:sz w:val="24"/>
           <w:szCs w:val="24"/>
         </w:rPr>
-        <w:t>Lots end in ‘ly’</w:t>
+        <w:t>Lots end in ‘</w:t>
+      </w:r>
+      <w:proofErr w:type="spellStart"/>
+      <w:r>
+        <w:rPr>
+          <w:sz w:val="24"/>
+          <w:szCs w:val="24"/>
+        </w:rPr>
+        <w:t>ly</w:t>
+      </w:r>
+      <w:proofErr w:type="spellEnd"/>
+      <w:r>
+        <w:rPr>
+          <w:sz w:val="24"/>
+          <w:szCs w:val="24"/>
+        </w:rPr>
+        <w:t>’</w:t>
       </w:r>
     </w:p>
     <w:p>
@@ -4424,6 +5307,7 @@
         </w:rPr>
         <w:t xml:space="preserve">Photodiode, not </w:t>
       </w:r>
+      <w:proofErr w:type="gramStart"/>
       <w:r>
         <w:rPr>
           <w:sz w:val="24"/>
@@ -4431,6 +5315,7 @@
         </w:rPr>
         <w:t>Photo-diode</w:t>
       </w:r>
+      <w:proofErr w:type="gramEnd"/>
     </w:p>
     <w:p>
       <w:pPr>
@@ -4449,7 +5334,23 @@
           <w:sz w:val="24"/>
           <w:szCs w:val="24"/>
         </w:rPr>
-        <w:t>Check ngram viewer if unsure.</w:t>
+        <w:t xml:space="preserve">Check </w:t>
+      </w:r>
+      <w:proofErr w:type="spellStart"/>
+      <w:r>
+        <w:rPr>
+          <w:sz w:val="24"/>
+          <w:szCs w:val="24"/>
+        </w:rPr>
+        <w:t>ngram</w:t>
+      </w:r>
+      <w:proofErr w:type="spellEnd"/>
+      <w:r>
+        <w:rPr>
+          <w:sz w:val="24"/>
+          <w:szCs w:val="24"/>
+        </w:rPr>
+        <w:t xml:space="preserve"> viewer if unsure.</w:t>
       </w:r>
     </w:p>
     <w:p>
@@ -4491,12 +5392,21 @@
           <w:szCs w:val="24"/>
         </w:rPr>
       </w:pPr>
-      <w:r>
-        <w:rPr>
-          <w:sz w:val="24"/>
-          <w:szCs w:val="24"/>
-        </w:rPr>
-        <w:t xml:space="preserve">E.g </w:t>
+      <w:proofErr w:type="spellStart"/>
+      <w:r>
+        <w:rPr>
+          <w:sz w:val="24"/>
+          <w:szCs w:val="24"/>
+        </w:rPr>
+        <w:t>E.g</w:t>
+      </w:r>
+      <w:proofErr w:type="spellEnd"/>
+      <w:r>
+        <w:rPr>
+          <w:sz w:val="24"/>
+          <w:szCs w:val="24"/>
+        </w:rPr>
+        <w:t xml:space="preserve"> </w:t>
       </w:r>
       <w:r>
         <w:rPr>
@@ -4537,7 +5447,23 @@
           <w:sz w:val="24"/>
           <w:szCs w:val="24"/>
         </w:rPr>
-        <w:t>Current detector = aLIGO, future detector = LIGO A+, the detector in a general abstract sense = LIGO</w:t>
+        <w:t xml:space="preserve">Current detector = </w:t>
+      </w:r>
+      <w:proofErr w:type="spellStart"/>
+      <w:r>
+        <w:rPr>
+          <w:sz w:val="24"/>
+          <w:szCs w:val="24"/>
+        </w:rPr>
+        <w:t>aLIGO</w:t>
+      </w:r>
+      <w:proofErr w:type="spellEnd"/>
+      <w:r>
+        <w:rPr>
+          <w:sz w:val="24"/>
+          <w:szCs w:val="24"/>
+        </w:rPr>
+        <w:t>, future detector = LIGO A+, the detector in a general abstract sense = LIGO</w:t>
       </w:r>
     </w:p>
     <w:p>
@@ -4552,12 +5478,21 @@
           <w:szCs w:val="24"/>
         </w:rPr>
       </w:pPr>
-      <w:r>
-        <w:rPr>
-          <w:sz w:val="24"/>
-          <w:szCs w:val="24"/>
-        </w:rPr>
-        <w:t>None classical -&gt; non-classical</w:t>
+      <w:proofErr w:type="gramStart"/>
+      <w:r>
+        <w:rPr>
+          <w:sz w:val="24"/>
+          <w:szCs w:val="24"/>
+        </w:rPr>
+        <w:t>None classical</w:t>
+      </w:r>
+      <w:proofErr w:type="gramEnd"/>
+      <w:r>
+        <w:rPr>
+          <w:sz w:val="24"/>
+          <w:szCs w:val="24"/>
+        </w:rPr>
+        <w:t xml:space="preserve"> -&gt; non-classical</w:t>
       </w:r>
     </w:p>
     <w:p>
@@ -4747,6 +5682,7 @@
           <w:sz w:val="32"/>
           <w:szCs w:val="32"/>
         </w:rPr>
+        <w:lastRenderedPageBreak/>
         <w:t xml:space="preserve">Presentation of </w:t>
       </w:r>
       <w:r>
@@ -4777,7 +5713,39 @@
           <w:sz w:val="24"/>
           <w:szCs w:val="24"/>
         </w:rPr>
-        <w:t>Figures shall be saved as eps when using matplotlib or 'epsc' when using matlab. This is to prevent a latex warning.</w:t>
+        <w:t>Figures shall be saved as eps when using matplotlib or '</w:t>
+      </w:r>
+      <w:proofErr w:type="spellStart"/>
+      <w:r>
+        <w:rPr>
+          <w:sz w:val="24"/>
+          <w:szCs w:val="24"/>
+        </w:rPr>
+        <w:t>epsc</w:t>
+      </w:r>
+      <w:proofErr w:type="spellEnd"/>
+      <w:r>
+        <w:rPr>
+          <w:sz w:val="24"/>
+          <w:szCs w:val="24"/>
+        </w:rPr>
+        <w:t xml:space="preserve">' when using </w:t>
+      </w:r>
+      <w:proofErr w:type="spellStart"/>
+      <w:r>
+        <w:rPr>
+          <w:sz w:val="24"/>
+          <w:szCs w:val="24"/>
+        </w:rPr>
+        <w:t>matlab</w:t>
+      </w:r>
+      <w:proofErr w:type="spellEnd"/>
+      <w:r>
+        <w:rPr>
+          <w:sz w:val="24"/>
+          <w:szCs w:val="24"/>
+        </w:rPr>
+        <w:t>. This is to prevent a latex warning.</w:t>
       </w:r>
     </w:p>
     <w:p>
@@ -4831,7 +5799,23 @@
           <w:sz w:val="24"/>
           <w:szCs w:val="24"/>
         </w:rPr>
-        <w:t>Figure names shall be 'chapter description'_chapter_'figure description'. For</w:t>
+        <w:t xml:space="preserve">Figure names shall be 'chapter </w:t>
+      </w:r>
+      <w:proofErr w:type="spellStart"/>
+      <w:r>
+        <w:rPr>
+          <w:sz w:val="24"/>
+          <w:szCs w:val="24"/>
+        </w:rPr>
+        <w:t>description'_chapter_'figure</w:t>
+      </w:r>
+      <w:proofErr w:type="spellEnd"/>
+      <w:r>
+        <w:rPr>
+          <w:sz w:val="24"/>
+          <w:szCs w:val="24"/>
+        </w:rPr>
+        <w:t xml:space="preserve"> description'. For</w:t>
       </w:r>
       <w:r>
         <w:rPr>
@@ -4845,7 +5829,23 @@
           <w:sz w:val="24"/>
           <w:szCs w:val="24"/>
         </w:rPr>
-        <w:t>example, 'sim_chapter_Zoom_in_ETM_tuning' refers to the figure being in the</w:t>
+        <w:t>example, '</w:t>
+      </w:r>
+      <w:proofErr w:type="spellStart"/>
+      <w:r>
+        <w:rPr>
+          <w:sz w:val="24"/>
+          <w:szCs w:val="24"/>
+        </w:rPr>
+        <w:t>sim_chapter_Zoom_in_ETM_tuning</w:t>
+      </w:r>
+      <w:proofErr w:type="spellEnd"/>
+      <w:r>
+        <w:rPr>
+          <w:sz w:val="24"/>
+          <w:szCs w:val="24"/>
+        </w:rPr>
+        <w:t>' refers to the figure being in the</w:t>
       </w:r>
       <w:r>
         <w:rPr>
@@ -4899,8 +5899,23 @@
           <w:sz w:val="24"/>
           <w:szCs w:val="24"/>
         </w:rPr>
-        <w:lastRenderedPageBreak/>
-        <w:t>Are all lines visible/distinguishable? Changing thickness and linestyle can help.</w:t>
+        <w:t xml:space="preserve">Are all lines visible/distinguishable? Changing thickness and </w:t>
+      </w:r>
+      <w:proofErr w:type="spellStart"/>
+      <w:r>
+        <w:rPr>
+          <w:sz w:val="24"/>
+          <w:szCs w:val="24"/>
+        </w:rPr>
+        <w:t>linestyle</w:t>
+      </w:r>
+      <w:proofErr w:type="spellEnd"/>
+      <w:r>
+        <w:rPr>
+          <w:sz w:val="24"/>
+          <w:szCs w:val="24"/>
+        </w:rPr>
+        <w:t xml:space="preserve"> can help.</w:t>
       </w:r>
     </w:p>
     <w:p>
@@ -4915,12 +5930,37 @@
           <w:szCs w:val="24"/>
         </w:rPr>
       </w:pPr>
-      <w:r>
-        <w:rPr>
-          <w:sz w:val="24"/>
-          <w:szCs w:val="24"/>
-        </w:rPr>
-        <w:t>Are the axis labelled? The label is a sentence, so normal sentence capitalisation should be used. If its just one word, use a capital letter.</w:t>
+      <w:proofErr w:type="gramStart"/>
+      <w:r>
+        <w:rPr>
+          <w:sz w:val="24"/>
+          <w:szCs w:val="24"/>
+        </w:rPr>
+        <w:t>Are</w:t>
+      </w:r>
+      <w:proofErr w:type="gramEnd"/>
+      <w:r>
+        <w:rPr>
+          <w:sz w:val="24"/>
+          <w:szCs w:val="24"/>
+        </w:rPr>
+        <w:t xml:space="preserve"> the axis labelled? The label is a sentence, so normal sentence capitalisation should be used. If </w:t>
+      </w:r>
+      <w:proofErr w:type="spellStart"/>
+      <w:r>
+        <w:rPr>
+          <w:sz w:val="24"/>
+          <w:szCs w:val="24"/>
+        </w:rPr>
+        <w:t>its</w:t>
+      </w:r>
+      <w:proofErr w:type="spellEnd"/>
+      <w:r>
+        <w:rPr>
+          <w:sz w:val="24"/>
+          <w:szCs w:val="24"/>
+        </w:rPr>
+        <w:t xml:space="preserve"> just one word, use a capital letter.</w:t>
       </w:r>
     </w:p>
     <w:p>
@@ -4955,12 +5995,21 @@
           <w:szCs w:val="24"/>
         </w:rPr>
       </w:pPr>
-      <w:r>
-        <w:rPr>
-          <w:sz w:val="24"/>
-          <w:szCs w:val="24"/>
-        </w:rPr>
-        <w:t>Do the axis have units? The units should be put in brackets like (m). No other shape of brackets should be used.</w:t>
+      <w:proofErr w:type="gramStart"/>
+      <w:r>
+        <w:rPr>
+          <w:sz w:val="24"/>
+          <w:szCs w:val="24"/>
+        </w:rPr>
+        <w:t>Do</w:t>
+      </w:r>
+      <w:proofErr w:type="gramEnd"/>
+      <w:r>
+        <w:rPr>
+          <w:sz w:val="24"/>
+          <w:szCs w:val="24"/>
+        </w:rPr>
+        <w:t xml:space="preserve"> the axis have units? The units should be put in brackets like (m). No other shape of brackets should be used.</w:t>
       </w:r>
     </w:p>
     <w:p>
@@ -5000,7 +6049,23 @@
           <w:sz w:val="24"/>
           <w:szCs w:val="24"/>
         </w:rPr>
-        <w:t>Are subscripts properly typset?</w:t>
+        <w:t xml:space="preserve">Are subscripts properly </w:t>
+      </w:r>
+      <w:proofErr w:type="spellStart"/>
+      <w:r>
+        <w:rPr>
+          <w:sz w:val="24"/>
+          <w:szCs w:val="24"/>
+        </w:rPr>
+        <w:t>typset</w:t>
+      </w:r>
+      <w:proofErr w:type="spellEnd"/>
+      <w:r>
+        <w:rPr>
+          <w:sz w:val="24"/>
+          <w:szCs w:val="24"/>
+        </w:rPr>
+        <w:t>?</w:t>
       </w:r>
     </w:p>
     <w:p>
@@ -5020,7 +6085,39 @@
           <w:sz w:val="24"/>
           <w:szCs w:val="24"/>
         </w:rPr>
-        <w:t>Have standard unit labels been used? A for amps, degree symbols instead of 'deg' etc.</w:t>
+        <w:t xml:space="preserve">Have standard unit labels been used? </w:t>
+      </w:r>
+      <w:proofErr w:type="gramStart"/>
+      <w:r>
+        <w:rPr>
+          <w:sz w:val="24"/>
+          <w:szCs w:val="24"/>
+        </w:rPr>
+        <w:t>A for</w:t>
+      </w:r>
+      <w:proofErr w:type="gramEnd"/>
+      <w:r>
+        <w:rPr>
+          <w:sz w:val="24"/>
+          <w:szCs w:val="24"/>
+        </w:rPr>
+        <w:t xml:space="preserve"> amps, degree symbols instead of '</w:t>
+      </w:r>
+      <w:proofErr w:type="spellStart"/>
+      <w:r>
+        <w:rPr>
+          <w:sz w:val="24"/>
+          <w:szCs w:val="24"/>
+        </w:rPr>
+        <w:t>deg</w:t>
+      </w:r>
+      <w:proofErr w:type="spellEnd"/>
+      <w:r>
+        <w:rPr>
+          <w:sz w:val="24"/>
+          <w:szCs w:val="24"/>
+        </w:rPr>
+        <w:t>' etc.</w:t>
       </w:r>
     </w:p>
     <w:p>
@@ -5060,7 +6157,23 @@
           <w:sz w:val="24"/>
           <w:szCs w:val="24"/>
         </w:rPr>
-        <w:t>Check for spelling mistakes! e.g. freuqency -&gt; frequency.</w:t>
+        <w:t xml:space="preserve">Check for spelling mistakes! e.g. </w:t>
+      </w:r>
+      <w:proofErr w:type="spellStart"/>
+      <w:r>
+        <w:rPr>
+          <w:sz w:val="24"/>
+          <w:szCs w:val="24"/>
+        </w:rPr>
+        <w:t>freuqency</w:t>
+      </w:r>
+      <w:proofErr w:type="spellEnd"/>
+      <w:r>
+        <w:rPr>
+          <w:sz w:val="24"/>
+          <w:szCs w:val="24"/>
+        </w:rPr>
+        <w:t xml:space="preserve"> -&gt; frequency.</w:t>
       </w:r>
     </w:p>
     <w:p>
@@ -5163,7 +6276,23 @@
           <w:sz w:val="24"/>
           <w:szCs w:val="24"/>
         </w:rPr>
-        <w:t>Standard matlab and matplotlib fonts will be used. The following examples give</w:t>
+        <w:t xml:space="preserve">Standard </w:t>
+      </w:r>
+      <w:proofErr w:type="spellStart"/>
+      <w:r>
+        <w:rPr>
+          <w:sz w:val="24"/>
+          <w:szCs w:val="24"/>
+        </w:rPr>
+        <w:t>matlab</w:t>
+      </w:r>
+      <w:proofErr w:type="spellEnd"/>
+      <w:r>
+        <w:rPr>
+          <w:sz w:val="24"/>
+          <w:szCs w:val="24"/>
+        </w:rPr>
+        <w:t xml:space="preserve"> and matplotlib fonts will be used. The following examples give</w:t>
       </w:r>
       <w:r>
         <w:rPr>
@@ -5266,7 +6395,55 @@
           <w:sz w:val="24"/>
           <w:szCs w:val="24"/>
         </w:rPr>
-        <w:t>have ‘shared axis’, only label one of the axis. If it’s the xaxis, then label the bottom one. If it’s the y axis, label the left one.</w:t>
+        <w:t xml:space="preserve">have ‘shared axis’, only label one of the axis. If </w:t>
+      </w:r>
+      <w:proofErr w:type="gramStart"/>
+      <w:r>
+        <w:rPr>
+          <w:sz w:val="24"/>
+          <w:szCs w:val="24"/>
+        </w:rPr>
+        <w:t>it’s</w:t>
+      </w:r>
+      <w:proofErr w:type="gramEnd"/>
+      <w:r>
+        <w:rPr>
+          <w:sz w:val="24"/>
+          <w:szCs w:val="24"/>
+        </w:rPr>
+        <w:t xml:space="preserve"> the </w:t>
+      </w:r>
+      <w:proofErr w:type="spellStart"/>
+      <w:r>
+        <w:rPr>
+          <w:sz w:val="24"/>
+          <w:szCs w:val="24"/>
+        </w:rPr>
+        <w:t>xaxis</w:t>
+      </w:r>
+      <w:proofErr w:type="spellEnd"/>
+      <w:r>
+        <w:rPr>
+          <w:sz w:val="24"/>
+          <w:szCs w:val="24"/>
+        </w:rPr>
+        <w:t xml:space="preserve">, then label the bottom one. If </w:t>
+      </w:r>
+      <w:proofErr w:type="gramStart"/>
+      <w:r>
+        <w:rPr>
+          <w:sz w:val="24"/>
+          <w:szCs w:val="24"/>
+        </w:rPr>
+        <w:t>it’s</w:t>
+      </w:r>
+      <w:proofErr w:type="gramEnd"/>
+      <w:r>
+        <w:rPr>
+          <w:sz w:val="24"/>
+          <w:szCs w:val="24"/>
+        </w:rPr>
+        <w:t xml:space="preserve"> the y axis, label the left one.</w:t>
       </w:r>
     </w:p>
     <w:p>
@@ -5323,7 +6500,23 @@
           <w:sz w:val="24"/>
           <w:szCs w:val="24"/>
         </w:rPr>
-        <w:t xml:space="preserve"> fontsize = </w:t>
+        <w:t xml:space="preserve"> </w:t>
+      </w:r>
+      <w:proofErr w:type="spellStart"/>
+      <w:r>
+        <w:rPr>
+          <w:sz w:val="24"/>
+          <w:szCs w:val="24"/>
+        </w:rPr>
+        <w:t>fontsize</w:t>
+      </w:r>
+      <w:proofErr w:type="spellEnd"/>
+      <w:r>
+        <w:rPr>
+          <w:sz w:val="24"/>
+          <w:szCs w:val="24"/>
+        </w:rPr>
+        <w:t xml:space="preserve"> = </w:t>
       </w:r>
       <w:r>
         <w:rPr>
@@ -5372,14 +6565,46 @@
           <w:sz w:val="24"/>
           <w:szCs w:val="24"/>
         </w:rPr>
-        <w:t>. If the legend looks too big, try splitting it into multiple columns. If this doesn’t work, reduce the</w:t>
-      </w:r>
-      <w:r>
-        <w:rPr>
-          <w:sz w:val="24"/>
-          <w:szCs w:val="24"/>
-        </w:rPr>
-        <w:t xml:space="preserve"> fontsize </w:t>
+        <w:t xml:space="preserve">. If the legend looks too big, try splitting it into multiple columns. If this </w:t>
+      </w:r>
+      <w:proofErr w:type="gramStart"/>
+      <w:r>
+        <w:rPr>
+          <w:sz w:val="24"/>
+          <w:szCs w:val="24"/>
+        </w:rPr>
+        <w:t>doesn’t</w:t>
+      </w:r>
+      <w:proofErr w:type="gramEnd"/>
+      <w:r>
+        <w:rPr>
+          <w:sz w:val="24"/>
+          <w:szCs w:val="24"/>
+        </w:rPr>
+        <w:t xml:space="preserve"> work, reduce the</w:t>
+      </w:r>
+      <w:r>
+        <w:rPr>
+          <w:sz w:val="24"/>
+          <w:szCs w:val="24"/>
+        </w:rPr>
+        <w:t xml:space="preserve"> </w:t>
+      </w:r>
+      <w:proofErr w:type="spellStart"/>
+      <w:r>
+        <w:rPr>
+          <w:sz w:val="24"/>
+          <w:szCs w:val="24"/>
+        </w:rPr>
+        <w:t>fontsize</w:t>
+      </w:r>
+      <w:proofErr w:type="spellEnd"/>
+      <w:r>
+        <w:rPr>
+          <w:sz w:val="24"/>
+          <w:szCs w:val="24"/>
+        </w:rPr>
+        <w:t xml:space="preserve"> </w:t>
       </w:r>
       <w:r>
         <w:rPr>
@@ -5447,13 +6672,24 @@
           <w:szCs w:val="24"/>
         </w:rPr>
       </w:pPr>
-      <w:r>
-        <w:rPr>
-          <w:rFonts w:ascii="SimSun" w:eastAsia="SimSun" w:hAnsi="SimSun"/>
-          <w:sz w:val="24"/>
-          <w:szCs w:val="24"/>
-        </w:rPr>
-        <w:t>figure_size = (6,</w:t>
+      <w:proofErr w:type="spellStart"/>
+      <w:r>
+        <w:rPr>
+          <w:rFonts w:ascii="SimSun" w:eastAsia="SimSun" w:hAnsi="SimSun"/>
+          <w:sz w:val="24"/>
+          <w:szCs w:val="24"/>
+        </w:rPr>
+        <w:lastRenderedPageBreak/>
+        <w:t>figure_size</w:t>
+      </w:r>
+      <w:proofErr w:type="spellEnd"/>
+      <w:r>
+        <w:rPr>
+          <w:rFonts w:ascii="SimSun" w:eastAsia="SimSun" w:hAnsi="SimSun"/>
+          <w:sz w:val="24"/>
+          <w:szCs w:val="24"/>
+        </w:rPr>
+        <w:t xml:space="preserve"> = (6,</w:t>
       </w:r>
       <w:r>
         <w:rPr>
@@ -5480,13 +6716,61 @@
           <w:szCs w:val="24"/>
         </w:rPr>
       </w:pPr>
-      <w:r>
-        <w:rPr>
-          <w:rFonts w:ascii="SimSun" w:eastAsia="SimSun" w:hAnsi="SimSun"/>
-          <w:sz w:val="24"/>
-          <w:szCs w:val="24"/>
-        </w:rPr>
-        <w:t xml:space="preserve">plt.figure(figsize = figure_size,dpi = </w:t>
+      <w:proofErr w:type="spellStart"/>
+      <w:proofErr w:type="gramStart"/>
+      <w:r>
+        <w:rPr>
+          <w:rFonts w:ascii="SimSun" w:eastAsia="SimSun" w:hAnsi="SimSun"/>
+          <w:sz w:val="24"/>
+          <w:szCs w:val="24"/>
+        </w:rPr>
+        <w:t>plt.figure</w:t>
+      </w:r>
+      <w:proofErr w:type="spellEnd"/>
+      <w:proofErr w:type="gramEnd"/>
+      <w:r>
+        <w:rPr>
+          <w:rFonts w:ascii="SimSun" w:eastAsia="SimSun" w:hAnsi="SimSun"/>
+          <w:sz w:val="24"/>
+          <w:szCs w:val="24"/>
+        </w:rPr>
+        <w:t>(</w:t>
+      </w:r>
+      <w:proofErr w:type="spellStart"/>
+      <w:r>
+        <w:rPr>
+          <w:rFonts w:ascii="SimSun" w:eastAsia="SimSun" w:hAnsi="SimSun"/>
+          <w:sz w:val="24"/>
+          <w:szCs w:val="24"/>
+        </w:rPr>
+        <w:t>figsize</w:t>
+      </w:r>
+      <w:proofErr w:type="spellEnd"/>
+      <w:r>
+        <w:rPr>
+          <w:rFonts w:ascii="SimSun" w:eastAsia="SimSun" w:hAnsi="SimSun"/>
+          <w:sz w:val="24"/>
+          <w:szCs w:val="24"/>
+        </w:rPr>
+        <w:t xml:space="preserve"> = </w:t>
+      </w:r>
+      <w:proofErr w:type="spellStart"/>
+      <w:r>
+        <w:rPr>
+          <w:rFonts w:ascii="SimSun" w:eastAsia="SimSun" w:hAnsi="SimSun"/>
+          <w:sz w:val="24"/>
+          <w:szCs w:val="24"/>
+        </w:rPr>
+        <w:t>figure_size,dpi</w:t>
+      </w:r>
+      <w:proofErr w:type="spellEnd"/>
+      <w:r>
+        <w:rPr>
+          <w:rFonts w:ascii="SimSun" w:eastAsia="SimSun" w:hAnsi="SimSun"/>
+          <w:sz w:val="24"/>
+          <w:szCs w:val="24"/>
+        </w:rPr>
+        <w:t xml:space="preserve"> = </w:t>
       </w:r>
       <w:r>
         <w:rPr>
@@ -5513,47 +6797,119 @@
           <w:szCs w:val="24"/>
         </w:rPr>
       </w:pPr>
-      <w:r>
-        <w:rPr>
-          <w:rFonts w:ascii="SimSun" w:eastAsia="SimSun" w:hAnsi="SimSun"/>
-          <w:sz w:val="24"/>
-          <w:szCs w:val="24"/>
-        </w:rPr>
-        <w:t>plt.plot(x,y,label = 'Name of line')</w:t>
-      </w:r>
-    </w:p>
-    <w:p>
-      <w:pPr>
-        <w:rPr>
-          <w:rFonts w:ascii="SimSun" w:eastAsia="SimSun" w:hAnsi="SimSun"/>
-          <w:sz w:val="24"/>
-          <w:szCs w:val="24"/>
-        </w:rPr>
-      </w:pPr>
-      <w:r>
-        <w:rPr>
-          <w:rFonts w:ascii="SimSun" w:eastAsia="SimSun" w:hAnsi="SimSun"/>
-          <w:sz w:val="24"/>
-          <w:szCs w:val="24"/>
-        </w:rPr>
-        <w:t>plt.legend(prop={'size': 8},loc = 'lower left')</w:t>
-      </w:r>
-    </w:p>
-    <w:p>
-      <w:pPr>
-        <w:rPr>
-          <w:rFonts w:ascii="SimSun" w:eastAsia="SimSun" w:hAnsi="SimSun"/>
-          <w:sz w:val="24"/>
-          <w:szCs w:val="24"/>
-        </w:rPr>
-      </w:pPr>
-      <w:r>
-        <w:rPr>
-          <w:rFonts w:ascii="SimSun" w:eastAsia="SimSun" w:hAnsi="SimSun"/>
-          <w:sz w:val="24"/>
-          <w:szCs w:val="24"/>
-        </w:rPr>
-        <w:t>plt.xlabel('x axis (units)'</w:t>
+      <w:proofErr w:type="spellStart"/>
+      <w:proofErr w:type="gramStart"/>
+      <w:r>
+        <w:rPr>
+          <w:rFonts w:ascii="SimSun" w:eastAsia="SimSun" w:hAnsi="SimSun"/>
+          <w:sz w:val="24"/>
+          <w:szCs w:val="24"/>
+        </w:rPr>
+        <w:t>plt.plot</w:t>
+      </w:r>
+      <w:proofErr w:type="spellEnd"/>
+      <w:proofErr w:type="gramEnd"/>
+      <w:r>
+        <w:rPr>
+          <w:rFonts w:ascii="SimSun" w:eastAsia="SimSun" w:hAnsi="SimSun"/>
+          <w:sz w:val="24"/>
+          <w:szCs w:val="24"/>
+        </w:rPr>
+        <w:t>(</w:t>
+      </w:r>
+      <w:proofErr w:type="spellStart"/>
+      <w:r>
+        <w:rPr>
+          <w:rFonts w:ascii="SimSun" w:eastAsia="SimSun" w:hAnsi="SimSun"/>
+          <w:sz w:val="24"/>
+          <w:szCs w:val="24"/>
+        </w:rPr>
+        <w:t>x,y,label</w:t>
+      </w:r>
+      <w:proofErr w:type="spellEnd"/>
+      <w:r>
+        <w:rPr>
+          <w:rFonts w:ascii="SimSun" w:eastAsia="SimSun" w:hAnsi="SimSun"/>
+          <w:sz w:val="24"/>
+          <w:szCs w:val="24"/>
+        </w:rPr>
+        <w:t xml:space="preserve"> = 'Name of line')</w:t>
+      </w:r>
+    </w:p>
+    <w:p>
+      <w:pPr>
+        <w:rPr>
+          <w:rFonts w:ascii="SimSun" w:eastAsia="SimSun" w:hAnsi="SimSun"/>
+          <w:sz w:val="24"/>
+          <w:szCs w:val="24"/>
+        </w:rPr>
+      </w:pPr>
+      <w:proofErr w:type="spellStart"/>
+      <w:proofErr w:type="gramStart"/>
+      <w:r>
+        <w:rPr>
+          <w:rFonts w:ascii="SimSun" w:eastAsia="SimSun" w:hAnsi="SimSun"/>
+          <w:sz w:val="24"/>
+          <w:szCs w:val="24"/>
+        </w:rPr>
+        <w:t>plt.legend</w:t>
+      </w:r>
+      <w:proofErr w:type="spellEnd"/>
+      <w:proofErr w:type="gramEnd"/>
+      <w:r>
+        <w:rPr>
+          <w:rFonts w:ascii="SimSun" w:eastAsia="SimSun" w:hAnsi="SimSun"/>
+          <w:sz w:val="24"/>
+          <w:szCs w:val="24"/>
+        </w:rPr>
+        <w:t>(prop={'size': 8},</w:t>
+      </w:r>
+      <w:proofErr w:type="spellStart"/>
+      <w:r>
+        <w:rPr>
+          <w:rFonts w:ascii="SimSun" w:eastAsia="SimSun" w:hAnsi="SimSun"/>
+          <w:sz w:val="24"/>
+          <w:szCs w:val="24"/>
+        </w:rPr>
+        <w:t>loc</w:t>
+      </w:r>
+      <w:proofErr w:type="spellEnd"/>
+      <w:r>
+        <w:rPr>
+          <w:rFonts w:ascii="SimSun" w:eastAsia="SimSun" w:hAnsi="SimSun"/>
+          <w:sz w:val="24"/>
+          <w:szCs w:val="24"/>
+        </w:rPr>
+        <w:t xml:space="preserve"> = 'lower left')</w:t>
+      </w:r>
+    </w:p>
+    <w:p>
+      <w:pPr>
+        <w:rPr>
+          <w:rFonts w:ascii="SimSun" w:eastAsia="SimSun" w:hAnsi="SimSun"/>
+          <w:sz w:val="24"/>
+          <w:szCs w:val="24"/>
+        </w:rPr>
+      </w:pPr>
+      <w:proofErr w:type="spellStart"/>
+      <w:proofErr w:type="gramStart"/>
+      <w:r>
+        <w:rPr>
+          <w:rFonts w:ascii="SimSun" w:eastAsia="SimSun" w:hAnsi="SimSun"/>
+          <w:sz w:val="24"/>
+          <w:szCs w:val="24"/>
+        </w:rPr>
+        <w:t>plt.xlabel</w:t>
+      </w:r>
+      <w:proofErr w:type="spellEnd"/>
+      <w:proofErr w:type="gramEnd"/>
+      <w:r>
+        <w:rPr>
+          <w:rFonts w:ascii="SimSun" w:eastAsia="SimSun" w:hAnsi="SimSun"/>
+          <w:sz w:val="24"/>
+          <w:szCs w:val="24"/>
+        </w:rPr>
+        <w:t>('x axis (units)'</w:t>
       </w:r>
       <w:r>
         <w:rPr>
@@ -5566,13 +6922,23 @@
       <w:r>
         <w:t xml:space="preserve"> </w:t>
       </w:r>
-      <w:r>
-        <w:rPr>
-          <w:rFonts w:ascii="SimSun" w:eastAsia="SimSun" w:hAnsi="SimSun"/>
-          <w:sz w:val="24"/>
-          <w:szCs w:val="24"/>
-        </w:rPr>
-        <w:t xml:space="preserve">fontsize = </w:t>
+      <w:proofErr w:type="spellStart"/>
+      <w:r>
+        <w:rPr>
+          <w:rFonts w:ascii="SimSun" w:eastAsia="SimSun" w:hAnsi="SimSun"/>
+          <w:sz w:val="24"/>
+          <w:szCs w:val="24"/>
+        </w:rPr>
+        <w:t>fontsize</w:t>
+      </w:r>
+      <w:proofErr w:type="spellEnd"/>
+      <w:r>
+        <w:rPr>
+          <w:rFonts w:ascii="SimSun" w:eastAsia="SimSun" w:hAnsi="SimSun"/>
+          <w:sz w:val="24"/>
+          <w:szCs w:val="24"/>
+        </w:rPr>
+        <w:t xml:space="preserve"> = </w:t>
       </w:r>
       <w:r>
         <w:rPr>
@@ -5599,13 +6965,25 @@
           <w:szCs w:val="24"/>
         </w:rPr>
       </w:pPr>
-      <w:r>
-        <w:rPr>
-          <w:rFonts w:ascii="SimSun" w:eastAsia="SimSun" w:hAnsi="SimSun"/>
-          <w:sz w:val="24"/>
-          <w:szCs w:val="24"/>
-        </w:rPr>
-        <w:t>plt.ylabel('y axis (units)'</w:t>
+      <w:proofErr w:type="spellStart"/>
+      <w:proofErr w:type="gramStart"/>
+      <w:r>
+        <w:rPr>
+          <w:rFonts w:ascii="SimSun" w:eastAsia="SimSun" w:hAnsi="SimSun"/>
+          <w:sz w:val="24"/>
+          <w:szCs w:val="24"/>
+        </w:rPr>
+        <w:t>plt.ylabel</w:t>
+      </w:r>
+      <w:proofErr w:type="spellEnd"/>
+      <w:proofErr w:type="gramEnd"/>
+      <w:r>
+        <w:rPr>
+          <w:rFonts w:ascii="SimSun" w:eastAsia="SimSun" w:hAnsi="SimSun"/>
+          <w:sz w:val="24"/>
+          <w:szCs w:val="24"/>
+        </w:rPr>
+        <w:t>('y axis (units)'</w:t>
       </w:r>
       <w:r>
         <w:rPr>
@@ -5618,13 +6996,23 @@
       <w:r>
         <w:t xml:space="preserve"> </w:t>
       </w:r>
-      <w:r>
-        <w:rPr>
-          <w:rFonts w:ascii="SimSun" w:eastAsia="SimSun" w:hAnsi="SimSun"/>
-          <w:sz w:val="24"/>
-          <w:szCs w:val="24"/>
-        </w:rPr>
-        <w:t xml:space="preserve">fontsize = </w:t>
+      <w:proofErr w:type="spellStart"/>
+      <w:r>
+        <w:rPr>
+          <w:rFonts w:ascii="SimSun" w:eastAsia="SimSun" w:hAnsi="SimSun"/>
+          <w:sz w:val="24"/>
+          <w:szCs w:val="24"/>
+        </w:rPr>
+        <w:t>fontsize</w:t>
+      </w:r>
+      <w:proofErr w:type="spellEnd"/>
+      <w:r>
+        <w:rPr>
+          <w:rFonts w:ascii="SimSun" w:eastAsia="SimSun" w:hAnsi="SimSun"/>
+          <w:sz w:val="24"/>
+          <w:szCs w:val="24"/>
+        </w:rPr>
+        <w:t xml:space="preserve"> = </w:t>
       </w:r>
       <w:r>
         <w:rPr>
@@ -5651,65 +7039,138 @@
           <w:szCs w:val="24"/>
         </w:rPr>
       </w:pPr>
-      <w:r>
-        <w:rPr>
-          <w:rFonts w:ascii="SimSun" w:eastAsia="SimSun" w:hAnsi="SimSun"/>
-          <w:sz w:val="24"/>
-          <w:szCs w:val="24"/>
-        </w:rPr>
-        <w:lastRenderedPageBreak/>
-        <w:t>plt.tight_layout()</w:t>
-      </w:r>
-    </w:p>
-    <w:p>
-      <w:pPr>
-        <w:rPr>
-          <w:rFonts w:ascii="SimSun" w:eastAsia="SimSun" w:hAnsi="SimSun"/>
-          <w:sz w:val="24"/>
-          <w:szCs w:val="24"/>
-        </w:rPr>
-      </w:pPr>
-      <w:r>
-        <w:rPr>
-          <w:rFonts w:ascii="SimSun" w:eastAsia="SimSun" w:hAnsi="SimSun"/>
-          <w:sz w:val="24"/>
-          <w:szCs w:val="24"/>
-        </w:rPr>
-        <w:t>plt.grid()</w:t>
-      </w:r>
-    </w:p>
-    <w:p>
-      <w:pPr>
-        <w:rPr>
-          <w:rFonts w:ascii="SimSun" w:eastAsia="SimSun" w:hAnsi="SimSun"/>
-          <w:sz w:val="24"/>
-          <w:szCs w:val="24"/>
-        </w:rPr>
-      </w:pPr>
-      <w:r>
-        <w:rPr>
-          <w:rFonts w:ascii="SimSun" w:eastAsia="SimSun" w:hAnsi="SimSun"/>
-          <w:sz w:val="24"/>
-          <w:szCs w:val="24"/>
-        </w:rPr>
-        <w:t>plt.savefig('sim_chapter_Zoom_in_ETM_tuning.eps')</w:t>
-      </w:r>
-    </w:p>
-    <w:p>
-      <w:pPr>
-        <w:rPr>
-          <w:rFonts w:ascii="SimSun" w:eastAsia="SimSun" w:hAnsi="SimSun"/>
-          <w:sz w:val="24"/>
-          <w:szCs w:val="24"/>
-        </w:rPr>
-      </w:pPr>
-      <w:r>
-        <w:rPr>
-          <w:rFonts w:ascii="SimSun" w:eastAsia="SimSun" w:hAnsi="SimSun"/>
-          <w:sz w:val="24"/>
-          <w:szCs w:val="24"/>
-        </w:rPr>
-        <w:t>plt.show()</w:t>
+      <w:proofErr w:type="spellStart"/>
+      <w:proofErr w:type="gramStart"/>
+      <w:r>
+        <w:rPr>
+          <w:rFonts w:ascii="SimSun" w:eastAsia="SimSun" w:hAnsi="SimSun"/>
+          <w:sz w:val="24"/>
+          <w:szCs w:val="24"/>
+        </w:rPr>
+        <w:t>plt.tight</w:t>
+      </w:r>
+      <w:proofErr w:type="gramEnd"/>
+      <w:r>
+        <w:rPr>
+          <w:rFonts w:ascii="SimSun" w:eastAsia="SimSun" w:hAnsi="SimSun"/>
+          <w:sz w:val="24"/>
+          <w:szCs w:val="24"/>
+        </w:rPr>
+        <w:t>_layout</w:t>
+      </w:r>
+      <w:proofErr w:type="spellEnd"/>
+      <w:r>
+        <w:rPr>
+          <w:rFonts w:ascii="SimSun" w:eastAsia="SimSun" w:hAnsi="SimSun"/>
+          <w:sz w:val="24"/>
+          <w:szCs w:val="24"/>
+        </w:rPr>
+        <w:t>()</w:t>
+      </w:r>
+    </w:p>
+    <w:p>
+      <w:pPr>
+        <w:rPr>
+          <w:rFonts w:ascii="SimSun" w:eastAsia="SimSun" w:hAnsi="SimSun"/>
+          <w:sz w:val="24"/>
+          <w:szCs w:val="24"/>
+        </w:rPr>
+      </w:pPr>
+      <w:proofErr w:type="spellStart"/>
+      <w:proofErr w:type="gramStart"/>
+      <w:r>
+        <w:rPr>
+          <w:rFonts w:ascii="SimSun" w:eastAsia="SimSun" w:hAnsi="SimSun"/>
+          <w:sz w:val="24"/>
+          <w:szCs w:val="24"/>
+        </w:rPr>
+        <w:t>plt.grid</w:t>
+      </w:r>
+      <w:proofErr w:type="spellEnd"/>
+      <w:proofErr w:type="gramEnd"/>
+      <w:r>
+        <w:rPr>
+          <w:rFonts w:ascii="SimSun" w:eastAsia="SimSun" w:hAnsi="SimSun"/>
+          <w:sz w:val="24"/>
+          <w:szCs w:val="24"/>
+        </w:rPr>
+        <w:t>()</w:t>
+      </w:r>
+    </w:p>
+    <w:p>
+      <w:pPr>
+        <w:rPr>
+          <w:rFonts w:ascii="SimSun" w:eastAsia="SimSun" w:hAnsi="SimSun"/>
+          <w:sz w:val="24"/>
+          <w:szCs w:val="24"/>
+        </w:rPr>
+      </w:pPr>
+      <w:proofErr w:type="spellStart"/>
+      <w:proofErr w:type="gramStart"/>
+      <w:r>
+        <w:rPr>
+          <w:rFonts w:ascii="SimSun" w:eastAsia="SimSun" w:hAnsi="SimSun"/>
+          <w:sz w:val="24"/>
+          <w:szCs w:val="24"/>
+        </w:rPr>
+        <w:t>plt.savefig</w:t>
+      </w:r>
+      <w:proofErr w:type="spellEnd"/>
+      <w:proofErr w:type="gramEnd"/>
+      <w:r>
+        <w:rPr>
+          <w:rFonts w:ascii="SimSun" w:eastAsia="SimSun" w:hAnsi="SimSun"/>
+          <w:sz w:val="24"/>
+          <w:szCs w:val="24"/>
+        </w:rPr>
+        <w:t>('</w:t>
+      </w:r>
+      <w:proofErr w:type="spellStart"/>
+      <w:r>
+        <w:rPr>
+          <w:rFonts w:ascii="SimSun" w:eastAsia="SimSun" w:hAnsi="SimSun"/>
+          <w:sz w:val="24"/>
+          <w:szCs w:val="24"/>
+        </w:rPr>
+        <w:t>sim_chapter_Zoom_in_ETM_tuning.eps</w:t>
+      </w:r>
+      <w:proofErr w:type="spellEnd"/>
+      <w:r>
+        <w:rPr>
+          <w:rFonts w:ascii="SimSun" w:eastAsia="SimSun" w:hAnsi="SimSun"/>
+          <w:sz w:val="24"/>
+          <w:szCs w:val="24"/>
+        </w:rPr>
+        <w:t>')</w:t>
+      </w:r>
+    </w:p>
+    <w:p>
+      <w:pPr>
+        <w:rPr>
+          <w:rFonts w:ascii="SimSun" w:eastAsia="SimSun" w:hAnsi="SimSun"/>
+          <w:sz w:val="24"/>
+          <w:szCs w:val="24"/>
+        </w:rPr>
+      </w:pPr>
+      <w:proofErr w:type="spellStart"/>
+      <w:proofErr w:type="gramStart"/>
+      <w:r>
+        <w:rPr>
+          <w:rFonts w:ascii="SimSun" w:eastAsia="SimSun" w:hAnsi="SimSun"/>
+          <w:sz w:val="24"/>
+          <w:szCs w:val="24"/>
+        </w:rPr>
+        <w:t>plt.show</w:t>
+      </w:r>
+      <w:proofErr w:type="spellEnd"/>
+      <w:proofErr w:type="gramEnd"/>
+      <w:r>
+        <w:rPr>
+          <w:rFonts w:ascii="SimSun" w:eastAsia="SimSun" w:hAnsi="SimSun"/>
+          <w:sz w:val="24"/>
+          <w:szCs w:val="24"/>
+        </w:rPr>
+        <w:t>()</w:t>
       </w:r>
     </w:p>
     <w:p>
@@ -5746,13 +7207,43 @@
           <w:szCs w:val="24"/>
         </w:rPr>
       </w:pPr>
-      <w:r>
-        <w:rPr>
-          <w:rFonts w:ascii="SimSun" w:eastAsia="SimSun" w:hAnsi="SimSun"/>
-          <w:sz w:val="24"/>
-          <w:szCs w:val="24"/>
-        </w:rPr>
-        <w:t>plt.figure(figsize=(6, 6), dpi=150)</w:t>
+      <w:proofErr w:type="spellStart"/>
+      <w:proofErr w:type="gramStart"/>
+      <w:r>
+        <w:rPr>
+          <w:rFonts w:ascii="SimSun" w:eastAsia="SimSun" w:hAnsi="SimSun"/>
+          <w:sz w:val="24"/>
+          <w:szCs w:val="24"/>
+        </w:rPr>
+        <w:t>plt.figure</w:t>
+      </w:r>
+      <w:proofErr w:type="spellEnd"/>
+      <w:proofErr w:type="gramEnd"/>
+      <w:r>
+        <w:rPr>
+          <w:rFonts w:ascii="SimSun" w:eastAsia="SimSun" w:hAnsi="SimSun"/>
+          <w:sz w:val="24"/>
+          <w:szCs w:val="24"/>
+        </w:rPr>
+        <w:t>(</w:t>
+      </w:r>
+      <w:proofErr w:type="spellStart"/>
+      <w:r>
+        <w:rPr>
+          <w:rFonts w:ascii="SimSun" w:eastAsia="SimSun" w:hAnsi="SimSun"/>
+          <w:sz w:val="24"/>
+          <w:szCs w:val="24"/>
+        </w:rPr>
+        <w:t>figsize</w:t>
+      </w:r>
+      <w:proofErr w:type="spellEnd"/>
+      <w:r>
+        <w:rPr>
+          <w:rFonts w:ascii="SimSun" w:eastAsia="SimSun" w:hAnsi="SimSun"/>
+          <w:sz w:val="24"/>
+          <w:szCs w:val="24"/>
+        </w:rPr>
+        <w:t>=(6, 6), dpi=150)</w:t>
       </w:r>
     </w:p>
     <w:p>
@@ -5810,6 +7301,7 @@
           <w:szCs w:val="24"/>
         </w:rPr>
       </w:pPr>
+      <w:proofErr w:type="spellStart"/>
       <w:r>
         <w:rPr>
           <w:rFonts w:asciiTheme="majorHAnsi" w:hAnsiTheme="majorHAnsi"/>
@@ -5820,6 +7312,7 @@
         </w:rPr>
         <w:t>Matlab</w:t>
       </w:r>
+      <w:proofErr w:type="spellEnd"/>
     </w:p>
     <w:p>
       <w:pPr>
@@ -5838,7 +7331,55 @@
           <w:sz w:val="24"/>
           <w:szCs w:val="24"/>
         </w:rPr>
-        <w:t>For matlab figures, use the linspecer (from mathworks file exchange) function to</w:t>
+        <w:t xml:space="preserve">For </w:t>
+      </w:r>
+      <w:proofErr w:type="spellStart"/>
+      <w:r>
+        <w:rPr>
+          <w:sz w:val="24"/>
+          <w:szCs w:val="24"/>
+        </w:rPr>
+        <w:t>matlab</w:t>
+      </w:r>
+      <w:proofErr w:type="spellEnd"/>
+      <w:r>
+        <w:rPr>
+          <w:sz w:val="24"/>
+          <w:szCs w:val="24"/>
+        </w:rPr>
+        <w:t xml:space="preserve"> figures, use the </w:t>
+      </w:r>
+      <w:proofErr w:type="spellStart"/>
+      <w:r>
+        <w:rPr>
+          <w:sz w:val="24"/>
+          <w:szCs w:val="24"/>
+        </w:rPr>
+        <w:t>linspecer</w:t>
+      </w:r>
+      <w:proofErr w:type="spellEnd"/>
+      <w:r>
+        <w:rPr>
+          <w:sz w:val="24"/>
+          <w:szCs w:val="24"/>
+        </w:rPr>
+        <w:t xml:space="preserve"> (from </w:t>
+      </w:r>
+      <w:proofErr w:type="spellStart"/>
+      <w:r>
+        <w:rPr>
+          <w:sz w:val="24"/>
+          <w:szCs w:val="24"/>
+        </w:rPr>
+        <w:t>mathworks</w:t>
+      </w:r>
+      <w:proofErr w:type="spellEnd"/>
+      <w:r>
+        <w:rPr>
+          <w:sz w:val="24"/>
+          <w:szCs w:val="24"/>
+        </w:rPr>
+        <w:t xml:space="preserve"> file exchange) function to</w:t>
       </w:r>
       <w:r>
         <w:rPr>
@@ -5879,8 +7420,9 @@
           <w:sz w:val="24"/>
           <w:szCs w:val="24"/>
         </w:rPr>
-        <w:t>The font should be set to Deja</w:t>
-      </w:r>
+        <w:t xml:space="preserve">The font should be set to </w:t>
+      </w:r>
+      <w:proofErr w:type="spellStart"/>
       <w:r>
         <w:rPr>
           <w:rFonts w:cstheme="minorHAnsi"/>
@@ -5888,7 +7430,7 @@
           <w:sz w:val="24"/>
           <w:szCs w:val="24"/>
         </w:rPr>
-        <w:t xml:space="preserve">Vu Sans, do this with: </w:t>
+        <w:t>Deja</w:t>
       </w:r>
       <w:r>
         <w:rPr>
@@ -5897,15 +7439,92 @@
           <w:sz w:val="24"/>
           <w:szCs w:val="24"/>
         </w:rPr>
-        <w:t>set(gca,</w:t>
-      </w:r>
-      <w:r>
-        <w:rPr>
-          <w:rFonts w:cstheme="minorHAnsi"/>
-          <w:sz w:val="24"/>
-          <w:szCs w:val="24"/>
-        </w:rPr>
-        <w:t>'fontname','DejaVu Sans')</w:t>
+        <w:t>Vu</w:t>
+      </w:r>
+      <w:proofErr w:type="spellEnd"/>
+      <w:r>
+        <w:rPr>
+          <w:rFonts w:cstheme="minorHAnsi"/>
+          <w:color w:val="000000"/>
+          <w:sz w:val="24"/>
+          <w:szCs w:val="24"/>
+        </w:rPr>
+        <w:t xml:space="preserve"> Sans, do this with: </w:t>
+      </w:r>
+      <w:proofErr w:type="gramStart"/>
+      <w:r>
+        <w:rPr>
+          <w:rFonts w:cstheme="minorHAnsi"/>
+          <w:color w:val="000000"/>
+          <w:sz w:val="24"/>
+          <w:szCs w:val="24"/>
+        </w:rPr>
+        <w:t>set(</w:t>
+      </w:r>
+      <w:proofErr w:type="spellStart"/>
+      <w:proofErr w:type="gramEnd"/>
+      <w:r>
+        <w:rPr>
+          <w:rFonts w:cstheme="minorHAnsi"/>
+          <w:color w:val="000000"/>
+          <w:sz w:val="24"/>
+          <w:szCs w:val="24"/>
+        </w:rPr>
+        <w:t>gca</w:t>
+      </w:r>
+      <w:proofErr w:type="spellEnd"/>
+      <w:r>
+        <w:rPr>
+          <w:rFonts w:cstheme="minorHAnsi"/>
+          <w:color w:val="000000"/>
+          <w:sz w:val="24"/>
+          <w:szCs w:val="24"/>
+        </w:rPr>
+        <w:t>,</w:t>
+      </w:r>
+      <w:r>
+        <w:rPr>
+          <w:rFonts w:cstheme="minorHAnsi"/>
+          <w:sz w:val="24"/>
+          <w:szCs w:val="24"/>
+        </w:rPr>
+        <w:t>'</w:t>
+      </w:r>
+      <w:proofErr w:type="spellStart"/>
+      <w:r>
+        <w:rPr>
+          <w:rFonts w:cstheme="minorHAnsi"/>
+          <w:sz w:val="24"/>
+          <w:szCs w:val="24"/>
+        </w:rPr>
+        <w:t>fontname</w:t>
+      </w:r>
+      <w:proofErr w:type="spellEnd"/>
+      <w:r>
+        <w:rPr>
+          <w:rFonts w:cstheme="minorHAnsi"/>
+          <w:sz w:val="24"/>
+          <w:szCs w:val="24"/>
+        </w:rPr>
+        <w:t>','</w:t>
+      </w:r>
+      <w:proofErr w:type="spellStart"/>
+      <w:r>
+        <w:rPr>
+          <w:rFonts w:cstheme="minorHAnsi"/>
+          <w:sz w:val="24"/>
+          <w:szCs w:val="24"/>
+        </w:rPr>
+        <w:t>DejaVu</w:t>
+      </w:r>
+      <w:proofErr w:type="spellEnd"/>
+      <w:r>
+        <w:rPr>
+          <w:rFonts w:cstheme="minorHAnsi"/>
+          <w:sz w:val="24"/>
+          <w:szCs w:val="24"/>
+        </w:rPr>
+        <w:t xml:space="preserve"> Sans')</w:t>
       </w:r>
     </w:p>
     <w:p>
@@ -5935,84 +7554,260 @@
           <w:sz w:val="24"/>
           <w:szCs w:val="24"/>
         </w:rPr>
-        <w:t>c = linspecer(2);</w:t>
-      </w:r>
-    </w:p>
-    <w:p>
-      <w:pPr>
-        <w:rPr>
-          <w:rFonts w:ascii="SimSun" w:eastAsia="SimSun" w:hAnsi="SimSun"/>
-          <w:sz w:val="24"/>
-          <w:szCs w:val="24"/>
-        </w:rPr>
-      </w:pPr>
-      <w:r>
-        <w:rPr>
-          <w:rFonts w:ascii="SimSun" w:eastAsia="SimSun" w:hAnsi="SimSun"/>
-          <w:sz w:val="24"/>
-          <w:szCs w:val="24"/>
-        </w:rPr>
-        <w:t>size = 1.1;</w:t>
-      </w:r>
-    </w:p>
-    <w:p>
-      <w:pPr>
-        <w:rPr>
-          <w:rFonts w:ascii="SimSun" w:eastAsia="SimSun" w:hAnsi="SimSun"/>
-          <w:sz w:val="24"/>
-          <w:szCs w:val="24"/>
-        </w:rPr>
-      </w:pPr>
-      <w:r>
-        <w:rPr>
-          <w:rFonts w:ascii="SimSun" w:eastAsia="SimSun" w:hAnsi="SimSun"/>
-          <w:sz w:val="24"/>
-          <w:szCs w:val="24"/>
-        </w:rPr>
-        <w:t>aspect_ratio = size.*[6,4];</w:t>
-      </w:r>
-    </w:p>
-    <w:p>
-      <w:pPr>
-        <w:rPr>
-          <w:rFonts w:ascii="SimSun" w:eastAsia="SimSun" w:hAnsi="SimSun"/>
-          <w:sz w:val="24"/>
-          <w:szCs w:val="24"/>
-        </w:rPr>
-      </w:pPr>
-    </w:p>
-    <w:p>
-      <w:pPr>
-        <w:rPr>
-          <w:rFonts w:ascii="SimSun" w:eastAsia="SimSun" w:hAnsi="SimSun"/>
-          <w:sz w:val="24"/>
-          <w:szCs w:val="24"/>
-        </w:rPr>
-      </w:pPr>
-      <w:r>
-        <w:rPr>
-          <w:rFonts w:ascii="SimSun" w:eastAsia="SimSun" w:hAnsi="SimSun"/>
-          <w:sz w:val="24"/>
-          <w:szCs w:val="24"/>
-        </w:rPr>
-        <w:t>figure('Name','dark noise','units','inches','position',[0 0 aspect_ratio(1) aspect_ratio(2)])</w:t>
-      </w:r>
-    </w:p>
-    <w:p>
-      <w:pPr>
-        <w:rPr>
-          <w:rFonts w:ascii="SimSun" w:eastAsia="SimSun" w:hAnsi="SimSun"/>
-          <w:sz w:val="24"/>
-          <w:szCs w:val="24"/>
-        </w:rPr>
-      </w:pPr>
-      <w:r>
-        <w:rPr>
-          <w:rFonts w:ascii="SimSun" w:eastAsia="SimSun" w:hAnsi="SimSun"/>
-          <w:sz w:val="24"/>
-          <w:szCs w:val="24"/>
-        </w:rPr>
-        <w:t>loglog(x1, y1, 'color',c(1,:))</w:t>
+        <w:t xml:space="preserve">c = </w:t>
+      </w:r>
+      <w:proofErr w:type="spellStart"/>
+      <w:proofErr w:type="gramStart"/>
+      <w:r>
+        <w:rPr>
+          <w:rFonts w:ascii="SimSun" w:eastAsia="SimSun" w:hAnsi="SimSun"/>
+          <w:sz w:val="24"/>
+          <w:szCs w:val="24"/>
+        </w:rPr>
+        <w:t>linspecer</w:t>
+      </w:r>
+      <w:proofErr w:type="spellEnd"/>
+      <w:r>
+        <w:rPr>
+          <w:rFonts w:ascii="SimSun" w:eastAsia="SimSun" w:hAnsi="SimSun"/>
+          <w:sz w:val="24"/>
+          <w:szCs w:val="24"/>
+        </w:rPr>
+        <w:t>(</w:t>
+      </w:r>
+      <w:proofErr w:type="gramEnd"/>
+      <w:r>
+        <w:rPr>
+          <w:rFonts w:ascii="SimSun" w:eastAsia="SimSun" w:hAnsi="SimSun"/>
+          <w:sz w:val="24"/>
+          <w:szCs w:val="24"/>
+        </w:rPr>
+        <w:t>2);</w:t>
+      </w:r>
+    </w:p>
+    <w:p>
+      <w:pPr>
+        <w:rPr>
+          <w:rFonts w:ascii="SimSun" w:eastAsia="SimSun" w:hAnsi="SimSun"/>
+          <w:sz w:val="24"/>
+          <w:szCs w:val="24"/>
+        </w:rPr>
+      </w:pPr>
+      <w:r>
+        <w:rPr>
+          <w:rFonts w:ascii="SimSun" w:eastAsia="SimSun" w:hAnsi="SimSun"/>
+          <w:sz w:val="24"/>
+          <w:szCs w:val="24"/>
+        </w:rPr>
+        <w:t xml:space="preserve">size = </w:t>
+      </w:r>
+      <w:proofErr w:type="gramStart"/>
+      <w:r>
+        <w:rPr>
+          <w:rFonts w:ascii="SimSun" w:eastAsia="SimSun" w:hAnsi="SimSun"/>
+          <w:sz w:val="24"/>
+          <w:szCs w:val="24"/>
+        </w:rPr>
+        <w:t>1.1;</w:t>
+      </w:r>
+      <w:proofErr w:type="gramEnd"/>
+    </w:p>
+    <w:p>
+      <w:pPr>
+        <w:rPr>
+          <w:rFonts w:ascii="SimSun" w:eastAsia="SimSun" w:hAnsi="SimSun"/>
+          <w:sz w:val="24"/>
+          <w:szCs w:val="24"/>
+        </w:rPr>
+      </w:pPr>
+      <w:proofErr w:type="spellStart"/>
+      <w:r>
+        <w:rPr>
+          <w:rFonts w:ascii="SimSun" w:eastAsia="SimSun" w:hAnsi="SimSun"/>
+          <w:sz w:val="24"/>
+          <w:szCs w:val="24"/>
+        </w:rPr>
+        <w:t>aspect_ratio</w:t>
+      </w:r>
+      <w:proofErr w:type="spellEnd"/>
+      <w:r>
+        <w:rPr>
+          <w:rFonts w:ascii="SimSun" w:eastAsia="SimSun" w:hAnsi="SimSun"/>
+          <w:sz w:val="24"/>
+          <w:szCs w:val="24"/>
+        </w:rPr>
+        <w:t xml:space="preserve"> = </w:t>
+      </w:r>
+      <w:proofErr w:type="gramStart"/>
+      <w:r>
+        <w:rPr>
+          <w:rFonts w:ascii="SimSun" w:eastAsia="SimSun" w:hAnsi="SimSun"/>
+          <w:sz w:val="24"/>
+          <w:szCs w:val="24"/>
+        </w:rPr>
+        <w:t>size.*</w:t>
+      </w:r>
+      <w:proofErr w:type="gramEnd"/>
+      <w:r>
+        <w:rPr>
+          <w:rFonts w:ascii="SimSun" w:eastAsia="SimSun" w:hAnsi="SimSun"/>
+          <w:sz w:val="24"/>
+          <w:szCs w:val="24"/>
+        </w:rPr>
+        <w:t>[6,4];</w:t>
+      </w:r>
+    </w:p>
+    <w:p>
+      <w:pPr>
+        <w:rPr>
+          <w:rFonts w:ascii="SimSun" w:eastAsia="SimSun" w:hAnsi="SimSun"/>
+          <w:sz w:val="24"/>
+          <w:szCs w:val="24"/>
+        </w:rPr>
+      </w:pPr>
+    </w:p>
+    <w:p>
+      <w:pPr>
+        <w:rPr>
+          <w:rFonts w:ascii="SimSun" w:eastAsia="SimSun" w:hAnsi="SimSun"/>
+          <w:sz w:val="24"/>
+          <w:szCs w:val="24"/>
+        </w:rPr>
+      </w:pPr>
+      <w:proofErr w:type="gramStart"/>
+      <w:r>
+        <w:rPr>
+          <w:rFonts w:ascii="SimSun" w:eastAsia="SimSun" w:hAnsi="SimSun"/>
+          <w:sz w:val="24"/>
+          <w:szCs w:val="24"/>
+        </w:rPr>
+        <w:t>figure(</w:t>
+      </w:r>
+      <w:proofErr w:type="gramEnd"/>
+      <w:r>
+        <w:rPr>
+          <w:rFonts w:ascii="SimSun" w:eastAsia="SimSun" w:hAnsi="SimSun"/>
+          <w:sz w:val="24"/>
+          <w:szCs w:val="24"/>
+        </w:rPr>
+        <w:t>'</w:t>
+      </w:r>
+      <w:proofErr w:type="spellStart"/>
+      <w:r>
+        <w:rPr>
+          <w:rFonts w:ascii="SimSun" w:eastAsia="SimSun" w:hAnsi="SimSun"/>
+          <w:sz w:val="24"/>
+          <w:szCs w:val="24"/>
+        </w:rPr>
+        <w:t>Name','dark</w:t>
+      </w:r>
+      <w:proofErr w:type="spellEnd"/>
+      <w:r>
+        <w:rPr>
+          <w:rFonts w:ascii="SimSun" w:eastAsia="SimSun" w:hAnsi="SimSun"/>
+          <w:sz w:val="24"/>
+          <w:szCs w:val="24"/>
+        </w:rPr>
+        <w:t xml:space="preserve"> </w:t>
+      </w:r>
+      <w:proofErr w:type="spellStart"/>
+      <w:r>
+        <w:rPr>
+          <w:rFonts w:ascii="SimSun" w:eastAsia="SimSun" w:hAnsi="SimSun"/>
+          <w:sz w:val="24"/>
+          <w:szCs w:val="24"/>
+        </w:rPr>
+        <w:t>noise','units','inches','position</w:t>
+      </w:r>
+      <w:proofErr w:type="spellEnd"/>
+      <w:r>
+        <w:rPr>
+          <w:rFonts w:ascii="SimSun" w:eastAsia="SimSun" w:hAnsi="SimSun"/>
+          <w:sz w:val="24"/>
+          <w:szCs w:val="24"/>
+        </w:rPr>
+        <w:t xml:space="preserve">',[0 0 </w:t>
+      </w:r>
+      <w:proofErr w:type="spellStart"/>
+      <w:r>
+        <w:rPr>
+          <w:rFonts w:ascii="SimSun" w:eastAsia="SimSun" w:hAnsi="SimSun"/>
+          <w:sz w:val="24"/>
+          <w:szCs w:val="24"/>
+        </w:rPr>
+        <w:t>aspect_ratio</w:t>
+      </w:r>
+      <w:proofErr w:type="spellEnd"/>
+      <w:r>
+        <w:rPr>
+          <w:rFonts w:ascii="SimSun" w:eastAsia="SimSun" w:hAnsi="SimSun"/>
+          <w:sz w:val="24"/>
+          <w:szCs w:val="24"/>
+        </w:rPr>
+        <w:t xml:space="preserve">(1) </w:t>
+      </w:r>
+      <w:proofErr w:type="spellStart"/>
+      <w:r>
+        <w:rPr>
+          <w:rFonts w:ascii="SimSun" w:eastAsia="SimSun" w:hAnsi="SimSun"/>
+          <w:sz w:val="24"/>
+          <w:szCs w:val="24"/>
+        </w:rPr>
+        <w:t>aspect_ratio</w:t>
+      </w:r>
+      <w:proofErr w:type="spellEnd"/>
+      <w:r>
+        <w:rPr>
+          <w:rFonts w:ascii="SimSun" w:eastAsia="SimSun" w:hAnsi="SimSun"/>
+          <w:sz w:val="24"/>
+          <w:szCs w:val="24"/>
+        </w:rPr>
+        <w:t>(2)])</w:t>
+      </w:r>
+    </w:p>
+    <w:p>
+      <w:pPr>
+        <w:rPr>
+          <w:rFonts w:ascii="SimSun" w:eastAsia="SimSun" w:hAnsi="SimSun"/>
+          <w:sz w:val="24"/>
+          <w:szCs w:val="24"/>
+        </w:rPr>
+      </w:pPr>
+      <w:proofErr w:type="gramStart"/>
+      <w:r>
+        <w:rPr>
+          <w:rFonts w:ascii="SimSun" w:eastAsia="SimSun" w:hAnsi="SimSun"/>
+          <w:sz w:val="24"/>
+          <w:szCs w:val="24"/>
+        </w:rPr>
+        <w:t>loglog(</w:t>
+      </w:r>
+      <w:proofErr w:type="gramEnd"/>
+      <w:r>
+        <w:rPr>
+          <w:rFonts w:ascii="SimSun" w:eastAsia="SimSun" w:hAnsi="SimSun"/>
+          <w:sz w:val="24"/>
+          <w:szCs w:val="24"/>
+        </w:rPr>
+        <w:t>x1, y1, '</w:t>
+      </w:r>
+      <w:proofErr w:type="spellStart"/>
+      <w:r>
+        <w:rPr>
+          <w:rFonts w:ascii="SimSun" w:eastAsia="SimSun" w:hAnsi="SimSun"/>
+          <w:sz w:val="24"/>
+          <w:szCs w:val="24"/>
+        </w:rPr>
+        <w:t>color</w:t>
+      </w:r>
+      <w:proofErr w:type="spellEnd"/>
+      <w:r>
+        <w:rPr>
+          <w:rFonts w:ascii="SimSun" w:eastAsia="SimSun" w:hAnsi="SimSun"/>
+          <w:sz w:val="24"/>
+          <w:szCs w:val="24"/>
+        </w:rPr>
+        <w:t>',c(1,:))</w:t>
       </w:r>
     </w:p>
     <w:p>
@@ -6040,13 +7835,42 @@
           <w:szCs w:val="24"/>
         </w:rPr>
       </w:pPr>
-      <w:r>
-        <w:rPr>
-          <w:rFonts w:ascii="SimSun" w:eastAsia="SimSun" w:hAnsi="SimSun"/>
-          <w:sz w:val="24"/>
-          <w:szCs w:val="24"/>
-        </w:rPr>
-        <w:t>loglog(x2, y2, 'color',c(2,:))</w:t>
+      <w:proofErr w:type="gramStart"/>
+      <w:r>
+        <w:rPr>
+          <w:rFonts w:ascii="SimSun" w:eastAsia="SimSun" w:hAnsi="SimSun"/>
+          <w:sz w:val="24"/>
+          <w:szCs w:val="24"/>
+        </w:rPr>
+        <w:lastRenderedPageBreak/>
+        <w:t>loglog(</w:t>
+      </w:r>
+      <w:proofErr w:type="gramEnd"/>
+      <w:r>
+        <w:rPr>
+          <w:rFonts w:ascii="SimSun" w:eastAsia="SimSun" w:hAnsi="SimSun"/>
+          <w:sz w:val="24"/>
+          <w:szCs w:val="24"/>
+        </w:rPr>
+        <w:t>x2, y2, '</w:t>
+      </w:r>
+      <w:proofErr w:type="spellStart"/>
+      <w:r>
+        <w:rPr>
+          <w:rFonts w:ascii="SimSun" w:eastAsia="SimSun" w:hAnsi="SimSun"/>
+          <w:sz w:val="24"/>
+          <w:szCs w:val="24"/>
+        </w:rPr>
+        <w:t>color</w:t>
+      </w:r>
+      <w:proofErr w:type="spellEnd"/>
+      <w:r>
+        <w:rPr>
+          <w:rFonts w:ascii="SimSun" w:eastAsia="SimSun" w:hAnsi="SimSun"/>
+          <w:sz w:val="24"/>
+          <w:szCs w:val="24"/>
+        </w:rPr>
+        <w:t>',c(2,:))</w:t>
       </w:r>
     </w:p>
     <w:p>
@@ -6091,40 +7915,107 @@
           <w:szCs w:val="24"/>
         </w:rPr>
       </w:pPr>
-      <w:r>
-        <w:rPr>
-          <w:rFonts w:ascii="SimSun" w:eastAsia="SimSun" w:hAnsi="SimSun"/>
-          <w:sz w:val="24"/>
-          <w:szCs w:val="24"/>
-        </w:rPr>
-        <w:t>xlabel('Frequency (Hz)')</w:t>
-      </w:r>
-    </w:p>
-    <w:p>
-      <w:pPr>
-        <w:rPr>
-          <w:rFonts w:ascii="SimSun" w:eastAsia="SimSun" w:hAnsi="SimSun"/>
-          <w:sz w:val="24"/>
-          <w:szCs w:val="24"/>
-        </w:rPr>
-      </w:pPr>
-      <w:r>
-        <w:rPr>
-          <w:rFonts w:ascii="SimSun" w:eastAsia="SimSun" w:hAnsi="SimSun"/>
-          <w:sz w:val="24"/>
-          <w:szCs w:val="24"/>
-        </w:rPr>
-        <w:t>ylabel('I_r_m_s/\surd(Hz)')</w:t>
-      </w:r>
-    </w:p>
-    <w:p>
-      <w:pPr>
-        <w:rPr>
-          <w:rFonts w:ascii="SimSun" w:eastAsia="SimSun" w:hAnsi="SimSun"/>
-          <w:sz w:val="24"/>
-          <w:szCs w:val="24"/>
-        </w:rPr>
-      </w:pPr>
+      <w:proofErr w:type="spellStart"/>
+      <w:proofErr w:type="gramStart"/>
+      <w:r>
+        <w:rPr>
+          <w:rFonts w:ascii="SimSun" w:eastAsia="SimSun" w:hAnsi="SimSun"/>
+          <w:sz w:val="24"/>
+          <w:szCs w:val="24"/>
+        </w:rPr>
+        <w:t>xlabel</w:t>
+      </w:r>
+      <w:proofErr w:type="spellEnd"/>
+      <w:r>
+        <w:rPr>
+          <w:rFonts w:ascii="SimSun" w:eastAsia="SimSun" w:hAnsi="SimSun"/>
+          <w:sz w:val="24"/>
+          <w:szCs w:val="24"/>
+        </w:rPr>
+        <w:t>(</w:t>
+      </w:r>
+      <w:proofErr w:type="gramEnd"/>
+      <w:r>
+        <w:rPr>
+          <w:rFonts w:ascii="SimSun" w:eastAsia="SimSun" w:hAnsi="SimSun"/>
+          <w:sz w:val="24"/>
+          <w:szCs w:val="24"/>
+        </w:rPr>
+        <w:t>'Frequency (Hz)')</w:t>
+      </w:r>
+    </w:p>
+    <w:p>
+      <w:pPr>
+        <w:rPr>
+          <w:rFonts w:ascii="SimSun" w:eastAsia="SimSun" w:hAnsi="SimSun"/>
+          <w:sz w:val="24"/>
+          <w:szCs w:val="24"/>
+        </w:rPr>
+      </w:pPr>
+      <w:proofErr w:type="spellStart"/>
+      <w:r>
+        <w:rPr>
+          <w:rFonts w:ascii="SimSun" w:eastAsia="SimSun" w:hAnsi="SimSun"/>
+          <w:sz w:val="24"/>
+          <w:szCs w:val="24"/>
+        </w:rPr>
+        <w:t>ylabel</w:t>
+      </w:r>
+      <w:proofErr w:type="spellEnd"/>
+      <w:r>
+        <w:rPr>
+          <w:rFonts w:ascii="SimSun" w:eastAsia="SimSun" w:hAnsi="SimSun"/>
+          <w:sz w:val="24"/>
+          <w:szCs w:val="24"/>
+        </w:rPr>
+        <w:t>('</w:t>
+      </w:r>
+      <w:proofErr w:type="spellStart"/>
+      <w:r>
+        <w:rPr>
+          <w:rFonts w:ascii="SimSun" w:eastAsia="SimSun" w:hAnsi="SimSun"/>
+          <w:sz w:val="24"/>
+          <w:szCs w:val="24"/>
+        </w:rPr>
+        <w:t>I_r_m_s</w:t>
+      </w:r>
+      <w:proofErr w:type="spellEnd"/>
+      <w:r>
+        <w:rPr>
+          <w:rFonts w:ascii="SimSun" w:eastAsia="SimSun" w:hAnsi="SimSun"/>
+          <w:sz w:val="24"/>
+          <w:szCs w:val="24"/>
+        </w:rPr>
+        <w:t>/\</w:t>
+      </w:r>
+      <w:proofErr w:type="gramStart"/>
+      <w:r>
+        <w:rPr>
+          <w:rFonts w:ascii="SimSun" w:eastAsia="SimSun" w:hAnsi="SimSun"/>
+          <w:sz w:val="24"/>
+          <w:szCs w:val="24"/>
+        </w:rPr>
+        <w:t>surd(</w:t>
+      </w:r>
+      <w:proofErr w:type="gramEnd"/>
+      <w:r>
+        <w:rPr>
+          <w:rFonts w:ascii="SimSun" w:eastAsia="SimSun" w:hAnsi="SimSun"/>
+          <w:sz w:val="24"/>
+          <w:szCs w:val="24"/>
+        </w:rPr>
+        <w:t>Hz)')</w:t>
+      </w:r>
+    </w:p>
+    <w:p>
+      <w:pPr>
+        <w:rPr>
+          <w:rFonts w:ascii="SimSun" w:eastAsia="SimSun" w:hAnsi="SimSun"/>
+          <w:sz w:val="24"/>
+          <w:szCs w:val="24"/>
+        </w:rPr>
+      </w:pPr>
+      <w:proofErr w:type="gramStart"/>
       <w:r>
         <w:rPr>
           <w:rFonts w:ascii="SimSun" w:eastAsia="SimSun" w:hAnsi="SimSun" w:cs="Courier New"/>
@@ -6132,16 +8023,10 @@
           <w:sz w:val="24"/>
           <w:szCs w:val="24"/>
         </w:rPr>
-        <w:t>set(gca,</w:t>
-      </w:r>
-      <w:r>
-        <w:rPr>
-          <w:rFonts w:ascii="SimSun" w:eastAsia="SimSun" w:hAnsi="SimSun" w:cs="Courier New"/>
-          <w:sz w:val="24"/>
-          <w:szCs w:val="24"/>
-        </w:rPr>
-        <w:t>'fontname','DejaVu Sans'</w:t>
-      </w:r>
+        <w:t>set(</w:t>
+      </w:r>
+      <w:proofErr w:type="spellStart"/>
+      <w:proofErr w:type="gramEnd"/>
       <w:r>
         <w:rPr>
           <w:rFonts w:ascii="SimSun" w:eastAsia="SimSun" w:hAnsi="SimSun" w:cs="Courier New"/>
@@ -6149,6 +8034,69 @@
           <w:sz w:val="24"/>
           <w:szCs w:val="24"/>
         </w:rPr>
+        <w:t>gca</w:t>
+      </w:r>
+      <w:proofErr w:type="spellEnd"/>
+      <w:r>
+        <w:rPr>
+          <w:rFonts w:ascii="SimSun" w:eastAsia="SimSun" w:hAnsi="SimSun" w:cs="Courier New"/>
+          <w:color w:val="000000"/>
+          <w:sz w:val="24"/>
+          <w:szCs w:val="24"/>
+        </w:rPr>
+        <w:t>,</w:t>
+      </w:r>
+      <w:r>
+        <w:rPr>
+          <w:rFonts w:ascii="SimSun" w:eastAsia="SimSun" w:hAnsi="SimSun" w:cs="Courier New"/>
+          <w:sz w:val="24"/>
+          <w:szCs w:val="24"/>
+        </w:rPr>
+        <w:t>'</w:t>
+      </w:r>
+      <w:proofErr w:type="spellStart"/>
+      <w:r>
+        <w:rPr>
+          <w:rFonts w:ascii="SimSun" w:eastAsia="SimSun" w:hAnsi="SimSun" w:cs="Courier New"/>
+          <w:sz w:val="24"/>
+          <w:szCs w:val="24"/>
+        </w:rPr>
+        <w:t>fontname</w:t>
+      </w:r>
+      <w:proofErr w:type="spellEnd"/>
+      <w:r>
+        <w:rPr>
+          <w:rFonts w:ascii="SimSun" w:eastAsia="SimSun" w:hAnsi="SimSun" w:cs="Courier New"/>
+          <w:sz w:val="24"/>
+          <w:szCs w:val="24"/>
+        </w:rPr>
+        <w:t>','</w:t>
+      </w:r>
+      <w:proofErr w:type="spellStart"/>
+      <w:r>
+        <w:rPr>
+          <w:rFonts w:ascii="SimSun" w:eastAsia="SimSun" w:hAnsi="SimSun" w:cs="Courier New"/>
+          <w:sz w:val="24"/>
+          <w:szCs w:val="24"/>
+        </w:rPr>
+        <w:t>DejaVu</w:t>
+      </w:r>
+      <w:proofErr w:type="spellEnd"/>
+      <w:r>
+        <w:rPr>
+          <w:rFonts w:ascii="SimSun" w:eastAsia="SimSun" w:hAnsi="SimSun" w:cs="Courier New"/>
+          <w:sz w:val="24"/>
+          <w:szCs w:val="24"/>
+        </w:rPr>
+        <w:t xml:space="preserve"> Sans'</w:t>
+      </w:r>
+      <w:r>
+        <w:rPr>
+          <w:rFonts w:ascii="SimSun" w:eastAsia="SimSun" w:hAnsi="SimSun" w:cs="Courier New"/>
+          <w:color w:val="000000"/>
+          <w:sz w:val="24"/>
+          <w:szCs w:val="24"/>
+        </w:rPr>
         <w:t>)</w:t>
       </w:r>
     </w:p>
@@ -6166,7 +8114,6 @@
           <w:sz w:val="24"/>
           <w:szCs w:val="24"/>
         </w:rPr>
-        <w:lastRenderedPageBreak/>
         <w:t>legend('0.00V','0.10V','numColumns',2,'location','northeast')</w:t>
       </w:r>
     </w:p>
@@ -6201,7 +8148,25 @@
           <w:sz w:val="24"/>
           <w:szCs w:val="24"/>
         </w:rPr>
-        <w:t>print('Noise_low_f','-depsc')</w:t>
+        <w:t>print('Noise_low_f','-</w:t>
+      </w:r>
+      <w:proofErr w:type="spellStart"/>
+      <w:r>
+        <w:rPr>
+          <w:rFonts w:ascii="SimSun" w:eastAsia="SimSun" w:hAnsi="SimSun"/>
+          <w:sz w:val="24"/>
+          <w:szCs w:val="24"/>
+        </w:rPr>
+        <w:t>depsc</w:t>
+      </w:r>
+      <w:proofErr w:type="spellEnd"/>
+      <w:r>
+        <w:rPr>
+          <w:rFonts w:ascii="SimSun" w:eastAsia="SimSun" w:hAnsi="SimSun"/>
+          <w:sz w:val="24"/>
+          <w:szCs w:val="24"/>
+        </w:rPr>
+        <w:t>')</w:t>
       </w:r>
     </w:p>
     <w:p>
@@ -6307,7 +8272,23 @@
           <w:sz w:val="24"/>
           <w:szCs w:val="24"/>
         </w:rPr>
-        <w:t>have gnd at the bottom of the diagram.</w:t>
+        <w:t xml:space="preserve">have </w:t>
+      </w:r>
+      <w:proofErr w:type="spellStart"/>
+      <w:r>
+        <w:rPr>
+          <w:sz w:val="24"/>
+          <w:szCs w:val="24"/>
+        </w:rPr>
+        <w:t>gnd</w:t>
+      </w:r>
+      <w:proofErr w:type="spellEnd"/>
+      <w:r>
+        <w:rPr>
+          <w:sz w:val="24"/>
+          <w:szCs w:val="24"/>
+        </w:rPr>
+        <w:t xml:space="preserve"> at the bottom of the diagram.</w:t>
       </w:r>
     </w:p>
     <w:p>
@@ -6398,8 +8379,9 @@
           <w:sz w:val="20"/>
           <w:szCs w:val="20"/>
         </w:rPr>
-        <w:t>The pre-stabilized laser system was the same for both aLIGO gravitational wave detectors. The laser</w:t>
-      </w:r>
+        <w:t xml:space="preserve">The pre-stabilized laser system was the same for both </w:t>
+      </w:r>
+      <w:proofErr w:type="spellStart"/>
       <w:r>
         <w:rPr>
           <w:rFonts w:ascii="URWPalladioL-Roma" w:hAnsi="URWPalladioL-Roma" w:cs="URWPalladioL-Roma"/>
@@ -6407,8 +8389,9 @@
           <w:sz w:val="20"/>
           <w:szCs w:val="20"/>
         </w:rPr>
-        <w:t xml:space="preserve"> </w:t>
-      </w:r>
+        <w:t>aLIGO</w:t>
+      </w:r>
+      <w:proofErr w:type="spellEnd"/>
       <w:r>
         <w:rPr>
           <w:rFonts w:ascii="URWPalladioL-Roma" w:hAnsi="URWPalladioL-Roma" w:cs="URWPalladioL-Roma"/>
@@ -6416,7 +8399,7 @@
           <w:sz w:val="20"/>
           <w:szCs w:val="20"/>
         </w:rPr>
-        <w:t xml:space="preserve">system </w:t>
+        <w:t xml:space="preserve"> gravitational wave detectors. The laser system </w:t>
       </w:r>
       <w:r>
         <w:rPr>
@@ -6452,7 +8435,16 @@
           <w:sz w:val="20"/>
           <w:szCs w:val="20"/>
         </w:rPr>
-        <w:t xml:space="preserve"> isolated laser room and could be operated completely remote via the LIGO</w:t>
+        <w:t xml:space="preserve"> isolated laser room and could be operated completely remote via the LIGO control and data system (CDS, [</w:t>
+      </w:r>
+      <w:r>
+        <w:rPr>
+          <w:rFonts w:ascii="URWPalladioL-Roma" w:hAnsi="URWPalladioL-Roma" w:cs="URWPalladioL-Roma"/>
+          <w:color w:val="0875B8"/>
+          <w:sz w:val="20"/>
+          <w:szCs w:val="20"/>
+        </w:rPr>
+        <w:t>11</w:t>
       </w:r>
       <w:r>
         <w:rPr>
@@ -6461,43 +8453,7 @@
           <w:sz w:val="20"/>
           <w:szCs w:val="20"/>
         </w:rPr>
-        <w:t xml:space="preserve"> </w:t>
-      </w:r>
-      <w:r>
-        <w:rPr>
-          <w:rFonts w:ascii="URWPalladioL-Roma" w:hAnsi="URWPalladioL-Roma" w:cs="URWPalladioL-Roma"/>
-          <w:color w:val="000000"/>
-          <w:sz w:val="20"/>
-          <w:szCs w:val="20"/>
-        </w:rPr>
-        <w:t>control and data system (CDS, [</w:t>
-      </w:r>
-      <w:r>
-        <w:rPr>
-          <w:rFonts w:ascii="URWPalladioL-Roma" w:hAnsi="URWPalladioL-Roma" w:cs="URWPalladioL-Roma"/>
-          <w:color w:val="0875B8"/>
-          <w:sz w:val="20"/>
-          <w:szCs w:val="20"/>
-        </w:rPr>
-        <w:t>11</w:t>
-      </w:r>
-      <w:r>
-        <w:rPr>
-          <w:rFonts w:ascii="URWPalladioL-Roma" w:hAnsi="URWPalladioL-Roma" w:cs="URWPalladioL-Roma"/>
-          <w:color w:val="000000"/>
-          <w:sz w:val="20"/>
-          <w:szCs w:val="20"/>
-        </w:rPr>
-        <w:t>]) and integrated Beckhoff modules.</w:t>
-      </w:r>
-      <w:r>
-        <w:rPr>
-          <w:rFonts w:ascii="URWPalladioL-Roma" w:hAnsi="URWPalladioL-Roma" w:cs="URWPalladioL-Roma"/>
-          <w:color w:val="000000"/>
-          <w:sz w:val="20"/>
-          <w:szCs w:val="20"/>
-        </w:rPr>
-        <w:t xml:space="preserve"> </w:t>
+        <w:t xml:space="preserve">]) and integrated Beckhoff modules. </w:t>
       </w:r>
       <w:r>
         <w:rPr>
@@ -6545,23 +8501,7 @@
           <w:sz w:val="20"/>
           <w:szCs w:val="20"/>
         </w:rPr>
-        <w:t xml:space="preserve">interference between the diode drivers and the </w:t>
-      </w:r>
-      <w:r>
-        <w:rPr>
-          <w:rFonts w:ascii="URWPalladioL-Roma" w:hAnsi="URWPalladioL-Roma" w:cs="URWPalladioL-Roma"/>
-          <w:sz w:val="20"/>
-          <w:szCs w:val="20"/>
-        </w:rPr>
-        <w:t>sensitive</w:t>
-      </w:r>
-      <w:r>
-        <w:rPr>
-          <w:rFonts w:ascii="URWPalladioL-Roma" w:hAnsi="URWPalladioL-Roma" w:cs="URWPalladioL-Roma"/>
-          <w:sz w:val="20"/>
-          <w:szCs w:val="20"/>
-        </w:rPr>
-        <w:t xml:space="preserve"> electronics located in the laser room. </w:t>
+        <w:t xml:space="preserve">interference between the diode drivers and the sensitive electronics located in the laser room. </w:t>
       </w:r>
       <w:r>
         <w:rPr>
@@ -6883,23 +8823,25 @@
           <w:sz w:val="20"/>
           <w:szCs w:val="20"/>
         </w:rPr>
-        <w:t xml:space="preserve"> on the lasers intensity </w:t>
-      </w:r>
+        <w:t xml:space="preserve"> on the </w:t>
+      </w:r>
+      <w:proofErr w:type="gramStart"/>
       <w:r>
         <w:rPr>
           <w:rFonts w:ascii="URWPalladioL-Roma" w:hAnsi="URWPalladioL-Roma" w:cs="URWPalladioL-Roma"/>
           <w:sz w:val="20"/>
           <w:szCs w:val="20"/>
         </w:rPr>
-        <w:t xml:space="preserve">were considered: an AOM </w:t>
-      </w:r>
+        <w:t>lasers</w:t>
+      </w:r>
+      <w:proofErr w:type="gramEnd"/>
       <w:r>
         <w:rPr>
           <w:rFonts w:ascii="URWPalladioL-Roma" w:hAnsi="URWPalladioL-Roma" w:cs="URWPalladioL-Roma"/>
           <w:sz w:val="20"/>
           <w:szCs w:val="20"/>
         </w:rPr>
-        <w:t>or a</w:t>
+        <w:t xml:space="preserve"> intensity </w:t>
       </w:r>
       <w:r>
         <w:rPr>
@@ -6907,7 +8849,7 @@
           <w:sz w:val="20"/>
           <w:szCs w:val="20"/>
         </w:rPr>
-        <w:t xml:space="preserve"> current modulator on one of pump diode lasers.</w:t>
+        <w:t xml:space="preserve">were considered: an AOM </w:t>
       </w:r>
       <w:r>
         <w:rPr>
@@ -6915,7 +8857,7 @@
           <w:sz w:val="20"/>
           <w:szCs w:val="20"/>
         </w:rPr>
-        <w:t xml:space="preserve"> The AOM method </w:t>
+        <w:t>or a</w:t>
       </w:r>
       <w:r>
         <w:rPr>
@@ -6923,7 +8865,7 @@
           <w:sz w:val="20"/>
           <w:szCs w:val="20"/>
         </w:rPr>
-        <w:t>proved reliable during O3, however</w:t>
+        <w:t xml:space="preserve"> current modulator on one of pump diode lasers.</w:t>
       </w:r>
       <w:r>
         <w:rPr>
@@ -6931,7 +8873,7 @@
           <w:sz w:val="20"/>
           <w:szCs w:val="20"/>
         </w:rPr>
-        <w:t xml:space="preserve"> a </w:t>
+        <w:t xml:space="preserve"> The AOM method </w:t>
       </w:r>
       <w:r>
         <w:rPr>
@@ -6939,7 +8881,7 @@
           <w:sz w:val="20"/>
           <w:szCs w:val="20"/>
         </w:rPr>
-        <w:t>significant amount of light</w:t>
+        <w:t>proved reliable during O3, however</w:t>
       </w:r>
       <w:r>
         <w:rPr>
@@ -6947,7 +8889,7 @@
           <w:sz w:val="20"/>
           <w:szCs w:val="20"/>
         </w:rPr>
-        <w:t xml:space="preserve"> (~10W)</w:t>
+        <w:t xml:space="preserve"> a </w:t>
       </w:r>
       <w:r>
         <w:rPr>
@@ -6955,7 +8897,7 @@
           <w:sz w:val="20"/>
           <w:szCs w:val="20"/>
         </w:rPr>
-        <w:t xml:space="preserve"> needs to be </w:t>
+        <w:t>significant amount of light</w:t>
       </w:r>
       <w:r>
         <w:rPr>
@@ -6963,7 +8905,7 @@
           <w:sz w:val="20"/>
           <w:szCs w:val="20"/>
         </w:rPr>
-        <w:t>B</w:t>
+        <w:t xml:space="preserve"> (~10W)</w:t>
       </w:r>
       <w:r>
         <w:rPr>
@@ -6971,7 +8913,7 @@
           <w:sz w:val="20"/>
           <w:szCs w:val="20"/>
         </w:rPr>
-        <w:t xml:space="preserve">ragg scattered into higher </w:t>
+        <w:t xml:space="preserve"> needs to be </w:t>
       </w:r>
       <w:r>
         <w:rPr>
@@ -6979,7 +8921,7 @@
           <w:sz w:val="20"/>
           <w:szCs w:val="20"/>
         </w:rPr>
-        <w:t>order modes</w:t>
+        <w:t>B</w:t>
       </w:r>
       <w:r>
         <w:rPr>
@@ -6987,7 +8929,41 @@
           <w:sz w:val="20"/>
           <w:szCs w:val="20"/>
         </w:rPr>
-        <w:t>. Additionally, having transmissive optics in a high power beam path can lead to deformation of the beam</w:t>
+        <w:t xml:space="preserve">ragg scattered into higher </w:t>
+      </w:r>
+      <w:r>
+        <w:rPr>
+          <w:rFonts w:ascii="URWPalladioL-Roma" w:hAnsi="URWPalladioL-Roma" w:cs="URWPalladioL-Roma"/>
+          <w:sz w:val="20"/>
+          <w:szCs w:val="20"/>
+        </w:rPr>
+        <w:t>order modes</w:t>
+      </w:r>
+      <w:r>
+        <w:rPr>
+          <w:rFonts w:ascii="URWPalladioL-Roma" w:hAnsi="URWPalladioL-Roma" w:cs="URWPalladioL-Roma"/>
+          <w:sz w:val="20"/>
+          <w:szCs w:val="20"/>
+        </w:rPr>
+        <w:t xml:space="preserve">. Additionally, having transmissive optics in a </w:t>
+      </w:r>
+      <w:proofErr w:type="gramStart"/>
+      <w:r>
+        <w:rPr>
+          <w:rFonts w:ascii="URWPalladioL-Roma" w:hAnsi="URWPalladioL-Roma" w:cs="URWPalladioL-Roma"/>
+          <w:sz w:val="20"/>
+          <w:szCs w:val="20"/>
+        </w:rPr>
+        <w:t>high power</w:t>
+      </w:r>
+      <w:proofErr w:type="gramEnd"/>
+      <w:r>
+        <w:rPr>
+          <w:rFonts w:ascii="URWPalladioL-Roma" w:hAnsi="URWPalladioL-Roma" w:cs="URWPalladioL-Roma"/>
+          <w:sz w:val="20"/>
+          <w:szCs w:val="20"/>
+        </w:rPr>
+        <w:t xml:space="preserve"> beam path can lead to deformation of the beam</w:t>
       </w:r>
       <w:r>
         <w:rPr>

</xml_diff>

<commit_message>
Edited the intro, concept and layout sections. Edited diagrams and wrote captions for these sections.
</commit_message>
<xml_diff>
--- a/Structuring.docx
+++ b/Structuring.docx
@@ -807,6 +807,75 @@
         </w:rPr>
         <w:lastRenderedPageBreak/>
         <w:t>Fourth level Editing</w:t>
+      </w:r>
+    </w:p>
+    <w:p>
+      <w:pPr>
+        <w:rPr>
+          <w:rFonts w:cstheme="minorHAnsi"/>
+          <w:sz w:val="24"/>
+          <w:szCs w:val="24"/>
+        </w:rPr>
+      </w:pPr>
+      <w:r>
+        <w:rPr>
+          <w:rFonts w:cstheme="minorHAnsi"/>
+          <w:sz w:val="24"/>
+          <w:szCs w:val="24"/>
+        </w:rPr>
+        <w:t>Mak</w:t>
+      </w:r>
+      <w:r>
+        <w:rPr>
+          <w:rFonts w:cstheme="minorHAnsi"/>
+          <w:sz w:val="24"/>
+          <w:szCs w:val="24"/>
+        </w:rPr>
+        <w:t xml:space="preserve">e sure that </w:t>
+      </w:r>
+      <w:r>
+        <w:rPr>
+          <w:rFonts w:cstheme="minorHAnsi"/>
+          <w:sz w:val="24"/>
+          <w:szCs w:val="24"/>
+        </w:rPr>
+        <w:t xml:space="preserve">inanimate objects are not doing things (e.g. the chapter </w:t>
+      </w:r>
+      <w:proofErr w:type="gramStart"/>
+      <w:r>
+        <w:rPr>
+          <w:rFonts w:cstheme="minorHAnsi"/>
+          <w:sz w:val="24"/>
+          <w:szCs w:val="24"/>
+        </w:rPr>
+        <w:t>isn’t</w:t>
+      </w:r>
+      <w:proofErr w:type="gramEnd"/>
+      <w:r>
+        <w:rPr>
+          <w:rFonts w:cstheme="minorHAnsi"/>
+          <w:sz w:val="24"/>
+          <w:szCs w:val="24"/>
+        </w:rPr>
+        <w:t xml:space="preserve"> describing, things are described in the </w:t>
+      </w:r>
+      <w:proofErr w:type="spellStart"/>
+      <w:r>
+        <w:rPr>
+          <w:rFonts w:cstheme="minorHAnsi"/>
+          <w:sz w:val="24"/>
+          <w:szCs w:val="24"/>
+        </w:rPr>
+        <w:t>chatper</w:t>
+      </w:r>
+      <w:proofErr w:type="spellEnd"/>
+      <w:r>
+        <w:rPr>
+          <w:rFonts w:cstheme="minorHAnsi"/>
+          <w:sz w:val="24"/>
+          <w:szCs w:val="24"/>
+        </w:rPr>
+        <w:t xml:space="preserve"> etc)</w:t>
       </w:r>
     </w:p>
     <w:p>
@@ -2030,6 +2099,7 @@
           <w:sz w:val="24"/>
           <w:szCs w:val="24"/>
         </w:rPr>
+        <w:lastRenderedPageBreak/>
         <w:t>The choice depends on how</w:t>
       </w:r>
       <w:r>
@@ -2082,7 +2152,6 @@
           <w:sz w:val="24"/>
           <w:szCs w:val="24"/>
         </w:rPr>
-        <w:lastRenderedPageBreak/>
         <w:t>the rat, having eaten the poison, was dead.</w:t>
       </w:r>
     </w:p>
@@ -3244,6 +3313,7 @@
           <w:sz w:val="24"/>
           <w:szCs w:val="24"/>
         </w:rPr>
+        <w:lastRenderedPageBreak/>
         <w:t>However</w:t>
       </w:r>
       <w:proofErr w:type="gramEnd"/>
@@ -3404,7 +3474,6 @@
           <w:sz w:val="24"/>
           <w:szCs w:val="24"/>
         </w:rPr>
-        <w:lastRenderedPageBreak/>
         <w:t>The rat was gone</w:t>
       </w:r>
       <w:r>
@@ -4479,6 +4548,7 @@
           <w:sz w:val="24"/>
           <w:szCs w:val="24"/>
         </w:rPr>
+        <w:lastRenderedPageBreak/>
         <w:t>Facts that were once believed.</w:t>
       </w:r>
     </w:p>
@@ -4561,7 +4631,6 @@
           <w:sz w:val="24"/>
           <w:szCs w:val="24"/>
         </w:rPr>
-        <w:lastRenderedPageBreak/>
         <w:t>This chapter explore</w:t>
       </w:r>
       <w:r>
@@ -5148,6 +5217,71 @@
         </w:rPr>
         <w:t>adverbs: very,</w:t>
       </w:r>
+      <w:r>
+        <w:rPr>
+          <w:sz w:val="24"/>
+          <w:szCs w:val="24"/>
+        </w:rPr>
+        <w:t xml:space="preserve"> </w:t>
+      </w:r>
+      <w:r>
+        <w:rPr>
+          <w:sz w:val="24"/>
+          <w:szCs w:val="24"/>
+        </w:rPr>
+        <w:t>rather</w:t>
+      </w:r>
+      <w:r>
+        <w:rPr>
+          <w:sz w:val="24"/>
+          <w:szCs w:val="24"/>
+        </w:rPr>
+        <w:t xml:space="preserve"> (to mean </w:t>
+      </w:r>
+      <w:r>
+        <w:rPr>
+          <w:sz w:val="24"/>
+          <w:szCs w:val="24"/>
+        </w:rPr>
+        <w:t>to some degree</w:t>
+      </w:r>
+      <w:r>
+        <w:rPr>
+          <w:sz w:val="24"/>
+          <w:szCs w:val="24"/>
+        </w:rPr>
+        <w:t>, not instead</w:t>
+      </w:r>
+      <w:r>
+        <w:rPr>
+          <w:sz w:val="24"/>
+          <w:szCs w:val="24"/>
+        </w:rPr>
+        <w:t>)</w:t>
+      </w:r>
+      <w:r>
+        <w:rPr>
+          <w:sz w:val="24"/>
+          <w:szCs w:val="24"/>
+        </w:rPr>
+        <w:t xml:space="preserve">, really, </w:t>
+      </w:r>
+      <w:proofErr w:type="gramStart"/>
+      <w:r>
+        <w:rPr>
+          <w:sz w:val="24"/>
+          <w:szCs w:val="24"/>
+        </w:rPr>
+        <w:t>quite</w:t>
+      </w:r>
+      <w:proofErr w:type="gramEnd"/>
+      <w:r>
+        <w:rPr>
+          <w:sz w:val="24"/>
+          <w:szCs w:val="24"/>
+        </w:rPr>
+        <w:t>, in fact, so (to mean extreme), actually and pretty.</w:t>
+      </w:r>
     </w:p>
     <w:p>
       <w:pPr>
@@ -5463,7 +5597,21 @@
           <w:sz w:val="24"/>
           <w:szCs w:val="24"/>
         </w:rPr>
-        <w:t>, future detector = LIGO A+, the detector in a general abstract sense = LIGO</w:t>
+        <w:t xml:space="preserve">, future detector = LIGO A+, the </w:t>
+      </w:r>
+      <w:r>
+        <w:rPr>
+          <w:sz w:val="24"/>
+          <w:szCs w:val="24"/>
+        </w:rPr>
+        <w:t>organisation</w:t>
+      </w:r>
+      <w:r>
+        <w:rPr>
+          <w:sz w:val="24"/>
+          <w:szCs w:val="24"/>
+        </w:rPr>
+        <w:t xml:space="preserve"> in a general abstract sense = LIGO</w:t>
       </w:r>
     </w:p>
     <w:p>
@@ -5559,6 +5707,7 @@
           <w:sz w:val="24"/>
           <w:szCs w:val="24"/>
         </w:rPr>
+        <w:lastRenderedPageBreak/>
         <w:t xml:space="preserve">Check </w:t>
       </w:r>
       <w:r>
@@ -5682,7 +5831,6 @@
           <w:sz w:val="32"/>
           <w:szCs w:val="32"/>
         </w:rPr>
-        <w:lastRenderedPageBreak/>
         <w:t xml:space="preserve">Presentation of </w:t>
       </w:r>
       <w:r>
@@ -6479,6 +6627,7 @@
           <w:sz w:val="24"/>
           <w:szCs w:val="24"/>
         </w:rPr>
+        <w:lastRenderedPageBreak/>
         <w:t>In general, for matplotlib figures use</w:t>
       </w:r>
       <w:r>
@@ -6679,7 +6828,6 @@
           <w:sz w:val="24"/>
           <w:szCs w:val="24"/>
         </w:rPr>
-        <w:lastRenderedPageBreak/>
         <w:t>figure_size</w:t>
       </w:r>
       <w:proofErr w:type="spellEnd"/>
@@ -7842,7 +7990,6 @@
           <w:sz w:val="24"/>
           <w:szCs w:val="24"/>
         </w:rPr>
-        <w:lastRenderedPageBreak/>
         <w:t>loglog(</w:t>
       </w:r>
       <w:proofErr w:type="gramEnd"/>
@@ -8897,7 +9044,16 @@
           <w:sz w:val="20"/>
           <w:szCs w:val="20"/>
         </w:rPr>
-        <w:t>significant amount of light</w:t>
+        <w:t xml:space="preserve">significant amount of </w:t>
+      </w:r>
+      <w:r>
+        <w:rPr>
+          <w:rFonts w:ascii="URWPalladioL-Roma" w:hAnsi="URWPalladioL-Roma" w:cs="URWPalladioL-Roma"/>
+          <w:sz w:val="20"/>
+          <w:szCs w:val="20"/>
+        </w:rPr>
+        <w:lastRenderedPageBreak/>
+        <w:t>light</w:t>
       </w:r>
       <w:r>
         <w:rPr>

</xml_diff>

<commit_message>
editted actuator section, modified open-loop tf measurement figure. did modelling of open loop tf (needs to be written up).
</commit_message>
<xml_diff>
--- a/Structuring.docx
+++ b/Structuring.docx
@@ -2015,23 +2015,7 @@
           <w:sz w:val="24"/>
           <w:szCs w:val="24"/>
         </w:rPr>
-        <w:t xml:space="preserve"> and it</w:t>
-      </w:r>
-      <w:r>
-        <w:rPr>
-          <w:rFonts w:cstheme="minorHAnsi"/>
-          <w:sz w:val="24"/>
-          <w:szCs w:val="24"/>
-        </w:rPr>
-        <w:t xml:space="preserve"> provides 80% of the meaning</w:t>
-      </w:r>
-      <w:r>
-        <w:rPr>
-          <w:rFonts w:cstheme="minorHAnsi"/>
-          <w:sz w:val="24"/>
-          <w:szCs w:val="24"/>
-        </w:rPr>
-        <w:t>.</w:t>
+        <w:t xml:space="preserve"> and it provides 80% of the meaning.</w:t>
       </w:r>
       <w:r>
         <w:rPr>
@@ -2525,8 +2509,22 @@
           <w:szCs w:val="21"/>
           <w:shd w:val="clear" w:color="auto" w:fill="F9F9F9"/>
         </w:rPr>
-        <w:t>Although Fred's a nice guy, he commits *genocide*.</w:t>
-      </w:r>
+        <w:t xml:space="preserve">Although Fred's a nice guy, he commits *genocide*. </w:t>
+      </w:r>
+    </w:p>
+    <w:p>
+      <w:pPr>
+        <w:pStyle w:val="ListParagraph"/>
+        <w:numPr>
+          <w:ilvl w:val="0"/>
+          <w:numId w:val="12"/>
+        </w:numPr>
+        <w:rPr>
+          <w:rFonts w:cstheme="minorHAnsi"/>
+          <w:sz w:val="24"/>
+          <w:szCs w:val="24"/>
+        </w:rPr>
+      </w:pPr>
       <w:r>
         <w:rPr>
           <w:rFonts w:ascii="Roboto" w:hAnsi="Roboto"/>
@@ -2535,22 +2533,8 @@
           <w:szCs w:val="21"/>
           <w:shd w:val="clear" w:color="auto" w:fill="F9F9F9"/>
         </w:rPr>
-        <w:t xml:space="preserve"> </w:t>
-      </w:r>
-    </w:p>
-    <w:p>
-      <w:pPr>
-        <w:pStyle w:val="ListParagraph"/>
-        <w:numPr>
-          <w:ilvl w:val="0"/>
-          <w:numId w:val="12"/>
-        </w:numPr>
-        <w:rPr>
-          <w:rFonts w:cstheme="minorHAnsi"/>
-          <w:sz w:val="24"/>
-          <w:szCs w:val="24"/>
-        </w:rPr>
-      </w:pPr>
+        <w:t xml:space="preserve"> Although Fred commits *genocide*, he's a nice guy</w:t>
+      </w:r>
       <w:r>
         <w:rPr>
           <w:rFonts w:ascii="Roboto" w:hAnsi="Roboto"/>
@@ -2559,26 +2543,6 @@
           <w:szCs w:val="21"/>
           <w:shd w:val="clear" w:color="auto" w:fill="F9F9F9"/>
         </w:rPr>
-        <w:t xml:space="preserve"> </w:t>
-      </w:r>
-      <w:r>
-        <w:rPr>
-          <w:rFonts w:ascii="Roboto" w:hAnsi="Roboto"/>
-          <w:color w:val="030303"/>
-          <w:sz w:val="21"/>
-          <w:szCs w:val="21"/>
-          <w:shd w:val="clear" w:color="auto" w:fill="F9F9F9"/>
-        </w:rPr>
-        <w:t>Although Fred commits *genocide*, he's a nice guy</w:t>
-      </w:r>
-      <w:r>
-        <w:rPr>
-          <w:rFonts w:ascii="Roboto" w:hAnsi="Roboto"/>
-          <w:color w:val="030303"/>
-          <w:sz w:val="21"/>
-          <w:szCs w:val="21"/>
-          <w:shd w:val="clear" w:color="auto" w:fill="F9F9F9"/>
-        </w:rPr>
         <w:t>.</w:t>
       </w:r>
     </w:p>
@@ -2785,15 +2749,7 @@
           <w:sz w:val="24"/>
           <w:szCs w:val="24"/>
         </w:rPr>
-        <w:t>disappointing</w:t>
-      </w:r>
-      <w:r>
-        <w:rPr>
-          <w:rFonts w:cstheme="minorHAnsi"/>
-          <w:sz w:val="24"/>
-          <w:szCs w:val="24"/>
-        </w:rPr>
-        <w:t xml:space="preserve">  </w:t>
+        <w:t xml:space="preserve">disappointing  </w:t>
       </w:r>
       <w:r>
         <w:rPr>
@@ -6706,6 +6662,135 @@
     </w:p>
     <w:p>
       <w:pPr>
+        <w:pStyle w:val="ListParagraph"/>
+        <w:numPr>
+          <w:ilvl w:val="0"/>
+          <w:numId w:val="6"/>
+        </w:numPr>
+        <w:rPr>
+          <w:sz w:val="24"/>
+          <w:szCs w:val="24"/>
+        </w:rPr>
+      </w:pPr>
+      <w:r>
+        <w:rPr>
+          <w:sz w:val="24"/>
+          <w:szCs w:val="24"/>
+        </w:rPr>
+        <w:t xml:space="preserve">Free-running, open-loop, closed-loop. </w:t>
+      </w:r>
+    </w:p>
+    <w:p>
+      <w:pPr>
+        <w:pStyle w:val="ListParagraph"/>
+        <w:numPr>
+          <w:ilvl w:val="0"/>
+          <w:numId w:val="6"/>
+        </w:numPr>
+        <w:rPr>
+          <w:sz w:val="24"/>
+          <w:szCs w:val="24"/>
+        </w:rPr>
+      </w:pPr>
+      <w:r>
+        <w:rPr>
+          <w:sz w:val="24"/>
+          <w:szCs w:val="24"/>
+        </w:rPr>
+        <w:t>Remove ‘in order to’, this is a useless phrase</w:t>
+      </w:r>
+      <w:r>
+        <w:rPr>
+          <w:sz w:val="24"/>
+          <w:szCs w:val="24"/>
+        </w:rPr>
+        <w:t xml:space="preserve"> (normally? </w:t>
+      </w:r>
+      <w:r>
+        <w:rPr>
+          <w:sz w:val="24"/>
+          <w:szCs w:val="24"/>
+        </w:rPr>
+        <w:t>May be useful to add emphasis</w:t>
+      </w:r>
+      <w:r>
+        <w:rPr>
+          <w:sz w:val="24"/>
+          <w:szCs w:val="24"/>
+        </w:rPr>
+        <w:t>).</w:t>
+      </w:r>
+    </w:p>
+    <w:p>
+      <w:pPr>
+        <w:pStyle w:val="ListParagraph"/>
+        <w:numPr>
+          <w:ilvl w:val="0"/>
+          <w:numId w:val="6"/>
+        </w:numPr>
+        <w:rPr>
+          <w:sz w:val="24"/>
+          <w:szCs w:val="24"/>
+        </w:rPr>
+      </w:pPr>
+      <w:r>
+        <w:rPr>
+          <w:sz w:val="24"/>
+          <w:szCs w:val="24"/>
+        </w:rPr>
+        <w:t>Checker fewer</w:t>
+      </w:r>
+      <w:r>
+        <w:rPr>
+          <w:sz w:val="24"/>
+          <w:szCs w:val="24"/>
+        </w:rPr>
+        <w:t xml:space="preserve"> and less</w:t>
+      </w:r>
+      <w:r>
+        <w:rPr>
+          <w:sz w:val="24"/>
+          <w:szCs w:val="24"/>
+        </w:rPr>
+        <w:t>.</w:t>
+      </w:r>
+    </w:p>
+    <w:p>
+      <w:pPr>
+        <w:pStyle w:val="ListParagraph"/>
+        <w:numPr>
+          <w:ilvl w:val="0"/>
+          <w:numId w:val="6"/>
+        </w:numPr>
+        <w:rPr>
+          <w:sz w:val="24"/>
+          <w:szCs w:val="24"/>
+        </w:rPr>
+      </w:pPr>
+      <w:r>
+        <w:rPr>
+          <w:sz w:val="24"/>
+          <w:szCs w:val="24"/>
+        </w:rPr>
+        <w:t>P</w:t>
+      </w:r>
+      <w:r>
+        <w:rPr>
+          <w:sz w:val="24"/>
+          <w:szCs w:val="24"/>
+        </w:rPr>
+        <w:t>ump</w:t>
+      </w:r>
+      <w:r>
+        <w:rPr>
+          <w:sz w:val="24"/>
+          <w:szCs w:val="24"/>
+        </w:rPr>
+        <w:t>-diode</w:t>
+      </w:r>
+    </w:p>
+    <w:p>
+      <w:pPr>
         <w:ind w:left="720"/>
         <w:rPr>
           <w:sz w:val="24"/>
@@ -7073,6 +7158,7 @@
           <w:sz w:val="24"/>
           <w:szCs w:val="24"/>
         </w:rPr>
+        <w:lastRenderedPageBreak/>
         <w:t>Is there any weird looking ‘1e-5’ type notation?</w:t>
       </w:r>
     </w:p>
@@ -7122,7 +7208,6 @@
           <w:sz w:val="24"/>
           <w:szCs w:val="24"/>
         </w:rPr>
-        <w:lastRenderedPageBreak/>
         <w:t>On a higher level of editing, make sure that things are consistent. (To expand</w:t>
       </w:r>
       <w:r>
@@ -7831,7 +7916,6 @@
           <w:sz w:val="24"/>
           <w:szCs w:val="24"/>
         </w:rPr>
-        <w:lastRenderedPageBreak/>
         <w:t>For matlab figures, use the linspecer (from mathworks file exchange) function to</w:t>
       </w:r>
       <w:r>
@@ -8360,16 +8444,9 @@
           <w:sz w:val="24"/>
           <w:szCs w:val="24"/>
         </w:rPr>
+        <w:lastRenderedPageBreak/>
         <w:t>see art of electronics appendix B for more tips.</w:t>
       </w:r>
-    </w:p>
-    <w:p>
-      <w:pPr>
-        <w:rPr>
-          <w:sz w:val="24"/>
-          <w:szCs w:val="24"/>
-        </w:rPr>
-      </w:pPr>
     </w:p>
     <w:p>
       <w:pPr>
@@ -8378,379 +8455,22 @@
         <w:adjustRightInd w:val="0"/>
         <w:spacing w:after="0" w:line="240" w:lineRule="auto"/>
         <w:rPr>
-          <w:rFonts w:ascii="URWPalladioL-Roma" w:hAnsi="URWPalladioL-Roma" w:cs="URWPalladioL-Roma"/>
-          <w:color w:val="000000"/>
-          <w:sz w:val="20"/>
-          <w:szCs w:val="20"/>
-        </w:rPr>
-      </w:pPr>
-      <w:r>
-        <w:rPr>
-          <w:rFonts w:ascii="URWPalladioL-Roma" w:hAnsi="URWPalladioL-Roma" w:cs="URWPalladioL-Roma"/>
-          <w:color w:val="000000"/>
-          <w:sz w:val="20"/>
-          <w:szCs w:val="20"/>
-        </w:rPr>
-        <w:lastRenderedPageBreak/>
-        <w:t xml:space="preserve">The pre-stabilized laser system was the same for both aLIGO gravitational wave detectors. The laser system </w:t>
-      </w:r>
-      <w:r>
-        <w:rPr>
-          <w:rFonts w:ascii="URWPalladioL-Roma" w:hAnsi="URWPalladioL-Roma" w:cs="URWPalladioL-Roma"/>
-          <w:color w:val="000000"/>
-          <w:sz w:val="20"/>
-          <w:szCs w:val="20"/>
-        </w:rPr>
-        <w:t>was in</w:t>
-      </w:r>
-      <w:r>
-        <w:rPr>
-          <w:rFonts w:ascii="URWPalladioL-Roma" w:hAnsi="URWPalladioL-Roma" w:cs="URWPalladioL-Roma"/>
-          <w:color w:val="000000"/>
-          <w:sz w:val="20"/>
-          <w:szCs w:val="20"/>
-        </w:rPr>
-        <w:t xml:space="preserve"> a</w:t>
-      </w:r>
-      <w:r>
-        <w:rPr>
-          <w:rFonts w:ascii="URWPalladioL-Roma" w:hAnsi="URWPalladioL-Roma" w:cs="URWPalladioL-Roma"/>
-          <w:color w:val="000000"/>
-          <w:sz w:val="20"/>
-          <w:szCs w:val="20"/>
-        </w:rPr>
-        <w:t>n</w:t>
-      </w:r>
-      <w:r>
-        <w:rPr>
-          <w:rFonts w:ascii="URWPalladioL-Roma" w:hAnsi="URWPalladioL-Roma" w:cs="URWPalladioL-Roma"/>
-          <w:color w:val="000000"/>
-          <w:sz w:val="20"/>
-          <w:szCs w:val="20"/>
-        </w:rPr>
-        <w:t xml:space="preserve"> isolated laser room and could be operated completely remote via the LIGO control and data system (CDS, [</w:t>
-      </w:r>
-      <w:r>
-        <w:rPr>
-          <w:rFonts w:ascii="URWPalladioL-Roma" w:hAnsi="URWPalladioL-Roma" w:cs="URWPalladioL-Roma"/>
-          <w:color w:val="0875B8"/>
-          <w:sz w:val="20"/>
-          <w:szCs w:val="20"/>
-        </w:rPr>
-        <w:t>11</w:t>
-      </w:r>
-      <w:r>
-        <w:rPr>
-          <w:rFonts w:ascii="URWPalladioL-Roma" w:hAnsi="URWPalladioL-Roma" w:cs="URWPalladioL-Roma"/>
-          <w:color w:val="000000"/>
-          <w:sz w:val="20"/>
-          <w:szCs w:val="20"/>
-        </w:rPr>
-        <w:t xml:space="preserve">]) and integrated Beckhoff modules. </w:t>
-      </w:r>
-      <w:r>
-        <w:rPr>
-          <w:rFonts w:ascii="URWPalladioL-Roma" w:hAnsi="URWPalladioL-Roma" w:cs="URWPalladioL-Roma"/>
-          <w:sz w:val="20"/>
-          <w:szCs w:val="20"/>
-        </w:rPr>
-        <w:t>The front-end diode boxes</w:t>
-      </w:r>
-      <w:r>
-        <w:rPr>
-          <w:rFonts w:ascii="SFSS0500" w:hAnsi="SFSS0500" w:cs="SFSS0500"/>
-          <w:sz w:val="10"/>
-          <w:szCs w:val="10"/>
-        </w:rPr>
-        <w:t xml:space="preserve"> </w:t>
-      </w:r>
-      <w:r>
-        <w:rPr>
-          <w:rFonts w:ascii="URWPalladioL-Roma" w:hAnsi="URWPalladioL-Roma" w:cs="URWPalladioL-Roma"/>
-          <w:sz w:val="20"/>
-          <w:szCs w:val="20"/>
-        </w:rPr>
-        <w:t xml:space="preserve">were in an additional room to prevent from </w:t>
-      </w:r>
-      <w:r>
-        <w:rPr>
-          <w:rFonts w:ascii="URWPalladioL-Roma" w:hAnsi="URWPalladioL-Roma" w:cs="URWPalladioL-Roma"/>
-          <w:sz w:val="20"/>
-          <w:szCs w:val="20"/>
-        </w:rPr>
-        <w:t>electromagnetic</w:t>
-      </w:r>
-      <w:r>
-        <w:rPr>
-          <w:rFonts w:ascii="SFSS0500" w:hAnsi="SFSS0500" w:cs="SFSS0500"/>
-          <w:sz w:val="10"/>
-          <w:szCs w:val="10"/>
-        </w:rPr>
-        <w:t xml:space="preserve"> </w:t>
-      </w:r>
-      <w:r>
-        <w:rPr>
-          <w:rFonts w:ascii="URWPalladioL-Roma" w:hAnsi="URWPalladioL-Roma" w:cs="URWPalladioL-Roma"/>
-          <w:sz w:val="20"/>
-          <w:szCs w:val="20"/>
-        </w:rPr>
-        <w:t xml:space="preserve">interference between the diode drivers and the sensitive electronics located in the laser room. </w:t>
-      </w:r>
-      <w:r>
-        <w:rPr>
-          <w:rFonts w:ascii="URWPalladioL-Roma" w:hAnsi="URWPalladioL-Roma" w:cs="URWPalladioL-Roma"/>
-          <w:sz w:val="20"/>
-          <w:szCs w:val="20"/>
-        </w:rPr>
-        <w:t>Th</w:t>
-      </w:r>
-      <w:r>
-        <w:rPr>
-          <w:rFonts w:ascii="URWPalladioL-Roma" w:hAnsi="URWPalladioL-Roma" w:cs="URWPalladioL-Roma"/>
-          <w:sz w:val="20"/>
-          <w:szCs w:val="20"/>
-        </w:rPr>
-        <w:t>e electronics for the DBB, the PMC</w:t>
-      </w:r>
-      <w:r>
-        <w:rPr>
-          <w:rFonts w:ascii="URWPalladioL-Roma" w:hAnsi="URWPalladioL-Roma" w:cs="URWPalladioL-Roma"/>
-          <w:sz w:val="20"/>
-          <w:szCs w:val="20"/>
-        </w:rPr>
-        <w:t xml:space="preserve"> and </w:t>
-      </w:r>
-      <w:r>
-        <w:rPr>
-          <w:rFonts w:ascii="URWPalladioL-Roma" w:hAnsi="URWPalladioL-Roma" w:cs="URWPalladioL-Roma"/>
-          <w:sz w:val="20"/>
-          <w:szCs w:val="20"/>
-        </w:rPr>
-        <w:t>the intensity stabilization</w:t>
-      </w:r>
-      <w:r>
-        <w:rPr>
-          <w:rFonts w:ascii="URWPalladioL-Roma" w:hAnsi="URWPalladioL-Roma" w:cs="URWPalladioL-Roma"/>
-          <w:sz w:val="20"/>
-          <w:szCs w:val="20"/>
-        </w:rPr>
-        <w:t xml:space="preserve"> as well as</w:t>
-      </w:r>
-      <w:r>
-        <w:rPr>
-          <w:rFonts w:ascii="URWPalladioL-Roma" w:hAnsi="URWPalladioL-Roma" w:cs="URWPalladioL-Roma"/>
-          <w:sz w:val="20"/>
-          <w:szCs w:val="20"/>
-        </w:rPr>
-        <w:t xml:space="preserve"> </w:t>
-      </w:r>
-      <w:r>
-        <w:rPr>
-          <w:rFonts w:ascii="URWPalladioL-Roma" w:hAnsi="URWPalladioL-Roma" w:cs="URWPalladioL-Roma"/>
-          <w:sz w:val="20"/>
-          <w:szCs w:val="20"/>
-        </w:rPr>
-        <w:t>interface between</w:t>
-      </w:r>
-      <w:r>
-        <w:rPr>
-          <w:rFonts w:ascii="URWPalladioL-Roma" w:hAnsi="URWPalladioL-Roma" w:cs="URWPalladioL-Roma"/>
-          <w:sz w:val="20"/>
-          <w:szCs w:val="20"/>
-        </w:rPr>
-        <w:t xml:space="preserve"> </w:t>
-      </w:r>
-      <w:r>
-        <w:rPr>
-          <w:rFonts w:ascii="URWPalladioL-Roma" w:hAnsi="URWPalladioL-Roma" w:cs="URWPalladioL-Roma"/>
-          <w:sz w:val="20"/>
-          <w:szCs w:val="20"/>
-        </w:rPr>
-        <w:t>CDS and the</w:t>
-      </w:r>
-      <w:r>
-        <w:rPr>
-          <w:rFonts w:ascii="URWPalladioL-Roma" w:hAnsi="URWPalladioL-Roma" w:cs="URWPalladioL-Roma"/>
-          <w:sz w:val="20"/>
-          <w:szCs w:val="20"/>
-        </w:rPr>
-        <w:t xml:space="preserve"> </w:t>
-      </w:r>
-      <w:r>
-        <w:rPr>
-          <w:rFonts w:ascii="URWPalladioL-Roma" w:hAnsi="URWPalladioL-Roma" w:cs="URWPalladioL-Roma"/>
-          <w:sz w:val="20"/>
-          <w:szCs w:val="20"/>
-        </w:rPr>
-        <w:t xml:space="preserve">frequency stabilization </w:t>
-      </w:r>
-      <w:r>
-        <w:rPr>
-          <w:rFonts w:ascii="URWPalladioL-Roma" w:hAnsi="URWPalladioL-Roma" w:cs="URWPalladioL-Roma"/>
-          <w:sz w:val="20"/>
-          <w:szCs w:val="20"/>
-        </w:rPr>
-        <w:t xml:space="preserve">servo </w:t>
-      </w:r>
-      <w:r>
-        <w:rPr>
-          <w:rFonts w:ascii="URWPalladioL-Roma" w:hAnsi="URWPalladioL-Roma" w:cs="URWPalladioL-Roma"/>
-          <w:sz w:val="20"/>
-          <w:szCs w:val="20"/>
-        </w:rPr>
-        <w:t>were located outsides of the laser room.</w:t>
-      </w:r>
-      <w:r>
-        <w:rPr>
-          <w:rFonts w:ascii="URWPalladioL-Roma" w:hAnsi="URWPalladioL-Roma" w:cs="URWPalladioL-Roma"/>
-          <w:sz w:val="20"/>
-          <w:szCs w:val="20"/>
-        </w:rPr>
-        <w:t xml:space="preserve"> </w:t>
-      </w:r>
-      <w:r>
-        <w:rPr>
-          <w:rFonts w:ascii="URWPalladioL-Roma" w:hAnsi="URWPalladioL-Roma" w:cs="URWPalladioL-Roma"/>
-          <w:sz w:val="20"/>
-          <w:szCs w:val="20"/>
-        </w:rPr>
-        <w:t>To reduce</w:t>
-      </w:r>
-      <w:r>
-        <w:rPr>
-          <w:rFonts w:ascii="URWPalladioL-Roma" w:hAnsi="URWPalladioL-Roma" w:cs="URWPalladioL-Roma"/>
-          <w:sz w:val="20"/>
-          <w:szCs w:val="20"/>
-        </w:rPr>
-        <w:t xml:space="preserve"> potential noise couplings</w:t>
-      </w:r>
-      <w:r>
-        <w:rPr>
-          <w:rFonts w:ascii="URWPalladioL-Roma" w:hAnsi="URWPalladioL-Roma" w:cs="URWPalladioL-Roma"/>
-          <w:sz w:val="20"/>
-          <w:szCs w:val="20"/>
-        </w:rPr>
-        <w:t xml:space="preserve"> </w:t>
-      </w:r>
-      <w:r>
-        <w:rPr>
-          <w:rFonts w:ascii="URWPalladioL-Roma" w:hAnsi="URWPalladioL-Roma" w:cs="URWPalladioL-Roma"/>
-          <w:sz w:val="20"/>
-          <w:szCs w:val="20"/>
-        </w:rPr>
-        <w:t>associated with long cables</w:t>
-      </w:r>
-      <w:r>
-        <w:rPr>
-          <w:rFonts w:ascii="URWPalladioL-Roma" w:hAnsi="URWPalladioL-Roma" w:cs="URWPalladioL-Roma"/>
-          <w:sz w:val="20"/>
-          <w:szCs w:val="20"/>
-        </w:rPr>
-        <w:t>, t</w:t>
-      </w:r>
-      <w:r>
-        <w:rPr>
-          <w:rFonts w:ascii="URWPalladioL-Roma" w:hAnsi="URWPalladioL-Roma" w:cs="URWPalladioL-Roma"/>
-          <w:sz w:val="20"/>
-          <w:szCs w:val="20"/>
-        </w:rPr>
-        <w:t xml:space="preserve">he </w:t>
-      </w:r>
-      <w:r>
-        <w:rPr>
-          <w:rFonts w:ascii="URWPalladioL-Roma" w:hAnsi="URWPalladioL-Roma" w:cs="URWPalladioL-Roma"/>
-          <w:sz w:val="20"/>
-          <w:szCs w:val="20"/>
-        </w:rPr>
-        <w:t>tabletop</w:t>
-      </w:r>
-      <w:r>
-        <w:rPr>
-          <w:rFonts w:ascii="URWPalladioL-Roma" w:hAnsi="URWPalladioL-Roma" w:cs="URWPalladioL-Roma"/>
-          <w:sz w:val="20"/>
-          <w:szCs w:val="20"/>
-        </w:rPr>
-        <w:t xml:space="preserve"> frequency stabilization servo (TTFSS) was</w:t>
-      </w:r>
-      <w:r>
-        <w:rPr>
-          <w:rFonts w:ascii="URWPalladioL-Roma" w:hAnsi="URWPalladioL-Roma" w:cs="URWPalladioL-Roma"/>
-          <w:sz w:val="20"/>
-          <w:szCs w:val="20"/>
-        </w:rPr>
-        <w:t xml:space="preserve"> the</w:t>
-      </w:r>
-      <w:r>
-        <w:rPr>
-          <w:rFonts w:ascii="SFSS0500" w:hAnsi="SFSS0500" w:cs="SFSS0500"/>
-          <w:sz w:val="10"/>
-          <w:szCs w:val="10"/>
-        </w:rPr>
-        <w:t xml:space="preserve"> </w:t>
-      </w:r>
-      <w:r>
-        <w:rPr>
-          <w:rFonts w:ascii="URWPalladioL-Roma" w:hAnsi="URWPalladioL-Roma" w:cs="URWPalladioL-Roma"/>
-          <w:sz w:val="20"/>
-          <w:szCs w:val="20"/>
-        </w:rPr>
-        <w:t>located on the laser table</w:t>
-      </w:r>
-      <w:r>
-        <w:rPr>
-          <w:rFonts w:ascii="URWPalladioL-Roma" w:hAnsi="URWPalladioL-Roma" w:cs="URWPalladioL-Roma"/>
-          <w:sz w:val="20"/>
-          <w:szCs w:val="20"/>
-        </w:rPr>
-        <w:t>.</w:t>
-      </w:r>
-      <w:r>
-        <w:rPr>
-          <w:rFonts w:ascii="URWPalladioL-Roma" w:hAnsi="URWPalladioL-Roma" w:cs="URWPalladioL-Roma"/>
-          <w:sz w:val="20"/>
-          <w:szCs w:val="20"/>
-        </w:rPr>
-        <w:t xml:space="preserve"> </w:t>
-      </w:r>
-      <w:r>
-        <w:rPr>
-          <w:rFonts w:ascii="URWPalladioL-Roma" w:hAnsi="URWPalladioL-Roma" w:cs="URWPalladioL-Roma"/>
-          <w:sz w:val="20"/>
-          <w:szCs w:val="20"/>
-        </w:rPr>
-        <w:t xml:space="preserve">The chiller for the </w:t>
-      </w:r>
-      <w:r>
-        <w:rPr>
-          <w:rFonts w:ascii="URWPalladioL-Roma" w:hAnsi="URWPalladioL-Roma" w:cs="URWPalladioL-Roma"/>
-          <w:sz w:val="20"/>
-          <w:szCs w:val="20"/>
-        </w:rPr>
-        <w:t>water-cooling</w:t>
-      </w:r>
-      <w:r>
-        <w:rPr>
-          <w:rFonts w:ascii="URWPalladioL-Roma" w:hAnsi="URWPalladioL-Roma" w:cs="URWPalladioL-Roma"/>
-          <w:sz w:val="20"/>
-          <w:szCs w:val="20"/>
-        </w:rPr>
-        <w:t xml:space="preserve"> system for the amplifiers, diode boxes and </w:t>
-      </w:r>
-      <w:r>
-        <w:rPr>
-          <w:rFonts w:ascii="URWPalladioL-Roma" w:hAnsi="URWPalladioL-Roma" w:cs="URWPalladioL-Roma"/>
-          <w:sz w:val="20"/>
-          <w:szCs w:val="20"/>
-        </w:rPr>
-        <w:t>high-power</w:t>
-      </w:r>
-      <w:r>
-        <w:rPr>
-          <w:rFonts w:ascii="URWPalladioL-Roma" w:hAnsi="URWPalladioL-Roma" w:cs="URWPalladioL-Roma"/>
-          <w:sz w:val="20"/>
-          <w:szCs w:val="20"/>
-        </w:rPr>
-        <w:t xml:space="preserve"> beam dumps was situated in the additional room to decrease the coupling between the laser and the acoustic noise generated by the chiller.</w:t>
+          <w:rFonts w:asciiTheme="majorHAnsi" w:hAnsiTheme="majorHAnsi" w:cstheme="majorHAnsi"/>
+          <w:b/>
+          <w:bCs/>
+          <w:sz w:val="24"/>
+          <w:szCs w:val="24"/>
+        </w:rPr>
+      </w:pPr>
+      <w:r>
+        <w:rPr>
+          <w:rFonts w:asciiTheme="majorHAnsi" w:hAnsiTheme="majorHAnsi" w:cstheme="majorHAnsi"/>
+          <w:b/>
+          <w:bCs/>
+          <w:sz w:val="24"/>
+          <w:szCs w:val="24"/>
+        </w:rPr>
+        <w:t>Photos</w:t>
       </w:r>
     </w:p>
     <w:p>
@@ -8760,9 +8480,8 @@
         <w:adjustRightInd w:val="0"/>
         <w:spacing w:after="0" w:line="240" w:lineRule="auto"/>
         <w:rPr>
-          <w:rFonts w:ascii="URWPalladioL-Roma" w:hAnsi="URWPalladioL-Roma" w:cs="URWPalladioL-Roma"/>
-          <w:sz w:val="20"/>
-          <w:szCs w:val="20"/>
+          <w:sz w:val="24"/>
+          <w:szCs w:val="24"/>
         </w:rPr>
       </w:pPr>
     </w:p>
@@ -8780,259 +8499,17 @@
       </w:pPr>
       <w:r>
         <w:rPr>
-          <w:rFonts w:ascii="URWPalladioL-Roma" w:hAnsi="URWPalladioL-Roma" w:cs="URWPalladioL-Roma"/>
-          <w:sz w:val="20"/>
-          <w:szCs w:val="20"/>
-        </w:rPr>
-        <w:t>T</w:t>
-      </w:r>
-      <w:r>
-        <w:rPr>
-          <w:rFonts w:ascii="URWPalladioL-Roma" w:hAnsi="URWPalladioL-Roma" w:cs="URWPalladioL-Roma"/>
-          <w:sz w:val="20"/>
-          <w:szCs w:val="20"/>
-        </w:rPr>
-        <w:t>wo methods for providing</w:t>
-      </w:r>
-      <w:r>
-        <w:rPr>
-          <w:rFonts w:ascii="URWPalladioL-Roma" w:hAnsi="URWPalladioL-Roma" w:cs="URWPalladioL-Roma"/>
-          <w:sz w:val="20"/>
-          <w:szCs w:val="20"/>
-        </w:rPr>
-        <w:t xml:space="preserve"> actuat</w:t>
-      </w:r>
-      <w:r>
-        <w:rPr>
-          <w:rFonts w:ascii="URWPalladioL-Roma" w:hAnsi="URWPalladioL-Roma" w:cs="URWPalladioL-Roma"/>
-          <w:sz w:val="20"/>
-          <w:szCs w:val="20"/>
-        </w:rPr>
-        <w:t>ion</w:t>
-      </w:r>
-      <w:r>
-        <w:rPr>
-          <w:rFonts w:ascii="URWPalladioL-Roma" w:hAnsi="URWPalladioL-Roma" w:cs="URWPalladioL-Roma"/>
-          <w:sz w:val="20"/>
-          <w:szCs w:val="20"/>
-        </w:rPr>
-        <w:t xml:space="preserve"> on the lasers intensity </w:t>
-      </w:r>
-      <w:r>
-        <w:rPr>
-          <w:rFonts w:ascii="URWPalladioL-Roma" w:hAnsi="URWPalladioL-Roma" w:cs="URWPalladioL-Roma"/>
-          <w:sz w:val="20"/>
-          <w:szCs w:val="20"/>
-        </w:rPr>
-        <w:t xml:space="preserve">were considered: an AOM </w:t>
-      </w:r>
-      <w:r>
-        <w:rPr>
-          <w:rFonts w:ascii="URWPalladioL-Roma" w:hAnsi="URWPalladioL-Roma" w:cs="URWPalladioL-Roma"/>
-          <w:sz w:val="20"/>
-          <w:szCs w:val="20"/>
-        </w:rPr>
-        <w:t>or a</w:t>
-      </w:r>
-      <w:r>
-        <w:rPr>
-          <w:rFonts w:ascii="URWPalladioL-Roma" w:hAnsi="URWPalladioL-Roma" w:cs="URWPalladioL-Roma"/>
-          <w:sz w:val="20"/>
-          <w:szCs w:val="20"/>
-        </w:rPr>
-        <w:t xml:space="preserve"> current modulator on one of pump diode lasers.</w:t>
-      </w:r>
-      <w:r>
-        <w:rPr>
-          <w:rFonts w:ascii="URWPalladioL-Roma" w:hAnsi="URWPalladioL-Roma" w:cs="URWPalladioL-Roma"/>
-          <w:sz w:val="20"/>
-          <w:szCs w:val="20"/>
-        </w:rPr>
-        <w:t xml:space="preserve"> The AOM method </w:t>
-      </w:r>
-      <w:r>
-        <w:rPr>
-          <w:rFonts w:ascii="URWPalladioL-Roma" w:hAnsi="URWPalladioL-Roma" w:cs="URWPalladioL-Roma"/>
-          <w:sz w:val="20"/>
-          <w:szCs w:val="20"/>
-        </w:rPr>
-        <w:t>proved reliable during O3, however</w:t>
-      </w:r>
-      <w:r>
-        <w:rPr>
-          <w:rFonts w:ascii="URWPalladioL-Roma" w:hAnsi="URWPalladioL-Roma" w:cs="URWPalladioL-Roma"/>
-          <w:sz w:val="20"/>
-          <w:szCs w:val="20"/>
-        </w:rPr>
-        <w:t xml:space="preserve"> a </w:t>
-      </w:r>
-      <w:r>
-        <w:rPr>
-          <w:rFonts w:ascii="URWPalladioL-Roma" w:hAnsi="URWPalladioL-Roma" w:cs="URWPalladioL-Roma"/>
-          <w:sz w:val="20"/>
-          <w:szCs w:val="20"/>
-        </w:rPr>
-        <w:t>significant amount of light</w:t>
-      </w:r>
-      <w:r>
-        <w:rPr>
-          <w:rFonts w:ascii="URWPalladioL-Roma" w:hAnsi="URWPalladioL-Roma" w:cs="URWPalladioL-Roma"/>
-          <w:sz w:val="20"/>
-          <w:szCs w:val="20"/>
-        </w:rPr>
-        <w:t xml:space="preserve"> (~10W)</w:t>
-      </w:r>
-      <w:r>
-        <w:rPr>
-          <w:rFonts w:ascii="URWPalladioL-Roma" w:hAnsi="URWPalladioL-Roma" w:cs="URWPalladioL-Roma"/>
-          <w:sz w:val="20"/>
-          <w:szCs w:val="20"/>
-        </w:rPr>
-        <w:t xml:space="preserve"> needs to be </w:t>
-      </w:r>
-      <w:r>
-        <w:rPr>
-          <w:rFonts w:ascii="URWPalladioL-Roma" w:hAnsi="URWPalladioL-Roma" w:cs="URWPalladioL-Roma"/>
-          <w:sz w:val="20"/>
-          <w:szCs w:val="20"/>
-        </w:rPr>
-        <w:t>B</w:t>
-      </w:r>
-      <w:r>
-        <w:rPr>
-          <w:rFonts w:ascii="URWPalladioL-Roma" w:hAnsi="URWPalladioL-Roma" w:cs="URWPalladioL-Roma"/>
-          <w:sz w:val="20"/>
-          <w:szCs w:val="20"/>
-        </w:rPr>
-        <w:t xml:space="preserve">ragg scattered into higher </w:t>
-      </w:r>
-      <w:r>
-        <w:rPr>
-          <w:rFonts w:ascii="URWPalladioL-Roma" w:hAnsi="URWPalladioL-Roma" w:cs="URWPalladioL-Roma"/>
-          <w:sz w:val="20"/>
-          <w:szCs w:val="20"/>
-        </w:rPr>
-        <w:t>order modes</w:t>
-      </w:r>
-      <w:r>
-        <w:rPr>
-          <w:rFonts w:ascii="URWPalladioL-Roma" w:hAnsi="URWPalladioL-Roma" w:cs="URWPalladioL-Roma"/>
-          <w:sz w:val="20"/>
-          <w:szCs w:val="20"/>
-        </w:rPr>
-        <w:t>. Additionally, having transmissive optics in a high power beam path can lead to deformation of the beam</w:t>
-      </w:r>
-      <w:r>
-        <w:rPr>
-          <w:rFonts w:ascii="URWPalladioL-Roma" w:hAnsi="URWPalladioL-Roma" w:cs="URWPalladioL-Roma"/>
-          <w:sz w:val="20"/>
-          <w:szCs w:val="20"/>
-        </w:rPr>
-        <w:t xml:space="preserve">. </w:t>
-      </w:r>
-      <w:r>
-        <w:rPr>
-          <w:rFonts w:ascii="URWPalladioL-Roma" w:hAnsi="URWPalladioL-Roma" w:cs="URWPalladioL-Roma"/>
-          <w:sz w:val="20"/>
-          <w:szCs w:val="20"/>
-        </w:rPr>
-        <w:t xml:space="preserve"> </w:t>
-      </w:r>
-      <w:r>
-        <w:rPr>
-          <w:rFonts w:ascii="URWPalladioL-Roma" w:hAnsi="URWPalladioL-Roma" w:cs="URWPalladioL-Roma"/>
-          <w:sz w:val="20"/>
-          <w:szCs w:val="20"/>
-        </w:rPr>
-        <w:t>The current shunt</w:t>
-      </w:r>
-      <w:r>
-        <w:rPr>
-          <w:rFonts w:ascii="URWPalladioL-Roma" w:hAnsi="URWPalladioL-Roma" w:cs="URWPalladioL-Roma"/>
-          <w:sz w:val="20"/>
-          <w:szCs w:val="20"/>
-        </w:rPr>
-        <w:t xml:space="preserve"> technique requires a much small</w:t>
-      </w:r>
-      <w:r>
-        <w:rPr>
-          <w:rFonts w:ascii="URWPalladioL-Roma" w:hAnsi="URWPalladioL-Roma" w:cs="URWPalladioL-Roma"/>
-          <w:sz w:val="20"/>
-          <w:szCs w:val="20"/>
-        </w:rPr>
-        <w:t>er</w:t>
-      </w:r>
-      <w:r>
-        <w:rPr>
-          <w:rFonts w:ascii="URWPalladioL-Roma" w:hAnsi="URWPalladioL-Roma" w:cs="URWPalladioL-Roma"/>
-          <w:sz w:val="20"/>
-          <w:szCs w:val="20"/>
-        </w:rPr>
-        <w:t xml:space="preserve"> offset</w:t>
-      </w:r>
-      <w:r>
-        <w:rPr>
-          <w:rFonts w:ascii="URWPalladioL-Roma" w:hAnsi="URWPalladioL-Roma" w:cs="URWPalladioL-Roma"/>
-          <w:sz w:val="20"/>
-          <w:szCs w:val="20"/>
-        </w:rPr>
-        <w:t xml:space="preserve"> and does not introduce </w:t>
-      </w:r>
-      <w:r>
-        <w:rPr>
-          <w:rFonts w:ascii="URWPalladioL-Roma" w:hAnsi="URWPalladioL-Roma" w:cs="URWPalladioL-Roma"/>
-          <w:sz w:val="20"/>
-          <w:szCs w:val="20"/>
-        </w:rPr>
-        <w:t xml:space="preserve">extra transmissive optics into the beam path. </w:t>
-      </w:r>
-      <w:r>
-        <w:rPr>
-          <w:rFonts w:ascii="URWPalladioL-Roma" w:hAnsi="URWPalladioL-Roma" w:cs="URWPalladioL-Roma"/>
-          <w:sz w:val="20"/>
-          <w:szCs w:val="20"/>
-        </w:rPr>
-        <w:t>However</w:t>
-      </w:r>
-      <w:r>
-        <w:rPr>
-          <w:rFonts w:ascii="URWPalladioL-Roma" w:hAnsi="URWPalladioL-Roma" w:cs="URWPalladioL-Roma"/>
-          <w:sz w:val="20"/>
-          <w:szCs w:val="20"/>
-        </w:rPr>
-        <w:t>,</w:t>
-      </w:r>
-      <w:r>
-        <w:rPr>
-          <w:rFonts w:ascii="URWPalladioL-Roma" w:hAnsi="URWPalladioL-Roma" w:cs="URWPalladioL-Roma"/>
-          <w:sz w:val="20"/>
-          <w:szCs w:val="20"/>
-        </w:rPr>
-        <w:t xml:space="preserve"> </w:t>
-      </w:r>
-      <w:r>
-        <w:rPr>
-          <w:rFonts w:ascii="URWPalladioL-Roma" w:hAnsi="URWPalladioL-Roma" w:cs="URWPalladioL-Roma"/>
-          <w:sz w:val="20"/>
-          <w:szCs w:val="20"/>
-        </w:rPr>
-        <w:t>altering the pump diode currents will change the thermal lensing in the amplifier</w:t>
-      </w:r>
-      <w:r>
-        <w:rPr>
-          <w:rFonts w:ascii="URWPalladioL-Roma" w:hAnsi="URWPalladioL-Roma" w:cs="URWPalladioL-Roma"/>
-          <w:sz w:val="20"/>
-          <w:szCs w:val="20"/>
-        </w:rPr>
-        <w:t xml:space="preserve">. </w:t>
-      </w:r>
-      <w:r>
-        <w:rPr>
-          <w:rFonts w:ascii="URWPalladioL-Roma" w:hAnsi="URWPalladioL-Roma" w:cs="URWPalladioL-Roma"/>
-          <w:sz w:val="20"/>
-          <w:szCs w:val="20"/>
-        </w:rPr>
-        <w:t>To attenuate the beams power, it</w:t>
+          <w:sz w:val="24"/>
+          <w:szCs w:val="24"/>
+        </w:rPr>
+        <w:t xml:space="preserve">Edit with GIMP, save as xcf and jpeg. The xcf allows for re-editing. Jpeg is good for photos, </w:t>
+      </w:r>
+      <w:r>
+        <w:rPr>
+          <w:sz w:val="24"/>
+          <w:szCs w:val="24"/>
+        </w:rPr>
+        <w:t xml:space="preserve">although it can be bad for text. </w:t>
       </w:r>
     </w:p>
     <w:sectPr>

</xml_diff>

<commit_message>
fifth level edits made for the ligo laser chapter. This version was sent off to Ken
</commit_message>
<xml_diff>
--- a/Structuring.docx
+++ b/Structuring.docx
@@ -5819,7 +5819,14 @@
           <w:sz w:val="24"/>
           <w:szCs w:val="24"/>
         </w:rPr>
-        <w:t>Ctrl+f effect and affect</w:t>
+        <w:t xml:space="preserve">Ctrl+f </w:t>
+      </w:r>
+      <w:r>
+        <w:rPr>
+          <w:sz w:val="24"/>
+          <w:szCs w:val="24"/>
+        </w:rPr>
+        <w:t>the the</w:t>
       </w:r>
     </w:p>
     <w:p>
@@ -5839,14 +5846,42 @@
           <w:sz w:val="24"/>
           <w:szCs w:val="24"/>
         </w:rPr>
-        <w:t xml:space="preserve">Ctrl+f </w:t>
-      </w:r>
-      <w:r>
-        <w:rPr>
-          <w:sz w:val="24"/>
-          <w:szCs w:val="24"/>
-        </w:rPr>
-        <w:t>the the</w:t>
+        <w:t xml:space="preserve">etc. </w:t>
+      </w:r>
+      <w:r>
+        <w:rPr>
+          <w:sz w:val="24"/>
+          <w:szCs w:val="24"/>
+        </w:rPr>
+        <w:t>-&gt;</w:t>
+      </w:r>
+      <w:r>
+        <w:rPr>
+          <w:sz w:val="24"/>
+          <w:szCs w:val="24"/>
+        </w:rPr>
+        <w:t xml:space="preserve"> etc.~</w:t>
+      </w:r>
+      <w:r>
+        <w:rPr>
+          <w:sz w:val="24"/>
+          <w:szCs w:val="24"/>
+        </w:rPr>
+        <w:t>,</w:t>
+      </w:r>
+      <w:r>
+        <w:rPr>
+          <w:sz w:val="24"/>
+          <w:szCs w:val="24"/>
+        </w:rPr>
+        <w:t xml:space="preserve"> e.g.</w:t>
+      </w:r>
+      <w:r>
+        <w:rPr>
+          <w:sz w:val="24"/>
+          <w:szCs w:val="24"/>
+        </w:rPr>
+        <w:t xml:space="preserve"> -&gt;e.g.~ i.e. -&gt; i.e.~</w:t>
       </w:r>
     </w:p>
     <w:p>
@@ -5866,7 +5901,7 @@
           <w:sz w:val="24"/>
           <w:szCs w:val="24"/>
         </w:rPr>
-        <w:t>Look for etc. and etc.~</w:t>
+        <w:t>Check `` quote marks.</w:t>
       </w:r>
     </w:p>
     <w:p>
@@ -5886,7 +5921,7 @@
           <w:sz w:val="24"/>
           <w:szCs w:val="24"/>
         </w:rPr>
-        <w:t>Check `` quote marks.</w:t>
+        <w:t>Beam splitter, not beamsplitter</w:t>
       </w:r>
     </w:p>
     <w:p>
@@ -5906,7 +5941,14 @@
           <w:sz w:val="24"/>
           <w:szCs w:val="24"/>
         </w:rPr>
-        <w:t>Beam splitter, not beamsplitter</w:t>
+        <w:t>Equation (1.1), not Equation 1.1</w:t>
+      </w:r>
+      <w:r>
+        <w:rPr>
+          <w:sz w:val="24"/>
+          <w:szCs w:val="24"/>
+        </w:rPr>
+        <w:t>.</w:t>
       </w:r>
     </w:p>
     <w:p>
@@ -5926,14 +5968,21 @@
           <w:sz w:val="24"/>
           <w:szCs w:val="24"/>
         </w:rPr>
-        <w:t>Equation (1.1), not Equation 1.1</w:t>
-      </w:r>
-      <w:r>
-        <w:rPr>
-          <w:sz w:val="24"/>
-          <w:szCs w:val="24"/>
-        </w:rPr>
-        <w:t>.</w:t>
+        <w:t>Remove doesn’t,</w:t>
+      </w:r>
+      <w:r>
+        <w:rPr>
+          <w:sz w:val="24"/>
+          <w:szCs w:val="24"/>
+        </w:rPr>
+        <w:t xml:space="preserve"> hasn’t,</w:t>
+      </w:r>
+      <w:r>
+        <w:rPr>
+          <w:sz w:val="24"/>
+          <w:szCs w:val="24"/>
+        </w:rPr>
+        <w:t xml:space="preserve"> replace with does not, etc.</w:t>
       </w:r>
     </w:p>
     <w:p>
@@ -5953,7 +6002,186 @@
           <w:sz w:val="24"/>
           <w:szCs w:val="24"/>
         </w:rPr>
-        <w:t>Remove doesn’t, replace with does not, etc.</w:t>
+        <w:t>Ctrl+f effect and affect</w:t>
+      </w:r>
+      <w:r>
+        <w:rPr>
+          <w:sz w:val="24"/>
+          <w:szCs w:val="24"/>
+        </w:rPr>
+        <w:t xml:space="preserve">. </w:t>
+      </w:r>
+      <w:r>
+        <w:rPr>
+          <w:sz w:val="24"/>
+          <w:szCs w:val="24"/>
+        </w:rPr>
+        <w:t xml:space="preserve">Effect is a noun, affect is a verb. </w:t>
+      </w:r>
+      <w:r>
+        <w:rPr>
+          <w:sz w:val="24"/>
+          <w:szCs w:val="24"/>
+        </w:rPr>
+        <w:t>E.g. ‘the first effect’, ‘the optical spring effect’</w:t>
+      </w:r>
+      <w:r>
+        <w:rPr>
+          <w:sz w:val="24"/>
+          <w:szCs w:val="24"/>
+        </w:rPr>
+        <w:t>. ‘optical springs affect’</w:t>
+      </w:r>
+      <w:r>
+        <w:rPr>
+          <w:sz w:val="24"/>
+          <w:szCs w:val="24"/>
+        </w:rPr>
+        <w:t xml:space="preserve">. </w:t>
+      </w:r>
+    </w:p>
+    <w:p>
+      <w:pPr>
+        <w:pStyle w:val="ListParagraph"/>
+        <w:numPr>
+          <w:ilvl w:val="1"/>
+          <w:numId w:val="6"/>
+        </w:numPr>
+        <w:rPr>
+          <w:sz w:val="24"/>
+          <w:szCs w:val="24"/>
+        </w:rPr>
+      </w:pPr>
+      <w:r>
+        <w:rPr>
+          <w:sz w:val="24"/>
+          <w:szCs w:val="24"/>
+        </w:rPr>
+        <w:t>A</w:t>
+      </w:r>
+      <w:r>
+        <w:rPr>
+          <w:sz w:val="24"/>
+          <w:szCs w:val="24"/>
+        </w:rPr>
+        <w:t>ffect</w:t>
+      </w:r>
+      <w:r>
+        <w:rPr>
+          <w:sz w:val="24"/>
+          <w:szCs w:val="24"/>
+        </w:rPr>
+        <w:t xml:space="preserve"> -&gt;</w:t>
+      </w:r>
+      <w:r>
+        <w:rPr>
+          <w:sz w:val="24"/>
+          <w:szCs w:val="24"/>
+        </w:rPr>
+        <w:t xml:space="preserve"> </w:t>
+      </w:r>
+      <w:r>
+        <w:rPr>
+          <w:sz w:val="24"/>
+          <w:szCs w:val="24"/>
+        </w:rPr>
+        <w:t>alter, change, disturb</w:t>
+      </w:r>
+      <w:r>
+        <w:rPr>
+          <w:sz w:val="24"/>
+          <w:szCs w:val="24"/>
+        </w:rPr>
+        <w:t>,</w:t>
+      </w:r>
+      <w:r>
+        <w:rPr>
+          <w:sz w:val="24"/>
+          <w:szCs w:val="24"/>
+        </w:rPr>
+        <w:t xml:space="preserve"> </w:t>
+      </w:r>
+      <w:r>
+        <w:rPr>
+          <w:sz w:val="24"/>
+          <w:szCs w:val="24"/>
+        </w:rPr>
+        <w:t>influence</w:t>
+      </w:r>
+    </w:p>
+    <w:p>
+      <w:pPr>
+        <w:pStyle w:val="ListParagraph"/>
+        <w:numPr>
+          <w:ilvl w:val="1"/>
+          <w:numId w:val="6"/>
+        </w:numPr>
+        <w:rPr>
+          <w:sz w:val="24"/>
+          <w:szCs w:val="24"/>
+        </w:rPr>
+      </w:pPr>
+      <w:r>
+        <w:rPr>
+          <w:sz w:val="24"/>
+          <w:szCs w:val="24"/>
+        </w:rPr>
+        <w:t xml:space="preserve">Effect </w:t>
+      </w:r>
+      <w:r>
+        <w:rPr>
+          <w:sz w:val="24"/>
+          <w:szCs w:val="24"/>
+        </w:rPr>
+        <w:t xml:space="preserve">-&gt; </w:t>
+      </w:r>
+      <w:r>
+        <w:rPr>
+          <w:sz w:val="24"/>
+          <w:szCs w:val="24"/>
+        </w:rPr>
+        <w:t>consequence</w:t>
+      </w:r>
+      <w:r>
+        <w:rPr>
+          <w:sz w:val="24"/>
+          <w:szCs w:val="24"/>
+        </w:rPr>
+        <w:t>,</w:t>
+      </w:r>
+      <w:r>
+        <w:rPr>
+          <w:sz w:val="24"/>
+          <w:szCs w:val="24"/>
+        </w:rPr>
+        <w:t xml:space="preserve"> </w:t>
+      </w:r>
+      <w:r>
+        <w:rPr>
+          <w:sz w:val="24"/>
+          <w:szCs w:val="24"/>
+        </w:rPr>
+        <w:t>fate, product, result</w:t>
+      </w:r>
+    </w:p>
+    <w:p>
+      <w:pPr>
+        <w:pStyle w:val="ListParagraph"/>
+        <w:numPr>
+          <w:ilvl w:val="1"/>
+          <w:numId w:val="6"/>
+        </w:numPr>
+        <w:rPr>
+          <w:sz w:val="24"/>
+          <w:szCs w:val="24"/>
+        </w:rPr>
+      </w:pPr>
+      <w:r>
+        <w:rPr>
+          <w:sz w:val="24"/>
+          <w:szCs w:val="24"/>
+        </w:rPr>
+        <w:t>If unsure, check if the sentence has another verb in it.</w:t>
       </w:r>
     </w:p>
     <w:p>
@@ -5973,28 +6201,63 @@
           <w:sz w:val="24"/>
           <w:szCs w:val="24"/>
         </w:rPr>
-        <w:t xml:space="preserve">Effect is a noun, affect is a verb. </w:t>
-      </w:r>
-      <w:r>
-        <w:rPr>
-          <w:sz w:val="24"/>
-          <w:szCs w:val="24"/>
-        </w:rPr>
-        <w:t>E.g. ‘the first effect’, ‘the optical spring effect’</w:t>
-      </w:r>
-      <w:r>
-        <w:rPr>
-          <w:sz w:val="24"/>
-          <w:szCs w:val="24"/>
-        </w:rPr>
-        <w:t>. ‘optical springs affect’</w:t>
-      </w:r>
-      <w:r>
-        <w:rPr>
-          <w:sz w:val="24"/>
-          <w:szCs w:val="24"/>
-        </w:rPr>
-        <w:t xml:space="preserve">. </w:t>
+        <w:t xml:space="preserve">Remove </w:t>
+      </w:r>
+      <w:r>
+        <w:rPr>
+          <w:sz w:val="24"/>
+          <w:szCs w:val="24"/>
+        </w:rPr>
+        <w:t>adverbs: very,</w:t>
+      </w:r>
+      <w:r>
+        <w:rPr>
+          <w:sz w:val="24"/>
+          <w:szCs w:val="24"/>
+        </w:rPr>
+        <w:t xml:space="preserve"> </w:t>
+      </w:r>
+      <w:r>
+        <w:rPr>
+          <w:sz w:val="24"/>
+          <w:szCs w:val="24"/>
+        </w:rPr>
+        <w:t>rather</w:t>
+      </w:r>
+      <w:r>
+        <w:rPr>
+          <w:sz w:val="24"/>
+          <w:szCs w:val="24"/>
+        </w:rPr>
+        <w:t xml:space="preserve"> (to mean </w:t>
+      </w:r>
+      <w:r>
+        <w:rPr>
+          <w:sz w:val="24"/>
+          <w:szCs w:val="24"/>
+        </w:rPr>
+        <w:t>to some degree</w:t>
+      </w:r>
+      <w:r>
+        <w:rPr>
+          <w:sz w:val="24"/>
+          <w:szCs w:val="24"/>
+        </w:rPr>
+        <w:t>, not instead</w:t>
+      </w:r>
+      <w:r>
+        <w:rPr>
+          <w:sz w:val="24"/>
+          <w:szCs w:val="24"/>
+        </w:rPr>
+        <w:t>)</w:t>
+      </w:r>
+      <w:r>
+        <w:rPr>
+          <w:sz w:val="24"/>
+          <w:szCs w:val="24"/>
+        </w:rPr>
+        <w:t>, really, quite, in fact, so (to mean extreme), actually and pretty.</w:t>
       </w:r>
     </w:p>
     <w:p>
@@ -6014,56 +6277,41 @@
           <w:sz w:val="24"/>
           <w:szCs w:val="24"/>
         </w:rPr>
-        <w:t>A</w:t>
-      </w:r>
-      <w:r>
-        <w:rPr>
-          <w:sz w:val="24"/>
-          <w:szCs w:val="24"/>
-        </w:rPr>
-        <w:t>ffect</w:t>
-      </w:r>
-      <w:r>
-        <w:rPr>
-          <w:sz w:val="24"/>
-          <w:szCs w:val="24"/>
-        </w:rPr>
-        <w:t xml:space="preserve"> -&gt;</w:t>
-      </w:r>
-      <w:r>
-        <w:rPr>
-          <w:sz w:val="24"/>
-          <w:szCs w:val="24"/>
-        </w:rPr>
-        <w:t xml:space="preserve"> </w:t>
-      </w:r>
-      <w:r>
-        <w:rPr>
-          <w:sz w:val="24"/>
-          <w:szCs w:val="24"/>
-        </w:rPr>
-        <w:t>alter, change, disturb</w:t>
-      </w:r>
-      <w:r>
-        <w:rPr>
-          <w:sz w:val="24"/>
-          <w:szCs w:val="24"/>
-        </w:rPr>
-        <w:t>,</w:t>
-      </w:r>
-      <w:r>
-        <w:rPr>
-          <w:sz w:val="24"/>
-          <w:szCs w:val="24"/>
-        </w:rPr>
-        <w:t xml:space="preserve"> </w:t>
-      </w:r>
-      <w:r>
-        <w:rPr>
-          <w:sz w:val="24"/>
-          <w:szCs w:val="24"/>
-        </w:rPr>
-        <w:t>influence</w:t>
+        <w:t>Lots end in ‘ly’</w:t>
+      </w:r>
+    </w:p>
+    <w:p>
+      <w:pPr>
+        <w:pStyle w:val="ListParagraph"/>
+        <w:numPr>
+          <w:ilvl w:val="0"/>
+          <w:numId w:val="6"/>
+        </w:numPr>
+        <w:rPr>
+          <w:sz w:val="24"/>
+          <w:szCs w:val="24"/>
+        </w:rPr>
+      </w:pPr>
+      <w:r>
+        <w:rPr>
+          <w:sz w:val="24"/>
+          <w:szCs w:val="24"/>
+        </w:rPr>
+        <w:t>H</w:t>
+      </w:r>
+      <w:r>
+        <w:rPr>
+          <w:sz w:val="24"/>
+          <w:szCs w:val="24"/>
+        </w:rPr>
+        <w:t>yphens</w:t>
+      </w:r>
+      <w:r>
+        <w:rPr>
+          <w:sz w:val="24"/>
+          <w:szCs w:val="24"/>
+        </w:rPr>
+        <w:t xml:space="preserve">: </w:t>
       </w:r>
     </w:p>
     <w:p>
@@ -6083,42 +6331,15 @@
           <w:sz w:val="24"/>
           <w:szCs w:val="24"/>
         </w:rPr>
-        <w:t xml:space="preserve">Effect </w:t>
-      </w:r>
-      <w:r>
-        <w:rPr>
-          <w:sz w:val="24"/>
-          <w:szCs w:val="24"/>
-        </w:rPr>
-        <w:t xml:space="preserve">-&gt; </w:t>
-      </w:r>
-      <w:r>
-        <w:rPr>
-          <w:sz w:val="24"/>
-          <w:szCs w:val="24"/>
-        </w:rPr>
-        <w:t>consequence</w:t>
-      </w:r>
-      <w:r>
-        <w:rPr>
-          <w:sz w:val="24"/>
-          <w:szCs w:val="24"/>
-        </w:rPr>
-        <w:t>,</w:t>
-      </w:r>
-      <w:r>
-        <w:rPr>
-          <w:sz w:val="24"/>
-          <w:szCs w:val="24"/>
-        </w:rPr>
-        <w:t xml:space="preserve"> </w:t>
-      </w:r>
-      <w:r>
-        <w:rPr>
-          <w:sz w:val="24"/>
-          <w:szCs w:val="24"/>
-        </w:rPr>
-        <w:t>fate, product, result</w:t>
+        <w:t>&lt;adjective&gt;-&lt;adjective&gt;</w:t>
+      </w:r>
+      <w:r>
+        <w:rPr>
+          <w:sz w:val="24"/>
+          <w:szCs w:val="24"/>
+        </w:rPr>
+        <w:tab/>
+        <w:t>&lt;noun&gt;</w:t>
       </w:r>
     </w:p>
     <w:p>
@@ -6138,7 +6359,76 @@
           <w:sz w:val="24"/>
           <w:szCs w:val="24"/>
         </w:rPr>
-        <w:t>If unsure, check if the sentence has another verb in it.</w:t>
+        <w:t xml:space="preserve">Majority of papers go with mode mismatch, not </w:t>
+      </w:r>
+      <w:r>
+        <w:rPr>
+          <w:sz w:val="24"/>
+          <w:szCs w:val="24"/>
+        </w:rPr>
+        <w:t>M</w:t>
+      </w:r>
+      <w:r>
+        <w:rPr>
+          <w:sz w:val="24"/>
+          <w:szCs w:val="24"/>
+        </w:rPr>
+        <w:t>ode</w:t>
+      </w:r>
+      <w:r>
+        <w:rPr>
+          <w:sz w:val="24"/>
+          <w:szCs w:val="24"/>
+        </w:rPr>
+        <w:t>-mismatch</w:t>
+      </w:r>
+    </w:p>
+    <w:p>
+      <w:pPr>
+        <w:pStyle w:val="ListParagraph"/>
+        <w:numPr>
+          <w:ilvl w:val="1"/>
+          <w:numId w:val="6"/>
+        </w:numPr>
+        <w:rPr>
+          <w:sz w:val="24"/>
+          <w:szCs w:val="24"/>
+        </w:rPr>
+      </w:pPr>
+      <w:r>
+        <w:rPr>
+          <w:sz w:val="24"/>
+          <w:szCs w:val="24"/>
+        </w:rPr>
+        <w:t xml:space="preserve">Photodiode, not </w:t>
+      </w:r>
+      <w:r>
+        <w:rPr>
+          <w:sz w:val="24"/>
+          <w:szCs w:val="24"/>
+        </w:rPr>
+        <w:t>Photo-diode</w:t>
+      </w:r>
+    </w:p>
+    <w:p>
+      <w:pPr>
+        <w:pStyle w:val="ListParagraph"/>
+        <w:numPr>
+          <w:ilvl w:val="1"/>
+          <w:numId w:val="6"/>
+        </w:numPr>
+        <w:rPr>
+          <w:sz w:val="24"/>
+          <w:szCs w:val="24"/>
+        </w:rPr>
+      </w:pPr>
+      <w:r>
+        <w:rPr>
+          <w:sz w:val="24"/>
+          <w:szCs w:val="24"/>
+        </w:rPr>
+        <w:lastRenderedPageBreak/>
+        <w:t>Check ngram viewer if unsure.</w:t>
       </w:r>
     </w:p>
     <w:p>
@@ -6158,63 +6448,14 @@
           <w:sz w:val="24"/>
           <w:szCs w:val="24"/>
         </w:rPr>
-        <w:t xml:space="preserve">Remove </w:t>
-      </w:r>
-      <w:r>
-        <w:rPr>
-          <w:sz w:val="24"/>
-          <w:szCs w:val="24"/>
-        </w:rPr>
-        <w:t>adverbs: very,</w:t>
-      </w:r>
-      <w:r>
-        <w:rPr>
-          <w:sz w:val="24"/>
-          <w:szCs w:val="24"/>
-        </w:rPr>
-        <w:t xml:space="preserve"> </w:t>
-      </w:r>
-      <w:r>
-        <w:rPr>
-          <w:sz w:val="24"/>
-          <w:szCs w:val="24"/>
-        </w:rPr>
-        <w:t>rather</w:t>
-      </w:r>
-      <w:r>
-        <w:rPr>
-          <w:sz w:val="24"/>
-          <w:szCs w:val="24"/>
-        </w:rPr>
-        <w:t xml:space="preserve"> (to mean </w:t>
-      </w:r>
-      <w:r>
-        <w:rPr>
-          <w:sz w:val="24"/>
-          <w:szCs w:val="24"/>
-        </w:rPr>
-        <w:t>to some degree</w:t>
-      </w:r>
-      <w:r>
-        <w:rPr>
-          <w:sz w:val="24"/>
-          <w:szCs w:val="24"/>
-        </w:rPr>
-        <w:t>, not instead</w:t>
-      </w:r>
-      <w:r>
-        <w:rPr>
-          <w:sz w:val="24"/>
-          <w:szCs w:val="24"/>
-        </w:rPr>
-        <w:t>)</w:t>
-      </w:r>
-      <w:r>
-        <w:rPr>
-          <w:sz w:val="24"/>
-          <w:szCs w:val="24"/>
-        </w:rPr>
-        <w:t>, really, quite, in fact, so (to mean extreme), actually and pretty.</w:t>
+        <w:t xml:space="preserve">Made up </w:t>
+      </w:r>
+      <w:r>
+        <w:rPr>
+          <w:sz w:val="24"/>
+          <w:szCs w:val="24"/>
+        </w:rPr>
+        <w:t>verbs:</w:t>
       </w:r>
     </w:p>
     <w:p>
@@ -6234,7 +6475,28 @@
           <w:sz w:val="24"/>
           <w:szCs w:val="24"/>
         </w:rPr>
-        <w:t>Lots end in ‘ly’</w:t>
+        <w:t xml:space="preserve">E.g </w:t>
+      </w:r>
+      <w:r>
+        <w:rPr>
+          <w:sz w:val="24"/>
+          <w:szCs w:val="24"/>
+        </w:rPr>
+        <w:t xml:space="preserve">Mode </w:t>
+      </w:r>
+      <w:r>
+        <w:rPr>
+          <w:sz w:val="24"/>
+          <w:szCs w:val="24"/>
+        </w:rPr>
+        <w:t>mis</w:t>
+      </w:r>
+      <w:r>
+        <w:rPr>
+          <w:sz w:val="24"/>
+          <w:szCs w:val="24"/>
+        </w:rPr>
+        <w:t xml:space="preserve">matching </w:t>
       </w:r>
     </w:p>
     <w:p>
@@ -6254,138 +6516,21 @@
           <w:sz w:val="24"/>
           <w:szCs w:val="24"/>
         </w:rPr>
-        <w:t>H</w:t>
-      </w:r>
-      <w:r>
-        <w:rPr>
-          <w:sz w:val="24"/>
-          <w:szCs w:val="24"/>
-        </w:rPr>
-        <w:t>yphens</w:t>
-      </w:r>
-      <w:r>
-        <w:rPr>
-          <w:sz w:val="24"/>
-          <w:szCs w:val="24"/>
-        </w:rPr>
-        <w:t xml:space="preserve">: </w:t>
-      </w:r>
-    </w:p>
-    <w:p>
-      <w:pPr>
-        <w:pStyle w:val="ListParagraph"/>
-        <w:numPr>
-          <w:ilvl w:val="1"/>
-          <w:numId w:val="6"/>
-        </w:numPr>
-        <w:rPr>
-          <w:sz w:val="24"/>
-          <w:szCs w:val="24"/>
-        </w:rPr>
-      </w:pPr>
-      <w:r>
-        <w:rPr>
-          <w:sz w:val="24"/>
-          <w:szCs w:val="24"/>
-        </w:rPr>
-        <w:t>&lt;adjective&gt;-&lt;adjective&gt;</w:t>
-      </w:r>
-      <w:r>
-        <w:rPr>
-          <w:sz w:val="24"/>
-          <w:szCs w:val="24"/>
-        </w:rPr>
-        <w:tab/>
-        <w:t>&lt;noun&gt;</w:t>
-      </w:r>
-    </w:p>
-    <w:p>
-      <w:pPr>
-        <w:pStyle w:val="ListParagraph"/>
-        <w:numPr>
-          <w:ilvl w:val="1"/>
-          <w:numId w:val="6"/>
-        </w:numPr>
-        <w:rPr>
-          <w:sz w:val="24"/>
-          <w:szCs w:val="24"/>
-        </w:rPr>
-      </w:pPr>
-      <w:r>
-        <w:rPr>
-          <w:sz w:val="24"/>
-          <w:szCs w:val="24"/>
-        </w:rPr>
-        <w:lastRenderedPageBreak/>
-        <w:t xml:space="preserve">Majority of papers go with mode mismatch, not </w:t>
-      </w:r>
-      <w:r>
-        <w:rPr>
-          <w:sz w:val="24"/>
-          <w:szCs w:val="24"/>
-        </w:rPr>
-        <w:t>M</w:t>
-      </w:r>
-      <w:r>
-        <w:rPr>
-          <w:sz w:val="24"/>
-          <w:szCs w:val="24"/>
-        </w:rPr>
-        <w:t>ode</w:t>
-      </w:r>
-      <w:r>
-        <w:rPr>
-          <w:sz w:val="24"/>
-          <w:szCs w:val="24"/>
-        </w:rPr>
-        <w:t>-mismatch</w:t>
-      </w:r>
-    </w:p>
-    <w:p>
-      <w:pPr>
-        <w:pStyle w:val="ListParagraph"/>
-        <w:numPr>
-          <w:ilvl w:val="1"/>
-          <w:numId w:val="6"/>
-        </w:numPr>
-        <w:rPr>
-          <w:sz w:val="24"/>
-          <w:szCs w:val="24"/>
-        </w:rPr>
-      </w:pPr>
-      <w:r>
-        <w:rPr>
-          <w:sz w:val="24"/>
-          <w:szCs w:val="24"/>
-        </w:rPr>
-        <w:t xml:space="preserve">Photodiode, not </w:t>
-      </w:r>
-      <w:r>
-        <w:rPr>
-          <w:sz w:val="24"/>
-          <w:szCs w:val="24"/>
-        </w:rPr>
-        <w:t>Photo-diode</w:t>
-      </w:r>
-    </w:p>
-    <w:p>
-      <w:pPr>
-        <w:pStyle w:val="ListParagraph"/>
-        <w:numPr>
-          <w:ilvl w:val="1"/>
-          <w:numId w:val="6"/>
-        </w:numPr>
-        <w:rPr>
-          <w:sz w:val="24"/>
-          <w:szCs w:val="24"/>
-        </w:rPr>
-      </w:pPr>
-      <w:r>
-        <w:rPr>
-          <w:sz w:val="24"/>
-          <w:szCs w:val="24"/>
-        </w:rPr>
-        <w:t>Check ngram viewer if unsure.</w:t>
+        <w:t xml:space="preserve">Current detector = aLIGO, future detector = LIGO A+, the </w:t>
+      </w:r>
+      <w:r>
+        <w:rPr>
+          <w:sz w:val="24"/>
+          <w:szCs w:val="24"/>
+        </w:rPr>
+        <w:t>organisation</w:t>
+      </w:r>
+      <w:r>
+        <w:rPr>
+          <w:sz w:val="24"/>
+          <w:szCs w:val="24"/>
+        </w:rPr>
+        <w:t xml:space="preserve"> in a general abstract sense = LIGO</w:t>
       </w:r>
     </w:p>
     <w:p>
@@ -6405,55 +6550,7 @@
           <w:sz w:val="24"/>
           <w:szCs w:val="24"/>
         </w:rPr>
-        <w:t xml:space="preserve">Made up </w:t>
-      </w:r>
-      <w:r>
-        <w:rPr>
-          <w:sz w:val="24"/>
-          <w:szCs w:val="24"/>
-        </w:rPr>
-        <w:t>verbs:</w:t>
-      </w:r>
-    </w:p>
-    <w:p>
-      <w:pPr>
-        <w:pStyle w:val="ListParagraph"/>
-        <w:numPr>
-          <w:ilvl w:val="1"/>
-          <w:numId w:val="6"/>
-        </w:numPr>
-        <w:rPr>
-          <w:sz w:val="24"/>
-          <w:szCs w:val="24"/>
-        </w:rPr>
-      </w:pPr>
-      <w:r>
-        <w:rPr>
-          <w:sz w:val="24"/>
-          <w:szCs w:val="24"/>
-        </w:rPr>
-        <w:t xml:space="preserve">E.g </w:t>
-      </w:r>
-      <w:r>
-        <w:rPr>
-          <w:sz w:val="24"/>
-          <w:szCs w:val="24"/>
-        </w:rPr>
-        <w:t xml:space="preserve">Mode </w:t>
-      </w:r>
-      <w:r>
-        <w:rPr>
-          <w:sz w:val="24"/>
-          <w:szCs w:val="24"/>
-        </w:rPr>
-        <w:t>mis</w:t>
-      </w:r>
-      <w:r>
-        <w:rPr>
-          <w:sz w:val="24"/>
-          <w:szCs w:val="24"/>
-        </w:rPr>
-        <w:t xml:space="preserve">matching </w:t>
+        <w:t>None classical -&gt; non-classical</w:t>
       </w:r>
     </w:p>
     <w:p>
@@ -6473,21 +6570,14 @@
           <w:sz w:val="24"/>
           <w:szCs w:val="24"/>
         </w:rPr>
-        <w:t xml:space="preserve">Current detector = aLIGO, future detector = LIGO A+, the </w:t>
-      </w:r>
-      <w:r>
-        <w:rPr>
-          <w:sz w:val="24"/>
-          <w:szCs w:val="24"/>
-        </w:rPr>
-        <w:t>organisation</w:t>
-      </w:r>
-      <w:r>
-        <w:rPr>
-          <w:sz w:val="24"/>
-          <w:szCs w:val="24"/>
-        </w:rPr>
-        <w:t xml:space="preserve"> in a general abstract sense = LIGO</w:t>
+        <w:t xml:space="preserve">Look for commas + conjunctive adverb </w:t>
+      </w:r>
+      <w:r>
+        <w:rPr>
+          <w:sz w:val="24"/>
+          <w:szCs w:val="24"/>
+        </w:rPr>
+        <w:t>error.</w:t>
       </w:r>
     </w:p>
     <w:p>
@@ -6507,7 +6597,7 @@
           <w:sz w:val="24"/>
           <w:szCs w:val="24"/>
         </w:rPr>
-        <w:t>None classical -&gt; non-classical</w:t>
+        <w:t>Watch out for ‘ration’.</w:t>
       </w:r>
     </w:p>
     <w:p>
@@ -6527,14 +6617,63 @@
           <w:sz w:val="24"/>
           <w:szCs w:val="24"/>
         </w:rPr>
-        <w:t xml:space="preserve">Look for commas + conjunctive adverb </w:t>
-      </w:r>
-      <w:r>
-        <w:rPr>
-          <w:sz w:val="24"/>
-          <w:szCs w:val="24"/>
-        </w:rPr>
-        <w:t>error.</w:t>
+        <w:t xml:space="preserve">Check </w:t>
+      </w:r>
+      <w:r>
+        <w:rPr>
+          <w:sz w:val="24"/>
+          <w:szCs w:val="24"/>
+        </w:rPr>
+        <w:t>‘</w:t>
+      </w:r>
+      <w:r>
+        <w:rPr>
+          <w:sz w:val="24"/>
+          <w:szCs w:val="24"/>
+        </w:rPr>
+        <w:t>&lt;</w:t>
+      </w:r>
+      <w:r>
+        <w:rPr>
+          <w:sz w:val="24"/>
+          <w:szCs w:val="24"/>
+        </w:rPr>
+        <w:t>’</w:t>
+      </w:r>
+      <w:r>
+        <w:rPr>
+          <w:sz w:val="24"/>
+          <w:szCs w:val="24"/>
+        </w:rPr>
+        <w:t xml:space="preserve"> and </w:t>
+      </w:r>
+      <w:r>
+        <w:rPr>
+          <w:sz w:val="24"/>
+          <w:szCs w:val="24"/>
+        </w:rPr>
+        <w:t>‘</w:t>
+      </w:r>
+      <w:r>
+        <w:rPr>
+          <w:sz w:val="24"/>
+          <w:szCs w:val="24"/>
+        </w:rPr>
+        <w:t>&gt;</w:t>
+      </w:r>
+      <w:r>
+        <w:rPr>
+          <w:sz w:val="24"/>
+          <w:szCs w:val="24"/>
+        </w:rPr>
+        <w:t>’</w:t>
+      </w:r>
+      <w:r>
+        <w:rPr>
+          <w:sz w:val="24"/>
+          <w:szCs w:val="24"/>
+        </w:rPr>
+        <w:t xml:space="preserve"> signs.</w:t>
       </w:r>
     </w:p>
     <w:p>
@@ -6554,7 +6693,14 @@
           <w:sz w:val="24"/>
           <w:szCs w:val="24"/>
         </w:rPr>
-        <w:t>Watch out for ‘ration’.</w:t>
+        <w:t>Axes is the plural of axis</w:t>
+      </w:r>
+      <w:r>
+        <w:rPr>
+          <w:sz w:val="24"/>
+          <w:szCs w:val="24"/>
+        </w:rPr>
+        <w:t>.</w:t>
       </w:r>
     </w:p>
     <w:p>
@@ -6574,63 +6720,7 @@
           <w:sz w:val="24"/>
           <w:szCs w:val="24"/>
         </w:rPr>
-        <w:t xml:space="preserve">Check </w:t>
-      </w:r>
-      <w:r>
-        <w:rPr>
-          <w:sz w:val="24"/>
-          <w:szCs w:val="24"/>
-        </w:rPr>
-        <w:t>‘</w:t>
-      </w:r>
-      <w:r>
-        <w:rPr>
-          <w:sz w:val="24"/>
-          <w:szCs w:val="24"/>
-        </w:rPr>
-        <w:t>&lt;</w:t>
-      </w:r>
-      <w:r>
-        <w:rPr>
-          <w:sz w:val="24"/>
-          <w:szCs w:val="24"/>
-        </w:rPr>
-        <w:t>’</w:t>
-      </w:r>
-      <w:r>
-        <w:rPr>
-          <w:sz w:val="24"/>
-          <w:szCs w:val="24"/>
-        </w:rPr>
-        <w:t xml:space="preserve"> and </w:t>
-      </w:r>
-      <w:r>
-        <w:rPr>
-          <w:sz w:val="24"/>
-          <w:szCs w:val="24"/>
-        </w:rPr>
-        <w:t>‘</w:t>
-      </w:r>
-      <w:r>
-        <w:rPr>
-          <w:sz w:val="24"/>
-          <w:szCs w:val="24"/>
-        </w:rPr>
-        <w:t>&gt;</w:t>
-      </w:r>
-      <w:r>
-        <w:rPr>
-          <w:sz w:val="24"/>
-          <w:szCs w:val="24"/>
-        </w:rPr>
-        <w:t>’</w:t>
-      </w:r>
-      <w:r>
-        <w:rPr>
-          <w:sz w:val="24"/>
-          <w:szCs w:val="24"/>
-        </w:rPr>
-        <w:t xml:space="preserve"> signs.</w:t>
+        <w:t xml:space="preserve">Free-running, open-loop, closed-loop. </w:t>
       </w:r>
     </w:p>
     <w:p>
@@ -6650,14 +6740,28 @@
           <w:sz w:val="24"/>
           <w:szCs w:val="24"/>
         </w:rPr>
-        <w:t>Axes is the plural of axis</w:t>
-      </w:r>
-      <w:r>
-        <w:rPr>
-          <w:sz w:val="24"/>
-          <w:szCs w:val="24"/>
-        </w:rPr>
-        <w:t>.</w:t>
+        <w:t>Remove ‘in order to’, this is a useless phrase</w:t>
+      </w:r>
+      <w:r>
+        <w:rPr>
+          <w:sz w:val="24"/>
+          <w:szCs w:val="24"/>
+        </w:rPr>
+        <w:t xml:space="preserve"> (normally? </w:t>
+      </w:r>
+      <w:r>
+        <w:rPr>
+          <w:sz w:val="24"/>
+          <w:szCs w:val="24"/>
+        </w:rPr>
+        <w:t>May be useful to add emphasis</w:t>
+      </w:r>
+      <w:r>
+        <w:rPr>
+          <w:sz w:val="24"/>
+          <w:szCs w:val="24"/>
+        </w:rPr>
+        <w:t>).</w:t>
       </w:r>
     </w:p>
     <w:p>
@@ -6677,7 +6781,21 @@
           <w:sz w:val="24"/>
           <w:szCs w:val="24"/>
         </w:rPr>
-        <w:t xml:space="preserve">Free-running, open-loop, closed-loop. </w:t>
+        <w:t>Checker fewer</w:t>
+      </w:r>
+      <w:r>
+        <w:rPr>
+          <w:sz w:val="24"/>
+          <w:szCs w:val="24"/>
+        </w:rPr>
+        <w:t xml:space="preserve"> and less</w:t>
+      </w:r>
+      <w:r>
+        <w:rPr>
+          <w:sz w:val="24"/>
+          <w:szCs w:val="24"/>
+        </w:rPr>
+        <w:t>.</w:t>
       </w:r>
     </w:p>
     <w:p>
@@ -6697,28 +6815,28 @@
           <w:sz w:val="24"/>
           <w:szCs w:val="24"/>
         </w:rPr>
-        <w:t>Remove ‘in order to’, this is a useless phrase</w:t>
-      </w:r>
-      <w:r>
-        <w:rPr>
-          <w:sz w:val="24"/>
-          <w:szCs w:val="24"/>
-        </w:rPr>
-        <w:t xml:space="preserve"> (normally? </w:t>
-      </w:r>
-      <w:r>
-        <w:rPr>
-          <w:sz w:val="24"/>
-          <w:szCs w:val="24"/>
-        </w:rPr>
-        <w:t>May be useful to add emphasis</w:t>
-      </w:r>
-      <w:r>
-        <w:rPr>
-          <w:sz w:val="24"/>
-          <w:szCs w:val="24"/>
-        </w:rPr>
-        <w:t>).</w:t>
+        <w:t>P</w:t>
+      </w:r>
+      <w:r>
+        <w:rPr>
+          <w:sz w:val="24"/>
+          <w:szCs w:val="24"/>
+        </w:rPr>
+        <w:t>ump</w:t>
+      </w:r>
+      <w:r>
+        <w:rPr>
+          <w:sz w:val="24"/>
+          <w:szCs w:val="24"/>
+        </w:rPr>
+        <w:t>-diode</w:t>
+      </w:r>
+      <w:r>
+        <w:rPr>
+          <w:sz w:val="24"/>
+          <w:szCs w:val="24"/>
+        </w:rPr>
+        <w:t>.</w:t>
       </w:r>
     </w:p>
     <w:p>
@@ -6738,55 +6856,21 @@
           <w:sz w:val="24"/>
           <w:szCs w:val="24"/>
         </w:rPr>
-        <w:t>Checker fewer</w:t>
-      </w:r>
-      <w:r>
-        <w:rPr>
-          <w:sz w:val="24"/>
-          <w:szCs w:val="24"/>
-        </w:rPr>
-        <w:t xml:space="preserve"> and less</w:t>
-      </w:r>
-      <w:r>
-        <w:rPr>
-          <w:sz w:val="24"/>
-          <w:szCs w:val="24"/>
-        </w:rPr>
-        <w:t>.</w:t>
-      </w:r>
-    </w:p>
-    <w:p>
-      <w:pPr>
-        <w:pStyle w:val="ListParagraph"/>
-        <w:numPr>
-          <w:ilvl w:val="0"/>
-          <w:numId w:val="6"/>
-        </w:numPr>
-        <w:rPr>
-          <w:sz w:val="24"/>
-          <w:szCs w:val="24"/>
-        </w:rPr>
-      </w:pPr>
-      <w:r>
-        <w:rPr>
-          <w:sz w:val="24"/>
-          <w:szCs w:val="24"/>
-        </w:rPr>
-        <w:t>P</w:t>
-      </w:r>
-      <w:r>
-        <w:rPr>
-          <w:sz w:val="24"/>
-          <w:szCs w:val="24"/>
-        </w:rPr>
-        <w:t>ump</w:t>
-      </w:r>
-      <w:r>
-        <w:rPr>
-          <w:sz w:val="24"/>
-          <w:szCs w:val="24"/>
-        </w:rPr>
-        <w:t>-diode</w:t>
+        <w:t>figure-&gt;</w:t>
+      </w:r>
+      <w:r>
+        <w:rPr>
+          <w:sz w:val="24"/>
+          <w:szCs w:val="24"/>
+        </w:rPr>
+        <w:t>F</w:t>
+      </w:r>
+      <w:r>
+        <w:rPr>
+          <w:sz w:val="24"/>
+          <w:szCs w:val="24"/>
+        </w:rPr>
+        <w:t>igure, section-&gt; Section, chapter -&gt; Chapter</w:t>
       </w:r>
     </w:p>
     <w:p>
@@ -7158,7 +7242,6 @@
           <w:sz w:val="24"/>
           <w:szCs w:val="24"/>
         </w:rPr>
-        <w:lastRenderedPageBreak/>
         <w:t>Is there any weird looking ‘1e-5’ type notation?</w:t>
       </w:r>
     </w:p>
@@ -7179,6 +7262,7 @@
           <w:sz w:val="24"/>
           <w:szCs w:val="24"/>
         </w:rPr>
+        <w:lastRenderedPageBreak/>
         <w:t>For log plots, it looks better to start and end on a decade.</w:t>
       </w:r>
     </w:p>

</xml_diff>

<commit_message>
finished some type 5 edits, and added references
</commit_message>
<xml_diff>
--- a/Structuring.docx
+++ b/Structuring.docx
@@ -6475,6 +6475,106 @@
       <w:pPr>
         <w:pStyle w:val="ListParagraph"/>
         <w:numPr>
+          <w:ilvl w:val="1"/>
+          <w:numId w:val="6"/>
+        </w:numPr>
+        <w:rPr>
+          <w:sz w:val="24"/>
+          <w:szCs w:val="24"/>
+        </w:rPr>
+      </w:pPr>
+      <w:r>
+        <w:rPr>
+          <w:sz w:val="24"/>
+          <w:szCs w:val="24"/>
+        </w:rPr>
+        <w:t>Space-time</w:t>
+      </w:r>
+    </w:p>
+    <w:p>
+      <w:pPr>
+        <w:pStyle w:val="ListParagraph"/>
+        <w:numPr>
+          <w:ilvl w:val="1"/>
+          <w:numId w:val="6"/>
+        </w:numPr>
+        <w:rPr>
+          <w:sz w:val="24"/>
+          <w:szCs w:val="24"/>
+        </w:rPr>
+      </w:pPr>
+      <w:r>
+        <w:rPr>
+          <w:sz w:val="24"/>
+          <w:szCs w:val="24"/>
+        </w:rPr>
+        <w:t>Fabry-Perot</w:t>
+      </w:r>
+    </w:p>
+    <w:p>
+      <w:pPr>
+        <w:pStyle w:val="ListParagraph"/>
+        <w:numPr>
+          <w:ilvl w:val="1"/>
+          <w:numId w:val="6"/>
+        </w:numPr>
+        <w:rPr>
+          <w:sz w:val="24"/>
+          <w:szCs w:val="24"/>
+        </w:rPr>
+      </w:pPr>
+      <w:r>
+        <w:rPr>
+          <w:sz w:val="24"/>
+          <w:szCs w:val="24"/>
+        </w:rPr>
+        <w:t>Free-running</w:t>
+      </w:r>
+    </w:p>
+    <w:p>
+      <w:pPr>
+        <w:pStyle w:val="ListParagraph"/>
+        <w:numPr>
+          <w:ilvl w:val="1"/>
+          <w:numId w:val="6"/>
+        </w:numPr>
+        <w:rPr>
+          <w:sz w:val="24"/>
+          <w:szCs w:val="24"/>
+        </w:rPr>
+      </w:pPr>
+      <w:r>
+        <w:rPr>
+          <w:sz w:val="24"/>
+          <w:szCs w:val="24"/>
+        </w:rPr>
+        <w:t>closed-loop</w:t>
+      </w:r>
+    </w:p>
+    <w:p>
+      <w:pPr>
+        <w:pStyle w:val="ListParagraph"/>
+        <w:numPr>
+          <w:ilvl w:val="1"/>
+          <w:numId w:val="6"/>
+        </w:numPr>
+        <w:rPr>
+          <w:sz w:val="24"/>
+          <w:szCs w:val="24"/>
+        </w:rPr>
+      </w:pPr>
+      <w:r>
+        <w:rPr>
+          <w:sz w:val="24"/>
+          <w:szCs w:val="24"/>
+        </w:rPr>
+        <w:t>open-loop</w:t>
+      </w:r>
+    </w:p>
+    <w:p>
+      <w:pPr>
+        <w:pStyle w:val="ListParagraph"/>
+        <w:numPr>
           <w:ilvl w:val="0"/>
           <w:numId w:val="6"/>
         </w:numPr>
@@ -6760,7 +6860,58 @@
           <w:sz w:val="24"/>
           <w:szCs w:val="24"/>
         </w:rPr>
-        <w:t xml:space="preserve">Free-running, open-loop, closed-loop. </w:t>
+        <w:t>Remove ‘</w:t>
+      </w:r>
+      <w:r>
+        <w:rPr>
+          <w:b/>
+          <w:bCs/>
+          <w:sz w:val="24"/>
+          <w:szCs w:val="24"/>
+        </w:rPr>
+        <w:t>in order</w:t>
+      </w:r>
+      <w:r>
+        <w:rPr>
+          <w:sz w:val="24"/>
+          <w:szCs w:val="24"/>
+        </w:rPr>
+        <w:t xml:space="preserve"> to’</w:t>
+      </w:r>
+      <w:r>
+        <w:rPr>
+          <w:sz w:val="24"/>
+          <w:szCs w:val="24"/>
+        </w:rPr>
+        <w:t xml:space="preserve"> etc. T</w:t>
+      </w:r>
+      <w:r>
+        <w:rPr>
+          <w:sz w:val="24"/>
+          <w:szCs w:val="24"/>
+        </w:rPr>
+        <w:t>his is a useless phrase</w:t>
+      </w:r>
+      <w:r>
+        <w:rPr>
+          <w:sz w:val="24"/>
+          <w:szCs w:val="24"/>
+        </w:rPr>
+        <w:t xml:space="preserve"> (normally? </w:t>
+      </w:r>
+      <w:r>
+        <w:rPr>
+          <w:sz w:val="24"/>
+          <w:szCs w:val="24"/>
+        </w:rPr>
+        <w:t>May be useful to add emphasis</w:t>
+      </w:r>
+      <w:r>
+        <w:rPr>
+          <w:sz w:val="24"/>
+          <w:szCs w:val="24"/>
+        </w:rPr>
+        <w:t>).</w:t>
       </w:r>
     </w:p>
     <w:p>
@@ -6780,28 +6931,21 @@
           <w:sz w:val="24"/>
           <w:szCs w:val="24"/>
         </w:rPr>
-        <w:t>Remove ‘in order to’, this is a useless phrase</w:t>
-      </w:r>
-      <w:r>
-        <w:rPr>
-          <w:sz w:val="24"/>
-          <w:szCs w:val="24"/>
-        </w:rPr>
-        <w:t xml:space="preserve"> (normally? </w:t>
-      </w:r>
-      <w:r>
-        <w:rPr>
-          <w:sz w:val="24"/>
-          <w:szCs w:val="24"/>
-        </w:rPr>
-        <w:t>May be useful to add emphasis</w:t>
-      </w:r>
-      <w:r>
-        <w:rPr>
-          <w:sz w:val="24"/>
-          <w:szCs w:val="24"/>
-        </w:rPr>
-        <w:t>).</w:t>
+        <w:t>Checker fewer</w:t>
+      </w:r>
+      <w:r>
+        <w:rPr>
+          <w:sz w:val="24"/>
+          <w:szCs w:val="24"/>
+        </w:rPr>
+        <w:t xml:space="preserve"> and less</w:t>
+      </w:r>
+      <w:r>
+        <w:rPr>
+          <w:sz w:val="24"/>
+          <w:szCs w:val="24"/>
+        </w:rPr>
+        <w:t>.</w:t>
       </w:r>
     </w:p>
     <w:p>
@@ -6821,14 +6965,21 @@
           <w:sz w:val="24"/>
           <w:szCs w:val="24"/>
         </w:rPr>
-        <w:t>Checker fewer</w:t>
-      </w:r>
-      <w:r>
-        <w:rPr>
-          <w:sz w:val="24"/>
-          <w:szCs w:val="24"/>
-        </w:rPr>
-        <w:t xml:space="preserve"> and less</w:t>
+        <w:t>P</w:t>
+      </w:r>
+      <w:r>
+        <w:rPr>
+          <w:sz w:val="24"/>
+          <w:szCs w:val="24"/>
+        </w:rPr>
+        <w:t>ump</w:t>
+      </w:r>
+      <w:r>
+        <w:rPr>
+          <w:sz w:val="24"/>
+          <w:szCs w:val="24"/>
+        </w:rPr>
+        <w:t>-diode</w:t>
       </w:r>
       <w:r>
         <w:rPr>
@@ -6855,28 +7006,21 @@
           <w:sz w:val="24"/>
           <w:szCs w:val="24"/>
         </w:rPr>
-        <w:t>P</w:t>
-      </w:r>
-      <w:r>
-        <w:rPr>
-          <w:sz w:val="24"/>
-          <w:szCs w:val="24"/>
-        </w:rPr>
-        <w:t>ump</w:t>
-      </w:r>
-      <w:r>
-        <w:rPr>
-          <w:sz w:val="24"/>
-          <w:szCs w:val="24"/>
-        </w:rPr>
-        <w:t>-diode</w:t>
-      </w:r>
-      <w:r>
-        <w:rPr>
-          <w:sz w:val="24"/>
-          <w:szCs w:val="24"/>
-        </w:rPr>
-        <w:t>.</w:t>
+        <w:t>figure-&gt;</w:t>
+      </w:r>
+      <w:r>
+        <w:rPr>
+          <w:sz w:val="24"/>
+          <w:szCs w:val="24"/>
+        </w:rPr>
+        <w:t>F</w:t>
+      </w:r>
+      <w:r>
+        <w:rPr>
+          <w:sz w:val="24"/>
+          <w:szCs w:val="24"/>
+        </w:rPr>
+        <w:t>igure, section-&gt; Section, chapter -&gt; Chapter</w:t>
       </w:r>
     </w:p>
     <w:p>
@@ -6896,21 +7040,49 @@
           <w:sz w:val="24"/>
           <w:szCs w:val="24"/>
         </w:rPr>
-        <w:t>figure-&gt;</w:t>
-      </w:r>
-      <w:r>
-        <w:rPr>
-          <w:sz w:val="24"/>
-          <w:szCs w:val="24"/>
-        </w:rPr>
-        <w:t>F</w:t>
-      </w:r>
-      <w:r>
-        <w:rPr>
-          <w:sz w:val="24"/>
-          <w:szCs w:val="24"/>
-        </w:rPr>
-        <w:t>igure, section-&gt; Section, chapter -&gt; Chapter</w:t>
+        <w:t xml:space="preserve">Capitalisation in titles: </w:t>
+      </w:r>
+      <w:r>
+        <w:rPr>
+          <w:sz w:val="24"/>
+          <w:szCs w:val="24"/>
+        </w:rPr>
+        <w:t>do not capit</w:t>
+      </w:r>
+      <w:r>
+        <w:rPr>
+          <w:sz w:val="24"/>
+          <w:szCs w:val="24"/>
+        </w:rPr>
+        <w:t>alise</w:t>
+      </w:r>
+      <w:r>
+        <w:rPr>
+          <w:sz w:val="24"/>
+          <w:szCs w:val="24"/>
+        </w:rPr>
+        <w:t xml:space="preserve"> article</w:t>
+      </w:r>
+      <w:r>
+        <w:rPr>
+          <w:sz w:val="24"/>
+          <w:szCs w:val="24"/>
+        </w:rPr>
+        <w:t>s (a, an, the), conjunctions (and, but, if, or etc.)</w:t>
+      </w:r>
+      <w:r>
+        <w:rPr>
+          <w:sz w:val="24"/>
+          <w:szCs w:val="24"/>
+        </w:rPr>
+        <w:t>, and short prepositions (at, but, by, from, into, of, to, with).</w:t>
+      </w:r>
+      <w:r>
+        <w:rPr>
+          <w:sz w:val="24"/>
+          <w:szCs w:val="24"/>
+        </w:rPr>
+        <w:t xml:space="preserve"> They is some stylistic freedom here.</w:t>
       </w:r>
     </w:p>
     <w:p>
@@ -7162,6 +7334,7 @@
           <w:sz w:val="24"/>
           <w:szCs w:val="24"/>
         </w:rPr>
+        <w:lastRenderedPageBreak/>
         <w:t>Do the axis have units? The units should be put in brackets like (m). No other shape of brackets should be used.</w:t>
       </w:r>
     </w:p>
@@ -7262,7 +7435,6 @@
           <w:sz w:val="24"/>
           <w:szCs w:val="24"/>
         </w:rPr>
-        <w:lastRenderedPageBreak/>
         <w:t>Check for spelling mistakes! e.g. freuqency -&gt; frequency.</w:t>
       </w:r>
     </w:p>
@@ -7911,6 +8083,7 @@
           <w:sz w:val="24"/>
           <w:szCs w:val="24"/>
         </w:rPr>
+        <w:lastRenderedPageBreak/>
         <w:t>plt.show()</w:t>
       </w:r>
     </w:p>
@@ -7977,7 +8150,6 @@
           <w:sz w:val="24"/>
           <w:szCs w:val="24"/>
         </w:rPr>
-        <w:lastRenderedPageBreak/>
         <w:t xml:space="preserve">when there </w:t>
       </w:r>
       <w:r>
@@ -8529,7 +8701,6 @@
           <w:sz w:val="24"/>
           <w:szCs w:val="24"/>
         </w:rPr>
-        <w:lastRenderedPageBreak/>
         <w:t>clearly label pin numbers, part values polarities, connector inputs etc.</w:t>
       </w:r>
     </w:p>
@@ -9493,6 +9664,7 @@
           <w:sz w:val="24"/>
           <w:szCs w:val="24"/>
         </w:rPr>
+        <w:lastRenderedPageBreak/>
         <w:t>This led to the development of an entirely new theory of X, based on the idea that…</w:t>
       </w:r>
       <w:r>
@@ -10532,7 +10704,6 @@
           <w:sz w:val="24"/>
           <w:szCs w:val="24"/>
         </w:rPr>
-        <w:lastRenderedPageBreak/>
         <w:t xml:space="preserve">Control area is when you’re talking about stuff you’ve </w:t>
       </w:r>
       <w:r>
@@ -10948,6 +11119,7 @@
           <w:sz w:val="24"/>
           <w:szCs w:val="24"/>
         </w:rPr>
+        <w:lastRenderedPageBreak/>
         <w:t xml:space="preserve">Mind-map is big tangle. It makes a stock of ideas. </w:t>
       </w:r>
     </w:p>
@@ -11105,16 +11277,7 @@
           <w:sz w:val="24"/>
           <w:szCs w:val="24"/>
         </w:rPr>
-        <w:t xml:space="preserve">work on </w:t>
-      </w:r>
-      <w:r>
-        <w:rPr>
-          <w:rFonts w:cstheme="minorHAnsi"/>
-          <w:sz w:val="24"/>
-          <w:szCs w:val="24"/>
-        </w:rPr>
-        <w:lastRenderedPageBreak/>
-        <w:t xml:space="preserve">confidence. It could be perfectionism, adjust where you are on the scale. It could be a preparation thing, you need to complete some analysis. </w:t>
+        <w:t xml:space="preserve">work on confidence. It could be perfectionism, adjust where you are on the scale. It could be a preparation thing, you need to complete some analysis. </w:t>
       </w:r>
     </w:p>
     <w:p>

</xml_diff>

<commit_message>
created all figures for the in vacuum MZ work, i think!
</commit_message>
<xml_diff>
--- a/Structuring.docx
+++ b/Structuring.docx
@@ -109,7 +109,25 @@
           <w:sz w:val="24"/>
           <w:szCs w:val="24"/>
         </w:rPr>
-        <w:t>first, the reader doesn’t care what you know</w:t>
+        <w:t xml:space="preserve">first, the reader </w:t>
+      </w:r>
+      <w:proofErr w:type="gramStart"/>
+      <w:r>
+        <w:rPr>
+          <w:rFonts w:cstheme="minorHAnsi"/>
+          <w:sz w:val="24"/>
+          <w:szCs w:val="24"/>
+        </w:rPr>
+        <w:t>doesn’t</w:t>
+      </w:r>
+      <w:proofErr w:type="gramEnd"/>
+      <w:r>
+        <w:rPr>
+          <w:rFonts w:cstheme="minorHAnsi"/>
+          <w:sz w:val="24"/>
+          <w:szCs w:val="24"/>
+        </w:rPr>
+        <w:t xml:space="preserve"> care what you know</w:t>
       </w:r>
       <w:r>
         <w:rPr>
@@ -149,7 +167,25 @@
           <w:sz w:val="24"/>
           <w:szCs w:val="24"/>
         </w:rPr>
-        <w:t>there to do new and original work. You are there to do valuable work. You’re not creating new knowledge</w:t>
+        <w:t xml:space="preserve">there to do new and original work. You are there to do valuable work. </w:t>
+      </w:r>
+      <w:proofErr w:type="gramStart"/>
+      <w:r>
+        <w:rPr>
+          <w:rFonts w:cstheme="minorHAnsi"/>
+          <w:sz w:val="24"/>
+          <w:szCs w:val="24"/>
+        </w:rPr>
+        <w:t>You’re</w:t>
+      </w:r>
+      <w:proofErr w:type="gramEnd"/>
+      <w:r>
+        <w:rPr>
+          <w:rFonts w:cstheme="minorHAnsi"/>
+          <w:sz w:val="24"/>
+          <w:szCs w:val="24"/>
+        </w:rPr>
+        <w:t xml:space="preserve"> not creating new knowledge</w:t>
       </w:r>
       <w:r>
         <w:rPr>
@@ -197,7 +233,25 @@
           <w:sz w:val="24"/>
           <w:szCs w:val="24"/>
         </w:rPr>
-        <w:t xml:space="preserve"> You need to tell people ‘wow you’re great, and heres something new’, or ‘but you were slightly wrong about that’.</w:t>
+        <w:t xml:space="preserve"> You need to tell people ‘wow you’re great, and </w:t>
+      </w:r>
+      <w:proofErr w:type="spellStart"/>
+      <w:r>
+        <w:rPr>
+          <w:rFonts w:cstheme="minorHAnsi"/>
+          <w:sz w:val="24"/>
+          <w:szCs w:val="24"/>
+        </w:rPr>
+        <w:t>heres</w:t>
+      </w:r>
+      <w:proofErr w:type="spellEnd"/>
+      <w:r>
+        <w:rPr>
+          <w:rFonts w:cstheme="minorHAnsi"/>
+          <w:sz w:val="24"/>
+          <w:szCs w:val="24"/>
+        </w:rPr>
+        <w:t xml:space="preserve"> something new’, or ‘but you were slightly wrong about that’.</w:t>
       </w:r>
       <w:r>
         <w:rPr>
@@ -261,7 +315,25 @@
           <w:sz w:val="24"/>
           <w:szCs w:val="24"/>
         </w:rPr>
-        <w:t>, like a big conversation. To participate, you don’t share your feelings and thoughts, you change the thoughts of others.</w:t>
+        <w:t xml:space="preserve">, like a big conversation. To participate, you </w:t>
+      </w:r>
+      <w:proofErr w:type="gramStart"/>
+      <w:r>
+        <w:rPr>
+          <w:rFonts w:cstheme="minorHAnsi"/>
+          <w:sz w:val="24"/>
+          <w:szCs w:val="24"/>
+        </w:rPr>
+        <w:t>don’t</w:t>
+      </w:r>
+      <w:proofErr w:type="gramEnd"/>
+      <w:r>
+        <w:rPr>
+          <w:rFonts w:cstheme="minorHAnsi"/>
+          <w:sz w:val="24"/>
+          <w:szCs w:val="24"/>
+        </w:rPr>
+        <w:t xml:space="preserve"> share your feelings and thoughts, you change the thoughts of others.</w:t>
       </w:r>
     </w:p>
     <w:p>
@@ -286,7 +358,25 @@
           <w:sz w:val="24"/>
           <w:szCs w:val="24"/>
         </w:rPr>
-        <w:t>. It’s the martini model of writing.</w:t>
+        <w:t xml:space="preserve">. </w:t>
+      </w:r>
+      <w:proofErr w:type="gramStart"/>
+      <w:r>
+        <w:rPr>
+          <w:rFonts w:cstheme="minorHAnsi"/>
+          <w:sz w:val="24"/>
+          <w:szCs w:val="24"/>
+        </w:rPr>
+        <w:t>It’s</w:t>
+      </w:r>
+      <w:proofErr w:type="gramEnd"/>
+      <w:r>
+        <w:rPr>
+          <w:rFonts w:cstheme="minorHAnsi"/>
+          <w:sz w:val="24"/>
+          <w:szCs w:val="24"/>
+        </w:rPr>
+        <w:t xml:space="preserve"> the martini model of writing.</w:t>
       </w:r>
       <w:r>
         <w:rPr>
@@ -377,7 +467,25 @@
           <w:sz w:val="24"/>
           <w:szCs w:val="24"/>
         </w:rPr>
-        <w:t>Problems have to be unstable</w:t>
+        <w:t xml:space="preserve">Problems </w:t>
+      </w:r>
+      <w:proofErr w:type="gramStart"/>
+      <w:r>
+        <w:rPr>
+          <w:rFonts w:cstheme="minorHAnsi"/>
+          <w:sz w:val="24"/>
+          <w:szCs w:val="24"/>
+        </w:rPr>
+        <w:t>have to</w:t>
+      </w:r>
+      <w:proofErr w:type="gramEnd"/>
+      <w:r>
+        <w:rPr>
+          <w:rFonts w:cstheme="minorHAnsi"/>
+          <w:sz w:val="24"/>
+          <w:szCs w:val="24"/>
+        </w:rPr>
+        <w:t xml:space="preserve"> be unstable</w:t>
       </w:r>
       <w:r>
         <w:rPr>
@@ -655,8 +763,18 @@
           <w:sz w:val="24"/>
           <w:szCs w:val="24"/>
         </w:rPr>
-        <w:t>use lit review to enrich the problem. A student lit review shows what the student know</w:t>
-      </w:r>
+        <w:t xml:space="preserve">use lit review to enrich the problem. A student lit review shows what the student </w:t>
+      </w:r>
+      <w:proofErr w:type="gramStart"/>
+      <w:r>
+        <w:rPr>
+          <w:rFonts w:cstheme="minorHAnsi"/>
+          <w:sz w:val="24"/>
+          <w:szCs w:val="24"/>
+        </w:rPr>
+        <w:t>know</w:t>
+      </w:r>
+      <w:proofErr w:type="gramEnd"/>
       <w:r>
         <w:rPr>
           <w:rFonts w:cstheme="minorHAnsi"/>
@@ -672,7 +790,25 @@
           <w:szCs w:val="24"/>
         </w:rPr>
         <w:lastRenderedPageBreak/>
-        <w:t>will say who said what, and pose a problem.</w:t>
+        <w:t xml:space="preserve">will say who said </w:t>
+      </w:r>
+      <w:proofErr w:type="gramStart"/>
+      <w:r>
+        <w:rPr>
+          <w:rFonts w:cstheme="minorHAnsi"/>
+          <w:sz w:val="24"/>
+          <w:szCs w:val="24"/>
+        </w:rPr>
+        <w:t>what, and</w:t>
+      </w:r>
+      <w:proofErr w:type="gramEnd"/>
+      <w:r>
+        <w:rPr>
+          <w:rFonts w:cstheme="minorHAnsi"/>
+          <w:sz w:val="24"/>
+          <w:szCs w:val="24"/>
+        </w:rPr>
+        <w:t xml:space="preserve"> pose a problem.</w:t>
       </w:r>
       <w:r>
         <w:rPr>
@@ -696,7 +832,25 @@
           <w:sz w:val="24"/>
           <w:szCs w:val="24"/>
         </w:rPr>
-        <w:t xml:space="preserve"> Student lit review: is a stable thing. Professional one, seems unstable.</w:t>
+        <w:t xml:space="preserve"> Student lit </w:t>
+      </w:r>
+      <w:proofErr w:type="gramStart"/>
+      <w:r>
+        <w:rPr>
+          <w:rFonts w:cstheme="minorHAnsi"/>
+          <w:sz w:val="24"/>
+          <w:szCs w:val="24"/>
+        </w:rPr>
+        <w:t>review:</w:t>
+      </w:r>
+      <w:proofErr w:type="gramEnd"/>
+      <w:r>
+        <w:rPr>
+          <w:rFonts w:cstheme="minorHAnsi"/>
+          <w:sz w:val="24"/>
+          <w:szCs w:val="24"/>
+        </w:rPr>
+        <w:t xml:space="preserve"> is a stable thing. Professional one, seems unstable.</w:t>
       </w:r>
     </w:p>
     <w:p>
@@ -764,7 +918,61 @@
           <w:sz w:val="24"/>
           <w:szCs w:val="24"/>
         </w:rPr>
-        <w:t xml:space="preserve">dge. Its not a bounded thing, knowledge is infinite, the gap doesn’t matter. By filling the gap, theres still </w:t>
+        <w:t xml:space="preserve">dge. </w:t>
+      </w:r>
+      <w:proofErr w:type="spellStart"/>
+      <w:r>
+        <w:rPr>
+          <w:rFonts w:cstheme="minorHAnsi"/>
+          <w:sz w:val="24"/>
+          <w:szCs w:val="24"/>
+        </w:rPr>
+        <w:t>Its</w:t>
+      </w:r>
+      <w:proofErr w:type="spellEnd"/>
+      <w:r>
+        <w:rPr>
+          <w:rFonts w:cstheme="minorHAnsi"/>
+          <w:sz w:val="24"/>
+          <w:szCs w:val="24"/>
+        </w:rPr>
+        <w:t xml:space="preserve"> not a bounded thing, knowledge is infinite, the gap </w:t>
+      </w:r>
+      <w:proofErr w:type="gramStart"/>
+      <w:r>
+        <w:rPr>
+          <w:rFonts w:cstheme="minorHAnsi"/>
+          <w:sz w:val="24"/>
+          <w:szCs w:val="24"/>
+        </w:rPr>
+        <w:t>doesn’t</w:t>
+      </w:r>
+      <w:proofErr w:type="gramEnd"/>
+      <w:r>
+        <w:rPr>
+          <w:rFonts w:cstheme="minorHAnsi"/>
+          <w:sz w:val="24"/>
+          <w:szCs w:val="24"/>
+        </w:rPr>
+        <w:t xml:space="preserve"> matter. By filling the gap, </w:t>
+      </w:r>
+      <w:proofErr w:type="spellStart"/>
+      <w:r>
+        <w:rPr>
+          <w:rFonts w:cstheme="minorHAnsi"/>
+          <w:sz w:val="24"/>
+          <w:szCs w:val="24"/>
+        </w:rPr>
+        <w:t>theres</w:t>
+      </w:r>
+      <w:proofErr w:type="spellEnd"/>
+      <w:r>
+        <w:rPr>
+          <w:rFonts w:cstheme="minorHAnsi"/>
+          <w:sz w:val="24"/>
+          <w:szCs w:val="24"/>
+        </w:rPr>
+        <w:t xml:space="preserve"> still </w:t>
       </w:r>
       <w:r>
         <w:rPr>
@@ -774,6 +982,7 @@
         </w:rPr>
         <w:t xml:space="preserve">more gaps. This rarely works. Who is the gap a problem </w:t>
       </w:r>
+      <w:proofErr w:type="gramStart"/>
       <w:r>
         <w:rPr>
           <w:rFonts w:cstheme="minorHAnsi"/>
@@ -782,6 +991,7 @@
         </w:rPr>
         <w:t>for.</w:t>
       </w:r>
+      <w:proofErr w:type="gramEnd"/>
     </w:p>
     <w:p>
       <w:pPr>
@@ -838,15 +1048,33 @@
           <w:sz w:val="24"/>
           <w:szCs w:val="24"/>
         </w:rPr>
-        <w:t>This is the first step to writing a chapter. Come up with likely sections,</w:t>
-      </w:r>
-      <w:r>
-        <w:rPr>
-          <w:rFonts w:cstheme="minorHAnsi"/>
-          <w:sz w:val="24"/>
-          <w:szCs w:val="24"/>
-        </w:rPr>
-        <w:t xml:space="preserve"> and fill them in with ideas for paragraphs. Think about/put in relevant figures at this point.</w:t>
+        <w:t xml:space="preserve">This is the first step to writing a chapter. Come up with likely </w:t>
+      </w:r>
+      <w:proofErr w:type="gramStart"/>
+      <w:r>
+        <w:rPr>
+          <w:rFonts w:cstheme="minorHAnsi"/>
+          <w:sz w:val="24"/>
+          <w:szCs w:val="24"/>
+        </w:rPr>
+        <w:t>sections,</w:t>
+      </w:r>
+      <w:r>
+        <w:rPr>
+          <w:rFonts w:cstheme="minorHAnsi"/>
+          <w:sz w:val="24"/>
+          <w:szCs w:val="24"/>
+        </w:rPr>
+        <w:t xml:space="preserve"> and</w:t>
+      </w:r>
+      <w:proofErr w:type="gramEnd"/>
+      <w:r>
+        <w:rPr>
+          <w:rFonts w:cstheme="minorHAnsi"/>
+          <w:sz w:val="24"/>
+          <w:szCs w:val="24"/>
+        </w:rPr>
+        <w:t xml:space="preserve"> fill them in with ideas for paragraphs. Think about/put in relevant figures at this point.</w:t>
       </w:r>
     </w:p>
     <w:p>
@@ -927,15 +1155,69 @@
           <w:sz w:val="24"/>
           <w:szCs w:val="24"/>
         </w:rPr>
-        <w:t>writing. The majority of the content of the chapter (&lt;90%) will be written by the end of this draft</w:t>
-      </w:r>
-      <w:r>
-        <w:rPr>
-          <w:rFonts w:cstheme="minorHAnsi"/>
-          <w:sz w:val="24"/>
-          <w:szCs w:val="24"/>
-        </w:rPr>
-        <w:t xml:space="preserve">. The writing at this point may be ‘stream of conciouness`-esk, but it should have had an attempt at making it clear. </w:t>
+        <w:t xml:space="preserve">writing. </w:t>
+      </w:r>
+      <w:proofErr w:type="gramStart"/>
+      <w:r>
+        <w:rPr>
+          <w:rFonts w:cstheme="minorHAnsi"/>
+          <w:sz w:val="24"/>
+          <w:szCs w:val="24"/>
+        </w:rPr>
+        <w:t>The majority of</w:t>
+      </w:r>
+      <w:proofErr w:type="gramEnd"/>
+      <w:r>
+        <w:rPr>
+          <w:rFonts w:cstheme="minorHAnsi"/>
+          <w:sz w:val="24"/>
+          <w:szCs w:val="24"/>
+        </w:rPr>
+        <w:t xml:space="preserve"> the content of the chapter (&lt;90%) will be written by the end of this draft</w:t>
+      </w:r>
+      <w:r>
+        <w:rPr>
+          <w:rFonts w:cstheme="minorHAnsi"/>
+          <w:sz w:val="24"/>
+          <w:szCs w:val="24"/>
+        </w:rPr>
+        <w:t xml:space="preserve">. The writing at this point may be ‘stream of </w:t>
+      </w:r>
+      <w:proofErr w:type="spellStart"/>
+      <w:r>
+        <w:rPr>
+          <w:rFonts w:cstheme="minorHAnsi"/>
+          <w:sz w:val="24"/>
+          <w:szCs w:val="24"/>
+        </w:rPr>
+        <w:t>conciouness</w:t>
+      </w:r>
+      <w:proofErr w:type="spellEnd"/>
+      <w:r>
+        <w:rPr>
+          <w:rFonts w:cstheme="minorHAnsi"/>
+          <w:sz w:val="24"/>
+          <w:szCs w:val="24"/>
+        </w:rPr>
+        <w:t>`-</w:t>
+      </w:r>
+      <w:proofErr w:type="spellStart"/>
+      <w:r>
+        <w:rPr>
+          <w:rFonts w:cstheme="minorHAnsi"/>
+          <w:sz w:val="24"/>
+          <w:szCs w:val="24"/>
+        </w:rPr>
+        <w:t>esk</w:t>
+      </w:r>
+      <w:proofErr w:type="spellEnd"/>
+      <w:r>
+        <w:rPr>
+          <w:rFonts w:cstheme="minorHAnsi"/>
+          <w:sz w:val="24"/>
+          <w:szCs w:val="24"/>
+        </w:rPr>
+        <w:t xml:space="preserve">, but it should have had an attempt at making it clear. </w:t>
       </w:r>
       <w:r>
         <w:rPr>
@@ -1161,7 +1443,25 @@
           <w:sz w:val="24"/>
           <w:szCs w:val="24"/>
         </w:rPr>
-        <w:t>. Consider if some information can be made into an appendix, or if the chapter could be made into two chapters. For the purpose of editing, continue editing them as if they were one chapter.</w:t>
+        <w:t xml:space="preserve">. Consider if some information can be made into an appendix, or if the chapter could be made into two chapters. </w:t>
+      </w:r>
+      <w:proofErr w:type="gramStart"/>
+      <w:r>
+        <w:rPr>
+          <w:rFonts w:cstheme="minorHAnsi"/>
+          <w:sz w:val="24"/>
+          <w:szCs w:val="24"/>
+        </w:rPr>
+        <w:t>For the purpose of</w:t>
+      </w:r>
+      <w:proofErr w:type="gramEnd"/>
+      <w:r>
+        <w:rPr>
+          <w:rFonts w:cstheme="minorHAnsi"/>
+          <w:sz w:val="24"/>
+          <w:szCs w:val="24"/>
+        </w:rPr>
+        <w:t xml:space="preserve"> editing, continue editing them as if they were one chapter.</w:t>
       </w:r>
     </w:p>
     <w:p>
@@ -1326,7 +1626,25 @@
           <w:sz w:val="24"/>
           <w:szCs w:val="24"/>
         </w:rPr>
-        <w:t>word level. This involves checking the spellings of words (eg. Effect or affect). The</w:t>
+        <w:t>word level. This involves checking the spellings of words (</w:t>
+      </w:r>
+      <w:proofErr w:type="spellStart"/>
+      <w:r>
+        <w:rPr>
+          <w:rFonts w:cstheme="minorHAnsi"/>
+          <w:sz w:val="24"/>
+          <w:szCs w:val="24"/>
+        </w:rPr>
+        <w:t>eg.</w:t>
+      </w:r>
+      <w:proofErr w:type="spellEnd"/>
+      <w:r>
+        <w:rPr>
+          <w:rFonts w:cstheme="minorHAnsi"/>
+          <w:sz w:val="24"/>
+          <w:szCs w:val="24"/>
+        </w:rPr>
+        <w:t xml:space="preserve"> Effect or affect). The</w:t>
       </w:r>
       <w:r>
         <w:rPr>
@@ -1458,7 +1776,43 @@
           <w:sz w:val="24"/>
           <w:szCs w:val="24"/>
         </w:rPr>
-        <w:t>inanimate objects are not doing things (e.g. the chapter isn’t describing, things are described in the chatper etc)</w:t>
+        <w:t xml:space="preserve">inanimate objects are not doing things (e.g. the chapter </w:t>
+      </w:r>
+      <w:proofErr w:type="gramStart"/>
+      <w:r>
+        <w:rPr>
+          <w:rFonts w:cstheme="minorHAnsi"/>
+          <w:sz w:val="24"/>
+          <w:szCs w:val="24"/>
+        </w:rPr>
+        <w:t>isn’t</w:t>
+      </w:r>
+      <w:proofErr w:type="gramEnd"/>
+      <w:r>
+        <w:rPr>
+          <w:rFonts w:cstheme="minorHAnsi"/>
+          <w:sz w:val="24"/>
+          <w:szCs w:val="24"/>
+        </w:rPr>
+        <w:t xml:space="preserve"> describing, things are described in the </w:t>
+      </w:r>
+      <w:proofErr w:type="spellStart"/>
+      <w:r>
+        <w:rPr>
+          <w:rFonts w:cstheme="minorHAnsi"/>
+          <w:sz w:val="24"/>
+          <w:szCs w:val="24"/>
+        </w:rPr>
+        <w:t>chatper</w:t>
+      </w:r>
+      <w:proofErr w:type="spellEnd"/>
+      <w:r>
+        <w:rPr>
+          <w:rFonts w:cstheme="minorHAnsi"/>
+          <w:sz w:val="24"/>
+          <w:szCs w:val="24"/>
+        </w:rPr>
+        <w:t xml:space="preserve"> etc)</w:t>
       </w:r>
     </w:p>
     <w:p>
@@ -1483,7 +1837,25 @@
           <w:sz w:val="24"/>
           <w:szCs w:val="24"/>
         </w:rPr>
-        <w:t>nalyse the subject, the verb and the object</w:t>
+        <w:t xml:space="preserve">nalyse the subject, the </w:t>
+      </w:r>
+      <w:proofErr w:type="gramStart"/>
+      <w:r>
+        <w:rPr>
+          <w:rFonts w:cstheme="minorHAnsi"/>
+          <w:sz w:val="24"/>
+          <w:szCs w:val="24"/>
+        </w:rPr>
+        <w:t>verb</w:t>
+      </w:r>
+      <w:proofErr w:type="gramEnd"/>
+      <w:r>
+        <w:rPr>
+          <w:rFonts w:cstheme="minorHAnsi"/>
+          <w:sz w:val="24"/>
+          <w:szCs w:val="24"/>
+        </w:rPr>
+        <w:t xml:space="preserve"> and the object</w:t>
       </w:r>
       <w:r>
         <w:rPr>
@@ -2054,8 +2426,18 @@
           <w:sz w:val="24"/>
           <w:szCs w:val="24"/>
         </w:rPr>
-        <w:t xml:space="preserve"> tells the reader what information is important</w:t>
-      </w:r>
+        <w:t xml:space="preserve"> tells the reader what information is </w:t>
+      </w:r>
+      <w:proofErr w:type="gramStart"/>
+      <w:r>
+        <w:rPr>
+          <w:rFonts w:cstheme="minorHAnsi"/>
+          <w:sz w:val="24"/>
+          <w:szCs w:val="24"/>
+        </w:rPr>
+        <w:t>important</w:t>
+      </w:r>
+      <w:proofErr w:type="gramEnd"/>
       <w:r>
         <w:rPr>
           <w:rFonts w:cstheme="minorHAnsi"/>
@@ -2111,7 +2493,25 @@
           <w:sz w:val="24"/>
           <w:szCs w:val="24"/>
         </w:rPr>
-        <w:t xml:space="preserve"> the sentence and whether it’s the main clause.</w:t>
+        <w:t xml:space="preserve"> the sentence and whether </w:t>
+      </w:r>
+      <w:proofErr w:type="gramStart"/>
+      <w:r>
+        <w:rPr>
+          <w:rFonts w:cstheme="minorHAnsi"/>
+          <w:sz w:val="24"/>
+          <w:szCs w:val="24"/>
+        </w:rPr>
+        <w:t>it’s</w:t>
+      </w:r>
+      <w:proofErr w:type="gramEnd"/>
+      <w:r>
+        <w:rPr>
+          <w:rFonts w:cstheme="minorHAnsi"/>
+          <w:sz w:val="24"/>
+          <w:szCs w:val="24"/>
+        </w:rPr>
+        <w:t xml:space="preserve"> the main clause.</w:t>
       </w:r>
       <w:r>
         <w:rPr>
@@ -2249,7 +2649,25 @@
           <w:sz w:val="24"/>
           <w:szCs w:val="24"/>
         </w:rPr>
-        <w:t>Although Fred beats his dog, he’s a nice guy.</w:t>
+        <w:t xml:space="preserve">Although Fred beats his dog, </w:t>
+      </w:r>
+      <w:proofErr w:type="gramStart"/>
+      <w:r>
+        <w:rPr>
+          <w:rFonts w:cstheme="minorHAnsi"/>
+          <w:sz w:val="24"/>
+          <w:szCs w:val="24"/>
+        </w:rPr>
+        <w:t>he’s</w:t>
+      </w:r>
+      <w:proofErr w:type="gramEnd"/>
+      <w:r>
+        <w:rPr>
+          <w:rFonts w:cstheme="minorHAnsi"/>
+          <w:sz w:val="24"/>
+          <w:szCs w:val="24"/>
+        </w:rPr>
+        <w:t xml:space="preserve"> a nice guy.</w:t>
       </w:r>
     </w:p>
     <w:p>
@@ -2377,7 +2795,25 @@
           <w:sz w:val="24"/>
           <w:szCs w:val="24"/>
         </w:rPr>
-        <w:t>Fred beats his dog, but he’s a nice guy</w:t>
+        <w:t xml:space="preserve">Fred beats his dog, but </w:t>
+      </w:r>
+      <w:proofErr w:type="gramStart"/>
+      <w:r>
+        <w:rPr>
+          <w:rFonts w:cstheme="minorHAnsi"/>
+          <w:sz w:val="24"/>
+          <w:szCs w:val="24"/>
+        </w:rPr>
+        <w:t>he’s</w:t>
+      </w:r>
+      <w:proofErr w:type="gramEnd"/>
+      <w:r>
+        <w:rPr>
+          <w:rFonts w:cstheme="minorHAnsi"/>
+          <w:sz w:val="24"/>
+          <w:szCs w:val="24"/>
+        </w:rPr>
+        <w:t xml:space="preserve"> a nice guy</w:t>
       </w:r>
       <w:r>
         <w:rPr>
@@ -2481,7 +2917,25 @@
           <w:sz w:val="24"/>
           <w:szCs w:val="24"/>
         </w:rPr>
-        <w:t>Fred is a good husband, a caring father, a good colleague and an altogether nice guy, even though he beats his dog.</w:t>
+        <w:t xml:space="preserve">Fred is a good husband, a caring father, a good </w:t>
+      </w:r>
+      <w:proofErr w:type="gramStart"/>
+      <w:r>
+        <w:rPr>
+          <w:rFonts w:cstheme="minorHAnsi"/>
+          <w:sz w:val="24"/>
+          <w:szCs w:val="24"/>
+        </w:rPr>
+        <w:t>colleague</w:t>
+      </w:r>
+      <w:proofErr w:type="gramEnd"/>
+      <w:r>
+        <w:rPr>
+          <w:rFonts w:cstheme="minorHAnsi"/>
+          <w:sz w:val="24"/>
+          <w:szCs w:val="24"/>
+        </w:rPr>
+        <w:t xml:space="preserve"> and an altogether nice guy, even though he beats his dog.</w:t>
       </w:r>
     </w:p>
     <w:p>
@@ -2505,7 +2959,29 @@
           <w:szCs w:val="24"/>
           <w:shd w:val="clear" w:color="auto" w:fill="F9F9F9"/>
         </w:rPr>
-        <w:t>Even though he beats his dog, Fred is a good husband, a caring father, a fine colleague and an altogether nice guy</w:t>
+        <w:t xml:space="preserve">Even though he beats his dog, Fred is a good husband, a caring father, a fine </w:t>
+      </w:r>
+      <w:proofErr w:type="gramStart"/>
+      <w:r>
+        <w:rPr>
+          <w:rFonts w:cstheme="minorHAnsi"/>
+          <w:color w:val="030303"/>
+          <w:sz w:val="24"/>
+          <w:szCs w:val="24"/>
+          <w:shd w:val="clear" w:color="auto" w:fill="F9F9F9"/>
+        </w:rPr>
+        <w:t>colleague</w:t>
+      </w:r>
+      <w:proofErr w:type="gramEnd"/>
+      <w:r>
+        <w:rPr>
+          <w:rFonts w:cstheme="minorHAnsi"/>
+          <w:color w:val="030303"/>
+          <w:sz w:val="24"/>
+          <w:szCs w:val="24"/>
+          <w:shd w:val="clear" w:color="auto" w:fill="F9F9F9"/>
+        </w:rPr>
+        <w:t xml:space="preserve"> and an altogether nice guy</w:t>
       </w:r>
       <w:r>
         <w:rPr>
@@ -2580,8 +3056,9 @@
           <w:szCs w:val="21"/>
           <w:shd w:val="clear" w:color="auto" w:fill="F9F9F9"/>
         </w:rPr>
-        <w:t xml:space="preserve"> Although Fred commits *genocide*, he's a nice guy</w:t>
-      </w:r>
+        <w:t xml:space="preserve"> Although Fred commits *genocide*, </w:t>
+      </w:r>
+      <w:proofErr w:type="gramStart"/>
       <w:r>
         <w:rPr>
           <w:rFonts w:ascii="Roboto" w:hAnsi="Roboto"/>
@@ -2590,6 +3067,27 @@
           <w:szCs w:val="21"/>
           <w:shd w:val="clear" w:color="auto" w:fill="F9F9F9"/>
         </w:rPr>
+        <w:t>he's</w:t>
+      </w:r>
+      <w:proofErr w:type="gramEnd"/>
+      <w:r>
+        <w:rPr>
+          <w:rFonts w:ascii="Roboto" w:hAnsi="Roboto"/>
+          <w:color w:val="030303"/>
+          <w:sz w:val="21"/>
+          <w:szCs w:val="21"/>
+          <w:shd w:val="clear" w:color="auto" w:fill="F9F9F9"/>
+        </w:rPr>
+        <w:t xml:space="preserve"> a nice guy</w:t>
+      </w:r>
+      <w:r>
+        <w:rPr>
+          <w:rFonts w:ascii="Roboto" w:hAnsi="Roboto"/>
+          <w:color w:val="030303"/>
+          <w:sz w:val="21"/>
+          <w:szCs w:val="21"/>
+          <w:shd w:val="clear" w:color="auto" w:fill="F9F9F9"/>
+        </w:rPr>
         <w:t>.</w:t>
       </w:r>
     </w:p>
@@ -2657,7 +3155,25 @@
           <w:sz w:val="24"/>
           <w:szCs w:val="24"/>
         </w:rPr>
-        <w:t>Alter the sentence structure first before changing the words. If you change the words, you deliver the same idea but it is less coherent.</w:t>
+        <w:t xml:space="preserve">Alter the sentence structure first before changing the words. If you change the words, you deliver the same </w:t>
+      </w:r>
+      <w:proofErr w:type="gramStart"/>
+      <w:r>
+        <w:rPr>
+          <w:rFonts w:cstheme="minorHAnsi"/>
+          <w:sz w:val="24"/>
+          <w:szCs w:val="24"/>
+        </w:rPr>
+        <w:t>idea</w:t>
+      </w:r>
+      <w:proofErr w:type="gramEnd"/>
+      <w:r>
+        <w:rPr>
+          <w:rFonts w:cstheme="minorHAnsi"/>
+          <w:sz w:val="24"/>
+          <w:szCs w:val="24"/>
+        </w:rPr>
+        <w:t xml:space="preserve"> but it is less coherent.</w:t>
       </w:r>
     </w:p>
     <w:p>
@@ -2790,6 +3306,7 @@
         </w:rPr>
         <w:t xml:space="preserve"> </w:t>
       </w:r>
+      <w:proofErr w:type="gramStart"/>
       <w:r>
         <w:rPr>
           <w:rFonts w:cstheme="minorHAnsi"/>
@@ -2806,6 +3323,7 @@
         </w:rPr>
         <w:t>developments</w:t>
       </w:r>
+      <w:proofErr w:type="gramEnd"/>
       <w:r>
         <w:rPr>
           <w:rFonts w:cstheme="minorHAnsi"/>
@@ -2842,8 +3360,18 @@
           <w:sz w:val="24"/>
           <w:szCs w:val="24"/>
         </w:rPr>
-        <w:t>espite disappointing  developments</w:t>
-      </w:r>
+        <w:t xml:space="preserve">espite </w:t>
+      </w:r>
+      <w:proofErr w:type="gramStart"/>
+      <w:r>
+        <w:rPr>
+          <w:rFonts w:cstheme="minorHAnsi"/>
+          <w:sz w:val="24"/>
+          <w:szCs w:val="24"/>
+        </w:rPr>
+        <w:t>disappointing  developments</w:t>
+      </w:r>
+      <w:proofErr w:type="gramEnd"/>
       <w:r>
         <w:rPr>
           <w:rFonts w:cstheme="minorHAnsi"/>
@@ -2985,7 +3513,25 @@
           <w:sz w:val="24"/>
           <w:szCs w:val="24"/>
         </w:rPr>
-        <w:t xml:space="preserve"> Its hard to miss out ones you need. Err on the side of caution.</w:t>
+        <w:t xml:space="preserve"> </w:t>
+      </w:r>
+      <w:proofErr w:type="spellStart"/>
+      <w:r>
+        <w:rPr>
+          <w:rFonts w:cstheme="minorHAnsi"/>
+          <w:sz w:val="24"/>
+          <w:szCs w:val="24"/>
+        </w:rPr>
+        <w:t>Its</w:t>
+      </w:r>
+      <w:proofErr w:type="spellEnd"/>
+      <w:r>
+        <w:rPr>
+          <w:rFonts w:cstheme="minorHAnsi"/>
+          <w:sz w:val="24"/>
+          <w:szCs w:val="24"/>
+        </w:rPr>
+        <w:t xml:space="preserve"> hard to miss out ones you need. Err on the side of caution.</w:t>
       </w:r>
       <w:r>
         <w:rPr>
@@ -3053,15 +3599,33 @@
           <w:sz w:val="24"/>
           <w:szCs w:val="24"/>
         </w:rPr>
-        <w:t>People get confused by compound sentences and complex sentences</w:t>
-      </w:r>
-      <w:r>
-        <w:rPr>
-          <w:rFonts w:cstheme="minorHAnsi"/>
-          <w:sz w:val="24"/>
-          <w:szCs w:val="24"/>
-        </w:rPr>
-        <w:t>, I suppose.</w:t>
+        <w:t xml:space="preserve">People get confused by compound sentences and complex </w:t>
+      </w:r>
+      <w:proofErr w:type="gramStart"/>
+      <w:r>
+        <w:rPr>
+          <w:rFonts w:cstheme="minorHAnsi"/>
+          <w:sz w:val="24"/>
+          <w:szCs w:val="24"/>
+        </w:rPr>
+        <w:t>sentences</w:t>
+      </w:r>
+      <w:r>
+        <w:rPr>
+          <w:rFonts w:cstheme="minorHAnsi"/>
+          <w:sz w:val="24"/>
+          <w:szCs w:val="24"/>
+        </w:rPr>
+        <w:t>,</w:t>
+      </w:r>
+      <w:proofErr w:type="gramEnd"/>
+      <w:r>
+        <w:rPr>
+          <w:rFonts w:cstheme="minorHAnsi"/>
+          <w:sz w:val="24"/>
+          <w:szCs w:val="24"/>
+        </w:rPr>
+        <w:t xml:space="preserve"> I suppose.</w:t>
       </w:r>
     </w:p>
     <w:p>
@@ -3328,13 +3892,23 @@
           <w:szCs w:val="24"/>
         </w:rPr>
       </w:pPr>
-      <w:r>
-        <w:rPr>
-          <w:rFonts w:cstheme="minorHAnsi"/>
-          <w:sz w:val="24"/>
-          <w:szCs w:val="24"/>
-        </w:rPr>
-        <w:t>E.g the rat is dead.</w:t>
+      <w:proofErr w:type="spellStart"/>
+      <w:r>
+        <w:rPr>
+          <w:rFonts w:cstheme="minorHAnsi"/>
+          <w:sz w:val="24"/>
+          <w:szCs w:val="24"/>
+        </w:rPr>
+        <w:t>E.g</w:t>
+      </w:r>
+      <w:proofErr w:type="spellEnd"/>
+      <w:r>
+        <w:rPr>
+          <w:rFonts w:cstheme="minorHAnsi"/>
+          <w:sz w:val="24"/>
+          <w:szCs w:val="24"/>
+        </w:rPr>
+        <w:t xml:space="preserve"> the rat is dead.</w:t>
       </w:r>
     </w:p>
     <w:p>
@@ -3356,7 +3930,25 @@
           <w:sz w:val="24"/>
           <w:szCs w:val="24"/>
         </w:rPr>
-        <w:t>The rat is dead has a subject and a verb</w:t>
+        <w:t xml:space="preserve">The rat is dead </w:t>
+      </w:r>
+      <w:proofErr w:type="gramStart"/>
+      <w:r>
+        <w:rPr>
+          <w:rFonts w:cstheme="minorHAnsi"/>
+          <w:sz w:val="24"/>
+          <w:szCs w:val="24"/>
+        </w:rPr>
+        <w:t>has</w:t>
+      </w:r>
+      <w:proofErr w:type="gramEnd"/>
+      <w:r>
+        <w:rPr>
+          <w:rFonts w:cstheme="minorHAnsi"/>
+          <w:sz w:val="24"/>
+          <w:szCs w:val="24"/>
+        </w:rPr>
+        <w:t xml:space="preserve"> a subject and a verb</w:t>
       </w:r>
     </w:p>
     <w:p>
@@ -3378,7 +3970,25 @@
           <w:sz w:val="24"/>
           <w:szCs w:val="24"/>
         </w:rPr>
-        <w:t>Subordinate clause: It doesn’t stand alone.</w:t>
+        <w:t xml:space="preserve">Subordinate clause: It </w:t>
+      </w:r>
+      <w:proofErr w:type="gramStart"/>
+      <w:r>
+        <w:rPr>
+          <w:rFonts w:cstheme="minorHAnsi"/>
+          <w:sz w:val="24"/>
+          <w:szCs w:val="24"/>
+        </w:rPr>
+        <w:t>doesn’t</w:t>
+      </w:r>
+      <w:proofErr w:type="gramEnd"/>
+      <w:r>
+        <w:rPr>
+          <w:rFonts w:cstheme="minorHAnsi"/>
+          <w:sz w:val="24"/>
+          <w:szCs w:val="24"/>
+        </w:rPr>
+        <w:t xml:space="preserve"> stand alone.</w:t>
       </w:r>
     </w:p>
     <w:p>
@@ -3394,13 +4004,23 @@
           <w:szCs w:val="24"/>
         </w:rPr>
       </w:pPr>
-      <w:r>
-        <w:rPr>
-          <w:rFonts w:cstheme="minorHAnsi"/>
-          <w:sz w:val="24"/>
-          <w:szCs w:val="24"/>
-        </w:rPr>
-        <w:t xml:space="preserve">E.g </w:t>
+      <w:proofErr w:type="spellStart"/>
+      <w:r>
+        <w:rPr>
+          <w:rFonts w:cstheme="minorHAnsi"/>
+          <w:sz w:val="24"/>
+          <w:szCs w:val="24"/>
+        </w:rPr>
+        <w:t>E.g</w:t>
+      </w:r>
+      <w:proofErr w:type="spellEnd"/>
+      <w:r>
+        <w:rPr>
+          <w:rFonts w:cstheme="minorHAnsi"/>
+          <w:sz w:val="24"/>
+          <w:szCs w:val="24"/>
+        </w:rPr>
+        <w:t xml:space="preserve"> </w:t>
       </w:r>
       <w:r>
         <w:rPr>
@@ -3488,7 +4108,25 @@
           <w:sz w:val="24"/>
           <w:szCs w:val="24"/>
         </w:rPr>
-        <w:t xml:space="preserve"> (not particularly well formed sentence)</w:t>
+        <w:t xml:space="preserve"> (not particularly </w:t>
+      </w:r>
+      <w:proofErr w:type="gramStart"/>
+      <w:r>
+        <w:rPr>
+          <w:rFonts w:cstheme="minorHAnsi"/>
+          <w:sz w:val="24"/>
+          <w:szCs w:val="24"/>
+        </w:rPr>
+        <w:t>well formed</w:t>
+      </w:r>
+      <w:proofErr w:type="gramEnd"/>
+      <w:r>
+        <w:rPr>
+          <w:rFonts w:cstheme="minorHAnsi"/>
+          <w:sz w:val="24"/>
+          <w:szCs w:val="24"/>
+        </w:rPr>
+        <w:t xml:space="preserve"> sentence)</w:t>
       </w:r>
     </w:p>
     <w:p>
@@ -3740,7 +4378,25 @@
           <w:sz w:val="24"/>
           <w:szCs w:val="24"/>
         </w:rPr>
-        <w:t xml:space="preserve"> are indicated by ’and’ and both sides should stand alone as main clauses. This means no comma is required between the two clauses (around the and).</w:t>
+        <w:t xml:space="preserve"> are indicated by ’and’ and both sides should stand alone as main clauses. This means no comma is required between the two clauses (around the </w:t>
+      </w:r>
+      <w:proofErr w:type="spellStart"/>
+      <w:r>
+        <w:rPr>
+          <w:rFonts w:cstheme="minorHAnsi"/>
+          <w:sz w:val="24"/>
+          <w:szCs w:val="24"/>
+        </w:rPr>
+        <w:t>and</w:t>
+      </w:r>
+      <w:proofErr w:type="spellEnd"/>
+      <w:r>
+        <w:rPr>
+          <w:rFonts w:cstheme="minorHAnsi"/>
+          <w:sz w:val="24"/>
+          <w:szCs w:val="24"/>
+        </w:rPr>
+        <w:t>).</w:t>
       </w:r>
     </w:p>
     <w:p>
@@ -3947,7 +4603,38 @@
           <w:sz w:val="24"/>
           <w:szCs w:val="24"/>
         </w:rPr>
-        <w:t>Object, verb, subject,verb,subject.</w:t>
+        <w:t xml:space="preserve">Object, verb, </w:t>
+      </w:r>
+      <w:proofErr w:type="spellStart"/>
+      <w:proofErr w:type="gramStart"/>
+      <w:r>
+        <w:rPr>
+          <w:rFonts w:cstheme="minorHAnsi"/>
+          <w:color w:val="70AD47" w:themeColor="accent6"/>
+          <w:sz w:val="24"/>
+          <w:szCs w:val="24"/>
+        </w:rPr>
+        <w:t>subject,verb</w:t>
+      </w:r>
+      <w:proofErr w:type="gramEnd"/>
+      <w:r>
+        <w:rPr>
+          <w:rFonts w:cstheme="minorHAnsi"/>
+          <w:color w:val="70AD47" w:themeColor="accent6"/>
+          <w:sz w:val="24"/>
+          <w:szCs w:val="24"/>
+        </w:rPr>
+        <w:t>,subject</w:t>
+      </w:r>
+      <w:proofErr w:type="spellEnd"/>
+      <w:r>
+        <w:rPr>
+          <w:rFonts w:cstheme="minorHAnsi"/>
+          <w:color w:val="70AD47" w:themeColor="accent6"/>
+          <w:sz w:val="24"/>
+          <w:szCs w:val="24"/>
+        </w:rPr>
+        <w:t>.</w:t>
       </w:r>
     </w:p>
     <w:p>
@@ -4064,7 +4751,17 @@
           <w:sz w:val="24"/>
           <w:szCs w:val="24"/>
         </w:rPr>
-        <w:t>Section 2 discusses the functionality needed from the HAM6 layout</w:t>
+        <w:t xml:space="preserve">Section 2 discusses the functionality needed from the HAM6 </w:t>
+      </w:r>
+      <w:proofErr w:type="gramStart"/>
+      <w:r>
+        <w:rPr>
+          <w:rFonts w:cstheme="minorHAnsi"/>
+          <w:color w:val="FF0000"/>
+          <w:sz w:val="24"/>
+          <w:szCs w:val="24"/>
+        </w:rPr>
+        <w:t>layout</w:t>
       </w:r>
       <w:r>
         <w:rPr>
@@ -4084,7 +4781,17 @@
           <w:sz w:val="24"/>
           <w:szCs w:val="24"/>
         </w:rPr>
-        <w:t xml:space="preserve"> and analyses the proposed HAM6 layout</w:t>
+        <w:t xml:space="preserve"> and</w:t>
+      </w:r>
+      <w:proofErr w:type="gramEnd"/>
+      <w:r>
+        <w:rPr>
+          <w:rFonts w:cstheme="minorHAnsi"/>
+          <w:color w:val="FF0000"/>
+          <w:sz w:val="24"/>
+          <w:szCs w:val="24"/>
+        </w:rPr>
+        <w:t xml:space="preserve"> analyses the proposed HAM6 layout</w:t>
       </w:r>
       <w:r>
         <w:rPr>
@@ -4117,7 +4824,27 @@
           <w:sz w:val="24"/>
           <w:szCs w:val="24"/>
         </w:rPr>
-        <w:t>Alice goes fishing by the lake, and catches fish.</w:t>
+        <w:t xml:space="preserve">Alice goes fishing by the </w:t>
+      </w:r>
+      <w:proofErr w:type="gramStart"/>
+      <w:r>
+        <w:rPr>
+          <w:rFonts w:cstheme="minorHAnsi"/>
+          <w:color w:val="FF0000"/>
+          <w:sz w:val="24"/>
+          <w:szCs w:val="24"/>
+        </w:rPr>
+        <w:t>lake, and</w:t>
+      </w:r>
+      <w:proofErr w:type="gramEnd"/>
+      <w:r>
+        <w:rPr>
+          <w:rFonts w:cstheme="minorHAnsi"/>
+          <w:color w:val="FF0000"/>
+          <w:sz w:val="24"/>
+          <w:szCs w:val="24"/>
+        </w:rPr>
+        <w:t xml:space="preserve"> catches fish.</w:t>
       </w:r>
     </w:p>
     <w:p>
@@ -4163,7 +4890,25 @@
           <w:sz w:val="24"/>
           <w:szCs w:val="24"/>
         </w:rPr>
-        <w:t>noun (it’s a ‘thing’)</w:t>
+        <w:t>noun (</w:t>
+      </w:r>
+      <w:proofErr w:type="gramStart"/>
+      <w:r>
+        <w:rPr>
+          <w:rFonts w:cstheme="minorHAnsi"/>
+          <w:sz w:val="24"/>
+          <w:szCs w:val="24"/>
+        </w:rPr>
+        <w:t>it’s</w:t>
+      </w:r>
+      <w:proofErr w:type="gramEnd"/>
+      <w:r>
+        <w:rPr>
+          <w:rFonts w:cstheme="minorHAnsi"/>
+          <w:sz w:val="24"/>
+          <w:szCs w:val="24"/>
+        </w:rPr>
+        <w:t xml:space="preserve"> a ‘thing’)</w:t>
       </w:r>
       <w:r>
         <w:rPr>
@@ -4357,7 +5102,25 @@
           <w:sz w:val="24"/>
           <w:szCs w:val="24"/>
         </w:rPr>
-        <w:t>conjunction (and, but, so)</w:t>
+        <w:t xml:space="preserve">conjunction (and, </w:t>
+      </w:r>
+      <w:proofErr w:type="gramStart"/>
+      <w:r>
+        <w:rPr>
+          <w:rFonts w:cstheme="minorHAnsi"/>
+          <w:sz w:val="24"/>
+          <w:szCs w:val="24"/>
+        </w:rPr>
+        <w:t>but,</w:t>
+      </w:r>
+      <w:proofErr w:type="gramEnd"/>
+      <w:r>
+        <w:rPr>
+          <w:rFonts w:cstheme="minorHAnsi"/>
+          <w:sz w:val="24"/>
+          <w:szCs w:val="24"/>
+        </w:rPr>
+        <w:t xml:space="preserve"> so)</w:t>
       </w:r>
       <w:r>
         <w:rPr>
@@ -4473,7 +5236,27 @@
           <w:sz w:val="24"/>
           <w:szCs w:val="24"/>
         </w:rPr>
-        <w:t>BHD is a method of measuring information encoded by a light field, it forms a key part of many quantum optics experiments.</w:t>
+        <w:t xml:space="preserve">BHD is a method of measuring information encoded by a light </w:t>
+      </w:r>
+      <w:proofErr w:type="gramStart"/>
+      <w:r>
+        <w:rPr>
+          <w:rFonts w:cstheme="minorHAnsi"/>
+          <w:color w:val="FF0000"/>
+          <w:sz w:val="24"/>
+          <w:szCs w:val="24"/>
+        </w:rPr>
+        <w:t>field,</w:t>
+      </w:r>
+      <w:proofErr w:type="gramEnd"/>
+      <w:r>
+        <w:rPr>
+          <w:rFonts w:cstheme="minorHAnsi"/>
+          <w:color w:val="FF0000"/>
+          <w:sz w:val="24"/>
+          <w:szCs w:val="24"/>
+        </w:rPr>
+        <w:t xml:space="preserve"> it forms a key part of many quantum optics experiments.</w:t>
       </w:r>
     </w:p>
     <w:p>
@@ -4528,15 +5311,33 @@
           <w:sz w:val="24"/>
           <w:szCs w:val="24"/>
         </w:rPr>
-        <w:t>Commas can be brackets</w:t>
-      </w:r>
-      <w:r>
-        <w:rPr>
-          <w:rFonts w:cstheme="minorHAnsi"/>
-          <w:sz w:val="24"/>
-          <w:szCs w:val="24"/>
-        </w:rPr>
-        <w:t xml:space="preserve">: e.g. The rat, which was </w:t>
+        <w:t xml:space="preserve">Commas can be </w:t>
+      </w:r>
+      <w:proofErr w:type="gramStart"/>
+      <w:r>
+        <w:rPr>
+          <w:rFonts w:cstheme="minorHAnsi"/>
+          <w:sz w:val="24"/>
+          <w:szCs w:val="24"/>
+        </w:rPr>
+        <w:t>brackets</w:t>
+      </w:r>
+      <w:r>
+        <w:rPr>
+          <w:rFonts w:cstheme="minorHAnsi"/>
+          <w:sz w:val="24"/>
+          <w:szCs w:val="24"/>
+        </w:rPr>
+        <w:t>:</w:t>
+      </w:r>
+      <w:proofErr w:type="gramEnd"/>
+      <w:r>
+        <w:rPr>
+          <w:rFonts w:cstheme="minorHAnsi"/>
+          <w:sz w:val="24"/>
+          <w:szCs w:val="24"/>
+        </w:rPr>
+        <w:t xml:space="preserve"> e.g. The rat, which was </w:t>
       </w:r>
       <w:r>
         <w:rPr>
@@ -4584,13 +5385,23 @@
           <w:szCs w:val="24"/>
         </w:rPr>
       </w:pPr>
-      <w:r>
-        <w:rPr>
-          <w:rFonts w:cstheme="minorHAnsi"/>
-          <w:sz w:val="24"/>
-          <w:szCs w:val="24"/>
-        </w:rPr>
-        <w:t xml:space="preserve">However is a </w:t>
+      <w:proofErr w:type="gramStart"/>
+      <w:r>
+        <w:rPr>
+          <w:rFonts w:cstheme="minorHAnsi"/>
+          <w:sz w:val="24"/>
+          <w:szCs w:val="24"/>
+        </w:rPr>
+        <w:t>However</w:t>
+      </w:r>
+      <w:proofErr w:type="gramEnd"/>
+      <w:r>
+        <w:rPr>
+          <w:rFonts w:cstheme="minorHAnsi"/>
+          <w:sz w:val="24"/>
+          <w:szCs w:val="24"/>
+        </w:rPr>
+        <w:t xml:space="preserve"> is a </w:t>
       </w:r>
       <w:r>
         <w:rPr>
@@ -4622,7 +5433,25 @@
           <w:sz w:val="24"/>
           <w:szCs w:val="24"/>
         </w:rPr>
-        <w:t xml:space="preserve"> e.g:</w:t>
+        <w:t xml:space="preserve"> </w:t>
+      </w:r>
+      <w:proofErr w:type="spellStart"/>
+      <w:r>
+        <w:rPr>
+          <w:rFonts w:cstheme="minorHAnsi"/>
+          <w:sz w:val="24"/>
+          <w:szCs w:val="24"/>
+        </w:rPr>
+        <w:t>e.g</w:t>
+      </w:r>
+      <w:proofErr w:type="spellEnd"/>
+      <w:r>
+        <w:rPr>
+          <w:rFonts w:cstheme="minorHAnsi"/>
+          <w:sz w:val="24"/>
+          <w:szCs w:val="24"/>
+        </w:rPr>
+        <w:t>:</w:t>
       </w:r>
     </w:p>
     <w:p>
@@ -4646,7 +5475,27 @@
           <w:sz w:val="24"/>
           <w:szCs w:val="24"/>
         </w:rPr>
-        <w:t>The rat was gone, however it was not forgotten.</w:t>
+        <w:t xml:space="preserve">The rat was </w:t>
+      </w:r>
+      <w:proofErr w:type="gramStart"/>
+      <w:r>
+        <w:rPr>
+          <w:rFonts w:cstheme="minorHAnsi"/>
+          <w:color w:val="FF0000"/>
+          <w:sz w:val="24"/>
+          <w:szCs w:val="24"/>
+        </w:rPr>
+        <w:t>gone,</w:t>
+      </w:r>
+      <w:proofErr w:type="gramEnd"/>
+      <w:r>
+        <w:rPr>
+          <w:rFonts w:cstheme="minorHAnsi"/>
+          <w:color w:val="FF0000"/>
+          <w:sz w:val="24"/>
+          <w:szCs w:val="24"/>
+        </w:rPr>
+        <w:t xml:space="preserve"> however it was not forgotten.</w:t>
       </w:r>
     </w:p>
     <w:p>
@@ -4841,7 +5690,25 @@
           <w:sz w:val="24"/>
           <w:szCs w:val="24"/>
         </w:rPr>
-        <w:t>Be careful with ‘as’. Without a comma as can be an adverb</w:t>
+        <w:t>Be careful with ‘</w:t>
+      </w:r>
+      <w:proofErr w:type="gramStart"/>
+      <w:r>
+        <w:rPr>
+          <w:rFonts w:cstheme="minorHAnsi"/>
+          <w:sz w:val="24"/>
+          <w:szCs w:val="24"/>
+        </w:rPr>
+        <w:t>as’</w:t>
+      </w:r>
+      <w:proofErr w:type="gramEnd"/>
+      <w:r>
+        <w:rPr>
+          <w:rFonts w:cstheme="minorHAnsi"/>
+          <w:sz w:val="24"/>
+          <w:szCs w:val="24"/>
+        </w:rPr>
+        <w:t>. Without a comma as can be an adverb</w:t>
       </w:r>
       <w:r>
         <w:rPr>
@@ -4867,13 +5734,23 @@
         </w:rPr>
         <w:t xml:space="preserve">. With a comma, </w:t>
       </w:r>
-      <w:r>
-        <w:rPr>
-          <w:rFonts w:cstheme="minorHAnsi"/>
-          <w:sz w:val="24"/>
-          <w:szCs w:val="24"/>
-        </w:rPr>
-        <w:t xml:space="preserve">it’s the start of a </w:t>
+      <w:proofErr w:type="gramStart"/>
+      <w:r>
+        <w:rPr>
+          <w:rFonts w:cstheme="minorHAnsi"/>
+          <w:sz w:val="24"/>
+          <w:szCs w:val="24"/>
+        </w:rPr>
+        <w:t>it’s</w:t>
+      </w:r>
+      <w:proofErr w:type="gramEnd"/>
+      <w:r>
+        <w:rPr>
+          <w:rFonts w:cstheme="minorHAnsi"/>
+          <w:sz w:val="24"/>
+          <w:szCs w:val="24"/>
+        </w:rPr>
+        <w:t xml:space="preserve"> the start of a </w:t>
       </w:r>
       <w:r>
         <w:rPr>
@@ -4984,7 +5861,25 @@
           <w:sz w:val="24"/>
           <w:szCs w:val="24"/>
         </w:rPr>
-        <w:t>Adverbial clause: this is a clause in a complex sentence that provides adverbial in formation about it</w:t>
+        <w:t xml:space="preserve">Adverbial clause: this is a clause in a complex sentence that provides adverbial </w:t>
+      </w:r>
+      <w:proofErr w:type="gramStart"/>
+      <w:r>
+        <w:rPr>
+          <w:rFonts w:cstheme="minorHAnsi"/>
+          <w:sz w:val="24"/>
+          <w:szCs w:val="24"/>
+        </w:rPr>
+        <w:t>in formation</w:t>
+      </w:r>
+      <w:proofErr w:type="gramEnd"/>
+      <w:r>
+        <w:rPr>
+          <w:rFonts w:cstheme="minorHAnsi"/>
+          <w:sz w:val="24"/>
+          <w:szCs w:val="24"/>
+        </w:rPr>
+        <w:t xml:space="preserve"> about it</w:t>
       </w:r>
       <w:r>
         <w:rPr>
@@ -5088,7 +5983,25 @@
           <w:sz w:val="24"/>
           <w:szCs w:val="24"/>
         </w:rPr>
-        <w:t xml:space="preserve"> with an adverb that sets the tone of the sentence, such  as ‘fundamentally’, </w:t>
+        <w:t xml:space="preserve"> with an adverb that sets the tone of the sentence, </w:t>
+      </w:r>
+      <w:proofErr w:type="gramStart"/>
+      <w:r>
+        <w:rPr>
+          <w:rFonts w:cstheme="minorHAnsi"/>
+          <w:sz w:val="24"/>
+          <w:szCs w:val="24"/>
+        </w:rPr>
+        <w:t>such  as</w:t>
+      </w:r>
+      <w:proofErr w:type="gramEnd"/>
+      <w:r>
+        <w:rPr>
+          <w:rFonts w:cstheme="minorHAnsi"/>
+          <w:sz w:val="24"/>
+          <w:szCs w:val="24"/>
+        </w:rPr>
+        <w:t xml:space="preserve"> ‘fundamentally’, </w:t>
       </w:r>
       <w:r>
         <w:rPr>
@@ -5184,7 +6097,43 @@
           <w:sz w:val="24"/>
           <w:szCs w:val="24"/>
         </w:rPr>
-        <w:t>If so is a coordinating conjunction, its is preceded by a comma:</w:t>
+        <w:t xml:space="preserve">If </w:t>
+      </w:r>
+      <w:proofErr w:type="gramStart"/>
+      <w:r>
+        <w:rPr>
+          <w:rFonts w:cstheme="minorHAnsi"/>
+          <w:sz w:val="24"/>
+          <w:szCs w:val="24"/>
+        </w:rPr>
+        <w:t>so</w:t>
+      </w:r>
+      <w:proofErr w:type="gramEnd"/>
+      <w:r>
+        <w:rPr>
+          <w:rFonts w:cstheme="minorHAnsi"/>
+          <w:sz w:val="24"/>
+          <w:szCs w:val="24"/>
+        </w:rPr>
+        <w:t xml:space="preserve"> is a coordinating conjunction, </w:t>
+      </w:r>
+      <w:proofErr w:type="spellStart"/>
+      <w:r>
+        <w:rPr>
+          <w:rFonts w:cstheme="minorHAnsi"/>
+          <w:sz w:val="24"/>
+          <w:szCs w:val="24"/>
+        </w:rPr>
+        <w:t>its</w:t>
+      </w:r>
+      <w:proofErr w:type="spellEnd"/>
+      <w:r>
+        <w:rPr>
+          <w:rFonts w:cstheme="minorHAnsi"/>
+          <w:sz w:val="24"/>
+          <w:szCs w:val="24"/>
+        </w:rPr>
+        <w:t xml:space="preserve"> is preceded by a comma:</w:t>
       </w:r>
     </w:p>
     <w:p>
@@ -5248,7 +6197,25 @@
           <w:sz w:val="24"/>
           <w:szCs w:val="24"/>
         </w:rPr>
-        <w:t>If so is a subordinating conjunction, it is not preceded by a comma</w:t>
+        <w:t xml:space="preserve">If </w:t>
+      </w:r>
+      <w:proofErr w:type="gramStart"/>
+      <w:r>
+        <w:rPr>
+          <w:rFonts w:cstheme="minorHAnsi"/>
+          <w:sz w:val="24"/>
+          <w:szCs w:val="24"/>
+        </w:rPr>
+        <w:t>so</w:t>
+      </w:r>
+      <w:proofErr w:type="gramEnd"/>
+      <w:r>
+        <w:rPr>
+          <w:rFonts w:cstheme="minorHAnsi"/>
+          <w:sz w:val="24"/>
+          <w:szCs w:val="24"/>
+        </w:rPr>
+        <w:t xml:space="preserve"> is a subordinating conjunction, it is not preceded by a comma</w:t>
       </w:r>
     </w:p>
     <w:p>
@@ -5272,15 +6239,53 @@
           <w:sz w:val="24"/>
           <w:szCs w:val="24"/>
         </w:rPr>
-        <w:t>To check if this is true, replace so with so that. If the sentence meaning doesn’t change, then so is being used as a subordinating conjunction</w:t>
-      </w:r>
-      <w:r>
-        <w:rPr>
-          <w:rFonts w:cstheme="minorHAnsi"/>
-          <w:sz w:val="24"/>
-          <w:szCs w:val="24"/>
-        </w:rPr>
-        <w:t xml:space="preserve">. (this joins a independent and </w:t>
+        <w:t xml:space="preserve">To check if this is true, replace so with so that. If the sentence meaning </w:t>
+      </w:r>
+      <w:proofErr w:type="gramStart"/>
+      <w:r>
+        <w:rPr>
+          <w:rFonts w:cstheme="minorHAnsi"/>
+          <w:sz w:val="24"/>
+          <w:szCs w:val="24"/>
+        </w:rPr>
+        <w:t>doesn’t</w:t>
+      </w:r>
+      <w:proofErr w:type="gramEnd"/>
+      <w:r>
+        <w:rPr>
+          <w:rFonts w:cstheme="minorHAnsi"/>
+          <w:sz w:val="24"/>
+          <w:szCs w:val="24"/>
+        </w:rPr>
+        <w:t xml:space="preserve"> change, then so is being used as a subordinating conjunction</w:t>
+      </w:r>
+      <w:r>
+        <w:rPr>
+          <w:rFonts w:cstheme="minorHAnsi"/>
+          <w:sz w:val="24"/>
+          <w:szCs w:val="24"/>
+        </w:rPr>
+        <w:t xml:space="preserve">. (this joins </w:t>
+      </w:r>
+      <w:proofErr w:type="spellStart"/>
+      <w:proofErr w:type="gramStart"/>
+      <w:r>
+        <w:rPr>
+          <w:rFonts w:cstheme="minorHAnsi"/>
+          <w:sz w:val="24"/>
+          <w:szCs w:val="24"/>
+        </w:rPr>
+        <w:t>a</w:t>
+      </w:r>
+      <w:proofErr w:type="spellEnd"/>
+      <w:proofErr w:type="gramEnd"/>
+      <w:r>
+        <w:rPr>
+          <w:rFonts w:cstheme="minorHAnsi"/>
+          <w:sz w:val="24"/>
+          <w:szCs w:val="24"/>
+        </w:rPr>
+        <w:t xml:space="preserve"> independent and </w:t>
       </w:r>
       <w:r>
         <w:rPr>
@@ -5841,12 +6846,21 @@
           <w:szCs w:val="24"/>
         </w:rPr>
       </w:pPr>
-      <w:r>
-        <w:rPr>
-          <w:sz w:val="24"/>
-          <w:szCs w:val="24"/>
-        </w:rPr>
-        <w:t>Ctrl+f 1, 2, 3, 4, 5, 6, 7, 8, 9 and 10, replace with one, two, three …</w:t>
+      <w:proofErr w:type="spellStart"/>
+      <w:r>
+        <w:rPr>
+          <w:sz w:val="24"/>
+          <w:szCs w:val="24"/>
+        </w:rPr>
+        <w:t>Ctrl+f</w:t>
+      </w:r>
+      <w:proofErr w:type="spellEnd"/>
+      <w:r>
+        <w:rPr>
+          <w:sz w:val="24"/>
+          <w:szCs w:val="24"/>
+        </w:rPr>
+        <w:t xml:space="preserve"> 1, 2, 3, 4, 5, 6, 7, 8, 9 and 10, replace with one, two, three …</w:t>
       </w:r>
     </w:p>
     <w:p>
@@ -5861,20 +6875,38 @@
           <w:szCs w:val="24"/>
         </w:rPr>
       </w:pPr>
-      <w:r>
-        <w:rPr>
-          <w:sz w:val="24"/>
-          <w:szCs w:val="24"/>
-        </w:rPr>
-        <w:t xml:space="preserve">Ctrl+f </w:t>
-      </w:r>
-      <w:r>
-        <w:rPr>
-          <w:sz w:val="24"/>
-          <w:szCs w:val="24"/>
-        </w:rPr>
-        <w:t>the the</w:t>
-      </w:r>
+      <w:proofErr w:type="spellStart"/>
+      <w:r>
+        <w:rPr>
+          <w:sz w:val="24"/>
+          <w:szCs w:val="24"/>
+        </w:rPr>
+        <w:t>Ctrl+f</w:t>
+      </w:r>
+      <w:proofErr w:type="spellEnd"/>
+      <w:r>
+        <w:rPr>
+          <w:sz w:val="24"/>
+          <w:szCs w:val="24"/>
+        </w:rPr>
+        <w:t xml:space="preserve"> </w:t>
+      </w:r>
+      <w:r>
+        <w:rPr>
+          <w:sz w:val="24"/>
+          <w:szCs w:val="24"/>
+        </w:rPr>
+        <w:t xml:space="preserve">the </w:t>
+      </w:r>
+      <w:proofErr w:type="spellStart"/>
+      <w:r>
+        <w:rPr>
+          <w:sz w:val="24"/>
+          <w:szCs w:val="24"/>
+        </w:rPr>
+        <w:t>the</w:t>
+      </w:r>
+      <w:proofErr w:type="spellEnd"/>
     </w:p>
     <w:p>
       <w:pPr>
@@ -5968,8 +7000,17 @@
           <w:sz w:val="24"/>
           <w:szCs w:val="24"/>
         </w:rPr>
-        <w:t>Beam splitter, not beamsplitter</w:t>
-      </w:r>
+        <w:t xml:space="preserve">Beam splitter, not </w:t>
+      </w:r>
+      <w:proofErr w:type="spellStart"/>
+      <w:r>
+        <w:rPr>
+          <w:sz w:val="24"/>
+          <w:szCs w:val="24"/>
+        </w:rPr>
+        <w:t>beamsplitter</w:t>
+      </w:r>
+      <w:proofErr w:type="spellEnd"/>
     </w:p>
     <w:p>
       <w:pPr>
@@ -6015,7 +7056,23 @@
           <w:sz w:val="24"/>
           <w:szCs w:val="24"/>
         </w:rPr>
-        <w:t>Remove doesn’t,</w:t>
+        <w:t xml:space="preserve">Remove </w:t>
+      </w:r>
+      <w:proofErr w:type="gramStart"/>
+      <w:r>
+        <w:rPr>
+          <w:sz w:val="24"/>
+          <w:szCs w:val="24"/>
+        </w:rPr>
+        <w:t>doesn’t</w:t>
+      </w:r>
+      <w:proofErr w:type="gramEnd"/>
+      <w:r>
+        <w:rPr>
+          <w:sz w:val="24"/>
+          <w:szCs w:val="24"/>
+        </w:rPr>
+        <w:t>,</w:t>
       </w:r>
       <w:r>
         <w:rPr>
@@ -6044,19 +7101,44 @@
           <w:szCs w:val="24"/>
         </w:rPr>
       </w:pPr>
-      <w:r>
-        <w:rPr>
-          <w:sz w:val="24"/>
-          <w:szCs w:val="24"/>
-        </w:rPr>
-        <w:t xml:space="preserve">Ctrl+f effect and affect. </w:t>
-      </w:r>
-      <w:r>
-        <w:rPr>
-          <w:sz w:val="24"/>
-          <w:szCs w:val="24"/>
-        </w:rPr>
-        <w:t xml:space="preserve">Effect is a noun, affect is a verb. </w:t>
+      <w:proofErr w:type="spellStart"/>
+      <w:r>
+        <w:rPr>
+          <w:sz w:val="24"/>
+          <w:szCs w:val="24"/>
+        </w:rPr>
+        <w:t>Ctrl+f</w:t>
+      </w:r>
+      <w:proofErr w:type="spellEnd"/>
+      <w:r>
+        <w:rPr>
+          <w:sz w:val="24"/>
+          <w:szCs w:val="24"/>
+        </w:rPr>
+        <w:t xml:space="preserve"> effect and affect. </w:t>
+      </w:r>
+      <w:r>
+        <w:rPr>
+          <w:sz w:val="24"/>
+          <w:szCs w:val="24"/>
+        </w:rPr>
+        <w:t xml:space="preserve">Effect is a </w:t>
+      </w:r>
+      <w:proofErr w:type="gramStart"/>
+      <w:r>
+        <w:rPr>
+          <w:sz w:val="24"/>
+          <w:szCs w:val="24"/>
+        </w:rPr>
+        <w:t>noun,</w:t>
+      </w:r>
+      <w:proofErr w:type="gramEnd"/>
+      <w:r>
+        <w:rPr>
+          <w:sz w:val="24"/>
+          <w:szCs w:val="24"/>
+        </w:rPr>
+        <w:t xml:space="preserve"> affect is a verb. </w:t>
       </w:r>
       <w:r>
         <w:rPr>
@@ -6297,7 +7379,23 @@
           <w:sz w:val="24"/>
           <w:szCs w:val="24"/>
         </w:rPr>
-        <w:t>, really, quite, in fact, so (to mean extreme), actually and pretty.</w:t>
+        <w:t xml:space="preserve">, really, </w:t>
+      </w:r>
+      <w:proofErr w:type="gramStart"/>
+      <w:r>
+        <w:rPr>
+          <w:sz w:val="24"/>
+          <w:szCs w:val="24"/>
+        </w:rPr>
+        <w:t>quite</w:t>
+      </w:r>
+      <w:proofErr w:type="gramEnd"/>
+      <w:r>
+        <w:rPr>
+          <w:sz w:val="24"/>
+          <w:szCs w:val="24"/>
+        </w:rPr>
+        <w:t>, in fact, so (to mean extreme), actually and pretty.</w:t>
       </w:r>
     </w:p>
     <w:p>
@@ -6317,7 +7415,23 @@
           <w:sz w:val="24"/>
           <w:szCs w:val="24"/>
         </w:rPr>
-        <w:t>Lots end in ‘ly’</w:t>
+        <w:t>Lots end in ‘</w:t>
+      </w:r>
+      <w:proofErr w:type="spellStart"/>
+      <w:r>
+        <w:rPr>
+          <w:sz w:val="24"/>
+          <w:szCs w:val="24"/>
+        </w:rPr>
+        <w:t>ly</w:t>
+      </w:r>
+      <w:proofErr w:type="spellEnd"/>
+      <w:r>
+        <w:rPr>
+          <w:sz w:val="24"/>
+          <w:szCs w:val="24"/>
+        </w:rPr>
+        <w:t>’</w:t>
       </w:r>
     </w:p>
     <w:p>
@@ -6443,6 +7557,7 @@
         </w:rPr>
         <w:t xml:space="preserve">Photodiode, not </w:t>
       </w:r>
+      <w:proofErr w:type="gramStart"/>
       <w:r>
         <w:rPr>
           <w:sz w:val="24"/>
@@ -6450,6 +7565,7 @@
         </w:rPr>
         <w:t>Photo-diode</w:t>
       </w:r>
+      <w:proofErr w:type="gramEnd"/>
     </w:p>
     <w:p>
       <w:pPr>
@@ -6468,7 +7584,23 @@
           <w:sz w:val="24"/>
           <w:szCs w:val="24"/>
         </w:rPr>
-        <w:t>Check ngram viewer if unsure.</w:t>
+        <w:t xml:space="preserve">Check </w:t>
+      </w:r>
+      <w:proofErr w:type="spellStart"/>
+      <w:r>
+        <w:rPr>
+          <w:sz w:val="24"/>
+          <w:szCs w:val="24"/>
+        </w:rPr>
+        <w:t>ngram</w:t>
+      </w:r>
+      <w:proofErr w:type="spellEnd"/>
+      <w:r>
+        <w:rPr>
+          <w:sz w:val="24"/>
+          <w:szCs w:val="24"/>
+        </w:rPr>
+        <w:t xml:space="preserve"> viewer if unsure.</w:t>
       </w:r>
     </w:p>
     <w:p>
@@ -6523,6 +7655,7 @@
           <w:szCs w:val="24"/>
         </w:rPr>
       </w:pPr>
+      <w:proofErr w:type="gramStart"/>
       <w:r>
         <w:rPr>
           <w:sz w:val="24"/>
@@ -6530,6 +7663,7 @@
         </w:rPr>
         <w:t>Free-running</w:t>
       </w:r>
+      <w:proofErr w:type="gramEnd"/>
     </w:p>
     <w:p>
       <w:pPr>
@@ -6543,6 +7677,7 @@
           <w:szCs w:val="24"/>
         </w:rPr>
       </w:pPr>
+      <w:proofErr w:type="gramStart"/>
       <w:r>
         <w:rPr>
           <w:sz w:val="24"/>
@@ -6550,6 +7685,7 @@
         </w:rPr>
         <w:t>closed-loop</w:t>
       </w:r>
+      <w:proofErr w:type="gramEnd"/>
     </w:p>
     <w:p>
       <w:pPr>
@@ -6563,6 +7699,7 @@
           <w:szCs w:val="24"/>
         </w:rPr>
       </w:pPr>
+      <w:proofErr w:type="gramStart"/>
       <w:r>
         <w:rPr>
           <w:sz w:val="24"/>
@@ -6570,6 +7707,7 @@
         </w:rPr>
         <w:t>open-loop</w:t>
       </w:r>
+      <w:proofErr w:type="gramEnd"/>
     </w:p>
     <w:p>
       <w:pPr>
@@ -6610,12 +7748,21 @@
           <w:szCs w:val="24"/>
         </w:rPr>
       </w:pPr>
-      <w:r>
-        <w:rPr>
-          <w:sz w:val="24"/>
-          <w:szCs w:val="24"/>
-        </w:rPr>
-        <w:t xml:space="preserve">E.g </w:t>
+      <w:proofErr w:type="spellStart"/>
+      <w:r>
+        <w:rPr>
+          <w:sz w:val="24"/>
+          <w:szCs w:val="24"/>
+        </w:rPr>
+        <w:t>E.g</w:t>
+      </w:r>
+      <w:proofErr w:type="spellEnd"/>
+      <w:r>
+        <w:rPr>
+          <w:sz w:val="24"/>
+          <w:szCs w:val="24"/>
+        </w:rPr>
+        <w:t xml:space="preserve"> </w:t>
       </w:r>
       <w:r>
         <w:rPr>
@@ -6656,7 +7803,23 @@
           <w:sz w:val="24"/>
           <w:szCs w:val="24"/>
         </w:rPr>
-        <w:t xml:space="preserve">Current detector = aLIGO, future detector = LIGO A+, the </w:t>
+        <w:t xml:space="preserve">Current detector = </w:t>
+      </w:r>
+      <w:proofErr w:type="spellStart"/>
+      <w:r>
+        <w:rPr>
+          <w:sz w:val="24"/>
+          <w:szCs w:val="24"/>
+        </w:rPr>
+        <w:t>aLIGO</w:t>
+      </w:r>
+      <w:proofErr w:type="spellEnd"/>
+      <w:r>
+        <w:rPr>
+          <w:sz w:val="24"/>
+          <w:szCs w:val="24"/>
+        </w:rPr>
+        <w:t xml:space="preserve">, future detector = LIGO A+, the </w:t>
       </w:r>
       <w:r>
         <w:rPr>
@@ -6685,12 +7848,21 @@
           <w:szCs w:val="24"/>
         </w:rPr>
       </w:pPr>
-      <w:r>
-        <w:rPr>
-          <w:sz w:val="24"/>
-          <w:szCs w:val="24"/>
-        </w:rPr>
-        <w:t>None classical -&gt; non-classical</w:t>
+      <w:proofErr w:type="gramStart"/>
+      <w:r>
+        <w:rPr>
+          <w:sz w:val="24"/>
+          <w:szCs w:val="24"/>
+        </w:rPr>
+        <w:t>None classical</w:t>
+      </w:r>
+      <w:proofErr w:type="gramEnd"/>
+      <w:r>
+        <w:rPr>
+          <w:sz w:val="24"/>
+          <w:szCs w:val="24"/>
+        </w:rPr>
+        <w:t xml:space="preserve"> -&gt; non-classical</w:t>
       </w:r>
     </w:p>
     <w:p>
@@ -6862,6 +8034,7 @@
         </w:rPr>
         <w:t>Remove ‘</w:t>
       </w:r>
+      <w:proofErr w:type="gramStart"/>
       <w:r>
         <w:rPr>
           <w:b/>
@@ -6876,7 +8049,15 @@
           <w:sz w:val="24"/>
           <w:szCs w:val="24"/>
         </w:rPr>
-        <w:t xml:space="preserve"> to’</w:t>
+        <w:t xml:space="preserve"> to</w:t>
+      </w:r>
+      <w:proofErr w:type="gramEnd"/>
+      <w:r>
+        <w:rPr>
+          <w:sz w:val="24"/>
+          <w:szCs w:val="24"/>
+        </w:rPr>
+        <w:t>’</w:t>
       </w:r>
       <w:r>
         <w:rPr>
@@ -7082,7 +8263,23 @@
           <w:sz w:val="24"/>
           <w:szCs w:val="24"/>
         </w:rPr>
-        <w:t xml:space="preserve"> They is some stylistic freedom here.</w:t>
+        <w:t xml:space="preserve"> They </w:t>
+      </w:r>
+      <w:proofErr w:type="gramStart"/>
+      <w:r>
+        <w:rPr>
+          <w:sz w:val="24"/>
+          <w:szCs w:val="24"/>
+        </w:rPr>
+        <w:t>is</w:t>
+      </w:r>
+      <w:proofErr w:type="gramEnd"/>
+      <w:r>
+        <w:rPr>
+          <w:sz w:val="24"/>
+          <w:szCs w:val="24"/>
+        </w:rPr>
+        <w:t xml:space="preserve"> some stylistic freedom here.</w:t>
       </w:r>
     </w:p>
     <w:p>
@@ -7152,7 +8349,39 @@
           <w:sz w:val="24"/>
           <w:szCs w:val="24"/>
         </w:rPr>
-        <w:t>Figures shall be saved as eps when using matplotlib or 'epsc' when using matlab. This is to prevent a latex warning.</w:t>
+        <w:t>Figures shall be saved as eps when using matplotlib or '</w:t>
+      </w:r>
+      <w:proofErr w:type="spellStart"/>
+      <w:r>
+        <w:rPr>
+          <w:sz w:val="24"/>
+          <w:szCs w:val="24"/>
+        </w:rPr>
+        <w:t>epsc</w:t>
+      </w:r>
+      <w:proofErr w:type="spellEnd"/>
+      <w:r>
+        <w:rPr>
+          <w:sz w:val="24"/>
+          <w:szCs w:val="24"/>
+        </w:rPr>
+        <w:t xml:space="preserve">' when using </w:t>
+      </w:r>
+      <w:proofErr w:type="spellStart"/>
+      <w:r>
+        <w:rPr>
+          <w:sz w:val="24"/>
+          <w:szCs w:val="24"/>
+        </w:rPr>
+        <w:t>matlab</w:t>
+      </w:r>
+      <w:proofErr w:type="spellEnd"/>
+      <w:r>
+        <w:rPr>
+          <w:sz w:val="24"/>
+          <w:szCs w:val="24"/>
+        </w:rPr>
+        <w:t>. This is to prevent a latex warning.</w:t>
       </w:r>
     </w:p>
     <w:p>
@@ -7206,7 +8435,23 @@
           <w:sz w:val="24"/>
           <w:szCs w:val="24"/>
         </w:rPr>
-        <w:t>Figure names shall be 'chapter description'_chapter_'figure description'. For</w:t>
+        <w:t xml:space="preserve">Figure names shall be 'chapter </w:t>
+      </w:r>
+      <w:proofErr w:type="spellStart"/>
+      <w:r>
+        <w:rPr>
+          <w:sz w:val="24"/>
+          <w:szCs w:val="24"/>
+        </w:rPr>
+        <w:t>description'_chapter_'figure</w:t>
+      </w:r>
+      <w:proofErr w:type="spellEnd"/>
+      <w:r>
+        <w:rPr>
+          <w:sz w:val="24"/>
+          <w:szCs w:val="24"/>
+        </w:rPr>
+        <w:t xml:space="preserve"> description'. For</w:t>
       </w:r>
       <w:r>
         <w:rPr>
@@ -7220,7 +8465,23 @@
           <w:sz w:val="24"/>
           <w:szCs w:val="24"/>
         </w:rPr>
-        <w:t>example, 'sim_chapter_Zoom_in_ETM_tuning' refers to the figure being in the</w:t>
+        <w:t>example, '</w:t>
+      </w:r>
+      <w:proofErr w:type="spellStart"/>
+      <w:r>
+        <w:rPr>
+          <w:sz w:val="24"/>
+          <w:szCs w:val="24"/>
+        </w:rPr>
+        <w:t>sim_chapter_Zoom_in_ETM_tuning</w:t>
+      </w:r>
+      <w:proofErr w:type="spellEnd"/>
+      <w:r>
+        <w:rPr>
+          <w:sz w:val="24"/>
+          <w:szCs w:val="24"/>
+        </w:rPr>
+        <w:t>' refers to the figure being in the</w:t>
       </w:r>
       <w:r>
         <w:rPr>
@@ -7274,7 +8535,23 @@
           <w:sz w:val="24"/>
           <w:szCs w:val="24"/>
         </w:rPr>
-        <w:t>Are all lines visible/distinguishable? Changing thickness and linestyle can help.</w:t>
+        <w:t xml:space="preserve">Are all lines visible/distinguishable? Changing thickness and </w:t>
+      </w:r>
+      <w:proofErr w:type="spellStart"/>
+      <w:r>
+        <w:rPr>
+          <w:sz w:val="24"/>
+          <w:szCs w:val="24"/>
+        </w:rPr>
+        <w:t>linestyle</w:t>
+      </w:r>
+      <w:proofErr w:type="spellEnd"/>
+      <w:r>
+        <w:rPr>
+          <w:sz w:val="24"/>
+          <w:szCs w:val="24"/>
+        </w:rPr>
+        <w:t xml:space="preserve"> can help.</w:t>
       </w:r>
     </w:p>
     <w:p>
@@ -7289,12 +8566,37 @@
           <w:szCs w:val="24"/>
         </w:rPr>
       </w:pPr>
-      <w:r>
-        <w:rPr>
-          <w:sz w:val="24"/>
-          <w:szCs w:val="24"/>
-        </w:rPr>
-        <w:t>Are the axis labelled? The label is a sentence, so normal sentence capitalisation should be used. If its just one word, use a capital letter.</w:t>
+      <w:proofErr w:type="gramStart"/>
+      <w:r>
+        <w:rPr>
+          <w:sz w:val="24"/>
+          <w:szCs w:val="24"/>
+        </w:rPr>
+        <w:t>Are</w:t>
+      </w:r>
+      <w:proofErr w:type="gramEnd"/>
+      <w:r>
+        <w:rPr>
+          <w:sz w:val="24"/>
+          <w:szCs w:val="24"/>
+        </w:rPr>
+        <w:t xml:space="preserve"> the axis labelled? The label is a sentence, so normal sentence capitalisation should be used. If </w:t>
+      </w:r>
+      <w:proofErr w:type="spellStart"/>
+      <w:r>
+        <w:rPr>
+          <w:sz w:val="24"/>
+          <w:szCs w:val="24"/>
+        </w:rPr>
+        <w:t>its</w:t>
+      </w:r>
+      <w:proofErr w:type="spellEnd"/>
+      <w:r>
+        <w:rPr>
+          <w:sz w:val="24"/>
+          <w:szCs w:val="24"/>
+        </w:rPr>
+        <w:t xml:space="preserve"> just one word, use a capital letter.</w:t>
       </w:r>
     </w:p>
     <w:p>
@@ -7329,13 +8631,22 @@
           <w:szCs w:val="24"/>
         </w:rPr>
       </w:pPr>
+      <w:proofErr w:type="gramStart"/>
       <w:r>
         <w:rPr>
           <w:sz w:val="24"/>
           <w:szCs w:val="24"/>
         </w:rPr>
         <w:lastRenderedPageBreak/>
-        <w:t>Do the axis have units? The units should be put in brackets like (m). No other shape of brackets should be used.</w:t>
+        <w:t>Do</w:t>
+      </w:r>
+      <w:proofErr w:type="gramEnd"/>
+      <w:r>
+        <w:rPr>
+          <w:sz w:val="24"/>
+          <w:szCs w:val="24"/>
+        </w:rPr>
+        <w:t xml:space="preserve"> the axis have units? The units should be put in brackets like (m). No other shape of brackets should be used.</w:t>
       </w:r>
     </w:p>
     <w:p>
@@ -7375,7 +8686,23 @@
           <w:sz w:val="24"/>
           <w:szCs w:val="24"/>
         </w:rPr>
-        <w:t>Are subscripts properly typset?</w:t>
+        <w:t xml:space="preserve">Are subscripts properly </w:t>
+      </w:r>
+      <w:proofErr w:type="spellStart"/>
+      <w:r>
+        <w:rPr>
+          <w:sz w:val="24"/>
+          <w:szCs w:val="24"/>
+        </w:rPr>
+        <w:t>typset</w:t>
+      </w:r>
+      <w:proofErr w:type="spellEnd"/>
+      <w:r>
+        <w:rPr>
+          <w:sz w:val="24"/>
+          <w:szCs w:val="24"/>
+        </w:rPr>
+        <w:t>?</w:t>
       </w:r>
     </w:p>
     <w:p>
@@ -7395,7 +8722,39 @@
           <w:sz w:val="24"/>
           <w:szCs w:val="24"/>
         </w:rPr>
-        <w:t>Have standard unit labels been used? A for amps, degree symbols instead of 'deg' etc.</w:t>
+        <w:t xml:space="preserve">Have standard unit labels been used? </w:t>
+      </w:r>
+      <w:proofErr w:type="gramStart"/>
+      <w:r>
+        <w:rPr>
+          <w:sz w:val="24"/>
+          <w:szCs w:val="24"/>
+        </w:rPr>
+        <w:t>A for</w:t>
+      </w:r>
+      <w:proofErr w:type="gramEnd"/>
+      <w:r>
+        <w:rPr>
+          <w:sz w:val="24"/>
+          <w:szCs w:val="24"/>
+        </w:rPr>
+        <w:t xml:space="preserve"> amps, degree symbols instead of '</w:t>
+      </w:r>
+      <w:proofErr w:type="spellStart"/>
+      <w:r>
+        <w:rPr>
+          <w:sz w:val="24"/>
+          <w:szCs w:val="24"/>
+        </w:rPr>
+        <w:t>deg</w:t>
+      </w:r>
+      <w:proofErr w:type="spellEnd"/>
+      <w:r>
+        <w:rPr>
+          <w:sz w:val="24"/>
+          <w:szCs w:val="24"/>
+        </w:rPr>
+        <w:t>' etc.</w:t>
       </w:r>
     </w:p>
     <w:p>
@@ -7435,7 +8794,23 @@
           <w:sz w:val="24"/>
           <w:szCs w:val="24"/>
         </w:rPr>
-        <w:t>Check for spelling mistakes! e.g. freuqency -&gt; frequency.</w:t>
+        <w:t xml:space="preserve">Check for spelling mistakes! e.g. </w:t>
+      </w:r>
+      <w:proofErr w:type="spellStart"/>
+      <w:r>
+        <w:rPr>
+          <w:sz w:val="24"/>
+          <w:szCs w:val="24"/>
+        </w:rPr>
+        <w:t>freuqency</w:t>
+      </w:r>
+      <w:proofErr w:type="spellEnd"/>
+      <w:r>
+        <w:rPr>
+          <w:sz w:val="24"/>
+          <w:szCs w:val="24"/>
+        </w:rPr>
+        <w:t xml:space="preserve"> -&gt; frequency.</w:t>
       </w:r>
     </w:p>
     <w:p>
@@ -7538,7 +8913,23 @@
           <w:sz w:val="24"/>
           <w:szCs w:val="24"/>
         </w:rPr>
-        <w:t>Standard matlab and matplotlib fonts will be used. The following examples give</w:t>
+        <w:t xml:space="preserve">Standard </w:t>
+      </w:r>
+      <w:proofErr w:type="spellStart"/>
+      <w:r>
+        <w:rPr>
+          <w:sz w:val="24"/>
+          <w:szCs w:val="24"/>
+        </w:rPr>
+        <w:t>matlab</w:t>
+      </w:r>
+      <w:proofErr w:type="spellEnd"/>
+      <w:r>
+        <w:rPr>
+          <w:sz w:val="24"/>
+          <w:szCs w:val="24"/>
+        </w:rPr>
+        <w:t xml:space="preserve"> and matplotlib fonts will be used. The following examples give</w:t>
       </w:r>
       <w:r>
         <w:rPr>
@@ -7641,7 +9032,55 @@
           <w:sz w:val="24"/>
           <w:szCs w:val="24"/>
         </w:rPr>
-        <w:t>have ‘shared axis’, only label one of the axis. If it’s the xaxis, then label the bottom one. If it’s the y axis, label the left one.</w:t>
+        <w:t xml:space="preserve">have ‘shared axis’, only label one of the axis. If </w:t>
+      </w:r>
+      <w:proofErr w:type="gramStart"/>
+      <w:r>
+        <w:rPr>
+          <w:sz w:val="24"/>
+          <w:szCs w:val="24"/>
+        </w:rPr>
+        <w:t>it’s</w:t>
+      </w:r>
+      <w:proofErr w:type="gramEnd"/>
+      <w:r>
+        <w:rPr>
+          <w:sz w:val="24"/>
+          <w:szCs w:val="24"/>
+        </w:rPr>
+        <w:t xml:space="preserve"> the </w:t>
+      </w:r>
+      <w:proofErr w:type="spellStart"/>
+      <w:r>
+        <w:rPr>
+          <w:sz w:val="24"/>
+          <w:szCs w:val="24"/>
+        </w:rPr>
+        <w:t>xaxis</w:t>
+      </w:r>
+      <w:proofErr w:type="spellEnd"/>
+      <w:r>
+        <w:rPr>
+          <w:sz w:val="24"/>
+          <w:szCs w:val="24"/>
+        </w:rPr>
+        <w:t xml:space="preserve">, then label the bottom one. If </w:t>
+      </w:r>
+      <w:proofErr w:type="gramStart"/>
+      <w:r>
+        <w:rPr>
+          <w:sz w:val="24"/>
+          <w:szCs w:val="24"/>
+        </w:rPr>
+        <w:t>it’s</w:t>
+      </w:r>
+      <w:proofErr w:type="gramEnd"/>
+      <w:r>
+        <w:rPr>
+          <w:sz w:val="24"/>
+          <w:szCs w:val="24"/>
+        </w:rPr>
+        <w:t xml:space="preserve"> the y axis, label the left one.</w:t>
       </w:r>
     </w:p>
     <w:p>
@@ -7698,7 +9137,23 @@
           <w:sz w:val="24"/>
           <w:szCs w:val="24"/>
         </w:rPr>
-        <w:t xml:space="preserve"> fontsize = </w:t>
+        <w:t xml:space="preserve"> </w:t>
+      </w:r>
+      <w:proofErr w:type="spellStart"/>
+      <w:r>
+        <w:rPr>
+          <w:sz w:val="24"/>
+          <w:szCs w:val="24"/>
+        </w:rPr>
+        <w:t>fontsize</w:t>
+      </w:r>
+      <w:proofErr w:type="spellEnd"/>
+      <w:r>
+        <w:rPr>
+          <w:sz w:val="24"/>
+          <w:szCs w:val="24"/>
+        </w:rPr>
+        <w:t xml:space="preserve"> = </w:t>
       </w:r>
       <w:r>
         <w:rPr>
@@ -7747,14 +9202,46 @@
           <w:sz w:val="24"/>
           <w:szCs w:val="24"/>
         </w:rPr>
-        <w:t>. If the legend looks too big, try splitting it into multiple columns. If this doesn’t work, reduce the</w:t>
-      </w:r>
-      <w:r>
-        <w:rPr>
-          <w:sz w:val="24"/>
-          <w:szCs w:val="24"/>
-        </w:rPr>
-        <w:t xml:space="preserve"> fontsize </w:t>
+        <w:t xml:space="preserve">. If the legend looks too big, try splitting it into multiple columns. If this </w:t>
+      </w:r>
+      <w:proofErr w:type="gramStart"/>
+      <w:r>
+        <w:rPr>
+          <w:sz w:val="24"/>
+          <w:szCs w:val="24"/>
+        </w:rPr>
+        <w:t>doesn’t</w:t>
+      </w:r>
+      <w:proofErr w:type="gramEnd"/>
+      <w:r>
+        <w:rPr>
+          <w:sz w:val="24"/>
+          <w:szCs w:val="24"/>
+        </w:rPr>
+        <w:t xml:space="preserve"> work, reduce the</w:t>
+      </w:r>
+      <w:r>
+        <w:rPr>
+          <w:sz w:val="24"/>
+          <w:szCs w:val="24"/>
+        </w:rPr>
+        <w:t xml:space="preserve"> </w:t>
+      </w:r>
+      <w:proofErr w:type="spellStart"/>
+      <w:r>
+        <w:rPr>
+          <w:sz w:val="24"/>
+          <w:szCs w:val="24"/>
+        </w:rPr>
+        <w:t>fontsize</w:t>
+      </w:r>
+      <w:proofErr w:type="spellEnd"/>
+      <w:r>
+        <w:rPr>
+          <w:sz w:val="24"/>
+          <w:szCs w:val="24"/>
+        </w:rPr>
+        <w:t xml:space="preserve"> </w:t>
       </w:r>
       <w:r>
         <w:rPr>
@@ -7822,20 +9309,30 @@
           <w:szCs w:val="24"/>
         </w:rPr>
       </w:pPr>
+      <w:proofErr w:type="spellStart"/>
       <w:r>
         <w:rPr>
           <w:rFonts w:ascii="SimSun" w:eastAsia="SimSun" w:hAnsi="SimSun"/>
           <w:sz w:val="24"/>
           <w:szCs w:val="24"/>
         </w:rPr>
-        <w:t>figure_size = (6,</w:t>
-      </w:r>
+        <w:t>figure_size</w:t>
+      </w:r>
+      <w:proofErr w:type="spellEnd"/>
       <w:r>
         <w:rPr>
           <w:rFonts w:ascii="SimSun" w:eastAsia="SimSun" w:hAnsi="SimSun"/>
           <w:sz w:val="24"/>
           <w:szCs w:val="24"/>
         </w:rPr>
+        <w:t xml:space="preserve"> = (6,</w:t>
+      </w:r>
+      <w:r>
+        <w:rPr>
+          <w:rFonts w:ascii="SimSun" w:eastAsia="SimSun" w:hAnsi="SimSun"/>
+          <w:sz w:val="24"/>
+          <w:szCs w:val="24"/>
+        </w:rPr>
         <w:t>3.5</w:t>
       </w:r>
       <w:r>
@@ -7855,20 +9352,68 @@
           <w:szCs w:val="24"/>
         </w:rPr>
       </w:pPr>
+      <w:proofErr w:type="spellStart"/>
+      <w:proofErr w:type="gramStart"/>
       <w:r>
         <w:rPr>
           <w:rFonts w:ascii="SimSun" w:eastAsia="SimSun" w:hAnsi="SimSun"/>
           <w:sz w:val="24"/>
           <w:szCs w:val="24"/>
         </w:rPr>
-        <w:t xml:space="preserve">plt.figure(figsize = figure_size,dpi = </w:t>
-      </w:r>
+        <w:t>plt.figure</w:t>
+      </w:r>
+      <w:proofErr w:type="spellEnd"/>
+      <w:proofErr w:type="gramEnd"/>
       <w:r>
         <w:rPr>
           <w:rFonts w:ascii="SimSun" w:eastAsia="SimSun" w:hAnsi="SimSun"/>
           <w:sz w:val="24"/>
           <w:szCs w:val="24"/>
         </w:rPr>
+        <w:t>(</w:t>
+      </w:r>
+      <w:proofErr w:type="spellStart"/>
+      <w:r>
+        <w:rPr>
+          <w:rFonts w:ascii="SimSun" w:eastAsia="SimSun" w:hAnsi="SimSun"/>
+          <w:sz w:val="24"/>
+          <w:szCs w:val="24"/>
+        </w:rPr>
+        <w:t>figsize</w:t>
+      </w:r>
+      <w:proofErr w:type="spellEnd"/>
+      <w:r>
+        <w:rPr>
+          <w:rFonts w:ascii="SimSun" w:eastAsia="SimSun" w:hAnsi="SimSun"/>
+          <w:sz w:val="24"/>
+          <w:szCs w:val="24"/>
+        </w:rPr>
+        <w:t xml:space="preserve"> = </w:t>
+      </w:r>
+      <w:proofErr w:type="spellStart"/>
+      <w:r>
+        <w:rPr>
+          <w:rFonts w:ascii="SimSun" w:eastAsia="SimSun" w:hAnsi="SimSun"/>
+          <w:sz w:val="24"/>
+          <w:szCs w:val="24"/>
+        </w:rPr>
+        <w:t>figure_size,dpi</w:t>
+      </w:r>
+      <w:proofErr w:type="spellEnd"/>
+      <w:r>
+        <w:rPr>
+          <w:rFonts w:ascii="SimSun" w:eastAsia="SimSun" w:hAnsi="SimSun"/>
+          <w:sz w:val="24"/>
+          <w:szCs w:val="24"/>
+        </w:rPr>
+        <w:t xml:space="preserve"> = </w:t>
+      </w:r>
+      <w:r>
+        <w:rPr>
+          <w:rFonts w:ascii="SimSun" w:eastAsia="SimSun" w:hAnsi="SimSun"/>
+          <w:sz w:val="24"/>
+          <w:szCs w:val="24"/>
+        </w:rPr>
         <w:t>15</w:t>
       </w:r>
       <w:r>
@@ -7888,73 +9433,155 @@
           <w:szCs w:val="24"/>
         </w:rPr>
       </w:pPr>
+      <w:proofErr w:type="spellStart"/>
+      <w:proofErr w:type="gramStart"/>
       <w:r>
         <w:rPr>
           <w:rFonts w:ascii="SimSun" w:eastAsia="SimSun" w:hAnsi="SimSun"/>
           <w:sz w:val="24"/>
           <w:szCs w:val="24"/>
         </w:rPr>
-        <w:t>plt.plot(x,y,label = 'Name of line')</w:t>
-      </w:r>
-    </w:p>
-    <w:p>
-      <w:pPr>
+        <w:t>plt.plot</w:t>
+      </w:r>
+      <w:proofErr w:type="spellEnd"/>
+      <w:proofErr w:type="gramEnd"/>
+      <w:r>
         <w:rPr>
           <w:rFonts w:ascii="SimSun" w:eastAsia="SimSun" w:hAnsi="SimSun"/>
           <w:sz w:val="24"/>
           <w:szCs w:val="24"/>
         </w:rPr>
-      </w:pPr>
+        <w:t>(</w:t>
+      </w:r>
+      <w:proofErr w:type="spellStart"/>
       <w:r>
         <w:rPr>
           <w:rFonts w:ascii="SimSun" w:eastAsia="SimSun" w:hAnsi="SimSun"/>
           <w:sz w:val="24"/>
           <w:szCs w:val="24"/>
         </w:rPr>
-        <w:t>plt.legend(prop={'size': 8},loc = 'lower left')</w:t>
-      </w:r>
-    </w:p>
-    <w:p>
-      <w:pPr>
+        <w:t>x,y,label</w:t>
+      </w:r>
+      <w:proofErr w:type="spellEnd"/>
+      <w:r>
         <w:rPr>
           <w:rFonts w:ascii="SimSun" w:eastAsia="SimSun" w:hAnsi="SimSun"/>
           <w:sz w:val="24"/>
           <w:szCs w:val="24"/>
         </w:rPr>
-      </w:pPr>
-      <w:r>
+        <w:t xml:space="preserve"> = 'Name of line')</w:t>
+      </w:r>
+    </w:p>
+    <w:p>
+      <w:pPr>
         <w:rPr>
           <w:rFonts w:ascii="SimSun" w:eastAsia="SimSun" w:hAnsi="SimSun"/>
           <w:sz w:val="24"/>
           <w:szCs w:val="24"/>
         </w:rPr>
-        <w:t>plt.xlabel('x axis (units)'</w:t>
-      </w:r>
+      </w:pPr>
+      <w:proofErr w:type="spellStart"/>
+      <w:proofErr w:type="gramStart"/>
       <w:r>
         <w:rPr>
           <w:rFonts w:ascii="SimSun" w:eastAsia="SimSun" w:hAnsi="SimSun"/>
           <w:sz w:val="24"/>
           <w:szCs w:val="24"/>
         </w:rPr>
+        <w:t>plt.legend</w:t>
+      </w:r>
+      <w:proofErr w:type="spellEnd"/>
+      <w:proofErr w:type="gramEnd"/>
+      <w:r>
+        <w:rPr>
+          <w:rFonts w:ascii="SimSun" w:eastAsia="SimSun" w:hAnsi="SimSun"/>
+          <w:sz w:val="24"/>
+          <w:szCs w:val="24"/>
+        </w:rPr>
+        <w:t>(prop={'size': 8},</w:t>
+      </w:r>
+      <w:proofErr w:type="spellStart"/>
+      <w:r>
+        <w:rPr>
+          <w:rFonts w:ascii="SimSun" w:eastAsia="SimSun" w:hAnsi="SimSun"/>
+          <w:sz w:val="24"/>
+          <w:szCs w:val="24"/>
+        </w:rPr>
+        <w:t>loc</w:t>
+      </w:r>
+      <w:proofErr w:type="spellEnd"/>
+      <w:r>
+        <w:rPr>
+          <w:rFonts w:ascii="SimSun" w:eastAsia="SimSun" w:hAnsi="SimSun"/>
+          <w:sz w:val="24"/>
+          <w:szCs w:val="24"/>
+        </w:rPr>
+        <w:t xml:space="preserve"> = 'lower left')</w:t>
+      </w:r>
+    </w:p>
+    <w:p>
+      <w:pPr>
+        <w:rPr>
+          <w:rFonts w:ascii="SimSun" w:eastAsia="SimSun" w:hAnsi="SimSun"/>
+          <w:sz w:val="24"/>
+          <w:szCs w:val="24"/>
+        </w:rPr>
+      </w:pPr>
+      <w:proofErr w:type="spellStart"/>
+      <w:proofErr w:type="gramStart"/>
+      <w:r>
+        <w:rPr>
+          <w:rFonts w:ascii="SimSun" w:eastAsia="SimSun" w:hAnsi="SimSun"/>
+          <w:sz w:val="24"/>
+          <w:szCs w:val="24"/>
+        </w:rPr>
+        <w:t>plt.xlabel</w:t>
+      </w:r>
+      <w:proofErr w:type="spellEnd"/>
+      <w:proofErr w:type="gramEnd"/>
+      <w:r>
+        <w:rPr>
+          <w:rFonts w:ascii="SimSun" w:eastAsia="SimSun" w:hAnsi="SimSun"/>
+          <w:sz w:val="24"/>
+          <w:szCs w:val="24"/>
+        </w:rPr>
+        <w:t>('x axis (units)'</w:t>
+      </w:r>
+      <w:r>
+        <w:rPr>
+          <w:rFonts w:ascii="SimSun" w:eastAsia="SimSun" w:hAnsi="SimSun"/>
+          <w:sz w:val="24"/>
+          <w:szCs w:val="24"/>
+        </w:rPr>
         <w:t>,</w:t>
       </w:r>
       <w:r>
         <w:t xml:space="preserve"> </w:t>
       </w:r>
+      <w:proofErr w:type="spellStart"/>
       <w:r>
         <w:rPr>
           <w:rFonts w:ascii="SimSun" w:eastAsia="SimSun" w:hAnsi="SimSun"/>
           <w:sz w:val="24"/>
           <w:szCs w:val="24"/>
         </w:rPr>
-        <w:t xml:space="preserve">fontsize = </w:t>
-      </w:r>
+        <w:t>fontsize</w:t>
+      </w:r>
+      <w:proofErr w:type="spellEnd"/>
       <w:r>
         <w:rPr>
           <w:rFonts w:ascii="SimSun" w:eastAsia="SimSun" w:hAnsi="SimSun"/>
           <w:sz w:val="24"/>
           <w:szCs w:val="24"/>
         </w:rPr>
+        <w:t xml:space="preserve"> = </w:t>
+      </w:r>
+      <w:r>
+        <w:rPr>
+          <w:rFonts w:ascii="SimSun" w:eastAsia="SimSun" w:hAnsi="SimSun"/>
+          <w:sz w:val="24"/>
+          <w:szCs w:val="24"/>
+        </w:rPr>
         <w:t>11.5</w:t>
       </w:r>
       <w:r>
@@ -7974,39 +9601,61 @@
           <w:szCs w:val="24"/>
         </w:rPr>
       </w:pPr>
+      <w:proofErr w:type="spellStart"/>
+      <w:proofErr w:type="gramStart"/>
       <w:r>
         <w:rPr>
           <w:rFonts w:ascii="SimSun" w:eastAsia="SimSun" w:hAnsi="SimSun"/>
           <w:sz w:val="24"/>
           <w:szCs w:val="24"/>
         </w:rPr>
-        <w:t>plt.ylabel('y axis (units)'</w:t>
-      </w:r>
+        <w:t>plt.ylabel</w:t>
+      </w:r>
+      <w:proofErr w:type="spellEnd"/>
+      <w:proofErr w:type="gramEnd"/>
       <w:r>
         <w:rPr>
           <w:rFonts w:ascii="SimSun" w:eastAsia="SimSun" w:hAnsi="SimSun"/>
           <w:sz w:val="24"/>
           <w:szCs w:val="24"/>
         </w:rPr>
+        <w:t>('y axis (units)'</w:t>
+      </w:r>
+      <w:r>
+        <w:rPr>
+          <w:rFonts w:ascii="SimSun" w:eastAsia="SimSun" w:hAnsi="SimSun"/>
+          <w:sz w:val="24"/>
+          <w:szCs w:val="24"/>
+        </w:rPr>
         <w:t>,</w:t>
       </w:r>
       <w:r>
         <w:t xml:space="preserve"> </w:t>
       </w:r>
+      <w:proofErr w:type="spellStart"/>
       <w:r>
         <w:rPr>
           <w:rFonts w:ascii="SimSun" w:eastAsia="SimSun" w:hAnsi="SimSun"/>
           <w:sz w:val="24"/>
           <w:szCs w:val="24"/>
         </w:rPr>
-        <w:t xml:space="preserve">fontsize = </w:t>
-      </w:r>
+        <w:t>fontsize</w:t>
+      </w:r>
+      <w:proofErr w:type="spellEnd"/>
       <w:r>
         <w:rPr>
           <w:rFonts w:ascii="SimSun" w:eastAsia="SimSun" w:hAnsi="SimSun"/>
           <w:sz w:val="24"/>
           <w:szCs w:val="24"/>
         </w:rPr>
+        <w:t xml:space="preserve"> = </w:t>
+      </w:r>
+      <w:r>
+        <w:rPr>
+          <w:rFonts w:ascii="SimSun" w:eastAsia="SimSun" w:hAnsi="SimSun"/>
+          <w:sz w:val="24"/>
+          <w:szCs w:val="24"/>
+        </w:rPr>
         <w:t>11.5</w:t>
       </w:r>
       <w:r>
@@ -8026,30 +9675,33 @@
           <w:szCs w:val="24"/>
         </w:rPr>
       </w:pPr>
+      <w:proofErr w:type="spellStart"/>
+      <w:proofErr w:type="gramStart"/>
       <w:r>
         <w:rPr>
           <w:rFonts w:ascii="SimSun" w:eastAsia="SimSun" w:hAnsi="SimSun"/>
           <w:sz w:val="24"/>
           <w:szCs w:val="24"/>
         </w:rPr>
-        <w:t>plt.tight_layout()</w:t>
-      </w:r>
-    </w:p>
-    <w:p>
-      <w:pPr>
+        <w:t>plt.tight</w:t>
+      </w:r>
+      <w:proofErr w:type="gramEnd"/>
+      <w:r>
         <w:rPr>
           <w:rFonts w:ascii="SimSun" w:eastAsia="SimSun" w:hAnsi="SimSun"/>
           <w:sz w:val="24"/>
           <w:szCs w:val="24"/>
         </w:rPr>
-      </w:pPr>
+        <w:t>_layout</w:t>
+      </w:r>
+      <w:proofErr w:type="spellEnd"/>
       <w:r>
         <w:rPr>
           <w:rFonts w:ascii="SimSun" w:eastAsia="SimSun" w:hAnsi="SimSun"/>
           <w:sz w:val="24"/>
           <w:szCs w:val="24"/>
         </w:rPr>
-        <w:t>plt.grid()</w:t>
+        <w:t>()</w:t>
       </w:r>
     </w:p>
     <w:p>
@@ -8060,41 +9712,103 @@
           <w:szCs w:val="24"/>
         </w:rPr>
       </w:pPr>
+      <w:proofErr w:type="spellStart"/>
+      <w:proofErr w:type="gramStart"/>
       <w:r>
         <w:rPr>
           <w:rFonts w:ascii="SimSun" w:eastAsia="SimSun" w:hAnsi="SimSun"/>
           <w:sz w:val="24"/>
           <w:szCs w:val="24"/>
         </w:rPr>
-        <w:t>plt.savefig('sim_chapter_Zoom_in_ETM_tuning.eps')</w:t>
-      </w:r>
-    </w:p>
-    <w:p>
-      <w:pPr>
+        <w:t>plt.grid</w:t>
+      </w:r>
+      <w:proofErr w:type="spellEnd"/>
+      <w:proofErr w:type="gramEnd"/>
+      <w:r>
         <w:rPr>
           <w:rFonts w:ascii="SimSun" w:eastAsia="SimSun" w:hAnsi="SimSun"/>
           <w:sz w:val="24"/>
           <w:szCs w:val="24"/>
         </w:rPr>
-      </w:pPr>
-      <w:r>
+        <w:t>()</w:t>
+      </w:r>
+    </w:p>
+    <w:p>
+      <w:pPr>
         <w:rPr>
           <w:rFonts w:ascii="SimSun" w:eastAsia="SimSun" w:hAnsi="SimSun"/>
           <w:sz w:val="24"/>
           <w:szCs w:val="24"/>
         </w:rPr>
+      </w:pPr>
+      <w:proofErr w:type="spellStart"/>
+      <w:proofErr w:type="gramStart"/>
+      <w:r>
+        <w:rPr>
+          <w:rFonts w:ascii="SimSun" w:eastAsia="SimSun" w:hAnsi="SimSun"/>
+          <w:sz w:val="24"/>
+          <w:szCs w:val="24"/>
+        </w:rPr>
+        <w:t>plt.savefig</w:t>
+      </w:r>
+      <w:proofErr w:type="spellEnd"/>
+      <w:proofErr w:type="gramEnd"/>
+      <w:r>
+        <w:rPr>
+          <w:rFonts w:ascii="SimSun" w:eastAsia="SimSun" w:hAnsi="SimSun"/>
+          <w:sz w:val="24"/>
+          <w:szCs w:val="24"/>
+        </w:rPr>
+        <w:t>('</w:t>
+      </w:r>
+      <w:proofErr w:type="spellStart"/>
+      <w:r>
+        <w:rPr>
+          <w:rFonts w:ascii="SimSun" w:eastAsia="SimSun" w:hAnsi="SimSun"/>
+          <w:sz w:val="24"/>
+          <w:szCs w:val="24"/>
+        </w:rPr>
+        <w:t>sim_chapter_Zoom_in_ETM_tuning.eps</w:t>
+      </w:r>
+      <w:proofErr w:type="spellEnd"/>
+      <w:r>
+        <w:rPr>
+          <w:rFonts w:ascii="SimSun" w:eastAsia="SimSun" w:hAnsi="SimSun"/>
+          <w:sz w:val="24"/>
+          <w:szCs w:val="24"/>
+        </w:rPr>
+        <w:t>')</w:t>
+      </w:r>
+    </w:p>
+    <w:p>
+      <w:pPr>
+        <w:rPr>
+          <w:rFonts w:ascii="SimSun" w:eastAsia="SimSun" w:hAnsi="SimSun"/>
+          <w:sz w:val="24"/>
+          <w:szCs w:val="24"/>
+        </w:rPr>
+      </w:pPr>
+      <w:proofErr w:type="spellStart"/>
+      <w:proofErr w:type="gramStart"/>
+      <w:r>
+        <w:rPr>
+          <w:rFonts w:ascii="SimSun" w:eastAsia="SimSun" w:hAnsi="SimSun"/>
+          <w:sz w:val="24"/>
+          <w:szCs w:val="24"/>
+        </w:rPr>
         <w:lastRenderedPageBreak/>
-        <w:t>plt.show()</w:t>
-      </w:r>
-    </w:p>
-    <w:p>
-      <w:pPr>
+        <w:t>plt.show</w:t>
+      </w:r>
+      <w:proofErr w:type="spellEnd"/>
+      <w:proofErr w:type="gramEnd"/>
+      <w:r>
         <w:rPr>
           <w:rFonts w:ascii="SimSun" w:eastAsia="SimSun" w:hAnsi="SimSun"/>
           <w:sz w:val="24"/>
           <w:szCs w:val="24"/>
         </w:rPr>
-      </w:pPr>
+        <w:t>()</w:t>
+      </w:r>
     </w:p>
     <w:p>
       <w:pPr>
@@ -8104,12 +9818,21 @@
           <w:szCs w:val="24"/>
         </w:rPr>
       </w:pPr>
-      <w:r>
+    </w:p>
+    <w:p>
+      <w:pPr>
         <w:rPr>
           <w:rFonts w:ascii="SimSun" w:eastAsia="SimSun" w:hAnsi="SimSun"/>
           <w:sz w:val="24"/>
           <w:szCs w:val="24"/>
         </w:rPr>
+      </w:pPr>
+      <w:r>
+        <w:rPr>
+          <w:rFonts w:ascii="SimSun" w:eastAsia="SimSun" w:hAnsi="SimSun"/>
+          <w:sz w:val="24"/>
+          <w:szCs w:val="24"/>
+        </w:rPr>
         <w:t>For 2x1 subplots, use</w:t>
       </w:r>
     </w:p>
@@ -8121,13 +9844,43 @@
           <w:szCs w:val="24"/>
         </w:rPr>
       </w:pPr>
+      <w:proofErr w:type="spellStart"/>
+      <w:proofErr w:type="gramStart"/>
       <w:r>
         <w:rPr>
           <w:rFonts w:ascii="SimSun" w:eastAsia="SimSun" w:hAnsi="SimSun"/>
           <w:sz w:val="24"/>
           <w:szCs w:val="24"/>
         </w:rPr>
-        <w:t>plt.figure(figsize=(6, 6), dpi=150)</w:t>
+        <w:t>plt.figure</w:t>
+      </w:r>
+      <w:proofErr w:type="spellEnd"/>
+      <w:proofErr w:type="gramEnd"/>
+      <w:r>
+        <w:rPr>
+          <w:rFonts w:ascii="SimSun" w:eastAsia="SimSun" w:hAnsi="SimSun"/>
+          <w:sz w:val="24"/>
+          <w:szCs w:val="24"/>
+        </w:rPr>
+        <w:t>(</w:t>
+      </w:r>
+      <w:proofErr w:type="spellStart"/>
+      <w:r>
+        <w:rPr>
+          <w:rFonts w:ascii="SimSun" w:eastAsia="SimSun" w:hAnsi="SimSun"/>
+          <w:sz w:val="24"/>
+          <w:szCs w:val="24"/>
+        </w:rPr>
+        <w:t>figsize</w:t>
+      </w:r>
+      <w:proofErr w:type="spellEnd"/>
+      <w:r>
+        <w:rPr>
+          <w:rFonts w:ascii="SimSun" w:eastAsia="SimSun" w:hAnsi="SimSun"/>
+          <w:sz w:val="24"/>
+          <w:szCs w:val="24"/>
+        </w:rPr>
+        <w:t>=(6, 6), dpi=150)</w:t>
       </w:r>
     </w:p>
     <w:p>
@@ -8185,6 +9938,7 @@
           <w:szCs w:val="24"/>
         </w:rPr>
       </w:pPr>
+      <w:proofErr w:type="spellStart"/>
       <w:r>
         <w:rPr>
           <w:rFonts w:asciiTheme="majorHAnsi" w:hAnsiTheme="majorHAnsi"/>
@@ -8195,6 +9949,7 @@
         </w:rPr>
         <w:t>Matlab</w:t>
       </w:r>
+      <w:proofErr w:type="spellEnd"/>
     </w:p>
     <w:p>
       <w:pPr>
@@ -8213,7 +9968,55 @@
           <w:sz w:val="24"/>
           <w:szCs w:val="24"/>
         </w:rPr>
-        <w:t>For matlab figures, use the linspecer (from mathworks file exchange) function to</w:t>
+        <w:t xml:space="preserve">For </w:t>
+      </w:r>
+      <w:proofErr w:type="spellStart"/>
+      <w:r>
+        <w:rPr>
+          <w:sz w:val="24"/>
+          <w:szCs w:val="24"/>
+        </w:rPr>
+        <w:t>matlab</w:t>
+      </w:r>
+      <w:proofErr w:type="spellEnd"/>
+      <w:r>
+        <w:rPr>
+          <w:sz w:val="24"/>
+          <w:szCs w:val="24"/>
+        </w:rPr>
+        <w:t xml:space="preserve"> figures, use the </w:t>
+      </w:r>
+      <w:proofErr w:type="spellStart"/>
+      <w:r>
+        <w:rPr>
+          <w:sz w:val="24"/>
+          <w:szCs w:val="24"/>
+        </w:rPr>
+        <w:t>linspecer</w:t>
+      </w:r>
+      <w:proofErr w:type="spellEnd"/>
+      <w:r>
+        <w:rPr>
+          <w:sz w:val="24"/>
+          <w:szCs w:val="24"/>
+        </w:rPr>
+        <w:t xml:space="preserve"> (from </w:t>
+      </w:r>
+      <w:proofErr w:type="spellStart"/>
+      <w:r>
+        <w:rPr>
+          <w:sz w:val="24"/>
+          <w:szCs w:val="24"/>
+        </w:rPr>
+        <w:t>mathworks</w:t>
+      </w:r>
+      <w:proofErr w:type="spellEnd"/>
+      <w:r>
+        <w:rPr>
+          <w:sz w:val="24"/>
+          <w:szCs w:val="24"/>
+        </w:rPr>
+        <w:t xml:space="preserve"> file exchange) function to</w:t>
       </w:r>
       <w:r>
         <w:rPr>
@@ -8254,8 +10057,9 @@
           <w:sz w:val="24"/>
           <w:szCs w:val="24"/>
         </w:rPr>
-        <w:t>The font should be set to Deja</w:t>
-      </w:r>
+        <w:t xml:space="preserve">The font should be set to </w:t>
+      </w:r>
+      <w:proofErr w:type="spellStart"/>
       <w:r>
         <w:rPr>
           <w:rFonts w:cstheme="minorHAnsi"/>
@@ -8263,7 +10067,7 @@
           <w:sz w:val="24"/>
           <w:szCs w:val="24"/>
         </w:rPr>
-        <w:t xml:space="preserve">Vu Sans, do this with: </w:t>
+        <w:t>Deja</w:t>
       </w:r>
       <w:r>
         <w:rPr>
@@ -8272,15 +10076,92 @@
           <w:sz w:val="24"/>
           <w:szCs w:val="24"/>
         </w:rPr>
-        <w:t>set(gca,</w:t>
-      </w:r>
-      <w:r>
-        <w:rPr>
-          <w:rFonts w:cstheme="minorHAnsi"/>
-          <w:sz w:val="24"/>
-          <w:szCs w:val="24"/>
-        </w:rPr>
-        <w:t>'fontname','DejaVu Sans')</w:t>
+        <w:t>Vu</w:t>
+      </w:r>
+      <w:proofErr w:type="spellEnd"/>
+      <w:r>
+        <w:rPr>
+          <w:rFonts w:cstheme="minorHAnsi"/>
+          <w:color w:val="000000"/>
+          <w:sz w:val="24"/>
+          <w:szCs w:val="24"/>
+        </w:rPr>
+        <w:t xml:space="preserve"> Sans, do this with: </w:t>
+      </w:r>
+      <w:proofErr w:type="gramStart"/>
+      <w:r>
+        <w:rPr>
+          <w:rFonts w:cstheme="minorHAnsi"/>
+          <w:color w:val="000000"/>
+          <w:sz w:val="24"/>
+          <w:szCs w:val="24"/>
+        </w:rPr>
+        <w:t>set(</w:t>
+      </w:r>
+      <w:proofErr w:type="spellStart"/>
+      <w:proofErr w:type="gramEnd"/>
+      <w:r>
+        <w:rPr>
+          <w:rFonts w:cstheme="minorHAnsi"/>
+          <w:color w:val="000000"/>
+          <w:sz w:val="24"/>
+          <w:szCs w:val="24"/>
+        </w:rPr>
+        <w:t>gca</w:t>
+      </w:r>
+      <w:proofErr w:type="spellEnd"/>
+      <w:r>
+        <w:rPr>
+          <w:rFonts w:cstheme="minorHAnsi"/>
+          <w:color w:val="000000"/>
+          <w:sz w:val="24"/>
+          <w:szCs w:val="24"/>
+        </w:rPr>
+        <w:t>,</w:t>
+      </w:r>
+      <w:r>
+        <w:rPr>
+          <w:rFonts w:cstheme="minorHAnsi"/>
+          <w:sz w:val="24"/>
+          <w:szCs w:val="24"/>
+        </w:rPr>
+        <w:t>'</w:t>
+      </w:r>
+      <w:proofErr w:type="spellStart"/>
+      <w:r>
+        <w:rPr>
+          <w:rFonts w:cstheme="minorHAnsi"/>
+          <w:sz w:val="24"/>
+          <w:szCs w:val="24"/>
+        </w:rPr>
+        <w:t>fontname</w:t>
+      </w:r>
+      <w:proofErr w:type="spellEnd"/>
+      <w:r>
+        <w:rPr>
+          <w:rFonts w:cstheme="minorHAnsi"/>
+          <w:sz w:val="24"/>
+          <w:szCs w:val="24"/>
+        </w:rPr>
+        <w:t>','</w:t>
+      </w:r>
+      <w:proofErr w:type="spellStart"/>
+      <w:r>
+        <w:rPr>
+          <w:rFonts w:cstheme="minorHAnsi"/>
+          <w:sz w:val="24"/>
+          <w:szCs w:val="24"/>
+        </w:rPr>
+        <w:t>DejaVu</w:t>
+      </w:r>
+      <w:proofErr w:type="spellEnd"/>
+      <w:r>
+        <w:rPr>
+          <w:rFonts w:cstheme="minorHAnsi"/>
+          <w:sz w:val="24"/>
+          <w:szCs w:val="24"/>
+        </w:rPr>
+        <w:t xml:space="preserve"> Sans')</w:t>
       </w:r>
     </w:p>
     <w:p>
@@ -8310,100 +10191,276 @@
           <w:sz w:val="24"/>
           <w:szCs w:val="24"/>
         </w:rPr>
-        <w:t>c = linspecer(2);</w:t>
-      </w:r>
-    </w:p>
-    <w:p>
-      <w:pPr>
+        <w:t xml:space="preserve">c = </w:t>
+      </w:r>
+      <w:proofErr w:type="spellStart"/>
+      <w:proofErr w:type="gramStart"/>
+      <w:r>
         <w:rPr>
           <w:rFonts w:ascii="SimSun" w:eastAsia="SimSun" w:hAnsi="SimSun"/>
           <w:sz w:val="24"/>
           <w:szCs w:val="24"/>
         </w:rPr>
-      </w:pPr>
+        <w:t>linspecer</w:t>
+      </w:r>
+      <w:proofErr w:type="spellEnd"/>
       <w:r>
         <w:rPr>
           <w:rFonts w:ascii="SimSun" w:eastAsia="SimSun" w:hAnsi="SimSun"/>
           <w:sz w:val="24"/>
           <w:szCs w:val="24"/>
         </w:rPr>
-        <w:t>size = 1.1;</w:t>
-      </w:r>
-    </w:p>
-    <w:p>
-      <w:pPr>
+        <w:t>(</w:t>
+      </w:r>
+      <w:proofErr w:type="gramEnd"/>
+      <w:r>
         <w:rPr>
           <w:rFonts w:ascii="SimSun" w:eastAsia="SimSun" w:hAnsi="SimSun"/>
           <w:sz w:val="24"/>
           <w:szCs w:val="24"/>
         </w:rPr>
-      </w:pPr>
-      <w:r>
+        <w:t>2);</w:t>
+      </w:r>
+    </w:p>
+    <w:p>
+      <w:pPr>
         <w:rPr>
           <w:rFonts w:ascii="SimSun" w:eastAsia="SimSun" w:hAnsi="SimSun"/>
           <w:sz w:val="24"/>
           <w:szCs w:val="24"/>
         </w:rPr>
-        <w:t>aspect_ratio = size.*[6,4];</w:t>
-      </w:r>
-    </w:p>
-    <w:p>
-      <w:pPr>
+      </w:pPr>
+      <w:r>
         <w:rPr>
           <w:rFonts w:ascii="SimSun" w:eastAsia="SimSun" w:hAnsi="SimSun"/>
           <w:sz w:val="24"/>
           <w:szCs w:val="24"/>
         </w:rPr>
-      </w:pPr>
-    </w:p>
-    <w:p>
-      <w:pPr>
+        <w:t xml:space="preserve">size = </w:t>
+      </w:r>
+      <w:proofErr w:type="gramStart"/>
+      <w:r>
         <w:rPr>
           <w:rFonts w:ascii="SimSun" w:eastAsia="SimSun" w:hAnsi="SimSun"/>
           <w:sz w:val="24"/>
           <w:szCs w:val="24"/>
         </w:rPr>
-      </w:pPr>
-      <w:r>
+        <w:t>1.1;</w:t>
+      </w:r>
+      <w:proofErr w:type="gramEnd"/>
+    </w:p>
+    <w:p>
+      <w:pPr>
         <w:rPr>
           <w:rFonts w:ascii="SimSun" w:eastAsia="SimSun" w:hAnsi="SimSun"/>
           <w:sz w:val="24"/>
           <w:szCs w:val="24"/>
         </w:rPr>
-        <w:t>figure('Name','dark noise','units','inches','position',[0 0 aspect_ratio(1) aspect_ratio(2)])</w:t>
-      </w:r>
-    </w:p>
-    <w:p>
-      <w:pPr>
+      </w:pPr>
+      <w:proofErr w:type="spellStart"/>
+      <w:r>
         <w:rPr>
           <w:rFonts w:ascii="SimSun" w:eastAsia="SimSun" w:hAnsi="SimSun"/>
           <w:sz w:val="24"/>
           <w:szCs w:val="24"/>
         </w:rPr>
-      </w:pPr>
+        <w:t>aspect_ratio</w:t>
+      </w:r>
+      <w:proofErr w:type="spellEnd"/>
       <w:r>
         <w:rPr>
           <w:rFonts w:ascii="SimSun" w:eastAsia="SimSun" w:hAnsi="SimSun"/>
           <w:sz w:val="24"/>
           <w:szCs w:val="24"/>
         </w:rPr>
-        <w:t>loglog(x1, y1, 'color',c(1,:))</w:t>
-      </w:r>
-    </w:p>
-    <w:p>
-      <w:pPr>
+        <w:t xml:space="preserve"> = </w:t>
+      </w:r>
+      <w:proofErr w:type="gramStart"/>
+      <w:r>
         <w:rPr>
           <w:rFonts w:ascii="SimSun" w:eastAsia="SimSun" w:hAnsi="SimSun"/>
           <w:sz w:val="24"/>
           <w:szCs w:val="24"/>
         </w:rPr>
-      </w:pPr>
+        <w:t>size.*</w:t>
+      </w:r>
+      <w:proofErr w:type="gramEnd"/>
       <w:r>
         <w:rPr>
           <w:rFonts w:ascii="SimSun" w:eastAsia="SimSun" w:hAnsi="SimSun"/>
           <w:sz w:val="24"/>
           <w:szCs w:val="24"/>
         </w:rPr>
+        <w:t>[6,4];</w:t>
+      </w:r>
+    </w:p>
+    <w:p>
+      <w:pPr>
+        <w:rPr>
+          <w:rFonts w:ascii="SimSun" w:eastAsia="SimSun" w:hAnsi="SimSun"/>
+          <w:sz w:val="24"/>
+          <w:szCs w:val="24"/>
+        </w:rPr>
+      </w:pPr>
+    </w:p>
+    <w:p>
+      <w:pPr>
+        <w:rPr>
+          <w:rFonts w:ascii="SimSun" w:eastAsia="SimSun" w:hAnsi="SimSun"/>
+          <w:sz w:val="24"/>
+          <w:szCs w:val="24"/>
+        </w:rPr>
+      </w:pPr>
+      <w:proofErr w:type="gramStart"/>
+      <w:r>
+        <w:rPr>
+          <w:rFonts w:ascii="SimSun" w:eastAsia="SimSun" w:hAnsi="SimSun"/>
+          <w:sz w:val="24"/>
+          <w:szCs w:val="24"/>
+        </w:rPr>
+        <w:t>figure(</w:t>
+      </w:r>
+      <w:proofErr w:type="gramEnd"/>
+      <w:r>
+        <w:rPr>
+          <w:rFonts w:ascii="SimSun" w:eastAsia="SimSun" w:hAnsi="SimSun"/>
+          <w:sz w:val="24"/>
+          <w:szCs w:val="24"/>
+        </w:rPr>
+        <w:t>'</w:t>
+      </w:r>
+      <w:proofErr w:type="spellStart"/>
+      <w:r>
+        <w:rPr>
+          <w:rFonts w:ascii="SimSun" w:eastAsia="SimSun" w:hAnsi="SimSun"/>
+          <w:sz w:val="24"/>
+          <w:szCs w:val="24"/>
+        </w:rPr>
+        <w:t>Name','dark</w:t>
+      </w:r>
+      <w:proofErr w:type="spellEnd"/>
+      <w:r>
+        <w:rPr>
+          <w:rFonts w:ascii="SimSun" w:eastAsia="SimSun" w:hAnsi="SimSun"/>
+          <w:sz w:val="24"/>
+          <w:szCs w:val="24"/>
+        </w:rPr>
+        <w:t xml:space="preserve"> </w:t>
+      </w:r>
+      <w:proofErr w:type="spellStart"/>
+      <w:r>
+        <w:rPr>
+          <w:rFonts w:ascii="SimSun" w:eastAsia="SimSun" w:hAnsi="SimSun"/>
+          <w:sz w:val="24"/>
+          <w:szCs w:val="24"/>
+        </w:rPr>
+        <w:t>noise','units','inches','position</w:t>
+      </w:r>
+      <w:proofErr w:type="spellEnd"/>
+      <w:r>
+        <w:rPr>
+          <w:rFonts w:ascii="SimSun" w:eastAsia="SimSun" w:hAnsi="SimSun"/>
+          <w:sz w:val="24"/>
+          <w:szCs w:val="24"/>
+        </w:rPr>
+        <w:t xml:space="preserve">',[0 0 </w:t>
+      </w:r>
+      <w:proofErr w:type="spellStart"/>
+      <w:r>
+        <w:rPr>
+          <w:rFonts w:ascii="SimSun" w:eastAsia="SimSun" w:hAnsi="SimSun"/>
+          <w:sz w:val="24"/>
+          <w:szCs w:val="24"/>
+        </w:rPr>
+        <w:t>aspect_ratio</w:t>
+      </w:r>
+      <w:proofErr w:type="spellEnd"/>
+      <w:r>
+        <w:rPr>
+          <w:rFonts w:ascii="SimSun" w:eastAsia="SimSun" w:hAnsi="SimSun"/>
+          <w:sz w:val="24"/>
+          <w:szCs w:val="24"/>
+        </w:rPr>
+        <w:t xml:space="preserve">(1) </w:t>
+      </w:r>
+      <w:proofErr w:type="spellStart"/>
+      <w:r>
+        <w:rPr>
+          <w:rFonts w:ascii="SimSun" w:eastAsia="SimSun" w:hAnsi="SimSun"/>
+          <w:sz w:val="24"/>
+          <w:szCs w:val="24"/>
+        </w:rPr>
+        <w:t>aspect_ratio</w:t>
+      </w:r>
+      <w:proofErr w:type="spellEnd"/>
+      <w:r>
+        <w:rPr>
+          <w:rFonts w:ascii="SimSun" w:eastAsia="SimSun" w:hAnsi="SimSun"/>
+          <w:sz w:val="24"/>
+          <w:szCs w:val="24"/>
+        </w:rPr>
+        <w:t>(2)])</w:t>
+      </w:r>
+    </w:p>
+    <w:p>
+      <w:pPr>
+        <w:rPr>
+          <w:rFonts w:ascii="SimSun" w:eastAsia="SimSun" w:hAnsi="SimSun"/>
+          <w:sz w:val="24"/>
+          <w:szCs w:val="24"/>
+        </w:rPr>
+      </w:pPr>
+      <w:proofErr w:type="gramStart"/>
+      <w:r>
+        <w:rPr>
+          <w:rFonts w:ascii="SimSun" w:eastAsia="SimSun" w:hAnsi="SimSun"/>
+          <w:sz w:val="24"/>
+          <w:szCs w:val="24"/>
+        </w:rPr>
+        <w:t>loglog(</w:t>
+      </w:r>
+      <w:proofErr w:type="gramEnd"/>
+      <w:r>
+        <w:rPr>
+          <w:rFonts w:ascii="SimSun" w:eastAsia="SimSun" w:hAnsi="SimSun"/>
+          <w:sz w:val="24"/>
+          <w:szCs w:val="24"/>
+        </w:rPr>
+        <w:t>x1, y1, '</w:t>
+      </w:r>
+      <w:proofErr w:type="spellStart"/>
+      <w:r>
+        <w:rPr>
+          <w:rFonts w:ascii="SimSun" w:eastAsia="SimSun" w:hAnsi="SimSun"/>
+          <w:sz w:val="24"/>
+          <w:szCs w:val="24"/>
+        </w:rPr>
+        <w:t>color</w:t>
+      </w:r>
+      <w:proofErr w:type="spellEnd"/>
+      <w:r>
+        <w:rPr>
+          <w:rFonts w:ascii="SimSun" w:eastAsia="SimSun" w:hAnsi="SimSun"/>
+          <w:sz w:val="24"/>
+          <w:szCs w:val="24"/>
+        </w:rPr>
+        <w:t>',c(1,:))</w:t>
+      </w:r>
+    </w:p>
+    <w:p>
+      <w:pPr>
+        <w:rPr>
+          <w:rFonts w:ascii="SimSun" w:eastAsia="SimSun" w:hAnsi="SimSun"/>
+          <w:sz w:val="24"/>
+          <w:szCs w:val="24"/>
+        </w:rPr>
+      </w:pPr>
+      <w:r>
+        <w:rPr>
+          <w:rFonts w:ascii="SimSun" w:eastAsia="SimSun" w:hAnsi="SimSun"/>
+          <w:sz w:val="24"/>
+          <w:szCs w:val="24"/>
+        </w:rPr>
         <w:t>hold on</w:t>
       </w:r>
     </w:p>
@@ -8415,29 +10472,57 @@
           <w:szCs w:val="24"/>
         </w:rPr>
       </w:pPr>
+      <w:proofErr w:type="gramStart"/>
       <w:r>
         <w:rPr>
           <w:rFonts w:ascii="SimSun" w:eastAsia="SimSun" w:hAnsi="SimSun"/>
           <w:sz w:val="24"/>
           <w:szCs w:val="24"/>
         </w:rPr>
-        <w:t>loglog(x2, y2, 'color',c(2,:))</w:t>
-      </w:r>
-    </w:p>
-    <w:p>
-      <w:pPr>
+        <w:t>loglog(</w:t>
+      </w:r>
+      <w:proofErr w:type="gramEnd"/>
+      <w:r>
         <w:rPr>
           <w:rFonts w:ascii="SimSun" w:eastAsia="SimSun" w:hAnsi="SimSun"/>
           <w:sz w:val="24"/>
           <w:szCs w:val="24"/>
         </w:rPr>
-      </w:pPr>
+        <w:t>x2, y2, '</w:t>
+      </w:r>
+      <w:proofErr w:type="spellStart"/>
       <w:r>
         <w:rPr>
           <w:rFonts w:ascii="SimSun" w:eastAsia="SimSun" w:hAnsi="SimSun"/>
           <w:sz w:val="24"/>
           <w:szCs w:val="24"/>
         </w:rPr>
+        <w:t>color</w:t>
+      </w:r>
+      <w:proofErr w:type="spellEnd"/>
+      <w:r>
+        <w:rPr>
+          <w:rFonts w:ascii="SimSun" w:eastAsia="SimSun" w:hAnsi="SimSun"/>
+          <w:sz w:val="24"/>
+          <w:szCs w:val="24"/>
+        </w:rPr>
+        <w:t>',c(2,:))</w:t>
+      </w:r>
+    </w:p>
+    <w:p>
+      <w:pPr>
+        <w:rPr>
+          <w:rFonts w:ascii="SimSun" w:eastAsia="SimSun" w:hAnsi="SimSun"/>
+          <w:sz w:val="24"/>
+          <w:szCs w:val="24"/>
+        </w:rPr>
+      </w:pPr>
+      <w:r>
+        <w:rPr>
+          <w:rFonts w:ascii="SimSun" w:eastAsia="SimSun" w:hAnsi="SimSun"/>
+          <w:sz w:val="24"/>
+          <w:szCs w:val="24"/>
+        </w:rPr>
         <w:t>hold off</w:t>
       </w:r>
     </w:p>
@@ -8466,30 +10551,33 @@
           <w:szCs w:val="24"/>
         </w:rPr>
       </w:pPr>
+      <w:proofErr w:type="spellStart"/>
+      <w:proofErr w:type="gramStart"/>
       <w:r>
         <w:rPr>
           <w:rFonts w:ascii="SimSun" w:eastAsia="SimSun" w:hAnsi="SimSun"/>
           <w:sz w:val="24"/>
           <w:szCs w:val="24"/>
         </w:rPr>
-        <w:t>xlabel('Frequency (Hz)')</w:t>
-      </w:r>
-    </w:p>
-    <w:p>
-      <w:pPr>
+        <w:t>xlabel</w:t>
+      </w:r>
+      <w:proofErr w:type="spellEnd"/>
+      <w:r>
         <w:rPr>
           <w:rFonts w:ascii="SimSun" w:eastAsia="SimSun" w:hAnsi="SimSun"/>
           <w:sz w:val="24"/>
           <w:szCs w:val="24"/>
         </w:rPr>
-      </w:pPr>
+        <w:t>(</w:t>
+      </w:r>
+      <w:proofErr w:type="gramEnd"/>
       <w:r>
         <w:rPr>
           <w:rFonts w:ascii="SimSun" w:eastAsia="SimSun" w:hAnsi="SimSun"/>
           <w:sz w:val="24"/>
           <w:szCs w:val="24"/>
         </w:rPr>
-        <w:t>ylabel('I_r_m_s/\surd(Hz)')</w:t>
+        <w:t>'Frequency (Hz)')</w:t>
       </w:r>
     </w:p>
     <w:p>
@@ -8500,6 +10588,70 @@
           <w:szCs w:val="24"/>
         </w:rPr>
       </w:pPr>
+      <w:proofErr w:type="spellStart"/>
+      <w:r>
+        <w:rPr>
+          <w:rFonts w:ascii="SimSun" w:eastAsia="SimSun" w:hAnsi="SimSun"/>
+          <w:sz w:val="24"/>
+          <w:szCs w:val="24"/>
+        </w:rPr>
+        <w:t>ylabel</w:t>
+      </w:r>
+      <w:proofErr w:type="spellEnd"/>
+      <w:r>
+        <w:rPr>
+          <w:rFonts w:ascii="SimSun" w:eastAsia="SimSun" w:hAnsi="SimSun"/>
+          <w:sz w:val="24"/>
+          <w:szCs w:val="24"/>
+        </w:rPr>
+        <w:t>('</w:t>
+      </w:r>
+      <w:proofErr w:type="spellStart"/>
+      <w:r>
+        <w:rPr>
+          <w:rFonts w:ascii="SimSun" w:eastAsia="SimSun" w:hAnsi="SimSun"/>
+          <w:sz w:val="24"/>
+          <w:szCs w:val="24"/>
+        </w:rPr>
+        <w:t>I_r_m_s</w:t>
+      </w:r>
+      <w:proofErr w:type="spellEnd"/>
+      <w:r>
+        <w:rPr>
+          <w:rFonts w:ascii="SimSun" w:eastAsia="SimSun" w:hAnsi="SimSun"/>
+          <w:sz w:val="24"/>
+          <w:szCs w:val="24"/>
+        </w:rPr>
+        <w:t>/\</w:t>
+      </w:r>
+      <w:proofErr w:type="gramStart"/>
+      <w:r>
+        <w:rPr>
+          <w:rFonts w:ascii="SimSun" w:eastAsia="SimSun" w:hAnsi="SimSun"/>
+          <w:sz w:val="24"/>
+          <w:szCs w:val="24"/>
+        </w:rPr>
+        <w:t>surd(</w:t>
+      </w:r>
+      <w:proofErr w:type="gramEnd"/>
+      <w:r>
+        <w:rPr>
+          <w:rFonts w:ascii="SimSun" w:eastAsia="SimSun" w:hAnsi="SimSun"/>
+          <w:sz w:val="24"/>
+          <w:szCs w:val="24"/>
+        </w:rPr>
+        <w:t>Hz)')</w:t>
+      </w:r>
+    </w:p>
+    <w:p>
+      <w:pPr>
+        <w:rPr>
+          <w:rFonts w:ascii="SimSun" w:eastAsia="SimSun" w:hAnsi="SimSun"/>
+          <w:sz w:val="24"/>
+          <w:szCs w:val="24"/>
+        </w:rPr>
+      </w:pPr>
+      <w:proofErr w:type="gramStart"/>
       <w:r>
         <w:rPr>
           <w:rFonts w:ascii="SimSun" w:eastAsia="SimSun" w:hAnsi="SimSun" w:cs="Courier New"/>
@@ -8507,16 +10659,10 @@
           <w:sz w:val="24"/>
           <w:szCs w:val="24"/>
         </w:rPr>
-        <w:t>set(gca,</w:t>
-      </w:r>
-      <w:r>
-        <w:rPr>
-          <w:rFonts w:ascii="SimSun" w:eastAsia="SimSun" w:hAnsi="SimSun" w:cs="Courier New"/>
-          <w:sz w:val="24"/>
-          <w:szCs w:val="24"/>
-        </w:rPr>
-        <w:t>'fontname','DejaVu Sans'</w:t>
-      </w:r>
+        <w:t>set(</w:t>
+      </w:r>
+      <w:proofErr w:type="spellStart"/>
+      <w:proofErr w:type="gramEnd"/>
       <w:r>
         <w:rPr>
           <w:rFonts w:ascii="SimSun" w:eastAsia="SimSun" w:hAnsi="SimSun" w:cs="Courier New"/>
@@ -8524,6 +10670,69 @@
           <w:sz w:val="24"/>
           <w:szCs w:val="24"/>
         </w:rPr>
+        <w:t>gca</w:t>
+      </w:r>
+      <w:proofErr w:type="spellEnd"/>
+      <w:r>
+        <w:rPr>
+          <w:rFonts w:ascii="SimSun" w:eastAsia="SimSun" w:hAnsi="SimSun" w:cs="Courier New"/>
+          <w:color w:val="000000"/>
+          <w:sz w:val="24"/>
+          <w:szCs w:val="24"/>
+        </w:rPr>
+        <w:t>,</w:t>
+      </w:r>
+      <w:r>
+        <w:rPr>
+          <w:rFonts w:ascii="SimSun" w:eastAsia="SimSun" w:hAnsi="SimSun" w:cs="Courier New"/>
+          <w:sz w:val="24"/>
+          <w:szCs w:val="24"/>
+        </w:rPr>
+        <w:t>'</w:t>
+      </w:r>
+      <w:proofErr w:type="spellStart"/>
+      <w:r>
+        <w:rPr>
+          <w:rFonts w:ascii="SimSun" w:eastAsia="SimSun" w:hAnsi="SimSun" w:cs="Courier New"/>
+          <w:sz w:val="24"/>
+          <w:szCs w:val="24"/>
+        </w:rPr>
+        <w:t>fontname</w:t>
+      </w:r>
+      <w:proofErr w:type="spellEnd"/>
+      <w:r>
+        <w:rPr>
+          <w:rFonts w:ascii="SimSun" w:eastAsia="SimSun" w:hAnsi="SimSun" w:cs="Courier New"/>
+          <w:sz w:val="24"/>
+          <w:szCs w:val="24"/>
+        </w:rPr>
+        <w:t>','</w:t>
+      </w:r>
+      <w:proofErr w:type="spellStart"/>
+      <w:r>
+        <w:rPr>
+          <w:rFonts w:ascii="SimSun" w:eastAsia="SimSun" w:hAnsi="SimSun" w:cs="Courier New"/>
+          <w:sz w:val="24"/>
+          <w:szCs w:val="24"/>
+        </w:rPr>
+        <w:t>DejaVu</w:t>
+      </w:r>
+      <w:proofErr w:type="spellEnd"/>
+      <w:r>
+        <w:rPr>
+          <w:rFonts w:ascii="SimSun" w:eastAsia="SimSun" w:hAnsi="SimSun" w:cs="Courier New"/>
+          <w:sz w:val="24"/>
+          <w:szCs w:val="24"/>
+        </w:rPr>
+        <w:t xml:space="preserve"> Sans'</w:t>
+      </w:r>
+      <w:r>
+        <w:rPr>
+          <w:rFonts w:ascii="SimSun" w:eastAsia="SimSun" w:hAnsi="SimSun" w:cs="Courier New"/>
+          <w:color w:val="000000"/>
+          <w:sz w:val="24"/>
+          <w:szCs w:val="24"/>
+        </w:rPr>
         <w:t>)</w:t>
       </w:r>
     </w:p>
@@ -8575,7 +10784,25 @@
           <w:sz w:val="24"/>
           <w:szCs w:val="24"/>
         </w:rPr>
-        <w:t>print('Noise_low_f','-depsc')</w:t>
+        <w:t>print('Noise_low_f','-</w:t>
+      </w:r>
+      <w:proofErr w:type="spellStart"/>
+      <w:r>
+        <w:rPr>
+          <w:rFonts w:ascii="SimSun" w:eastAsia="SimSun" w:hAnsi="SimSun"/>
+          <w:sz w:val="24"/>
+          <w:szCs w:val="24"/>
+        </w:rPr>
+        <w:t>depsc</w:t>
+      </w:r>
+      <w:proofErr w:type="spellEnd"/>
+      <w:r>
+        <w:rPr>
+          <w:rFonts w:ascii="SimSun" w:eastAsia="SimSun" w:hAnsi="SimSun"/>
+          <w:sz w:val="24"/>
+          <w:szCs w:val="24"/>
+        </w:rPr>
+        <w:t>')</w:t>
       </w:r>
     </w:p>
     <w:p>
@@ -8681,7 +10908,23 @@
           <w:sz w:val="24"/>
           <w:szCs w:val="24"/>
         </w:rPr>
-        <w:t>have gnd at the bottom of the diagram.</w:t>
+        <w:t xml:space="preserve">have </w:t>
+      </w:r>
+      <w:proofErr w:type="spellStart"/>
+      <w:r>
+        <w:rPr>
+          <w:sz w:val="24"/>
+          <w:szCs w:val="24"/>
+        </w:rPr>
+        <w:t>gnd</w:t>
+      </w:r>
+      <w:proofErr w:type="spellEnd"/>
+      <w:r>
+        <w:rPr>
+          <w:sz w:val="24"/>
+          <w:szCs w:val="24"/>
+        </w:rPr>
+        <w:t xml:space="preserve"> at the bottom of the diagram.</w:t>
       </w:r>
     </w:p>
     <w:p>
@@ -8797,7 +11040,39 @@
           <w:sz w:val="24"/>
           <w:szCs w:val="24"/>
         </w:rPr>
-        <w:t xml:space="preserve">Edit with GIMP, save as xcf and jpeg. The xcf allows for re-editing. Jpeg is good for photos, </w:t>
+        <w:t xml:space="preserve">Edit with GIMP, save as </w:t>
+      </w:r>
+      <w:proofErr w:type="spellStart"/>
+      <w:r>
+        <w:rPr>
+          <w:sz w:val="24"/>
+          <w:szCs w:val="24"/>
+        </w:rPr>
+        <w:t>xcf</w:t>
+      </w:r>
+      <w:proofErr w:type="spellEnd"/>
+      <w:r>
+        <w:rPr>
+          <w:sz w:val="24"/>
+          <w:szCs w:val="24"/>
+        </w:rPr>
+        <w:t xml:space="preserve"> and jpeg. The </w:t>
+      </w:r>
+      <w:proofErr w:type="spellStart"/>
+      <w:r>
+        <w:rPr>
+          <w:sz w:val="24"/>
+          <w:szCs w:val="24"/>
+        </w:rPr>
+        <w:t>xcf</w:t>
+      </w:r>
+      <w:proofErr w:type="spellEnd"/>
+      <w:r>
+        <w:rPr>
+          <w:sz w:val="24"/>
+          <w:szCs w:val="24"/>
+        </w:rPr>
+        <w:t xml:space="preserve"> allows for re-editing. Jpeg is good for photos, </w:t>
       </w:r>
       <w:r>
         <w:rPr>
@@ -9112,13 +11387,41 @@
         </w:rPr>
         <w:t xml:space="preserve">Writing is linear, the knowledge in your head is not. </w:t>
       </w:r>
-      <w:r>
-        <w:rPr>
-          <w:rFonts w:cstheme="minorHAnsi"/>
-          <w:sz w:val="24"/>
-          <w:szCs w:val="24"/>
-        </w:rPr>
-        <w:t>Its an interconnected tangle of ideas, concepts and insights.</w:t>
+      <w:proofErr w:type="spellStart"/>
+      <w:r>
+        <w:rPr>
+          <w:rFonts w:cstheme="minorHAnsi"/>
+          <w:sz w:val="24"/>
+          <w:szCs w:val="24"/>
+        </w:rPr>
+        <w:t>Its</w:t>
+      </w:r>
+      <w:proofErr w:type="spellEnd"/>
+      <w:r>
+        <w:rPr>
+          <w:rFonts w:cstheme="minorHAnsi"/>
+          <w:sz w:val="24"/>
+          <w:szCs w:val="24"/>
+        </w:rPr>
+        <w:t xml:space="preserve"> an interconnected tangle of ideas, </w:t>
+      </w:r>
+      <w:proofErr w:type="gramStart"/>
+      <w:r>
+        <w:rPr>
+          <w:rFonts w:cstheme="minorHAnsi"/>
+          <w:sz w:val="24"/>
+          <w:szCs w:val="24"/>
+        </w:rPr>
+        <w:t>concepts</w:t>
+      </w:r>
+      <w:proofErr w:type="gramEnd"/>
+      <w:r>
+        <w:rPr>
+          <w:rFonts w:cstheme="minorHAnsi"/>
+          <w:sz w:val="24"/>
+          <w:szCs w:val="24"/>
+        </w:rPr>
+        <w:t xml:space="preserve"> and insights.</w:t>
       </w:r>
     </w:p>
     <w:p>
@@ -9250,7 +11553,25 @@
           <w:sz w:val="24"/>
           <w:szCs w:val="24"/>
         </w:rPr>
-        <w:t>done to approach the problem. Explain a need to approach it differently or expand on whats been done. Finally say what you will do.</w:t>
+        <w:t xml:space="preserve">done to approach the problem. Explain a need to approach it differently or expand on </w:t>
+      </w:r>
+      <w:proofErr w:type="spellStart"/>
+      <w:r>
+        <w:rPr>
+          <w:rFonts w:cstheme="minorHAnsi"/>
+          <w:sz w:val="24"/>
+          <w:szCs w:val="24"/>
+        </w:rPr>
+        <w:t>whats</w:t>
+      </w:r>
+      <w:proofErr w:type="spellEnd"/>
+      <w:r>
+        <w:rPr>
+          <w:rFonts w:cstheme="minorHAnsi"/>
+          <w:sz w:val="24"/>
+          <w:szCs w:val="24"/>
+        </w:rPr>
+        <w:t xml:space="preserve"> been done. Finally say what you will do.</w:t>
       </w:r>
     </w:p>
     <w:p>
@@ -9302,7 +11623,27 @@
           <w:sz w:val="24"/>
           <w:szCs w:val="24"/>
         </w:rPr>
-        <w:t xml:space="preserve">The structure acts as a scaffold. It can be modular, and changing structure wont break the </w:t>
+        <w:t xml:space="preserve">The structure acts as a scaffold. It can be modular, and changing structure </w:t>
+      </w:r>
+      <w:proofErr w:type="spellStart"/>
+      <w:proofErr w:type="gramStart"/>
+      <w:r>
+        <w:rPr>
+          <w:rFonts w:cstheme="minorHAnsi"/>
+          <w:sz w:val="24"/>
+          <w:szCs w:val="24"/>
+        </w:rPr>
+        <w:t>wont</w:t>
+      </w:r>
+      <w:proofErr w:type="spellEnd"/>
+      <w:proofErr w:type="gramEnd"/>
+      <w:r>
+        <w:rPr>
+          <w:rFonts w:cstheme="minorHAnsi"/>
+          <w:sz w:val="24"/>
+          <w:szCs w:val="24"/>
+        </w:rPr>
+        <w:t xml:space="preserve"> break the </w:t>
       </w:r>
       <w:r>
         <w:rPr>
@@ -9486,7 +11827,25 @@
           <w:sz w:val="24"/>
           <w:szCs w:val="24"/>
         </w:rPr>
-        <w:t xml:space="preserve"> and how it fits into this. Is it a new situation? A new problems?</w:t>
+        <w:t xml:space="preserve"> and how it fits into this. Is it a new situation? A </w:t>
+      </w:r>
+      <w:proofErr w:type="gramStart"/>
+      <w:r>
+        <w:rPr>
+          <w:rFonts w:cstheme="minorHAnsi"/>
+          <w:sz w:val="24"/>
+          <w:szCs w:val="24"/>
+        </w:rPr>
+        <w:t>new problems</w:t>
+      </w:r>
+      <w:proofErr w:type="gramEnd"/>
+      <w:r>
+        <w:rPr>
+          <w:rFonts w:cstheme="minorHAnsi"/>
+          <w:sz w:val="24"/>
+          <w:szCs w:val="24"/>
+        </w:rPr>
+        <w:t>?</w:t>
       </w:r>
     </w:p>
     <w:p>
@@ -9520,7 +11879,25 @@
           <w:sz w:val="24"/>
           <w:szCs w:val="24"/>
         </w:rPr>
-        <w:t xml:space="preserve"> E.g:</w:t>
+        <w:t xml:space="preserve"> </w:t>
+      </w:r>
+      <w:proofErr w:type="spellStart"/>
+      <w:r>
+        <w:rPr>
+          <w:rFonts w:cstheme="minorHAnsi"/>
+          <w:sz w:val="24"/>
+          <w:szCs w:val="24"/>
+        </w:rPr>
+        <w:t>E.g</w:t>
+      </w:r>
+      <w:proofErr w:type="spellEnd"/>
+      <w:r>
+        <w:rPr>
+          <w:rFonts w:cstheme="minorHAnsi"/>
+          <w:sz w:val="24"/>
+          <w:szCs w:val="24"/>
+        </w:rPr>
+        <w:t>:</w:t>
       </w:r>
     </w:p>
     <w:p>
@@ -9614,7 +11991,25 @@
           <w:sz w:val="24"/>
           <w:szCs w:val="24"/>
         </w:rPr>
-        <w:t>It was only with the discover in 1967 of .. by Hibbert that</w:t>
+        <w:t>It was only with the discover in 1967 of</w:t>
+      </w:r>
+      <w:proofErr w:type="gramStart"/>
+      <w:r>
+        <w:rPr>
+          <w:rFonts w:cstheme="minorHAnsi"/>
+          <w:sz w:val="24"/>
+          <w:szCs w:val="24"/>
+        </w:rPr>
+        <w:t xml:space="preserve"> ..</w:t>
+      </w:r>
+      <w:proofErr w:type="gramEnd"/>
+      <w:r>
+        <w:rPr>
+          <w:rFonts w:cstheme="minorHAnsi"/>
+          <w:sz w:val="24"/>
+          <w:szCs w:val="24"/>
+        </w:rPr>
+        <w:t xml:space="preserve"> by Hibbert that</w:t>
       </w:r>
       <w:r>
         <w:rPr>
@@ -9733,7 +12128,25 @@
           <w:sz w:val="24"/>
           <w:szCs w:val="24"/>
         </w:rPr>
-        <w:t xml:space="preserve">You don’t need to show how much </w:t>
+        <w:t xml:space="preserve">You </w:t>
+      </w:r>
+      <w:proofErr w:type="gramStart"/>
+      <w:r>
+        <w:rPr>
+          <w:rFonts w:cstheme="minorHAnsi"/>
+          <w:sz w:val="24"/>
+          <w:szCs w:val="24"/>
+        </w:rPr>
+        <w:t>don’t</w:t>
+      </w:r>
+      <w:proofErr w:type="gramEnd"/>
+      <w:r>
+        <w:rPr>
+          <w:rFonts w:cstheme="minorHAnsi"/>
+          <w:sz w:val="24"/>
+          <w:szCs w:val="24"/>
+        </w:rPr>
+        <w:t xml:space="preserve"> need to show how much </w:t>
       </w:r>
       <w:r>
         <w:rPr>
@@ -9903,7 +12316,25 @@
           <w:sz w:val="24"/>
           <w:szCs w:val="24"/>
         </w:rPr>
-        <w:t xml:space="preserve">missing key info for the examiner results in you writing about stuff you don’t know about. What happens is you can attract difficult questions. If you write what you know, you choose the ground you will be defending. </w:t>
+        <w:t xml:space="preserve">missing key info for the examiner results in you writing about stuff you </w:t>
+      </w:r>
+      <w:proofErr w:type="gramStart"/>
+      <w:r>
+        <w:rPr>
+          <w:rFonts w:cstheme="minorHAnsi"/>
+          <w:sz w:val="24"/>
+          <w:szCs w:val="24"/>
+        </w:rPr>
+        <w:t>don’t</w:t>
+      </w:r>
+      <w:proofErr w:type="gramEnd"/>
+      <w:r>
+        <w:rPr>
+          <w:rFonts w:cstheme="minorHAnsi"/>
+          <w:sz w:val="24"/>
+          <w:szCs w:val="24"/>
+        </w:rPr>
+        <w:t xml:space="preserve"> know about. What happens is you can attract difficult questions. If you write what you know, you choose the ground you will be defending. </w:t>
       </w:r>
     </w:p>
     <w:p>
@@ -10003,7 +12434,43 @@
           <w:sz w:val="24"/>
           <w:szCs w:val="24"/>
         </w:rPr>
-        <w:t>Stick with the thing you’re writing. If a hard thing to write comes up, keep going through it. Otherwise, you end up with a bunch of really hard stuff to write at the end.</w:t>
+        <w:t xml:space="preserve">Stick with the thing </w:t>
+      </w:r>
+      <w:proofErr w:type="gramStart"/>
+      <w:r>
+        <w:rPr>
+          <w:rFonts w:cstheme="minorHAnsi"/>
+          <w:sz w:val="24"/>
+          <w:szCs w:val="24"/>
+        </w:rPr>
+        <w:t>you’re</w:t>
+      </w:r>
+      <w:proofErr w:type="gramEnd"/>
+      <w:r>
+        <w:rPr>
+          <w:rFonts w:cstheme="minorHAnsi"/>
+          <w:sz w:val="24"/>
+          <w:szCs w:val="24"/>
+        </w:rPr>
+        <w:t xml:space="preserve"> writing. If a hard thing to write comes up, keep going through it. Otherwise, you end up with a bunch of </w:t>
+      </w:r>
+      <w:proofErr w:type="gramStart"/>
+      <w:r>
+        <w:rPr>
+          <w:rFonts w:cstheme="minorHAnsi"/>
+          <w:sz w:val="24"/>
+          <w:szCs w:val="24"/>
+        </w:rPr>
+        <w:t>really hard</w:t>
+      </w:r>
+      <w:proofErr w:type="gramEnd"/>
+      <w:r>
+        <w:rPr>
+          <w:rFonts w:cstheme="minorHAnsi"/>
+          <w:sz w:val="24"/>
+          <w:szCs w:val="24"/>
+        </w:rPr>
+        <w:t xml:space="preserve"> stuff to write at the end.</w:t>
       </w:r>
       <w:r>
         <w:rPr>
@@ -10019,7 +12486,25 @@
           <w:sz w:val="24"/>
           <w:szCs w:val="24"/>
         </w:rPr>
-        <w:t xml:space="preserve"> You don’t develop the skill of solving problems over time. </w:t>
+        <w:t xml:space="preserve"> You </w:t>
+      </w:r>
+      <w:proofErr w:type="gramStart"/>
+      <w:r>
+        <w:rPr>
+          <w:rFonts w:cstheme="minorHAnsi"/>
+          <w:sz w:val="24"/>
+          <w:szCs w:val="24"/>
+        </w:rPr>
+        <w:t>don’t</w:t>
+      </w:r>
+      <w:proofErr w:type="gramEnd"/>
+      <w:r>
+        <w:rPr>
+          <w:rFonts w:cstheme="minorHAnsi"/>
+          <w:sz w:val="24"/>
+          <w:szCs w:val="24"/>
+        </w:rPr>
+        <w:t xml:space="preserve"> develop the skill of solving problems over time. </w:t>
       </w:r>
     </w:p>
     <w:p>
@@ -10053,15 +12538,69 @@
           <w:sz w:val="24"/>
           <w:szCs w:val="24"/>
         </w:rPr>
-        <w:t>Focus on one problem at a time, don’t jump about. To solve the problem, consider your options and make a decision.</w:t>
-      </w:r>
-      <w:r>
-        <w:rPr>
-          <w:rFonts w:cstheme="minorHAnsi"/>
-          <w:sz w:val="24"/>
-          <w:szCs w:val="24"/>
-        </w:rPr>
-        <w:t xml:space="preserve"> Imagine you’re writing a section. You have an unbroken chain of paragraphs which have the cause/effect structure. You hit a diffic</w:t>
+        <w:t xml:space="preserve">Focus on one problem at a time, </w:t>
+      </w:r>
+      <w:proofErr w:type="gramStart"/>
+      <w:r>
+        <w:rPr>
+          <w:rFonts w:cstheme="minorHAnsi"/>
+          <w:sz w:val="24"/>
+          <w:szCs w:val="24"/>
+        </w:rPr>
+        <w:t>don’t</w:t>
+      </w:r>
+      <w:proofErr w:type="gramEnd"/>
+      <w:r>
+        <w:rPr>
+          <w:rFonts w:cstheme="minorHAnsi"/>
+          <w:sz w:val="24"/>
+          <w:szCs w:val="24"/>
+        </w:rPr>
+        <w:t xml:space="preserve"> jump about. To solve the problem, consider your options and </w:t>
+      </w:r>
+      <w:proofErr w:type="gramStart"/>
+      <w:r>
+        <w:rPr>
+          <w:rFonts w:cstheme="minorHAnsi"/>
+          <w:sz w:val="24"/>
+          <w:szCs w:val="24"/>
+        </w:rPr>
+        <w:t>make a decision</w:t>
+      </w:r>
+      <w:proofErr w:type="gramEnd"/>
+      <w:r>
+        <w:rPr>
+          <w:rFonts w:cstheme="minorHAnsi"/>
+          <w:sz w:val="24"/>
+          <w:szCs w:val="24"/>
+        </w:rPr>
+        <w:t>.</w:t>
+      </w:r>
+      <w:r>
+        <w:rPr>
+          <w:rFonts w:cstheme="minorHAnsi"/>
+          <w:sz w:val="24"/>
+          <w:szCs w:val="24"/>
+        </w:rPr>
+        <w:t xml:space="preserve"> Imagine </w:t>
+      </w:r>
+      <w:proofErr w:type="gramStart"/>
+      <w:r>
+        <w:rPr>
+          <w:rFonts w:cstheme="minorHAnsi"/>
+          <w:sz w:val="24"/>
+          <w:szCs w:val="24"/>
+        </w:rPr>
+        <w:t>you’re</w:t>
+      </w:r>
+      <w:proofErr w:type="gramEnd"/>
+      <w:r>
+        <w:rPr>
+          <w:rFonts w:cstheme="minorHAnsi"/>
+          <w:sz w:val="24"/>
+          <w:szCs w:val="24"/>
+        </w:rPr>
+        <w:t xml:space="preserve"> writing a section. You have an unbroken chain of paragraphs which have the cause/effect structure. You hit a diffic</w:t>
       </w:r>
       <w:r>
         <w:rPr>
@@ -10111,7 +12650,25 @@
           <w:sz w:val="24"/>
           <w:szCs w:val="24"/>
         </w:rPr>
-        <w:t>Find the write words until you find the right way of saying it.</w:t>
+        <w:t xml:space="preserve">Find the </w:t>
+      </w:r>
+      <w:proofErr w:type="spellStart"/>
+      <w:r>
+        <w:rPr>
+          <w:rFonts w:cstheme="minorHAnsi"/>
+          <w:sz w:val="24"/>
+          <w:szCs w:val="24"/>
+        </w:rPr>
+        <w:t>write</w:t>
+      </w:r>
+      <w:proofErr w:type="spellEnd"/>
+      <w:r>
+        <w:rPr>
+          <w:rFonts w:cstheme="minorHAnsi"/>
+          <w:sz w:val="24"/>
+          <w:szCs w:val="24"/>
+        </w:rPr>
+        <w:t xml:space="preserve"> words until you find the right way of saying it.</w:t>
       </w:r>
     </w:p>
     <w:p>
@@ -10153,7 +12710,25 @@
           <w:sz w:val="24"/>
           <w:szCs w:val="24"/>
         </w:rPr>
-        <w:t xml:space="preserve"> i.e. don’t include the idea. </w:t>
+        <w:t xml:space="preserve"> i.e. </w:t>
+      </w:r>
+      <w:proofErr w:type="gramStart"/>
+      <w:r>
+        <w:rPr>
+          <w:rFonts w:cstheme="minorHAnsi"/>
+          <w:sz w:val="24"/>
+          <w:szCs w:val="24"/>
+        </w:rPr>
+        <w:t>don’t</w:t>
+      </w:r>
+      <w:proofErr w:type="gramEnd"/>
+      <w:r>
+        <w:rPr>
+          <w:rFonts w:cstheme="minorHAnsi"/>
+          <w:sz w:val="24"/>
+          <w:szCs w:val="24"/>
+        </w:rPr>
+        <w:t xml:space="preserve"> include the idea. </w:t>
       </w:r>
     </w:p>
     <w:p>
@@ -10257,7 +12832,25 @@
           <w:sz w:val="24"/>
           <w:szCs w:val="24"/>
         </w:rPr>
-        <w:t>Metaphor, its like digging a tunnel</w:t>
+        <w:t xml:space="preserve">Metaphor, </w:t>
+      </w:r>
+      <w:proofErr w:type="spellStart"/>
+      <w:r>
+        <w:rPr>
+          <w:rFonts w:cstheme="minorHAnsi"/>
+          <w:sz w:val="24"/>
+          <w:szCs w:val="24"/>
+        </w:rPr>
+        <w:t>its</w:t>
+      </w:r>
+      <w:proofErr w:type="spellEnd"/>
+      <w:r>
+        <w:rPr>
+          <w:rFonts w:cstheme="minorHAnsi"/>
+          <w:sz w:val="24"/>
+          <w:szCs w:val="24"/>
+        </w:rPr>
+        <w:t xml:space="preserve"> like digging a tunnel</w:t>
       </w:r>
       <w:r>
         <w:rPr>
@@ -10308,7 +12901,25 @@
           <w:sz w:val="24"/>
           <w:szCs w:val="24"/>
         </w:rPr>
-        <w:t xml:space="preserve"> It’s a scale.</w:t>
+        <w:t xml:space="preserve"> </w:t>
+      </w:r>
+      <w:proofErr w:type="gramStart"/>
+      <w:r>
+        <w:rPr>
+          <w:rFonts w:cstheme="minorHAnsi"/>
+          <w:sz w:val="24"/>
+          <w:szCs w:val="24"/>
+        </w:rPr>
+        <w:t>It’s</w:t>
+      </w:r>
+      <w:proofErr w:type="gramEnd"/>
+      <w:r>
+        <w:rPr>
+          <w:rFonts w:cstheme="minorHAnsi"/>
+          <w:sz w:val="24"/>
+          <w:szCs w:val="24"/>
+        </w:rPr>
+        <w:t xml:space="preserve"> a scale.</w:t>
       </w:r>
     </w:p>
     <w:p>
@@ -10470,7 +13081,43 @@
           <w:sz w:val="24"/>
           <w:szCs w:val="24"/>
         </w:rPr>
-        <w:t>The solution to perfectionism is to adjust where you area on the scale. Give care and attention but do not worry about the end result.</w:t>
+        <w:t xml:space="preserve">The solution to perfectionism is to adjust where </w:t>
+      </w:r>
+      <w:proofErr w:type="gramStart"/>
+      <w:r>
+        <w:rPr>
+          <w:rFonts w:cstheme="minorHAnsi"/>
+          <w:sz w:val="24"/>
+          <w:szCs w:val="24"/>
+        </w:rPr>
+        <w:t>you</w:t>
+      </w:r>
+      <w:proofErr w:type="gramEnd"/>
+      <w:r>
+        <w:rPr>
+          <w:rFonts w:cstheme="minorHAnsi"/>
+          <w:sz w:val="24"/>
+          <w:szCs w:val="24"/>
+        </w:rPr>
+        <w:t xml:space="preserve"> area on the scale. Give care and attention but do not worry about </w:t>
+      </w:r>
+      <w:proofErr w:type="gramStart"/>
+      <w:r>
+        <w:rPr>
+          <w:rFonts w:cstheme="minorHAnsi"/>
+          <w:sz w:val="24"/>
+          <w:szCs w:val="24"/>
+        </w:rPr>
+        <w:t>the end result</w:t>
+      </w:r>
+      <w:proofErr w:type="gramEnd"/>
+      <w:r>
+        <w:rPr>
+          <w:rFonts w:cstheme="minorHAnsi"/>
+          <w:sz w:val="24"/>
+          <w:szCs w:val="24"/>
+        </w:rPr>
+        <w:t>.</w:t>
       </w:r>
       <w:r>
         <w:rPr>
@@ -10704,7 +13351,25 @@
           <w:sz w:val="24"/>
           <w:szCs w:val="24"/>
         </w:rPr>
-        <w:t xml:space="preserve">Control area is when you’re talking about stuff you’ve </w:t>
+        <w:t xml:space="preserve">Control area is when </w:t>
+      </w:r>
+      <w:proofErr w:type="gramStart"/>
+      <w:r>
+        <w:rPr>
+          <w:rFonts w:cstheme="minorHAnsi"/>
+          <w:sz w:val="24"/>
+          <w:szCs w:val="24"/>
+        </w:rPr>
+        <w:t>you’re</w:t>
+      </w:r>
+      <w:proofErr w:type="gramEnd"/>
+      <w:r>
+        <w:rPr>
+          <w:rFonts w:cstheme="minorHAnsi"/>
+          <w:sz w:val="24"/>
+          <w:szCs w:val="24"/>
+        </w:rPr>
+        <w:t xml:space="preserve"> talking about stuff you’ve </w:t>
       </w:r>
       <w:r>
         <w:rPr>
@@ -10746,7 +13411,25 @@
           <w:sz w:val="24"/>
           <w:szCs w:val="24"/>
         </w:rPr>
-        <w:t>Anxiety area is when you’re not sure what you’re talking about.</w:t>
+        <w:t xml:space="preserve">Anxiety area is when </w:t>
+      </w:r>
+      <w:proofErr w:type="gramStart"/>
+      <w:r>
+        <w:rPr>
+          <w:rFonts w:cstheme="minorHAnsi"/>
+          <w:sz w:val="24"/>
+          <w:szCs w:val="24"/>
+        </w:rPr>
+        <w:t>you’re</w:t>
+      </w:r>
+      <w:proofErr w:type="gramEnd"/>
+      <w:r>
+        <w:rPr>
+          <w:rFonts w:cstheme="minorHAnsi"/>
+          <w:sz w:val="24"/>
+          <w:szCs w:val="24"/>
+        </w:rPr>
+        <w:t xml:space="preserve"> not sure what you’re talking about.</w:t>
       </w:r>
     </w:p>
     <w:p>
@@ -10993,7 +13676,25 @@
           <w:sz w:val="24"/>
           <w:szCs w:val="24"/>
         </w:rPr>
-        <w:t xml:space="preserve">Confidence is made by skill, however you can’t be certain with the end result. You can have </w:t>
+        <w:t xml:space="preserve">Confidence is made by </w:t>
+      </w:r>
+      <w:proofErr w:type="gramStart"/>
+      <w:r>
+        <w:rPr>
+          <w:rFonts w:cstheme="minorHAnsi"/>
+          <w:sz w:val="24"/>
+          <w:szCs w:val="24"/>
+        </w:rPr>
+        <w:t>skill,</w:t>
+      </w:r>
+      <w:proofErr w:type="gramEnd"/>
+      <w:r>
+        <w:rPr>
+          <w:rFonts w:cstheme="minorHAnsi"/>
+          <w:sz w:val="24"/>
+          <w:szCs w:val="24"/>
+        </w:rPr>
+        <w:t xml:space="preserve"> however you can’t be certain with the end result. You can have </w:t>
       </w:r>
       <w:r>
         <w:rPr>
@@ -11253,32 +13954,135 @@
           <w:sz w:val="24"/>
           <w:szCs w:val="24"/>
         </w:rPr>
-        <w:t xml:space="preserve"> There is no single thing that is writers block. Its an effect that has multiple causes. </w:t>
-      </w:r>
-      <w:r>
-        <w:rPr>
-          <w:rFonts w:cstheme="minorHAnsi"/>
-          <w:sz w:val="24"/>
-          <w:szCs w:val="24"/>
-        </w:rPr>
-        <w:t xml:space="preserve">It can be caused by difficult ideas, take time and understand the idea. </w:t>
-      </w:r>
-      <w:r>
-        <w:rPr>
-          <w:rFonts w:cstheme="minorHAnsi"/>
-          <w:sz w:val="24"/>
-          <w:szCs w:val="24"/>
-        </w:rPr>
-        <w:t xml:space="preserve">It can happen because you’re tired, solution is to take a break. It could be fear, </w:t>
-      </w:r>
-      <w:r>
-        <w:rPr>
-          <w:rFonts w:cstheme="minorHAnsi"/>
-          <w:sz w:val="24"/>
-          <w:szCs w:val="24"/>
-        </w:rPr>
-        <w:t xml:space="preserve">work on confidence. It could be perfectionism, adjust where you are on the scale. It could be a preparation thing, you need to complete some analysis. </w:t>
-      </w:r>
+        <w:t xml:space="preserve"> There is no single thing that is </w:t>
+      </w:r>
+      <w:proofErr w:type="gramStart"/>
+      <w:r>
+        <w:rPr>
+          <w:rFonts w:cstheme="minorHAnsi"/>
+          <w:sz w:val="24"/>
+          <w:szCs w:val="24"/>
+        </w:rPr>
+        <w:t>writers</w:t>
+      </w:r>
+      <w:proofErr w:type="gramEnd"/>
+      <w:r>
+        <w:rPr>
+          <w:rFonts w:cstheme="minorHAnsi"/>
+          <w:sz w:val="24"/>
+          <w:szCs w:val="24"/>
+        </w:rPr>
+        <w:t xml:space="preserve"> block. </w:t>
+      </w:r>
+      <w:proofErr w:type="spellStart"/>
+      <w:r>
+        <w:rPr>
+          <w:rFonts w:cstheme="minorHAnsi"/>
+          <w:sz w:val="24"/>
+          <w:szCs w:val="24"/>
+        </w:rPr>
+        <w:t>Its</w:t>
+      </w:r>
+      <w:proofErr w:type="spellEnd"/>
+      <w:r>
+        <w:rPr>
+          <w:rFonts w:cstheme="minorHAnsi"/>
+          <w:sz w:val="24"/>
+          <w:szCs w:val="24"/>
+        </w:rPr>
+        <w:t xml:space="preserve"> an effect that has multiple causes. </w:t>
+      </w:r>
+      <w:r>
+        <w:rPr>
+          <w:rFonts w:cstheme="minorHAnsi"/>
+          <w:sz w:val="24"/>
+          <w:szCs w:val="24"/>
+        </w:rPr>
+        <w:t xml:space="preserve">It can be caused by difficult ideas, take </w:t>
+      </w:r>
+      <w:proofErr w:type="gramStart"/>
+      <w:r>
+        <w:rPr>
+          <w:rFonts w:cstheme="minorHAnsi"/>
+          <w:sz w:val="24"/>
+          <w:szCs w:val="24"/>
+        </w:rPr>
+        <w:t>time</w:t>
+      </w:r>
+      <w:proofErr w:type="gramEnd"/>
+      <w:r>
+        <w:rPr>
+          <w:rFonts w:cstheme="minorHAnsi"/>
+          <w:sz w:val="24"/>
+          <w:szCs w:val="24"/>
+        </w:rPr>
+        <w:t xml:space="preserve"> and understand the idea. </w:t>
+      </w:r>
+      <w:r>
+        <w:rPr>
+          <w:rFonts w:cstheme="minorHAnsi"/>
+          <w:sz w:val="24"/>
+          <w:szCs w:val="24"/>
+        </w:rPr>
+        <w:t xml:space="preserve">It can happen because </w:t>
+      </w:r>
+      <w:proofErr w:type="gramStart"/>
+      <w:r>
+        <w:rPr>
+          <w:rFonts w:cstheme="minorHAnsi"/>
+          <w:sz w:val="24"/>
+          <w:szCs w:val="24"/>
+        </w:rPr>
+        <w:t>you’re</w:t>
+      </w:r>
+      <w:proofErr w:type="gramEnd"/>
+      <w:r>
+        <w:rPr>
+          <w:rFonts w:cstheme="minorHAnsi"/>
+          <w:sz w:val="24"/>
+          <w:szCs w:val="24"/>
+        </w:rPr>
+        <w:t xml:space="preserve"> tired, solution is to take a break. It could be fear, </w:t>
+      </w:r>
+      <w:r>
+        <w:rPr>
+          <w:rFonts w:cstheme="minorHAnsi"/>
+          <w:sz w:val="24"/>
+          <w:szCs w:val="24"/>
+        </w:rPr>
+        <w:t xml:space="preserve">work on confidence. It could be perfectionism, adjust where you are on the scale. It could be a preparation </w:t>
+      </w:r>
+      <w:proofErr w:type="gramStart"/>
+      <w:r>
+        <w:rPr>
+          <w:rFonts w:cstheme="minorHAnsi"/>
+          <w:sz w:val="24"/>
+          <w:szCs w:val="24"/>
+        </w:rPr>
+        <w:t>thing,</w:t>
+      </w:r>
+      <w:proofErr w:type="gramEnd"/>
+      <w:r>
+        <w:rPr>
+          <w:rFonts w:cstheme="minorHAnsi"/>
+          <w:sz w:val="24"/>
+          <w:szCs w:val="24"/>
+        </w:rPr>
+        <w:t xml:space="preserve"> you need to complete some analysis. </w:t>
+      </w:r>
+    </w:p>
+    <w:p>
+      <w:pPr>
+        <w:autoSpaceDE w:val="0"/>
+        <w:autoSpaceDN w:val="0"/>
+        <w:adjustRightInd w:val="0"/>
+        <w:spacing w:after="0" w:line="240" w:lineRule="auto"/>
+        <w:rPr>
+          <w:rFonts w:cstheme="minorHAnsi"/>
+          <w:sz w:val="24"/>
+          <w:szCs w:val="24"/>
+        </w:rPr>
+      </w:pPr>
     </w:p>
     <w:p>
       <w:pPr>

</xml_diff>

<commit_message>
Made edits to chapter 2 and chapter 3
</commit_message>
<xml_diff>
--- a/Structuring.docx
+++ b/Structuring.docx
@@ -6595,6 +6595,26 @@
       <w:pPr>
         <w:pStyle w:val="ListParagraph"/>
         <w:numPr>
+          <w:ilvl w:val="1"/>
+          <w:numId w:val="6"/>
+        </w:numPr>
+        <w:rPr>
+          <w:sz w:val="24"/>
+          <w:szCs w:val="24"/>
+        </w:rPr>
+      </w:pPr>
+      <w:r>
+        <w:rPr>
+          <w:sz w:val="24"/>
+          <w:szCs w:val="24"/>
+        </w:rPr>
+        <w:t>set up/set-up -&gt; setup</w:t>
+      </w:r>
+    </w:p>
+    <w:p>
+      <w:pPr>
+        <w:pStyle w:val="ListParagraph"/>
+        <w:numPr>
           <w:ilvl w:val="0"/>
           <w:numId w:val="6"/>
         </w:numPr>
@@ -7123,6 +7143,210 @@
           <w:szCs w:val="24"/>
         </w:rPr>
         <w:t>Will be -&gt; check the tense!</w:t>
+      </w:r>
+    </w:p>
+    <w:p>
+      <w:pPr>
+        <w:pStyle w:val="ListParagraph"/>
+        <w:numPr>
+          <w:ilvl w:val="0"/>
+          <w:numId w:val="6"/>
+        </w:numPr>
+        <w:rPr>
+          <w:sz w:val="24"/>
+          <w:szCs w:val="24"/>
+        </w:rPr>
+      </w:pPr>
+      <w:r>
+        <w:rPr>
+          <w:sz w:val="24"/>
+          <w:szCs w:val="24"/>
+        </w:rPr>
+        <w:t>Size of and amounts of-&gt; is the thing already a quantity</w:t>
+      </w:r>
+      <w:r>
+        <w:rPr>
+          <w:sz w:val="24"/>
+          <w:szCs w:val="24"/>
+        </w:rPr>
+        <w:t>.</w:t>
+      </w:r>
+    </w:p>
+    <w:p>
+      <w:pPr>
+        <w:pStyle w:val="ListParagraph"/>
+        <w:numPr>
+          <w:ilvl w:val="0"/>
+          <w:numId w:val="6"/>
+        </w:numPr>
+        <w:rPr>
+          <w:sz w:val="24"/>
+          <w:szCs w:val="24"/>
+        </w:rPr>
+      </w:pPr>
+      <w:r>
+        <w:rPr>
+          <w:sz w:val="24"/>
+          <w:szCs w:val="24"/>
+        </w:rPr>
+        <w:t>Out of -&gt; from ?</w:t>
+      </w:r>
+    </w:p>
+    <w:p>
+      <w:pPr>
+        <w:pStyle w:val="ListParagraph"/>
+        <w:numPr>
+          <w:ilvl w:val="0"/>
+          <w:numId w:val="6"/>
+        </w:numPr>
+        <w:rPr>
+          <w:sz w:val="24"/>
+          <w:szCs w:val="24"/>
+        </w:rPr>
+      </w:pPr>
+      <w:r>
+        <w:rPr>
+          <w:sz w:val="24"/>
+          <w:szCs w:val="24"/>
+        </w:rPr>
+        <w:t>Used to = Vague verb</w:t>
+      </w:r>
+      <w:r>
+        <w:rPr>
+          <w:sz w:val="24"/>
+          <w:szCs w:val="24"/>
+        </w:rPr>
+        <w:t>. X is used to do Y vs. X is for Y’ing.</w:t>
+      </w:r>
+    </w:p>
+    <w:p>
+      <w:pPr>
+        <w:pStyle w:val="ListParagraph"/>
+        <w:numPr>
+          <w:ilvl w:val="0"/>
+          <w:numId w:val="6"/>
+        </w:numPr>
+        <w:rPr>
+          <w:sz w:val="24"/>
+          <w:szCs w:val="24"/>
+        </w:rPr>
+      </w:pPr>
+      <w:r>
+        <w:rPr>
+          <w:sz w:val="24"/>
+          <w:szCs w:val="24"/>
+        </w:rPr>
+        <w:t>Look for ending a sentence with a preposition (at, from</w:t>
+      </w:r>
+      <w:r>
+        <w:rPr>
+          <w:sz w:val="24"/>
+          <w:szCs w:val="24"/>
+        </w:rPr>
+        <w:t>, to</w:t>
+      </w:r>
+      <w:r>
+        <w:rPr>
+          <w:sz w:val="24"/>
+          <w:szCs w:val="24"/>
+        </w:rPr>
+        <w:t>, on, with, as</w:t>
+      </w:r>
+      <w:r>
+        <w:rPr>
+          <w:sz w:val="24"/>
+          <w:szCs w:val="24"/>
+        </w:rPr>
+        <w:t>, up etc…</w:t>
+      </w:r>
+      <w:r>
+        <w:rPr>
+          <w:sz w:val="24"/>
+          <w:szCs w:val="24"/>
+        </w:rPr>
+        <w:t>)</w:t>
+      </w:r>
+    </w:p>
+    <w:p>
+      <w:pPr>
+        <w:pStyle w:val="ListParagraph"/>
+        <w:numPr>
+          <w:ilvl w:val="0"/>
+          <w:numId w:val="6"/>
+        </w:numPr>
+        <w:rPr>
+          <w:sz w:val="24"/>
+          <w:szCs w:val="24"/>
+        </w:rPr>
+      </w:pPr>
+      <w:r>
+        <w:rPr>
+          <w:sz w:val="24"/>
+          <w:szCs w:val="24"/>
+        </w:rPr>
+        <w:t xml:space="preserve">Check if there are any </w:t>
+      </w:r>
+      <w:r>
+        <w:rPr>
+          <w:sz w:val="24"/>
+          <w:szCs w:val="24"/>
+        </w:rPr>
+        <w:t>plurals/groups with an ‘</w:t>
+      </w:r>
+      <w:r>
+        <w:rPr>
+          <w:sz w:val="24"/>
+          <w:szCs w:val="24"/>
+        </w:rPr>
+        <w:t>is</w:t>
+      </w:r>
+      <w:r>
+        <w:rPr>
+          <w:sz w:val="24"/>
+          <w:szCs w:val="24"/>
+        </w:rPr>
+        <w:t>’. is</w:t>
+      </w:r>
+      <w:r>
+        <w:rPr>
+          <w:sz w:val="24"/>
+          <w:szCs w:val="24"/>
+        </w:rPr>
+        <w:t xml:space="preserve"> -&gt; are</w:t>
+      </w:r>
+      <w:r>
+        <w:rPr>
+          <w:sz w:val="24"/>
+          <w:szCs w:val="24"/>
+        </w:rPr>
+        <w:t>.</w:t>
+      </w:r>
+    </w:p>
+    <w:p>
+      <w:pPr>
+        <w:pStyle w:val="ListParagraph"/>
+        <w:numPr>
+          <w:ilvl w:val="0"/>
+          <w:numId w:val="6"/>
+        </w:numPr>
+        <w:rPr>
+          <w:sz w:val="24"/>
+          <w:szCs w:val="24"/>
+        </w:rPr>
+      </w:pPr>
+      <w:r>
+        <w:rPr>
+          <w:sz w:val="24"/>
+          <w:szCs w:val="24"/>
+        </w:rPr>
+        <w:t>Look for is are/ are is</w:t>
+      </w:r>
+      <w:r>
+        <w:rPr>
+          <w:sz w:val="24"/>
+          <w:szCs w:val="24"/>
+        </w:rPr>
+        <w:t>.</w:t>
       </w:r>
     </w:p>
     <w:p>
@@ -7246,6 +7470,7 @@
           <w:sz w:val="24"/>
           <w:szCs w:val="24"/>
         </w:rPr>
+        <w:lastRenderedPageBreak/>
         <w:t>Figure names shall be 'chapter description'_chapter_'figure description'. For</w:t>
       </w:r>
       <w:r>
@@ -7374,7 +7599,6 @@
           <w:sz w:val="24"/>
           <w:szCs w:val="24"/>
         </w:rPr>
-        <w:lastRenderedPageBreak/>
         <w:t>Do the axis have units? The units should be put in brackets like (m). No other shape of brackets should be used.</w:t>
       </w:r>
     </w:p>
@@ -7951,6 +8175,7 @@
           <w:sz w:val="24"/>
           <w:szCs w:val="24"/>
         </w:rPr>
+        <w:lastRenderedPageBreak/>
         <w:t>plt.legend(prop={'size': 8},loc = 'lower left')</w:t>
       </w:r>
     </w:p>
@@ -8123,7 +8348,6 @@
           <w:sz w:val="24"/>
           <w:szCs w:val="24"/>
         </w:rPr>
-        <w:lastRenderedPageBreak/>
         <w:t>plt.show()</w:t>
       </w:r>
     </w:p>
@@ -8512,6 +8736,7 @@
           <w:sz w:val="24"/>
           <w:szCs w:val="24"/>
         </w:rPr>
+        <w:lastRenderedPageBreak/>
         <w:t>xlabel('Frequency (Hz)')</w:t>
       </w:r>
     </w:p>
@@ -9410,6 +9635,7 @@
           <w:sz w:val="24"/>
           <w:szCs w:val="24"/>
         </w:rPr>
+        <w:lastRenderedPageBreak/>
         <w:t>C</w:t>
       </w:r>
       <w:r>
@@ -9704,7 +9930,6 @@
           <w:sz w:val="24"/>
           <w:szCs w:val="24"/>
         </w:rPr>
-        <w:lastRenderedPageBreak/>
         <w:t>This led to the development of an entirely new theory of X, based on the idea that…</w:t>
       </w:r>
       <w:r>
@@ -10340,6 +10565,7 @@
           <w:sz w:val="24"/>
           <w:szCs w:val="24"/>
         </w:rPr>
+        <w:lastRenderedPageBreak/>
         <w:t>What about perfection?</w:t>
       </w:r>
       <w:r>
@@ -11012,6 +11238,7 @@
           <w:sz w:val="24"/>
           <w:szCs w:val="24"/>
         </w:rPr>
+        <w:lastRenderedPageBreak/>
         <w:t>This builds confidence.</w:t>
       </w:r>
     </w:p>
@@ -11159,7 +11386,6 @@
           <w:sz w:val="24"/>
           <w:szCs w:val="24"/>
         </w:rPr>
-        <w:lastRenderedPageBreak/>
         <w:t xml:space="preserve">Mind-map is big tangle. It makes a stock of ideas. </w:t>
       </w:r>
     </w:p>

</xml_diff>

<commit_message>
made first set of ken's edits to the photodiode chapter. Need to refine 'avalanches' and the InSb detector section
</commit_message>
<xml_diff>
--- a/Structuring.docx
+++ b/Structuring.docx
@@ -6126,27 +6126,6 @@
           <w:szCs w:val="24"/>
         </w:rPr>
         <w:t>alter, change, disturb</w:t>
-      </w:r>
-      <w:r>
-        <w:rPr>
-          <w:sz w:val="24"/>
-          <w:szCs w:val="24"/>
-        </w:rPr>
-        <w:t>,</w:t>
-      </w:r>
-      <w:r>
-        <w:rPr>
-          <w:sz w:val="24"/>
-          <w:szCs w:val="24"/>
-        </w:rPr>
-        <w:t xml:space="preserve"> </w:t>
-      </w:r>
-      <w:r>
-        <w:rPr>
-          <w:sz w:val="24"/>
-          <w:szCs w:val="24"/>
-        </w:rPr>
-        <w:t>influence</w:t>
       </w:r>
     </w:p>
     <w:p>

</xml_diff>

<commit_message>
Editted SRC modelling chapter, ready for Harry
</commit_message>
<xml_diff>
--- a/Structuring.docx
+++ b/Structuring.docx
@@ -5893,42 +5893,7 @@
           <w:sz w:val="24"/>
           <w:szCs w:val="24"/>
         </w:rPr>
-        <w:t xml:space="preserve">etc. </w:t>
-      </w:r>
-      <w:r>
-        <w:rPr>
-          <w:sz w:val="24"/>
-          <w:szCs w:val="24"/>
-        </w:rPr>
-        <w:t>-&gt;</w:t>
-      </w:r>
-      <w:r>
-        <w:rPr>
-          <w:sz w:val="24"/>
-          <w:szCs w:val="24"/>
-        </w:rPr>
-        <w:t xml:space="preserve"> etc.~</w:t>
-      </w:r>
-      <w:r>
-        <w:rPr>
-          <w:sz w:val="24"/>
-          <w:szCs w:val="24"/>
-        </w:rPr>
-        <w:t>,</w:t>
-      </w:r>
-      <w:r>
-        <w:rPr>
-          <w:sz w:val="24"/>
-          <w:szCs w:val="24"/>
-        </w:rPr>
-        <w:t xml:space="preserve"> e.g.</w:t>
-      </w:r>
-      <w:r>
-        <w:rPr>
-          <w:sz w:val="24"/>
-          <w:szCs w:val="24"/>
-        </w:rPr>
-        <w:t xml:space="preserve"> -&gt;e.g.~ i.e. -&gt; i.e.~</w:t>
+        <w:t>Ctrl+f double space</w:t>
       </w:r>
     </w:p>
     <w:p>
@@ -5948,7 +5913,42 @@
           <w:sz w:val="24"/>
           <w:szCs w:val="24"/>
         </w:rPr>
-        <w:t>Check `` quote marks.</w:t>
+        <w:t xml:space="preserve">etc. </w:t>
+      </w:r>
+      <w:r>
+        <w:rPr>
+          <w:sz w:val="24"/>
+          <w:szCs w:val="24"/>
+        </w:rPr>
+        <w:t>-&gt;</w:t>
+      </w:r>
+      <w:r>
+        <w:rPr>
+          <w:sz w:val="24"/>
+          <w:szCs w:val="24"/>
+        </w:rPr>
+        <w:t xml:space="preserve"> etc.~</w:t>
+      </w:r>
+      <w:r>
+        <w:rPr>
+          <w:sz w:val="24"/>
+          <w:szCs w:val="24"/>
+        </w:rPr>
+        <w:t>,</w:t>
+      </w:r>
+      <w:r>
+        <w:rPr>
+          <w:sz w:val="24"/>
+          <w:szCs w:val="24"/>
+        </w:rPr>
+        <w:t xml:space="preserve"> e.g.</w:t>
+      </w:r>
+      <w:r>
+        <w:rPr>
+          <w:sz w:val="24"/>
+          <w:szCs w:val="24"/>
+        </w:rPr>
+        <w:t xml:space="preserve"> -&gt;e.g.~ i.e. -&gt; i.e.~</w:t>
       </w:r>
     </w:p>
     <w:p>
@@ -5968,7 +5968,7 @@
           <w:sz w:val="24"/>
           <w:szCs w:val="24"/>
         </w:rPr>
-        <w:t>Beam splitter, not beamsplitter</w:t>
+        <w:t>Check `` quote marks.</w:t>
       </w:r>
     </w:p>
     <w:p>
@@ -5988,14 +5988,7 @@
           <w:sz w:val="24"/>
           <w:szCs w:val="24"/>
         </w:rPr>
-        <w:t>Equation (1.1), not Equation 1.1</w:t>
-      </w:r>
-      <w:r>
-        <w:rPr>
-          <w:sz w:val="24"/>
-          <w:szCs w:val="24"/>
-        </w:rPr>
-        <w:t>.</w:t>
+        <w:t>Beam splitter, not beamsplitter</w:t>
       </w:r>
     </w:p>
     <w:p>
@@ -6015,21 +6008,14 @@
           <w:sz w:val="24"/>
           <w:szCs w:val="24"/>
         </w:rPr>
-        <w:t>Remove doesn’t,</w:t>
-      </w:r>
-      <w:r>
-        <w:rPr>
-          <w:sz w:val="24"/>
-          <w:szCs w:val="24"/>
-        </w:rPr>
-        <w:t xml:space="preserve"> hasn’t,</w:t>
-      </w:r>
-      <w:r>
-        <w:rPr>
-          <w:sz w:val="24"/>
-          <w:szCs w:val="24"/>
-        </w:rPr>
-        <w:t xml:space="preserve"> replace with does not, etc.</w:t>
+        <w:t>Equation (1.1), not Equation 1.1</w:t>
+      </w:r>
+      <w:r>
+        <w:rPr>
+          <w:sz w:val="24"/>
+          <w:szCs w:val="24"/>
+        </w:rPr>
+        <w:t>.</w:t>
       </w:r>
     </w:p>
     <w:p>
@@ -6049,6 +6035,40 @@
           <w:sz w:val="24"/>
           <w:szCs w:val="24"/>
         </w:rPr>
+        <w:t>Remove doesn’t,</w:t>
+      </w:r>
+      <w:r>
+        <w:rPr>
+          <w:sz w:val="24"/>
+          <w:szCs w:val="24"/>
+        </w:rPr>
+        <w:t xml:space="preserve"> hasn’t,</w:t>
+      </w:r>
+      <w:r>
+        <w:rPr>
+          <w:sz w:val="24"/>
+          <w:szCs w:val="24"/>
+        </w:rPr>
+        <w:t xml:space="preserve"> replace with does not, etc.</w:t>
+      </w:r>
+    </w:p>
+    <w:p>
+      <w:pPr>
+        <w:pStyle w:val="ListParagraph"/>
+        <w:numPr>
+          <w:ilvl w:val="0"/>
+          <w:numId w:val="6"/>
+        </w:numPr>
+        <w:rPr>
+          <w:sz w:val="24"/>
+          <w:szCs w:val="24"/>
+        </w:rPr>
+      </w:pPr>
+      <w:r>
+        <w:rPr>
+          <w:sz w:val="24"/>
+          <w:szCs w:val="24"/>
+        </w:rPr>
         <w:t xml:space="preserve">Ctrl+f effect and affect. </w:t>
       </w:r>
       <w:r>
@@ -6378,6 +6398,7 @@
           <w:sz w:val="24"/>
           <w:szCs w:val="24"/>
         </w:rPr>
+        <w:lastRenderedPageBreak/>
         <w:t xml:space="preserve">Majority of papers go with mode mismatch, not </w:t>
       </w:r>
       <w:r>
@@ -6446,7 +6467,6 @@
           <w:sz w:val="24"/>
           <w:szCs w:val="24"/>
         </w:rPr>
-        <w:lastRenderedPageBreak/>
         <w:t>Check ngram viewer if unsure.</w:t>
       </w:r>
     </w:p>
@@ -7250,6 +7270,33 @@
       <w:pPr>
         <w:pStyle w:val="ListParagraph"/>
         <w:numPr>
+          <w:ilvl w:val="1"/>
+          <w:numId w:val="6"/>
+        </w:numPr>
+        <w:rPr>
+          <w:sz w:val="24"/>
+          <w:szCs w:val="24"/>
+        </w:rPr>
+      </w:pPr>
+      <w:r>
+        <w:rPr>
+          <w:sz w:val="24"/>
+          <w:szCs w:val="24"/>
+        </w:rPr>
+        <w:t xml:space="preserve">If a sentence ends with with ‘comes from’, </w:t>
+      </w:r>
+      <w:r>
+        <w:rPr>
+          <w:sz w:val="24"/>
+          <w:szCs w:val="24"/>
+        </w:rPr>
+        <w:t>then the comes from phrase can be replaced with ‘originates’ etc.</w:t>
+      </w:r>
+    </w:p>
+    <w:p>
+      <w:pPr>
+        <w:pStyle w:val="ListParagraph"/>
+        <w:numPr>
           <w:ilvl w:val="0"/>
           <w:numId w:val="6"/>
         </w:numPr>
@@ -7326,6 +7373,26 @@
           <w:szCs w:val="24"/>
         </w:rPr>
         <w:t>.</w:t>
+      </w:r>
+    </w:p>
+    <w:p>
+      <w:pPr>
+        <w:pStyle w:val="ListParagraph"/>
+        <w:numPr>
+          <w:ilvl w:val="0"/>
+          <w:numId w:val="6"/>
+        </w:numPr>
+        <w:rPr>
+          <w:sz w:val="24"/>
+          <w:szCs w:val="24"/>
+        </w:rPr>
+      </w:pPr>
+      <w:r>
+        <w:rPr>
+          <w:sz w:val="24"/>
+          <w:szCs w:val="24"/>
+        </w:rPr>
+        <w:t>As long as -&gt; if</w:t>
       </w:r>
     </w:p>
     <w:p>
@@ -7395,6 +7462,7 @@
           <w:sz w:val="24"/>
           <w:szCs w:val="24"/>
         </w:rPr>
+        <w:lastRenderedPageBreak/>
         <w:t>Figures shall be saved as eps when using matplotlib or 'epsc' when using matlab. This is to prevent a latex warning.</w:t>
       </w:r>
     </w:p>
@@ -7449,7 +7517,6 @@
           <w:sz w:val="24"/>
           <w:szCs w:val="24"/>
         </w:rPr>
-        <w:lastRenderedPageBreak/>
         <w:t>Figure names shall be 'chapter description'_chapter_'figure description'. For</w:t>
       </w:r>
       <w:r>
@@ -8104,6 +8171,7 @@
           <w:sz w:val="24"/>
           <w:szCs w:val="24"/>
         </w:rPr>
+        <w:lastRenderedPageBreak/>
         <w:t xml:space="preserve">plt.figure(figsize = figure_size,dpi = </w:t>
       </w:r>
       <w:r>
@@ -8154,7 +8222,6 @@
           <w:sz w:val="24"/>
           <w:szCs w:val="24"/>
         </w:rPr>
-        <w:lastRenderedPageBreak/>
         <w:t>plt.legend(prop={'size': 8},loc = 'lower left')</w:t>
       </w:r>
     </w:p>
@@ -8681,6 +8748,7 @@
           <w:sz w:val="24"/>
           <w:szCs w:val="24"/>
         </w:rPr>
+        <w:lastRenderedPageBreak/>
         <w:t>hold off</w:t>
       </w:r>
     </w:p>
@@ -8715,7 +8783,6 @@
           <w:sz w:val="24"/>
           <w:szCs w:val="24"/>
         </w:rPr>
-        <w:lastRenderedPageBreak/>
         <w:t>xlabel('Frequency (Hz)')</w:t>
       </w:r>
     </w:p>
@@ -9546,6 +9613,7 @@
           <w:sz w:val="24"/>
           <w:szCs w:val="24"/>
         </w:rPr>
+        <w:lastRenderedPageBreak/>
         <w:t xml:space="preserve">The structure acts as a scaffold. It can be modular, and changing structure wont break the </w:t>
       </w:r>
       <w:r>
@@ -9614,7 +9682,6 @@
           <w:sz w:val="24"/>
           <w:szCs w:val="24"/>
         </w:rPr>
-        <w:lastRenderedPageBreak/>
         <w:t>C</w:t>
       </w:r>
       <w:r>
@@ -10501,6 +10568,7 @@
           <w:sz w:val="24"/>
           <w:szCs w:val="24"/>
         </w:rPr>
+        <w:lastRenderedPageBreak/>
         <w:t>Metaphor, its like digging a tunnel</w:t>
       </w:r>
       <w:r>
@@ -10544,7 +10612,6 @@
           <w:sz w:val="24"/>
           <w:szCs w:val="24"/>
         </w:rPr>
-        <w:lastRenderedPageBreak/>
         <w:t>What about perfection?</w:t>
       </w:r>
       <w:r>
@@ -11165,6 +11232,7 @@
           <w:sz w:val="24"/>
           <w:szCs w:val="24"/>
         </w:rPr>
+        <w:lastRenderedPageBreak/>
         <w:t>Recognise the kinds of problems that arise.</w:t>
       </w:r>
     </w:p>
@@ -11217,7 +11285,6 @@
           <w:sz w:val="24"/>
           <w:szCs w:val="24"/>
         </w:rPr>
-        <w:lastRenderedPageBreak/>
         <w:t>This builds confidence.</w:t>
       </w:r>
     </w:p>

</xml_diff>

<commit_message>
all work chapters at first draft. Appendix E also finished. Formatting issues with Appendix A, but text in this section is finished
</commit_message>
<xml_diff>
--- a/Structuring.docx
+++ b/Structuring.docx
@@ -6614,6 +6614,26 @@
       <w:pPr>
         <w:pStyle w:val="ListParagraph"/>
         <w:numPr>
+          <w:ilvl w:val="1"/>
+          <w:numId w:val="6"/>
+        </w:numPr>
+        <w:rPr>
+          <w:sz w:val="24"/>
+          <w:szCs w:val="24"/>
+        </w:rPr>
+      </w:pPr>
+      <w:r>
+        <w:rPr>
+          <w:sz w:val="24"/>
+          <w:szCs w:val="24"/>
+        </w:rPr>
+        <w:t>Pump-diode.</w:t>
+      </w:r>
+    </w:p>
+    <w:p>
+      <w:pPr>
+        <w:pStyle w:val="ListParagraph"/>
+        <w:numPr>
           <w:ilvl w:val="0"/>
           <w:numId w:val="6"/>
         </w:numPr>
@@ -6978,47 +6998,6 @@
           <w:szCs w:val="24"/>
         </w:rPr>
         <w:t xml:space="preserve"> and less</w:t>
-      </w:r>
-      <w:r>
-        <w:rPr>
-          <w:sz w:val="24"/>
-          <w:szCs w:val="24"/>
-        </w:rPr>
-        <w:t>.</w:t>
-      </w:r>
-    </w:p>
-    <w:p>
-      <w:pPr>
-        <w:pStyle w:val="ListParagraph"/>
-        <w:numPr>
-          <w:ilvl w:val="0"/>
-          <w:numId w:val="6"/>
-        </w:numPr>
-        <w:rPr>
-          <w:sz w:val="24"/>
-          <w:szCs w:val="24"/>
-        </w:rPr>
-      </w:pPr>
-      <w:r>
-        <w:rPr>
-          <w:sz w:val="24"/>
-          <w:szCs w:val="24"/>
-        </w:rPr>
-        <w:t>P</w:t>
-      </w:r>
-      <w:r>
-        <w:rPr>
-          <w:sz w:val="24"/>
-          <w:szCs w:val="24"/>
-        </w:rPr>
-        <w:t>ump</w:t>
-      </w:r>
-      <w:r>
-        <w:rPr>
-          <w:sz w:val="24"/>
-          <w:szCs w:val="24"/>
-        </w:rPr>
-        <w:t>-diode</w:t>
       </w:r>
       <w:r>
         <w:rPr>

</xml_diff>

<commit_message>
grammar checks for abstract and chapter 1
</commit_message>
<xml_diff>
--- a/Structuring.docx
+++ b/Structuring.docx
@@ -197,7 +197,25 @@
           <w:sz w:val="24"/>
           <w:szCs w:val="24"/>
         </w:rPr>
-        <w:t xml:space="preserve"> You need to tell people ‘wow you’re great, and heres something new’, or ‘but you were slightly wrong about that’.</w:t>
+        <w:t xml:space="preserve"> You need to tell people ‘wow you’re great, and </w:t>
+      </w:r>
+      <w:proofErr w:type="spellStart"/>
+      <w:r>
+        <w:rPr>
+          <w:rFonts w:cstheme="minorHAnsi"/>
+          <w:sz w:val="24"/>
+          <w:szCs w:val="24"/>
+        </w:rPr>
+        <w:t>heres</w:t>
+      </w:r>
+      <w:proofErr w:type="spellEnd"/>
+      <w:r>
+        <w:rPr>
+          <w:rFonts w:cstheme="minorHAnsi"/>
+          <w:sz w:val="24"/>
+          <w:szCs w:val="24"/>
+        </w:rPr>
+        <w:t xml:space="preserve"> something new’, or ‘but you were slightly wrong about that’.</w:t>
       </w:r>
       <w:r>
         <w:rPr>
@@ -764,7 +782,43 @@
           <w:sz w:val="24"/>
           <w:szCs w:val="24"/>
         </w:rPr>
-        <w:t xml:space="preserve">dge. Its not a bounded thing, knowledge is infinite, the gap doesn’t matter. By filling the gap, theres still </w:t>
+        <w:t xml:space="preserve">dge. </w:t>
+      </w:r>
+      <w:proofErr w:type="spellStart"/>
+      <w:r>
+        <w:rPr>
+          <w:rFonts w:cstheme="minorHAnsi"/>
+          <w:sz w:val="24"/>
+          <w:szCs w:val="24"/>
+        </w:rPr>
+        <w:t>Its</w:t>
+      </w:r>
+      <w:proofErr w:type="spellEnd"/>
+      <w:r>
+        <w:rPr>
+          <w:rFonts w:cstheme="minorHAnsi"/>
+          <w:sz w:val="24"/>
+          <w:szCs w:val="24"/>
+        </w:rPr>
+        <w:t xml:space="preserve"> not a bounded thing, knowledge is infinite, the gap doesn’t matter. By filling the gap, </w:t>
+      </w:r>
+      <w:proofErr w:type="spellStart"/>
+      <w:r>
+        <w:rPr>
+          <w:rFonts w:cstheme="minorHAnsi"/>
+          <w:sz w:val="24"/>
+          <w:szCs w:val="24"/>
+        </w:rPr>
+        <w:t>theres</w:t>
+      </w:r>
+      <w:proofErr w:type="spellEnd"/>
+      <w:r>
+        <w:rPr>
+          <w:rFonts w:cstheme="minorHAnsi"/>
+          <w:sz w:val="24"/>
+          <w:szCs w:val="24"/>
+        </w:rPr>
+        <w:t xml:space="preserve"> still </w:t>
       </w:r>
       <w:r>
         <w:rPr>
@@ -935,7 +989,43 @@
           <w:sz w:val="24"/>
           <w:szCs w:val="24"/>
         </w:rPr>
-        <w:t xml:space="preserve">. The writing at this point may be ‘stream of conciouness`-esk, but it should have had an attempt at making it clear. </w:t>
+        <w:t xml:space="preserve">. The writing at this point may be ‘stream of </w:t>
+      </w:r>
+      <w:proofErr w:type="spellStart"/>
+      <w:r>
+        <w:rPr>
+          <w:rFonts w:cstheme="minorHAnsi"/>
+          <w:sz w:val="24"/>
+          <w:szCs w:val="24"/>
+        </w:rPr>
+        <w:t>conciouness</w:t>
+      </w:r>
+      <w:proofErr w:type="spellEnd"/>
+      <w:r>
+        <w:rPr>
+          <w:rFonts w:cstheme="minorHAnsi"/>
+          <w:sz w:val="24"/>
+          <w:szCs w:val="24"/>
+        </w:rPr>
+        <w:t>`-</w:t>
+      </w:r>
+      <w:proofErr w:type="spellStart"/>
+      <w:r>
+        <w:rPr>
+          <w:rFonts w:cstheme="minorHAnsi"/>
+          <w:sz w:val="24"/>
+          <w:szCs w:val="24"/>
+        </w:rPr>
+        <w:t>esk</w:t>
+      </w:r>
+      <w:proofErr w:type="spellEnd"/>
+      <w:r>
+        <w:rPr>
+          <w:rFonts w:cstheme="minorHAnsi"/>
+          <w:sz w:val="24"/>
+          <w:szCs w:val="24"/>
+        </w:rPr>
+        <w:t xml:space="preserve">, but it should have had an attempt at making it clear. </w:t>
       </w:r>
       <w:r>
         <w:rPr>
@@ -1326,7 +1416,25 @@
           <w:sz w:val="24"/>
           <w:szCs w:val="24"/>
         </w:rPr>
-        <w:t>word level. This involves checking the spellings of words (eg. Effect or affect). The</w:t>
+        <w:t>word level. This involves checking the spellings of words (</w:t>
+      </w:r>
+      <w:proofErr w:type="spellStart"/>
+      <w:r>
+        <w:rPr>
+          <w:rFonts w:cstheme="minorHAnsi"/>
+          <w:sz w:val="24"/>
+          <w:szCs w:val="24"/>
+        </w:rPr>
+        <w:t>eg.</w:t>
+      </w:r>
+      <w:proofErr w:type="spellEnd"/>
+      <w:r>
+        <w:rPr>
+          <w:rFonts w:cstheme="minorHAnsi"/>
+          <w:sz w:val="24"/>
+          <w:szCs w:val="24"/>
+        </w:rPr>
+        <w:t xml:space="preserve"> Effect or affect). The</w:t>
       </w:r>
       <w:r>
         <w:rPr>
@@ -1458,7 +1566,25 @@
           <w:sz w:val="24"/>
           <w:szCs w:val="24"/>
         </w:rPr>
-        <w:t>inanimate objects are not doing things (e.g. the chapter isn’t describing, things are described in the chatper etc)</w:t>
+        <w:t xml:space="preserve">inanimate objects are not doing things (e.g. the chapter isn’t describing, things are described in the </w:t>
+      </w:r>
+      <w:proofErr w:type="spellStart"/>
+      <w:r>
+        <w:rPr>
+          <w:rFonts w:cstheme="minorHAnsi"/>
+          <w:sz w:val="24"/>
+          <w:szCs w:val="24"/>
+        </w:rPr>
+        <w:t>chatper</w:t>
+      </w:r>
+      <w:proofErr w:type="spellEnd"/>
+      <w:r>
+        <w:rPr>
+          <w:rFonts w:cstheme="minorHAnsi"/>
+          <w:sz w:val="24"/>
+          <w:szCs w:val="24"/>
+        </w:rPr>
+        <w:t xml:space="preserve"> etc)</w:t>
       </w:r>
     </w:p>
     <w:p>
@@ -2985,7 +3111,25 @@
           <w:sz w:val="24"/>
           <w:szCs w:val="24"/>
         </w:rPr>
-        <w:t xml:space="preserve"> Its hard to miss out ones you need. Err on the side of caution.</w:t>
+        <w:t xml:space="preserve"> </w:t>
+      </w:r>
+      <w:proofErr w:type="spellStart"/>
+      <w:r>
+        <w:rPr>
+          <w:rFonts w:cstheme="minorHAnsi"/>
+          <w:sz w:val="24"/>
+          <w:szCs w:val="24"/>
+        </w:rPr>
+        <w:t>Its</w:t>
+      </w:r>
+      <w:proofErr w:type="spellEnd"/>
+      <w:r>
+        <w:rPr>
+          <w:rFonts w:cstheme="minorHAnsi"/>
+          <w:sz w:val="24"/>
+          <w:szCs w:val="24"/>
+        </w:rPr>
+        <w:t xml:space="preserve"> hard to miss out ones you need. Err on the side of caution.</w:t>
       </w:r>
       <w:r>
         <w:rPr>
@@ -3311,6 +3455,7 @@
           <w:sz w:val="24"/>
           <w:szCs w:val="24"/>
         </w:rPr>
+        <w:lastRenderedPageBreak/>
         <w:t>Main clause: Stands alone as its own sentence.</w:t>
       </w:r>
     </w:p>
@@ -3327,14 +3472,23 @@
           <w:szCs w:val="24"/>
         </w:rPr>
       </w:pPr>
-      <w:r>
-        <w:rPr>
-          <w:rFonts w:cstheme="minorHAnsi"/>
-          <w:sz w:val="24"/>
-          <w:szCs w:val="24"/>
-        </w:rPr>
-        <w:lastRenderedPageBreak/>
-        <w:t>E.g the rat is dead.</w:t>
+      <w:proofErr w:type="spellStart"/>
+      <w:r>
+        <w:rPr>
+          <w:rFonts w:cstheme="minorHAnsi"/>
+          <w:sz w:val="24"/>
+          <w:szCs w:val="24"/>
+        </w:rPr>
+        <w:t>E.g</w:t>
+      </w:r>
+      <w:proofErr w:type="spellEnd"/>
+      <w:r>
+        <w:rPr>
+          <w:rFonts w:cstheme="minorHAnsi"/>
+          <w:sz w:val="24"/>
+          <w:szCs w:val="24"/>
+        </w:rPr>
+        <w:t xml:space="preserve"> the rat is dead.</w:t>
       </w:r>
     </w:p>
     <w:p>
@@ -3394,13 +3548,23 @@
           <w:szCs w:val="24"/>
         </w:rPr>
       </w:pPr>
-      <w:r>
-        <w:rPr>
-          <w:rFonts w:cstheme="minorHAnsi"/>
-          <w:sz w:val="24"/>
-          <w:szCs w:val="24"/>
-        </w:rPr>
-        <w:t xml:space="preserve">E.g </w:t>
+      <w:proofErr w:type="spellStart"/>
+      <w:r>
+        <w:rPr>
+          <w:rFonts w:cstheme="minorHAnsi"/>
+          <w:sz w:val="24"/>
+          <w:szCs w:val="24"/>
+        </w:rPr>
+        <w:t>E.g</w:t>
+      </w:r>
+      <w:proofErr w:type="spellEnd"/>
+      <w:r>
+        <w:rPr>
+          <w:rFonts w:cstheme="minorHAnsi"/>
+          <w:sz w:val="24"/>
+          <w:szCs w:val="24"/>
+        </w:rPr>
+        <w:t xml:space="preserve"> </w:t>
       </w:r>
       <w:r>
         <w:rPr>
@@ -3740,7 +3904,25 @@
           <w:sz w:val="24"/>
           <w:szCs w:val="24"/>
         </w:rPr>
-        <w:t xml:space="preserve"> are indicated by ’and’ and both sides should stand alone as main clauses. This means no comma is required between the two clauses (around the and).</w:t>
+        <w:t xml:space="preserve"> are indicated by ’and’ and both sides should stand alone as main clauses. This means no comma is required between the two clauses (around the </w:t>
+      </w:r>
+      <w:proofErr w:type="spellStart"/>
+      <w:r>
+        <w:rPr>
+          <w:rFonts w:cstheme="minorHAnsi"/>
+          <w:sz w:val="24"/>
+          <w:szCs w:val="24"/>
+        </w:rPr>
+        <w:t>and</w:t>
+      </w:r>
+      <w:proofErr w:type="spellEnd"/>
+      <w:r>
+        <w:rPr>
+          <w:rFonts w:cstheme="minorHAnsi"/>
+          <w:sz w:val="24"/>
+          <w:szCs w:val="24"/>
+        </w:rPr>
+        <w:t>).</w:t>
       </w:r>
     </w:p>
     <w:p>
@@ -3947,7 +4129,27 @@
           <w:sz w:val="24"/>
           <w:szCs w:val="24"/>
         </w:rPr>
-        <w:t>Object, verb, subject,verb,subject.</w:t>
+        <w:t xml:space="preserve">Object, verb, </w:t>
+      </w:r>
+      <w:proofErr w:type="spellStart"/>
+      <w:r>
+        <w:rPr>
+          <w:rFonts w:cstheme="minorHAnsi"/>
+          <w:color w:val="70AD47" w:themeColor="accent6"/>
+          <w:sz w:val="24"/>
+          <w:szCs w:val="24"/>
+        </w:rPr>
+        <w:t>subject,verb,subject</w:t>
+      </w:r>
+      <w:proofErr w:type="spellEnd"/>
+      <w:r>
+        <w:rPr>
+          <w:rFonts w:cstheme="minorHAnsi"/>
+          <w:color w:val="70AD47" w:themeColor="accent6"/>
+          <w:sz w:val="24"/>
+          <w:szCs w:val="24"/>
+        </w:rPr>
+        <w:t>.</w:t>
       </w:r>
     </w:p>
     <w:p>
@@ -4312,6 +4514,7 @@
           <w:sz w:val="24"/>
           <w:szCs w:val="24"/>
         </w:rPr>
+        <w:lastRenderedPageBreak/>
         <w:t>Comma Splice</w:t>
       </w:r>
       <w:r>
@@ -4388,7 +4591,6 @@
           <w:sz w:val="24"/>
           <w:szCs w:val="24"/>
         </w:rPr>
-        <w:lastRenderedPageBreak/>
         <w:t>BHD is a method of measuring information encoded by a light field and it forms a key part of many quantum optics experiments.</w:t>
       </w:r>
       <w:r>
@@ -4622,7 +4824,25 @@
           <w:sz w:val="24"/>
           <w:szCs w:val="24"/>
         </w:rPr>
-        <w:t xml:space="preserve"> e.g:</w:t>
+        <w:t xml:space="preserve"> </w:t>
+      </w:r>
+      <w:proofErr w:type="spellStart"/>
+      <w:r>
+        <w:rPr>
+          <w:rFonts w:cstheme="minorHAnsi"/>
+          <w:sz w:val="24"/>
+          <w:szCs w:val="24"/>
+        </w:rPr>
+        <w:t>e.g</w:t>
+      </w:r>
+      <w:proofErr w:type="spellEnd"/>
+      <w:r>
+        <w:rPr>
+          <w:rFonts w:cstheme="minorHAnsi"/>
+          <w:sz w:val="24"/>
+          <w:szCs w:val="24"/>
+        </w:rPr>
+        <w:t>:</w:t>
       </w:r>
     </w:p>
     <w:p>
@@ -5184,7 +5404,25 @@
           <w:sz w:val="24"/>
           <w:szCs w:val="24"/>
         </w:rPr>
-        <w:t>If so is a coordinating conjunction, its is preceded by a comma:</w:t>
+        <w:t xml:space="preserve">If so is a coordinating conjunction, </w:t>
+      </w:r>
+      <w:proofErr w:type="spellStart"/>
+      <w:r>
+        <w:rPr>
+          <w:rFonts w:cstheme="minorHAnsi"/>
+          <w:sz w:val="24"/>
+          <w:szCs w:val="24"/>
+        </w:rPr>
+        <w:t>its</w:t>
+      </w:r>
+      <w:proofErr w:type="spellEnd"/>
+      <w:r>
+        <w:rPr>
+          <w:rFonts w:cstheme="minorHAnsi"/>
+          <w:sz w:val="24"/>
+          <w:szCs w:val="24"/>
+        </w:rPr>
+        <w:t xml:space="preserve"> is preceded by a comma:</w:t>
       </w:r>
     </w:p>
     <w:p>
@@ -5280,7 +5518,25 @@
           <w:sz w:val="24"/>
           <w:szCs w:val="24"/>
         </w:rPr>
-        <w:t xml:space="preserve">. (this joins a independent and </w:t>
+        <w:t xml:space="preserve">. (this joins </w:t>
+      </w:r>
+      <w:proofErr w:type="spellStart"/>
+      <w:r>
+        <w:rPr>
+          <w:rFonts w:cstheme="minorHAnsi"/>
+          <w:sz w:val="24"/>
+          <w:szCs w:val="24"/>
+        </w:rPr>
+        <w:t>a</w:t>
+      </w:r>
+      <w:proofErr w:type="spellEnd"/>
+      <w:r>
+        <w:rPr>
+          <w:rFonts w:cstheme="minorHAnsi"/>
+          <w:sz w:val="24"/>
+          <w:szCs w:val="24"/>
+        </w:rPr>
+        <w:t xml:space="preserve"> independent and </w:t>
       </w:r>
       <w:r>
         <w:rPr>
@@ -5841,12 +6097,21 @@
           <w:szCs w:val="24"/>
         </w:rPr>
       </w:pPr>
-      <w:r>
-        <w:rPr>
-          <w:sz w:val="24"/>
-          <w:szCs w:val="24"/>
-        </w:rPr>
-        <w:t>Ctrl+f 1, 2, 3, 4, 5, 6, 7, 8, 9 and 10, replace with one, two, three …</w:t>
+      <w:proofErr w:type="spellStart"/>
+      <w:r>
+        <w:rPr>
+          <w:sz w:val="24"/>
+          <w:szCs w:val="24"/>
+        </w:rPr>
+        <w:t>Ctrl+f</w:t>
+      </w:r>
+      <w:proofErr w:type="spellEnd"/>
+      <w:r>
+        <w:rPr>
+          <w:sz w:val="24"/>
+          <w:szCs w:val="24"/>
+        </w:rPr>
+        <w:t xml:space="preserve"> 1, 2, 3, 4, 5, 6, 7, 8, 9 and 10, replace with one, two, three …</w:t>
       </w:r>
     </w:p>
     <w:p>
@@ -5861,20 +6126,38 @@
           <w:szCs w:val="24"/>
         </w:rPr>
       </w:pPr>
-      <w:r>
-        <w:rPr>
-          <w:sz w:val="24"/>
-          <w:szCs w:val="24"/>
-        </w:rPr>
-        <w:t xml:space="preserve">Ctrl+f </w:t>
-      </w:r>
-      <w:r>
-        <w:rPr>
-          <w:sz w:val="24"/>
-          <w:szCs w:val="24"/>
-        </w:rPr>
-        <w:t>the the</w:t>
-      </w:r>
+      <w:proofErr w:type="spellStart"/>
+      <w:r>
+        <w:rPr>
+          <w:sz w:val="24"/>
+          <w:szCs w:val="24"/>
+        </w:rPr>
+        <w:t>Ctrl+f</w:t>
+      </w:r>
+      <w:proofErr w:type="spellEnd"/>
+      <w:r>
+        <w:rPr>
+          <w:sz w:val="24"/>
+          <w:szCs w:val="24"/>
+        </w:rPr>
+        <w:t xml:space="preserve"> </w:t>
+      </w:r>
+      <w:r>
+        <w:rPr>
+          <w:sz w:val="24"/>
+          <w:szCs w:val="24"/>
+        </w:rPr>
+        <w:t xml:space="preserve">the </w:t>
+      </w:r>
+      <w:proofErr w:type="spellStart"/>
+      <w:r>
+        <w:rPr>
+          <w:sz w:val="24"/>
+          <w:szCs w:val="24"/>
+        </w:rPr>
+        <w:t>the</w:t>
+      </w:r>
+      <w:proofErr w:type="spellEnd"/>
     </w:p>
     <w:p>
       <w:pPr>
@@ -5888,12 +6171,21 @@
           <w:szCs w:val="24"/>
         </w:rPr>
       </w:pPr>
-      <w:r>
-        <w:rPr>
-          <w:sz w:val="24"/>
-          <w:szCs w:val="24"/>
-        </w:rPr>
-        <w:t>Ctrl+f double space</w:t>
+      <w:proofErr w:type="spellStart"/>
+      <w:r>
+        <w:rPr>
+          <w:sz w:val="24"/>
+          <w:szCs w:val="24"/>
+        </w:rPr>
+        <w:t>Ctrl+f</w:t>
+      </w:r>
+      <w:proofErr w:type="spellEnd"/>
+      <w:r>
+        <w:rPr>
+          <w:sz w:val="24"/>
+          <w:szCs w:val="24"/>
+        </w:rPr>
+        <w:t xml:space="preserve"> double space</w:t>
       </w:r>
     </w:p>
     <w:p>
@@ -5988,8 +6280,17 @@
           <w:sz w:val="24"/>
           <w:szCs w:val="24"/>
         </w:rPr>
-        <w:t>Beam splitter, not beamsplitter</w:t>
-      </w:r>
+        <w:t xml:space="preserve">Beam splitter, not </w:t>
+      </w:r>
+      <w:proofErr w:type="spellStart"/>
+      <w:r>
+        <w:rPr>
+          <w:sz w:val="24"/>
+          <w:szCs w:val="24"/>
+        </w:rPr>
+        <w:t>beamsplitter</w:t>
+      </w:r>
+      <w:proofErr w:type="spellEnd"/>
     </w:p>
     <w:p>
       <w:pPr>
@@ -6064,12 +6365,21 @@
           <w:szCs w:val="24"/>
         </w:rPr>
       </w:pPr>
-      <w:r>
-        <w:rPr>
-          <w:sz w:val="24"/>
-          <w:szCs w:val="24"/>
-        </w:rPr>
-        <w:t xml:space="preserve">Ctrl+f effect and affect. </w:t>
+      <w:proofErr w:type="spellStart"/>
+      <w:r>
+        <w:rPr>
+          <w:sz w:val="24"/>
+          <w:szCs w:val="24"/>
+        </w:rPr>
+        <w:t>Ctrl+f</w:t>
+      </w:r>
+      <w:proofErr w:type="spellEnd"/>
+      <w:r>
+        <w:rPr>
+          <w:sz w:val="24"/>
+          <w:szCs w:val="24"/>
+        </w:rPr>
+        <w:t xml:space="preserve"> effect and affect. </w:t>
       </w:r>
       <w:r>
         <w:rPr>
@@ -6316,7 +6626,23 @@
           <w:sz w:val="24"/>
           <w:szCs w:val="24"/>
         </w:rPr>
-        <w:t>Lots end in ‘ly’</w:t>
+        <w:t>Lots end in ‘</w:t>
+      </w:r>
+      <w:proofErr w:type="spellStart"/>
+      <w:r>
+        <w:rPr>
+          <w:sz w:val="24"/>
+          <w:szCs w:val="24"/>
+        </w:rPr>
+        <w:t>ly</w:t>
+      </w:r>
+      <w:proofErr w:type="spellEnd"/>
+      <w:r>
+        <w:rPr>
+          <w:sz w:val="24"/>
+          <w:szCs w:val="24"/>
+        </w:rPr>
+        <w:t>’</w:t>
       </w:r>
     </w:p>
     <w:p>
@@ -6370,6 +6696,7 @@
           <w:sz w:val="24"/>
           <w:szCs w:val="24"/>
         </w:rPr>
+        <w:lastRenderedPageBreak/>
         <w:t>&lt;adjective&gt;-&lt;adjective&gt;</w:t>
       </w:r>
       <w:r>
@@ -6398,7 +6725,6 @@
           <w:sz w:val="24"/>
           <w:szCs w:val="24"/>
         </w:rPr>
-        <w:lastRenderedPageBreak/>
         <w:t xml:space="preserve">Majority of papers go with mode mismatch, not </w:t>
       </w:r>
       <w:r>
@@ -6467,7 +6793,23 @@
           <w:sz w:val="24"/>
           <w:szCs w:val="24"/>
         </w:rPr>
-        <w:t>Check ngram viewer if unsure.</w:t>
+        <w:t xml:space="preserve">Check </w:t>
+      </w:r>
+      <w:proofErr w:type="spellStart"/>
+      <w:r>
+        <w:rPr>
+          <w:sz w:val="24"/>
+          <w:szCs w:val="24"/>
+        </w:rPr>
+        <w:t>ngram</w:t>
+      </w:r>
+      <w:proofErr w:type="spellEnd"/>
+      <w:r>
+        <w:rPr>
+          <w:sz w:val="24"/>
+          <w:szCs w:val="24"/>
+        </w:rPr>
+        <w:t xml:space="preserve"> viewer if unsure.</w:t>
       </w:r>
     </w:p>
     <w:p>
@@ -6634,6 +6976,46 @@
       <w:pPr>
         <w:pStyle w:val="ListParagraph"/>
         <w:numPr>
+          <w:ilvl w:val="1"/>
+          <w:numId w:val="6"/>
+        </w:numPr>
+        <w:rPr>
+          <w:sz w:val="24"/>
+          <w:szCs w:val="24"/>
+        </w:rPr>
+      </w:pPr>
+      <w:r>
+        <w:rPr>
+          <w:sz w:val="24"/>
+          <w:szCs w:val="24"/>
+        </w:rPr>
+        <w:t>Third-generation</w:t>
+      </w:r>
+    </w:p>
+    <w:p>
+      <w:pPr>
+        <w:pStyle w:val="ListParagraph"/>
+        <w:numPr>
+          <w:ilvl w:val="1"/>
+          <w:numId w:val="6"/>
+        </w:numPr>
+        <w:rPr>
+          <w:sz w:val="24"/>
+          <w:szCs w:val="24"/>
+        </w:rPr>
+      </w:pPr>
+      <w:r>
+        <w:rPr>
+          <w:sz w:val="24"/>
+          <w:szCs w:val="24"/>
+        </w:rPr>
+        <w:t xml:space="preserve">Ground-based </w:t>
+      </w:r>
+    </w:p>
+    <w:p>
+      <w:pPr>
+        <w:pStyle w:val="ListParagraph"/>
+        <w:numPr>
           <w:ilvl w:val="0"/>
           <w:numId w:val="6"/>
         </w:numPr>
@@ -6669,12 +7051,21 @@
           <w:szCs w:val="24"/>
         </w:rPr>
       </w:pPr>
-      <w:r>
-        <w:rPr>
-          <w:sz w:val="24"/>
-          <w:szCs w:val="24"/>
-        </w:rPr>
-        <w:t xml:space="preserve">E.g </w:t>
+      <w:proofErr w:type="spellStart"/>
+      <w:r>
+        <w:rPr>
+          <w:sz w:val="24"/>
+          <w:szCs w:val="24"/>
+        </w:rPr>
+        <w:t>E.g</w:t>
+      </w:r>
+      <w:proofErr w:type="spellEnd"/>
+      <w:r>
+        <w:rPr>
+          <w:sz w:val="24"/>
+          <w:szCs w:val="24"/>
+        </w:rPr>
+        <w:t xml:space="preserve"> </w:t>
       </w:r>
       <w:r>
         <w:rPr>
@@ -6715,7 +7106,23 @@
           <w:sz w:val="24"/>
           <w:szCs w:val="24"/>
         </w:rPr>
-        <w:t xml:space="preserve">Current detector = aLIGO, future detector = LIGO A+, the </w:t>
+        <w:t xml:space="preserve">Current detector = </w:t>
+      </w:r>
+      <w:proofErr w:type="spellStart"/>
+      <w:r>
+        <w:rPr>
+          <w:sz w:val="24"/>
+          <w:szCs w:val="24"/>
+        </w:rPr>
+        <w:t>aLIGO</w:t>
+      </w:r>
+      <w:proofErr w:type="spellEnd"/>
+      <w:r>
+        <w:rPr>
+          <w:sz w:val="24"/>
+          <w:szCs w:val="24"/>
+        </w:rPr>
+        <w:t xml:space="preserve">, future detector = LIGO A+, the </w:t>
       </w:r>
       <w:r>
         <w:rPr>
@@ -7194,7 +7601,23 @@
           <w:sz w:val="24"/>
           <w:szCs w:val="24"/>
         </w:rPr>
-        <w:t>. X is used to do Y vs. X is for Y’ing.</w:t>
+        <w:t xml:space="preserve">. X is used to do Y vs. X is for </w:t>
+      </w:r>
+      <w:proofErr w:type="spellStart"/>
+      <w:r>
+        <w:rPr>
+          <w:sz w:val="24"/>
+          <w:szCs w:val="24"/>
+        </w:rPr>
+        <w:t>Y’ing</w:t>
+      </w:r>
+      <w:proofErr w:type="spellEnd"/>
+      <w:r>
+        <w:rPr>
+          <w:sz w:val="24"/>
+          <w:szCs w:val="24"/>
+        </w:rPr>
+        <w:t>.</w:t>
       </w:r>
     </w:p>
     <w:p>
@@ -7262,7 +7685,23 @@
           <w:sz w:val="24"/>
           <w:szCs w:val="24"/>
         </w:rPr>
-        <w:t xml:space="preserve">If a sentence ends with with ‘comes from’, </w:t>
+        <w:t xml:space="preserve">If a sentence ends with </w:t>
+      </w:r>
+      <w:proofErr w:type="spellStart"/>
+      <w:r>
+        <w:rPr>
+          <w:sz w:val="24"/>
+          <w:szCs w:val="24"/>
+        </w:rPr>
+        <w:t>with</w:t>
+      </w:r>
+      <w:proofErr w:type="spellEnd"/>
+      <w:r>
+        <w:rPr>
+          <w:sz w:val="24"/>
+          <w:szCs w:val="24"/>
+        </w:rPr>
+        <w:t xml:space="preserve"> ‘comes from’, </w:t>
       </w:r>
       <w:r>
         <w:rPr>
@@ -7411,6 +7850,7 @@
           <w:sz w:val="32"/>
           <w:szCs w:val="32"/>
         </w:rPr>
+        <w:lastRenderedPageBreak/>
         <w:t xml:space="preserve">Presentation of </w:t>
       </w:r>
       <w:r>
@@ -7441,8 +7881,39 @@
           <w:sz w:val="24"/>
           <w:szCs w:val="24"/>
         </w:rPr>
-        <w:lastRenderedPageBreak/>
-        <w:t>Figures shall be saved as eps when using matplotlib or 'epsc' when using matlab. This is to prevent a latex warning.</w:t>
+        <w:t>Figures shall be saved as eps when using matplotlib or '</w:t>
+      </w:r>
+      <w:proofErr w:type="spellStart"/>
+      <w:r>
+        <w:rPr>
+          <w:sz w:val="24"/>
+          <w:szCs w:val="24"/>
+        </w:rPr>
+        <w:t>epsc</w:t>
+      </w:r>
+      <w:proofErr w:type="spellEnd"/>
+      <w:r>
+        <w:rPr>
+          <w:sz w:val="24"/>
+          <w:szCs w:val="24"/>
+        </w:rPr>
+        <w:t xml:space="preserve">' when using </w:t>
+      </w:r>
+      <w:proofErr w:type="spellStart"/>
+      <w:r>
+        <w:rPr>
+          <w:sz w:val="24"/>
+          <w:szCs w:val="24"/>
+        </w:rPr>
+        <w:t>matlab</w:t>
+      </w:r>
+      <w:proofErr w:type="spellEnd"/>
+      <w:r>
+        <w:rPr>
+          <w:sz w:val="24"/>
+          <w:szCs w:val="24"/>
+        </w:rPr>
+        <w:t>. This is to prevent a latex warning.</w:t>
       </w:r>
     </w:p>
     <w:p>
@@ -7496,7 +7967,23 @@
           <w:sz w:val="24"/>
           <w:szCs w:val="24"/>
         </w:rPr>
-        <w:t>Figure names shall be 'chapter description'_chapter_'figure description'. For</w:t>
+        <w:t xml:space="preserve">Figure names shall be 'chapter </w:t>
+      </w:r>
+      <w:proofErr w:type="spellStart"/>
+      <w:r>
+        <w:rPr>
+          <w:sz w:val="24"/>
+          <w:szCs w:val="24"/>
+        </w:rPr>
+        <w:t>description'_chapter_'figure</w:t>
+      </w:r>
+      <w:proofErr w:type="spellEnd"/>
+      <w:r>
+        <w:rPr>
+          <w:sz w:val="24"/>
+          <w:szCs w:val="24"/>
+        </w:rPr>
+        <w:t xml:space="preserve"> description'. For</w:t>
       </w:r>
       <w:r>
         <w:rPr>
@@ -7510,7 +7997,23 @@
           <w:sz w:val="24"/>
           <w:szCs w:val="24"/>
         </w:rPr>
-        <w:t>example, 'sim_chapter_Zoom_in_ETM_tuning' refers to the figure being in the</w:t>
+        <w:t>example, '</w:t>
+      </w:r>
+      <w:proofErr w:type="spellStart"/>
+      <w:r>
+        <w:rPr>
+          <w:sz w:val="24"/>
+          <w:szCs w:val="24"/>
+        </w:rPr>
+        <w:t>sim_chapter_Zoom_in_ETM_tuning</w:t>
+      </w:r>
+      <w:proofErr w:type="spellEnd"/>
+      <w:r>
+        <w:rPr>
+          <w:sz w:val="24"/>
+          <w:szCs w:val="24"/>
+        </w:rPr>
+        <w:t>' refers to the figure being in the</w:t>
       </w:r>
       <w:r>
         <w:rPr>
@@ -7564,7 +8067,23 @@
           <w:sz w:val="24"/>
           <w:szCs w:val="24"/>
         </w:rPr>
-        <w:t>Are all lines visible/distinguishable? Changing thickness and linestyle can help.</w:t>
+        <w:t xml:space="preserve">Are all lines visible/distinguishable? Changing thickness and </w:t>
+      </w:r>
+      <w:proofErr w:type="spellStart"/>
+      <w:r>
+        <w:rPr>
+          <w:sz w:val="24"/>
+          <w:szCs w:val="24"/>
+        </w:rPr>
+        <w:t>linestyle</w:t>
+      </w:r>
+      <w:proofErr w:type="spellEnd"/>
+      <w:r>
+        <w:rPr>
+          <w:sz w:val="24"/>
+          <w:szCs w:val="24"/>
+        </w:rPr>
+        <w:t xml:space="preserve"> can help.</w:t>
       </w:r>
     </w:p>
     <w:p>
@@ -7584,7 +8103,23 @@
           <w:sz w:val="24"/>
           <w:szCs w:val="24"/>
         </w:rPr>
-        <w:t>Are the axis labelled? The label is a sentence, so normal sentence capitalisation should be used. If its just one word, use a capital letter.</w:t>
+        <w:t xml:space="preserve">Are the axis labelled? The label is a sentence, so normal sentence capitalisation should be used. If </w:t>
+      </w:r>
+      <w:proofErr w:type="spellStart"/>
+      <w:r>
+        <w:rPr>
+          <w:sz w:val="24"/>
+          <w:szCs w:val="24"/>
+        </w:rPr>
+        <w:t>its</w:t>
+      </w:r>
+      <w:proofErr w:type="spellEnd"/>
+      <w:r>
+        <w:rPr>
+          <w:sz w:val="24"/>
+          <w:szCs w:val="24"/>
+        </w:rPr>
+        <w:t xml:space="preserve"> just one word, use a capital letter.</w:t>
       </w:r>
     </w:p>
     <w:p>
@@ -7664,7 +8199,23 @@
           <w:sz w:val="24"/>
           <w:szCs w:val="24"/>
         </w:rPr>
-        <w:t>Are subscripts properly typset?</w:t>
+        <w:t xml:space="preserve">Are subscripts properly </w:t>
+      </w:r>
+      <w:proofErr w:type="spellStart"/>
+      <w:r>
+        <w:rPr>
+          <w:sz w:val="24"/>
+          <w:szCs w:val="24"/>
+        </w:rPr>
+        <w:t>typset</w:t>
+      </w:r>
+      <w:proofErr w:type="spellEnd"/>
+      <w:r>
+        <w:rPr>
+          <w:sz w:val="24"/>
+          <w:szCs w:val="24"/>
+        </w:rPr>
+        <w:t>?</w:t>
       </w:r>
     </w:p>
     <w:p>
@@ -7684,7 +8235,23 @@
           <w:sz w:val="24"/>
           <w:szCs w:val="24"/>
         </w:rPr>
-        <w:t>Have standard unit labels been used? A for amps, degree symbols instead of 'deg' etc.</w:t>
+        <w:t>Have standard unit labels been used? A for amps, degree symbols instead of '</w:t>
+      </w:r>
+      <w:proofErr w:type="spellStart"/>
+      <w:r>
+        <w:rPr>
+          <w:sz w:val="24"/>
+          <w:szCs w:val="24"/>
+        </w:rPr>
+        <w:t>deg</w:t>
+      </w:r>
+      <w:proofErr w:type="spellEnd"/>
+      <w:r>
+        <w:rPr>
+          <w:sz w:val="24"/>
+          <w:szCs w:val="24"/>
+        </w:rPr>
+        <w:t>' etc.</w:t>
       </w:r>
     </w:p>
     <w:p>
@@ -7724,7 +8291,23 @@
           <w:sz w:val="24"/>
           <w:szCs w:val="24"/>
         </w:rPr>
-        <w:t>Check for spelling mistakes! e.g. freuqency -&gt; frequency.</w:t>
+        <w:t xml:space="preserve">Check for spelling mistakes! e.g. </w:t>
+      </w:r>
+      <w:proofErr w:type="spellStart"/>
+      <w:r>
+        <w:rPr>
+          <w:sz w:val="24"/>
+          <w:szCs w:val="24"/>
+        </w:rPr>
+        <w:t>freuqency</w:t>
+      </w:r>
+      <w:proofErr w:type="spellEnd"/>
+      <w:r>
+        <w:rPr>
+          <w:sz w:val="24"/>
+          <w:szCs w:val="24"/>
+        </w:rPr>
+        <w:t xml:space="preserve"> -&gt; frequency.</w:t>
       </w:r>
     </w:p>
     <w:p>
@@ -7827,7 +8410,23 @@
           <w:sz w:val="24"/>
           <w:szCs w:val="24"/>
         </w:rPr>
-        <w:t>Standard matlab and matplotlib fonts will be used. The following examples give</w:t>
+        <w:t xml:space="preserve">Standard </w:t>
+      </w:r>
+      <w:proofErr w:type="spellStart"/>
+      <w:r>
+        <w:rPr>
+          <w:sz w:val="24"/>
+          <w:szCs w:val="24"/>
+        </w:rPr>
+        <w:t>matlab</w:t>
+      </w:r>
+      <w:proofErr w:type="spellEnd"/>
+      <w:r>
+        <w:rPr>
+          <w:sz w:val="24"/>
+          <w:szCs w:val="24"/>
+        </w:rPr>
+        <w:t xml:space="preserve"> and matplotlib fonts will be used. The following examples give</w:t>
       </w:r>
       <w:r>
         <w:rPr>
@@ -7930,7 +8529,23 @@
           <w:sz w:val="24"/>
           <w:szCs w:val="24"/>
         </w:rPr>
-        <w:t>have ‘shared axis’, only label one of the axis. If it’s the xaxis, then label the bottom one. If it’s the y axis, label the left one.</w:t>
+        <w:t xml:space="preserve">have ‘shared axis’, only label one of the axis. If it’s the </w:t>
+      </w:r>
+      <w:proofErr w:type="spellStart"/>
+      <w:r>
+        <w:rPr>
+          <w:sz w:val="24"/>
+          <w:szCs w:val="24"/>
+        </w:rPr>
+        <w:t>xaxis</w:t>
+      </w:r>
+      <w:proofErr w:type="spellEnd"/>
+      <w:r>
+        <w:rPr>
+          <w:sz w:val="24"/>
+          <w:szCs w:val="24"/>
+        </w:rPr>
+        <w:t>, then label the bottom one. If it’s the y axis, label the left one.</w:t>
       </w:r>
     </w:p>
     <w:p>
@@ -7987,7 +8602,23 @@
           <w:sz w:val="24"/>
           <w:szCs w:val="24"/>
         </w:rPr>
-        <w:t xml:space="preserve"> fontsize = </w:t>
+        <w:t xml:space="preserve"> </w:t>
+      </w:r>
+      <w:proofErr w:type="spellStart"/>
+      <w:r>
+        <w:rPr>
+          <w:sz w:val="24"/>
+          <w:szCs w:val="24"/>
+        </w:rPr>
+        <w:t>fontsize</w:t>
+      </w:r>
+      <w:proofErr w:type="spellEnd"/>
+      <w:r>
+        <w:rPr>
+          <w:sz w:val="24"/>
+          <w:szCs w:val="24"/>
+        </w:rPr>
+        <w:t xml:space="preserve"> = </w:t>
       </w:r>
       <w:r>
         <w:rPr>
@@ -8043,7 +8674,23 @@
           <w:sz w:val="24"/>
           <w:szCs w:val="24"/>
         </w:rPr>
-        <w:t xml:space="preserve"> fontsize </w:t>
+        <w:t xml:space="preserve"> </w:t>
+      </w:r>
+      <w:proofErr w:type="spellStart"/>
+      <w:r>
+        <w:rPr>
+          <w:sz w:val="24"/>
+          <w:szCs w:val="24"/>
+        </w:rPr>
+        <w:t>fontsize</w:t>
+      </w:r>
+      <w:proofErr w:type="spellEnd"/>
+      <w:r>
+        <w:rPr>
+          <w:sz w:val="24"/>
+          <w:szCs w:val="24"/>
+        </w:rPr>
+        <w:t xml:space="preserve"> </w:t>
       </w:r>
       <w:r>
         <w:rPr>
@@ -8111,20 +8758,31 @@
           <w:szCs w:val="24"/>
         </w:rPr>
       </w:pPr>
+      <w:proofErr w:type="spellStart"/>
       <w:r>
         <w:rPr>
           <w:rFonts w:ascii="SimSun" w:eastAsia="SimSun" w:hAnsi="SimSun"/>
           <w:sz w:val="24"/>
           <w:szCs w:val="24"/>
         </w:rPr>
-        <w:t>figure_size = (6,</w:t>
-      </w:r>
+        <w:lastRenderedPageBreak/>
+        <w:t>figure_size</w:t>
+      </w:r>
+      <w:proofErr w:type="spellEnd"/>
       <w:r>
         <w:rPr>
           <w:rFonts w:ascii="SimSun" w:eastAsia="SimSun" w:hAnsi="SimSun"/>
           <w:sz w:val="24"/>
           <w:szCs w:val="24"/>
         </w:rPr>
+        <w:t xml:space="preserve"> = (6,</w:t>
+      </w:r>
+      <w:r>
+        <w:rPr>
+          <w:rFonts w:ascii="SimSun" w:eastAsia="SimSun" w:hAnsi="SimSun"/>
+          <w:sz w:val="24"/>
+          <w:szCs w:val="24"/>
+        </w:rPr>
         <w:t>3.5</w:t>
       </w:r>
       <w:r>
@@ -8144,21 +8802,66 @@
           <w:szCs w:val="24"/>
         </w:rPr>
       </w:pPr>
+      <w:proofErr w:type="spellStart"/>
       <w:r>
         <w:rPr>
           <w:rFonts w:ascii="SimSun" w:eastAsia="SimSun" w:hAnsi="SimSun"/>
           <w:sz w:val="24"/>
           <w:szCs w:val="24"/>
         </w:rPr>
-        <w:lastRenderedPageBreak/>
-        <w:t xml:space="preserve">plt.figure(figsize = figure_size,dpi = </w:t>
-      </w:r>
+        <w:t>plt.figure</w:t>
+      </w:r>
+      <w:proofErr w:type="spellEnd"/>
       <w:r>
         <w:rPr>
           <w:rFonts w:ascii="SimSun" w:eastAsia="SimSun" w:hAnsi="SimSun"/>
           <w:sz w:val="24"/>
           <w:szCs w:val="24"/>
         </w:rPr>
+        <w:t>(</w:t>
+      </w:r>
+      <w:proofErr w:type="spellStart"/>
+      <w:r>
+        <w:rPr>
+          <w:rFonts w:ascii="SimSun" w:eastAsia="SimSun" w:hAnsi="SimSun"/>
+          <w:sz w:val="24"/>
+          <w:szCs w:val="24"/>
+        </w:rPr>
+        <w:t>figsize</w:t>
+      </w:r>
+      <w:proofErr w:type="spellEnd"/>
+      <w:r>
+        <w:rPr>
+          <w:rFonts w:ascii="SimSun" w:eastAsia="SimSun" w:hAnsi="SimSun"/>
+          <w:sz w:val="24"/>
+          <w:szCs w:val="24"/>
+        </w:rPr>
+        <w:t xml:space="preserve"> = </w:t>
+      </w:r>
+      <w:proofErr w:type="spellStart"/>
+      <w:r>
+        <w:rPr>
+          <w:rFonts w:ascii="SimSun" w:eastAsia="SimSun" w:hAnsi="SimSun"/>
+          <w:sz w:val="24"/>
+          <w:szCs w:val="24"/>
+        </w:rPr>
+        <w:t>figure_size,dpi</w:t>
+      </w:r>
+      <w:proofErr w:type="spellEnd"/>
+      <w:r>
+        <w:rPr>
+          <w:rFonts w:ascii="SimSun" w:eastAsia="SimSun" w:hAnsi="SimSun"/>
+          <w:sz w:val="24"/>
+          <w:szCs w:val="24"/>
+        </w:rPr>
+        <w:t xml:space="preserve"> = </w:t>
+      </w:r>
+      <w:r>
+        <w:rPr>
+          <w:rFonts w:ascii="SimSun" w:eastAsia="SimSun" w:hAnsi="SimSun"/>
+          <w:sz w:val="24"/>
+          <w:szCs w:val="24"/>
+        </w:rPr>
         <w:t>15</w:t>
       </w:r>
       <w:r>
@@ -8178,73 +8881,149 @@
           <w:szCs w:val="24"/>
         </w:rPr>
       </w:pPr>
+      <w:proofErr w:type="spellStart"/>
       <w:r>
         <w:rPr>
           <w:rFonts w:ascii="SimSun" w:eastAsia="SimSun" w:hAnsi="SimSun"/>
           <w:sz w:val="24"/>
           <w:szCs w:val="24"/>
         </w:rPr>
-        <w:t>plt.plot(x,y,label = 'Name of line')</w:t>
-      </w:r>
-    </w:p>
-    <w:p>
-      <w:pPr>
+        <w:t>plt.plot</w:t>
+      </w:r>
+      <w:proofErr w:type="spellEnd"/>
+      <w:r>
         <w:rPr>
           <w:rFonts w:ascii="SimSun" w:eastAsia="SimSun" w:hAnsi="SimSun"/>
           <w:sz w:val="24"/>
           <w:szCs w:val="24"/>
         </w:rPr>
-      </w:pPr>
+        <w:t>(</w:t>
+      </w:r>
+      <w:proofErr w:type="spellStart"/>
       <w:r>
         <w:rPr>
           <w:rFonts w:ascii="SimSun" w:eastAsia="SimSun" w:hAnsi="SimSun"/>
           <w:sz w:val="24"/>
           <w:szCs w:val="24"/>
         </w:rPr>
-        <w:t>plt.legend(prop={'size': 8},loc = 'lower left')</w:t>
-      </w:r>
-    </w:p>
-    <w:p>
-      <w:pPr>
+        <w:t>x,y,label</w:t>
+      </w:r>
+      <w:proofErr w:type="spellEnd"/>
+      <w:r>
         <w:rPr>
           <w:rFonts w:ascii="SimSun" w:eastAsia="SimSun" w:hAnsi="SimSun"/>
           <w:sz w:val="24"/>
           <w:szCs w:val="24"/>
         </w:rPr>
-      </w:pPr>
-      <w:r>
+        <w:t xml:space="preserve"> = 'Name of line')</w:t>
+      </w:r>
+    </w:p>
+    <w:p>
+      <w:pPr>
         <w:rPr>
           <w:rFonts w:ascii="SimSun" w:eastAsia="SimSun" w:hAnsi="SimSun"/>
           <w:sz w:val="24"/>
           <w:szCs w:val="24"/>
         </w:rPr>
-        <w:t>plt.xlabel('x axis (units)'</w:t>
-      </w:r>
+      </w:pPr>
+      <w:proofErr w:type="spellStart"/>
       <w:r>
         <w:rPr>
           <w:rFonts w:ascii="SimSun" w:eastAsia="SimSun" w:hAnsi="SimSun"/>
           <w:sz w:val="24"/>
           <w:szCs w:val="24"/>
         </w:rPr>
+        <w:t>plt.legend</w:t>
+      </w:r>
+      <w:proofErr w:type="spellEnd"/>
+      <w:r>
+        <w:rPr>
+          <w:rFonts w:ascii="SimSun" w:eastAsia="SimSun" w:hAnsi="SimSun"/>
+          <w:sz w:val="24"/>
+          <w:szCs w:val="24"/>
+        </w:rPr>
+        <w:t>(prop={'size': 8},</w:t>
+      </w:r>
+      <w:proofErr w:type="spellStart"/>
+      <w:r>
+        <w:rPr>
+          <w:rFonts w:ascii="SimSun" w:eastAsia="SimSun" w:hAnsi="SimSun"/>
+          <w:sz w:val="24"/>
+          <w:szCs w:val="24"/>
+        </w:rPr>
+        <w:t>loc</w:t>
+      </w:r>
+      <w:proofErr w:type="spellEnd"/>
+      <w:r>
+        <w:rPr>
+          <w:rFonts w:ascii="SimSun" w:eastAsia="SimSun" w:hAnsi="SimSun"/>
+          <w:sz w:val="24"/>
+          <w:szCs w:val="24"/>
+        </w:rPr>
+        <w:t xml:space="preserve"> = 'lower left')</w:t>
+      </w:r>
+    </w:p>
+    <w:p>
+      <w:pPr>
+        <w:rPr>
+          <w:rFonts w:ascii="SimSun" w:eastAsia="SimSun" w:hAnsi="SimSun"/>
+          <w:sz w:val="24"/>
+          <w:szCs w:val="24"/>
+        </w:rPr>
+      </w:pPr>
+      <w:proofErr w:type="spellStart"/>
+      <w:r>
+        <w:rPr>
+          <w:rFonts w:ascii="SimSun" w:eastAsia="SimSun" w:hAnsi="SimSun"/>
+          <w:sz w:val="24"/>
+          <w:szCs w:val="24"/>
+        </w:rPr>
+        <w:t>plt.xlabel</w:t>
+      </w:r>
+      <w:proofErr w:type="spellEnd"/>
+      <w:r>
+        <w:rPr>
+          <w:rFonts w:ascii="SimSun" w:eastAsia="SimSun" w:hAnsi="SimSun"/>
+          <w:sz w:val="24"/>
+          <w:szCs w:val="24"/>
+        </w:rPr>
+        <w:t>('x axis (units)'</w:t>
+      </w:r>
+      <w:r>
+        <w:rPr>
+          <w:rFonts w:ascii="SimSun" w:eastAsia="SimSun" w:hAnsi="SimSun"/>
+          <w:sz w:val="24"/>
+          <w:szCs w:val="24"/>
+        </w:rPr>
         <w:t>,</w:t>
       </w:r>
       <w:r>
         <w:t xml:space="preserve"> </w:t>
       </w:r>
+      <w:proofErr w:type="spellStart"/>
       <w:r>
         <w:rPr>
           <w:rFonts w:ascii="SimSun" w:eastAsia="SimSun" w:hAnsi="SimSun"/>
           <w:sz w:val="24"/>
           <w:szCs w:val="24"/>
         </w:rPr>
-        <w:t xml:space="preserve">fontsize = </w:t>
-      </w:r>
+        <w:t>fontsize</w:t>
+      </w:r>
+      <w:proofErr w:type="spellEnd"/>
       <w:r>
         <w:rPr>
           <w:rFonts w:ascii="SimSun" w:eastAsia="SimSun" w:hAnsi="SimSun"/>
           <w:sz w:val="24"/>
           <w:szCs w:val="24"/>
         </w:rPr>
+        <w:t xml:space="preserve"> = </w:t>
+      </w:r>
+      <w:r>
+        <w:rPr>
+          <w:rFonts w:ascii="SimSun" w:eastAsia="SimSun" w:hAnsi="SimSun"/>
+          <w:sz w:val="24"/>
+          <w:szCs w:val="24"/>
+        </w:rPr>
         <w:t>11.5</w:t>
       </w:r>
       <w:r>
@@ -8264,39 +9043,59 @@
           <w:szCs w:val="24"/>
         </w:rPr>
       </w:pPr>
+      <w:proofErr w:type="spellStart"/>
       <w:r>
         <w:rPr>
           <w:rFonts w:ascii="SimSun" w:eastAsia="SimSun" w:hAnsi="SimSun"/>
           <w:sz w:val="24"/>
           <w:szCs w:val="24"/>
         </w:rPr>
-        <w:t>plt.ylabel('y axis (units)'</w:t>
-      </w:r>
+        <w:t>plt.ylabel</w:t>
+      </w:r>
+      <w:proofErr w:type="spellEnd"/>
       <w:r>
         <w:rPr>
           <w:rFonts w:ascii="SimSun" w:eastAsia="SimSun" w:hAnsi="SimSun"/>
           <w:sz w:val="24"/>
           <w:szCs w:val="24"/>
         </w:rPr>
+        <w:t>('y axis (units)'</w:t>
+      </w:r>
+      <w:r>
+        <w:rPr>
+          <w:rFonts w:ascii="SimSun" w:eastAsia="SimSun" w:hAnsi="SimSun"/>
+          <w:sz w:val="24"/>
+          <w:szCs w:val="24"/>
+        </w:rPr>
         <w:t>,</w:t>
       </w:r>
       <w:r>
         <w:t xml:space="preserve"> </w:t>
       </w:r>
+      <w:proofErr w:type="spellStart"/>
       <w:r>
         <w:rPr>
           <w:rFonts w:ascii="SimSun" w:eastAsia="SimSun" w:hAnsi="SimSun"/>
           <w:sz w:val="24"/>
           <w:szCs w:val="24"/>
         </w:rPr>
-        <w:t xml:space="preserve">fontsize = </w:t>
-      </w:r>
+        <w:t>fontsize</w:t>
+      </w:r>
+      <w:proofErr w:type="spellEnd"/>
       <w:r>
         <w:rPr>
           <w:rFonts w:ascii="SimSun" w:eastAsia="SimSun" w:hAnsi="SimSun"/>
           <w:sz w:val="24"/>
           <w:szCs w:val="24"/>
         </w:rPr>
+        <w:t xml:space="preserve"> = </w:t>
+      </w:r>
+      <w:r>
+        <w:rPr>
+          <w:rFonts w:ascii="SimSun" w:eastAsia="SimSun" w:hAnsi="SimSun"/>
+          <w:sz w:val="24"/>
+          <w:szCs w:val="24"/>
+        </w:rPr>
         <w:t>11.5</w:t>
       </w:r>
       <w:r>
@@ -8316,47 +9115,50 @@
           <w:szCs w:val="24"/>
         </w:rPr>
       </w:pPr>
+      <w:proofErr w:type="spellStart"/>
       <w:r>
         <w:rPr>
           <w:rFonts w:ascii="SimSun" w:eastAsia="SimSun" w:hAnsi="SimSun"/>
           <w:sz w:val="24"/>
           <w:szCs w:val="24"/>
         </w:rPr>
-        <w:t>plt.tight_layout()</w:t>
-      </w:r>
-    </w:p>
-    <w:p>
-      <w:pPr>
+        <w:t>plt.tight_layout</w:t>
+      </w:r>
+      <w:proofErr w:type="spellEnd"/>
+      <w:r>
         <w:rPr>
           <w:rFonts w:ascii="SimSun" w:eastAsia="SimSun" w:hAnsi="SimSun"/>
           <w:sz w:val="24"/>
           <w:szCs w:val="24"/>
         </w:rPr>
-      </w:pPr>
-      <w:r>
+        <w:t>()</w:t>
+      </w:r>
+    </w:p>
+    <w:p>
+      <w:pPr>
         <w:rPr>
           <w:rFonts w:ascii="SimSun" w:eastAsia="SimSun" w:hAnsi="SimSun"/>
           <w:sz w:val="24"/>
           <w:szCs w:val="24"/>
         </w:rPr>
-        <w:t>plt.grid()</w:t>
-      </w:r>
-    </w:p>
-    <w:p>
-      <w:pPr>
+      </w:pPr>
+      <w:proofErr w:type="spellStart"/>
+      <w:r>
         <w:rPr>
           <w:rFonts w:ascii="SimSun" w:eastAsia="SimSun" w:hAnsi="SimSun"/>
           <w:sz w:val="24"/>
           <w:szCs w:val="24"/>
         </w:rPr>
-      </w:pPr>
+        <w:t>plt.grid</w:t>
+      </w:r>
+      <w:proofErr w:type="spellEnd"/>
       <w:r>
         <w:rPr>
           <w:rFonts w:ascii="SimSun" w:eastAsia="SimSun" w:hAnsi="SimSun"/>
           <w:sz w:val="24"/>
           <w:szCs w:val="24"/>
         </w:rPr>
-        <w:t>plt.savefig('sim_chapter_Zoom_in_ETM_tuning.eps')</w:t>
+        <w:t>()</w:t>
       </w:r>
     </w:p>
     <w:p>
@@ -8367,38 +9169,93 @@
           <w:szCs w:val="24"/>
         </w:rPr>
       </w:pPr>
+      <w:proofErr w:type="spellStart"/>
       <w:r>
         <w:rPr>
           <w:rFonts w:ascii="SimSun" w:eastAsia="SimSun" w:hAnsi="SimSun"/>
           <w:sz w:val="24"/>
           <w:szCs w:val="24"/>
         </w:rPr>
-        <w:t>plt.show()</w:t>
-      </w:r>
-    </w:p>
-    <w:p>
-      <w:pPr>
+        <w:t>plt.savefig</w:t>
+      </w:r>
+      <w:proofErr w:type="spellEnd"/>
+      <w:r>
         <w:rPr>
           <w:rFonts w:ascii="SimSun" w:eastAsia="SimSun" w:hAnsi="SimSun"/>
           <w:sz w:val="24"/>
           <w:szCs w:val="24"/>
         </w:rPr>
-      </w:pPr>
-    </w:p>
-    <w:p>
-      <w:pPr>
+        <w:t>('</w:t>
+      </w:r>
+      <w:proofErr w:type="spellStart"/>
+      <w:r>
         <w:rPr>
           <w:rFonts w:ascii="SimSun" w:eastAsia="SimSun" w:hAnsi="SimSun"/>
           <w:sz w:val="24"/>
           <w:szCs w:val="24"/>
         </w:rPr>
-      </w:pPr>
+        <w:t>sim_chapter_Zoom_in_ETM_tuning.eps</w:t>
+      </w:r>
+      <w:proofErr w:type="spellEnd"/>
       <w:r>
         <w:rPr>
           <w:rFonts w:ascii="SimSun" w:eastAsia="SimSun" w:hAnsi="SimSun"/>
           <w:sz w:val="24"/>
           <w:szCs w:val="24"/>
         </w:rPr>
+        <w:t>')</w:t>
+      </w:r>
+    </w:p>
+    <w:p>
+      <w:pPr>
+        <w:rPr>
+          <w:rFonts w:ascii="SimSun" w:eastAsia="SimSun" w:hAnsi="SimSun"/>
+          <w:sz w:val="24"/>
+          <w:szCs w:val="24"/>
+        </w:rPr>
+      </w:pPr>
+      <w:proofErr w:type="spellStart"/>
+      <w:r>
+        <w:rPr>
+          <w:rFonts w:ascii="SimSun" w:eastAsia="SimSun" w:hAnsi="SimSun"/>
+          <w:sz w:val="24"/>
+          <w:szCs w:val="24"/>
+        </w:rPr>
+        <w:t>plt.show</w:t>
+      </w:r>
+      <w:proofErr w:type="spellEnd"/>
+      <w:r>
+        <w:rPr>
+          <w:rFonts w:ascii="SimSun" w:eastAsia="SimSun" w:hAnsi="SimSun"/>
+          <w:sz w:val="24"/>
+          <w:szCs w:val="24"/>
+        </w:rPr>
+        <w:t>()</w:t>
+      </w:r>
+    </w:p>
+    <w:p>
+      <w:pPr>
+        <w:rPr>
+          <w:rFonts w:ascii="SimSun" w:eastAsia="SimSun" w:hAnsi="SimSun"/>
+          <w:sz w:val="24"/>
+          <w:szCs w:val="24"/>
+        </w:rPr>
+      </w:pPr>
+    </w:p>
+    <w:p>
+      <w:pPr>
+        <w:rPr>
+          <w:rFonts w:ascii="SimSun" w:eastAsia="SimSun" w:hAnsi="SimSun"/>
+          <w:sz w:val="24"/>
+          <w:szCs w:val="24"/>
+        </w:rPr>
+      </w:pPr>
+      <w:r>
+        <w:rPr>
+          <w:rFonts w:ascii="SimSun" w:eastAsia="SimSun" w:hAnsi="SimSun"/>
+          <w:sz w:val="24"/>
+          <w:szCs w:val="24"/>
+        </w:rPr>
         <w:t>For 2x1 subplots, use</w:t>
       </w:r>
     </w:p>
@@ -8410,13 +9267,41 @@
           <w:szCs w:val="24"/>
         </w:rPr>
       </w:pPr>
+      <w:proofErr w:type="spellStart"/>
       <w:r>
         <w:rPr>
           <w:rFonts w:ascii="SimSun" w:eastAsia="SimSun" w:hAnsi="SimSun"/>
           <w:sz w:val="24"/>
           <w:szCs w:val="24"/>
         </w:rPr>
-        <w:t>plt.figure(figsize=(6, 6), dpi=150)</w:t>
+        <w:t>plt.figure</w:t>
+      </w:r>
+      <w:proofErr w:type="spellEnd"/>
+      <w:r>
+        <w:rPr>
+          <w:rFonts w:ascii="SimSun" w:eastAsia="SimSun" w:hAnsi="SimSun"/>
+          <w:sz w:val="24"/>
+          <w:szCs w:val="24"/>
+        </w:rPr>
+        <w:t>(</w:t>
+      </w:r>
+      <w:proofErr w:type="spellStart"/>
+      <w:r>
+        <w:rPr>
+          <w:rFonts w:ascii="SimSun" w:eastAsia="SimSun" w:hAnsi="SimSun"/>
+          <w:sz w:val="24"/>
+          <w:szCs w:val="24"/>
+        </w:rPr>
+        <w:t>figsize</w:t>
+      </w:r>
+      <w:proofErr w:type="spellEnd"/>
+      <w:r>
+        <w:rPr>
+          <w:rFonts w:ascii="SimSun" w:eastAsia="SimSun" w:hAnsi="SimSun"/>
+          <w:sz w:val="24"/>
+          <w:szCs w:val="24"/>
+        </w:rPr>
+        <w:t>=(6, 6), dpi=150)</w:t>
       </w:r>
     </w:p>
     <w:p>
@@ -8474,6 +9359,7 @@
           <w:szCs w:val="24"/>
         </w:rPr>
       </w:pPr>
+      <w:proofErr w:type="spellStart"/>
       <w:r>
         <w:rPr>
           <w:rFonts w:asciiTheme="majorHAnsi" w:hAnsiTheme="majorHAnsi"/>
@@ -8484,6 +9370,7 @@
         </w:rPr>
         <w:t>Matlab</w:t>
       </w:r>
+      <w:proofErr w:type="spellEnd"/>
     </w:p>
     <w:p>
       <w:pPr>
@@ -8502,7 +9389,55 @@
           <w:sz w:val="24"/>
           <w:szCs w:val="24"/>
         </w:rPr>
-        <w:t>For matlab figures, use the linspecer (from mathworks file exchange) function to</w:t>
+        <w:t xml:space="preserve">For </w:t>
+      </w:r>
+      <w:proofErr w:type="spellStart"/>
+      <w:r>
+        <w:rPr>
+          <w:sz w:val="24"/>
+          <w:szCs w:val="24"/>
+        </w:rPr>
+        <w:t>matlab</w:t>
+      </w:r>
+      <w:proofErr w:type="spellEnd"/>
+      <w:r>
+        <w:rPr>
+          <w:sz w:val="24"/>
+          <w:szCs w:val="24"/>
+        </w:rPr>
+        <w:t xml:space="preserve"> figures, use the </w:t>
+      </w:r>
+      <w:proofErr w:type="spellStart"/>
+      <w:r>
+        <w:rPr>
+          <w:sz w:val="24"/>
+          <w:szCs w:val="24"/>
+        </w:rPr>
+        <w:t>linspecer</w:t>
+      </w:r>
+      <w:proofErr w:type="spellEnd"/>
+      <w:r>
+        <w:rPr>
+          <w:sz w:val="24"/>
+          <w:szCs w:val="24"/>
+        </w:rPr>
+        <w:t xml:space="preserve"> (from </w:t>
+      </w:r>
+      <w:proofErr w:type="spellStart"/>
+      <w:r>
+        <w:rPr>
+          <w:sz w:val="24"/>
+          <w:szCs w:val="24"/>
+        </w:rPr>
+        <w:t>mathworks</w:t>
+      </w:r>
+      <w:proofErr w:type="spellEnd"/>
+      <w:r>
+        <w:rPr>
+          <w:sz w:val="24"/>
+          <w:szCs w:val="24"/>
+        </w:rPr>
+        <w:t xml:space="preserve"> file exchange) function to</w:t>
       </w:r>
       <w:r>
         <w:rPr>
@@ -8543,8 +9478,9 @@
           <w:sz w:val="24"/>
           <w:szCs w:val="24"/>
         </w:rPr>
-        <w:t>The font should be set to Deja</w:t>
-      </w:r>
+        <w:t xml:space="preserve">The font should be set to </w:t>
+      </w:r>
+      <w:proofErr w:type="spellStart"/>
       <w:r>
         <w:rPr>
           <w:rFonts w:cstheme="minorHAnsi"/>
@@ -8552,7 +9488,7 @@
           <w:sz w:val="24"/>
           <w:szCs w:val="24"/>
         </w:rPr>
-        <w:t xml:space="preserve">Vu Sans, do this with: </w:t>
+        <w:t>Deja</w:t>
       </w:r>
       <w:r>
         <w:rPr>
@@ -8561,15 +9497,90 @@
           <w:sz w:val="24"/>
           <w:szCs w:val="24"/>
         </w:rPr>
-        <w:t>set(gca,</w:t>
-      </w:r>
-      <w:r>
-        <w:rPr>
-          <w:rFonts w:cstheme="minorHAnsi"/>
-          <w:sz w:val="24"/>
-          <w:szCs w:val="24"/>
-        </w:rPr>
-        <w:t>'fontname','DejaVu Sans')</w:t>
+        <w:t>Vu</w:t>
+      </w:r>
+      <w:proofErr w:type="spellEnd"/>
+      <w:r>
+        <w:rPr>
+          <w:rFonts w:cstheme="minorHAnsi"/>
+          <w:color w:val="000000"/>
+          <w:sz w:val="24"/>
+          <w:szCs w:val="24"/>
+        </w:rPr>
+        <w:t xml:space="preserve"> Sans, do this with: </w:t>
+      </w:r>
+      <w:r>
+        <w:rPr>
+          <w:rFonts w:cstheme="minorHAnsi"/>
+          <w:color w:val="000000"/>
+          <w:sz w:val="24"/>
+          <w:szCs w:val="24"/>
+        </w:rPr>
+        <w:t>set(</w:t>
+      </w:r>
+      <w:proofErr w:type="spellStart"/>
+      <w:r>
+        <w:rPr>
+          <w:rFonts w:cstheme="minorHAnsi"/>
+          <w:color w:val="000000"/>
+          <w:sz w:val="24"/>
+          <w:szCs w:val="24"/>
+        </w:rPr>
+        <w:t>gca</w:t>
+      </w:r>
+      <w:proofErr w:type="spellEnd"/>
+      <w:r>
+        <w:rPr>
+          <w:rFonts w:cstheme="minorHAnsi"/>
+          <w:color w:val="000000"/>
+          <w:sz w:val="24"/>
+          <w:szCs w:val="24"/>
+        </w:rPr>
+        <w:t>,</w:t>
+      </w:r>
+      <w:r>
+        <w:rPr>
+          <w:rFonts w:cstheme="minorHAnsi"/>
+          <w:sz w:val="24"/>
+          <w:szCs w:val="24"/>
+        </w:rPr>
+        <w:t>'</w:t>
+      </w:r>
+      <w:proofErr w:type="spellStart"/>
+      <w:r>
+        <w:rPr>
+          <w:rFonts w:cstheme="minorHAnsi"/>
+          <w:sz w:val="24"/>
+          <w:szCs w:val="24"/>
+        </w:rPr>
+        <w:t>fontname</w:t>
+      </w:r>
+      <w:proofErr w:type="spellEnd"/>
+      <w:r>
+        <w:rPr>
+          <w:rFonts w:cstheme="minorHAnsi"/>
+          <w:sz w:val="24"/>
+          <w:szCs w:val="24"/>
+        </w:rPr>
+        <w:t>','</w:t>
+      </w:r>
+      <w:proofErr w:type="spellStart"/>
+      <w:r>
+        <w:rPr>
+          <w:rFonts w:cstheme="minorHAnsi"/>
+          <w:sz w:val="24"/>
+          <w:szCs w:val="24"/>
+        </w:rPr>
+        <w:t>DejaVu</w:t>
+      </w:r>
+      <w:proofErr w:type="spellEnd"/>
+      <w:r>
+        <w:rPr>
+          <w:rFonts w:cstheme="minorHAnsi"/>
+          <w:sz w:val="24"/>
+          <w:szCs w:val="24"/>
+        </w:rPr>
+        <w:t xml:space="preserve"> Sans')</w:t>
       </w:r>
     </w:p>
     <w:p>
@@ -8599,23 +9610,41 @@
           <w:sz w:val="24"/>
           <w:szCs w:val="24"/>
         </w:rPr>
-        <w:t>c = linspecer(2);</w:t>
-      </w:r>
-    </w:p>
-    <w:p>
-      <w:pPr>
+        <w:t xml:space="preserve">c = </w:t>
+      </w:r>
+      <w:proofErr w:type="spellStart"/>
+      <w:r>
         <w:rPr>
           <w:rFonts w:ascii="SimSun" w:eastAsia="SimSun" w:hAnsi="SimSun"/>
           <w:sz w:val="24"/>
           <w:szCs w:val="24"/>
         </w:rPr>
-      </w:pPr>
+        <w:t>linspecer</w:t>
+      </w:r>
+      <w:proofErr w:type="spellEnd"/>
       <w:r>
         <w:rPr>
           <w:rFonts w:ascii="SimSun" w:eastAsia="SimSun" w:hAnsi="SimSun"/>
           <w:sz w:val="24"/>
           <w:szCs w:val="24"/>
         </w:rPr>
+        <w:t>(2);</w:t>
+      </w:r>
+    </w:p>
+    <w:p>
+      <w:pPr>
+        <w:rPr>
+          <w:rFonts w:ascii="SimSun" w:eastAsia="SimSun" w:hAnsi="SimSun"/>
+          <w:sz w:val="24"/>
+          <w:szCs w:val="24"/>
+        </w:rPr>
+      </w:pPr>
+      <w:r>
+        <w:rPr>
+          <w:rFonts w:ascii="SimSun" w:eastAsia="SimSun" w:hAnsi="SimSun"/>
+          <w:sz w:val="24"/>
+          <w:szCs w:val="24"/>
+        </w:rPr>
         <w:t>size = 1.1;</w:t>
       </w:r>
     </w:p>
@@ -8627,23 +9656,24 @@
           <w:szCs w:val="24"/>
         </w:rPr>
       </w:pPr>
+      <w:proofErr w:type="spellStart"/>
       <w:r>
         <w:rPr>
           <w:rFonts w:ascii="SimSun" w:eastAsia="SimSun" w:hAnsi="SimSun"/>
           <w:sz w:val="24"/>
           <w:szCs w:val="24"/>
         </w:rPr>
-        <w:t>aspect_ratio = size.*[6,4];</w:t>
-      </w:r>
-    </w:p>
-    <w:p>
-      <w:pPr>
+        <w:t>aspect_ratio</w:t>
+      </w:r>
+      <w:proofErr w:type="spellEnd"/>
+      <w:r>
         <w:rPr>
           <w:rFonts w:ascii="SimSun" w:eastAsia="SimSun" w:hAnsi="SimSun"/>
           <w:sz w:val="24"/>
           <w:szCs w:val="24"/>
         </w:rPr>
-      </w:pPr>
+        <w:t xml:space="preserve"> = size.*[6,4];</w:t>
+      </w:r>
     </w:p>
     <w:p>
       <w:pPr>
@@ -8653,46 +9683,145 @@
           <w:szCs w:val="24"/>
         </w:rPr>
       </w:pPr>
-      <w:r>
+    </w:p>
+    <w:p>
+      <w:pPr>
         <w:rPr>
           <w:rFonts w:ascii="SimSun" w:eastAsia="SimSun" w:hAnsi="SimSun"/>
           <w:sz w:val="24"/>
           <w:szCs w:val="24"/>
         </w:rPr>
-        <w:t>figure('Name','dark noise','units','inches','position',[0 0 aspect_ratio(1) aspect_ratio(2)])</w:t>
-      </w:r>
-    </w:p>
-    <w:p>
-      <w:pPr>
+      </w:pPr>
+      <w:r>
         <w:rPr>
           <w:rFonts w:ascii="SimSun" w:eastAsia="SimSun" w:hAnsi="SimSun"/>
           <w:sz w:val="24"/>
           <w:szCs w:val="24"/>
         </w:rPr>
-      </w:pPr>
+        <w:t>figure('</w:t>
+      </w:r>
+      <w:proofErr w:type="spellStart"/>
       <w:r>
         <w:rPr>
           <w:rFonts w:ascii="SimSun" w:eastAsia="SimSun" w:hAnsi="SimSun"/>
           <w:sz w:val="24"/>
           <w:szCs w:val="24"/>
         </w:rPr>
-        <w:t>loglog(x1, y1, 'color',c(1,:))</w:t>
-      </w:r>
-    </w:p>
-    <w:p>
-      <w:pPr>
+        <w:t>Name','dark</w:t>
+      </w:r>
+      <w:proofErr w:type="spellEnd"/>
+      <w:r>
         <w:rPr>
           <w:rFonts w:ascii="SimSun" w:eastAsia="SimSun" w:hAnsi="SimSun"/>
           <w:sz w:val="24"/>
           <w:szCs w:val="24"/>
         </w:rPr>
-      </w:pPr>
+        <w:t xml:space="preserve"> </w:t>
+      </w:r>
+      <w:proofErr w:type="spellStart"/>
       <w:r>
         <w:rPr>
           <w:rFonts w:ascii="SimSun" w:eastAsia="SimSun" w:hAnsi="SimSun"/>
           <w:sz w:val="24"/>
           <w:szCs w:val="24"/>
         </w:rPr>
+        <w:t>noise','units','inches','position</w:t>
+      </w:r>
+      <w:proofErr w:type="spellEnd"/>
+      <w:r>
+        <w:rPr>
+          <w:rFonts w:ascii="SimSun" w:eastAsia="SimSun" w:hAnsi="SimSun"/>
+          <w:sz w:val="24"/>
+          <w:szCs w:val="24"/>
+        </w:rPr>
+        <w:t xml:space="preserve">',[0 0 </w:t>
+      </w:r>
+      <w:proofErr w:type="spellStart"/>
+      <w:r>
+        <w:rPr>
+          <w:rFonts w:ascii="SimSun" w:eastAsia="SimSun" w:hAnsi="SimSun"/>
+          <w:sz w:val="24"/>
+          <w:szCs w:val="24"/>
+        </w:rPr>
+        <w:t>aspect_ratio</w:t>
+      </w:r>
+      <w:proofErr w:type="spellEnd"/>
+      <w:r>
+        <w:rPr>
+          <w:rFonts w:ascii="SimSun" w:eastAsia="SimSun" w:hAnsi="SimSun"/>
+          <w:sz w:val="24"/>
+          <w:szCs w:val="24"/>
+        </w:rPr>
+        <w:t xml:space="preserve">(1) </w:t>
+      </w:r>
+      <w:proofErr w:type="spellStart"/>
+      <w:r>
+        <w:rPr>
+          <w:rFonts w:ascii="SimSun" w:eastAsia="SimSun" w:hAnsi="SimSun"/>
+          <w:sz w:val="24"/>
+          <w:szCs w:val="24"/>
+        </w:rPr>
+        <w:t>aspect_ratio</w:t>
+      </w:r>
+      <w:proofErr w:type="spellEnd"/>
+      <w:r>
+        <w:rPr>
+          <w:rFonts w:ascii="SimSun" w:eastAsia="SimSun" w:hAnsi="SimSun"/>
+          <w:sz w:val="24"/>
+          <w:szCs w:val="24"/>
+        </w:rPr>
+        <w:t>(2)])</w:t>
+      </w:r>
+    </w:p>
+    <w:p>
+      <w:pPr>
+        <w:rPr>
+          <w:rFonts w:ascii="SimSun" w:eastAsia="SimSun" w:hAnsi="SimSun"/>
+          <w:sz w:val="24"/>
+          <w:szCs w:val="24"/>
+        </w:rPr>
+      </w:pPr>
+      <w:r>
+        <w:rPr>
+          <w:rFonts w:ascii="SimSun" w:eastAsia="SimSun" w:hAnsi="SimSun"/>
+          <w:sz w:val="24"/>
+          <w:szCs w:val="24"/>
+        </w:rPr>
+        <w:t>loglog(x1, y1, '</w:t>
+      </w:r>
+      <w:proofErr w:type="spellStart"/>
+      <w:r>
+        <w:rPr>
+          <w:rFonts w:ascii="SimSun" w:eastAsia="SimSun" w:hAnsi="SimSun"/>
+          <w:sz w:val="24"/>
+          <w:szCs w:val="24"/>
+        </w:rPr>
+        <w:t>color</w:t>
+      </w:r>
+      <w:proofErr w:type="spellEnd"/>
+      <w:r>
+        <w:rPr>
+          <w:rFonts w:ascii="SimSun" w:eastAsia="SimSun" w:hAnsi="SimSun"/>
+          <w:sz w:val="24"/>
+          <w:szCs w:val="24"/>
+        </w:rPr>
+        <w:t>',c(1,:))</w:t>
+      </w:r>
+    </w:p>
+    <w:p>
+      <w:pPr>
+        <w:rPr>
+          <w:rFonts w:ascii="SimSun" w:eastAsia="SimSun" w:hAnsi="SimSun"/>
+          <w:sz w:val="24"/>
+          <w:szCs w:val="24"/>
+        </w:rPr>
+      </w:pPr>
+      <w:r>
+        <w:rPr>
+          <w:rFonts w:ascii="SimSun" w:eastAsia="SimSun" w:hAnsi="SimSun"/>
+          <w:sz w:val="24"/>
+          <w:szCs w:val="24"/>
+        </w:rPr>
         <w:t>hold on</w:t>
       </w:r>
     </w:p>
@@ -8710,24 +9839,42 @@
           <w:sz w:val="24"/>
           <w:szCs w:val="24"/>
         </w:rPr>
-        <w:t>loglog(x2, y2, 'color',c(2,:))</w:t>
-      </w:r>
-    </w:p>
-    <w:p>
-      <w:pPr>
+        <w:lastRenderedPageBreak/>
+        <w:t>loglog(x2, y2, '</w:t>
+      </w:r>
+      <w:proofErr w:type="spellStart"/>
+      <w:r>
         <w:rPr>
           <w:rFonts w:ascii="SimSun" w:eastAsia="SimSun" w:hAnsi="SimSun"/>
           <w:sz w:val="24"/>
           <w:szCs w:val="24"/>
         </w:rPr>
-      </w:pPr>
+        <w:t>color</w:t>
+      </w:r>
+      <w:proofErr w:type="spellEnd"/>
       <w:r>
         <w:rPr>
           <w:rFonts w:ascii="SimSun" w:eastAsia="SimSun" w:hAnsi="SimSun"/>
           <w:sz w:val="24"/>
           <w:szCs w:val="24"/>
         </w:rPr>
-        <w:lastRenderedPageBreak/>
+        <w:t>',c(2,:))</w:t>
+      </w:r>
+    </w:p>
+    <w:p>
+      <w:pPr>
+        <w:rPr>
+          <w:rFonts w:ascii="SimSun" w:eastAsia="SimSun" w:hAnsi="SimSun"/>
+          <w:sz w:val="24"/>
+          <w:szCs w:val="24"/>
+        </w:rPr>
+      </w:pPr>
+      <w:r>
+        <w:rPr>
+          <w:rFonts w:ascii="SimSun" w:eastAsia="SimSun" w:hAnsi="SimSun"/>
+          <w:sz w:val="24"/>
+          <w:szCs w:val="24"/>
+        </w:rPr>
         <w:t>hold off</w:t>
       </w:r>
     </w:p>
@@ -8756,30 +9903,68 @@
           <w:szCs w:val="24"/>
         </w:rPr>
       </w:pPr>
+      <w:proofErr w:type="spellStart"/>
       <w:r>
         <w:rPr>
           <w:rFonts w:ascii="SimSun" w:eastAsia="SimSun" w:hAnsi="SimSun"/>
           <w:sz w:val="24"/>
           <w:szCs w:val="24"/>
         </w:rPr>
-        <w:t>xlabel('Frequency (Hz)')</w:t>
-      </w:r>
-    </w:p>
-    <w:p>
-      <w:pPr>
+        <w:t>xlabel</w:t>
+      </w:r>
+      <w:proofErr w:type="spellEnd"/>
+      <w:r>
         <w:rPr>
           <w:rFonts w:ascii="SimSun" w:eastAsia="SimSun" w:hAnsi="SimSun"/>
           <w:sz w:val="24"/>
           <w:szCs w:val="24"/>
         </w:rPr>
-      </w:pPr>
-      <w:r>
+        <w:t>('Frequency (Hz)')</w:t>
+      </w:r>
+    </w:p>
+    <w:p>
+      <w:pPr>
         <w:rPr>
           <w:rFonts w:ascii="SimSun" w:eastAsia="SimSun" w:hAnsi="SimSun"/>
           <w:sz w:val="24"/>
           <w:szCs w:val="24"/>
         </w:rPr>
-        <w:t>ylabel('I_r_m_s/\surd(Hz)')</w:t>
+      </w:pPr>
+      <w:proofErr w:type="spellStart"/>
+      <w:r>
+        <w:rPr>
+          <w:rFonts w:ascii="SimSun" w:eastAsia="SimSun" w:hAnsi="SimSun"/>
+          <w:sz w:val="24"/>
+          <w:szCs w:val="24"/>
+        </w:rPr>
+        <w:t>ylabel</w:t>
+      </w:r>
+      <w:proofErr w:type="spellEnd"/>
+      <w:r>
+        <w:rPr>
+          <w:rFonts w:ascii="SimSun" w:eastAsia="SimSun" w:hAnsi="SimSun"/>
+          <w:sz w:val="24"/>
+          <w:szCs w:val="24"/>
+        </w:rPr>
+        <w:t>('</w:t>
+      </w:r>
+      <w:proofErr w:type="spellStart"/>
+      <w:r>
+        <w:rPr>
+          <w:rFonts w:ascii="SimSun" w:eastAsia="SimSun" w:hAnsi="SimSun"/>
+          <w:sz w:val="24"/>
+          <w:szCs w:val="24"/>
+        </w:rPr>
+        <w:t>I_r_m_s</w:t>
+      </w:r>
+      <w:proofErr w:type="spellEnd"/>
+      <w:r>
+        <w:rPr>
+          <w:rFonts w:ascii="SimSun" w:eastAsia="SimSun" w:hAnsi="SimSun"/>
+          <w:sz w:val="24"/>
+          <w:szCs w:val="24"/>
+        </w:rPr>
+        <w:t>/\surd(Hz)')</w:t>
       </w:r>
     </w:p>
     <w:p>
@@ -8797,16 +9982,9 @@
           <w:sz w:val="24"/>
           <w:szCs w:val="24"/>
         </w:rPr>
-        <w:t>set(gca,</w:t>
-      </w:r>
-      <w:r>
-        <w:rPr>
-          <w:rFonts w:ascii="SimSun" w:eastAsia="SimSun" w:hAnsi="SimSun" w:cs="Courier New"/>
-          <w:sz w:val="24"/>
-          <w:szCs w:val="24"/>
-        </w:rPr>
-        <w:t>'fontname','DejaVu Sans'</w:t>
-      </w:r>
+        <w:t>set(</w:t>
+      </w:r>
+      <w:proofErr w:type="spellStart"/>
       <w:r>
         <w:rPr>
           <w:rFonts w:ascii="SimSun" w:eastAsia="SimSun" w:hAnsi="SimSun" w:cs="Courier New"/>
@@ -8814,6 +9992,69 @@
           <w:sz w:val="24"/>
           <w:szCs w:val="24"/>
         </w:rPr>
+        <w:t>gca</w:t>
+      </w:r>
+      <w:proofErr w:type="spellEnd"/>
+      <w:r>
+        <w:rPr>
+          <w:rFonts w:ascii="SimSun" w:eastAsia="SimSun" w:hAnsi="SimSun" w:cs="Courier New"/>
+          <w:color w:val="000000"/>
+          <w:sz w:val="24"/>
+          <w:szCs w:val="24"/>
+        </w:rPr>
+        <w:t>,</w:t>
+      </w:r>
+      <w:r>
+        <w:rPr>
+          <w:rFonts w:ascii="SimSun" w:eastAsia="SimSun" w:hAnsi="SimSun" w:cs="Courier New"/>
+          <w:sz w:val="24"/>
+          <w:szCs w:val="24"/>
+        </w:rPr>
+        <w:t>'</w:t>
+      </w:r>
+      <w:proofErr w:type="spellStart"/>
+      <w:r>
+        <w:rPr>
+          <w:rFonts w:ascii="SimSun" w:eastAsia="SimSun" w:hAnsi="SimSun" w:cs="Courier New"/>
+          <w:sz w:val="24"/>
+          <w:szCs w:val="24"/>
+        </w:rPr>
+        <w:t>fontname</w:t>
+      </w:r>
+      <w:proofErr w:type="spellEnd"/>
+      <w:r>
+        <w:rPr>
+          <w:rFonts w:ascii="SimSun" w:eastAsia="SimSun" w:hAnsi="SimSun" w:cs="Courier New"/>
+          <w:sz w:val="24"/>
+          <w:szCs w:val="24"/>
+        </w:rPr>
+        <w:t>','</w:t>
+      </w:r>
+      <w:proofErr w:type="spellStart"/>
+      <w:r>
+        <w:rPr>
+          <w:rFonts w:ascii="SimSun" w:eastAsia="SimSun" w:hAnsi="SimSun" w:cs="Courier New"/>
+          <w:sz w:val="24"/>
+          <w:szCs w:val="24"/>
+        </w:rPr>
+        <w:t>DejaVu</w:t>
+      </w:r>
+      <w:proofErr w:type="spellEnd"/>
+      <w:r>
+        <w:rPr>
+          <w:rFonts w:ascii="SimSun" w:eastAsia="SimSun" w:hAnsi="SimSun" w:cs="Courier New"/>
+          <w:sz w:val="24"/>
+          <w:szCs w:val="24"/>
+        </w:rPr>
+        <w:t xml:space="preserve"> Sans'</w:t>
+      </w:r>
+      <w:r>
+        <w:rPr>
+          <w:rFonts w:ascii="SimSun" w:eastAsia="SimSun" w:hAnsi="SimSun" w:cs="Courier New"/>
+          <w:color w:val="000000"/>
+          <w:sz w:val="24"/>
+          <w:szCs w:val="24"/>
+        </w:rPr>
         <w:t>)</w:t>
       </w:r>
     </w:p>
@@ -8865,7 +10106,25 @@
           <w:sz w:val="24"/>
           <w:szCs w:val="24"/>
         </w:rPr>
-        <w:t>print('Noise_low_f','-depsc')</w:t>
+        <w:t>print('Noise_low_f','-</w:t>
+      </w:r>
+      <w:proofErr w:type="spellStart"/>
+      <w:r>
+        <w:rPr>
+          <w:rFonts w:ascii="SimSun" w:eastAsia="SimSun" w:hAnsi="SimSun"/>
+          <w:sz w:val="24"/>
+          <w:szCs w:val="24"/>
+        </w:rPr>
+        <w:t>depsc</w:t>
+      </w:r>
+      <w:proofErr w:type="spellEnd"/>
+      <w:r>
+        <w:rPr>
+          <w:rFonts w:ascii="SimSun" w:eastAsia="SimSun" w:hAnsi="SimSun"/>
+          <w:sz w:val="24"/>
+          <w:szCs w:val="24"/>
+        </w:rPr>
+        <w:t>')</w:t>
       </w:r>
     </w:p>
     <w:p>
@@ -8971,7 +10230,23 @@
           <w:sz w:val="24"/>
           <w:szCs w:val="24"/>
         </w:rPr>
-        <w:t>have gnd at the bottom of the diagram.</w:t>
+        <w:t xml:space="preserve">have </w:t>
+      </w:r>
+      <w:proofErr w:type="spellStart"/>
+      <w:r>
+        <w:rPr>
+          <w:sz w:val="24"/>
+          <w:szCs w:val="24"/>
+        </w:rPr>
+        <w:t>gnd</w:t>
+      </w:r>
+      <w:proofErr w:type="spellEnd"/>
+      <w:r>
+        <w:rPr>
+          <w:sz w:val="24"/>
+          <w:szCs w:val="24"/>
+        </w:rPr>
+        <w:t xml:space="preserve"> at the bottom of the diagram.</w:t>
       </w:r>
     </w:p>
     <w:p>
@@ -9087,7 +10362,39 @@
           <w:sz w:val="24"/>
           <w:szCs w:val="24"/>
         </w:rPr>
-        <w:t xml:space="preserve">Edit with GIMP, save as xcf and jpeg. The xcf allows for re-editing. Jpeg is good for photos, </w:t>
+        <w:t xml:space="preserve">Edit with GIMP, save as </w:t>
+      </w:r>
+      <w:proofErr w:type="spellStart"/>
+      <w:r>
+        <w:rPr>
+          <w:sz w:val="24"/>
+          <w:szCs w:val="24"/>
+        </w:rPr>
+        <w:t>xcf</w:t>
+      </w:r>
+      <w:proofErr w:type="spellEnd"/>
+      <w:r>
+        <w:rPr>
+          <w:sz w:val="24"/>
+          <w:szCs w:val="24"/>
+        </w:rPr>
+        <w:t xml:space="preserve"> and jpeg. The </w:t>
+      </w:r>
+      <w:proofErr w:type="spellStart"/>
+      <w:r>
+        <w:rPr>
+          <w:sz w:val="24"/>
+          <w:szCs w:val="24"/>
+        </w:rPr>
+        <w:t>xcf</w:t>
+      </w:r>
+      <w:proofErr w:type="spellEnd"/>
+      <w:r>
+        <w:rPr>
+          <w:sz w:val="24"/>
+          <w:szCs w:val="24"/>
+        </w:rPr>
+        <w:t xml:space="preserve"> allows for re-editing. Jpeg is good for photos, </w:t>
       </w:r>
       <w:r>
         <w:rPr>
@@ -9402,13 +10709,23 @@
         </w:rPr>
         <w:t xml:space="preserve">Writing is linear, the knowledge in your head is not. </w:t>
       </w:r>
-      <w:r>
-        <w:rPr>
-          <w:rFonts w:cstheme="minorHAnsi"/>
-          <w:sz w:val="24"/>
-          <w:szCs w:val="24"/>
-        </w:rPr>
-        <w:t>Its an interconnected tangle of ideas, concepts and insights.</w:t>
+      <w:proofErr w:type="spellStart"/>
+      <w:r>
+        <w:rPr>
+          <w:rFonts w:cstheme="minorHAnsi"/>
+          <w:sz w:val="24"/>
+          <w:szCs w:val="24"/>
+        </w:rPr>
+        <w:t>Its</w:t>
+      </w:r>
+      <w:proofErr w:type="spellEnd"/>
+      <w:r>
+        <w:rPr>
+          <w:rFonts w:cstheme="minorHAnsi"/>
+          <w:sz w:val="24"/>
+          <w:szCs w:val="24"/>
+        </w:rPr>
+        <w:t xml:space="preserve"> an interconnected tangle of ideas, concepts and insights.</w:t>
       </w:r>
     </w:p>
     <w:p>
@@ -9540,7 +10857,34 @@
           <w:sz w:val="24"/>
           <w:szCs w:val="24"/>
         </w:rPr>
-        <w:t>done to approach the problem. Explain a need to approach it differently or expand on whats been done. Finally say what you will do.</w:t>
+        <w:t xml:space="preserve">done to approach the problem. Explain a </w:t>
+      </w:r>
+      <w:r>
+        <w:rPr>
+          <w:rFonts w:cstheme="minorHAnsi"/>
+          <w:sz w:val="24"/>
+          <w:szCs w:val="24"/>
+        </w:rPr>
+        <w:lastRenderedPageBreak/>
+        <w:t xml:space="preserve">need to approach it differently or expand on </w:t>
+      </w:r>
+      <w:proofErr w:type="spellStart"/>
+      <w:r>
+        <w:rPr>
+          <w:rFonts w:cstheme="minorHAnsi"/>
+          <w:sz w:val="24"/>
+          <w:szCs w:val="24"/>
+        </w:rPr>
+        <w:t>whats</w:t>
+      </w:r>
+      <w:proofErr w:type="spellEnd"/>
+      <w:r>
+        <w:rPr>
+          <w:rFonts w:cstheme="minorHAnsi"/>
+          <w:sz w:val="24"/>
+          <w:szCs w:val="24"/>
+        </w:rPr>
+        <w:t xml:space="preserve"> been done. Finally say what you will do.</w:t>
       </w:r>
     </w:p>
     <w:p>
@@ -9592,8 +10936,25 @@
           <w:sz w:val="24"/>
           <w:szCs w:val="24"/>
         </w:rPr>
-        <w:lastRenderedPageBreak/>
-        <w:t xml:space="preserve">The structure acts as a scaffold. It can be modular, and changing structure wont break the </w:t>
+        <w:t xml:space="preserve">The structure acts as a scaffold. It can be modular, and changing structure </w:t>
+      </w:r>
+      <w:proofErr w:type="spellStart"/>
+      <w:r>
+        <w:rPr>
+          <w:rFonts w:cstheme="minorHAnsi"/>
+          <w:sz w:val="24"/>
+          <w:szCs w:val="24"/>
+        </w:rPr>
+        <w:t>wont</w:t>
+      </w:r>
+      <w:proofErr w:type="spellEnd"/>
+      <w:r>
+        <w:rPr>
+          <w:rFonts w:cstheme="minorHAnsi"/>
+          <w:sz w:val="24"/>
+          <w:szCs w:val="24"/>
+        </w:rPr>
+        <w:t xml:space="preserve"> break the </w:t>
       </w:r>
       <w:r>
         <w:rPr>
@@ -9811,7 +11172,25 @@
           <w:sz w:val="24"/>
           <w:szCs w:val="24"/>
         </w:rPr>
-        <w:t xml:space="preserve"> E.g:</w:t>
+        <w:t xml:space="preserve"> </w:t>
+      </w:r>
+      <w:proofErr w:type="spellStart"/>
+      <w:r>
+        <w:rPr>
+          <w:rFonts w:cstheme="minorHAnsi"/>
+          <w:sz w:val="24"/>
+          <w:szCs w:val="24"/>
+        </w:rPr>
+        <w:t>E.g</w:t>
+      </w:r>
+      <w:proofErr w:type="spellEnd"/>
+      <w:r>
+        <w:rPr>
+          <w:rFonts w:cstheme="minorHAnsi"/>
+          <w:sz w:val="24"/>
+          <w:szCs w:val="24"/>
+        </w:rPr>
+        <w:t>:</w:t>
       </w:r>
     </w:p>
     <w:p>
@@ -10401,7 +11780,25 @@
           <w:sz w:val="24"/>
           <w:szCs w:val="24"/>
         </w:rPr>
-        <w:t>Find the write words until you find the right way of saying it.</w:t>
+        <w:t xml:space="preserve">Find the </w:t>
+      </w:r>
+      <w:proofErr w:type="spellStart"/>
+      <w:r>
+        <w:rPr>
+          <w:rFonts w:cstheme="minorHAnsi"/>
+          <w:sz w:val="24"/>
+          <w:szCs w:val="24"/>
+        </w:rPr>
+        <w:t>write</w:t>
+      </w:r>
+      <w:proofErr w:type="spellEnd"/>
+      <w:r>
+        <w:rPr>
+          <w:rFonts w:cstheme="minorHAnsi"/>
+          <w:sz w:val="24"/>
+          <w:szCs w:val="24"/>
+        </w:rPr>
+        <w:t xml:space="preserve"> words until you find the right way of saying it.</w:t>
       </w:r>
     </w:p>
     <w:p>
@@ -10469,6 +11866,7 @@
           <w:sz w:val="24"/>
           <w:szCs w:val="24"/>
         </w:rPr>
+        <w:lastRenderedPageBreak/>
         <w:t>The idea is more fundamental than initially though. Insert it earlier.</w:t>
       </w:r>
     </w:p>
@@ -10547,8 +11945,25 @@
           <w:sz w:val="24"/>
           <w:szCs w:val="24"/>
         </w:rPr>
-        <w:lastRenderedPageBreak/>
-        <w:t>Metaphor, its like digging a tunnel</w:t>
+        <w:t xml:space="preserve">Metaphor, </w:t>
+      </w:r>
+      <w:proofErr w:type="spellStart"/>
+      <w:r>
+        <w:rPr>
+          <w:rFonts w:cstheme="minorHAnsi"/>
+          <w:sz w:val="24"/>
+          <w:szCs w:val="24"/>
+        </w:rPr>
+        <w:t>its</w:t>
+      </w:r>
+      <w:proofErr w:type="spellEnd"/>
+      <w:r>
+        <w:rPr>
+          <w:rFonts w:cstheme="minorHAnsi"/>
+          <w:sz w:val="24"/>
+          <w:szCs w:val="24"/>
+        </w:rPr>
+        <w:t xml:space="preserve"> like digging a tunnel</w:t>
       </w:r>
       <w:r>
         <w:rPr>
@@ -11116,6 +12531,7 @@
           <w:sz w:val="24"/>
           <w:szCs w:val="24"/>
         </w:rPr>
+        <w:lastRenderedPageBreak/>
         <w:drawing>
           <wp:inline distT="0" distB="0" distL="0" distR="0" wp14:anchorId="49B90323" wp14:editId="00DF856E">
             <wp:extent cx="3977005" cy="3787140"/>
@@ -11211,7 +12627,6 @@
           <w:sz w:val="24"/>
           <w:szCs w:val="24"/>
         </w:rPr>
-        <w:lastRenderedPageBreak/>
         <w:t>Recognise the kinds of problems that arise.</w:t>
       </w:r>
     </w:p>
@@ -11544,7 +12959,25 @@
           <w:sz w:val="24"/>
           <w:szCs w:val="24"/>
         </w:rPr>
-        <w:t xml:space="preserve"> There is no single thing that is writers block. Its an effect that has multiple causes. </w:t>
+        <w:t xml:space="preserve"> There is no single thing that is writers block. </w:t>
+      </w:r>
+      <w:proofErr w:type="spellStart"/>
+      <w:r>
+        <w:rPr>
+          <w:rFonts w:cstheme="minorHAnsi"/>
+          <w:sz w:val="24"/>
+          <w:szCs w:val="24"/>
+        </w:rPr>
+        <w:t>Its</w:t>
+      </w:r>
+      <w:proofErr w:type="spellEnd"/>
+      <w:r>
+        <w:rPr>
+          <w:rFonts w:cstheme="minorHAnsi"/>
+          <w:sz w:val="24"/>
+          <w:szCs w:val="24"/>
+        </w:rPr>
+        <w:t xml:space="preserve"> an effect that has multiple causes. </w:t>
       </w:r>
       <w:r>
         <w:rPr>

</xml_diff>